<commit_message>
Now just need to add the table to the RL part and some more paragarpahs on the comparison part of chapter 2
</commit_message>
<xml_diff>
--- a/Thesis Rafi Draft 1.docx
+++ b/Thesis Rafi Draft 1.docx
@@ -9910,10 +9910,7 @@
         </w:numPr>
       </w:pPr>
       <w:r>
-        <w:t xml:space="preserve">Value-based and </w:t>
-      </w:r>
-      <w:r>
-        <w:t>Policy based</w:t>
+        <w:t>Value-based and Policy based</w:t>
       </w:r>
     </w:p>
     <w:p>
@@ -9942,36 +9939,11 @@
     </w:p>
     <w:p>
       <w:pPr>
-        <w:pStyle w:val="ListParagraph"/>
-        <w:numPr>
-          <w:ilvl w:val="0"/>
-          <w:numId w:val="14"/>
-        </w:numPr>
-      </w:pPr>
-      <w:r>
-        <w:t>How do these different RL algorithms perform in optimizing energy system</w:t>
-      </w:r>
-      <w:r>
-        <w:t>s</w:t>
-      </w:r>
-    </w:p>
-    <w:p>
-      <w:pPr>
-        <w:pStyle w:val="ListParagraph"/>
-        <w:numPr>
-          <w:ilvl w:val="1"/>
-          <w:numId w:val="14"/>
-        </w:numPr>
-      </w:pPr>
-      <w:r>
-        <w:t>Example of RL performance in different energy problems</w:t>
-      </w:r>
-    </w:p>
-    <w:p>
-      <w:pPr>
-        <w:pStyle w:val="ListParagraph"/>
-        <w:ind w:left="1440"/>
-      </w:pPr>
+        <w:pStyle w:val="Heading3"/>
+      </w:pPr>
+      <w:r>
+        <w:t>Reinforcement Learning Fundamentals</w:t>
+      </w:r>
     </w:p>
     <w:p>
       <w:r>
@@ -10043,10 +10015,7 @@
         <w:t xml:space="preserve"> </w:t>
       </w:r>
       <w:r>
-        <w:t>RL is</w:t>
-      </w:r>
-      <w:r>
-        <w:t xml:space="preserve"> different</w:t>
+        <w:t>RL is different</w:t>
       </w:r>
       <w:r>
         <w:t xml:space="preserve"> because </w:t>
@@ -10081,7 +10050,13 @@
         <w:t xml:space="preserve">. </w:t>
       </w:r>
       <w:r>
-        <w:t xml:space="preserve">The consensus among scholars conclude that RL is especially attractive where renewable variability, stochastic demand, and sector coupling make exact model-based control difficult </w:t>
+        <w:t>The consensus among scholars conclude</w:t>
+      </w:r>
+      <w:r>
+        <w:t>s</w:t>
+      </w:r>
+      <w:r>
+        <w:t xml:space="preserve"> that RL is especially attractive where renewable variability, stochastic demand, and sector coupling make exact model-based control difficult </w:t>
       </w:r>
       <w:sdt>
         <w:sdtPr>
@@ -10116,7 +10091,13 @@
     <w:p/>
     <w:p>
       <w:r>
-        <w:t xml:space="preserve">By directly interacting with the system it is thrown into, the RL agent can derive optimal strategies through a series of Markov Decision Processes (MDP). </w:t>
+        <w:t>By directly interacting with the system it is thrown into, the RL agent can derive optimal strategies through a series of Markov Decision Processes (MDP</w:t>
+      </w:r>
+      <w:r>
+        <w:t>s</w:t>
+      </w:r>
+      <w:r>
+        <w:t xml:space="preserve">). </w:t>
       </w:r>
       <w:r>
         <w:t>An MDP is descri</w:t>
@@ -10135,10 +10116,7 @@
         <w:t>S, A, T, R</w:t>
       </w:r>
       <w:r>
-        <w:t xml:space="preserve">}, where S denotes a set of states, A stands for a set of actions, T represents the transitional probability, and R denotes the reward function. </w:t>
-      </w:r>
-      <w:r>
-        <w:t>This process involves a dynamic evolution of the states, actions, transitional probabilities, and reward at each time step, where the RL agent selects and executes an action at a current state and receives a reward from its action.</w:t>
+        <w:t>}, where S denotes a set of states, A stands for a set of actions, T represents the transitional probability, and R denotes the reward function. This process involves a dynamic evolution of the states, actions, transitional probabilities, and reward at each time step, where the RL agent selects and executes an action at a current state and receives a reward from its action.</w:t>
       </w:r>
     </w:p>
     <w:p/>
@@ -10504,21 +10482,7 @@
               <w:rFonts w:ascii="Cambria Math" w:hAnsi="Cambria Math"/>
               <w:vertAlign w:val="superscript"/>
             </w:rPr>
-            <m:t xml:space="preserve">+ </m:t>
-          </m:r>
-          <m:r>
-            <w:rPr>
-              <w:rFonts w:ascii="Cambria Math" w:hAnsi="Cambria Math"/>
-              <w:vertAlign w:val="superscript"/>
-            </w:rPr>
-            <m:t>…</m:t>
-          </m:r>
-          <m:r>
-            <w:rPr>
-              <w:rFonts w:ascii="Cambria Math" w:hAnsi="Cambria Math"/>
-              <w:vertAlign w:val="superscript"/>
-            </w:rPr>
-            <m:t xml:space="preserve">= </m:t>
+            <m:t xml:space="preserve">+ …= </m:t>
           </m:r>
           <m:nary>
             <m:naryPr>
@@ -11114,13 +11078,7 @@
                 <w:rPr>
                   <w:rFonts w:ascii="Cambria Math" w:hAnsi="Cambria Math"/>
                 </w:rPr>
-                <m:t xml:space="preserve"> </m:t>
-              </m:r>
-              <m:r>
-                <w:rPr>
-                  <w:rFonts w:ascii="Cambria Math" w:hAnsi="Cambria Math"/>
-                </w:rPr>
-                <m:t>E</m:t>
+                <m:t xml:space="preserve"> E</m:t>
               </m:r>
               <m:ctrlPr>
                 <w:rPr>
@@ -12329,9 +12287,9 @@
       <w:r>
         <w:t>state.</w:t>
       </w:r>
-    </w:p>
-    <w:p/>
-    <w:p>
+      <w:r>
+        <w:t xml:space="preserve"> </w:t>
+      </w:r>
       <w:r>
         <w:t xml:space="preserve">Modelling an accurate </w:t>
       </w:r>
@@ -12412,6 +12370,124 @@
     <w:p/>
     <w:p>
       <w:r>
+        <w:t xml:space="preserve">To select an appropriate RL strategy for optimizing an energy system, it is paramount to understand the different structural arrangement that differentiates modern RL algorithms. RL algorithms are primarily categorized along two fundamental axes: (1) Model-based vs. Model-free RL, which specifies how the agent-environment dynamics, and (2) Value-Based, Policy-Based, and Hybrid Actor-Critic </w:t>
+      </w:r>
+      <w:r>
+        <w:t>architectures, which determines how control policies are learned and updated</w:t>
+      </w:r>
+      <w:r>
+        <w:t>. Depending on the type of system, data availability, and objective, one arrangement can be favored over the others.</w:t>
+      </w:r>
+    </w:p>
+    <w:p/>
+    <w:p>
+      <w:pPr>
+        <w:pStyle w:val="Heading3"/>
+      </w:pPr>
+      <w:r>
+        <w:t>Environmental Dynamics</w:t>
+      </w:r>
+      <w:r>
+        <w:t xml:space="preserve"> of RL</w:t>
+      </w:r>
+      <w:r>
+        <w:t xml:space="preserve">: Model-Based vs. Model-free </w:t>
+      </w:r>
+    </w:p>
+    <w:p>
+      <w:pPr>
+        <w:pStyle w:val="ListParagraph"/>
+        <w:numPr>
+          <w:ilvl w:val="0"/>
+          <w:numId w:val="19"/>
+        </w:numPr>
+      </w:pPr>
+      <w:r>
+        <w:rPr>
+          <w:b/>
+          <w:bCs/>
+        </w:rPr>
+        <w:t>Model-Based RL:</w:t>
+      </w:r>
+      <w:r>
+        <w:t xml:space="preserve"> The agent uses an explicit model of the system dynamics to plan future actions by simulating </w:t>
+      </w:r>
+      <w:r>
+        <w:t>potential trajectories (e.g. Dyna-Q, Monte Carlo Tree Search, Model Predictive Path Integral control). In other words, the knowledge of the model directly influences the agent’s decision in choosing its next action. Although this approach introduces better sample efficiency, model-based RL often leads to longer online execution time and model-bias error which can be detrimental for highly complex and non-linear polygeneration system</w:t>
+      </w:r>
+      <w:r>
+        <w:t xml:space="preserve"> []. </w:t>
+      </w:r>
+    </w:p>
+    <w:p>
+      <w:pPr>
+        <w:pStyle w:val="ListParagraph"/>
+      </w:pPr>
+    </w:p>
+    <w:p>
+      <w:pPr>
+        <w:pStyle w:val="ListParagraph"/>
+        <w:numPr>
+          <w:ilvl w:val="0"/>
+          <w:numId w:val="19"/>
+        </w:numPr>
+      </w:pPr>
+      <w:r>
+        <w:rPr>
+          <w:b/>
+          <w:bCs/>
+        </w:rPr>
+        <w:t>Model-Free RL:</w:t>
+      </w:r>
+      <w:r>
+        <w:t xml:space="preserve"> </w:t>
+      </w:r>
+      <w:r>
+        <w:t xml:space="preserve">The agent treats the model of the system as a black box and purely relies </w:t>
+      </w:r>
+      <w:r>
+        <w:lastRenderedPageBreak/>
+        <w:t>on the navigating the accessible levers and system feedback to dictate its policy. As a consequence, this strategy requires significantly more data and longer training time for the agent to finally understand the underlying physics of the system. However, with a robust and accurately representing digital twin of the system, the agent can use the digital environment to generate as much data as it needs during the training period to finally reach a good policy while avoiding model-bias because all the physics are governed inside the digital twin black box</w:t>
+      </w:r>
+      <w:r>
+        <w:t xml:space="preserve"> []</w:t>
+      </w:r>
+      <w:r>
+        <w:t xml:space="preserve">. </w:t>
+      </w:r>
+    </w:p>
+    <w:p>
+      <w:pPr>
+        <w:pStyle w:val="Heading3"/>
+        <w:numPr>
+          <w:ilvl w:val="0"/>
+          <w:numId w:val="0"/>
+        </w:numPr>
+        <w:ind w:left="720" w:hanging="720"/>
+      </w:pPr>
+    </w:p>
+    <w:p>
+      <w:pPr>
+        <w:pStyle w:val="Heading3"/>
+        <w:rPr>
+          <w:bCs/>
+        </w:rPr>
+      </w:pPr>
+      <w:r>
+        <w:rPr>
+          <w:bCs/>
+        </w:rPr>
+        <w:t>Policy Optimization Alg</w:t>
+      </w:r>
+      <w:r>
+        <w:rPr>
+          <w:bCs/>
+        </w:rPr>
+        <w:t>orithms: Value-Based, Policy-Based, and Actor-Critic</w:t>
+      </w:r>
+    </w:p>
+    <w:p>
+      <w:r>
         <w:t>There are different type</w:t>
       </w:r>
       <w:r>
@@ -12565,7 +12641,13 @@
         <w:t>are</w:t>
       </w:r>
       <w:r>
-        <w:t xml:space="preserve"> many literature on RL that simply applies </w:t>
+        <w:t xml:space="preserve"> many </w:t>
+      </w:r>
+      <w:r>
+        <w:t>literatures</w:t>
+      </w:r>
+      <w:r>
+        <w:t xml:space="preserve"> on RL that simply applies </w:t>
       </w:r>
       <w:r>
         <w:t>a value-based approach, howe</w:t>
@@ -12603,11 +12685,7 @@
     <w:p/>
     <w:p>
       <w:r>
-        <w:t xml:space="preserve">Actor-critics methods are a mixed between the two: the actor learns the policy, while the critic </w:t>
-      </w:r>
-      <w:r>
-        <w:lastRenderedPageBreak/>
-        <w:t xml:space="preserve">learns the estimated value to make training more stable. </w:t>
+        <w:t xml:space="preserve">Actor-critics methods are a mixed between the two: the actor learns the policy, while the critic learns the estimated value to make training more stable. </w:t>
       </w:r>
       <w:r>
         <w:t xml:space="preserve">In the literature, </w:t>
@@ -12651,22 +12729,119 @@
         <w:t xml:space="preserve">actor-critic </w:t>
       </w:r>
       <w:r>
-        <w:t>method includes PPO, S</w:t>
-      </w:r>
-      <w:r>
-        <w:t xml:space="preserve">AC, </w:t>
-      </w:r>
-      <w:r>
-        <w:t xml:space="preserve">A3C, TD3, and DDPG. </w:t>
-      </w:r>
-      <w:r>
-        <w:t>Many studies have have shown the application of this algorithm method</w:t>
-      </w:r>
-      <w:r>
-        <w:t xml:space="preserve"> into different kinds of energy systems. To be continued…</w:t>
-      </w:r>
-      <w:r>
-        <w:t xml:space="preserve"> </w:t>
+        <w:t xml:space="preserve">method includes </w:t>
+      </w:r>
+      <w:r>
+        <w:t>Proximal Policy Optimization (</w:t>
+      </w:r>
+      <w:r>
+        <w:t>PPO</w:t>
+      </w:r>
+      <w:r>
+        <w:t>)</w:t>
+      </w:r>
+      <w:r>
+        <w:t xml:space="preserve">, </w:t>
+      </w:r>
+      <w:r>
+        <w:t>Soft Actor-Critic (</w:t>
+      </w:r>
+      <w:r>
+        <w:t>S</w:t>
+      </w:r>
+      <w:r>
+        <w:t>AC</w:t>
+      </w:r>
+      <w:r>
+        <w:t>), Asynchronous Advantage Actor-Critic (</w:t>
+      </w:r>
+      <w:r>
+        <w:t>A3C</w:t>
+      </w:r>
+      <w:r>
+        <w:t>)</w:t>
+      </w:r>
+      <w:r>
+        <w:t xml:space="preserve">, </w:t>
+      </w:r>
+      <w:r>
+        <w:t>Twin Delayed Deep Deterministic Policy Gradient (</w:t>
+      </w:r>
+      <w:r>
+        <w:t>TD3</w:t>
+      </w:r>
+      <w:r>
+        <w:t>)</w:t>
+      </w:r>
+      <w:r>
+        <w:t xml:space="preserve">, and </w:t>
+      </w:r>
+      <w:r>
+        <w:t>Deep Deterministic Policy Gradient (</w:t>
+      </w:r>
+      <w:r>
+        <w:t>DDPG</w:t>
+      </w:r>
+      <w:r>
+        <w:t>)</w:t>
+      </w:r>
+      <w:r>
+        <w:t xml:space="preserve">. </w:t>
+      </w:r>
+      <w:r>
+        <w:lastRenderedPageBreak/>
+        <w:t>Numerous</w:t>
+      </w:r>
+      <w:r>
+        <w:t xml:space="preserve"> studies have shown the application of this algorithm method</w:t>
+      </w:r>
+      <w:r>
+        <w:t xml:space="preserve"> into different kinds of energy systems</w:t>
+      </w:r>
+      <w:r>
+        <w:t xml:space="preserve"> and concluded that it performs best when uncertainty, continuous control, and multi-timescale coordination matter </w:t>
+      </w:r>
+      <w:sdt>
+        <w:sdtPr>
+          <w:rPr>
+            <w:color w:val="000000"/>
+          </w:rPr>
+          <w:tag w:val="MENDELEY_CITATION_v3_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"/>
+          <w:id w:val="-1254361031"/>
+          <w:placeholder>
+            <w:docPart w:val="DefaultPlaceholder_-1854013440"/>
+          </w:placeholder>
+        </w:sdtPr>
+        <w:sdtContent>
+          <w:r>
+            <w:rPr>
+              <w:color w:val="000000"/>
+            </w:rPr>
+            <w:t>[47], [56]</w:t>
+          </w:r>
+        </w:sdtContent>
+      </w:sdt>
+      <w:r>
+        <w:t xml:space="preserve">. </w:t>
+      </w:r>
+    </w:p>
+    <w:p/>
+    <w:p>
+      <w:pPr>
+        <w:pStyle w:val="ListParagraph"/>
+        <w:numPr>
+          <w:ilvl w:val="0"/>
+          <w:numId w:val="14"/>
+        </w:numPr>
+        <w:rPr>
+          <w:color w:val="EE0000"/>
+        </w:rPr>
+      </w:pPr>
+      <w:r>
+        <w:rPr>
+          <w:color w:val="EE0000"/>
+        </w:rPr>
+        <w:t>Table that compares the different algorithms of RL</w:t>
       </w:r>
     </w:p>
     <w:p/>
@@ -12677,7 +12852,13 @@
       </w:pPr>
       <w:bookmarkStart w:id="13" w:name="_Toc235289156"/>
       <w:r>
-        <w:t xml:space="preserve">RL vs MILP for Different </w:t>
+        <w:t>RL vs MILP for Different</w:t>
+      </w:r>
+      <w:r>
+        <w:t xml:space="preserve"> Energy System</w:t>
+      </w:r>
+      <w:r>
+        <w:t xml:space="preserve"> </w:t>
       </w:r>
       <w:commentRangeStart w:id="14"/>
       <w:r>
@@ -12761,18 +12942,36 @@
         <w:rPr>
           <w:color w:val="000000"/>
         </w:rPr>
+        <w:t xml:space="preserve">a </w:t>
+      </w:r>
+      <w:r>
+        <w:rPr>
+          <w:color w:val="000000"/>
+        </w:rPr>
         <w:t xml:space="preserve">deep reinforcement learning </w:t>
       </w:r>
       <w:r>
         <w:rPr>
           <w:color w:val="000000"/>
         </w:rPr>
-        <w:t>framework using Deep Q-Network (DQN) algorithm to optimize the control o</w:t>
+        <w:t xml:space="preserve">framework using </w:t>
       </w:r>
       <w:r>
         <w:rPr>
           <w:color w:val="000000"/>
         </w:rPr>
+        <w:t xml:space="preserve">the </w:t>
+      </w:r>
+      <w:r>
+        <w:rPr>
+          <w:color w:val="000000"/>
+        </w:rPr>
+        <w:t>Deep Q-Network (DQN) algorithm to optimize the control o</w:t>
+      </w:r>
+      <w:r>
+        <w:rPr>
+          <w:color w:val="000000"/>
+        </w:rPr>
         <w:t>f heat pump and heating element operation</w:t>
       </w:r>
       <w:r>
@@ -12845,12 +13044,24 @@
         <w:rPr>
           <w:color w:val="000000"/>
         </w:rPr>
-        <w:t xml:space="preserve">or state it is able to see. </w:t>
+        <w:t xml:space="preserve">or state it </w:t>
       </w:r>
       <w:r>
         <w:rPr>
           <w:color w:val="000000"/>
         </w:rPr>
+        <w:t>can</w:t>
+      </w:r>
+      <w:r>
+        <w:rPr>
+          <w:color w:val="000000"/>
+        </w:rPr>
+        <w:t xml:space="preserve"> see. </w:t>
+      </w:r>
+      <w:r>
+        <w:rPr>
+          <w:color w:val="000000"/>
+        </w:rPr>
         <w:t xml:space="preserve">On the other hand, the MILP </w:t>
       </w:r>
       <w:r>
@@ -12875,55 +13086,169 @@
         <w:rPr>
           <w:color w:val="000000"/>
         </w:rPr>
-        <w:t xml:space="preserve">the reference scenario with MILP having </w:t>
+        <w:t>the reference scenario</w:t>
       </w:r>
       <w:r>
         <w:rPr>
           <w:color w:val="000000"/>
         </w:rPr>
+        <w:t>,</w:t>
+      </w:r>
+      <w:r>
+        <w:rPr>
+          <w:color w:val="000000"/>
+        </w:rPr>
+        <w:t xml:space="preserve"> with MILP having </w:t>
+      </w:r>
+      <w:r>
+        <w:rPr>
+          <w:color w:val="000000"/>
+        </w:rPr>
         <w:t>greater</w:t>
       </w:r>
       <w:r>
         <w:rPr>
           <w:color w:val="000000"/>
         </w:rPr>
-        <w:t xml:space="preserve"> cost savings on </w:t>
+        <w:t xml:space="preserve"> cost savings o</w:t>
       </w:r>
       <w:r>
         <w:rPr>
           <w:color w:val="000000"/>
         </w:rPr>
-        <w:t xml:space="preserve">10-6% reduction compared to a 8.79% RL. </w:t>
+        <w:t xml:space="preserve">f a </w:t>
       </w:r>
       <w:r>
         <w:rPr>
           <w:color w:val="000000"/>
         </w:rPr>
-        <w:t xml:space="preserve">Aside from the cost result, RL solution leads in terms of other metrics such as CO2 emission reduction, </w:t>
+        <w:t>10</w:t>
       </w:r>
       <w:r>
         <w:rPr>
           <w:color w:val="000000"/>
         </w:rPr>
+        <w:t>.06</w:t>
+      </w:r>
+      <w:r>
+        <w:rPr>
+          <w:color w:val="000000"/>
+        </w:rPr>
+        <w:t>% reduction compared to 8.7</w:t>
+      </w:r>
+      <w:r>
+        <w:rPr>
+          <w:color w:val="000000"/>
+        </w:rPr>
+        <w:t>8</w:t>
+      </w:r>
+      <w:r>
+        <w:rPr>
+          <w:color w:val="000000"/>
+        </w:rPr>
+        <w:t xml:space="preserve">% </w:t>
+      </w:r>
+      <w:r>
+        <w:rPr>
+          <w:color w:val="000000"/>
+        </w:rPr>
+        <w:t xml:space="preserve">for </w:t>
+      </w:r>
+      <w:r>
+        <w:rPr>
+          <w:color w:val="000000"/>
+        </w:rPr>
+        <w:t xml:space="preserve">RL. </w:t>
+      </w:r>
+      <w:r>
+        <w:rPr>
+          <w:color w:val="000000"/>
+        </w:rPr>
+        <w:t xml:space="preserve">Aside from the cost result, </w:t>
+      </w:r>
+      <w:r>
+        <w:rPr>
+          <w:color w:val="000000"/>
+        </w:rPr>
+        <w:t xml:space="preserve">the </w:t>
+      </w:r>
+      <w:r>
+        <w:rPr>
+          <w:color w:val="000000"/>
+        </w:rPr>
+        <w:t xml:space="preserve">RL solution leads in terms of other metrics such as CO2 emission reduction, </w:t>
+      </w:r>
+      <w:r>
+        <w:rPr>
+          <w:color w:val="000000"/>
+        </w:rPr>
         <w:t>self-consumption ratio, and self-sufficiency ratio</w:t>
       </w:r>
       <w:r>
         <w:rPr>
           <w:color w:val="000000"/>
         </w:rPr>
-        <w:t xml:space="preserve">, without it explicitly optimizing it. </w:t>
+        <w:t xml:space="preserve">, without explicitly optimizing </w:t>
       </w:r>
       <w:r>
         <w:rPr>
           <w:color w:val="000000"/>
         </w:rPr>
-        <w:t>This is due to the fact that RL</w:t>
+        <w:t>them</w:t>
       </w:r>
       <w:r>
         <w:rPr>
           <w:color w:val="000000"/>
         </w:rPr>
-        <w:t xml:space="preserve">’s decision in using more of PV, which increases SFR which further reduces CO2 </w:t>
+        <w:t xml:space="preserve">. </w:t>
+      </w:r>
+      <w:r>
+        <w:rPr>
+          <w:color w:val="000000"/>
+        </w:rPr>
+        <w:t xml:space="preserve">This is </w:t>
+      </w:r>
+      <w:r>
+        <w:rPr>
+          <w:color w:val="000000"/>
+        </w:rPr>
+        <w:t>because</w:t>
+      </w:r>
+      <w:r>
+        <w:rPr>
+          <w:color w:val="000000"/>
+        </w:rPr>
+        <w:t xml:space="preserve"> RL</w:t>
+      </w:r>
+      <w:r>
+        <w:rPr>
+          <w:color w:val="000000"/>
+        </w:rPr>
+        <w:t xml:space="preserve"> </w:t>
+      </w:r>
+      <w:r>
+        <w:rPr>
+          <w:color w:val="000000"/>
+        </w:rPr>
+        <w:t>decides</w:t>
+      </w:r>
+      <w:r>
+        <w:rPr>
+          <w:color w:val="000000"/>
+        </w:rPr>
+        <w:t xml:space="preserve"> </w:t>
+      </w:r>
+      <w:r>
+        <w:rPr>
+          <w:color w:val="000000"/>
+        </w:rPr>
+        <w:t>to use</w:t>
+      </w:r>
+      <w:r>
+        <w:rPr>
+          <w:color w:val="000000"/>
+        </w:rPr>
+        <w:t xml:space="preserve"> more PV, which further reduces CO2 </w:t>
       </w:r>
       <w:r>
         <w:rPr>
@@ -13008,7 +13333,7 @@
           <w:rPr>
             <w:color w:val="000000"/>
           </w:rPr>
-          <w:tag w:val="MENDELEY_CITATION_v3_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"/>
+          <w:tag w:val="MENDELEY_CITATION_v3_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"/>
           <w:id w:val="-252891772"/>
           <w:placeholder>
             <w:docPart w:val="DefaultPlaceholder_-1854013440"/>
@@ -13019,7 +13344,7 @@
             <w:rPr>
               <w:color w:val="000000"/>
             </w:rPr>
-            <w:t>[56]</w:t>
+            <w:t>[57]</w:t>
           </w:r>
         </w:sdtContent>
       </w:sdt>
@@ -13087,37 +13412,109 @@
         <w:rPr>
           <w:color w:val="000000"/>
         </w:rPr>
-        <w:t xml:space="preserve">sign problem here lies in sizing the battery and PV power whereas </w:t>
+        <w:t>sign problem here lies in sizing the battery and PV power</w:t>
       </w:r>
       <w:r>
         <w:rPr>
           <w:color w:val="000000"/>
         </w:rPr>
+        <w:t>,</w:t>
+      </w:r>
+      <w:r>
+        <w:rPr>
+          <w:color w:val="000000"/>
+        </w:rPr>
+        <w:t xml:space="preserve"> whereas </w:t>
+      </w:r>
+      <w:r>
+        <w:rPr>
+          <w:color w:val="000000"/>
+        </w:rPr>
         <w:t xml:space="preserve">the control problem lies in dispatching battery and grid operations. </w:t>
       </w:r>
       <w:r>
         <w:rPr>
           <w:color w:val="000000"/>
         </w:rPr>
-        <w:t xml:space="preserve">The comparison is </w:t>
+        <w:t xml:space="preserve">The comparison is done in two stages: </w:t>
       </w:r>
       <w:r>
         <w:rPr>
           <w:color w:val="000000"/>
         </w:rPr>
+        <w:t xml:space="preserve">the </w:t>
+      </w:r>
+      <w:r>
+        <w:rPr>
+          <w:color w:val="000000"/>
+        </w:rPr>
+        <w:t xml:space="preserve">first stage </w:t>
+      </w:r>
+      <w:r>
+        <w:rPr>
+          <w:color w:val="000000"/>
+        </w:rPr>
+        <w:t>only involves one week of operation</w:t>
+      </w:r>
+      <w:r>
+        <w:rPr>
+          <w:color w:val="000000"/>
+        </w:rPr>
+        <w:t>,</w:t>
+      </w:r>
+      <w:r>
+        <w:rPr>
+          <w:color w:val="000000"/>
+        </w:rPr>
+        <w:t xml:space="preserve"> and the second stage tests </w:t>
+      </w:r>
+      <w:r>
+        <w:rPr>
+          <w:color w:val="000000"/>
+        </w:rPr>
         <w:lastRenderedPageBreak/>
-        <w:t xml:space="preserve">done in two stages: first stage </w:t>
+        <w:t>both frameworks</w:t>
       </w:r>
       <w:r>
         <w:rPr>
           <w:color w:val="000000"/>
         </w:rPr>
-        <w:t xml:space="preserve">only involves one week of operation and the second stage tests both frameworks performance in one year case study. </w:t>
+        <w:t>’</w:t>
       </w:r>
       <w:r>
         <w:rPr>
           <w:color w:val="000000"/>
         </w:rPr>
+        <w:t xml:space="preserve"> performance in </w:t>
+      </w:r>
+      <w:r>
+        <w:rPr>
+          <w:color w:val="000000"/>
+        </w:rPr>
+        <w:t>a</w:t>
+      </w:r>
+      <w:r>
+        <w:rPr>
+          <w:color w:val="000000"/>
+        </w:rPr>
+        <w:t xml:space="preserve"> </w:t>
+      </w:r>
+      <w:r>
+        <w:rPr>
+          <w:color w:val="000000"/>
+        </w:rPr>
+        <w:t>one-</w:t>
+      </w:r>
+      <w:r>
+        <w:rPr>
+          <w:color w:val="000000"/>
+        </w:rPr>
+        <w:t xml:space="preserve">year case study. </w:t>
+      </w:r>
+      <w:r>
+        <w:rPr>
+          <w:color w:val="000000"/>
+        </w:rPr>
         <w:t xml:space="preserve">For the </w:t>
       </w:r>
       <w:r>
@@ -13130,12 +13527,24 @@
         <w:rPr>
           <w:color w:val="000000"/>
         </w:rPr>
-        <w:t>discovered that under a fixed sizing scenario, both frameworks manage to converge to global optimum</w:t>
+        <w:t xml:space="preserve">discovered that under a fixed sizing scenario, both frameworks manage to converge to </w:t>
       </w:r>
       <w:r>
         <w:rPr>
           <w:color w:val="000000"/>
         </w:rPr>
+        <w:t xml:space="preserve">the </w:t>
+      </w:r>
+      <w:r>
+        <w:rPr>
+          <w:color w:val="000000"/>
+        </w:rPr>
+        <w:t>global optimum</w:t>
+      </w:r>
+      <w:r>
+        <w:rPr>
+          <w:color w:val="000000"/>
+        </w:rPr>
         <w:t>. However, while introducing the design decision problem</w:t>
       </w:r>
       <w:r>
@@ -13154,30 +13563,78 @@
         <w:rPr>
           <w:color w:val="000000"/>
         </w:rPr>
-        <w:t xml:space="preserve">at first managed to produce a better result in terms of cost, however, the authors later found that this is due to the </w:t>
+        <w:t>at first managed to produce a better result in terms of cost</w:t>
       </w:r>
       <w:r>
         <w:rPr>
           <w:color w:val="000000"/>
         </w:rPr>
-        <w:t xml:space="preserve">modelling limitations that the RL excludes </w:t>
+        <w:t>;</w:t>
       </w:r>
       <w:r>
         <w:rPr>
           <w:color w:val="000000"/>
         </w:rPr>
-        <w:t xml:space="preserve">which is the battery SOC state at the end of the simulation that should be the same as the initial SOC state. </w:t>
+        <w:t xml:space="preserve"> however, the authors later found that this is due to the </w:t>
       </w:r>
       <w:r>
         <w:rPr>
           <w:color w:val="000000"/>
         </w:rPr>
-        <w:t xml:space="preserve">With this assumption being included in the calculation, the cost result of RL drops </w:t>
+        <w:t>modelling limitations that the RL excludes</w:t>
       </w:r>
       <w:r>
         <w:rPr>
           <w:color w:val="000000"/>
         </w:rPr>
+        <w:t>,</w:t>
+      </w:r>
+      <w:r>
+        <w:rPr>
+          <w:color w:val="000000"/>
+        </w:rPr>
+        <w:t xml:space="preserve"> </w:t>
+      </w:r>
+      <w:r>
+        <w:rPr>
+          <w:color w:val="000000"/>
+        </w:rPr>
+        <w:t xml:space="preserve">which is the battery SOC </w:t>
+      </w:r>
+      <w:r>
+        <w:rPr>
+          <w:color w:val="000000"/>
+        </w:rPr>
+        <w:t>balance at the end</w:t>
+      </w:r>
+      <w:r>
+        <w:rPr>
+          <w:color w:val="000000"/>
+        </w:rPr>
+        <w:t xml:space="preserve"> that should be the same as the initial SOC state. </w:t>
+      </w:r>
+      <w:r>
+        <w:rPr>
+          <w:color w:val="000000"/>
+        </w:rPr>
+        <w:t xml:space="preserve">With this assumption being included in the calculation, the cost result of RL </w:t>
+      </w:r>
+      <w:r>
+        <w:rPr>
+          <w:color w:val="000000"/>
+        </w:rPr>
+        <w:t>drops,</w:t>
+      </w:r>
+      <w:r>
+        <w:rPr>
+          <w:color w:val="000000"/>
+        </w:rPr>
+        <w:t xml:space="preserve"> </w:t>
+      </w:r>
+      <w:r>
+        <w:rPr>
+          <w:color w:val="000000"/>
+        </w:rPr>
         <w:t>and MILP prevails to become cheaper.</w:t>
       </w:r>
       <w:r>
@@ -13208,12 +13665,24 @@
         <w:rPr>
           <w:color w:val="000000"/>
         </w:rPr>
-        <w:t>the RL approach manages to converge to a near optimal solution with a design variable that is significantly different from the MILP</w:t>
+        <w:t>the RL approach manages to converge to a near</w:t>
       </w:r>
       <w:r>
         <w:rPr>
           <w:color w:val="000000"/>
         </w:rPr>
+        <w:t>-</w:t>
+      </w:r>
+      <w:r>
+        <w:rPr>
+          <w:color w:val="000000"/>
+        </w:rPr>
+        <w:t>optimal solution with a design variable that is significantly different from the MILP</w:t>
+      </w:r>
+      <w:r>
+        <w:rPr>
+          <w:color w:val="000000"/>
+        </w:rPr>
         <w:t>:</w:t>
       </w:r>
       <w:r>
@@ -13232,12 +13701,24 @@
         <w:rPr>
           <w:color w:val="000000"/>
         </w:rPr>
-        <w:t>MILP for battery and PV respectively</w:t>
+        <w:t>MILP for battery and PV</w:t>
       </w:r>
       <w:r>
         <w:rPr>
           <w:color w:val="000000"/>
         </w:rPr>
+        <w:t>,</w:t>
+      </w:r>
+      <w:r>
+        <w:rPr>
+          <w:color w:val="000000"/>
+        </w:rPr>
+        <w:t xml:space="preserve"> respectively</w:t>
+      </w:r>
+      <w:r>
+        <w:rPr>
+          <w:color w:val="000000"/>
+        </w:rPr>
         <w:t>, with the</w:t>
       </w:r>
       <w:r>
@@ -13270,12 +13751,24 @@
         <w:rPr>
           <w:color w:val="000000"/>
         </w:rPr>
-        <w:t>In the second stage of this study, RL</w:t>
+        <w:t xml:space="preserve">In the second stage of this study, </w:t>
       </w:r>
       <w:r>
         <w:rPr>
           <w:color w:val="000000"/>
         </w:rPr>
+        <w:t xml:space="preserve">the </w:t>
+      </w:r>
+      <w:r>
+        <w:rPr>
+          <w:color w:val="000000"/>
+        </w:rPr>
+        <w:t>RL</w:t>
+      </w:r>
+      <w:r>
+        <w:rPr>
+          <w:color w:val="000000"/>
+        </w:rPr>
         <w:t xml:space="preserve"> </w:t>
       </w:r>
       <w:r>
@@ -13324,18 +13817,30 @@
         <w:rPr>
           <w:color w:val="000000"/>
         </w:rPr>
-        <w:t xml:space="preserve">having 22% more cost than MILP, while the designs </w:t>
+        <w:t xml:space="preserve">having 22% more cost than MILP, while the design </w:t>
       </w:r>
       <w:r>
         <w:rPr>
           <w:color w:val="000000"/>
         </w:rPr>
-        <w:t>decision are significantly smaller than MILP (44 kWh &amp; 57 kWp</w:t>
+        <w:t>decision</w:t>
       </w:r>
       <w:r>
         <w:rPr>
           <w:color w:val="000000"/>
         </w:rPr>
+        <w:t>s</w:t>
+      </w:r>
+      <w:r>
+        <w:rPr>
+          <w:color w:val="000000"/>
+        </w:rPr>
+        <w:t xml:space="preserve"> are significantly smaller than MILP (44 kWh &amp; 57 kWp</w:t>
+      </w:r>
+      <w:r>
+        <w:rPr>
+          <w:color w:val="000000"/>
+        </w:rPr>
         <w:t xml:space="preserve"> RL and </w:t>
       </w:r>
       <w:r>
@@ -13360,24 +13865,54 @@
         <w:rPr>
           <w:color w:val="000000"/>
         </w:rPr>
-        <w:t xml:space="preserve"> for battery and PV respectively)</w:t>
+        <w:t xml:space="preserve"> for battery and PV</w:t>
       </w:r>
       <w:r>
         <w:rPr>
           <w:color w:val="000000"/>
         </w:rPr>
-        <w:t>. According to the authors of the study, this poorer performance of RL could be due to a lot of reasons, two of the notable reasons includ</w:t>
+        <w:t>,</w:t>
       </w:r>
       <w:r>
         <w:rPr>
           <w:color w:val="000000"/>
         </w:rPr>
+        <w:t xml:space="preserve"> respectively)</w:t>
+      </w:r>
+      <w:r>
+        <w:rPr>
+          <w:color w:val="000000"/>
+        </w:rPr>
+        <w:t>. According to the authors of the study, this poorer performance of RL could be due to a lot of reasons</w:t>
+      </w:r>
+      <w:r>
+        <w:rPr>
+          <w:color w:val="000000"/>
+        </w:rPr>
+        <w:t>;</w:t>
+      </w:r>
+      <w:r>
+        <w:rPr>
+          <w:color w:val="000000"/>
+        </w:rPr>
+        <w:t xml:space="preserve"> two of the notable reasons includ</w:t>
+      </w:r>
+      <w:r>
+        <w:rPr>
+          <w:color w:val="000000"/>
+        </w:rPr>
         <w:t xml:space="preserve">e hyperparameter tuning and </w:t>
       </w:r>
       <w:r>
         <w:rPr>
           <w:color w:val="000000"/>
         </w:rPr>
+        <w:t xml:space="preserve">the </w:t>
+      </w:r>
+      <w:r>
+        <w:rPr>
+          <w:color w:val="000000"/>
+        </w:rPr>
         <w:t xml:space="preserve">outdated </w:t>
       </w:r>
       <w:r>
@@ -13402,17 +13937,122 @@
     </w:p>
     <w:p>
       <w:pPr>
-        <w:pStyle w:val="Heading2"/>
-      </w:pPr>
-      <w:r>
-        <w:t xml:space="preserve">Hybrid Bayesian Optimization and MILP or RL </w:t>
-      </w:r>
-      <w:r>
-        <w:t xml:space="preserve">as </w:t>
-      </w:r>
-      <w:r>
-        <w:t>Bilevel Formulation</w:t>
-      </w:r>
+        <w:rPr>
+          <w:color w:val="000000"/>
+        </w:rPr>
+      </w:pPr>
+      <w:r>
+        <w:rPr>
+          <w:color w:val="000000"/>
+        </w:rPr>
+        <w:t>Reviews now identify TD3, SAC, Multi</w:t>
+      </w:r>
+      <w:r>
+        <w:rPr>
+          <w:color w:val="000000"/>
+        </w:rPr>
+        <w:t>-</w:t>
+      </w:r>
+      <w:r>
+        <w:rPr>
+          <w:color w:val="000000"/>
+        </w:rPr>
+        <w:t>Agent Reinforcement Learning (MARL), and PPO</w:t>
+      </w:r>
+      <w:r>
+        <w:rPr>
+          <w:color w:val="000000"/>
+        </w:rPr>
+        <w:t xml:space="preserve"> as the main advanced RL families being adopted for energy management, especially in online or uncertainty-heavy settings </w:t>
+      </w:r>
+      <w:sdt>
+        <w:sdtPr>
+          <w:rPr>
+            <w:color w:val="000000"/>
+          </w:rPr>
+          <w:tag w:val="MENDELEY_CITATION_v3_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"/>
+          <w:id w:val="720633209"/>
+          <w:placeholder>
+            <w:docPart w:val="DefaultPlaceholder_-1854013440"/>
+          </w:placeholder>
+        </w:sdtPr>
+        <w:sdtContent>
+          <w:r>
+            <w:rPr>
+              <w:color w:val="000000"/>
+            </w:rPr>
+            <w:t>[58]</w:t>
+          </w:r>
+        </w:sdtContent>
+      </w:sdt>
+      <w:r>
+        <w:rPr>
+          <w:color w:val="000000"/>
+        </w:rPr>
+        <w:t xml:space="preserve">. </w:t>
+      </w:r>
+    </w:p>
+    <w:p>
+      <w:pPr>
+        <w:rPr>
+          <w:color w:val="000000"/>
+        </w:rPr>
+      </w:pPr>
+    </w:p>
+    <w:p>
+      <w:pPr>
+        <w:pStyle w:val="ListParagraph"/>
+        <w:numPr>
+          <w:ilvl w:val="0"/>
+          <w:numId w:val="14"/>
+        </w:numPr>
+        <w:rPr>
+          <w:color w:val="000000"/>
+        </w:rPr>
+      </w:pPr>
+      <w:r>
+        <w:rPr>
+          <w:color w:val="000000"/>
+        </w:rPr>
+        <w:t>MILP vs RL for SAC and PPO, and other state-of-the-art RL algorithms</w:t>
+      </w:r>
+    </w:p>
+    <w:p>
+      <w:pPr>
+        <w:pStyle w:val="ListParagraph"/>
+        <w:numPr>
+          <w:ilvl w:val="0"/>
+          <w:numId w:val="14"/>
+        </w:numPr>
+        <w:rPr>
+          <w:color w:val="000000"/>
+        </w:rPr>
+      </w:pPr>
+      <w:r>
+        <w:rPr>
+          <w:color w:val="000000"/>
+        </w:rPr>
+        <w:t>RL &amp; MILP hybrid approach in optimizing energy system (if actually recommended, mention as future outlook that can be implemented in the future)</w:t>
+      </w:r>
+    </w:p>
+    <w:p>
+      <w:pPr>
+        <w:pStyle w:val="ListParagraph"/>
+        <w:numPr>
+          <w:ilvl w:val="0"/>
+          <w:numId w:val="14"/>
+        </w:numPr>
+        <w:rPr>
+          <w:color w:val="000000"/>
+        </w:rPr>
+      </w:pPr>
+    </w:p>
+    <w:p>
+      <w:pPr>
+        <w:rPr>
+          <w:color w:val="000000"/>
+        </w:rPr>
+      </w:pPr>
     </w:p>
     <w:p>
       <w:pPr>
@@ -18007,6 +18647,181 @@
     </w:lvl>
   </w:abstractNum>
   <w:abstractNum w:abstractNumId="1" w15:restartNumberingAfterBreak="0">
+    <w:nsid w:val="08EC6478"/>
+    <w:multiLevelType w:val="hybridMultilevel"/>
+    <w:tmpl w:val="145C49B2"/>
+    <w:lvl w:ilvl="0" w:tplc="04090011">
+      <w:start w:val="1"/>
+      <w:numFmt w:val="decimal"/>
+      <w:lvlText w:val="%1)"/>
+      <w:lvlJc w:val="left"/>
+      <w:pPr>
+        <w:ind w:left="720" w:hanging="360"/>
+      </w:pPr>
+    </w:lvl>
+    <w:lvl w:ilvl="1" w:tplc="04090019" w:tentative="1">
+      <w:start w:val="1"/>
+      <w:numFmt w:val="lowerLetter"/>
+      <w:lvlText w:val="%2."/>
+      <w:lvlJc w:val="left"/>
+      <w:pPr>
+        <w:ind w:left="1440" w:hanging="360"/>
+      </w:pPr>
+    </w:lvl>
+    <w:lvl w:ilvl="2" w:tplc="0409001B" w:tentative="1">
+      <w:start w:val="1"/>
+      <w:numFmt w:val="lowerRoman"/>
+      <w:lvlText w:val="%3."/>
+      <w:lvlJc w:val="right"/>
+      <w:pPr>
+        <w:ind w:left="2160" w:hanging="180"/>
+      </w:pPr>
+    </w:lvl>
+    <w:lvl w:ilvl="3" w:tplc="0409000F" w:tentative="1">
+      <w:start w:val="1"/>
+      <w:numFmt w:val="decimal"/>
+      <w:lvlText w:val="%4."/>
+      <w:lvlJc w:val="left"/>
+      <w:pPr>
+        <w:ind w:left="2880" w:hanging="360"/>
+      </w:pPr>
+    </w:lvl>
+    <w:lvl w:ilvl="4" w:tplc="04090019" w:tentative="1">
+      <w:start w:val="1"/>
+      <w:numFmt w:val="lowerLetter"/>
+      <w:lvlText w:val="%5."/>
+      <w:lvlJc w:val="left"/>
+      <w:pPr>
+        <w:ind w:left="3600" w:hanging="360"/>
+      </w:pPr>
+    </w:lvl>
+    <w:lvl w:ilvl="5" w:tplc="0409001B" w:tentative="1">
+      <w:start w:val="1"/>
+      <w:numFmt w:val="lowerRoman"/>
+      <w:lvlText w:val="%6."/>
+      <w:lvlJc w:val="right"/>
+      <w:pPr>
+        <w:ind w:left="4320" w:hanging="180"/>
+      </w:pPr>
+    </w:lvl>
+    <w:lvl w:ilvl="6" w:tplc="0409000F" w:tentative="1">
+      <w:start w:val="1"/>
+      <w:numFmt w:val="decimal"/>
+      <w:lvlText w:val="%7."/>
+      <w:lvlJc w:val="left"/>
+      <w:pPr>
+        <w:ind w:left="5040" w:hanging="360"/>
+      </w:pPr>
+    </w:lvl>
+    <w:lvl w:ilvl="7" w:tplc="04090019" w:tentative="1">
+      <w:start w:val="1"/>
+      <w:numFmt w:val="lowerLetter"/>
+      <w:lvlText w:val="%8."/>
+      <w:lvlJc w:val="left"/>
+      <w:pPr>
+        <w:ind w:left="5760" w:hanging="360"/>
+      </w:pPr>
+    </w:lvl>
+    <w:lvl w:ilvl="8" w:tplc="0409001B" w:tentative="1">
+      <w:start w:val="1"/>
+      <w:numFmt w:val="lowerRoman"/>
+      <w:lvlText w:val="%9."/>
+      <w:lvlJc w:val="right"/>
+      <w:pPr>
+        <w:ind w:left="6480" w:hanging="180"/>
+      </w:pPr>
+    </w:lvl>
+  </w:abstractNum>
+  <w:abstractNum w:abstractNumId="2" w15:restartNumberingAfterBreak="0">
+    <w:nsid w:val="0C6542A6"/>
+    <w:multiLevelType w:val="hybridMultilevel"/>
+    <w:tmpl w:val="15C6C674"/>
+    <w:lvl w:ilvl="0" w:tplc="FFFFFFFF">
+      <w:start w:val="1"/>
+      <w:numFmt w:val="decimal"/>
+      <w:lvlText w:val="%1."/>
+      <w:lvlJc w:val="left"/>
+      <w:pPr>
+        <w:ind w:left="720" w:hanging="360"/>
+      </w:pPr>
+      <w:rPr>
+        <w:rFonts w:hint="default"/>
+      </w:rPr>
+    </w:lvl>
+    <w:lvl w:ilvl="1" w:tplc="FFFFFFFF" w:tentative="1">
+      <w:start w:val="1"/>
+      <w:numFmt w:val="lowerLetter"/>
+      <w:lvlText w:val="%2."/>
+      <w:lvlJc w:val="left"/>
+      <w:pPr>
+        <w:ind w:left="1440" w:hanging="360"/>
+      </w:pPr>
+    </w:lvl>
+    <w:lvl w:ilvl="2" w:tplc="FFFFFFFF" w:tentative="1">
+      <w:start w:val="1"/>
+      <w:numFmt w:val="lowerRoman"/>
+      <w:lvlText w:val="%3."/>
+      <w:lvlJc w:val="right"/>
+      <w:pPr>
+        <w:ind w:left="2160" w:hanging="180"/>
+      </w:pPr>
+    </w:lvl>
+    <w:lvl w:ilvl="3" w:tplc="FFFFFFFF" w:tentative="1">
+      <w:start w:val="1"/>
+      <w:numFmt w:val="decimal"/>
+      <w:lvlText w:val="%4."/>
+      <w:lvlJc w:val="left"/>
+      <w:pPr>
+        <w:ind w:left="2880" w:hanging="360"/>
+      </w:pPr>
+    </w:lvl>
+    <w:lvl w:ilvl="4" w:tplc="FFFFFFFF" w:tentative="1">
+      <w:start w:val="1"/>
+      <w:numFmt w:val="lowerLetter"/>
+      <w:lvlText w:val="%5."/>
+      <w:lvlJc w:val="left"/>
+      <w:pPr>
+        <w:ind w:left="3600" w:hanging="360"/>
+      </w:pPr>
+    </w:lvl>
+    <w:lvl w:ilvl="5" w:tplc="FFFFFFFF" w:tentative="1">
+      <w:start w:val="1"/>
+      <w:numFmt w:val="lowerRoman"/>
+      <w:lvlText w:val="%6."/>
+      <w:lvlJc w:val="right"/>
+      <w:pPr>
+        <w:ind w:left="4320" w:hanging="180"/>
+      </w:pPr>
+    </w:lvl>
+    <w:lvl w:ilvl="6" w:tplc="FFFFFFFF" w:tentative="1">
+      <w:start w:val="1"/>
+      <w:numFmt w:val="decimal"/>
+      <w:lvlText w:val="%7."/>
+      <w:lvlJc w:val="left"/>
+      <w:pPr>
+        <w:ind w:left="5040" w:hanging="360"/>
+      </w:pPr>
+    </w:lvl>
+    <w:lvl w:ilvl="7" w:tplc="FFFFFFFF" w:tentative="1">
+      <w:start w:val="1"/>
+      <w:numFmt w:val="lowerLetter"/>
+      <w:lvlText w:val="%8."/>
+      <w:lvlJc w:val="left"/>
+      <w:pPr>
+        <w:ind w:left="5760" w:hanging="360"/>
+      </w:pPr>
+    </w:lvl>
+    <w:lvl w:ilvl="8" w:tplc="FFFFFFFF" w:tentative="1">
+      <w:start w:val="1"/>
+      <w:numFmt w:val="lowerRoman"/>
+      <w:lvlText w:val="%9."/>
+      <w:lvlJc w:val="right"/>
+      <w:pPr>
+        <w:ind w:left="6480" w:hanging="180"/>
+      </w:pPr>
+    </w:lvl>
+  </w:abstractNum>
+  <w:abstractNum w:abstractNumId="3" w15:restartNumberingAfterBreak="0">
     <w:nsid w:val="0FA843D6"/>
     <w:multiLevelType w:val="hybridMultilevel"/>
     <w:tmpl w:val="D4FC5FF6"/>
@@ -18119,7 +18934,120 @@
       </w:rPr>
     </w:lvl>
   </w:abstractNum>
-  <w:abstractNum w:abstractNumId="2" w15:restartNumberingAfterBreak="0">
+  <w:abstractNum w:abstractNumId="4" w15:restartNumberingAfterBreak="0">
+    <w:nsid w:val="16ED3FC4"/>
+    <w:multiLevelType w:val="hybridMultilevel"/>
+    <w:tmpl w:val="5FC2F790"/>
+    <w:lvl w:ilvl="0" w:tplc="04090001">
+      <w:start w:val="1"/>
+      <w:numFmt w:val="bullet"/>
+      <w:lvlText w:val=""/>
+      <w:lvlJc w:val="left"/>
+      <w:pPr>
+        <w:ind w:left="720" w:hanging="360"/>
+      </w:pPr>
+      <w:rPr>
+        <w:rFonts w:ascii="Symbol" w:hAnsi="Symbol" w:hint="default"/>
+      </w:rPr>
+    </w:lvl>
+    <w:lvl w:ilvl="1" w:tplc="04090003" w:tentative="1">
+      <w:start w:val="1"/>
+      <w:numFmt w:val="bullet"/>
+      <w:lvlText w:val="o"/>
+      <w:lvlJc w:val="left"/>
+      <w:pPr>
+        <w:ind w:left="1440" w:hanging="360"/>
+      </w:pPr>
+      <w:rPr>
+        <w:rFonts w:ascii="Courier New" w:hAnsi="Courier New" w:hint="default"/>
+      </w:rPr>
+    </w:lvl>
+    <w:lvl w:ilvl="2" w:tplc="04090005" w:tentative="1">
+      <w:start w:val="1"/>
+      <w:numFmt w:val="bullet"/>
+      <w:lvlText w:val=""/>
+      <w:lvlJc w:val="left"/>
+      <w:pPr>
+        <w:ind w:left="2160" w:hanging="360"/>
+      </w:pPr>
+      <w:rPr>
+        <w:rFonts w:ascii="Wingdings" w:hAnsi="Wingdings" w:hint="default"/>
+      </w:rPr>
+    </w:lvl>
+    <w:lvl w:ilvl="3" w:tplc="04090001" w:tentative="1">
+      <w:start w:val="1"/>
+      <w:numFmt w:val="bullet"/>
+      <w:lvlText w:val=""/>
+      <w:lvlJc w:val="left"/>
+      <w:pPr>
+        <w:ind w:left="2880" w:hanging="360"/>
+      </w:pPr>
+      <w:rPr>
+        <w:rFonts w:ascii="Symbol" w:hAnsi="Symbol" w:hint="default"/>
+      </w:rPr>
+    </w:lvl>
+    <w:lvl w:ilvl="4" w:tplc="04090003" w:tentative="1">
+      <w:start w:val="1"/>
+      <w:numFmt w:val="bullet"/>
+      <w:lvlText w:val="o"/>
+      <w:lvlJc w:val="left"/>
+      <w:pPr>
+        <w:ind w:left="3600" w:hanging="360"/>
+      </w:pPr>
+      <w:rPr>
+        <w:rFonts w:ascii="Courier New" w:hAnsi="Courier New" w:hint="default"/>
+      </w:rPr>
+    </w:lvl>
+    <w:lvl w:ilvl="5" w:tplc="04090005" w:tentative="1">
+      <w:start w:val="1"/>
+      <w:numFmt w:val="bullet"/>
+      <w:lvlText w:val=""/>
+      <w:lvlJc w:val="left"/>
+      <w:pPr>
+        <w:ind w:left="4320" w:hanging="360"/>
+      </w:pPr>
+      <w:rPr>
+        <w:rFonts w:ascii="Wingdings" w:hAnsi="Wingdings" w:hint="default"/>
+      </w:rPr>
+    </w:lvl>
+    <w:lvl w:ilvl="6" w:tplc="04090001" w:tentative="1">
+      <w:start w:val="1"/>
+      <w:numFmt w:val="bullet"/>
+      <w:lvlText w:val=""/>
+      <w:lvlJc w:val="left"/>
+      <w:pPr>
+        <w:ind w:left="5040" w:hanging="360"/>
+      </w:pPr>
+      <w:rPr>
+        <w:rFonts w:ascii="Symbol" w:hAnsi="Symbol" w:hint="default"/>
+      </w:rPr>
+    </w:lvl>
+    <w:lvl w:ilvl="7" w:tplc="04090003" w:tentative="1">
+      <w:start w:val="1"/>
+      <w:numFmt w:val="bullet"/>
+      <w:lvlText w:val="o"/>
+      <w:lvlJc w:val="left"/>
+      <w:pPr>
+        <w:ind w:left="5760" w:hanging="360"/>
+      </w:pPr>
+      <w:rPr>
+        <w:rFonts w:ascii="Courier New" w:hAnsi="Courier New" w:hint="default"/>
+      </w:rPr>
+    </w:lvl>
+    <w:lvl w:ilvl="8" w:tplc="04090005" w:tentative="1">
+      <w:start w:val="1"/>
+      <w:numFmt w:val="bullet"/>
+      <w:lvlText w:val=""/>
+      <w:lvlJc w:val="left"/>
+      <w:pPr>
+        <w:ind w:left="6480" w:hanging="360"/>
+      </w:pPr>
+      <w:rPr>
+        <w:rFonts w:ascii="Wingdings" w:hAnsi="Wingdings" w:hint="default"/>
+      </w:rPr>
+    </w:lvl>
+  </w:abstractNum>
+  <w:abstractNum w:abstractNumId="5" w15:restartNumberingAfterBreak="0">
     <w:nsid w:val="1AA90C95"/>
     <w:multiLevelType w:val="hybridMultilevel"/>
     <w:tmpl w:val="041E2E94"/>
@@ -18232,10 +19160,10 @@
       </w:rPr>
     </w:lvl>
   </w:abstractNum>
-  <w:abstractNum w:abstractNumId="3" w15:restartNumberingAfterBreak="0">
+  <w:abstractNum w:abstractNumId="6" w15:restartNumberingAfterBreak="0">
     <w:nsid w:val="1FCB6643"/>
     <w:multiLevelType w:val="multilevel"/>
-    <w:tmpl w:val="3E70E1E0"/>
+    <w:tmpl w:val="FCC0EC9C"/>
     <w:lvl w:ilvl="0">
       <w:start w:val="1"/>
       <w:numFmt w:val="decimal"/>
@@ -18327,7 +19255,7 @@
       </w:pPr>
     </w:lvl>
   </w:abstractNum>
-  <w:abstractNum w:abstractNumId="4" w15:restartNumberingAfterBreak="0">
+  <w:abstractNum w:abstractNumId="7" w15:restartNumberingAfterBreak="0">
     <w:nsid w:val="22084036"/>
     <w:multiLevelType w:val="hybridMultilevel"/>
     <w:tmpl w:val="DBD28B6A"/>
@@ -18440,7 +19368,7 @@
       </w:rPr>
     </w:lvl>
   </w:abstractNum>
-  <w:abstractNum w:abstractNumId="5" w15:restartNumberingAfterBreak="0">
+  <w:abstractNum w:abstractNumId="8" w15:restartNumberingAfterBreak="0">
     <w:nsid w:val="22D20551"/>
     <w:multiLevelType w:val="hybridMultilevel"/>
     <w:tmpl w:val="7B8AE820"/>
@@ -18552,10 +19480,96 @@
       </w:rPr>
     </w:lvl>
   </w:abstractNum>
-  <w:abstractNum w:abstractNumId="6" w15:restartNumberingAfterBreak="0">
-    <w:nsid w:val="300E4837"/>
+  <w:abstractNum w:abstractNumId="9" w15:restartNumberingAfterBreak="0">
+    <w:nsid w:val="234B3D9C"/>
     <w:multiLevelType w:val="hybridMultilevel"/>
-    <w:tmpl w:val="21A88B6C"/>
+    <w:tmpl w:val="74A080CA"/>
+    <w:lvl w:ilvl="0" w:tplc="04090011">
+      <w:start w:val="1"/>
+      <w:numFmt w:val="decimal"/>
+      <w:lvlText w:val="%1)"/>
+      <w:lvlJc w:val="left"/>
+      <w:pPr>
+        <w:ind w:left="720" w:hanging="360"/>
+      </w:pPr>
+    </w:lvl>
+    <w:lvl w:ilvl="1" w:tplc="04090019" w:tentative="1">
+      <w:start w:val="1"/>
+      <w:numFmt w:val="lowerLetter"/>
+      <w:lvlText w:val="%2."/>
+      <w:lvlJc w:val="left"/>
+      <w:pPr>
+        <w:ind w:left="1440" w:hanging="360"/>
+      </w:pPr>
+    </w:lvl>
+    <w:lvl w:ilvl="2" w:tplc="0409001B" w:tentative="1">
+      <w:start w:val="1"/>
+      <w:numFmt w:val="lowerRoman"/>
+      <w:lvlText w:val="%3."/>
+      <w:lvlJc w:val="right"/>
+      <w:pPr>
+        <w:ind w:left="2160" w:hanging="180"/>
+      </w:pPr>
+    </w:lvl>
+    <w:lvl w:ilvl="3" w:tplc="0409000F" w:tentative="1">
+      <w:start w:val="1"/>
+      <w:numFmt w:val="decimal"/>
+      <w:lvlText w:val="%4."/>
+      <w:lvlJc w:val="left"/>
+      <w:pPr>
+        <w:ind w:left="2880" w:hanging="360"/>
+      </w:pPr>
+    </w:lvl>
+    <w:lvl w:ilvl="4" w:tplc="04090019" w:tentative="1">
+      <w:start w:val="1"/>
+      <w:numFmt w:val="lowerLetter"/>
+      <w:lvlText w:val="%5."/>
+      <w:lvlJc w:val="left"/>
+      <w:pPr>
+        <w:ind w:left="3600" w:hanging="360"/>
+      </w:pPr>
+    </w:lvl>
+    <w:lvl w:ilvl="5" w:tplc="0409001B" w:tentative="1">
+      <w:start w:val="1"/>
+      <w:numFmt w:val="lowerRoman"/>
+      <w:lvlText w:val="%6."/>
+      <w:lvlJc w:val="right"/>
+      <w:pPr>
+        <w:ind w:left="4320" w:hanging="180"/>
+      </w:pPr>
+    </w:lvl>
+    <w:lvl w:ilvl="6" w:tplc="0409000F" w:tentative="1">
+      <w:start w:val="1"/>
+      <w:numFmt w:val="decimal"/>
+      <w:lvlText w:val="%7."/>
+      <w:lvlJc w:val="left"/>
+      <w:pPr>
+        <w:ind w:left="5040" w:hanging="360"/>
+      </w:pPr>
+    </w:lvl>
+    <w:lvl w:ilvl="7" w:tplc="04090019" w:tentative="1">
+      <w:start w:val="1"/>
+      <w:numFmt w:val="lowerLetter"/>
+      <w:lvlText w:val="%8."/>
+      <w:lvlJc w:val="left"/>
+      <w:pPr>
+        <w:ind w:left="5760" w:hanging="360"/>
+      </w:pPr>
+    </w:lvl>
+    <w:lvl w:ilvl="8" w:tplc="0409001B" w:tentative="1">
+      <w:start w:val="1"/>
+      <w:numFmt w:val="lowerRoman"/>
+      <w:lvlText w:val="%9."/>
+      <w:lvlJc w:val="right"/>
+      <w:pPr>
+        <w:ind w:left="6480" w:hanging="180"/>
+      </w:pPr>
+    </w:lvl>
+  </w:abstractNum>
+  <w:abstractNum w:abstractNumId="10" w15:restartNumberingAfterBreak="0">
+    <w:nsid w:val="2F7857E6"/>
+    <w:multiLevelType w:val="hybridMultilevel"/>
+    <w:tmpl w:val="97D09220"/>
     <w:lvl w:ilvl="0" w:tplc="04090001">
       <w:start w:val="1"/>
       <w:numFmt w:val="bullet"/>
@@ -18577,7 +19591,7 @@
         <w:ind w:left="1440" w:hanging="360"/>
       </w:pPr>
       <w:rPr>
-        <w:rFonts w:ascii="Courier New" w:hAnsi="Courier New" w:cs="Courier New" w:hint="default"/>
+        <w:rFonts w:ascii="Courier New" w:hAnsi="Courier New" w:hint="default"/>
       </w:rPr>
     </w:lvl>
     <w:lvl w:ilvl="2" w:tplc="04090005" w:tentative="1">
@@ -18613,7 +19627,7 @@
         <w:ind w:left="3600" w:hanging="360"/>
       </w:pPr>
       <w:rPr>
-        <w:rFonts w:ascii="Courier New" w:hAnsi="Courier New" w:cs="Courier New" w:hint="default"/>
+        <w:rFonts w:ascii="Courier New" w:hAnsi="Courier New" w:hint="default"/>
       </w:rPr>
     </w:lvl>
     <w:lvl w:ilvl="5" w:tplc="04090005" w:tentative="1">
@@ -18649,6 +19663,119 @@
         <w:ind w:left="5760" w:hanging="360"/>
       </w:pPr>
       <w:rPr>
+        <w:rFonts w:ascii="Courier New" w:hAnsi="Courier New" w:hint="default"/>
+      </w:rPr>
+    </w:lvl>
+    <w:lvl w:ilvl="8" w:tplc="04090005" w:tentative="1">
+      <w:start w:val="1"/>
+      <w:numFmt w:val="bullet"/>
+      <w:lvlText w:val=""/>
+      <w:lvlJc w:val="left"/>
+      <w:pPr>
+        <w:ind w:left="6480" w:hanging="360"/>
+      </w:pPr>
+      <w:rPr>
+        <w:rFonts w:ascii="Wingdings" w:hAnsi="Wingdings" w:hint="default"/>
+      </w:rPr>
+    </w:lvl>
+  </w:abstractNum>
+  <w:abstractNum w:abstractNumId="11" w15:restartNumberingAfterBreak="0">
+    <w:nsid w:val="300E4837"/>
+    <w:multiLevelType w:val="hybridMultilevel"/>
+    <w:tmpl w:val="21A88B6C"/>
+    <w:lvl w:ilvl="0" w:tplc="04090001">
+      <w:start w:val="1"/>
+      <w:numFmt w:val="bullet"/>
+      <w:lvlText w:val=""/>
+      <w:lvlJc w:val="left"/>
+      <w:pPr>
+        <w:ind w:left="720" w:hanging="360"/>
+      </w:pPr>
+      <w:rPr>
+        <w:rFonts w:ascii="Symbol" w:hAnsi="Symbol" w:hint="default"/>
+      </w:rPr>
+    </w:lvl>
+    <w:lvl w:ilvl="1" w:tplc="04090003" w:tentative="1">
+      <w:start w:val="1"/>
+      <w:numFmt w:val="bullet"/>
+      <w:lvlText w:val="o"/>
+      <w:lvlJc w:val="left"/>
+      <w:pPr>
+        <w:ind w:left="1440" w:hanging="360"/>
+      </w:pPr>
+      <w:rPr>
+        <w:rFonts w:ascii="Courier New" w:hAnsi="Courier New" w:cs="Courier New" w:hint="default"/>
+      </w:rPr>
+    </w:lvl>
+    <w:lvl w:ilvl="2" w:tplc="04090005" w:tentative="1">
+      <w:start w:val="1"/>
+      <w:numFmt w:val="bullet"/>
+      <w:lvlText w:val=""/>
+      <w:lvlJc w:val="left"/>
+      <w:pPr>
+        <w:ind w:left="2160" w:hanging="360"/>
+      </w:pPr>
+      <w:rPr>
+        <w:rFonts w:ascii="Wingdings" w:hAnsi="Wingdings" w:hint="default"/>
+      </w:rPr>
+    </w:lvl>
+    <w:lvl w:ilvl="3" w:tplc="04090001" w:tentative="1">
+      <w:start w:val="1"/>
+      <w:numFmt w:val="bullet"/>
+      <w:lvlText w:val=""/>
+      <w:lvlJc w:val="left"/>
+      <w:pPr>
+        <w:ind w:left="2880" w:hanging="360"/>
+      </w:pPr>
+      <w:rPr>
+        <w:rFonts w:ascii="Symbol" w:hAnsi="Symbol" w:hint="default"/>
+      </w:rPr>
+    </w:lvl>
+    <w:lvl w:ilvl="4" w:tplc="04090003" w:tentative="1">
+      <w:start w:val="1"/>
+      <w:numFmt w:val="bullet"/>
+      <w:lvlText w:val="o"/>
+      <w:lvlJc w:val="left"/>
+      <w:pPr>
+        <w:ind w:left="3600" w:hanging="360"/>
+      </w:pPr>
+      <w:rPr>
+        <w:rFonts w:ascii="Courier New" w:hAnsi="Courier New" w:cs="Courier New" w:hint="default"/>
+      </w:rPr>
+    </w:lvl>
+    <w:lvl w:ilvl="5" w:tplc="04090005" w:tentative="1">
+      <w:start w:val="1"/>
+      <w:numFmt w:val="bullet"/>
+      <w:lvlText w:val=""/>
+      <w:lvlJc w:val="left"/>
+      <w:pPr>
+        <w:ind w:left="4320" w:hanging="360"/>
+      </w:pPr>
+      <w:rPr>
+        <w:rFonts w:ascii="Wingdings" w:hAnsi="Wingdings" w:hint="default"/>
+      </w:rPr>
+    </w:lvl>
+    <w:lvl w:ilvl="6" w:tplc="04090001" w:tentative="1">
+      <w:start w:val="1"/>
+      <w:numFmt w:val="bullet"/>
+      <w:lvlText w:val=""/>
+      <w:lvlJc w:val="left"/>
+      <w:pPr>
+        <w:ind w:left="5040" w:hanging="360"/>
+      </w:pPr>
+      <w:rPr>
+        <w:rFonts w:ascii="Symbol" w:hAnsi="Symbol" w:hint="default"/>
+      </w:rPr>
+    </w:lvl>
+    <w:lvl w:ilvl="7" w:tplc="04090003" w:tentative="1">
+      <w:start w:val="1"/>
+      <w:numFmt w:val="bullet"/>
+      <w:lvlText w:val="o"/>
+      <w:lvlJc w:val="left"/>
+      <w:pPr>
+        <w:ind w:left="5760" w:hanging="360"/>
+      </w:pPr>
+      <w:rPr>
         <w:rFonts w:ascii="Courier New" w:hAnsi="Courier New" w:cs="Courier New" w:hint="default"/>
       </w:rPr>
     </w:lvl>
@@ -18665,7 +19792,7 @@
       </w:rPr>
     </w:lvl>
   </w:abstractNum>
-  <w:abstractNum w:abstractNumId="7" w15:restartNumberingAfterBreak="0">
+  <w:abstractNum w:abstractNumId="12" w15:restartNumberingAfterBreak="0">
     <w:nsid w:val="325C3B4B"/>
     <w:multiLevelType w:val="hybridMultilevel"/>
     <w:tmpl w:val="C6E029BA"/>
@@ -18778,7 +19905,7 @@
       </w:rPr>
     </w:lvl>
   </w:abstractNum>
-  <w:abstractNum w:abstractNumId="8" w15:restartNumberingAfterBreak="0">
+  <w:abstractNum w:abstractNumId="13" w15:restartNumberingAfterBreak="0">
     <w:nsid w:val="36C30D85"/>
     <w:multiLevelType w:val="hybridMultilevel"/>
     <w:tmpl w:val="DE32E2F2"/>
@@ -18891,7 +20018,7 @@
       </w:rPr>
     </w:lvl>
   </w:abstractNum>
-  <w:abstractNum w:abstractNumId="9" w15:restartNumberingAfterBreak="0">
+  <w:abstractNum w:abstractNumId="14" w15:restartNumberingAfterBreak="0">
     <w:nsid w:val="44924F22"/>
     <w:multiLevelType w:val="hybridMultilevel"/>
     <w:tmpl w:val="F3AA4096"/>
@@ -19004,7 +20131,7 @@
       </w:rPr>
     </w:lvl>
   </w:abstractNum>
-  <w:abstractNum w:abstractNumId="10" w15:restartNumberingAfterBreak="0">
+  <w:abstractNum w:abstractNumId="15" w15:restartNumberingAfterBreak="0">
     <w:nsid w:val="67F61E84"/>
     <w:multiLevelType w:val="hybridMultilevel"/>
     <w:tmpl w:val="430EF71E"/>
@@ -19117,7 +20244,7 @@
       </w:rPr>
     </w:lvl>
   </w:abstractNum>
-  <w:abstractNum w:abstractNumId="11" w15:restartNumberingAfterBreak="0">
+  <w:abstractNum w:abstractNumId="16" w15:restartNumberingAfterBreak="0">
     <w:nsid w:val="7497266A"/>
     <w:multiLevelType w:val="hybridMultilevel"/>
     <w:tmpl w:val="39BA0AC4"/>
@@ -19230,7 +20357,7 @@
       </w:rPr>
     </w:lvl>
   </w:abstractNum>
-  <w:abstractNum w:abstractNumId="12" w15:restartNumberingAfterBreak="0">
+  <w:abstractNum w:abstractNumId="17" w15:restartNumberingAfterBreak="0">
     <w:nsid w:val="75050389"/>
     <w:multiLevelType w:val="hybridMultilevel"/>
     <w:tmpl w:val="5D4490F8"/>
@@ -19343,7 +20470,7 @@
       </w:rPr>
     </w:lvl>
   </w:abstractNum>
-  <w:abstractNum w:abstractNumId="13" w15:restartNumberingAfterBreak="0">
+  <w:abstractNum w:abstractNumId="18" w15:restartNumberingAfterBreak="0">
     <w:nsid w:val="75FC2675"/>
     <w:multiLevelType w:val="hybridMultilevel"/>
     <w:tmpl w:val="15C6C674"/>
@@ -19433,46 +20560,61 @@
     </w:lvl>
   </w:abstractNum>
   <w:num w:numId="1" w16cid:durableId="410201841">
+    <w:abstractNumId w:val="6"/>
+  </w:num>
+  <w:num w:numId="2" w16cid:durableId="1701786197">
+    <w:abstractNumId w:val="13"/>
+  </w:num>
+  <w:num w:numId="3" w16cid:durableId="113404857">
+    <w:abstractNumId w:val="14"/>
+  </w:num>
+  <w:num w:numId="4" w16cid:durableId="667246042">
+    <w:abstractNumId w:val="11"/>
+  </w:num>
+  <w:num w:numId="5" w16cid:durableId="481195516">
+    <w:abstractNumId w:val="7"/>
+  </w:num>
+  <w:num w:numId="6" w16cid:durableId="1271402247">
+    <w:abstractNumId w:val="17"/>
+  </w:num>
+  <w:num w:numId="7" w16cid:durableId="1723824251">
+    <w:abstractNumId w:val="12"/>
+  </w:num>
+  <w:num w:numId="8" w16cid:durableId="545145559">
     <w:abstractNumId w:val="3"/>
   </w:num>
-  <w:num w:numId="2" w16cid:durableId="1701786197">
-    <w:abstractNumId w:val="8"/>
-  </w:num>
-  <w:num w:numId="3" w16cid:durableId="113404857">
-    <w:abstractNumId w:val="9"/>
-  </w:num>
-  <w:num w:numId="4" w16cid:durableId="667246042">
-    <w:abstractNumId w:val="6"/>
-  </w:num>
-  <w:num w:numId="5" w16cid:durableId="481195516">
-    <w:abstractNumId w:val="4"/>
-  </w:num>
-  <w:num w:numId="6" w16cid:durableId="1271402247">
-    <w:abstractNumId w:val="12"/>
-  </w:num>
-  <w:num w:numId="7" w16cid:durableId="1723824251">
-    <w:abstractNumId w:val="7"/>
-  </w:num>
-  <w:num w:numId="8" w16cid:durableId="545145559">
-    <w:abstractNumId w:val="1"/>
-  </w:num>
   <w:num w:numId="9" w16cid:durableId="1538007799">
-    <w:abstractNumId w:val="10"/>
+    <w:abstractNumId w:val="15"/>
   </w:num>
   <w:num w:numId="10" w16cid:durableId="993264226">
     <w:abstractNumId w:val="0"/>
   </w:num>
   <w:num w:numId="11" w16cid:durableId="1541211727">
+    <w:abstractNumId w:val="8"/>
+  </w:num>
+  <w:num w:numId="12" w16cid:durableId="1250507572">
+    <w:abstractNumId w:val="18"/>
+  </w:num>
+  <w:num w:numId="13" w16cid:durableId="1669056">
     <w:abstractNumId w:val="5"/>
   </w:num>
-  <w:num w:numId="12" w16cid:durableId="1250507572">
-    <w:abstractNumId w:val="13"/>
+  <w:num w:numId="14" w16cid:durableId="712190530">
+    <w:abstractNumId w:val="16"/>
   </w:num>
-  <w:num w:numId="13" w16cid:durableId="1669056">
+  <w:num w:numId="15" w16cid:durableId="360478094">
+    <w:abstractNumId w:val="1"/>
+  </w:num>
+  <w:num w:numId="16" w16cid:durableId="757215746">
     <w:abstractNumId w:val="2"/>
   </w:num>
-  <w:num w:numId="14" w16cid:durableId="712190530">
-    <w:abstractNumId w:val="11"/>
+  <w:num w:numId="17" w16cid:durableId="903611158">
+    <w:abstractNumId w:val="9"/>
+  </w:num>
+  <w:num w:numId="18" w16cid:durableId="1867717384">
+    <w:abstractNumId w:val="10"/>
+  </w:num>
+  <w:num w:numId="19" w16cid:durableId="642009846">
+    <w:abstractNumId w:val="4"/>
   </w:num>
   <w:numIdMacAtCleanup w:val="13"/>
 </w:numbering>
@@ -19932,7 +21074,7 @@
     <w:uiPriority w:val="9"/>
     <w:unhideWhenUsed/>
     <w:qFormat/>
-    <w:rsid w:val="00157F2F"/>
+    <w:rsid w:val="00C47EA7"/>
     <w:pPr>
       <w:keepNext/>
       <w:numPr>
@@ -19957,7 +21099,6 @@
     <w:next w:val="Normal"/>
     <w:link w:val="Heading3Char"/>
     <w:uiPriority w:val="9"/>
-    <w:semiHidden/>
     <w:unhideWhenUsed/>
     <w:qFormat/>
     <w:rsid w:val="00157F2F"/>
@@ -20183,7 +21324,7 @@
     <w:basedOn w:val="DefaultParagraphFont"/>
     <w:link w:val="Heading2"/>
     <w:uiPriority w:val="9"/>
-    <w:rsid w:val="00157F2F"/>
+    <w:rsid w:val="00C47EA7"/>
     <w:rPr>
       <w:rFonts w:ascii="Times New Roman" w:eastAsiaTheme="majorEastAsia" w:hAnsi="Times New Roman" w:cstheme="majorBidi"/>
       <w:b/>
@@ -20391,7 +21532,6 @@
     <w:basedOn w:val="DefaultParagraphFont"/>
     <w:link w:val="Heading3"/>
     <w:uiPriority w:val="9"/>
-    <w:semiHidden/>
     <w:rsid w:val="00157F2F"/>
     <w:rPr>
       <w:rFonts w:ascii="Times New Roman" w:eastAsiaTheme="majorEastAsia" w:hAnsi="Times New Roman" w:cstheme="majorBidi"/>
@@ -21828,12 +22968,14 @@
     <w:rsid w:val="000C7F1F"/>
     <w:rsid w:val="000D4585"/>
     <w:rsid w:val="000D4658"/>
+    <w:rsid w:val="00151E92"/>
     <w:rsid w:val="00175017"/>
     <w:rsid w:val="001A236A"/>
     <w:rsid w:val="001D7398"/>
     <w:rsid w:val="00243D59"/>
     <w:rsid w:val="00276DE2"/>
     <w:rsid w:val="002A1E29"/>
+    <w:rsid w:val="002B3829"/>
     <w:rsid w:val="00310846"/>
     <w:rsid w:val="00313DDE"/>
     <w:rsid w:val="00324602"/>
@@ -21902,6 +23044,7 @@
     <w:rsid w:val="00E24E9F"/>
     <w:rsid w:val="00ED4800"/>
     <w:rsid w:val="00F57839"/>
+    <w:rsid w:val="00F654D4"/>
     <w:rsid w:val="00F744D8"/>
     <w:rsid w:val="00F86607"/>
     <w:rsid w:val="00F94122"/>
@@ -22710,7 +23853,7 @@
   <we:properties>
     <we:property name="MENDELEY_BIBLIOGRAPHY_IS_DIRTY" value="true"/>
     <we:property name="MENDELEY_BIBLIOGRAPHY_LAST_MODIFIED" value="1784919424295"/>
-    <we:property name="MENDELEY_CITATIONS" value="[{&quot;citationID&quot;:&quot;MENDELEY_CITATION_9a69a8b0-b116-4a8e-be9e-ca9faac00dd4&quot;,&quot;properties&quot;:{&quot;noteIndex&quot;:0},&quot;isEdited&quot;:false,&quot;manualOverride&quot;:{&quot;isManuallyOverridden&quot;:false,&quot;citeprocText&quot;:&quot;[1]&quot;,&quot;manualOverrideText&quot;:&quot;&quot;},&quot;citationTag&quot;:&quot;MENDELEY_CITATION_v3_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&quot;,&quot;citationItems&quot;:[{&quot;id&quot;:&quot;9f54496b-fc3d-3546-b057-55b552d0253d&quot;,&quot;itemData&quot;:{&quot;type&quot;:&quot;article-journal&quot;,&quot;id&quot;:&quot;9f54496b-fc3d-3546-b057-55b552d0253d&quot;,&quot;title&quot;:&quot;Hard-to-Abate Sectors: The role of industrial carbon capture and storage (CCS) in emission mitigation&quot;,&quot;author&quot;:[{&quot;family&quot;:&quot;Paltsev&quot;,&quot;given&quot;:&quot;Sergey&quot;,&quot;parse-names&quot;:false,&quot;dropping-particle&quot;:&quot;&quot;,&quot;non-dropping-particle&quot;:&quot;&quot;},{&quot;family&quot;:&quot;Morris&quot;,&quot;given&quot;:&quot;Jennifer&quot;,&quot;parse-names&quot;:false,&quot;dropping-particle&quot;:&quot;&quot;,&quot;non-dropping-particle&quot;:&quot;&quot;},{&quot;family&quot;:&quot;Kheshgi&quot;,&quot;given&quot;:&quot;Haroon&quot;,&quot;parse-names&quot;:false,&quot;dropping-particle&quot;:&quot;&quot;,&quot;non-dropping-particle&quot;:&quot;&quot;},{&quot;family&quot;:&quot;Herzog&quot;,&quot;given&quot;:&quot;Howard&quot;,&quot;parse-names&quot;:false,&quot;dropping-particle&quot;:&quot;&quot;,&quot;non-dropping-particle&quot;:&quot;&quot;}],&quot;container-title&quot;:&quot;Applied Energy&quot;,&quot;DOI&quot;:&quot;10.1016/j.apenergy.2021.117322&quot;,&quot;ISSN&quot;:&quot;03062619&quot;,&quot;issued&quot;:{&quot;date-parts&quot;:[[2021,10]]},&quot;page&quot;:&quot;117322&quot;,&quot;volume&quot;:&quot;300&quot;,&quot;container-title-short&quot;:&quot;Appl. Energy&quot;},&quot;isTemporary&quot;:false}]},{&quot;citationID&quot;:&quot;MENDELEY_CITATION_8d7bd39f-5014-4a97-bce1-d22efa7dbd0b&quot;,&quot;properties&quot;:{&quot;noteIndex&quot;:0},&quot;isEdited&quot;:false,&quot;manualOverride&quot;:{&quot;isManuallyOverridden&quot;:false,&quot;citeprocText&quot;:&quot;[2]&quot;,&quot;manualOverrideText&quot;:&quot;&quot;},&quot;citationTag&quot;:&quot;MENDELEY_CITATION_v3_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&quot;,&quot;citationItems&quot;:[{&quot;id&quot;:&quot;956a38fa-e422-3333-a9ab-81f96dae1644&quot;,&quot;itemData&quot;:{&quot;type&quot;:&quot;article-journal&quot;,&quot;id&quot;:&quot;956a38fa-e422-3333-a9ab-81f96dae1644&quot;,&quot;title&quot;:&quot;Decarbonizing Hard-to-Abate Sectors with Renewable Hydrogen: A Real Case Application to the Ceramics Industry&quot;,&quot;author&quot;:[{&quot;family&quot;:&quot;Sousa&quot;,&quot;given&quot;:&quot;Jorge&quot;,&quot;parse-names&quot;:false,&quot;dropping-particle&quot;:&quot;&quot;,&quot;non-dropping-particle&quot;:&quot;&quot;},{&quot;family&quot;:&quot;Azevedo&quot;,&quot;given&quot;:&quot;Inês&quot;,&quot;parse-names&quot;:false,&quot;dropping-particle&quot;:&quot;&quot;,&quot;non-dropping-particle&quot;:&quot;&quot;},{&quot;family&quot;:&quot;Camus&quot;,&quot;given&quot;:&quot;Cristina&quot;,&quot;parse-names&quot;:false,&quot;dropping-particle&quot;:&quot;&quot;,&quot;non-dropping-particle&quot;:&quot;&quot;},{&quot;family&quot;:&quot;Mendes&quot;,&quot;given&quot;:&quot;Luís&quot;,&quot;parse-names&quot;:false,&quot;dropping-particle&quot;:&quot;&quot;,&quot;non-dropping-particle&quot;:&quot;&quot;},{&quot;family&quot;:&quot;Viveiros&quot;,&quot;given&quot;:&quot;Carla&quot;,&quot;parse-names&quot;:false,&quot;dropping-particle&quot;:&quot;&quot;,&quot;non-dropping-particle&quot;:&quot;&quot;},{&quot;family&quot;:&quot;Barata&quot;,&quot;given&quot;:&quot;Filipe&quot;,&quot;parse-names&quot;:false,&quot;dropping-particle&quot;:&quot;&quot;,&quot;non-dropping-particle&quot;:&quot;&quot;}],&quot;container-title&quot;:&quot;Energies&quot;,&quot;DOI&quot;:&quot;10.3390/en17153661&quot;,&quot;ISSN&quot;:&quot;1996-1073&quot;,&quot;issued&quot;:{&quot;date-parts&quot;:[[2024,7,25]]},&quot;page&quot;:&quot;3661&quot;,&quot;abstract&quot;:&quot;&lt;p&gt;Hydrogen produced from renewable energy sources is a valuable energy carrier for linking growing renewable electricity generation with the hard-to-abate sectors, such as cement, steel, glass, chemical, and ceramics industries. In this context, this paper presents a new model of hydrogen production based on solar photovoltaics and wind energy with application to a real-world ceramics factory. For this task, a novel multipurpose profit-maximizing model is implemented using GAMS. The developed model explores hydrogen production with multiple value streams that enable technical and economical informed decisions under specific scenarios. Our results show that it is profitable to sell the hydrogen produced to the gas grid rather than using it for self-consumption for low-gas-price scenarios. On the other hand, when the price of gas is significantly high, it is more profitable to use as much hydrogen as possible for self-consumption to supply the factory and reduce the internal use of natural gas. The role of electricity self-consumption has proven to be key for the project’s profitability as, without this revenue stream, the project would not be profitable in any analysed scenario.&lt;/p&gt;&quot;,&quot;issue&quot;:&quot;15&quot;,&quot;volume&quot;:&quot;17&quot;,&quot;container-title-short&quot;:&quot;Energies (Basel).&quot;},&quot;isTemporary&quot;:false}]},{&quot;citationID&quot;:&quot;MENDELEY_CITATION_cc9a11a7-48e8-4bcd-9601-05385ccebf02&quot;,&quot;properties&quot;:{&quot;noteIndex&quot;:0},&quot;isEdited&quot;:false,&quot;manualOverride&quot;:{&quot;isManuallyOverridden&quot;:false,&quot;citeprocText&quot;:&quot;[3]&quot;,&quot;manualOverrideText&quot;:&quot;&quot;},&quot;citationTag&quot;:&quot;MENDELEY_CITATION_v3_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&quot;,&quot;citationItems&quot;:[{&quot;id&quot;:&quot;66781a91-8ce9-38c0-8b80-b0de4bdb3cc9&quot;,&quot;itemData&quot;:{&quot;type&quot;:&quot;article-journal&quot;,&quot;id&quot;:&quot;66781a91-8ce9-38c0-8b80-b0de4bdb3cc9&quot;,&quot;title&quot;:&quot;From green hydrogen to electricity: A review on recent advances, challenges, and opportunities on power-to-hydrogen-to-power systems&quot;,&quot;author&quot;:[{&quot;family&quot;:&quot;Risco-Bravo&quot;,&quot;given&quot;:&quot;A.&quot;,&quot;parse-names&quot;:false,&quot;dropping-particle&quot;:&quot;&quot;,&quot;non-dropping-particle&quot;:&quot;&quot;},{&quot;family&quot;:&quot;Varela&quot;,&quot;given&quot;:&quot;C.&quot;,&quot;parse-names&quot;:false,&quot;dropping-particle&quot;:&quot;&quot;,&quot;non-dropping-particle&quot;:&quot;&quot;},{&quot;family&quot;:&quot;Bartels&quot;,&quot;given&quot;:&quot;J.&quot;,&quot;parse-names&quot;:false,&quot;dropping-particle&quot;:&quot;&quot;,&quot;non-dropping-particle&quot;:&quot;&quot;},{&quot;family&quot;:&quot;Zondervan&quot;,&quot;given&quot;:&quot;E.&quot;,&quot;parse-names&quot;:false,&quot;dropping-particle&quot;:&quot;&quot;,&quot;non-dropping-particle&quot;:&quot;&quot;}],&quot;container-title&quot;:&quot;Renewable and Sustainable Energy Reviews&quot;,&quot;DOI&quot;:&quot;10.1016/j.rser.2023.113930&quot;,&quot;ISSN&quot;:&quot;13640321&quot;,&quot;issued&quot;:{&quot;date-parts&quot;:[[2024,1]]},&quot;page&quot;:&quot;113930&quot;,&quot;volume&quot;:&quot;189&quot;,&quot;container-title-short&quot;:&quot;&quot;},&quot;isTemporary&quot;:false}]},{&quot;citationID&quot;:&quot;MENDELEY_CITATION_10ebcc1d-9e7d-475c-9706-140f1e237e74&quot;,&quot;properties&quot;:{&quot;noteIndex&quot;:0},&quot;isEdited&quot;:false,&quot;manualOverride&quot;:{&quot;isManuallyOverridden&quot;:false,&quot;citeprocText&quot;:&quot;[4]&quot;,&quot;manualOverrideText&quot;:&quot;&quot;},&quot;citationTag&quot;:&quot;MENDELEY_CITATION_v3_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&quot;,&quot;citationItems&quot;:[{&quot;id&quot;:&quot;d00ceab6-c269-3d86-a58b-dd8be99f154b&quot;,&quot;itemData&quot;:{&quot;type&quot;:&quot;article-journal&quot;,&quot;id&quot;:&quot;d00ceab6-c269-3d86-a58b-dd8be99f154b&quot;,&quot;title&quot;:&quot;A comprehensive review of optimizing hybrid renewable energy system using optimization techniques&quot;,&quot;author&quot;:[{&quot;family&quot;:&quot;Yao&quot;,&quot;given&quot;:&quot;Ye&quot;,&quot;parse-names&quot;:false,&quot;dropping-particle&quot;:&quot;&quot;,&quot;non-dropping-particle&quot;:&quot;&quot;},{&quot;family&quot;:&quot;Wang&quot;,&quot;given&quot;:&quot;Zhen&quot;,&quot;parse-names&quot;:false,&quot;dropping-particle&quot;:&quot;&quot;,&quot;non-dropping-particle&quot;:&quot;&quot;},{&quot;family&quot;:&quot;Ma&quot;,&quot;given&quot;:&quot;Chao&quot;,&quot;parse-names&quot;:false,&quot;dropping-particle&quot;:&quot;&quot;,&quot;non-dropping-particle&quot;:&quot;&quot;},{&quot;family&quot;:&quot;Liu&quot;,&quot;given&quot;:&quot;Mengmeng&quot;,&quot;parse-names&quot;:false,&quot;dropping-particle&quot;:&quot;&quot;,&quot;non-dropping-particle&quot;:&quot;&quot;},{&quot;family&quot;:&quot;Qi&quot;,&quot;given&quot;:&quot;Wenchao&quot;,&quot;parse-names&quot;:false,&quot;dropping-particle&quot;:&quot;&quot;,&quot;non-dropping-particle&quot;:&quot;&quot;},{&quot;family&quot;:&quot;Yang&quot;,&quot;given&quot;:&quot;Xiuwei&quot;,&quot;parse-names&quot;:false,&quot;dropping-particle&quot;:&quot;&quot;,&quot;non-dropping-particle&quot;:&quot;&quot;},{&quot;family&quot;:&quot;Gao&quot;,&quot;given&quot;:&quot;Xifeng&quot;,&quot;parse-names&quot;:false,&quot;dropping-particle&quot;:&quot;&quot;,&quot;non-dropping-particle&quot;:&quot;&quot;},{&quot;family&quot;:&quot;Liu&quot;,&quot;given&quot;:&quot;Yingzhou&quot;,&quot;parse-names&quot;:false,&quot;dropping-particle&quot;:&quot;&quot;,&quot;non-dropping-particle&quot;:&quot;&quot;},{&quot;family&quot;:&quot;Lian&quot;,&quot;given&quot;:&quot;Jijian&quot;,&quot;parse-names&quot;:false,&quot;dropping-particle&quot;:&quot;&quot;,&quot;non-dropping-particle&quot;:&quot;&quot;},{&quot;family&quot;:&quot;Wang&quot;,&quot;given&quot;:&quot;Haolin&quot;,&quot;parse-names&quot;:false,&quot;dropping-particle&quot;:&quot;&quot;,&quot;non-dropping-particle&quot;:&quot;&quot;}],&quot;container-title&quot;:&quot;Engineering Science and Technology, an International Journal&quot;,&quot;DOI&quot;:&quot;10.1016/j.jestch.2026.102384&quot;,&quot;ISSN&quot;:&quot;22150986&quot;,&quot;issued&quot;:{&quot;date-parts&quot;:[[2026,6]]},&quot;page&quot;:&quot;102384&quot;,&quot;volume&quot;:&quot;78&quot;,&quot;container-title-short&quot;:&quot;&quot;},&quot;isTemporary&quot;:false}]},{&quot;citationID&quot;:&quot;MENDELEY_CITATION_883842a3-a21f-4bfa-9084-5059522ad981&quot;,&quot;properties&quot;:{&quot;noteIndex&quot;:0},&quot;isEdited&quot;:false,&quot;manualOverride&quot;:{&quot;isManuallyOverridden&quot;:false,&quot;citeprocText&quot;:&quot;[5]&quot;,&quot;manualOverrideText&quot;:&quot;&quot;},&quot;citationTag&quot;:&quot;MENDELEY_CITATION_v3_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&quot;,&quot;citationItems&quot;:[{&quot;id&quot;:&quot;37e1e1c6-a2f3-3486-92e6-469dc2e4adc9&quot;,&quot;itemData&quot;:{&quot;type&quot;:&quot;article-journal&quot;,&quot;id&quot;:&quot;37e1e1c6-a2f3-3486-92e6-469dc2e4adc9&quot;,&quot;title&quot;:&quot;Energy Demand Response in a Food-Processing Plant: A Deep Reinforcement Learning Approach&quot;,&quot;author&quot;:[{&quot;family&quot;:&quot;Wohlgenannt&quot;,&quot;given&quot;:&quot;Philipp&quot;,&quot;parse-names&quot;:false,&quot;dropping-particle&quot;:&quot;&quot;,&quot;non-dropping-particle&quot;:&quot;&quot;},{&quot;family&quot;:&quot;Hegenbart&quot;,&quot;given&quot;:&quot;Sebastian&quot;,&quot;parse-names&quot;:false,&quot;dropping-particle&quot;:&quot;&quot;,&quot;non-dropping-particle&quot;:&quot;&quot;},{&quot;family&quot;:&quot;Eder&quot;,&quot;given&quot;:&quot;Elias&quot;,&quot;parse-names&quot;:false,&quot;dropping-particle&quot;:&quot;&quot;,&quot;non-dropping-particle&quot;:&quot;&quot;},{&quot;family&quot;:&quot;Kolhe&quot;,&quot;given&quot;:&quot;Mohan&quot;,&quot;parse-names&quot;:false,&quot;dropping-particle&quot;:&quot;&quot;,&quot;non-dropping-particle&quot;:&quot;&quot;},{&quot;family&quot;:&quot;Kepplinger&quot;,&quot;given&quot;:&quot;Peter&quot;,&quot;parse-names&quot;:false,&quot;dropping-particle&quot;:&quot;&quot;,&quot;non-dropping-particle&quot;:&quot;&quot;}],&quot;container-title&quot;:&quot;Energies&quot;,&quot;container-title-short&quot;:&quot;Energies (Basel).&quot;,&quot;DOI&quot;:&quot;10.3390/en17246430&quot;,&quot;ISSN&quot;:&quot;1996-1073&quot;,&quot;issued&quot;:{&quot;date-parts&quot;:[[2024,12,20]]},&quot;page&quot;:&quot;6430&quot;,&quot;abstract&quot;:&quot;&lt;p&gt;The food industry faces significant challenges in managing operational costs due to its high energy intensity and rising energy prices. Industrial food-processing facilities, with substantial thermal capacities and large demands for cooling and heating, offer promising opportunities for demand response (DR) strategies. This study explores the application of deep reinforcement learning (RL) as an innovative, data-driven approach for DR in the food industry. By leveraging the adaptive, self-learning capabilities of RL, energy costs in the investigated plant are effectively decreased. The RL algorithm was compared with the well-established optimization method Mixed Integer Linear Programming (MILP), and both were benchmarked against a reference scenario without DR. The two optimization strategies demonstrate cost savings of 17.57% and 18.65% for RL and MILP, respectively. Although RL is slightly less efficient in cost reduction, it significantly outperforms in computational speed, being approximately 20 times faster. During operation, RL only needs 2ms per optimization compared to 19s for MILP, making it a promising optimization tool for edge computing. Moreover, while MILP’s computation time increases considerably with the number of binary variables, RL efficiently learns dynamic system behavior and scales to more complex systems without significant performance degradation. These results highlight that deep RL, when applied to DR, offers substantial cost savings and computational efficiency, with broad applicability to energy management in various applications.&lt;/p&gt;&quot;,&quot;issue&quot;:&quot;24&quot;,&quot;volume&quot;:&quot;17&quot;},&quot;isTemporary&quot;:false}]},{&quot;citationID&quot;:&quot;MENDELEY_CITATION_d7370189-8bad-428a-bf96-f6e0b77e7bf5&quot;,&quot;properties&quot;:{&quot;noteIndex&quot;:0},&quot;isEdited&quot;:false,&quot;manualOverride&quot;:{&quot;isManuallyOverridden&quot;:false,&quot;citeprocText&quot;:&quot;[6]&quot;,&quot;manualOverrideText&quot;:&quot;&quot;},&quot;citationTag&quot;:&quot;MENDELEY_CITATION_v3_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&quot;,&quot;citationItems&quot;:[{&quot;id&quot;:&quot;f01623cd-5b09-3de7-90db-88f6efe9d97e&quot;,&quot;itemData&quot;:{&quot;type&quot;:&quot;article-journal&quot;,&quot;id&quot;:&quot;f01623cd-5b09-3de7-90db-88f6efe9d97e&quot;,&quot;title&quot;:&quot;Optimization of energy supply systems by MILP branch and bound method in consideration of hierarchical relationship between design and operation&quot;,&quot;author&quot;:[{&quot;family&quot;:&quot;Yokoyama&quot;,&quot;given&quot;:&quot;Ryohei&quot;,&quot;parse-names&quot;:false,&quot;dropping-particle&quot;:&quot;&quot;,&quot;non-dropping-particle&quot;:&quot;&quot;},{&quot;family&quot;:&quot;Shinano&quot;,&quot;given&quot;:&quot;Yuji&quot;,&quot;parse-names&quot;:false,&quot;dropping-particle&quot;:&quot;&quot;,&quot;non-dropping-particle&quot;:&quot;&quot;},{&quot;family&quot;:&quot;Taniguchi&quot;,&quot;given&quot;:&quot;Syusuke&quot;,&quot;parse-names&quot;:false,&quot;dropping-particle&quot;:&quot;&quot;,&quot;non-dropping-particle&quot;:&quot;&quot;},{&quot;family&quot;:&quot;Ohkura&quot;,&quot;given&quot;:&quot;Masashi&quot;,&quot;parse-names&quot;:false,&quot;dropping-particle&quot;:&quot;&quot;,&quot;non-dropping-particle&quot;:&quot;&quot;},{&quot;family&quot;:&quot;Wakui&quot;,&quot;given&quot;:&quot;Tetsuya&quot;,&quot;parse-names&quot;:false,&quot;dropping-particle&quot;:&quot;&quot;,&quot;non-dropping-particle&quot;:&quot;&quot;}],&quot;container-title&quot;:&quot;Energy Conversion and Management&quot;,&quot;DOI&quot;:&quot;10.1016/j.enconman.2014.12.020&quot;,&quot;ISSN&quot;:&quot;01968904&quot;,&quot;issued&quot;:{&quot;date-parts&quot;:[[2015,3]]},&quot;page&quot;:&quot;92-104&quot;,&quot;volume&quot;:&quot;92&quot;,&quot;container-title-short&quot;:&quot;Energy Convers. Manag.&quot;},&quot;isTemporary&quot;:false}]},{&quot;citationID&quot;:&quot;MENDELEY_CITATION_25f810e2-1387-4860-bc8b-20e968f8adf0&quot;,&quot;properties&quot;:{&quot;noteIndex&quot;:0},&quot;isEdited&quot;:false,&quot;manualOverride&quot;:{&quot;isManuallyOverridden&quot;:false,&quot;citeprocText&quot;:&quot;[7]&quot;,&quot;manualOverrideText&quot;:&quot;&quot;},&quot;citationTag&quot;:&quot;MENDELEY_CITATION_v3_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&quot;,&quot;citationItems&quot;:[{&quot;id&quot;:&quot;85308694-191e-34ed-aa20-9e1aa6f08e43&quot;,&quot;itemData&quot;:{&quot;type&quot;:&quot;article-journal&quot;,&quot;id&quot;:&quot;85308694-191e-34ed-aa20-9e1aa6f08e43&quot;,&quot;title&quot;:&quot;Reinforcement Learning Techniques in Optimizing Energy Systems&quot;,&quot;author&quot;:[{&quot;family&quot;:&quot;Stavrev&quot;,&quot;given&quot;:&quot;Stefan&quot;,&quot;parse-names&quot;:false,&quot;dropping-particle&quot;:&quot;&quot;,&quot;non-dropping-particle&quot;:&quot;&quot;},{&quot;family&quot;:&quot;Ginchev&quot;,&quot;given&quot;:&quot;Dimitar&quot;,&quot;parse-names&quot;:false,&quot;dropping-particle&quot;:&quot;&quot;,&quot;non-dropping-particle&quot;:&quot;&quot;}],&quot;container-title&quot;:&quot;Electronics&quot;,&quot;DOI&quot;:&quot;10.3390/electronics13081459&quot;,&quot;ISSN&quot;:&quot;2079-9292&quot;,&quot;issued&quot;:{&quot;date-parts&quot;:[[2024,4,12]]},&quot;page&quot;:&quot;1459&quot;,&quot;abstract&quot;:&quot;&lt;p&gt;Reinforcement learning (RL) techniques have emerged as powerful tools for optimizing energy systems, offering the potential to enhance efficiency, reliability, and sustainability. This review paper provides a comprehensive examination of the applications of RL in the field of energy system optimization, spanning various domains such as energy management, grid control, and renewable energy integration. Beginning with an overview of RL fundamentals, the paper explores recent advancements in RL algorithms and their adaptation to address the unique challenges of energy system optimization. Case studies and real-world applications demonstrate the efficacy of RL-based approaches in improving energy efficiency, reducing costs, and mitigating environmental impacts. Furthermore, the paper discusses future directions and challenges, including scalability, interpretability, and integration with domain knowledge. By synthesizing the latest research findings and identifying key areas for further investigation, this paper aims to inform and inspire future research endeavors in the intersection of reinforcement learning and energy system optimization.&lt;/p&gt;&quot;,&quot;issue&quot;:&quot;8&quot;,&quot;volume&quot;:&quot;13&quot;,&quot;container-title-short&quot;:&quot;Electronics (Basel).&quot;},&quot;isTemporary&quot;:false}]},{&quot;citationID&quot;:&quot;MENDELEY_CITATION_51c152f6-c4bd-46c0-a730-f4779c171221&quot;,&quot;properties&quot;:{&quot;noteIndex&quot;:0},&quot;isEdited&quot;:false,&quot;manualOverride&quot;:{&quot;isManuallyOverridden&quot;:false,&quot;citeprocText&quot;:&quot;[8]&quot;,&quot;manualOverrideText&quot;:&quot;&quot;},&quot;citationTag&quot;:&quot;MENDELEY_CITATION_v3_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&quot;,&quot;citationItems&quot;:[{&quot;id&quot;:&quot;19ead3b7-e80b-3f24-a3e3-22a038f3385c&quot;,&quot;itemData&quot;:{&quot;type&quot;:&quot;article-journal&quot;,&quot;id&quot;:&quot;19ead3b7-e80b-3f24-a3e3-22a038f3385c&quot;,&quot;title&quot;:&quot;LCA and exergy-economic evaluation of a biogas-to-fuels system using CO2 hydrogenation and exhaust gas recycling&quot;,&quot;author&quot;:[{&quot;family&quot;:&quot;Ghiasirad&quot;,&quot;given&quot;:&quot;Hamed&quot;,&quot;parse-names&quot;:false,&quot;dropping-particle&quot;:&quot;&quot;,&quot;non-dropping-particle&quot;:&quot;&quot;},{&quot;family&quot;:&quot;Ebrahimian&quot;,&quot;given&quot;:&quot;Farinaz&quot;,&quot;parse-names&quot;:false,&quot;dropping-particle&quot;:&quot;&quot;,&quot;non-dropping-particle&quot;:&quot;&quot;},{&quot;family&quot;:&quot;Gholizadeh&quot;,&quot;given&quot;:&quot;Towhid&quot;,&quot;parse-names&quot;:false,&quot;dropping-particle&quot;:&quot;&quot;,&quot;non-dropping-particle&quot;:&quot;&quot;},{&quot;family&quot;:&quot;Mohammadi&quot;,&quot;given&quot;:&quot;Ali&quot;,&quot;parse-names&quot;:false,&quot;dropping-particle&quot;:&quot;&quot;,&quot;non-dropping-particle&quot;:&quot;&quot;},{&quot;family&quot;:&quot;Mirmasoumi&quot;,&quot;given&quot;:&quot;Siamak&quot;,&quot;parse-names&quot;:false,&quot;dropping-particle&quot;:&quot;&quot;,&quot;non-dropping-particle&quot;:&quot;&quot;},{&quot;family&quot;:&quot;Saray&quot;,&quot;given&quot;:&quot;Rahim Khoshbakhti&quot;,&quot;parse-names&quot;:false,&quot;dropping-particle&quot;:&quot;&quot;,&quot;non-dropping-particle&quot;:&quot;&quot;},{&quot;family&quot;:&quot;Skorek-Osikowska&quot;,&quot;given&quot;:&quot;Anna&quot;,&quot;parse-names&quot;:false,&quot;dropping-particle&quot;:&quot;&quot;,&quot;non-dropping-particle&quot;:&quot;&quot;}],&quot;container-title&quot;:&quot;Energy Conversion and Management: X&quot;,&quot;DOI&quot;:&quot;10.1016/j.ecmx.2025.100897&quot;,&quot;ISSN&quot;:&quot;25901745&quot;,&quot;issued&quot;:{&quot;date-parts&quot;:[[2025,4]]},&quot;page&quot;:&quot;100897&quot;,&quot;volume&quot;:&quot;26&quot;,&quot;container-title-short&quot;:&quot;&quot;},&quot;isTemporary&quot;:false}]},{&quot;citationID&quot;:&quot;MENDELEY_CITATION_105cda64-5b6c-464e-beda-2ca75d02300e&quot;,&quot;properties&quot;:{&quot;noteIndex&quot;:0},&quot;isEdited&quot;:false,&quot;manualOverride&quot;:{&quot;isManuallyOverridden&quot;:false,&quot;citeprocText&quot;:&quot;[9]&quot;,&quot;manualOverrideText&quot;:&quot;&quot;},&quot;citationTag&quot;:&quot;MENDELEY_CITATION_v3_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&quot;,&quot;citationItems&quot;:[{&quot;id&quot;:&quot;56e0ce24-6bd0-3ca6-ad59-9e041fc06482&quot;,&quot;itemData&quot;:{&quot;type&quot;:&quot;article-journal&quot;,&quot;id&quot;:&quot;56e0ce24-6bd0-3ca6-ad59-9e041fc06482&quot;,&quot;title&quot;:&quot;Syngas biomethanation: state‐of‐the‐art review and perspectives&quot;,&quot;author&quot;:[{&quot;family&quot;:&quot;Grimalt‐Alemany&quot;,&quot;given&quot;:&quot;Antonio&quot;,&quot;parse-names&quot;:false,&quot;dropping-particle&quot;:&quot;&quot;,&quot;non-dropping-particle&quot;:&quot;&quot;},{&quot;family&quot;:&quot;Skiadas&quot;,&quot;given&quot;:&quot;Ioannis&quot;,&quot;parse-names&quot;:false,&quot;dropping-particle&quot;:&quot;V.&quot;,&quot;non-dropping-particle&quot;:&quot;&quot;},{&quot;family&quot;:&quot;Gavala&quot;,&quot;given&quot;:&quot;Hariklia N.&quot;,&quot;parse-names&quot;:false,&quot;dropping-particle&quot;:&quot;&quot;,&quot;non-dropping-particle&quot;:&quot;&quot;}],&quot;container-title&quot;:&quot;Biofuels, Bioproducts and Biorefining&quot;,&quot;DOI&quot;:&quot;10.1002/bbb.1826&quot;,&quot;ISSN&quot;:&quot;1932-104X&quot;,&quot;issued&quot;:{&quot;date-parts&quot;:[[2018,1,10]]},&quot;page&quot;:&quot;139-158&quot;,&quot;abstract&quot;:&quot;&lt;p&gt;Significant research efforts are currently being made worldwide to develop more efficient biomethane production processes from a variety of waste streams. The biomethanation of biomass‐derived syngas can contribute to increasing the potential of methane production as it opens the way for the conversion of recalcitrant biomasses, generally not fully exploitable by anaerobic digestion systems. Additionally, this biological process presents several advantages over its analogous process of catalytic methanation such as the use of inexpensive biocatalysts, milder operational conditions, higher tolerance to the impurities of syngas, and higher product selectivity. However, there are still several challenges to be addressed for this technology to reach commercial stage. This work reviews the progress made over the last few years in syngas biomethanation processes in order to provide an overview of the current state of the art of this technology. The most relevant aspects determining the performance of syngas biomethanation processes are extensively discussed here, including microbial diversity and metabolic interactions in mixed microbial consortia, the influence of operating parameters and bioreactor designs, and the potential of modelling as a tool for the design and control of this bioprocess. © 2017 Society of Chemical Industry and John Wiley &amp;amp; Sons, Ltd&lt;/p&gt;&quot;,&quot;issue&quot;:&quot;1&quot;,&quot;volume&quot;:&quot;12&quot;,&quot;container-title-short&quot;:&quot;&quot;},&quot;isTemporary&quot;:false}]},{&quot;citationID&quot;:&quot;MENDELEY_CITATION_790cd8fb-1a04-4124-9aa6-1645a459196b&quot;,&quot;properties&quot;:{&quot;noteIndex&quot;:0},&quot;isEdited&quot;:false,&quot;manualOverride&quot;:{&quot;isManuallyOverridden&quot;:false,&quot;citeprocText&quot;:&quot;[9], [10]&quot;,&quot;manualOverrideText&quot;:&quot;&quot;},&quot;citationTag&quot;:&quot;MENDELEY_CITATION_v3_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&quot;,&quot;citationItems&quot;:[{&quot;id&quot;:&quot;aa2feb8d-c9bd-3781-bba9-d18156ecd3e8&quot;,&quot;itemData&quot;:{&quot;type&quot;:&quot;article-journal&quot;,&quot;id&quot;:&quot;aa2feb8d-c9bd-3781-bba9-d18156ecd3e8&quot;,&quot;title&quot;:&quot;Alternative sustainable routes to methanol production: Techno-economic and environmental assessment&quot;,&quot;author&quot;:[{&quot;family&quot;:&quot;Scomazzon&quot;,&quot;given&quot;:&quot;Marco&quot;,&quot;parse-names&quot;:false,&quot;dropping-particle&quot;:&quot;&quot;,&quot;non-dropping-particle&quot;:&quot;&quot;},{&quot;family&quot;:&quot;Barbera&quot;,&quot;given&quot;:&quot;Elena&quot;,&quot;parse-names&quot;:false,&quot;dropping-particle&quot;:&quot;&quot;,&quot;non-dropping-particle&quot;:&quot;&quot;},{&quot;family&quot;:&quot;Bezzo&quot;,&quot;given&quot;:&quot;Fabrizio&quot;,&quot;parse-names&quot;:false,&quot;dropping-particle&quot;:&quot;&quot;,&quot;non-dropping-particle&quot;:&quot;&quot;}],&quot;container-title&quot;:&quot;Journal of Environmental Chemical Engineering&quot;,&quot;DOI&quot;:&quot;10.1016/j.jece.2024.112674&quot;,&quot;ISSN&quot;:&quot;22133437&quot;,&quot;issued&quot;:{&quot;date-parts&quot;:[[2024,6]]},&quot;page&quot;:&quot;112674&quot;,&quot;issue&quot;:&quot;3&quot;,&quot;volume&quot;:&quot;12&quot;,&quot;container-title-short&quot;:&quot;J. Environ. Chem. Eng.&quot;},&quot;isTemporary&quot;:false},{&quot;id&quot;:&quot;56e0ce24-6bd0-3ca6-ad59-9e041fc06482&quot;,&quot;itemData&quot;:{&quot;type&quot;:&quot;article-journal&quot;,&quot;id&quot;:&quot;56e0ce24-6bd0-3ca6-ad59-9e041fc06482&quot;,&quot;title&quot;:&quot;Syngas biomethanation: state‐of‐the‐art review and perspectives&quot;,&quot;author&quot;:[{&quot;family&quot;:&quot;Grimalt‐Alemany&quot;,&quot;given&quot;:&quot;Antonio&quot;,&quot;parse-names&quot;:false,&quot;dropping-particle&quot;:&quot;&quot;,&quot;non-dropping-particle&quot;:&quot;&quot;},{&quot;family&quot;:&quot;Skiadas&quot;,&quot;given&quot;:&quot;Ioannis&quot;,&quot;parse-names&quot;:false,&quot;dropping-particle&quot;:&quot;V.&quot;,&quot;non-dropping-particle&quot;:&quot;&quot;},{&quot;family&quot;:&quot;Gavala&quot;,&quot;given&quot;:&quot;Hariklia N.&quot;,&quot;parse-names&quot;:false,&quot;dropping-particle&quot;:&quot;&quot;,&quot;non-dropping-particle&quot;:&quot;&quot;}],&quot;container-title&quot;:&quot;Biofuels, Bioproducts and Biorefining&quot;,&quot;DOI&quot;:&quot;10.1002/bbb.1826&quot;,&quot;ISSN&quot;:&quot;1932-104X&quot;,&quot;issued&quot;:{&quot;date-parts&quot;:[[2018,1,10]]},&quot;page&quot;:&quot;139-158&quot;,&quot;abstract&quot;:&quot;&lt;p&gt;Significant research efforts are currently being made worldwide to develop more efficient biomethane production processes from a variety of waste streams. The biomethanation of biomass‐derived syngas can contribute to increasing the potential of methane production as it opens the way for the conversion of recalcitrant biomasses, generally not fully exploitable by anaerobic digestion systems. Additionally, this biological process presents several advantages over its analogous process of catalytic methanation such as the use of inexpensive biocatalysts, milder operational conditions, higher tolerance to the impurities of syngas, and higher product selectivity. However, there are still several challenges to be addressed for this technology to reach commercial stage. This work reviews the progress made over the last few years in syngas biomethanation processes in order to provide an overview of the current state of the art of this technology. The most relevant aspects determining the performance of syngas biomethanation processes are extensively discussed here, including microbial diversity and metabolic interactions in mixed microbial consortia, the influence of operating parameters and bioreactor designs, and the potential of modelling as a tool for the design and control of this bioprocess. © 2017 Society of Chemical Industry and John Wiley &amp;amp; Sons, Ltd&lt;/p&gt;&quot;,&quot;issue&quot;:&quot;1&quot;,&quot;volume&quot;:&quot;12&quot;,&quot;container-title-short&quot;:&quot;&quot;},&quot;isTemporary&quot;:false}]},{&quot;citationID&quot;:&quot;MENDELEY_CITATION_b4c44ef8-e2c2-413d-b321-be21b9ddc9bc&quot;,&quot;properties&quot;:{&quot;noteIndex&quot;:0},&quot;isEdited&quot;:false,&quot;manualOverride&quot;:{&quot;isManuallyOverridden&quot;:false,&quot;citeprocText&quot;:&quot;[9]&quot;,&quot;manualOverrideText&quot;:&quot;&quot;},&quot;citationTag&quot;:&quot;MENDELEY_CITATION_v3_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&quot;,&quot;citationItems&quot;:[{&quot;id&quot;:&quot;56e0ce24-6bd0-3ca6-ad59-9e041fc06482&quot;,&quot;itemData&quot;:{&quot;type&quot;:&quot;article-journal&quot;,&quot;id&quot;:&quot;56e0ce24-6bd0-3ca6-ad59-9e041fc06482&quot;,&quot;title&quot;:&quot;Syngas biomethanation: state‐of‐the‐art review and perspectives&quot;,&quot;author&quot;:[{&quot;family&quot;:&quot;Grimalt‐Alemany&quot;,&quot;given&quot;:&quot;Antonio&quot;,&quot;parse-names&quot;:false,&quot;dropping-particle&quot;:&quot;&quot;,&quot;non-dropping-particle&quot;:&quot;&quot;},{&quot;family&quot;:&quot;Skiadas&quot;,&quot;given&quot;:&quot;Ioannis&quot;,&quot;parse-names&quot;:false,&quot;dropping-particle&quot;:&quot;V.&quot;,&quot;non-dropping-particle&quot;:&quot;&quot;},{&quot;family&quot;:&quot;Gavala&quot;,&quot;given&quot;:&quot;Hariklia N.&quot;,&quot;parse-names&quot;:false,&quot;dropping-particle&quot;:&quot;&quot;,&quot;non-dropping-particle&quot;:&quot;&quot;}],&quot;container-title&quot;:&quot;Biofuels, Bioproducts and Biorefining&quot;,&quot;DOI&quot;:&quot;10.1002/bbb.1826&quot;,&quot;ISSN&quot;:&quot;1932-104X&quot;,&quot;issued&quot;:{&quot;date-parts&quot;:[[2018,1,10]]},&quot;page&quot;:&quot;139-158&quot;,&quot;abstract&quot;:&quot;&lt;p&gt;Significant research efforts are currently being made worldwide to develop more efficient biomethane production processes from a variety of waste streams. The biomethanation of biomass‐derived syngas can contribute to increasing the potential of methane production as it opens the way for the conversion of recalcitrant biomasses, generally not fully exploitable by anaerobic digestion systems. Additionally, this biological process presents several advantages over its analogous process of catalytic methanation such as the use of inexpensive biocatalysts, milder operational conditions, higher tolerance to the impurities of syngas, and higher product selectivity. However, there are still several challenges to be addressed for this technology to reach commercial stage. This work reviews the progress made over the last few years in syngas biomethanation processes in order to provide an overview of the current state of the art of this technology. The most relevant aspects determining the performance of syngas biomethanation processes are extensively discussed here, including microbial diversity and metabolic interactions in mixed microbial consortia, the influence of operating parameters and bioreactor designs, and the potential of modelling as a tool for the design and control of this bioprocess. © 2017 Society of Chemical Industry and John Wiley &amp;amp; Sons, Ltd&lt;/p&gt;&quot;,&quot;issue&quot;:&quot;1&quot;,&quot;volume&quot;:&quot;12&quot;,&quot;container-title-short&quot;:&quot;&quot;},&quot;isTemporary&quot;:false}]},{&quot;citationID&quot;:&quot;MENDELEY_CITATION_ff939063-8c0e-47e0-8f2f-be64fc1a6c11&quot;,&quot;properties&quot;:{&quot;noteIndex&quot;:0},&quot;isEdited&quot;:false,&quot;manualOverride&quot;:{&quot;isManuallyOverridden&quot;:false,&quot;citeprocText&quot;:&quot;[9], [11]&quot;,&quot;manualOverrideText&quot;:&quot;&quot;},&quot;citationTag&quot;:&quot;MENDELEY_CITATION_v3_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&quot;,&quot;citationItems&quot;:[{&quot;id&quot;:&quot;05ccdcdc-ca9b-3b81-a51a-6f8632295c3c&quot;,&quot;itemData&quot;:{&quot;type&quot;:&quot;article-journal&quot;,&quot;id&quot;:&quot;05ccdcdc-ca9b-3b81-a51a-6f8632295c3c&quot;,&quot;title&quot;:&quot;Techno-economic-environmental assessment of the integration of power-to-X and biogas utilization towards the production of electricity, hydrogen, methane and methanol&quot;,&quot;author&quot;:[{&quot;family&quot;:&quot;Moioli&quot;,&quot;given&quot;:&quot;Emanuele&quot;,&quot;parse-names&quot;:false,&quot;dropping-particle&quot;:&quot;&quot;,&quot;non-dropping-particle&quot;:&quot;&quot;},{&quot;family&quot;:&quot;Schildhauer&quot;,&quot;given&quot;:&quot;Tilman&quot;,&quot;parse-names&quot;:false,&quot;dropping-particle&quot;:&quot;&quot;,&quot;non-dropping-particle&quot;:&quot;&quot;}],&quot;container-title&quot;:&quot;Sustainable Energy &amp; Fuels&quot;,&quot;DOI&quot;:&quot;10.1039/D3SE00052D&quot;,&quot;ISSN&quot;:&quot;2398-4902&quot;,&quot;issued&quot;:{&quot;date-parts&quot;:[[2023]]},&quot;page&quot;:&quot;2690-2706&quot;,&quot;abstract&quot;:&quot;&lt;p&gt;Various routes for the valorisation of biogas towards methane and methanol and for electricity or hydrogen storage is assessed.&lt;/p&gt;&quot;,&quot;issue&quot;:&quot;11&quot;,&quot;volume&quot;:&quot;7&quot;,&quot;container-title-short&quot;:&quot;Sustain. Energy Fuels&quot;},&quot;isTemporary&quot;:false},{&quot;id&quot;:&quot;56e0ce24-6bd0-3ca6-ad59-9e041fc06482&quot;,&quot;itemData&quot;:{&quot;type&quot;:&quot;article-journal&quot;,&quot;id&quot;:&quot;56e0ce24-6bd0-3ca6-ad59-9e041fc06482&quot;,&quot;title&quot;:&quot;Syngas biomethanation: state‐of‐the‐art review and perspectives&quot;,&quot;author&quot;:[{&quot;family&quot;:&quot;Grimalt‐Alemany&quot;,&quot;given&quot;:&quot;Antonio&quot;,&quot;parse-names&quot;:false,&quot;dropping-particle&quot;:&quot;&quot;,&quot;non-dropping-particle&quot;:&quot;&quot;},{&quot;family&quot;:&quot;Skiadas&quot;,&quot;given&quot;:&quot;Ioannis&quot;,&quot;parse-names&quot;:false,&quot;dropping-particle&quot;:&quot;V.&quot;,&quot;non-dropping-particle&quot;:&quot;&quot;},{&quot;family&quot;:&quot;Gavala&quot;,&quot;given&quot;:&quot;Hariklia N.&quot;,&quot;parse-names&quot;:false,&quot;dropping-particle&quot;:&quot;&quot;,&quot;non-dropping-particle&quot;:&quot;&quot;}],&quot;container-title&quot;:&quot;Biofuels, Bioproducts and Biorefining&quot;,&quot;DOI&quot;:&quot;10.1002/bbb.1826&quot;,&quot;ISSN&quot;:&quot;1932-104X&quot;,&quot;issued&quot;:{&quot;date-parts&quot;:[[2018,1,10]]},&quot;page&quot;:&quot;139-158&quot;,&quot;abstract&quot;:&quot;&lt;p&gt;Significant research efforts are currently being made worldwide to develop more efficient biomethane production processes from a variety of waste streams. The biomethanation of biomass‐derived syngas can contribute to increasing the potential of methane production as it opens the way for the conversion of recalcitrant biomasses, generally not fully exploitable by anaerobic digestion systems. Additionally, this biological process presents several advantages over its analogous process of catalytic methanation such as the use of inexpensive biocatalysts, milder operational conditions, higher tolerance to the impurities of syngas, and higher product selectivity. However, there are still several challenges to be addressed for this technology to reach commercial stage. This work reviews the progress made over the last few years in syngas biomethanation processes in order to provide an overview of the current state of the art of this technology. The most relevant aspects determining the performance of syngas biomethanation processes are extensively discussed here, including microbial diversity and metabolic interactions in mixed microbial consortia, the influence of operating parameters and bioreactor designs, and the potential of modelling as a tool for the design and control of this bioprocess. © 2017 Society of Chemical Industry and John Wiley &amp;amp; Sons, Ltd&lt;/p&gt;&quot;,&quot;issue&quot;:&quot;1&quot;,&quot;volume&quot;:&quot;12&quot;,&quot;container-title-short&quot;:&quot;&quot;},&quot;isTemporary&quot;:false}]},{&quot;citationID&quot;:&quot;MENDELEY_CITATION_df48a702-88dc-4563-926b-cf46720d5673&quot;,&quot;properties&quot;:{&quot;noteIndex&quot;:0},&quot;isEdited&quot;:false,&quot;manualOverride&quot;:{&quot;isManuallyOverridden&quot;:false,&quot;citeprocText&quot;:&quot;[10]&quot;,&quot;manualOverrideText&quot;:&quot;&quot;},&quot;citationTag&quot;:&quot;MENDELEY_CITATION_v3_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&quot;,&quot;citationItems&quot;:[{&quot;id&quot;:&quot;aa2feb8d-c9bd-3781-bba9-d18156ecd3e8&quot;,&quot;itemData&quot;:{&quot;type&quot;:&quot;article-journal&quot;,&quot;id&quot;:&quot;aa2feb8d-c9bd-3781-bba9-d18156ecd3e8&quot;,&quot;title&quot;:&quot;Alternative sustainable routes to methanol production: Techno-economic and environmental assessment&quot;,&quot;author&quot;:[{&quot;family&quot;:&quot;Scomazzon&quot;,&quot;given&quot;:&quot;Marco&quot;,&quot;parse-names&quot;:false,&quot;dropping-particle&quot;:&quot;&quot;,&quot;non-dropping-particle&quot;:&quot;&quot;},{&quot;family&quot;:&quot;Barbera&quot;,&quot;given&quot;:&quot;Elena&quot;,&quot;parse-names&quot;:false,&quot;dropping-particle&quot;:&quot;&quot;,&quot;non-dropping-particle&quot;:&quot;&quot;},{&quot;family&quot;:&quot;Bezzo&quot;,&quot;given&quot;:&quot;Fabrizio&quot;,&quot;parse-names&quot;:false,&quot;dropping-particle&quot;:&quot;&quot;,&quot;non-dropping-particle&quot;:&quot;&quot;}],&quot;container-title&quot;:&quot;Journal of Environmental Chemical Engineering&quot;,&quot;DOI&quot;:&quot;10.1016/j.jece.2024.112674&quot;,&quot;ISSN&quot;:&quot;22133437&quot;,&quot;issued&quot;:{&quot;date-parts&quot;:[[2024,6]]},&quot;page&quot;:&quot;112674&quot;,&quot;issue&quot;:&quot;3&quot;,&quot;volume&quot;:&quot;12&quot;,&quot;container-title-short&quot;:&quot;J. Environ. Chem. Eng.&quot;},&quot;isTemporary&quot;:false}]},{&quot;citationID&quot;:&quot;MENDELEY_CITATION_8eef8f75-1f87-4dff-a071-68987bdeee67&quot;,&quot;properties&quot;:{&quot;noteIndex&quot;:0},&quot;isEdited&quot;:false,&quot;manualOverride&quot;:{&quot;isManuallyOverridden&quot;:false,&quot;citeprocText&quot;:&quot;[10]&quot;,&quot;manualOverrideText&quot;:&quot;&quot;},&quot;citationTag&quot;:&quot;MENDELEY_CITATION_v3_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&quot;,&quot;citationItems&quot;:[{&quot;id&quot;:&quot;aa2feb8d-c9bd-3781-bba9-d18156ecd3e8&quot;,&quot;itemData&quot;:{&quot;type&quot;:&quot;article-journal&quot;,&quot;id&quot;:&quot;aa2feb8d-c9bd-3781-bba9-d18156ecd3e8&quot;,&quot;title&quot;:&quot;Alternative sustainable routes to methanol production: Techno-economic and environmental assessment&quot;,&quot;author&quot;:[{&quot;family&quot;:&quot;Scomazzon&quot;,&quot;given&quot;:&quot;Marco&quot;,&quot;parse-names&quot;:false,&quot;dropping-particle&quot;:&quot;&quot;,&quot;non-dropping-particle&quot;:&quot;&quot;},{&quot;family&quot;:&quot;Barbera&quot;,&quot;given&quot;:&quot;Elena&quot;,&quot;parse-names&quot;:false,&quot;dropping-particle&quot;:&quot;&quot;,&quot;non-dropping-particle&quot;:&quot;&quot;},{&quot;family&quot;:&quot;Bezzo&quot;,&quot;given&quot;:&quot;Fabrizio&quot;,&quot;parse-names&quot;:false,&quot;dropping-particle&quot;:&quot;&quot;,&quot;non-dropping-particle&quot;:&quot;&quot;}],&quot;container-title&quot;:&quot;Journal of Environmental Chemical Engineering&quot;,&quot;DOI&quot;:&quot;10.1016/j.jece.2024.112674&quot;,&quot;ISSN&quot;:&quot;22133437&quot;,&quot;issued&quot;:{&quot;date-parts&quot;:[[2024,6]]},&quot;page&quot;:&quot;112674&quot;,&quot;issue&quot;:&quot;3&quot;,&quot;volume&quot;:&quot;12&quot;,&quot;container-title-short&quot;:&quot;J. Environ. Chem. Eng.&quot;},&quot;isTemporary&quot;:false}]},{&quot;citationID&quot;:&quot;MENDELEY_CITATION_8a70196d-3ff9-41c8-be39-fcf525822331&quot;,&quot;properties&quot;:{&quot;noteIndex&quot;:0},&quot;isEdited&quot;:false,&quot;manualOverride&quot;:{&quot;isManuallyOverridden&quot;:false,&quot;citeprocText&quot;:&quot;[12]&quot;,&quot;manualOverrideText&quot;:&quot;&quot;},&quot;citationTag&quot;:&quot;MENDELEY_CITATION_v3_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&quot;,&quot;citationItems&quot;:[{&quot;id&quot;:&quot;1310fab5-b88a-3b52-8d94-488c61413bed&quot;,&quot;itemData&quot;:{&quot;type&quot;:&quot;article-journal&quot;,&quot;id&quot;:&quot;1310fab5-b88a-3b52-8d94-488c61413bed&quot;,&quot;title&quot;:&quot;Techno-economic evaluation of biomass-to-fuels with solid-oxide electrolyzer&quot;,&quot;author&quot;:[{&quot;family&quot;:&quot;Zhang&quot;,&quot;given&quot;:&quot;Hanfei&quot;,&quot;parse-names&quot;:false,&quot;dropping-particle&quot;:&quot;&quot;,&quot;non-dropping-particle&quot;:&quot;&quot;},{&quot;family&quot;:&quot;Wang&quot;,&quot;given&quot;:&quot;Ligang&quot;,&quot;parse-names&quot;:false,&quot;dropping-particle&quot;:&quot;&quot;,&quot;non-dropping-particle&quot;:&quot;&quot;},{&quot;family&quot;:&quot;herle&quot;,&quot;given&quot;:&quot;Jan&quot;,&quot;parse-names&quot;:false,&quot;dropping-particle&quot;:&quot;&quot;,&quot;non-dropping-particle&quot;:&quot;Van&quot;},{&quot;family&quot;:&quot;Maréchal&quot;,&quot;given&quot;:&quot;François&quot;,&quot;parse-names&quot;:false,&quot;dropping-particle&quot;:&quot;&quot;,&quot;non-dropping-particle&quot;:&quot;&quot;},{&quot;family&quot;:&quot;Desideri&quot;,&quot;given&quot;:&quot;Umberto&quot;,&quot;parse-names&quot;:false,&quot;dropping-particle&quot;:&quot;&quot;,&quot;non-dropping-particle&quot;:&quot;&quot;}],&quot;container-title&quot;:&quot;Applied Energy&quot;,&quot;DOI&quot;:&quot;10.1016/j.apenergy.2020.115113&quot;,&quot;ISSN&quot;:&quot;03062619&quot;,&quot;issued&quot;:{&quot;date-parts&quot;:[[2020,7]]},&quot;page&quot;:&quot;115113&quot;,&quot;volume&quot;:&quot;270&quot;,&quot;container-title-short&quot;:&quot;Appl. Energy&quot;},&quot;isTemporary&quot;:false}]},{&quot;citationID&quot;:&quot;MENDELEY_CITATION_13304e8f-750e-4a08-8b1d-6a0f67b53a03&quot;,&quot;properties&quot;:{&quot;noteIndex&quot;:0},&quot;isEdited&quot;:false,&quot;manualOverride&quot;:{&quot;isManuallyOverridden&quot;:false,&quot;citeprocText&quot;:&quot;[13]&quot;,&quot;manualOverrideText&quot;:&quot;&quot;},&quot;citationTag&quot;:&quot;MENDELEY_CITATION_v3_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&quot;,&quot;citationItems&quot;:[{&quot;id&quot;:&quot;190b1267-cffd-3b0f-acfd-1ca4b15c3e7b&quot;,&quot;itemData&quot;:{&quot;type&quot;:&quot;article-journal&quot;,&quot;id&quot;:&quot;190b1267-cffd-3b0f-acfd-1ca4b15c3e7b&quot;,&quot;title&quot;:&quot;Techno-economic assessment of the impact of electrolysis technology on power-to-methanol processes&quot;,&quot;author&quot;:[{&quot;family&quot;:&quot;Walther&quot;,&quot;given&quot;:&quot;Aniko&quot;,&quot;parse-names&quot;:false,&quot;dropping-particle&quot;:&quot;&quot;,&quot;non-dropping-particle&quot;:&quot;&quot;},{&quot;family&quot;:&quot;Löning&quot;,&quot;given&quot;:&quot;Kai&quot;,&quot;parse-names&quot;:false,&quot;dropping-particle&quot;:&quot;&quot;,&quot;non-dropping-particle&quot;:&quot;&quot;},{&quot;family&quot;:&quot;Reichelt&quot;,&quot;given&quot;:&quot;Erik&quot;,&quot;parse-names&quot;:false,&quot;dropping-particle&quot;:&quot;&quot;,&quot;non-dropping-particle&quot;:&quot;&quot;}],&quot;container-title&quot;:&quot;International Journal of Hydrogen Energy&quot;,&quot;DOI&quot;:&quot;10.1016/j.ijhydene.2026.153394&quot;,&quot;ISSN&quot;:&quot;03603199&quot;,&quot;issued&quot;:{&quot;date-parts&quot;:[[2026,2]]},&quot;page&quot;:&quot;153394&quot;,&quot;volume&quot;:&quot;206&quot;,&quot;container-title-short&quot;:&quot;Int. J. Hydrogen Energy&quot;},&quot;isTemporary&quot;:false}]},{&quot;citationID&quot;:&quot;MENDELEY_CITATION_6a736241-62e6-4de8-9385-e50fe6f3ae30&quot;,&quot;properties&quot;:{&quot;noteIndex&quot;:0},&quot;isEdited&quot;:false,&quot;manualOverride&quot;:{&quot;isManuallyOverridden&quot;:false,&quot;citeprocText&quot;:&quot;[14], [15], [16]&quot;,&quot;manualOverrideText&quot;:&quot;&quot;},&quot;citationTag&quot;:&quot;MENDELEY_CITATION_v3_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&quot;,&quot;citationItems&quot;:[{&quot;id&quot;:&quot;d24a77c3-65ad-3302-bdd5-2971e96b5fe6&quot;,&quot;itemData&quot;:{&quot;type&quot;:&quot;article-journal&quot;,&quot;id&quot;:&quot;d24a77c3-65ad-3302-bdd5-2971e96b5fe6&quot;,&quot;title&quot;:&quot;Alkaline Water Electrolysis Powered by Renewable Energy: A Review&quot;,&quot;author&quot;:[{&quot;family&quot;:&quot;Brauns&quot;,&quot;given&quot;:&quot;Jörn&quot;,&quot;parse-names&quot;:false,&quot;dropping-particle&quot;:&quot;&quot;,&quot;non-dropping-particle&quot;:&quot;&quot;},{&quot;family&quot;:&quot;Turek&quot;,&quot;given&quot;:&quot;Thomas&quot;,&quot;parse-names&quot;:false,&quot;dropping-particle&quot;:&quot;&quot;,&quot;non-dropping-particle&quot;:&quot;&quot;}],&quot;container-title&quot;:&quot;Processes&quot;,&quot;DOI&quot;:&quot;10.3390/pr8020248&quot;,&quot;ISSN&quot;:&quot;2227-9717&quot;,&quot;issued&quot;:{&quot;date-parts&quot;:[[2020,2,21]]},&quot;page&quot;:&quot;248&quot;,&quot;abstract&quot;:&quot;&lt;p&gt;Alkaline water electrolysis is a key technology for large-scale hydrogen production powered by renewable energy. As conventional electrolyzers are designed for operation at fixed process conditions, the implementation of fluctuating and highly intermittent renewable energy is challenging. This contribution shows the recent state of system descriptions for alkaline water electrolysis and renewable energies, such as solar and wind power. Each component of a hydrogen energy system needs to be optimized to increase the operation time and system efficiency. Only in this way can hydrogen produced by electrolysis processes be competitive with the conventional path based on fossil energy sources. Conventional alkaline water electrolyzers show a limited part-load range due to an increased gas impurity at low power availability. As explosive mixtures of hydrogen and oxygen must be prevented, a safety shutdown is performed when reaching specific gas contamination. Furthermore, the cell voltage should be optimized to maintain a high efficiency. While photovoltaic panels can be directly coupled to alkaline water electrolyzers, wind turbines require suitable converters with additional losses. By combining alkaline water electrolysis with hydrogen storage tanks and fuel cells, power grid stabilization can be performed. As a consequence, the conventional spinning reserve can be reduced, which additionally lowers the carbon dioxide emissions.&lt;/p&gt;&quot;,&quot;issue&quot;:&quot;2&quot;,&quot;volume&quot;:&quot;8&quot;,&quot;container-title-short&quot;:&quot;&quot;},&quot;isTemporary&quot;:false},{&quot;id&quot;:&quot;fb305ddc-d308-30ab-8f80-782b0f32ba1c&quot;,&quot;itemData&quot;:{&quot;type&quot;:&quot;article-journal&quot;,&quot;id&quot;:&quot;fb305ddc-d308-30ab-8f80-782b0f32ba1c&quot;,&quot;title&quot;:&quot;Electrofuels for the transport sector: A review of production costs&quot;,&quot;author&quot;:[{&quot;family&quot;:&quot;Brynolf&quot;,&quot;given&quot;:&quot;Selma&quot;,&quot;parse-names&quot;:false,&quot;dropping-particle&quot;:&quot;&quot;,&quot;non-dropping-particle&quot;:&quot;&quot;},{&quot;family&quot;:&quot;Taljegard&quot;,&quot;given&quot;:&quot;Maria&quot;,&quot;parse-names&quot;:false,&quot;dropping-particle&quot;:&quot;&quot;,&quot;non-dropping-particle&quot;:&quot;&quot;},{&quot;family&quot;:&quot;Grahn&quot;,&quot;given&quot;:&quot;Maria&quot;,&quot;parse-names&quot;:false,&quot;dropping-particle&quot;:&quot;&quot;,&quot;non-dropping-particle&quot;:&quot;&quot;},{&quot;family&quot;:&quot;Hansson&quot;,&quot;given&quot;:&quot;Julia&quot;,&quot;parse-names&quot;:false,&quot;dropping-particle&quot;:&quot;&quot;,&quot;non-dropping-particle&quot;:&quot;&quot;}],&quot;container-title&quot;:&quot;Renewable and Sustainable Energy Reviews&quot;,&quot;DOI&quot;:&quot;10.1016/j.rser.2017.05.288&quot;,&quot;ISSN&quot;:&quot;13640321&quot;,&quot;issued&quot;:{&quot;date-parts&quot;:[[2018,1]]},&quot;page&quot;:&quot;1887-1905&quot;,&quot;volume&quot;:&quot;81&quot;,&quot;container-title-short&quot;:&quot;&quot;},&quot;isTemporary&quot;:false},{&quot;id&quot;:&quot;1b5f443a-d989-3c31-80b4-27044204c02c&quot;,&quot;itemData&quot;:{&quot;type&quot;:&quot;article-journal&quot;,&quot;id&quot;:&quot;1b5f443a-d989-3c31-80b4-27044204c02c&quot;,&quot;title&quot;:&quot;Hydrogen production by PEM water electrolysis – A review&quot;,&quot;author&quot;:[{&quot;family&quot;:&quot;Shiva Kumar&quot;,&quot;given&quot;:&quot;S.&quot;,&quot;parse-names&quot;:false,&quot;dropping-particle&quot;:&quot;&quot;,&quot;non-dropping-particle&quot;:&quot;&quot;},{&quot;family&quot;:&quot;Himabindu&quot;,&quot;given&quot;:&quot;V.&quot;,&quot;parse-names&quot;:false,&quot;dropping-particle&quot;:&quot;&quot;,&quot;non-dropping-particle&quot;:&quot;&quot;}],&quot;container-title&quot;:&quot;Materials Science for Energy Technologies&quot;,&quot;DOI&quot;:&quot;10.1016/j.mset.2019.03.002&quot;,&quot;ISSN&quot;:&quot;25892991&quot;,&quot;issued&quot;:{&quot;date-parts&quot;:[[2019,12]]},&quot;page&quot;:&quot;442-454&quot;,&quot;issue&quot;:&quot;3&quot;,&quot;volume&quot;:&quot;2&quot;,&quot;container-title-short&quot;:&quot;Mater. Sci. Energy Technol.&quot;},&quot;isTemporary&quot;:false}]},{&quot;citationID&quot;:&quot;MENDELEY_CITATION_e23df023-1b0e-4c7d-a81a-d4f5c2bec620&quot;,&quot;properties&quot;:{&quot;noteIndex&quot;:0},&quot;isEdited&quot;:false,&quot;manualOverride&quot;:{&quot;isManuallyOverridden&quot;:false,&quot;citeprocText&quot;:&quot;[17]&quot;,&quot;manualOverrideText&quot;:&quot;&quot;},&quot;citationTag&quot;:&quot;MENDELEY_CITATION_v3_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&quot;,&quot;citationItems&quot;:[{&quot;id&quot;:&quot;8c3b2930-cd0d-331a-8923-1e74c3142273&quot;,&quot;itemData&quot;:{&quot;type&quot;:&quot;article-journal&quot;,&quot;id&quot;:&quot;8c3b2930-cd0d-331a-8923-1e74c3142273&quot;,&quot;title&quot;:&quot;LCA and exergy-economic evaluation of a biogas-to-fuels system using CO2 hydrogenation and exhaust gas recycling&quot;,&quot;author&quot;:[{&quot;family&quot;:&quot;Ghiasirad&quot;,&quot;given&quot;:&quot;Hamed&quot;,&quot;parse-names&quot;:false,&quot;dropping-particle&quot;:&quot;&quot;,&quot;non-dropping-particle&quot;:&quot;&quot;},{&quot;family&quot;:&quot;Ebrahimian&quot;,&quot;given&quot;:&quot;Farinaz&quot;,&quot;parse-names&quot;:false,&quot;dropping-particle&quot;:&quot;&quot;,&quot;non-dropping-particle&quot;:&quot;&quot;},{&quot;family&quot;:&quot;Gholizadeh&quot;,&quot;given&quot;:&quot;Towhid&quot;,&quot;parse-names&quot;:false,&quot;dropping-particle&quot;:&quot;&quot;,&quot;non-dropping-particle&quot;:&quot;&quot;},{&quot;family&quot;:&quot;Mohammadi&quot;,&quot;given&quot;:&quot;Ali&quot;,&quot;parse-names&quot;:false,&quot;dropping-particle&quot;:&quot;&quot;,&quot;non-dropping-particle&quot;:&quot;&quot;},{&quot;family&quot;:&quot;Mirmasoumi&quot;,&quot;given&quot;:&quot;Siamak&quot;,&quot;parse-names&quot;:false,&quot;dropping-particle&quot;:&quot;&quot;,&quot;non-dropping-particle&quot;:&quot;&quot;},{&quot;family&quot;:&quot;Saray&quot;,&quot;given&quot;:&quot;Rahim Khoshbakhti&quot;,&quot;parse-names&quot;:false,&quot;dropping-particle&quot;:&quot;&quot;,&quot;non-dropping-particle&quot;:&quot;&quot;},{&quot;family&quot;:&quot;Skorek-Osikowska&quot;,&quot;given&quot;:&quot;Anna&quot;,&quot;parse-names&quot;:false,&quot;dropping-particle&quot;:&quot;&quot;,&quot;non-dropping-particle&quot;:&quot;&quot;}],&quot;container-title&quot;:&quot;Energy Conversion and Management: X&quot;,&quot;DOI&quot;:&quot;10.1016/j.ecmx.2025.100897&quot;,&quot;ISSN&quot;:&quot;25901745&quot;,&quot;issued&quot;:{&quot;date-parts&quot;:[[2025,4]]},&quot;page&quot;:&quot;100897&quot;,&quot;volume&quot;:&quot;26&quot;,&quot;container-title-short&quot;:&quot;&quot;},&quot;isTemporary&quot;:false}]},{&quot;citationID&quot;:&quot;MENDELEY_CITATION_f5902acf-3f1b-4f47-a295-09ff9652d7b2&quot;,&quot;properties&quot;:{&quot;noteIndex&quot;:0},&quot;isEdited&quot;:false,&quot;manualOverride&quot;:{&quot;isManuallyOverridden&quot;:false,&quot;citeprocText&quot;:&quot;[18]&quot;,&quot;manualOverrideText&quot;:&quot;&quot;},&quot;citationTag&quot;:&quot;MENDELEY_CITATION_v3_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&quot;,&quot;citationItems&quot;:[{&quot;id&quot;:&quot;cb817469-f165-3488-91d4-ffe692974354&quot;,&quot;itemData&quot;:{&quot;type&quot;:&quot;article-journal&quot;,&quot;id&quot;:&quot;cb817469-f165-3488-91d4-ffe692974354&quot;,&quot;title&quot;:&quot;Alternative sustainable routes to methanol production: Techno-economic and environmental assessment&quot;,&quot;author&quot;:[{&quot;family&quot;:&quot;Scomazzon&quot;,&quot;given&quot;:&quot;Marco&quot;,&quot;parse-names&quot;:false,&quot;dropping-particle&quot;:&quot;&quot;,&quot;non-dropping-particle&quot;:&quot;&quot;},{&quot;family&quot;:&quot;Barbera&quot;,&quot;given&quot;:&quot;Elena&quot;,&quot;parse-names&quot;:false,&quot;dropping-particle&quot;:&quot;&quot;,&quot;non-dropping-particle&quot;:&quot;&quot;},{&quot;family&quot;:&quot;Bezzo&quot;,&quot;given&quot;:&quot;Fabrizio&quot;,&quot;parse-names&quot;:false,&quot;dropping-particle&quot;:&quot;&quot;,&quot;non-dropping-particle&quot;:&quot;&quot;}],&quot;container-title&quot;:&quot;Journal of Environmental Chemical Engineering&quot;,&quot;DOI&quot;:&quot;10.1016/j.jece.2024.112674&quot;,&quot;ISSN&quot;:&quot;22133437&quot;,&quot;issued&quot;:{&quot;date-parts&quot;:[[2024,6]]},&quot;page&quot;:&quot;112674&quot;,&quot;issue&quot;:&quot;3&quot;,&quot;volume&quot;:&quot;12&quot;,&quot;container-title-short&quot;:&quot;J. Environ. Chem. Eng.&quot;},&quot;isTemporary&quot;:false}]},{&quot;citationID&quot;:&quot;MENDELEY_CITATION_50e16af0-91a6-43f9-862e-188051a6076b&quot;,&quot;properties&quot;:{&quot;noteIndex&quot;:0},&quot;isEdited&quot;:false,&quot;manualOverride&quot;:{&quot;isManuallyOverridden&quot;:false,&quot;citeprocText&quot;:&quot;[17]&quot;,&quot;manualOverrideText&quot;:&quot;&quot;},&quot;citationTag&quot;:&quot;MENDELEY_CITATION_v3_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&quot;,&quot;citationItems&quot;:[{&quot;id&quot;:&quot;8c3b2930-cd0d-331a-8923-1e74c3142273&quot;,&quot;itemData&quot;:{&quot;type&quot;:&quot;article-journal&quot;,&quot;id&quot;:&quot;8c3b2930-cd0d-331a-8923-1e74c3142273&quot;,&quot;title&quot;:&quot;LCA and exergy-economic evaluation of a biogas-to-fuels system using CO2 hydrogenation and exhaust gas recycling&quot;,&quot;author&quot;:[{&quot;family&quot;:&quot;Ghiasirad&quot;,&quot;given&quot;:&quot;Hamed&quot;,&quot;parse-names&quot;:false,&quot;dropping-particle&quot;:&quot;&quot;,&quot;non-dropping-particle&quot;:&quot;&quot;},{&quot;family&quot;:&quot;Ebrahimian&quot;,&quot;given&quot;:&quot;Farinaz&quot;,&quot;parse-names&quot;:false,&quot;dropping-particle&quot;:&quot;&quot;,&quot;non-dropping-particle&quot;:&quot;&quot;},{&quot;family&quot;:&quot;Gholizadeh&quot;,&quot;given&quot;:&quot;Towhid&quot;,&quot;parse-names&quot;:false,&quot;dropping-particle&quot;:&quot;&quot;,&quot;non-dropping-particle&quot;:&quot;&quot;},{&quot;family&quot;:&quot;Mohammadi&quot;,&quot;given&quot;:&quot;Ali&quot;,&quot;parse-names&quot;:false,&quot;dropping-particle&quot;:&quot;&quot;,&quot;non-dropping-particle&quot;:&quot;&quot;},{&quot;family&quot;:&quot;Mirmasoumi&quot;,&quot;given&quot;:&quot;Siamak&quot;,&quot;parse-names&quot;:false,&quot;dropping-particle&quot;:&quot;&quot;,&quot;non-dropping-particle&quot;:&quot;&quot;},{&quot;family&quot;:&quot;Saray&quot;,&quot;given&quot;:&quot;Rahim Khoshbakhti&quot;,&quot;parse-names&quot;:false,&quot;dropping-particle&quot;:&quot;&quot;,&quot;non-dropping-particle&quot;:&quot;&quot;},{&quot;family&quot;:&quot;Skorek-Osikowska&quot;,&quot;given&quot;:&quot;Anna&quot;,&quot;parse-names&quot;:false,&quot;dropping-particle&quot;:&quot;&quot;,&quot;non-dropping-particle&quot;:&quot;&quot;}],&quot;container-title&quot;:&quot;Energy Conversion and Management: X&quot;,&quot;DOI&quot;:&quot;10.1016/j.ecmx.2025.100897&quot;,&quot;ISSN&quot;:&quot;25901745&quot;,&quot;issued&quot;:{&quot;date-parts&quot;:[[2025,4]]},&quot;page&quot;:&quot;100897&quot;,&quot;volume&quot;:&quot;26&quot;,&quot;container-title-short&quot;:&quot;&quot;},&quot;isTemporary&quot;:false}]},{&quot;citationID&quot;:&quot;MENDELEY_CITATION_f6f42889-26df-4dbb-987f-6da6adaab487&quot;,&quot;properties&quot;:{&quot;noteIndex&quot;:0},&quot;isEdited&quot;:false,&quot;manualOverride&quot;:{&quot;isManuallyOverridden&quot;:false,&quot;citeprocText&quot;:&quot;[19]&quot;,&quot;manualOverrideText&quot;:&quot;&quot;},&quot;citationTag&quot;:&quot;MENDELEY_CITATION_v3_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&quot;,&quot;citationItems&quot;:[{&quot;id&quot;:&quot;28a53769-a0e5-3c5a-80f0-90f7301702eb&quot;,&quot;itemData&quot;:{&quot;type&quot;:&quot;article-journal&quot;,&quot;id&quot;:&quot;28a53769-a0e5-3c5a-80f0-90f7301702eb&quot;,&quot;title&quot;:&quot;Techno-economic-environmental assessment of the integration of power-to-X and biogas utilization towards the production of electricity, hydrogen, methane and methanol&quot;,&quot;author&quot;:[{&quot;family&quot;:&quot;Moioli&quot;,&quot;given&quot;:&quot;Emanuele&quot;,&quot;parse-names&quot;:false,&quot;dropping-particle&quot;:&quot;&quot;,&quot;non-dropping-particle&quot;:&quot;&quot;},{&quot;family&quot;:&quot;Schildhauer&quot;,&quot;given&quot;:&quot;Tilman&quot;,&quot;parse-names&quot;:false,&quot;dropping-particle&quot;:&quot;&quot;,&quot;non-dropping-particle&quot;:&quot;&quot;}],&quot;container-title&quot;:&quot;Sustainable Energy &amp; Fuels&quot;,&quot;DOI&quot;:&quot;10.1039/D3SE00052D&quot;,&quot;ISSN&quot;:&quot;2398-4902&quot;,&quot;issued&quot;:{&quot;date-parts&quot;:[[2023]]},&quot;page&quot;:&quot;2690-2706&quot;,&quot;abstract&quot;:&quot;&lt;p&gt;Various routes for the valorisation of biogas towards methane and methanol and for electricity or hydrogen storage is assessed.&lt;/p&gt;&quot;,&quot;issue&quot;:&quot;11&quot;,&quot;volume&quot;:&quot;7&quot;,&quot;container-title-short&quot;:&quot;Sustain. Energy Fuels&quot;},&quot;isTemporary&quot;:false}]},{&quot;citationID&quot;:&quot;MENDELEY_CITATION_8e42163d-fd20-4d53-837d-ec79437e85ea&quot;,&quot;properties&quot;:{&quot;noteIndex&quot;:0},&quot;isEdited&quot;:false,&quot;manualOverride&quot;:{&quot;isManuallyOverridden&quot;:false,&quot;citeprocText&quot;:&quot;[20]&quot;,&quot;manualOverrideText&quot;:&quot;&quot;},&quot;citationTag&quot;:&quot;MENDELEY_CITATION_v3_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&quot;,&quot;citationItems&quot;:[{&quot;id&quot;:&quot;104cea19-ccc6-37e7-9959-f839fd356eec&quot;,&quot;itemData&quot;:{&quot;type&quot;:&quot;article-journal&quot;,&quot;id&quot;:&quot;104cea19-ccc6-37e7-9959-f839fd356eec&quot;,&quot;title&quot;:&quot;Improving carbon efficiency for an advanced Biomass-to-Liquid process using hydrogen and oxygen from electrolysis&quot;,&quot;author&quot;:[{&quot;family&quot;:&quot;Dossow&quot;,&quot;given&quot;:&quot;Marcel&quot;,&quot;parse-names&quot;:false,&quot;dropping-particle&quot;:&quot;&quot;,&quot;non-dropping-particle&quot;:&quot;&quot;},{&quot;family&quot;:&quot;Dieterich&quot;,&quot;given&quot;:&quot;Vincent&quot;,&quot;parse-names&quot;:false,&quot;dropping-particle&quot;:&quot;&quot;,&quot;non-dropping-particle&quot;:&quot;&quot;},{&quot;family&quot;:&quot;Hanel&quot;,&quot;given&quot;:&quot;Andreas&quot;,&quot;parse-names&quot;:false,&quot;dropping-particle&quot;:&quot;&quot;,&quot;non-dropping-particle&quot;:&quot;&quot;},{&quot;family&quot;:&quot;Spliethoff&quot;,&quot;given&quot;:&quot;Hartmut&quot;,&quot;parse-names&quot;:false,&quot;dropping-particle&quot;:&quot;&quot;,&quot;non-dropping-particle&quot;:&quot;&quot;},{&quot;family&quot;:&quot;Fendt&quot;,&quot;given&quot;:&quot;Sebastian&quot;,&quot;parse-names&quot;:false,&quot;dropping-particle&quot;:&quot;&quot;,&quot;non-dropping-particle&quot;:&quot;&quot;}],&quot;container-title&quot;:&quot;Renewable and Sustainable Energy Reviews&quot;,&quot;DOI&quot;:&quot;10.1016/j.rser.2021.111670&quot;,&quot;ISSN&quot;:&quot;13640321&quot;,&quot;issued&quot;:{&quot;date-parts&quot;:[[2021,12]]},&quot;page&quot;:&quot;111670&quot;,&quot;volume&quot;:&quot;152&quot;,&quot;container-title-short&quot;:&quot;&quot;},&quot;isTemporary&quot;:false}]},{&quot;citationID&quot;:&quot;MENDELEY_CITATION_88d0ffc1-318e-4fe5-b886-2a172eaebfef&quot;,&quot;properties&quot;:{&quot;noteIndex&quot;:0},&quot;isEdited&quot;:false,&quot;manualOverride&quot;:{&quot;isManuallyOverridden&quot;:false,&quot;citeprocText&quot;:&quot;[21]&quot;,&quot;manualOverrideText&quot;:&quot;&quot;},&quot;citationTag&quot;:&quot;MENDELEY_CITATION_v3_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&quot;,&quot;citationItems&quot;:[{&quot;id&quot;:&quot;70edddc8-ee03-31fd-86e6-6cf7a4858b7a&quot;,&quot;itemData&quot;:{&quot;type&quot;:&quot;article-journal&quot;,&quot;id&quot;:&quot;70edddc8-ee03-31fd-86e6-6cf7a4858b7a&quot;,&quot;title&quot;:&quot;Flexible Power and Biomass-To-Methanol Plants With Different Gasification Technologies&quot;,&quot;author&quot;:[{&quot;family&quot;:&quot;Poluzzi&quot;,&quot;given&quot;:&quot;A.&quot;,&quot;parse-names&quot;:false,&quot;dropping-particle&quot;:&quot;&quot;,&quot;non-dropping-particle&quot;:&quot;&quot;},{&quot;family&quot;:&quot;Guandalini&quot;,&quot;given&quot;:&quot;G.&quot;,&quot;parse-names&quot;:false,&quot;dropping-particle&quot;:&quot;&quot;,&quot;non-dropping-particle&quot;:&quot;&quot;},{&quot;family&quot;:&quot;Guffanti&quot;,&quot;given&quot;:&quot;S.&quot;,&quot;parse-names&quot;:false,&quot;dropping-particle&quot;:&quot;&quot;,&quot;non-dropping-particle&quot;:&quot;&quot;},{&quot;family&quot;:&quot;Martinelli&quot;,&quot;given&quot;:&quot;M.&quot;,&quot;parse-names&quot;:false,&quot;dropping-particle&quot;:&quot;&quot;,&quot;non-dropping-particle&quot;:&quot;&quot;},{&quot;family&quot;:&quot;Moioli&quot;,&quot;given&quot;:&quot;S.&quot;,&quot;parse-names&quot;:false,&quot;dropping-particle&quot;:&quot;&quot;,&quot;non-dropping-particle&quot;:&quot;&quot;},{&quot;family&quot;:&quot;Huttenhuis&quot;,&quot;given&quot;:&quot;P.&quot;,&quot;parse-names&quot;:false,&quot;dropping-particle&quot;:&quot;&quot;,&quot;non-dropping-particle&quot;:&quot;&quot;},{&quot;family&quot;:&quot;Rexwinkel&quot;,&quot;given&quot;:&quot;G.&quot;,&quot;parse-names&quot;:false,&quot;dropping-particle&quot;:&quot;&quot;,&quot;non-dropping-particle&quot;:&quot;&quot;},{&quot;family&quot;:&quot;Palonen&quot;,&quot;given&quot;:&quot;J.&quot;,&quot;parse-names&quot;:false,&quot;dropping-particle&quot;:&quot;&quot;,&quot;non-dropping-particle&quot;:&quot;&quot;},{&quot;family&quot;:&quot;Martelli&quot;,&quot;given&quot;:&quot;E.&quot;,&quot;parse-names&quot;:false,&quot;dropping-particle&quot;:&quot;&quot;,&quot;non-dropping-particle&quot;:&quot;&quot;},{&quot;family&quot;:&quot;Groppi&quot;,&quot;given&quot;:&quot;G.&quot;,&quot;parse-names&quot;:false,&quot;dropping-particle&quot;:&quot;&quot;,&quot;non-dropping-particle&quot;:&quot;&quot;},{&quot;family&quot;:&quot;Romano&quot;,&quot;given&quot;:&quot;M. C.&quot;,&quot;parse-names&quot;:false,&quot;dropping-particle&quot;:&quot;&quot;,&quot;non-dropping-particle&quot;:&quot;&quot;}],&quot;container-title&quot;:&quot;Frontiers in Energy Research&quot;,&quot;DOI&quot;:&quot;10.3389/fenrg.2021.795673&quot;,&quot;ISSN&quot;:&quot;2296-598X&quot;,&quot;issued&quot;:{&quot;date-parts&quot;:[[2022,1,27]]},&quot;abstract&quot;:&quot;&lt;p&gt; The competitiveness of biofuels may be increased by integrating biomass gasification plants with electrolysis units, which generate hydrogen to be combined with carbon-rich syngas. This option allows increasing the yield of the final product by retaining a higher amount of biogenic carbon and improving the resilience of the energy sector by favoring electric grid services and sector coupling. This article illustrates a techno-economic comparative analysis of three flexible power and biomass to methanol plants based on different gasification technologies: direct gasification, indirect gasification, and sorption-enhanced gasification. The design and operational criteria of each plant are conceived to operate both without green hydrogen addition (baseline mode) and with hydrogen addition (enhanced mode), following an intermittent use of the electrolysis system, which is turned on when the electricity price allows an economically viable hydrogen production. The methanol production plants include a gasification section, syngas cleaning, conditioning and compression section, methanol synthesis and purification, and heat recovery steam cycle to be flexibly operated. Due to the high oxygen demand in the gasifier, the direct gasification-based plant obtains a great advantage to be operated between a minimum load to satisfy the oxygen demand at high electricity prices and a maximum load to maximize methanol production at low electricity prices. This allows avoiding large oxygen storages with significant benefits for Capex and safety issues. The analysis reports specific fixed-capital investments between 1823 and 2048 €/kW of methanol output in the enhanced operation and LCOFs between 29.7 and 31.7 €/GJ &lt;sub&gt;LHV&lt;/sub&gt; . Economic advantages may be derived from a decrease in the electrolysis capital investment, especially for the direct gasification-based plants, which employ the greatest sized electrolyzer. Methanol breakeven selling prices range between 545 and 582 €/t with the 2019 reference Denmark electricity price curve and between 484 and 535 €/t with an assumed modified electricity price curve of a future energy mix with increased penetration of intermittent renewables. &lt;/p&gt;&quot;,&quot;volume&quot;:&quot;9&quot;,&quot;container-title-short&quot;:&quot;Front. Energy Res.&quot;},&quot;isTemporary&quot;:false}]},{&quot;citationID&quot;:&quot;MENDELEY_CITATION_e06c8150-ca7f-4bb6-8b73-8555f96f90d4&quot;,&quot;properties&quot;:{&quot;noteIndex&quot;:0},&quot;isEdited&quot;:false,&quot;manualOverride&quot;:{&quot;isManuallyOverridden&quot;:false,&quot;citeprocText&quot;:&quot;[22]&quot;,&quot;manualOverrideText&quot;:&quot;&quot;},&quot;citationTag&quot;:&quot;MENDELEY_CITATION_v3_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&quot;,&quot;citationItems&quot;:[{&quot;id&quot;:&quot;a36d5e43-f1b3-3f4c-8cdc-446f28ab3924&quot;,&quot;itemData&quot;:{&quot;type&quot;:&quot;article-journal&quot;,&quot;id&quot;:&quot;a36d5e43-f1b3-3f4c-8cdc-446f28ab3924&quot;,&quot;title&quot;:&quot;Benefits of Hybrid Production of E-Methanol in Connection with Biomass Gasification&quot;,&quot;author&quot;:[{&quot;family&quot;:&quot;Anetjärvi&quot;,&quot;given&quot;:&quot;Eemeli&quot;,&quot;parse-names&quot;:false,&quot;dropping-particle&quot;:&quot;&quot;,&quot;non-dropping-particle&quot;:&quot;&quot;},{&quot;family&quot;:&quot;Vakkilainen&quot;,&quot;given&quot;:&quot;Esa&quot;,&quot;parse-names&quot;:false,&quot;dropping-particle&quot;:&quot;&quot;,&quot;non-dropping-particle&quot;:&quot;&quot;},{&quot;family&quot;:&quot;Melin&quot;,&quot;given&quot;:&quot;Kristian&quot;,&quot;parse-names&quot;:false,&quot;dropping-particle&quot;:&quot;&quot;,&quot;non-dropping-particle&quot;:&quot;&quot;}],&quot;container-title&quot;:&quot;SSRN Electronic Journal&quot;,&quot;DOI&quot;:&quot;10.2139/ssrn.4184476&quot;,&quot;ISSN&quot;:&quot;1556-5068&quot;,&quot;issued&quot;:{&quot;date-parts&quot;:[[2022]]},&quot;container-title-short&quot;:&quot;&quot;},&quot;isTemporary&quot;:false}]},{&quot;citationID&quot;:&quot;MENDELEY_CITATION_cd84c5ed-f67d-47d0-afce-d099ac46029a&quot;,&quot;properties&quot;:{&quot;noteIndex&quot;:0},&quot;isEdited&quot;:false,&quot;manualOverride&quot;:{&quot;isManuallyOverridden&quot;:false,&quot;citeprocText&quot;:&quot;[23]&quot;,&quot;manualOverrideText&quot;:&quot;&quot;},&quot;citationTag&quot;:&quot;MENDELEY_CITATION_v3_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&quot;,&quot;citationItems&quot;:[{&quot;id&quot;:&quot;048c482b-30be-34eb-bade-6c65560bb00c&quot;,&quot;itemData&quot;:{&quot;type&quot;:&quot;article-journal&quot;,&quot;id&quot;:&quot;048c482b-30be-34eb-bade-6c65560bb00c&quot;,&quot;title&quot;:&quot;Techno-economic optimization of biomass-to-methanol with solid-oxide electrolyzer&quot;,&quot;author&quot;:[{&quot;family&quot;:&quot;Zhang&quot;,&quot;given&quot;:&quot;Hanfei&quot;,&quot;parse-names&quot;:false,&quot;dropping-particle&quot;:&quot;&quot;,&quot;non-dropping-particle&quot;:&quot;&quot;},{&quot;family&quot;:&quot;Wang&quot;,&quot;given&quot;:&quot;Ligang&quot;,&quot;parse-names&quot;:false,&quot;dropping-particle&quot;:&quot;&quot;,&quot;non-dropping-particle&quot;:&quot;&quot;},{&quot;family&quot;:&quot;Pérez-Fortes&quot;,&quot;given&quot;:&quot;Mar&quot;,&quot;parse-names&quot;:false,&quot;dropping-particle&quot;:&quot;&quot;,&quot;non-dropping-particle&quot;:&quot;&quot;},{&quot;family&quot;:&quot;herle&quot;,&quot;given&quot;:&quot;Jan&quot;,&quot;parse-names&quot;:false,&quot;dropping-particle&quot;:&quot;&quot;,&quot;non-dropping-particle&quot;:&quot;Van&quot;},{&quot;family&quot;:&quot;Maréchal&quot;,&quot;given&quot;:&quot;François&quot;,&quot;parse-names&quot;:false,&quot;dropping-particle&quot;:&quot;&quot;,&quot;non-dropping-particle&quot;:&quot;&quot;},{&quot;family&quot;:&quot;Desideri&quot;,&quot;given&quot;:&quot;Umberto&quot;,&quot;parse-names&quot;:false,&quot;dropping-particle&quot;:&quot;&quot;,&quot;non-dropping-particle&quot;:&quot;&quot;}],&quot;container-title&quot;:&quot;Applied Energy&quot;,&quot;DOI&quot;:&quot;10.1016/j.apenergy.2019.114071&quot;,&quot;ISSN&quot;:&quot;03062619&quot;,&quot;issued&quot;:{&quot;date-parts&quot;:[[2020,1]]},&quot;page&quot;:&quot;114071&quot;,&quot;volume&quot;:&quot;258&quot;,&quot;container-title-short&quot;:&quot;Appl. Energy&quot;},&quot;isTemporary&quot;:false}]},{&quot;citationID&quot;:&quot;MENDELEY_CITATION_42ff2c48-5158-4a41-83ab-c9fb9e7d73b7&quot;,&quot;properties&quot;:{&quot;noteIndex&quot;:0},&quot;isEdited&quot;:false,&quot;manualOverride&quot;:{&quot;isManuallyOverridden&quot;:false,&quot;citeprocText&quot;:&quot;[24]&quot;,&quot;manualOverrideText&quot;:&quot;&quot;},&quot;citationTag&quot;:&quot;MENDELEY_CITATION_v3_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&quot;,&quot;citationItems&quot;:[{&quot;id&quot;:&quot;ded22db1-0dce-3c1b-981f-fd5847a7cce1&quot;,&quot;itemData&quot;:{&quot;type&quot;:&quot;article-journal&quot;,&quot;id&quot;:&quot;ded22db1-0dce-3c1b-981f-fd5847a7cce1&quot;,&quot;title&quot;:&quot;Flexible Power &amp;amp; Biomass-to-Methanol plants: Design optimization and economic viability of the electrolysis integration&quot;,&quot;author&quot;:[{&quot;family&quot;:&quot;Poluzzi&quot;,&quot;given&quot;:&quot;Alessandro&quot;,&quot;parse-names&quot;:false,&quot;dropping-particle&quot;:&quot;&quot;,&quot;non-dropping-particle&quot;:&quot;&quot;},{&quot;family&quot;:&quot;Guandalini&quot;,&quot;given&quot;:&quot;Giulio&quot;,&quot;parse-names&quot;:false,&quot;dropping-particle&quot;:&quot;&quot;,&quot;non-dropping-particle&quot;:&quot;&quot;},{&quot;family&quot;:&quot;Guffanti&quot;,&quot;given&quot;:&quot;Simone&quot;,&quot;parse-names&quot;:false,&quot;dropping-particle&quot;:&quot;&quot;,&quot;non-dropping-particle&quot;:&quot;&quot;},{&quot;family&quot;:&quot;Elsido&quot;,&quot;given&quot;:&quot;Cristina&quot;,&quot;parse-names&quot;:false,&quot;dropping-particle&quot;:&quot;&quot;,&quot;non-dropping-particle&quot;:&quot;&quot;},{&quot;family&quot;:&quot;Moioli&quot;,&quot;given&quot;:&quot;Stefania&quot;,&quot;parse-names&quot;:false,&quot;dropping-particle&quot;:&quot;&quot;,&quot;non-dropping-particle&quot;:&quot;&quot;},{&quot;family&quot;:&quot;Huttenhuis&quot;,&quot;given&quot;:&quot;Patrick&quot;,&quot;parse-names&quot;:false,&quot;dropping-particle&quot;:&quot;&quot;,&quot;non-dropping-particle&quot;:&quot;&quot;},{&quot;family&quot;:&quot;Rexwinkel&quot;,&quot;given&quot;:&quot;Glenn&quot;,&quot;parse-names&quot;:false,&quot;dropping-particle&quot;:&quot;&quot;,&quot;non-dropping-particle&quot;:&quot;&quot;},{&quot;family&quot;:&quot;Martelli&quot;,&quot;given&quot;:&quot;Emanuele&quot;,&quot;parse-names&quot;:false,&quot;dropping-particle&quot;:&quot;&quot;,&quot;non-dropping-particle&quot;:&quot;&quot;},{&quot;family&quot;:&quot;Groppi&quot;,&quot;given&quot;:&quot;Gianpiero&quot;,&quot;parse-names&quot;:false,&quot;dropping-particle&quot;:&quot;&quot;,&quot;non-dropping-particle&quot;:&quot;&quot;},{&quot;family&quot;:&quot;Romano&quot;,&quot;given&quot;:&quot;Matteo C.&quot;,&quot;parse-names&quot;:false,&quot;dropping-particle&quot;:&quot;&quot;,&quot;non-dropping-particle&quot;:&quot;&quot;}],&quot;container-title&quot;:&quot;Fuel&quot;,&quot;DOI&quot;:&quot;10.1016/j.fuel.2021.122113&quot;,&quot;ISSN&quot;:&quot;00162361&quot;,&quot;issued&quot;:{&quot;date-parts&quot;:[[2022,2]]},&quot;page&quot;:&quot;122113&quot;,&quot;volume&quot;:&quot;310&quot;,&quot;container-title-short&quot;:&quot;&quot;},&quot;isTemporary&quot;:false}]},{&quot;citationID&quot;:&quot;MENDELEY_CITATION_a84a64c2-5cd9-45b5-8dd3-eed0901210e0&quot;,&quot;properties&quot;:{&quot;noteIndex&quot;:0},&quot;isEdited&quot;:false,&quot;manualOverride&quot;:{&quot;isManuallyOverridden&quot;:false,&quot;citeprocText&quot;:&quot;[25]&quot;,&quot;manualOverrideText&quot;:&quot;&quot;},&quot;citationTag&quot;:&quot;MENDELEY_CITATION_v3_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&quot;,&quot;citationItems&quot;:[{&quot;id&quot;:&quot;a332ee91-b343-3289-860a-430557bbc5fa&quot;,&quot;itemData&quot;:{&quot;type&quot;:&quot;article-journal&quot;,&quot;id&quot;:&quot;a332ee91-b343-3289-860a-430557bbc5fa&quot;,&quot;title&quot;:&quot;Flexible Power &amp;amp; Biomass-to-Methanol plants: Design optimization and economic viability of the electrolysis integration&quot;,&quot;author&quot;:[{&quot;family&quot;:&quot;Poluzzi&quot;,&quot;given&quot;:&quot;Alessandro&quot;,&quot;parse-names&quot;:false,&quot;dropping-particle&quot;:&quot;&quot;,&quot;non-dropping-particle&quot;:&quot;&quot;},{&quot;family&quot;:&quot;Guandalini&quot;,&quot;given&quot;:&quot;Giulio&quot;,&quot;parse-names&quot;:false,&quot;dropping-particle&quot;:&quot;&quot;,&quot;non-dropping-particle&quot;:&quot;&quot;},{&quot;family&quot;:&quot;Guffanti&quot;,&quot;given&quot;:&quot;Simone&quot;,&quot;parse-names&quot;:false,&quot;dropping-particle&quot;:&quot;&quot;,&quot;non-dropping-particle&quot;:&quot;&quot;},{&quot;family&quot;:&quot;Elsido&quot;,&quot;given&quot;:&quot;Cristina&quot;,&quot;parse-names&quot;:false,&quot;dropping-particle&quot;:&quot;&quot;,&quot;non-dropping-particle&quot;:&quot;&quot;},{&quot;family&quot;:&quot;Moioli&quot;,&quot;given&quot;:&quot;Stefania&quot;,&quot;parse-names&quot;:false,&quot;dropping-particle&quot;:&quot;&quot;,&quot;non-dropping-particle&quot;:&quot;&quot;},{&quot;family&quot;:&quot;Huttenhuis&quot;,&quot;given&quot;:&quot;Patrick&quot;,&quot;parse-names&quot;:false,&quot;dropping-particle&quot;:&quot;&quot;,&quot;non-dropping-particle&quot;:&quot;&quot;},{&quot;family&quot;:&quot;Rexwinkel&quot;,&quot;given&quot;:&quot;Glenn&quot;,&quot;parse-names&quot;:false,&quot;dropping-particle&quot;:&quot;&quot;,&quot;non-dropping-particle&quot;:&quot;&quot;},{&quot;family&quot;:&quot;Martelli&quot;,&quot;given&quot;:&quot;Emanuele&quot;,&quot;parse-names&quot;:false,&quot;dropping-particle&quot;:&quot;&quot;,&quot;non-dropping-particle&quot;:&quot;&quot;},{&quot;family&quot;:&quot;Groppi&quot;,&quot;given&quot;:&quot;Gianpiero&quot;,&quot;parse-names&quot;:false,&quot;dropping-particle&quot;:&quot;&quot;,&quot;non-dropping-particle&quot;:&quot;&quot;},{&quot;family&quot;:&quot;Romano&quot;,&quot;given&quot;:&quot;Matteo C.&quot;,&quot;parse-names&quot;:false,&quot;dropping-particle&quot;:&quot;&quot;,&quot;non-dropping-particle&quot;:&quot;&quot;}],&quot;container-title&quot;:&quot;Fuel&quot;,&quot;DOI&quot;:&quot;10.1016/j.fuel.2021.122113&quot;,&quot;ISSN&quot;:&quot;00162361&quot;,&quot;issued&quot;:{&quot;date-parts&quot;:[[2022,2]]},&quot;page&quot;:&quot;122113&quot;,&quot;volume&quot;:&quot;310&quot;,&quot;container-title-short&quot;:&quot;&quot;},&quot;isTemporary&quot;:false}]},{&quot;citationID&quot;:&quot;MENDELEY_CITATION_8c83e7a2-71cf-4160-9fdd-2510731786cf&quot;,&quot;properties&quot;:{&quot;noteIndex&quot;:0},&quot;isEdited&quot;:false,&quot;manualOverride&quot;:{&quot;isManuallyOverridden&quot;:false,&quot;citeprocText&quot;:&quot;[21]&quot;,&quot;manualOverrideText&quot;:&quot;&quot;},&quot;citationTag&quot;:&quot;MENDELEY_CITATION_v3_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&quot;,&quot;citationItems&quot;:[{&quot;id&quot;:&quot;70edddc8-ee03-31fd-86e6-6cf7a4858b7a&quot;,&quot;itemData&quot;:{&quot;type&quot;:&quot;article-journal&quot;,&quot;id&quot;:&quot;70edddc8-ee03-31fd-86e6-6cf7a4858b7a&quot;,&quot;title&quot;:&quot;Flexible Power and Biomass-To-Methanol Plants With Different Gasification Technologies&quot;,&quot;author&quot;:[{&quot;family&quot;:&quot;Poluzzi&quot;,&quot;given&quot;:&quot;A.&quot;,&quot;parse-names&quot;:false,&quot;dropping-particle&quot;:&quot;&quot;,&quot;non-dropping-particle&quot;:&quot;&quot;},{&quot;family&quot;:&quot;Guandalini&quot;,&quot;given&quot;:&quot;G.&quot;,&quot;parse-names&quot;:false,&quot;dropping-particle&quot;:&quot;&quot;,&quot;non-dropping-particle&quot;:&quot;&quot;},{&quot;family&quot;:&quot;Guffanti&quot;,&quot;given&quot;:&quot;S.&quot;,&quot;parse-names&quot;:false,&quot;dropping-particle&quot;:&quot;&quot;,&quot;non-dropping-particle&quot;:&quot;&quot;},{&quot;family&quot;:&quot;Martinelli&quot;,&quot;given&quot;:&quot;M.&quot;,&quot;parse-names&quot;:false,&quot;dropping-particle&quot;:&quot;&quot;,&quot;non-dropping-particle&quot;:&quot;&quot;},{&quot;family&quot;:&quot;Moioli&quot;,&quot;given&quot;:&quot;S.&quot;,&quot;parse-names&quot;:false,&quot;dropping-particle&quot;:&quot;&quot;,&quot;non-dropping-particle&quot;:&quot;&quot;},{&quot;family&quot;:&quot;Huttenhuis&quot;,&quot;given&quot;:&quot;P.&quot;,&quot;parse-names&quot;:false,&quot;dropping-particle&quot;:&quot;&quot;,&quot;non-dropping-particle&quot;:&quot;&quot;},{&quot;family&quot;:&quot;Rexwinkel&quot;,&quot;given&quot;:&quot;G.&quot;,&quot;parse-names&quot;:false,&quot;dropping-particle&quot;:&quot;&quot;,&quot;non-dropping-particle&quot;:&quot;&quot;},{&quot;family&quot;:&quot;Palonen&quot;,&quot;given&quot;:&quot;J.&quot;,&quot;parse-names&quot;:false,&quot;dropping-particle&quot;:&quot;&quot;,&quot;non-dropping-particle&quot;:&quot;&quot;},{&quot;family&quot;:&quot;Martelli&quot;,&quot;given&quot;:&quot;E.&quot;,&quot;parse-names&quot;:false,&quot;dropping-particle&quot;:&quot;&quot;,&quot;non-dropping-particle&quot;:&quot;&quot;},{&quot;family&quot;:&quot;Groppi&quot;,&quot;given&quot;:&quot;G.&quot;,&quot;parse-names&quot;:false,&quot;dropping-particle&quot;:&quot;&quot;,&quot;non-dropping-particle&quot;:&quot;&quot;},{&quot;family&quot;:&quot;Romano&quot;,&quot;given&quot;:&quot;M. C.&quot;,&quot;parse-names&quot;:false,&quot;dropping-particle&quot;:&quot;&quot;,&quot;non-dropping-particle&quot;:&quot;&quot;}],&quot;container-title&quot;:&quot;Frontiers in Energy Research&quot;,&quot;DOI&quot;:&quot;10.3389/fenrg.2021.795673&quot;,&quot;ISSN&quot;:&quot;2296-598X&quot;,&quot;issued&quot;:{&quot;date-parts&quot;:[[2022,1,27]]},&quot;abstract&quot;:&quot;&lt;p&gt; The competitiveness of biofuels may be increased by integrating biomass gasification plants with electrolysis units, which generate hydrogen to be combined with carbon-rich syngas. This option allows increasing the yield of the final product by retaining a higher amount of biogenic carbon and improving the resilience of the energy sector by favoring electric grid services and sector coupling. This article illustrates a techno-economic comparative analysis of three flexible power and biomass to methanol plants based on different gasification technologies: direct gasification, indirect gasification, and sorption-enhanced gasification. The design and operational criteria of each plant are conceived to operate both without green hydrogen addition (baseline mode) and with hydrogen addition (enhanced mode), following an intermittent use of the electrolysis system, which is turned on when the electricity price allows an economically viable hydrogen production. The methanol production plants include a gasification section, syngas cleaning, conditioning and compression section, methanol synthesis and purification, and heat recovery steam cycle to be flexibly operated. Due to the high oxygen demand in the gasifier, the direct gasification-based plant obtains a great advantage to be operated between a minimum load to satisfy the oxygen demand at high electricity prices and a maximum load to maximize methanol production at low electricity prices. This allows avoiding large oxygen storages with significant benefits for Capex and safety issues. The analysis reports specific fixed-capital investments between 1823 and 2048 €/kW of methanol output in the enhanced operation and LCOFs between 29.7 and 31.7 €/GJ &lt;sub&gt;LHV&lt;/sub&gt; . Economic advantages may be derived from a decrease in the electrolysis capital investment, especially for the direct gasification-based plants, which employ the greatest sized electrolyzer. Methanol breakeven selling prices range between 545 and 582 €/t with the 2019 reference Denmark electricity price curve and between 484 and 535 €/t with an assumed modified electricity price curve of a future energy mix with increased penetration of intermittent renewables. &lt;/p&gt;&quot;,&quot;volume&quot;:&quot;9&quot;,&quot;container-title-short&quot;:&quot;Front. Energy Res.&quot;},&quot;isTemporary&quot;:false}]},{&quot;citationID&quot;:&quot;MENDELEY_CITATION_e2d98fbf-79a4-429b-9796-2be5c079023d&quot;,&quot;properties&quot;:{&quot;noteIndex&quot;:0},&quot;isEdited&quot;:false,&quot;manualOverride&quot;:{&quot;isManuallyOverridden&quot;:false,&quot;citeprocText&quot;:&quot;[25]&quot;,&quot;manualOverrideText&quot;:&quot;&quot;},&quot;citationTag&quot;:&quot;MENDELEY_CITATION_v3_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&quot;,&quot;citationItems&quot;:[{&quot;id&quot;:&quot;a332ee91-b343-3289-860a-430557bbc5fa&quot;,&quot;itemData&quot;:{&quot;type&quot;:&quot;article-journal&quot;,&quot;id&quot;:&quot;a332ee91-b343-3289-860a-430557bbc5fa&quot;,&quot;title&quot;:&quot;Flexible Power &amp;amp; Biomass-to-Methanol plants: Design optimization and economic viability of the electrolysis integration&quot;,&quot;author&quot;:[{&quot;family&quot;:&quot;Poluzzi&quot;,&quot;given&quot;:&quot;Alessandro&quot;,&quot;parse-names&quot;:false,&quot;dropping-particle&quot;:&quot;&quot;,&quot;non-dropping-particle&quot;:&quot;&quot;},{&quot;family&quot;:&quot;Guandalini&quot;,&quot;given&quot;:&quot;Giulio&quot;,&quot;parse-names&quot;:false,&quot;dropping-particle&quot;:&quot;&quot;,&quot;non-dropping-particle&quot;:&quot;&quot;},{&quot;family&quot;:&quot;Guffanti&quot;,&quot;given&quot;:&quot;Simone&quot;,&quot;parse-names&quot;:false,&quot;dropping-particle&quot;:&quot;&quot;,&quot;non-dropping-particle&quot;:&quot;&quot;},{&quot;family&quot;:&quot;Elsido&quot;,&quot;given&quot;:&quot;Cristina&quot;,&quot;parse-names&quot;:false,&quot;dropping-particle&quot;:&quot;&quot;,&quot;non-dropping-particle&quot;:&quot;&quot;},{&quot;family&quot;:&quot;Moioli&quot;,&quot;given&quot;:&quot;Stefania&quot;,&quot;parse-names&quot;:false,&quot;dropping-particle&quot;:&quot;&quot;,&quot;non-dropping-particle&quot;:&quot;&quot;},{&quot;family&quot;:&quot;Huttenhuis&quot;,&quot;given&quot;:&quot;Patrick&quot;,&quot;parse-names&quot;:false,&quot;dropping-particle&quot;:&quot;&quot;,&quot;non-dropping-particle&quot;:&quot;&quot;},{&quot;family&quot;:&quot;Rexwinkel&quot;,&quot;given&quot;:&quot;Glenn&quot;,&quot;parse-names&quot;:false,&quot;dropping-particle&quot;:&quot;&quot;,&quot;non-dropping-particle&quot;:&quot;&quot;},{&quot;family&quot;:&quot;Martelli&quot;,&quot;given&quot;:&quot;Emanuele&quot;,&quot;parse-names&quot;:false,&quot;dropping-particle&quot;:&quot;&quot;,&quot;non-dropping-particle&quot;:&quot;&quot;},{&quot;family&quot;:&quot;Groppi&quot;,&quot;given&quot;:&quot;Gianpiero&quot;,&quot;parse-names&quot;:false,&quot;dropping-particle&quot;:&quot;&quot;,&quot;non-dropping-particle&quot;:&quot;&quot;},{&quot;family&quot;:&quot;Romano&quot;,&quot;given&quot;:&quot;Matteo C.&quot;,&quot;parse-names&quot;:false,&quot;dropping-particle&quot;:&quot;&quot;,&quot;non-dropping-particle&quot;:&quot;&quot;}],&quot;container-title&quot;:&quot;Fuel&quot;,&quot;DOI&quot;:&quot;10.1016/j.fuel.2021.122113&quot;,&quot;ISSN&quot;:&quot;00162361&quot;,&quot;issued&quot;:{&quot;date-parts&quot;:[[2022,2]]},&quot;page&quot;:&quot;122113&quot;,&quot;volume&quot;:&quot;310&quot;,&quot;container-title-short&quot;:&quot;&quot;},&quot;isTemporary&quot;:false}]},{&quot;citationID&quot;:&quot;MENDELEY_CITATION_b7c42850-3893-430a-a91a-ba071b5a549f&quot;,&quot;properties&quot;:{&quot;noteIndex&quot;:0},&quot;isEdited&quot;:false,&quot;manualOverride&quot;:{&quot;isManuallyOverridden&quot;:false,&quot;citeprocText&quot;:&quot;[26]&quot;,&quot;manualOverrideText&quot;:&quot;&quot;},&quot;citationTag&quot;:&quot;MENDELEY_CITATION_v3_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&quot;,&quot;citationItems&quot;:[{&quot;id&quot;:&quot;31848458-a34e-370b-af77-81d1d893a1c5&quot;,&quot;itemData&quot;:{&quot;type&quot;:&quot;article-journal&quot;,&quot;id&quot;:&quot;31848458-a34e-370b-af77-81d1d893a1c5&quot;,&quot;title&quot;:&quot;Deep Reinforcement Learning Approaches the MILP Optimum of a Multi-Energy Optimization in Energy Communities&quot;,&quot;author&quot;:[{&quot;family&quot;:&quot;Vetter&quot;,&quot;given&quot;:&quot;Vinzent&quot;,&quot;parse-names&quot;:false,&quot;dropping-particle&quot;:&quot;&quot;,&quot;non-dropping-particle&quot;:&quot;&quot;},{&quot;family&quot;:&quot;Wohlgenannt&quot;,&quot;given&quot;:&quot;Philipp&quot;,&quot;parse-names&quot;:false,&quot;dropping-particle&quot;:&quot;&quot;,&quot;non-dropping-particle&quot;:&quot;&quot;},{&quot;family&quot;:&quot;Kepplinger&quot;,&quot;given&quot;:&quot;Peter&quot;,&quot;parse-names&quot;:false,&quot;dropping-particle&quot;:&quot;&quot;,&quot;non-dropping-particle&quot;:&quot;&quot;},{&quot;family&quot;:&quot;Eder&quot;,&quot;given&quot;:&quot;Elias&quot;,&quot;parse-names&quot;:false,&quot;dropping-particle&quot;:&quot;&quot;,&quot;non-dropping-particle&quot;:&quot;&quot;}],&quot;container-title&quot;:&quot;Energies&quot;,&quot;container-title-short&quot;:&quot;Energies (Basel).&quot;,&quot;DOI&quot;:&quot;10.3390/en18174489&quot;,&quot;ISSN&quot;:&quot;1996-1073&quot;,&quot;issued&quot;:{&quot;date-parts&quot;:[[2025,8,23]]},&quot;page&quot;:&quot;4489&quot;,&quot;abstract&quot;:&quot;&lt;p&gt;As energy systems transition toward high shares of variable renewable generation, local energy communities (ECs) are increasingly relevant for enabling demand-side flexibility and self-sufficiency. This shift is particularly evident in the residential sector, where the deployment of photovoltaic (PV) systems is rapidly growing. While mixed-integer linear programming (MILP) remains the standard for operational optimization and demand response in such systems, its computational burden limits scalability and responsiveness under real-time or uncertain conditions. Reinforcement learning (RL), by contrast, offers a model-free, adaptive alternative. However, its application to real-world energy system operation remains limited. This study explores the application of a Deep Q-Network (DQN) to a real residential EC, which has received limited attention in prior work. The system comprises three single-family homes sharing a centralized heating system with a thermal energy storage (TES), a PV installation, and a grid connection. We compare the performance of MILP and RL controllers across economic and environmental metrics. Relative to a reference scenario without TES, MILP and RL reduce energy costs by 10.06% and 8.78%, respectively, and both approaches yield lower total energy consumption and CO2-equivalent emissions. Notably, the trained RL agent achieves a near-optimal outcome while requiring only 22% of the MILP’s computation time. These results demonstrate that DQNs can offer a computationally efficient and practically viable alternative to MILP for real-time control in residential energy systems.&lt;/p&gt;&quot;,&quot;issue&quot;:&quot;17&quot;,&quot;volume&quot;:&quot;18&quot;},&quot;isTemporary&quot;:false}]},{&quot;citationID&quot;:&quot;MENDELEY_CITATION_03d18768-2530-4173-a512-ec7dc06e4ecc&quot;,&quot;properties&quot;:{&quot;noteIndex&quot;:0},&quot;isEdited&quot;:false,&quot;manualOverride&quot;:{&quot;isManuallyOverridden&quot;:false,&quot;citeprocText&quot;:&quot;[27]&quot;,&quot;manualOverrideText&quot;:&quot;&quot;},&quot;citationTag&quot;:&quot;MENDELEY_CITATION_v3_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&quot;,&quot;citationItems&quot;:[{&quot;id&quot;:&quot;185586bd-ce77-3f7d-ae64-0f509db4cf05&quot;,&quot;itemData&quot;:{&quot;type&quot;:&quot;article-journal&quot;,&quot;id&quot;:&quot;185586bd-ce77-3f7d-ae64-0f509db4cf05&quot;,&quot;title&quot;:&quot;Energy Demand Response in a Food-Processing Plant: A Deep Reinforcement Learning Approach&quot;,&quot;author&quot;:[{&quot;family&quot;:&quot;Wohlgenannt&quot;,&quot;given&quot;:&quot;Philipp&quot;,&quot;parse-names&quot;:false,&quot;dropping-particle&quot;:&quot;&quot;,&quot;non-dropping-particle&quot;:&quot;&quot;},{&quot;family&quot;:&quot;Hegenbart&quot;,&quot;given&quot;:&quot;Sebastian&quot;,&quot;parse-names&quot;:false,&quot;dropping-particle&quot;:&quot;&quot;,&quot;non-dropping-particle&quot;:&quot;&quot;},{&quot;family&quot;:&quot;Eder&quot;,&quot;given&quot;:&quot;Elias&quot;,&quot;parse-names&quot;:false,&quot;dropping-particle&quot;:&quot;&quot;,&quot;non-dropping-particle&quot;:&quot;&quot;},{&quot;family&quot;:&quot;Kolhe&quot;,&quot;given&quot;:&quot;Mohan&quot;,&quot;parse-names&quot;:false,&quot;dropping-particle&quot;:&quot;&quot;,&quot;non-dropping-particle&quot;:&quot;&quot;},{&quot;family&quot;:&quot;Kepplinger&quot;,&quot;given&quot;:&quot;Peter&quot;,&quot;parse-names&quot;:false,&quot;dropping-particle&quot;:&quot;&quot;,&quot;non-dropping-particle&quot;:&quot;&quot;}],&quot;container-title&quot;:&quot;Energies&quot;,&quot;DOI&quot;:&quot;10.3390/en17246430&quot;,&quot;ISSN&quot;:&quot;1996-1073&quot;,&quot;issued&quot;:{&quot;date-parts&quot;:[[2024,12,20]]},&quot;page&quot;:&quot;6430&quot;,&quot;abstract&quot;:&quot;&lt;p&gt;The food industry faces significant challenges in managing operational costs due to its high energy intensity and rising energy prices. Industrial food-processing facilities, with substantial thermal capacities and large demands for cooling and heating, offer promising opportunities for demand response (DR) strategies. This study explores the application of deep reinforcement learning (RL) as an innovative, data-driven approach for DR in the food industry. By leveraging the adaptive, self-learning capabilities of RL, energy costs in the investigated plant are effectively decreased. The RL algorithm was compared with the well-established optimization method Mixed Integer Linear Programming (MILP), and both were benchmarked against a reference scenario without DR. The two optimization strategies demonstrate cost savings of 17.57% and 18.65% for RL and MILP, respectively. Although RL is slightly less efficient in cost reduction, it significantly outperforms in computational speed, being approximately 20 times faster. During operation, RL only needs 2ms per optimization compared to 19s for MILP, making it a promising optimization tool for edge computing. Moreover, while MILP’s computation time increases considerably with the number of binary variables, RL efficiently learns dynamic system behavior and scales to more complex systems without significant performance degradation. These results highlight that deep RL, when applied to DR, offers substantial cost savings and computational efficiency, with broad applicability to energy management in various applications.&lt;/p&gt;&quot;,&quot;issue&quot;:&quot;24&quot;,&quot;volume&quot;:&quot;17&quot;,&quot;container-title-short&quot;:&quot;Energies (Basel).&quot;},&quot;isTemporary&quot;:false}]},{&quot;citationID&quot;:&quot;MENDELEY_CITATION_d0ae8956-c2f2-4f72-9054-a8ca53b2504b&quot;,&quot;properties&quot;:{&quot;noteIndex&quot;:0},&quot;isEdited&quot;:false,&quot;manualOverride&quot;:{&quot;isManuallyOverridden&quot;:false,&quot;citeprocText&quot;:&quot;[28]&quot;,&quot;manualOverrideText&quot;:&quot;&quot;},&quot;citationTag&quot;:&quot;MENDELEY_CITATION_v3_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&quot;,&quot;citationItems&quot;:[{&quot;id&quot;:&quot;b510e037-8e3e-36b2-9b7f-53d097c80a2d&quot;,&quot;itemData&quot;:{&quot;type&quot;:&quot;article-journal&quot;,&quot;id&quot;:&quot;b510e037-8e3e-36b2-9b7f-53d097c80a2d&quot;,&quot;title&quot;:&quot;A comprehensive review on optimization of hybrid renewable energy systems using various optimization techniques&quot;,&quot;author&quot;:[{&quot;family&quot;:&quot;Thirunavukkarasu&quot;,&quot;given&quot;:&quot;M.&quot;,&quot;parse-names&quot;:false,&quot;dropping-particle&quot;:&quot;&quot;,&quot;non-dropping-particle&quot;:&quot;&quot;},{&quot;family&quot;:&quot;Sawle&quot;,&quot;given&quot;:&quot;Yashwant&quot;,&quot;parse-names&quot;:false,&quot;dropping-particle&quot;:&quot;&quot;,&quot;non-dropping-particle&quot;:&quot;&quot;},{&quot;family&quot;:&quot;Lala&quot;,&quot;given&quot;:&quot;Himadri&quot;,&quot;parse-names&quot;:false,&quot;dropping-particle&quot;:&quot;&quot;,&quot;non-dropping-particle&quot;:&quot;&quot;}],&quot;container-title&quot;:&quot;Renewable and Sustainable Energy Reviews&quot;,&quot;DOI&quot;:&quot;10.1016/j.rser.2023.113192&quot;,&quot;ISSN&quot;:&quot;13640321&quot;,&quot;issued&quot;:{&quot;date-parts&quot;:[[2023,4]]},&quot;page&quot;:&quot;113192&quot;,&quot;volume&quot;:&quot;176&quot;,&quot;container-title-short&quot;:&quot;&quot;},&quot;isTemporary&quot;:false}]},{&quot;citationID&quot;:&quot;MENDELEY_CITATION_b63a1021-7346-498d-adf3-73382c63a827&quot;,&quot;properties&quot;:{&quot;noteIndex&quot;:0},&quot;isEdited&quot;:false,&quot;manualOverride&quot;:{&quot;isManuallyOverridden&quot;:false,&quot;citeprocText&quot;:&quot;[29]&quot;,&quot;manualOverrideText&quot;:&quot;&quot;},&quot;citationTag&quot;:&quot;MENDELEY_CITATION_v3_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&quot;,&quot;citationItems&quot;:[{&quot;id&quot;:&quot;0f89bf4c-80d3-3ce8-8c18-b8917957c10b&quot;,&quot;itemData&quot;:{&quot;type&quot;:&quot;article-journal&quot;,&quot;id&quot;:&quot;0f89bf4c-80d3-3ce8-8c18-b8917957c10b&quot;,&quot;title&quot;:&quot;Optimal energy system scheduling using a constraint-aware reinforcement learning algorithm&quot;,&quot;author&quot;:[{&quot;family&quot;:&quot;Shengren&quot;,&quot;given&quot;:&quot;Hou&quot;,&quot;parse-names&quot;:false,&quot;dropping-particle&quot;:&quot;&quot;,&quot;non-dropping-particle&quot;:&quot;&quot;},{&quot;family&quot;:&quot;Vergara&quot;,&quot;given&quot;:&quot;Pedro P.&quot;,&quot;parse-names&quot;:false,&quot;dropping-particle&quot;:&quot;&quot;,&quot;non-dropping-particle&quot;:&quot;&quot;},{&quot;family&quot;:&quot;Salazar Duque&quot;,&quot;given&quot;:&quot;Edgar Mauricio&quot;,&quot;parse-names&quot;:false,&quot;dropping-particle&quot;:&quot;&quot;,&quot;non-dropping-particle&quot;:&quot;&quot;},{&quot;family&quot;:&quot;Palensky&quot;,&quot;given&quot;:&quot;Peter&quot;,&quot;parse-names&quot;:false,&quot;dropping-particle&quot;:&quot;&quot;,&quot;non-dropping-particle&quot;:&quot;&quot;}],&quot;container-title&quot;:&quot;International Journal of Electrical Power &amp; Energy Systems&quot;,&quot;DOI&quot;:&quot;10.1016/j.ijepes.2023.109230&quot;,&quot;ISSN&quot;:&quot;01420615&quot;,&quot;issued&quot;:{&quot;date-parts&quot;:[[2023,10]]},&quot;page&quot;:&quot;109230&quot;,&quot;volume&quot;:&quot;152&quot;,&quot;container-title-short&quot;:&quot;&quot;},&quot;isTemporary&quot;:false}]},{&quot;citationID&quot;:&quot;MENDELEY_CITATION_6d8a7862-c0c2-4c71-b5ea-7e17817e262d&quot;,&quot;properties&quot;:{&quot;noteIndex&quot;:0},&quot;isEdited&quot;:false,&quot;manualOverride&quot;:{&quot;isManuallyOverridden&quot;:false,&quot;citeprocText&quot;:&quot;[30]&quot;,&quot;manualOverrideText&quot;:&quot;&quot;},&quot;citationTag&quot;:&quot;MENDELEY_CITATION_v3_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&quot;,&quot;citationItems&quot;:[{&quot;id&quot;:&quot;32d54ec3-73fd-3a7d-a2b9-efadea2d2319&quot;,&quot;itemData&quot;:{&quot;type&quot;:&quot;article-journal&quot;,&quot;id&quot;:&quot;32d54ec3-73fd-3a7d-a2b9-efadea2d2319&quot;,&quot;title&quot;:&quot;A Review on Multi-Objective Mixed-Integer Non-Linear Optimization Programming Methods&quot;,&quot;author&quot;:[{&quot;family&quot;:&quot;Jaber&quot;,&quot;given&quot;:&quot;Ahmed&quot;,&quot;parse-names&quot;:false,&quot;dropping-particle&quot;:&quot;&quot;,&quot;non-dropping-particle&quot;:&quot;&quot;},{&quot;family&quot;:&quot;Younes&quot;,&quot;given&quot;:&quot;Rafic&quot;,&quot;parse-names&quot;:false,&quot;dropping-particle&quot;:&quot;&quot;,&quot;non-dropping-particle&quot;:&quot;&quot;},{&quot;family&quot;:&quot;Lafon&quot;,&quot;given&quot;:&quot;Pascal&quot;,&quot;parse-names&quot;:false,&quot;dropping-particle&quot;:&quot;&quot;,&quot;non-dropping-particle&quot;:&quot;&quot;},{&quot;family&quot;:&quot;Khoder&quot;,&quot;given&quot;:&quot;Jihan&quot;,&quot;parse-names&quot;:false,&quot;dropping-particle&quot;:&quot;&quot;,&quot;non-dropping-particle&quot;:&quot;&quot;}],&quot;container-title&quot;:&quot;Eng&quot;,&quot;DOI&quot;:&quot;10.3390/eng5030104&quot;,&quot;ISSN&quot;:&quot;2673-4117&quot;,&quot;issued&quot;:{&quot;date-parts&quot;:[[2024,8,17]]},&quot;page&quot;:&quot;1961-1979&quot;,&quot;abstract&quot;:&quot;&lt;p&gt;This paper provides a recent overview of the exact, approximate, and hybrid optimization methods that handle Multi-Objective Mixed-Integer Non-Linear Programming (MO-MINLP) problems. Both the domains of exact and approximate research have experienced significant growth, driven by their shared goal of addressing a wide range of real-world problems. This work presents a comprehensive literature review that highlights the significant theoretical contributions in the field of hybrid approaches between these research areas. We also point out possible research gaps in the literature. Hence, the main research questions to be answered in this paper involve the following: (1) how to exactly or approximately solve a MO-MINLP problem? (2) What are the drawbacks of exact methods as well as approximate methods? (3) What are the research lines that are currently underway to enhance the performances of these methods? and (4) Where are the research gaps in this field? This work aims to provide enough descriptive information for newcomers in this area about the research that has been carried out and that is currently underway concerning exact, approximate, and hybrid methods used to solve MO-MINLP problems.&lt;/p&gt;&quot;,&quot;issue&quot;:&quot;3&quot;,&quot;volume&quot;:&quot;5&quot;,&quot;container-title-short&quot;:&quot;&quot;},&quot;isTemporary&quot;:false}]},{&quot;citationID&quot;:&quot;MENDELEY_CITATION_43edfd88-7e00-44e3-af12-138762045627&quot;,&quot;properties&quot;:{&quot;noteIndex&quot;:0},&quot;isEdited&quot;:false,&quot;manualOverride&quot;:{&quot;isManuallyOverridden&quot;:false,&quot;citeprocText&quot;:&quot;[31]&quot;,&quot;manualOverrideText&quot;:&quot;&quot;},&quot;citationTag&quot;:&quot;MENDELEY_CITATION_v3_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&quot;,&quot;citationItems&quot;:[{&quot;id&quot;:&quot;3491985c-2e0b-31bc-84e8-6823f88df629&quot;,&quot;itemData&quot;:{&quot;type&quot;:&quot;article-journal&quot;,&quot;id&quot;:&quot;3491985c-2e0b-31bc-84e8-6823f88df629&quot;,&quot;title&quot;:&quot;Multi-objective stochastic optimization problem: a systematic literature review&quot;,&quot;author&quot;:[{&quot;family&quot;:&quot;Pirouz&quot;,&quot;given&quot;:&quot;Behzad&quot;,&quot;parse-names&quot;:false,&quot;dropping-particle&quot;:&quot;&quot;,&quot;non-dropping-particle&quot;:&quot;&quot;},{&quot;family&quot;:&quot;Guerriero&quot;,&quot;given&quot;:&quot;Francesca&quot;,&quot;parse-names&quot;:false,&quot;dropping-particle&quot;:&quot;&quot;,&quot;non-dropping-particle&quot;:&quot;&quot;}],&quot;container-title&quot;:&quot;Applied Energy&quot;,&quot;DOI&quot;:&quot;10.1016/j.apenergy.2025.127237&quot;,&quot;ISSN&quot;:&quot;03062619&quot;,&quot;issued&quot;:{&quot;date-parts&quot;:[[2026,2]]},&quot;page&quot;:&quot;127237&quot;,&quot;volume&quot;:&quot;405&quot;,&quot;container-title-short&quot;:&quot;Appl. Energy&quot;},&quot;isTemporary&quot;:false}]},{&quot;citationID&quot;:&quot;MENDELEY_CITATION_b6249101-b808-40c8-a033-78980999aeb7&quot;,&quot;properties&quot;:{&quot;noteIndex&quot;:0},&quot;isEdited&quot;:false,&quot;manualOverride&quot;:{&quot;isManuallyOverridden&quot;:false,&quot;citeprocText&quot;:&quot;[32]&quot;,&quot;manualOverrideText&quot;:&quot;&quot;},&quot;citationTag&quot;:&quot;MENDELEY_CITATION_v3_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&quot;,&quot;citationItems&quot;:[{&quot;id&quot;:&quot;54e38a01-fa83-3801-a318-6f19e94cb79c&quot;,&quot;itemData&quot;:{&quot;type&quot;:&quot;article-journal&quot;,&quot;id&quot;:&quot;54e38a01-fa83-3801-a318-6f19e94cb79c&quot;,&quot;title&quot;:&quot;A review on recent standalone and grid integrated hybrid renewable energy systems: System optimization and energy management strategies&quot;,&quot;author&quot;:[{&quot;family&quot;:&quot;Basnet&quot;,&quot;given&quot;:&quot;Sarad&quot;,&quot;parse-names&quot;:false,&quot;dropping-particle&quot;:&quot;&quot;,&quot;non-dropping-particle&quot;:&quot;&quot;},{&quot;family&quot;:&quot;Deschinkel&quot;,&quot;given&quot;:&quot;Karine&quot;,&quot;parse-names&quot;:false,&quot;dropping-particle&quot;:&quot;&quot;,&quot;non-dropping-particle&quot;:&quot;&quot;},{&quot;family&quot;:&quot;Moyne&quot;,&quot;given&quot;:&quot;Luis&quot;,&quot;parse-names&quot;:false,&quot;dropping-particle&quot;:&quot;&quot;,&quot;non-dropping-particle&quot;:&quot;Le&quot;},{&quot;family&quot;:&quot;Cécile Péra&quot;,&quot;given&quot;:&quot;Marie&quot;,&quot;parse-names&quot;:false,&quot;dropping-particle&quot;:&quot;&quot;,&quot;non-dropping-particle&quot;:&quot;&quot;}],&quot;container-title&quot;:&quot;Renewable Energy Focus&quot;,&quot;DOI&quot;:&quot;10.1016/j.ref.2023.06.001&quot;,&quot;ISSN&quot;:&quot;17550084&quot;,&quot;issued&quot;:{&quot;date-parts&quot;:[[2023,9]]},&quot;page&quot;:&quot;103-125&quot;,&quot;volume&quot;:&quot;46&quot;,&quot;container-title-short&quot;:&quot;&quot;},&quot;isTemporary&quot;:false}]},{&quot;citationID&quot;:&quot;MENDELEY_CITATION_9c9f6d6b-0d28-4cda-88a9-65954fd94b49&quot;,&quot;properties&quot;:{&quot;noteIndex&quot;:0},&quot;isEdited&quot;:false,&quot;manualOverride&quot;:{&quot;isManuallyOverridden&quot;:false,&quot;citeprocText&quot;:&quot;[33]&quot;,&quot;manualOverrideText&quot;:&quot;&quot;},&quot;citationTag&quot;:&quot;MENDELEY_CITATION_v3_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&quot;,&quot;citationItems&quot;:[{&quot;id&quot;:&quot;a7dd1c28-2105-373b-8623-5d74e7cdc012&quot;,&quot;itemData&quot;:{&quot;type&quot;:&quot;article-journal&quot;,&quot;id&quot;:&quot;a7dd1c28-2105-373b-8623-5d74e7cdc012&quot;,&quot;title&quot;:&quot;A Survey on Mixed-Integer Programming Techniques in Bilevel Optimization&quot;,&quot;author&quot;:[{&quot;family&quot;:&quot;Kleinert&quot;,&quot;given&quot;:&quot;Thomas&quot;,&quot;parse-names&quot;:false,&quot;dropping-particle&quot;:&quot;&quot;,&quot;non-dropping-particle&quot;:&quot;&quot;},{&quot;family&quot;:&quot;Labbé&quot;,&quot;given&quot;:&quot;Martine&quot;,&quot;parse-names&quot;:false,&quot;dropping-particle&quot;:&quot;&quot;,&quot;non-dropping-particle&quot;:&quot;&quot;},{&quot;family&quot;:&quot;Ljubić&quot;,&quot;given&quot;:&quot;Ivana&quot;,&quot;parse-names&quot;:false,&quot;dropping-particle&quot;:&quot;&quot;,&quot;non-dropping-particle&quot;:&quot;&quot;},{&quot;family&quot;:&quot;Schmidt&quot;,&quot;given&quot;:&quot;Martin&quot;,&quot;parse-names&quot;:false,&quot;dropping-particle&quot;:&quot;&quot;,&quot;non-dropping-particle&quot;:&quot;&quot;}],&quot;container-title&quot;:&quot;EURO Journal on Computational Optimization&quot;,&quot;DOI&quot;:&quot;10.1016/j.ejco.2021.100007&quot;,&quot;ISSN&quot;:&quot;21924406&quot;,&quot;issued&quot;:{&quot;date-parts&quot;:[[2021]]},&quot;page&quot;:&quot;100007&quot;,&quot;volume&quot;:&quot;9&quot;,&quot;container-title-short&quot;:&quot;&quot;},&quot;isTemporary&quot;:false}]},{&quot;citationID&quot;:&quot;MENDELEY_CITATION_33ef091a-ded0-4a74-8b85-848522b9880f&quot;,&quot;properties&quot;:{&quot;noteIndex&quot;:0},&quot;isEdited&quot;:false,&quot;manualOverride&quot;:{&quot;isManuallyOverridden&quot;:false,&quot;citeprocText&quot;:&quot;[32], [33], [34], [35]&quot;,&quot;manualOverrideText&quot;:&quot;&quot;},&quot;citationTag&quot;:&quot;MENDELEY_CITATION_v3_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&quot;,&quot;citationItems&quot;:[{&quot;id&quot;:&quot;f5b03336-6a29-3705-ac39-a115ab7d476b&quot;,&quot;itemData&quot;:{&quot;type&quot;:&quot;article-journal&quot;,&quot;id&quot;:&quot;f5b03336-6a29-3705-ac39-a115ab7d476b&quot;,&quot;title&quot;:&quot;Recent advances in mathematical programming techniques for the optimization of process systems under uncertainty&quot;,&quot;author&quot;:[{&quot;family&quot;:&quot;Grossmann&quot;,&quot;given&quot;:&quot;Ignacio E.&quot;,&quot;parse-names&quot;:false,&quot;dropping-particle&quot;:&quot;&quot;,&quot;non-dropping-particle&quot;:&quot;&quot;},{&quot;family&quot;:&quot;Apap&quot;,&quot;given&quot;:&quot;Robert M.&quot;,&quot;parse-names&quot;:false,&quot;dropping-particle&quot;:&quot;&quot;,&quot;non-dropping-particle&quot;:&quot;&quot;},{&quot;family&quot;:&quot;Calfa&quot;,&quot;given&quot;:&quot;Bruno A.&quot;,&quot;parse-names&quot;:false,&quot;dropping-particle&quot;:&quot;&quot;,&quot;non-dropping-particle&quot;:&quot;&quot;},{&quot;family&quot;:&quot;García-Herreros&quot;,&quot;given&quot;:&quot;Pablo&quot;,&quot;parse-names&quot;:false,&quot;dropping-particle&quot;:&quot;&quot;,&quot;non-dropping-particle&quot;:&quot;&quot;},{&quot;family&quot;:&quot;Zhang&quot;,&quot;given&quot;:&quot;Qi&quot;,&quot;parse-names&quot;:false,&quot;dropping-particle&quot;:&quot;&quot;,&quot;non-dropping-particle&quot;:&quot;&quot;}],&quot;container-title&quot;:&quot;Computers &amp; Chemical Engineering&quot;,&quot;DOI&quot;:&quot;10.1016/j.compchemeng.2016.03.002&quot;,&quot;ISSN&quot;:&quot;00981354&quot;,&quot;issued&quot;:{&quot;date-parts&quot;:[[2016,8]]},&quot;page&quot;:&quot;3-14&quot;,&quot;volume&quot;:&quot;91&quot;,&quot;container-title-short&quot;:&quot;Comput. Chem. Eng.&quot;},&quot;isTemporary&quot;:false},{&quot;id&quot;:&quot;1c837bc1-1688-320b-9cef-676437130233&quot;,&quot;itemData&quot;:{&quot;type&quot;:&quot;article-journal&quot;,&quot;id&quot;:&quot;1c837bc1-1688-320b-9cef-676437130233&quot;,&quot;title&quot;:&quot;A Review of Stochastic Programming Methods for Optimization of Process Systems Under Uncertainty&quot;,&quot;author&quot;:[{&quot;family&quot;:&quot;Li&quot;,&quot;given&quot;:&quot;Can&quot;,&quot;parse-names&quot;:false,&quot;dropping-particle&quot;:&quot;&quot;,&quot;non-dropping-particle&quot;:&quot;&quot;},{&quot;family&quot;:&quot;Grossmann&quot;,&quot;given&quot;:&quot;Ignacio E.&quot;,&quot;parse-names&quot;:false,&quot;dropping-particle&quot;:&quot;&quot;,&quot;non-dropping-particle&quot;:&quot;&quot;}],&quot;container-title&quot;:&quot;Frontiers in Chemical Engineering&quot;,&quot;DOI&quot;:&quot;10.3389/fceng.2020.622241&quot;,&quot;ISSN&quot;:&quot;2673-2718&quot;,&quot;issued&quot;:{&quot;date-parts&quot;:[[2021,1,28]]},&quot;abstract&quot;:&quot;&lt;p&gt;Uncertainties are widespread in the optimization of process systems, such as uncertainties in process technologies, prices, and customer demands. In this paper, we review the basic concepts and recent advances of a risk-neutral mathematical framework called “stochastic programming” and its applications in solving process systems engineering problems under uncertainty. This review intends to provide both a tutorial for beginners without prior experience and a high-level overview of the current state-of-the-art developments for experts in process systems engineering and stochastic programming. The mathematical formulations and algorithms for two-stage and multistage stochastic programming are reviewed with illustrative examples from process industries. The differences between stochastic programming under exogenous uncertainty and endogenous uncertainties are discussed. The concepts and several data-driven methods for generating scenario trees are also reviewed.&lt;/p&gt;&quot;,&quot;volume&quot;:&quot;2&quot;,&quot;container-title-short&quot;:&quot;&quot;},&quot;isTemporary&quot;:false},{&quot;id&quot;:&quot;a7dd1c28-2105-373b-8623-5d74e7cdc012&quot;,&quot;itemData&quot;:{&quot;type&quot;:&quot;article-journal&quot;,&quot;id&quot;:&quot;a7dd1c28-2105-373b-8623-5d74e7cdc012&quot;,&quot;title&quot;:&quot;A Survey on Mixed-Integer Programming Techniques in Bilevel Optimization&quot;,&quot;author&quot;:[{&quot;family&quot;:&quot;Kleinert&quot;,&quot;given&quot;:&quot;Thomas&quot;,&quot;parse-names&quot;:false,&quot;dropping-particle&quot;:&quot;&quot;,&quot;non-dropping-particle&quot;:&quot;&quot;},{&quot;family&quot;:&quot;Labbé&quot;,&quot;given&quot;:&quot;Martine&quot;,&quot;parse-names&quot;:false,&quot;dropping-particle&quot;:&quot;&quot;,&quot;non-dropping-particle&quot;:&quot;&quot;},{&quot;family&quot;:&quot;Ljubić&quot;,&quot;given&quot;:&quot;Ivana&quot;,&quot;parse-names&quot;:false,&quot;dropping-particle&quot;:&quot;&quot;,&quot;non-dropping-particle&quot;:&quot;&quot;},{&quot;family&quot;:&quot;Schmidt&quot;,&quot;given&quot;:&quot;Martin&quot;,&quot;parse-names&quot;:false,&quot;dropping-particle&quot;:&quot;&quot;,&quot;non-dropping-particle&quot;:&quot;&quot;}],&quot;container-title&quot;:&quot;EURO Journal on Computational Optimization&quot;,&quot;DOI&quot;:&quot;10.1016/j.ejco.2021.100007&quot;,&quot;ISSN&quot;:&quot;21924406&quot;,&quot;issued&quot;:{&quot;date-parts&quot;:[[2021]]},&quot;page&quot;:&quot;100007&quot;,&quot;volume&quot;:&quot;9&quot;,&quot;container-title-short&quot;:&quot;&quot;},&quot;isTemporary&quot;:false},{&quot;id&quot;:&quot;54e38a01-fa83-3801-a318-6f19e94cb79c&quot;,&quot;itemData&quot;:{&quot;type&quot;:&quot;article-journal&quot;,&quot;id&quot;:&quot;54e38a01-fa83-3801-a318-6f19e94cb79c&quot;,&quot;title&quot;:&quot;A review on recent standalone and grid integrated hybrid renewable energy systems: System optimization and energy management strategies&quot;,&quot;author&quot;:[{&quot;family&quot;:&quot;Basnet&quot;,&quot;given&quot;:&quot;Sarad&quot;,&quot;parse-names&quot;:false,&quot;dropping-particle&quot;:&quot;&quot;,&quot;non-dropping-particle&quot;:&quot;&quot;},{&quot;family&quot;:&quot;Deschinkel&quot;,&quot;given&quot;:&quot;Karine&quot;,&quot;parse-names&quot;:false,&quot;dropping-particle&quot;:&quot;&quot;,&quot;non-dropping-particle&quot;:&quot;&quot;},{&quot;family&quot;:&quot;Moyne&quot;,&quot;given&quot;:&quot;Luis&quot;,&quot;parse-names&quot;:false,&quot;dropping-particle&quot;:&quot;&quot;,&quot;non-dropping-particle&quot;:&quot;Le&quot;},{&quot;family&quot;:&quot;Cécile Péra&quot;,&quot;given&quot;:&quot;Marie&quot;,&quot;parse-names&quot;:false,&quot;dropping-particle&quot;:&quot;&quot;,&quot;non-dropping-particle&quot;:&quot;&quot;}],&quot;container-title&quot;:&quot;Renewable Energy Focus&quot;,&quot;DOI&quot;:&quot;10.1016/j.ref.2023.06.001&quot;,&quot;ISSN&quot;:&quot;17550084&quot;,&quot;issued&quot;:{&quot;date-parts&quot;:[[2023,9]]},&quot;page&quot;:&quot;103-125&quot;,&quot;volume&quot;:&quot;46&quot;,&quot;container-title-short&quot;:&quot;&quot;},&quot;isTemporary&quot;:false}]},{&quot;citationID&quot;:&quot;MENDELEY_CITATION_4a4c6769-de4f-4723-ad1a-7b324cf3f736&quot;,&quot;properties&quot;:{&quot;noteIndex&quot;:0},&quot;isEdited&quot;:false,&quot;manualOverride&quot;:{&quot;isManuallyOverridden&quot;:false,&quot;citeprocText&quot;:&quot;[36]&quot;,&quot;manualOverrideText&quot;:&quot;&quot;},&quot;citationTag&quot;:&quot;MENDELEY_CITATION_v3_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&quot;,&quot;citationItems&quot;:[{&quot;id&quot;:&quot;657631e7-7854-321d-9660-90161531164b&quot;,&quot;itemData&quot;:{&quot;type&quot;:&quot;article-journal&quot;,&quot;id&quot;:&quot;657631e7-7854-321d-9660-90161531164b&quot;,&quot;title&quot;:&quot;Integrating multi-objective superstructure optimization and multi-criteria assessment: a novel methodology for sustainable process design&quot;,&quot;author&quot;:[{&quot;family&quot;:&quot;Kenkel&quot;,&quot;given&quot;:&quot;Philipp&quot;,&quot;parse-names&quot;:false,&quot;dropping-particle&quot;:&quot;&quot;,&quot;non-dropping-particle&quot;:&quot;&quot;},{&quot;family&quot;:&quot;Schnuelle&quot;,&quot;given&quot;:&quot;Christian&quot;,&quot;parse-names&quot;:false,&quot;dropping-particle&quot;:&quot;&quot;,&quot;non-dropping-particle&quot;:&quot;&quot;},{&quot;family&quot;:&quot;Wassermann&quot;,&quot;given&quot;:&quot;Timo&quot;,&quot;parse-names&quot;:false,&quot;dropping-particle&quot;:&quot;&quot;,&quot;non-dropping-particle&quot;:&quot;&quot;},{&quot;family&quot;:&quot;Zondervan&quot;,&quot;given&quot;:&quot;Edwin&quot;,&quot;parse-names&quot;:false,&quot;dropping-particle&quot;:&quot;&quot;,&quot;non-dropping-particle&quot;:&quot;&quot;}],&quot;container-title&quot;:&quot;Physical Sciences Reviews&quot;,&quot;DOI&quot;:&quot;10.1515/psr-2020-0058&quot;,&quot;ISSN&quot;:&quot;2365-659X&quot;,&quot;issued&quot;:{&quot;date-parts&quot;:[[2023,9,25]]},&quot;page&quot;:&quot;2361-2394&quot;,&quot;abstract&quot;:&quot;&lt;p&gt; This work presents a novel methodology for integrated multi-objective superstructure optimization and multi-criteria assessment. The method is tailored for sustainable process synthesis utilizing mixed-integer linear programming (MILP). The six-step algorithm includes 1) superstructure formulation, 2) criteria definition and implementation, 3) criteria weighting, 4) single-criterion optimization, 5) reformulation and 6) multi-criteria optimization. It is automated in the &lt;bold&gt; &lt;italic&gt;O&lt;/italic&gt; &lt;/bold&gt; &lt;italic&gt;pen s&lt;/italic&gt; &lt;bold&gt; &lt;italic&gt;U&lt;/italic&gt; &lt;/bold&gt; &lt;italic&gt;perstruc&lt;/italic&gt; &lt;bold&gt; &lt;italic&gt;T&lt;/italic&gt; &lt;/bold&gt; &lt;italic&gt;ure mo&lt;/italic&gt; &lt;bold&gt; &lt;italic&gt;D&lt;/italic&gt; &lt;/bold&gt; &lt;italic&gt;eling and&lt;/italic&gt; &lt;bold&gt; &lt;italic&gt;O&lt;/italic&gt; &lt;/bold&gt; &lt;italic&gt;ptimizati&lt;/italic&gt; &lt;bold&gt; &lt;italic&gt;O&lt;/italic&gt; &lt;/bold&gt; &lt;italic&gt;n f&lt;/italic&gt; &lt;bold&gt; &lt;italic&gt;R&lt;/italic&gt; &lt;/bold&gt; &lt;italic&gt;amework&lt;/italic&gt; (OUTDOOR) and tested on integrated power-to-X and biomass-to-X processes for methanol production. Three criteria are considered, namely net production costs ( &lt;italic&gt;NPC&lt;/italic&gt; ), net production greenhouse gas emissions ( &lt;italic&gt;NPE&lt;/italic&gt; ) and net production fresh water demand ( &lt;italic&gt;NPFWD&lt;/italic&gt; ). The optimization indicates &lt;italic&gt;NPC&lt;/italic&gt; of 1307 €/t &lt;sub&gt;MeOH&lt;/sub&gt; with &lt;italic&gt;NPE&lt;/italic&gt; of −2.23 &lt;inline-formula id=\&quot;j_psr-2020-0058_ineq_001\&quot;&gt; &lt;alternatives&gt; &lt;math&gt; &lt;mrow&gt; &lt;msub&gt; &lt;mtext&gt;t&lt;/mtext&gt; &lt;msub&gt; &lt;mtext&gt;CO&lt;/mtext&gt; &lt;mn&gt;2&lt;/mn&gt; &lt;/msub&gt; &lt;/msub&gt; &lt;mo&gt;/&lt;/mo&gt; &lt;msub&gt; &lt;mtext&gt;t&lt;/mtext&gt; &lt;mtext&gt;MeOH&lt;/mtext&gt; &lt;/msub&gt; &lt;/mrow&gt; &lt;/math&gt; &lt;tex-math&gt;${\\text{t}}_{{\\text{CO}}_{2}}/{\\text{t}}_{\\text{MeOH}}$&lt;/tex-math&gt; &lt;inline-graphic href=\&quot;graphic/j_psr-2020-0058_ineq_001.png\&quot;/&gt; &lt;/alternatives&gt; &lt;/inline-formula&gt; and &lt;italic&gt;NPFWD&lt;/italic&gt; of −3.42 &lt;inline-formula id=\&quot;j_psr-2020-0058_ineq_002\&quot;&gt; &lt;alternatives&gt; &lt;math&gt; &lt;mrow&gt; &lt;msub&gt; &lt;mtext&gt;t&lt;/mtext&gt; &lt;mrow&gt; &lt;msub&gt; &lt;mtext&gt;H&lt;/mtext&gt; &lt;mn&gt;2&lt;/mn&gt; &lt;/msub&gt; &lt;mtext&gt;O&lt;/mtext&gt; &lt;/mrow&gt; &lt;/msub&gt; &lt;mo&gt;/&lt;/mo&gt; &lt;msub&gt; &lt;mtext&gt;t&lt;/mtext&gt; &lt;mtext&gt;MeOH&lt;/mtext&gt; &lt;/msub&gt; &lt;/mrow&gt; &lt;/math&gt; &lt;tex-math&gt;${\\text{t}}_{{\\text{H}}_{2}\\text{O}}/{\\text{t}}_{\\text{MeOH}}$&lt;/tex-math&gt; &lt;inline-graphic href=\&quot;graphic/j_psr-2020-0058_ineq_002.png\&quot;/&gt; &lt;/alternatives&gt; &lt;/inline-formula&gt; for an optimal trade-off plant. The plant configuration features low-pressure alkaline electrolysis for hydrogen supply, absorption-based CO &lt;sub&gt;2&lt;/sub&gt; capture and steam production from methanol purge gas for internal heat supply. Conducted variation and sensitivity analyses indicate that methanol costs can drop to about 500 €/t &lt;sub&gt;MeOH&lt;/sub&gt; if electricity is free of charge, or to 805 €/t &lt;sub&gt;MeOH&lt;/sub&gt; if biogas is available at large quantities, if a least-cost process layouts are considered. However, all performed multi-criteria analyses imply a robust optimal process design utilizing electricity-based methanol production. &lt;/p&gt;&quot;,&quot;issue&quot;:&quot;9&quot;,&quot;volume&quot;:&quot;8&quot;,&quot;container-title-short&quot;:&quot;&quot;},&quot;isTemporary&quot;:false}]},{&quot;citationID&quot;:&quot;MENDELEY_CITATION_17f6286c-8eea-4653-85d8-bedf5256b8a1&quot;,&quot;properties&quot;:{&quot;noteIndex&quot;:0},&quot;isEdited&quot;:false,&quot;manualOverride&quot;:{&quot;isManuallyOverridden&quot;:false,&quot;citeprocText&quot;:&quot;[37]&quot;,&quot;manualOverrideText&quot;:&quot;&quot;},&quot;citationTag&quot;:&quot;MENDELEY_CITATION_v3_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&quot;,&quot;citationItems&quot;:[{&quot;id&quot;:&quot;a94934b4-96b0-3079-8b75-f945ca40e652&quot;,&quot;itemData&quot;:{&quot;type&quot;:&quot;article-journal&quot;,&quot;id&quot;:&quot;a94934b4-96b0-3079-8b75-f945ca40e652&quot;,&quot;title&quot;:&quot;Multi-Objective Optimization of an Energy Community Powered by a Distributed Polygeneration System&quot;,&quot;author&quot;:[{&quot;family&quot;:&quot;Souza&quot;,&quot;given&quot;:&quot;Ronelly José&quot;,&quot;parse-names&quot;:false,&quot;dropping-particle&quot;:&quot;&quot;,&quot;non-dropping-particle&quot;:&quot;De&quot;},{&quot;family&quot;:&quot;Reini&quot;,&quot;given&quot;:&quot;Mauro&quot;,&quot;parse-names&quot;:false,&quot;dropping-particle&quot;:&quot;&quot;,&quot;non-dropping-particle&quot;:&quot;&quot;},{&quot;family&quot;:&quot;Serra&quot;,&quot;given&quot;:&quot;Luis M.&quot;,&quot;parse-names&quot;:false,&quot;dropping-particle&quot;:&quot;&quot;,&quot;non-dropping-particle&quot;:&quot;&quot;},{&quot;family&quot;:&quot;Lozano&quot;,&quot;given&quot;:&quot;Miguel A.&quot;,&quot;parse-names&quot;:false,&quot;dropping-particle&quot;:&quot;&quot;,&quot;non-dropping-particle&quot;:&quot;&quot;},{&quot;family&quot;:&quot;Nadalon&quot;,&quot;given&quot;:&quot;Emanuele&quot;,&quot;parse-names&quot;:false,&quot;dropping-particle&quot;:&quot;&quot;,&quot;non-dropping-particle&quot;:&quot;&quot;},{&quot;family&quot;:&quot;Casisi&quot;,&quot;given&quot;:&quot;Melchiorre&quot;,&quot;parse-names&quot;:false,&quot;dropping-particle&quot;:&quot;&quot;,&quot;non-dropping-particle&quot;:&quot;&quot;}],&quot;container-title&quot;:&quot;Energies&quot;,&quot;DOI&quot;:&quot;10.3390/en17133085&quot;,&quot;ISSN&quot;:&quot;1996-1073&quot;,&quot;issued&quot;:{&quot;date-parts&quot;:[[2024,6,22]]},&quot;page&quot;:&quot;3085&quot;,&quot;abstract&quot;:&quot;&lt;p&gt;This paper presents a multi-objective optimization model for the integration of polygeneration systems into energy communities (ECs), by analyzing a case study. The concept of ECs is increasingly seen as beneficial for reducing global energy consumption and greenhouse gas emissions. Polygeneration systems have the potential to play a crucial role in this context, since they are known for producing multiple energy services from a single energy resource, besides the possibility of being fed also by renewable energy sources. However, optimizing the configuration and operation of these systems within ECs presents complex challenges due to the variety of technologies involved, their interactions, and the dynamic behavior of buildings. Therefore, the aim of this work is developing a mathematical model using a mixed integer linear programming (MILP) algorithm to optimally design and operate polygeneration systems integrated into ECs. The model is applied to a case study of an EC comprising nine buildings in a small city in the northeast of Italy. The work rests on the single- and multi-objective optimization of the polygeneration systems taking into account the sharing of electricity among the buildings (both self-produced and/or the purchased from the grid), as well as the sharing of heating and cooling between the buildings through a district heating and cooling network (DHCN). The main results from the EC case study show the possibility of reducing the total annual CO2 emissions by around 24.3% (about 1.72 kt CO2/year) while increasing the total annual costs by 1.9% (about 0.09 M€/year) or reducing the total annual costs by 31.9% (about 1.47 M€/year) while increasing the total annual CO2 emissions by 2.2% (about 0.16 kt CO2/year). The work developed within this research can be adapted to different case studies, such as in the residential–commercial buildings and industrial sectors. Therefore, the model resulting from this work constitutes an effective tool to optimally design and operate polygeneration systems integrated into ECs.&lt;/p&gt;&quot;,&quot;issue&quot;:&quot;13&quot;,&quot;volume&quot;:&quot;17&quot;,&quot;container-title-short&quot;:&quot;Energies (Basel).&quot;},&quot;isTemporary&quot;:false}]},{&quot;citationID&quot;:&quot;MENDELEY_CITATION_94464e02-64aa-4b84-948c-989aee7cb4eb&quot;,&quot;properties&quot;:{&quot;noteIndex&quot;:0},&quot;isEdited&quot;:false,&quot;manualOverride&quot;:{&quot;isManuallyOverridden&quot;:false,&quot;citeprocText&quot;:&quot;[38]&quot;,&quot;manualOverrideText&quot;:&quot;&quot;},&quot;citationTag&quot;:&quot;MENDELEY_CITATION_v3_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&quot;,&quot;citationItems&quot;:[{&quot;id&quot;:&quot;39e6e63a-abdc-38b4-bc7e-087f23193300&quot;,&quot;itemData&quot;:{&quot;type&quot;:&quot;article-journal&quot;,&quot;id&quot;:&quot;39e6e63a-abdc-38b4-bc7e-087f23193300&quot;,&quot;title&quot;:&quot;Energy Demand Response in a Food-Processing Plant: A Deep Reinforcement Learning Approach&quot;,&quot;author&quot;:[{&quot;family&quot;:&quot;Wohlgenannt&quot;,&quot;given&quot;:&quot;Philipp&quot;,&quot;parse-names&quot;:false,&quot;dropping-particle&quot;:&quot;&quot;,&quot;non-dropping-particle&quot;:&quot;&quot;},{&quot;family&quot;:&quot;Hegenbart&quot;,&quot;given&quot;:&quot;Sebastian&quot;,&quot;parse-names&quot;:false,&quot;dropping-particle&quot;:&quot;&quot;,&quot;non-dropping-particle&quot;:&quot;&quot;},{&quot;family&quot;:&quot;Eder&quot;,&quot;given&quot;:&quot;Elias&quot;,&quot;parse-names&quot;:false,&quot;dropping-particle&quot;:&quot;&quot;,&quot;non-dropping-particle&quot;:&quot;&quot;},{&quot;family&quot;:&quot;Kolhe&quot;,&quot;given&quot;:&quot;Mohan&quot;,&quot;parse-names&quot;:false,&quot;dropping-particle&quot;:&quot;&quot;,&quot;non-dropping-particle&quot;:&quot;&quot;},{&quot;family&quot;:&quot;Kepplinger&quot;,&quot;given&quot;:&quot;Peter&quot;,&quot;parse-names&quot;:false,&quot;dropping-particle&quot;:&quot;&quot;,&quot;non-dropping-particle&quot;:&quot;&quot;}],&quot;container-title&quot;:&quot;Energies&quot;,&quot;container-title-short&quot;:&quot;Energies (Basel).&quot;,&quot;DOI&quot;:&quot;10.3390/en17246430&quot;,&quot;ISSN&quot;:&quot;1996-1073&quot;,&quot;issued&quot;:{&quot;date-parts&quot;:[[2024,12,20]]},&quot;page&quot;:&quot;6430&quot;,&quot;abstract&quot;:&quot;&lt;p&gt;The food industry faces significant challenges in managing operational costs due to its high energy intensity and rising energy prices. Industrial food-processing facilities, with substantial thermal capacities and large demands for cooling and heating, offer promising opportunities for demand response (DR) strategies. This study explores the application of deep reinforcement learning (RL) as an innovative, data-driven approach for DR in the food industry. By leveraging the adaptive, self-learning capabilities of RL, energy costs in the investigated plant are effectively decreased. The RL algorithm was compared with the well-established optimization method Mixed Integer Linear Programming (MILP), and both were benchmarked against a reference scenario without DR. The two optimization strategies demonstrate cost savings of 17.57% and 18.65% for RL and MILP, respectively. Although RL is slightly less efficient in cost reduction, it significantly outperforms in computational speed, being approximately 20 times faster. During operation, RL only needs 2ms per optimization compared to 19s for MILP, making it a promising optimization tool for edge computing. Moreover, while MILP’s computation time increases considerably with the number of binary variables, RL efficiently learns dynamic system behavior and scales to more complex systems without significant performance degradation. These results highlight that deep RL, when applied to DR, offers substantial cost savings and computational efficiency, with broad applicability to energy management in various applications.&lt;/p&gt;&quot;,&quot;issue&quot;:&quot;24&quot;,&quot;volume&quot;:&quot;17&quot;},&quot;isTemporary&quot;:false}]},{&quot;citationID&quot;:&quot;MENDELEY_CITATION_f6ee1e61-1bbe-43ae-916b-e4b52f3e034f&quot;,&quot;properties&quot;:{&quot;noteIndex&quot;:0},&quot;isEdited&quot;:false,&quot;manualOverride&quot;:{&quot;isManuallyOverridden&quot;:false,&quot;citeprocText&quot;:&quot;[39]&quot;,&quot;manualOverrideText&quot;:&quot;&quot;},&quot;citationTag&quot;:&quot;MENDELEY_CITATION_v3_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&quot;,&quot;citationItems&quot;:[{&quot;id&quot;:&quot;db0b8039-29f3-359f-944c-e94a21d1ea11&quot;,&quot;itemData&quot;:{&quot;type&quot;:&quot;paper-conference&quot;,&quot;id&quot;:&quot;db0b8039-29f3-359f-944c-e94a21d1ea11&quot;,&quot;title&quot;:&quot;Performance Comparison of Deep RL Algorithms for Energy Systems Optimal Scheduling&quot;,&quot;author&quot;:[{&quot;family&quot;:&quot;Shengren&quot;,&quot;given&quot;:&quot;Hou&quot;,&quot;parse-names&quot;:false,&quot;dropping-particle&quot;:&quot;&quot;,&quot;non-dropping-particle&quot;:&quot;&quot;},{&quot;family&quot;:&quot;Salazar&quot;,&quot;given&quot;:&quot;Edgar Mauricio&quot;,&quot;parse-names&quot;:false,&quot;dropping-particle&quot;:&quot;&quot;,&quot;non-dropping-particle&quot;:&quot;&quot;},{&quot;family&quot;:&quot;Vergara&quot;,&quot;given&quot;:&quot;Pedro P.&quot;,&quot;parse-names&quot;:false,&quot;dropping-particle&quot;:&quot;&quot;,&quot;non-dropping-particle&quot;:&quot;&quot;},{&quot;family&quot;:&quot;Palensky&quot;,&quot;given&quot;:&quot;Peter&quot;,&quot;parse-names&quot;:false,&quot;dropping-particle&quot;:&quot;&quot;,&quot;non-dropping-particle&quot;:&quot;&quot;}],&quot;container-title&quot;:&quot;2022 IEEE PES Innovative Smart Grid Technologies Conference Europe (ISGT-Europe)&quot;,&quot;DOI&quot;:&quot;10.1109/ISGT-Europe54678.2022.9960642&quot;,&quot;ISBN&quot;:&quot;978-1-6654-8032-1&quot;,&quot;issued&quot;:{&quot;date-parts&quot;:[[2022,10,10]]},&quot;page&quot;:&quot;1-6&quot;,&quot;publisher&quot;:&quot;IEEE&quot;,&quot;container-title-short&quot;:&quot;&quot;},&quot;isTemporary&quot;:false}]},{&quot;citationID&quot;:&quot;MENDELEY_CITATION_96ae9baa-ea86-4a08-9c4f-af9c24e3165b&quot;,&quot;properties&quot;:{&quot;noteIndex&quot;:0},&quot;isEdited&quot;:false,&quot;manualOverride&quot;:{&quot;isManuallyOverridden&quot;:false,&quot;citeprocText&quot;:&quot;[40]&quot;,&quot;manualOverrideText&quot;:&quot;&quot;},&quot;citationTag&quot;:&quot;MENDELEY_CITATION_v3_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&quot;,&quot;citationItems&quot;:[{&quot;id&quot;:&quot;24483df0-3b18-335c-b6c9-40541914d90d&quot;,&quot;itemData&quot;:{&quot;type&quot;:&quot;article-journal&quot;,&quot;id&quot;:&quot;24483df0-3b18-335c-b6c9-40541914d90d&quot;,&quot;title&quot;:&quot;Mixed Deep Reinforcement Learning Considering Discrete-continuous Hybrid Action Space for Smart Home Energy Management&quot;,&quot;author&quot;:[{&quot;family&quot;:&quot;Huang&quot;,&quot;given&quot;:&quot;Chao&quot;,&quot;parse-names&quot;:false,&quot;dropping-particle&quot;:&quot;&quot;,&quot;non-dropping-particle&quot;:&quot;&quot;},{&quot;family&quot;:&quot;Zhang&quot;,&quot;given&quot;:&quot;Hongcai&quot;,&quot;parse-names&quot;:false,&quot;dropping-particle&quot;:&quot;&quot;,&quot;non-dropping-particle&quot;:&quot;&quot;},{&quot;family&quot;:&quot;Wang&quot;,&quot;given&quot;:&quot;Long&quot;,&quot;parse-names&quot;:false,&quot;dropping-particle&quot;:&quot;&quot;,&quot;non-dropping-particle&quot;:&quot;&quot;},{&quot;family&quot;:&quot;Luo&quot;,&quot;given&quot;:&quot;Xiong&quot;,&quot;parse-names&quot;:false,&quot;dropping-particle&quot;:&quot;&quot;,&quot;non-dropping-particle&quot;:&quot;&quot;},{&quot;family&quot;:&quot;Song&quot;,&quot;given&quot;:&quot;Yonghua&quot;,&quot;parse-names&quot;:false,&quot;dropping-particle&quot;:&quot;&quot;,&quot;non-dropping-particle&quot;:&quot;&quot;}],&quot;container-title&quot;:&quot;Journal of Modern Power Systems and Clean Energy&quot;,&quot;DOI&quot;:&quot;10.35833/MPCE.2021.000394&quot;,&quot;ISSN&quot;:&quot;2196-5625&quot;,&quot;issued&quot;:{&quot;date-parts&quot;:[[2022]]},&quot;page&quot;:&quot;743-754&quot;,&quot;issue&quot;:&quot;3&quot;,&quot;volume&quot;:&quot;10&quot;,&quot;container-title-short&quot;:&quot;&quot;},&quot;isTemporary&quot;:false}]},{&quot;citationID&quot;:&quot;MENDELEY_CITATION_6c73ec7e-f594-40ea-aad9-4c624f81d6ce&quot;,&quot;properties&quot;:{&quot;noteIndex&quot;:0},&quot;isEdited&quot;:false,&quot;manualOverride&quot;:{&quot;isManuallyOverridden&quot;:false,&quot;citeprocText&quot;:&quot;[41]&quot;,&quot;manualOverrideText&quot;:&quot;&quot;},&quot;citationTag&quot;:&quot;MENDELEY_CITATION_v3_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&quot;,&quot;citationItems&quot;:[{&quot;id&quot;:&quot;e6b87f49-da3a-31c2-9708-c2655a7acf54&quot;,&quot;itemData&quot;:{&quot;type&quot;:&quot;article-journal&quot;,&quot;id&quot;:&quot;e6b87f49-da3a-31c2-9708-c2655a7acf54&quot;,&quot;title&quot;:&quot;Deep reinforcement learning-based energy management for design and control of off-grid renewable microgrids with dual-battery storage&quot;,&quot;author&quot;:[{&quot;family&quot;:&quot;Khan&quot;,&quot;given&quot;:&quot;Wajid&quot;,&quot;parse-names&quot;:false,&quot;dropping-particle&quot;:&quot;&quot;,&quot;non-dropping-particle&quot;:&quot;&quot;},{&quot;family&quot;:&quot;Renhai&quot;,&quot;given&quot;:&quot;Feng&quot;,&quot;parse-names&quot;:false,&quot;dropping-particle&quot;:&quot;&quot;,&quot;non-dropping-particle&quot;:&quot;&quot;},{&quot;family&quot;:&quot;Aziz&quot;,&quot;given&quot;:&quot;Abdul&quot;,&quot;parse-names&quot;:false,&quot;dropping-particle&quot;:&quot;&quot;,&quot;non-dropping-particle&quot;:&quot;&quot;},{&quot;family&quot;:&quot;Yousaf&quot;,&quot;given&quot;:&quot;Muhammad Zain&quot;,&quot;parse-names&quot;:false,&quot;dropping-particle&quot;:&quot;&quot;,&quot;non-dropping-particle&quot;:&quot;&quot;},{&quot;family&quot;:&quot;Cai&quot;,&quot;given&quot;:&quot;Zhi&quot;,&quot;parse-names&quot;:false,&quot;dropping-particle&quot;:&quot;&quot;,&quot;non-dropping-particle&quot;:&quot;&quot;},{&quot;family&quot;:&quot;Iqbal&quot;,&quot;given&quot;:&quot;Muhammad Umair&quot;,&quot;parse-names&quot;:false,&quot;dropping-particle&quot;:&quot;&quot;,&quot;non-dropping-particle&quot;:&quot;&quot;},{&quot;family&quot;:&quot;Wang&quot;,&quot;given&quot;:&quot;Jiang&quot;,&quot;parse-names&quot;:false,&quot;dropping-particle&quot;:&quot;&quot;,&quot;non-dropping-particle&quot;:&quot;&quot;},{&quot;family&quot;:&quot;Abdullah&quot;,&quot;given&quot;:&quot;Mustafa&quot;,&quot;parse-names&quot;:false,&quot;dropping-particle&quot;:&quot;&quot;,&quot;non-dropping-particle&quot;:&quot;&quot;},{&quot;family&quot;:&quot;Geremew&quot;,&quot;given&quot;:&quot;Mebratu Sintie&quot;,&quot;parse-names&quot;:false,&quot;dropping-particle&quot;:&quot;&quot;,&quot;non-dropping-particle&quot;:&quot;&quot;}],&quot;container-title&quot;:&quot;Energy Exploration &amp; Exploitation&quot;,&quot;DOI&quot;:&quot;10.1177/01445987251387368&quot;,&quot;ISSN&quot;:&quot;0144-5987&quot;,&quot;issued&quot;:{&quot;date-parts&quot;:[[2026,3,16]]},&quot;page&quot;:&quot;821-869&quot;,&quot;abstract&quot;:&quot;&lt;p&gt; Meeting the growing global electricity demand in remote and off-grid regions requires cost-effective and reliable power solutions that overcome the intermittency of renewable energy sources. This paper presents a comprehensive techno-economic optimization framework for the design and operation of off-grid hybrid renewable energy systems (HRES) integrating photovoltaic (PV), wind turbine, biomass generator, diesel backup, and a dual-chemistry hybrid battery energy storage system (HBESS) combining lithium-ion and nickel-iron batteries. A detailed mathematical modeling approach is employed to capture the nonlinear dynamics, stochastic renewable behavior, battery degradation, and temperature-adjusted component efficiencies. The system is formulated as a multi-objective mixed-integer nonlinear programming problem targeting the minimization of life cycle cost (LCC), levelized cost of energy (LCOE), and CO &lt;sub&gt;2&lt;/sub&gt; emissions while satisfying reliability constraints such as loss of power supply probability (LPSP &amp;lt; 0.01). To solve the optimization problem, advanced metaheuristic algorithms—Particle Swarm Optimization (PSO), Genetic Algorithms (GA), Grey Wolf Optimizer (GWO), and Differential Evolution (DE), and Salp Swarm Algorithm (SSA)—and a Deep Q-Network (DQN)-based reinforcement learning energy management strategy are implemented and benchmarked. The proposed DQN-based controller demonstrates superior performance over conventional rule-based and static dispatch methods by maintaining more stable battery state-of-charge (SOC) profiles, reducing degradation, and enabling intelligent real-time decision-making. Simulation results based on realistic meteorological and demand profiles reveal that the integrated DQN and HBESS strategy reduces total LCC by over 20%, CO &lt;sub&gt;2&lt;/sub&gt; emissions by up to 30%, and battery degradation costs by over 10% compared to baseline systems. The Salp Swarm Algorithm (SSA) achieves the fastest convergence and the highest-quality Pareto-optimal solutions among all metaheuristics evaluated. Sensitivity analysis identifies diesel price and interest rate as the most influential parameters on LCOE, while load shifting through aggressive demand-side management further minimizes battery usage, operating costs, and emissions. The proposed framework not only addresses key challenges in off-grid microgrid design but also provides a scalable and robust pathway for sustainable rural electrification using hybrid storage and intelligent control. &lt;/p&gt;&quot;,&quot;issue&quot;:&quot;2&quot;,&quot;volume&quot;:&quot;44&quot;,&quot;container-title-short&quot;:&quot;&quot;},&quot;isTemporary&quot;:false}]},{&quot;citationID&quot;:&quot;MENDELEY_CITATION_4aa9aa38-c6f8-4655-adad-651820be928f&quot;,&quot;properties&quot;:{&quot;noteIndex&quot;:0},&quot;isEdited&quot;:false,&quot;manualOverride&quot;:{&quot;isManuallyOverridden&quot;:false,&quot;citeprocText&quot;:&quot;[42]&quot;,&quot;manualOverrideText&quot;:&quot;&quot;},&quot;citationTag&quot;:&quot;MENDELEY_CITATION_v3_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&quot;,&quot;citationItems&quot;:[{&quot;id&quot;:&quot;724df896-ae80-37a5-bbb1-ea526b483901&quot;,&quot;itemData&quot;:{&quot;type&quot;:&quot;article-journal&quot;,&quot;id&quot;:&quot;724df896-ae80-37a5-bbb1-ea526b483901&quot;,&quot;title&quot;:&quot;Energy Demand Response in a Food-Processing Plant: A Deep Reinforcement Learning Approach&quot;,&quot;author&quot;:[{&quot;family&quot;:&quot;Wohlgenannt&quot;,&quot;given&quot;:&quot;Philipp&quot;,&quot;parse-names&quot;:false,&quot;dropping-particle&quot;:&quot;&quot;,&quot;non-dropping-particle&quot;:&quot;&quot;},{&quot;family&quot;:&quot;Hegenbart&quot;,&quot;given&quot;:&quot;Sebastian&quot;,&quot;parse-names&quot;:false,&quot;dropping-particle&quot;:&quot;&quot;,&quot;non-dropping-particle&quot;:&quot;&quot;},{&quot;family&quot;:&quot;Eder&quot;,&quot;given&quot;:&quot;Elias&quot;,&quot;parse-names&quot;:false,&quot;dropping-particle&quot;:&quot;&quot;,&quot;non-dropping-particle&quot;:&quot;&quot;},{&quot;family&quot;:&quot;Kolhe&quot;,&quot;given&quot;:&quot;Mohan&quot;,&quot;parse-names&quot;:false,&quot;dropping-particle&quot;:&quot;&quot;,&quot;non-dropping-particle&quot;:&quot;&quot;},{&quot;family&quot;:&quot;Kepplinger&quot;,&quot;given&quot;:&quot;Peter&quot;,&quot;parse-names&quot;:false,&quot;dropping-particle&quot;:&quot;&quot;,&quot;non-dropping-particle&quot;:&quot;&quot;}],&quot;container-title&quot;:&quot;Energies&quot;,&quot;container-title-short&quot;:&quot;Energies (Basel).&quot;,&quot;DOI&quot;:&quot;10.3390/en17246430&quot;,&quot;ISSN&quot;:&quot;1996-1073&quot;,&quot;issued&quot;:{&quot;date-parts&quot;:[[2024,12,20]]},&quot;page&quot;:&quot;6430&quot;,&quot;abstract&quot;:&quot;&lt;p&gt;The food industry faces significant challenges in managing operational costs due to its high energy intensity and rising energy prices. Industrial food-processing facilities, with substantial thermal capacities and large demands for cooling and heating, offer promising opportunities for demand response (DR) strategies. This study explores the application of deep reinforcement learning (RL) as an innovative, data-driven approach for DR in the food industry. By leveraging the adaptive, self-learning capabilities of RL, energy costs in the investigated plant are effectively decreased. The RL algorithm was compared with the well-established optimization method Mixed Integer Linear Programming (MILP), and both were benchmarked against a reference scenario without DR. The two optimization strategies demonstrate cost savings of 17.57% and 18.65% for RL and MILP, respectively. Although RL is slightly less efficient in cost reduction, it significantly outperforms in computational speed, being approximately 20 times faster. During operation, RL only needs 2ms per optimization compared to 19s for MILP, making it a promising optimization tool for edge computing. Moreover, while MILP’s computation time increases considerably with the number of binary variables, RL efficiently learns dynamic system behavior and scales to more complex systems without significant performance degradation. These results highlight that deep RL, when applied to DR, offers substantial cost savings and computational efficiency, with broad applicability to energy management in various applications.&lt;/p&gt;&quot;,&quot;issue&quot;:&quot;24&quot;,&quot;volume&quot;:&quot;17&quot;},&quot;isTemporary&quot;:false}]},{&quot;citationID&quot;:&quot;MENDELEY_CITATION_7cbe8449-6ae3-4327-a6e1-c91a210c1a1d&quot;,&quot;properties&quot;:{&quot;noteIndex&quot;:0},&quot;isEdited&quot;:false,&quot;manualOverride&quot;:{&quot;isManuallyOverridden&quot;:false,&quot;citeprocText&quot;:&quot;[43], [44]&quot;,&quot;manualOverrideText&quot;:&quot;&quot;},&quot;citationTag&quot;:&quot;MENDELEY_CITATION_v3_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&quot;,&quot;citationItems&quot;:[{&quot;id&quot;:&quot;80e0b832-1c6f-3864-9f71-9b273477a917&quot;,&quot;itemData&quot;:{&quot;type&quot;:&quot;article-journal&quot;,&quot;id&quot;:&quot;80e0b832-1c6f-3864-9f71-9b273477a917&quot;,&quot;title&quot;:&quot;Reinforcement Learning Techniques in Optimizing Energy Systems&quot;,&quot;author&quot;:[{&quot;family&quot;:&quot;Stavrev&quot;,&quot;given&quot;:&quot;Stefan&quot;,&quot;parse-names&quot;:false,&quot;dropping-particle&quot;:&quot;&quot;,&quot;non-dropping-particle&quot;:&quot;&quot;},{&quot;family&quot;:&quot;Ginchev&quot;,&quot;given&quot;:&quot;Dimitar&quot;,&quot;parse-names&quot;:false,&quot;dropping-particle&quot;:&quot;&quot;,&quot;non-dropping-particle&quot;:&quot;&quot;}],&quot;container-title&quot;:&quot;Electronics&quot;,&quot;DOI&quot;:&quot;10.3390/electronics13081459&quot;,&quot;ISSN&quot;:&quot;2079-9292&quot;,&quot;issued&quot;:{&quot;date-parts&quot;:[[2024,4,12]]},&quot;page&quot;:&quot;1459&quot;,&quot;abstract&quot;:&quot;&lt;p&gt;Reinforcement learning (RL) techniques have emerged as powerful tools for optimizing energy systems, offering the potential to enhance efficiency, reliability, and sustainability. This review paper provides a comprehensive examination of the applications of RL in the field of energy system optimization, spanning various domains such as energy management, grid control, and renewable energy integration. Beginning with an overview of RL fundamentals, the paper explores recent advancements in RL algorithms and their adaptation to address the unique challenges of energy system optimization. Case studies and real-world applications demonstrate the efficacy of RL-based approaches in improving energy efficiency, reducing costs, and mitigating environmental impacts. Furthermore, the paper discusses future directions and challenges, including scalability, interpretability, and integration with domain knowledge. By synthesizing the latest research findings and identifying key areas for further investigation, this paper aims to inform and inspire future research endeavors in the intersection of reinforcement learning and energy system optimization.&lt;/p&gt;&quot;,&quot;issue&quot;:&quot;8&quot;,&quot;volume&quot;:&quot;13&quot;,&quot;container-title-short&quot;:&quot;Electronics (Basel).&quot;},&quot;isTemporary&quot;:false},{&quot;id&quot;:&quot;71c1ace4-7085-3db1-9b31-493a7b2fcde3&quot;,&quot;itemData&quot;:{&quot;type&quot;:&quot;article-journal&quot;,&quot;id&quot;:&quot;71c1ace4-7085-3db1-9b31-493a7b2fcde3&quot;,&quot;title&quot;:&quot;Deep Reinforcement Learning Approaches the MILP Optimum of a Multi-Energy Optimization in Energy Communities&quot;,&quot;author&quot;:[{&quot;family&quot;:&quot;Vetter&quot;,&quot;given&quot;:&quot;Vinzent&quot;,&quot;parse-names&quot;:false,&quot;dropping-particle&quot;:&quot;&quot;,&quot;non-dropping-particle&quot;:&quot;&quot;},{&quot;family&quot;:&quot;Wohlgenannt&quot;,&quot;given&quot;:&quot;Philipp&quot;,&quot;parse-names&quot;:false,&quot;dropping-particle&quot;:&quot;&quot;,&quot;non-dropping-particle&quot;:&quot;&quot;},{&quot;family&quot;:&quot;Kepplinger&quot;,&quot;given&quot;:&quot;Peter&quot;,&quot;parse-names&quot;:false,&quot;dropping-particle&quot;:&quot;&quot;,&quot;non-dropping-particle&quot;:&quot;&quot;},{&quot;family&quot;:&quot;Eder&quot;,&quot;given&quot;:&quot;Elias&quot;,&quot;parse-names&quot;:false,&quot;dropping-particle&quot;:&quot;&quot;,&quot;non-dropping-particle&quot;:&quot;&quot;}],&quot;container-title&quot;:&quot;Energies&quot;,&quot;DOI&quot;:&quot;10.3390/en18174489&quot;,&quot;ISSN&quot;:&quot;1996-1073&quot;,&quot;issued&quot;:{&quot;date-parts&quot;:[[2025,8,23]]},&quot;page&quot;:&quot;4489&quot;,&quot;abstract&quot;:&quot;&lt;p&gt;As energy systems transition toward high shares of variable renewable generation, local energy communities (ECs) are increasingly relevant for enabling demand-side flexibility and self-sufficiency. This shift is particularly evident in the residential sector, where the deployment of photovoltaic (PV) systems is rapidly growing. While mixed-integer linear programming (MILP) remains the standard for operational optimization and demand response in such systems, its computational burden limits scalability and responsiveness under real-time or uncertain conditions. Reinforcement learning (RL), by contrast, offers a model-free, adaptive alternative. However, its application to real-world energy system operation remains limited. This study explores the application of a Deep Q-Network (DQN) to a real residential EC, which has received limited attention in prior work. The system comprises three single-family homes sharing a centralized heating system with a thermal energy storage (TES), a PV installation, and a grid connection. We compare the performance of MILP and RL controllers across economic and environmental metrics. Relative to a reference scenario without TES, MILP and RL reduce energy costs by 10.06% and 8.78%, respectively, and both approaches yield lower total energy consumption and CO2-equivalent emissions. Notably, the trained RL agent achieves a near-optimal outcome while requiring only 22% of the MILP’s computation time. These results demonstrate that DQNs can offer a computationally efficient and practically viable alternative to MILP for real-time control in residential energy systems.&lt;/p&gt;&quot;,&quot;issue&quot;:&quot;17&quot;,&quot;volume&quot;:&quot;18&quot;,&quot;container-title-short&quot;:&quot;Energies (Basel).&quot;},&quot;isTemporary&quot;:false}]},{&quot;citationID&quot;:&quot;MENDELEY_CITATION_fb974e0b-7e67-4c93-a30f-ed459a189960&quot;,&quot;properties&quot;:{&quot;noteIndex&quot;:0},&quot;isEdited&quot;:false,&quot;manualOverride&quot;:{&quot;isManuallyOverridden&quot;:false,&quot;citeprocText&quot;:&quot;[45]&quot;,&quot;manualOverrideText&quot;:&quot;&quot;},&quot;citationTag&quot;:&quot;MENDELEY_CITATION_v3_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&quot;,&quot;citationItems&quot;:[{&quot;id&quot;:&quot;8dce386b-1be0-3f7f-90b3-85aff7b0a20e&quot;,&quot;itemData&quot;:{&quot;type&quot;:&quot;article-journal&quot;,&quot;id&quot;:&quot;8dce386b-1be0-3f7f-90b3-85aff7b0a20e&quot;,&quot;title&quot;:&quot;Optimal energy system scheduling using a constraint-aware reinforcement learning algorithm&quot;,&quot;author&quot;:[{&quot;family&quot;:&quot;Shengren&quot;,&quot;given&quot;:&quot;Hou&quot;,&quot;parse-names&quot;:false,&quot;dropping-particle&quot;:&quot;&quot;,&quot;non-dropping-particle&quot;:&quot;&quot;},{&quot;family&quot;:&quot;Vergara&quot;,&quot;given&quot;:&quot;Pedro P.&quot;,&quot;parse-names&quot;:false,&quot;dropping-particle&quot;:&quot;&quot;,&quot;non-dropping-particle&quot;:&quot;&quot;},{&quot;family&quot;:&quot;Salazar Duque&quot;,&quot;given&quot;:&quot;Edgar Mauricio&quot;,&quot;parse-names&quot;:false,&quot;dropping-particle&quot;:&quot;&quot;,&quot;non-dropping-particle&quot;:&quot;&quot;},{&quot;family&quot;:&quot;Palensky&quot;,&quot;given&quot;:&quot;Peter&quot;,&quot;parse-names&quot;:false,&quot;dropping-particle&quot;:&quot;&quot;,&quot;non-dropping-particle&quot;:&quot;&quot;}],&quot;container-title&quot;:&quot;International Journal of Electrical Power &amp; Energy Systems&quot;,&quot;DOI&quot;:&quot;10.1016/j.ijepes.2023.109230&quot;,&quot;ISSN&quot;:&quot;01420615&quot;,&quot;issued&quot;:{&quot;date-parts&quot;:[[2023,10]]},&quot;page&quot;:&quot;109230&quot;,&quot;volume&quot;:&quot;152&quot;,&quot;container-title-short&quot;:&quot;&quot;},&quot;isTemporary&quot;:false}]},{&quot;citationID&quot;:&quot;MENDELEY_CITATION_1cdcd498-a953-4c56-9fed-7dd79ae2f0e4&quot;,&quot;properties&quot;:{&quot;noteIndex&quot;:0},&quot;isEdited&quot;:false,&quot;manualOverride&quot;:{&quot;isManuallyOverridden&quot;:false,&quot;citeprocText&quot;:&quot;[46]&quot;,&quot;manualOverrideText&quot;:&quot;&quot;},&quot;citationTag&quot;:&quot;MENDELEY_CITATION_v3_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&quot;,&quot;citationItems&quot;:[{&quot;id&quot;:&quot;06c2b8d2-b2dc-3af5-b126-6311b944aca0&quot;,&quot;itemData&quot;:{&quot;type&quot;:&quot;article&quot;,&quot;id&quot;:&quot;06c2b8d2-b2dc-3af5-b126-6311b944aca0&quot;,&quot;title&quot;:&quot;Reinforcement Learning Techniques in Optimizing Energy Systems&quot;,&quot;author&quot;:[{&quot;family&quot;:&quot;Stavrev&quot;,&quot;given&quot;:&quot;Stefan&quot;,&quot;parse-names&quot;:false,&quot;dropping-particle&quot;:&quot;&quot;,&quot;non-dropping-particle&quot;:&quot;&quot;},{&quot;family&quot;:&quot;Ginchev&quot;,&quot;given&quot;:&quot;Dimitar&quot;,&quot;parse-names&quot;:false,&quot;dropping-particle&quot;:&quot;&quot;,&quot;non-dropping-particle&quot;:&quot;&quot;}],&quot;container-title&quot;:&quot;Electronics (Switzerland)&quot;,&quot;DOI&quot;:&quot;10.3390/electronics13081459&quot;,&quot;ISSN&quot;:&quot;20799292&quot;,&quot;issued&quot;:{&quot;date-parts&quot;:[[2024,4,1]]},&quot;abstract&quot;:&quot;Reinforcement learning (RL) techniques have emerged as powerful tools for optimizing energy systems, offering the potential to enhance efficiency, reliability, and sustainability. This review paper provides a comprehensive examination of the applications of RL in the field of energy system optimization, spanning various domains such as energy management, grid control, and renewable energy integration. Beginning with an overview of RL fundamentals, the paper explores recent advancements in RL algorithms and their adaptation to address the unique challenges of energy system optimization. Case studies and real-world applications demonstrate the efficacy of RL-based approaches in improving energy efficiency, reducing costs, and mitigating environmental impacts. Furthermore, the paper discusses future directions and challenges, including scalability, interpretability, and integration with domain knowledge. By synthesizing the latest research findings and identifying key areas for further investigation, this paper aims to inform and inspire future research endeavors in the intersection of reinforcement learning and energy system optimization.&quot;,&quot;publisher&quot;:&quot;Multidisciplinary Digital Publishing Institute (MDPI)&quot;,&quot;issue&quot;:&quot;8&quot;,&quot;volume&quot;:&quot;13&quot;,&quot;container-title-short&quot;:&quot;&quot;},&quot;isTemporary&quot;:false}]},{&quot;citationID&quot;:&quot;MENDELEY_CITATION_8f9fc719-49df-456a-8934-5bb7891faa53&quot;,&quot;properties&quot;:{&quot;noteIndex&quot;:0},&quot;isEdited&quot;:false,&quot;manualOverride&quot;:{&quot;isManuallyOverridden&quot;:false,&quot;citeprocText&quot;:&quot;[47]&quot;,&quot;manualOverrideText&quot;:&quot;&quot;},&quot;citationTag&quot;:&quot;MENDELEY_CITATION_v3_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&quot;,&quot;citationItems&quot;:[{&quot;id&quot;:&quot;b748b453-1bc9-3b06-a2bc-accd4d93d9d9&quot;,&quot;itemData&quot;:{&quot;type&quot;:&quot;article-journal&quot;,&quot;id&quot;:&quot;b748b453-1bc9-3b06-a2bc-accd4d93d9d9&quot;,&quot;title&quot;:&quot;Applications of reinforcement learning in energy systems&quot;,&quot;author&quot;:[{&quot;family&quot;:&quot;Perera&quot;,&quot;given&quot;:&quot;A.T.D.&quot;,&quot;parse-names&quot;:false,&quot;dropping-particle&quot;:&quot;&quot;,&quot;non-dropping-particle&quot;:&quot;&quot;},{&quot;family&quot;:&quot;Kamalaruban&quot;,&quot;given&quot;:&quot;Parameswaran&quot;,&quot;parse-names&quot;:false,&quot;dropping-particle&quot;:&quot;&quot;,&quot;non-dropping-particle&quot;:&quot;&quot;}],&quot;container-title&quot;:&quot;Renewable and Sustainable Energy Reviews&quot;,&quot;DOI&quot;:&quot;10.1016/j.rser.2020.110618&quot;,&quot;ISSN&quot;:&quot;13640321&quot;,&quot;issued&quot;:{&quot;date-parts&quot;:[[2021,3]]},&quot;page&quot;:&quot;110618&quot;,&quot;volume&quot;:&quot;137&quot;,&quot;container-title-short&quot;:&quot;&quot;},&quot;isTemporary&quot;:false}]},{&quot;citationID&quot;:&quot;MENDELEY_CITATION_92567a48-90b0-46c9-bfb8-195d222dd6c2&quot;,&quot;properties&quot;:{&quot;noteIndex&quot;:0},&quot;isEdited&quot;:false,&quot;manualOverride&quot;:{&quot;isManuallyOverridden&quot;:false,&quot;citeprocText&quot;:&quot;[48]&quot;,&quot;manualOverrideText&quot;:&quot;&quot;},&quot;citationTag&quot;:&quot;MENDELEY_CITATION_v3_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&quot;,&quot;citationItems&quot;:[{&quot;id&quot;:&quot;408e45c0-460c-38aa-8310-19b6e3612eca&quot;,&quot;itemData&quot;:{&quot;type&quot;:&quot;article-journal&quot;,&quot;id&quot;:&quot;408e45c0-460c-38aa-8310-19b6e3612eca&quot;,&quot;title&quot;:&quot;Reinforcement Learning Techniques in Optimizing Energy Systems&quot;,&quot;author&quot;:[{&quot;family&quot;:&quot;Stavrev&quot;,&quot;given&quot;:&quot;Stefan&quot;,&quot;parse-names&quot;:false,&quot;dropping-particle&quot;:&quot;&quot;,&quot;non-dropping-particle&quot;:&quot;&quot;},{&quot;family&quot;:&quot;Ginchev&quot;,&quot;given&quot;:&quot;Dimitar&quot;,&quot;parse-names&quot;:false,&quot;dropping-particle&quot;:&quot;&quot;,&quot;non-dropping-particle&quot;:&quot;&quot;}],&quot;container-title&quot;:&quot;Electronics&quot;,&quot;container-title-short&quot;:&quot;Electronics (Basel).&quot;,&quot;DOI&quot;:&quot;10.3390/electronics13081459&quot;,&quot;ISSN&quot;:&quot;2079-9292&quot;,&quot;issued&quot;:{&quot;date-parts&quot;:[[2024,4,12]]},&quot;page&quot;:&quot;1459&quot;,&quot;abstract&quot;:&quot;&lt;p&gt;Reinforcement learning (RL) techniques have emerged as powerful tools for optimizing energy systems, offering the potential to enhance efficiency, reliability, and sustainability. This review paper provides a comprehensive examination of the applications of RL in the field of energy system optimization, spanning various domains such as energy management, grid control, and renewable energy integration. Beginning with an overview of RL fundamentals, the paper explores recent advancements in RL algorithms and their adaptation to address the unique challenges of energy system optimization. Case studies and real-world applications demonstrate the efficacy of RL-based approaches in improving energy efficiency, reducing costs, and mitigating environmental impacts. Furthermore, the paper discusses future directions and challenges, including scalability, interpretability, and integration with domain knowledge. By synthesizing the latest research findings and identifying key areas for further investigation, this paper aims to inform and inspire future research endeavors in the intersection of reinforcement learning and energy system optimization.&lt;/p&gt;&quot;,&quot;issue&quot;:&quot;8&quot;,&quot;volume&quot;:&quot;13&quot;},&quot;isTemporary&quot;:false}]},{&quot;citationID&quot;:&quot;MENDELEY_CITATION_2d90f837-c9a3-4da7-9b2d-0b187fae7ad5&quot;,&quot;properties&quot;:{&quot;noteIndex&quot;:0},&quot;isEdited&quot;:false,&quot;manualOverride&quot;:{&quot;isManuallyOverridden&quot;:false,&quot;citeprocText&quot;:&quot;[49]&quot;,&quot;manualOverrideText&quot;:&quot;&quot;},&quot;citationTag&quot;:&quot;MENDELEY_CITATION_v3_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&quot;,&quot;citationItems&quot;:[{&quot;id&quot;:&quot;94630c80-577c-3ded-896b-4aaf82147c8b&quot;,&quot;itemData&quot;:{&quot;type&quot;:&quot;chapter&quot;,&quot;id&quot;:&quot;94630c80-577c-3ded-896b-4aaf82147c8b&quot;,&quot;title&quot;:&quot;Efficient Exploration in Reinforcement Learning&quot;,&quot;author&quot;:[{&quot;family&quot;:&quot;Langford&quot;,&quot;given&quot;:&quot;John&quot;,&quot;parse-names&quot;:false,&quot;dropping-particle&quot;:&quot;&quot;,&quot;non-dropping-particle&quot;:&quot;&quot;}],&quot;container-title&quot;:&quot;Encyclopedia of Machine Learning&quot;,&quot;DOI&quot;:&quot;10.1007/978-0-387-30164-8_244&quot;,&quot;issued&quot;:{&quot;date-parts&quot;:[[2011]]},&quot;publisher-place&quot;:&quot;Boston, MA&quot;,&quot;page&quot;:&quot;309-311&quot;,&quot;publisher&quot;:&quot;Springer US&quot;,&quot;container-title-short&quot;:&quot;&quot;},&quot;isTemporary&quot;:false}]},{&quot;citationID&quot;:&quot;MENDELEY_CITATION_409cf5ec-19c5-4b5e-b434-08af62e0486e&quot;,&quot;properties&quot;:{&quot;noteIndex&quot;:0},&quot;isEdited&quot;:false,&quot;manualOverride&quot;:{&quot;isManuallyOverridden&quot;:false,&quot;citeprocText&quot;:&quot;[50]&quot;,&quot;manualOverrideText&quot;:&quot;&quot;},&quot;citationTag&quot;:&quot;MENDELEY_CITATION_v3_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&quot;,&quot;citationItems&quot;:[{&quot;id&quot;:&quot;b87850aa-a581-31c2-a694-b706eafaefa3&quot;,&quot;itemData&quot;:{&quot;type&quot;:&quot;article-journal&quot;,&quot;id&quot;:&quot;b87850aa-a581-31c2-a694-b706eafaefa3&quot;,&quot;title&quot;:&quot;ROBOT LEARNING&quot;,&quot;author&quot;:[{&quot;family&quot;:&quot;Sutton&quot;,&quot;given&quot;:&quot;Richard&quot;,&quot;parse-names&quot;:false,&quot;dropping-particle&quot;:&quot;&quot;,&quot;non-dropping-particle&quot;:&quot;&quot;},{&quot;family&quot;:&quot;Barto&quot;,&quot;given&quot;:&quot;Andrew&quot;,&quot;parse-names&quot;:false,&quot;dropping-particle&quot;:&quot;&quot;,&quot;non-dropping-particle&quot;:&quot;&quot;}],&quot;container-title&quot;:&quot;Robotica&quot;,&quot;container-title-short&quot;:&quot;Robotica&quot;,&quot;DOI&quot;:&quot;10.1017/S0263574799271172&quot;,&quot;ISSN&quot;:&quot;0263-5747&quot;,&quot;issued&quot;:{&quot;date-parts&quot;:[[1999,3,1]]},&quot;page&quot;:&quot;229-235&quot;,&quot;issue&quot;:&quot;2&quot;,&quot;volume&quot;:&quot;17&quot;},&quot;isTemporary&quot;:false}]},{&quot;citationID&quot;:&quot;MENDELEY_CITATION_275dbc2a-bca7-47b7-904d-467adf502462&quot;,&quot;properties&quot;:{&quot;noteIndex&quot;:0},&quot;isEdited&quot;:false,&quot;manualOverride&quot;:{&quot;isManuallyOverridden&quot;:false,&quot;citeprocText&quot;:&quot;[51]&quot;,&quot;manualOverrideText&quot;:&quot;&quot;},&quot;citationTag&quot;:&quot;MENDELEY_CITATION_v3_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&quot;,&quot;citationItems&quot;:[{&quot;id&quot;:&quot;8a2da654-28fe-395b-8105-172abb9e04b0&quot;,&quot;itemData&quot;:{&quot;type&quot;:&quot;paper-conference&quot;,&quot;id&quot;:&quot;8a2da654-28fe-395b-8105-172abb9e04b0&quot;,&quot;title&quot;:&quot;Overview of Reinforcement Learning Based on Value and Policy&quot;,&quot;author&quot;:[{&quot;family&quot;:&quot;Liu&quot;,&quot;given&quot;:&quot;Yun-ting&quot;,&quot;parse-names&quot;:false,&quot;dropping-particle&quot;:&quot;&quot;,&quot;non-dropping-particle&quot;:&quot;&quot;},{&quot;family&quot;:&quot;Yang&quot;,&quot;given&quot;:&quot;Jia-ming&quot;,&quot;parse-names&quot;:false,&quot;dropping-particle&quot;:&quot;&quot;,&quot;non-dropping-particle&quot;:&quot;&quot;},{&quot;family&quot;:&quot;Chen&quot;,&quot;given&quot;:&quot;Liang&quot;,&quot;parse-names&quot;:false,&quot;dropping-particle&quot;:&quot;&quot;,&quot;non-dropping-particle&quot;:&quot;&quot;},{&quot;family&quot;:&quot;Guo&quot;,&quot;given&quot;:&quot;Ting&quot;,&quot;parse-names&quot;:false,&quot;dropping-particle&quot;:&quot;&quot;,&quot;non-dropping-particle&quot;:&quot;&quot;},{&quot;family&quot;:&quot;Jiang&quot;,&quot;given&quot;:&quot;Yu&quot;,&quot;parse-names&quot;:false,&quot;dropping-particle&quot;:&quot;&quot;,&quot;non-dropping-particle&quot;:&quot;&quot;}],&quot;container-title&quot;:&quot;2020 Chinese Control And Decision Conference (CCDC)&quot;,&quot;DOI&quot;:&quot;10.1109/CCDC49329.2020.9164615&quot;,&quot;ISBN&quot;:&quot;978-1-7281-5855-6&quot;,&quot;issued&quot;:{&quot;date-parts&quot;:[[2020,8]]},&quot;page&quot;:&quot;598-603&quot;,&quot;publisher&quot;:&quot;IEEE&quot;,&quot;container-title-short&quot;:&quot;&quot;},&quot;isTemporary&quot;:false}]},{&quot;citationID&quot;:&quot;MENDELEY_CITATION_ef102693-b21e-49bd-8961-a5f9603586b2&quot;,&quot;properties&quot;:{&quot;noteIndex&quot;:0},&quot;isEdited&quot;:false,&quot;manualOverride&quot;:{&quot;isManuallyOverridden&quot;:false,&quot;citeprocText&quot;:&quot;[52]&quot;,&quot;manualOverrideText&quot;:&quot;&quot;},&quot;citationTag&quot;:&quot;MENDELEY_CITATION_v3_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&quot;,&quot;citationItems&quot;:[{&quot;id&quot;:&quot;ffddf98e-e370-3452-8a14-62d7c8029a56&quot;,&quot;itemData&quot;:{&quot;type&quot;:&quot;article-journal&quot;,&quot;id&quot;:&quot;ffddf98e-e370-3452-8a14-62d7c8029a56&quot;,&quot;title&quot;:&quot;Comparing Policy Gradient and Value Function Based Reinforcement Learning Methods in Simulated Electrical Power Trade&quot;,&quot;author&quot;:[{&quot;family&quot;:&quot;Lincoln&quot;,&quot;given&quot;:&quot;Richard&quot;,&quot;parse-names&quot;:false,&quot;dropping-particle&quot;:&quot;&quot;,&quot;non-dropping-particle&quot;:&quot;&quot;},{&quot;family&quot;:&quot;Galloway&quot;,&quot;given&quot;:&quot;Stuart&quot;,&quot;parse-names&quot;:false,&quot;dropping-particle&quot;:&quot;&quot;,&quot;non-dropping-particle&quot;:&quot;&quot;},{&quot;family&quot;:&quot;Stephen&quot;,&quot;given&quot;:&quot;Bruce&quot;,&quot;parse-names&quot;:false,&quot;dropping-particle&quot;:&quot;&quot;,&quot;non-dropping-particle&quot;:&quot;&quot;},{&quot;family&quot;:&quot;Burt&quot;,&quot;given&quot;:&quot;Graeme&quot;,&quot;parse-names&quot;:false,&quot;dropping-particle&quot;:&quot;&quot;,&quot;non-dropping-particle&quot;:&quot;&quot;}],&quot;container-title&quot;:&quot;IEEE Transactions on Power Systems&quot;,&quot;DOI&quot;:&quot;10.1109/TPWRS.2011.2166091&quot;,&quot;ISSN&quot;:&quot;0885-8950&quot;,&quot;issued&quot;:{&quot;date-parts&quot;:[[2012,2]]},&quot;page&quot;:&quot;373-380&quot;,&quot;issue&quot;:&quot;1&quot;,&quot;volume&quot;:&quot;27&quot;,&quot;container-title-short&quot;:&quot;&quot;},&quot;isTemporary&quot;:false}]},{&quot;citationID&quot;:&quot;MENDELEY_CITATION_2803f5df-7f60-4bed-8861-5d6e31d32156&quot;,&quot;properties&quot;:{&quot;noteIndex&quot;:0},&quot;isEdited&quot;:false,&quot;manualOverride&quot;:{&quot;isManuallyOverridden&quot;:false,&quot;citeprocText&quot;:&quot;[53]&quot;,&quot;manualOverrideText&quot;:&quot;&quot;},&quot;citationTag&quot;:&quot;MENDELEY_CITATION_v3_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&quot;,&quot;citationItems&quot;:[{&quot;id&quot;:&quot;e54e5b56-d131-3a66-9ffb-14ae92ea0215&quot;,&quot;itemData&quot;:{&quot;type&quot;:&quot;article-journal&quot;,&quot;id&quot;:&quot;e54e5b56-d131-3a66-9ffb-14ae92ea0215&quot;,&quot;title&quot;:&quot;Policy Gradient Methods in Deep Reinforcement Learning&quot;,&quot;author&quot;:[{&quot;family&quot;:&quot;Gao&quot;,&quot;given&quot;:&quot;Yuhan&quot;,&quot;parse-names&quot;:false,&quot;dropping-particle&quot;:&quot;&quot;,&quot;non-dropping-particle&quot;:&quot;&quot;}],&quot;container-title&quot;:&quot;Applied and Computational Engineering&quot;,&quot;DOI&quot;:&quot;10.54254/2755-2721/2025.TJ23321&quot;,&quot;ISSN&quot;:&quot;2755-2721&quot;,&quot;issued&quot;:{&quot;date-parts&quot;:[[2025,5,22]]},&quot;page&quot;:&quot;27-34&quot;,&quot;abstract&quot;:&quot;&lt;p&gt;Policy gradient (PG) methods are a fundamental component of deep reinforcement learning (DRL), particularly effective in continuous and high-dimensional control tasks. This paper presents a structured review of PG algorithms, tracing their development from basic Monte Carlo methods like REINFORCE to advanced techniques such as asynchronous advantage actor-critic (A3C), trust region policy optimization (TRPO), proximal policy optimization (PPO), deep deterministic policy gradient (DDPG), and soft actor-critic (SAC). These methods differ in terms of policy structure, optimization stability, and sample efficiency, addressing core challenges in policy learning through gradient-based updates. In addition, this review explores the application of PG methods in real-world domains, including autonomous driving, financial portfolio management, and smart grid energy systems. These applications demonstrate PG methods’ capacity to operate under uncertainty and adapt to complex dynamic environments. However, limitations such as high variance, low sample efficiency, and instability in multi-agent and offline settings remain significant obstacles. The review concludes by outlining emerging research directions, including entropy-based exploration, model-based policy optimization, meta-learning, and Transformer-based sequence modeling. This work aims to offer theoretical insights and practical guidance to support the continued advancement and application of policy gradient methods in reinforcement learning.&lt;/p&gt;&quot;,&quot;issue&quot;:&quot;1&quot;,&quot;volume&quot;:&quot;158&quot;,&quot;container-title-short&quot;:&quot;&quot;},&quot;isTemporary&quot;:false}]},{&quot;citationID&quot;:&quot;MENDELEY_CITATION_6b0aa260-f728-4cb7-8d42-c258b6a59a24&quot;,&quot;properties&quot;:{&quot;noteIndex&quot;:0},&quot;isEdited&quot;:false,&quot;manualOverride&quot;:{&quot;isManuallyOverridden&quot;:false,&quot;citeprocText&quot;:&quot;[54]&quot;,&quot;manualOverrideText&quot;:&quot;&quot;},&quot;citationTag&quot;:&quot;MENDELEY_CITATION_v3_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&quot;,&quot;citationItems&quot;:[{&quot;id&quot;:&quot;695f87ef-b1a7-3d24-bf63-54c6c4a9499c&quot;,&quot;itemData&quot;:{&quot;type&quot;:&quot;article-journal&quot;,&quot;id&quot;:&quot;695f87ef-b1a7-3d24-bf63-54c6c4a9499c&quot;,&quot;title&quot;:&quot;Reinforcement Learning and Its Applications in Modern Power and Energy Systems: A Review&quot;,&quot;author&quot;:[{&quot;family&quot;:&quot;Cao&quot;,&quot;given&quot;:&quot;Di&quot;,&quot;parse-names&quot;:false,&quot;dropping-particle&quot;:&quot;&quot;,&quot;non-dropping-particle&quot;:&quot;&quot;},{&quot;family&quot;:&quot;Hu&quot;,&quot;given&quot;:&quot;Weihao&quot;,&quot;parse-names&quot;:false,&quot;dropping-particle&quot;:&quot;&quot;,&quot;non-dropping-particle&quot;:&quot;&quot;},{&quot;family&quot;:&quot;Zhao&quot;,&quot;given&quot;:&quot;Junbo&quot;,&quot;parse-names&quot;:false,&quot;dropping-particle&quot;:&quot;&quot;,&quot;non-dropping-particle&quot;:&quot;&quot;},{&quot;family&quot;:&quot;Zhang&quot;,&quot;given&quot;:&quot;Guozhou&quot;,&quot;parse-names&quot;:false,&quot;dropping-particle&quot;:&quot;&quot;,&quot;non-dropping-particle&quot;:&quot;&quot;},{&quot;family&quot;:&quot;Zhang&quot;,&quot;given&quot;:&quot;Bin&quot;,&quot;parse-names&quot;:false,&quot;dropping-particle&quot;:&quot;&quot;,&quot;non-dropping-particle&quot;:&quot;&quot;},{&quot;family&quot;:&quot;Liu&quot;,&quot;given&quot;:&quot;Zhou&quot;,&quot;parse-names&quot;:false,&quot;dropping-particle&quot;:&quot;&quot;,&quot;non-dropping-particle&quot;:&quot;&quot;},{&quot;family&quot;:&quot;Chen&quot;,&quot;given&quot;:&quot;Zhe&quot;,&quot;parse-names&quot;:false,&quot;dropping-particle&quot;:&quot;&quot;,&quot;non-dropping-particle&quot;:&quot;&quot;},{&quot;family&quot;:&quot;Blaabjerg&quot;,&quot;given&quot;:&quot;Frede&quot;,&quot;parse-names&quot;:false,&quot;dropping-particle&quot;:&quot;&quot;,&quot;non-dropping-particle&quot;:&quot;&quot;}],&quot;container-title&quot;:&quot;Journal of Modern Power Systems and Clean Energy&quot;,&quot;DOI&quot;:&quot;10.35833/MPCE.2020.000552&quot;,&quot;ISSN&quot;:&quot;2196-5625&quot;,&quot;issued&quot;:{&quot;date-parts&quot;:[[2020]]},&quot;page&quot;:&quot;1029-1042&quot;,&quot;issue&quot;:&quot;6&quot;,&quot;volume&quot;:&quot;8&quot;,&quot;container-title-short&quot;:&quot;&quot;},&quot;isTemporary&quot;:false}]},{&quot;citationID&quot;:&quot;MENDELEY_CITATION_77016d76-bbff-470c-acaf-6a996a49373b&quot;,&quot;properties&quot;:{&quot;noteIndex&quot;:0},&quot;isEdited&quot;:false,&quot;manualOverride&quot;:{&quot;isManuallyOverridden&quot;:false,&quot;citeprocText&quot;:&quot;[55]&quot;,&quot;manualOverrideText&quot;:&quot;&quot;},&quot;citationTag&quot;:&quot;MENDELEY_CITATION_v3_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&quot;,&quot;citationItems&quot;:[{&quot;id&quot;:&quot;e45cab0b-e52f-3cff-b734-fbaac9d65a24&quot;,&quot;itemData&quot;:{&quot;type&quot;:&quot;paper-conference&quot;,&quot;id&quot;:&quot;e45cab0b-e52f-3cff-b734-fbaac9d65a24&quot;,&quot;title&quot;:&quot;Performance Comparison of Deep RL Algorithms for Energy Systems Optimal Scheduling&quot;,&quot;author&quot;:[{&quot;family&quot;:&quot;Shengren&quot;,&quot;given&quot;:&quot;Hou&quot;,&quot;parse-names&quot;:false,&quot;dropping-particle&quot;:&quot;&quot;,&quot;non-dropping-particle&quot;:&quot;&quot;},{&quot;family&quot;:&quot;Salazar&quot;,&quot;given&quot;:&quot;Edgar Mauricio&quot;,&quot;parse-names&quot;:false,&quot;dropping-particle&quot;:&quot;&quot;,&quot;non-dropping-particle&quot;:&quot;&quot;},{&quot;family&quot;:&quot;Vergara&quot;,&quot;given&quot;:&quot;Pedro P.&quot;,&quot;parse-names&quot;:false,&quot;dropping-particle&quot;:&quot;&quot;,&quot;non-dropping-particle&quot;:&quot;&quot;},{&quot;family&quot;:&quot;Palensky&quot;,&quot;given&quot;:&quot;Peter&quot;,&quot;parse-names&quot;:false,&quot;dropping-particle&quot;:&quot;&quot;,&quot;non-dropping-particle&quot;:&quot;&quot;}],&quot;container-title&quot;:&quot;2022 IEEE PES Innovative Smart Grid Technologies Conference Europe (ISGT-Europe)&quot;,&quot;DOI&quot;:&quot;10.1109/ISGT-Europe54678.2022.9960642&quot;,&quot;ISBN&quot;:&quot;978-1-6654-8032-1&quot;,&quot;issued&quot;:{&quot;date-parts&quot;:[[2022,10,10]]},&quot;page&quot;:&quot;1-6&quot;,&quot;publisher&quot;:&quot;IEEE&quot;,&quot;container-title-short&quot;:&quot;&quot;},&quot;isTemporary&quot;:false}]},{&quot;citationID&quot;:&quot;MENDELEY_CITATION_0a510372-57a7-426b-836c-f53f7d26b1fe&quot;,&quot;properties&quot;:{&quot;noteIndex&quot;:0},&quot;isEdited&quot;:false,&quot;manualOverride&quot;:{&quot;isManuallyOverridden&quot;:false,&quot;citeprocText&quot;:&quot;[26]&quot;,&quot;manualOverrideText&quot;:&quot;&quot;},&quot;citationTag&quot;:&quot;MENDELEY_CITATION_v3_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&quot;,&quot;citationItems&quot;:[{&quot;id&quot;:&quot;31848458-a34e-370b-af77-81d1d893a1c5&quot;,&quot;itemData&quot;:{&quot;type&quot;:&quot;article-journal&quot;,&quot;id&quot;:&quot;31848458-a34e-370b-af77-81d1d893a1c5&quot;,&quot;title&quot;:&quot;Deep Reinforcement Learning Approaches the MILP Optimum of a Multi-Energy Optimization in Energy Communities&quot;,&quot;author&quot;:[{&quot;family&quot;:&quot;Vetter&quot;,&quot;given&quot;:&quot;Vinzent&quot;,&quot;parse-names&quot;:false,&quot;dropping-particle&quot;:&quot;&quot;,&quot;non-dropping-particle&quot;:&quot;&quot;},{&quot;family&quot;:&quot;Wohlgenannt&quot;,&quot;given&quot;:&quot;Philipp&quot;,&quot;parse-names&quot;:false,&quot;dropping-particle&quot;:&quot;&quot;,&quot;non-dropping-particle&quot;:&quot;&quot;},{&quot;family&quot;:&quot;Kepplinger&quot;,&quot;given&quot;:&quot;Peter&quot;,&quot;parse-names&quot;:false,&quot;dropping-particle&quot;:&quot;&quot;,&quot;non-dropping-particle&quot;:&quot;&quot;},{&quot;family&quot;:&quot;Eder&quot;,&quot;given&quot;:&quot;Elias&quot;,&quot;parse-names&quot;:false,&quot;dropping-particle&quot;:&quot;&quot;,&quot;non-dropping-particle&quot;:&quot;&quot;}],&quot;container-title&quot;:&quot;Energies&quot;,&quot;DOI&quot;:&quot;10.3390/en18174489&quot;,&quot;ISSN&quot;:&quot;1996-1073&quot;,&quot;issued&quot;:{&quot;date-parts&quot;:[[2025,8,23]]},&quot;page&quot;:&quot;4489&quot;,&quot;abstract&quot;:&quot;&lt;p&gt;As energy systems transition toward high shares of variable renewable generation, local energy communities (ECs) are increasingly relevant for enabling demand-side flexibility and self-sufficiency. This shift is particularly evident in the residential sector, where the deployment of photovoltaic (PV) systems is rapidly growing. While mixed-integer linear programming (MILP) remains the standard for operational optimization and demand response in such systems, its computational burden limits scalability and responsiveness under real-time or uncertain conditions. Reinforcement learning (RL), by contrast, offers a model-free, adaptive alternative. However, its application to real-world energy system operation remains limited. This study explores the application of a Deep Q-Network (DQN) to a real residential EC, which has received limited attention in prior work. The system comprises three single-family homes sharing a centralized heating system with a thermal energy storage (TES), a PV installation, and a grid connection. We compare the performance of MILP and RL controllers across economic and environmental metrics. Relative to a reference scenario without TES, MILP and RL reduce energy costs by 10.06% and 8.78%, respectively, and both approaches yield lower total energy consumption and CO2-equivalent emissions. Notably, the trained RL agent achieves a near-optimal outcome while requiring only 22% of the MILP’s computation time. These results demonstrate that DQNs can offer a computationally efficient and practically viable alternative to MILP for real-time control in residential energy systems.&lt;/p&gt;&quot;,&quot;issue&quot;:&quot;17&quot;,&quot;volume&quot;:&quot;18&quot;,&quot;container-title-short&quot;:&quot;Energies (Basel).&quot;},&quot;isTemporary&quot;:false}]},{&quot;citationID&quot;:&quot;MENDELEY_CITATION_d44b77f0-61f7-4c28-821a-92a263b68faa&quot;,&quot;properties&quot;:{&quot;noteIndex&quot;:0},&quot;isEdited&quot;:false,&quot;manualOverride&quot;:{&quot;isManuallyOverridden&quot;:false,&quot;citeprocText&quot;:&quot;[56]&quot;,&quot;manualOverrideText&quot;:&quot;&quot;},&quot;citationTag&quot;:&quot;MENDELEY_CITATION_v3_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&quot;,&quot;citationItems&quot;:[{&quot;id&quot;:&quot;878a73bd-0c5d-3e77-a841-71aeb93db99a&quot;,&quot;itemData&quot;:{&quot;type&quot;:&quot;article-journal&quot;,&quot;id&quot;:&quot;878a73bd-0c5d-3e77-a841-71aeb93db99a&quot;,&quot;title&quot;:&quot;Reinforcement Learning for Joint Design and Control of Battery-PV Systems&quot;,&quot;author&quot;:[{&quot;family&quot;:&quot;Cauz&quot;,&quot;given&quot;:&quot;Marine&quot;,&quot;parse-names&quot;:false,&quot;dropping-particle&quot;:&quot;&quot;,&quot;non-dropping-particle&quot;:&quot;&quot;},{&quot;family&quot;:&quot;Bolland&quot;,&quot;given&quot;:&quot;Adrien&quot;,&quot;parse-names&quot;:false,&quot;dropping-particle&quot;:&quot;&quot;,&quot;non-dropping-particle&quot;:&quot;&quot;},{&quot;family&quot;:&quot;Miftari&quot;,&quot;given&quot;:&quot;Bardhyl&quot;,&quot;parse-names&quot;:false,&quot;dropping-particle&quot;:&quot;&quot;,&quot;non-dropping-particle&quot;:&quot;&quot;},{&quot;family&quot;:&quot;Perret&quot;,&quot;given&quot;:&quot;Lionel&quot;,&quot;parse-names&quot;:false,&quot;dropping-particle&quot;:&quot;&quot;,&quot;non-dropping-particle&quot;:&quot;&quot;},{&quot;family&quot;:&quot;Ballif&quot;,&quot;given&quot;:&quot;Christophe&quot;,&quot;parse-names&quot;:false,&quot;dropping-particle&quot;:&quot;&quot;,&quot;non-dropping-particle&quot;:&quot;&quot;},{&quot;family&quot;:&quot;Wyrsch&quot;,&quot;given&quot;:&quot;Nicolas&quot;,&quot;parse-names&quot;:false,&quot;dropping-particle&quot;:&quot;&quot;,&quot;non-dropping-particle&quot;:&quot;&quot;}],&quot;URL&quot;:&quot;http://arxiv.org/abs/2307.04244&quot;,&quot;issued&quot;:{&quot;date-parts&quot;:[[2023,7,9]]},&quot;abstract&quot;:&quot;The decentralisation and unpredictability of new renewable energy sources require rethinking our energy system. Data-driven approaches, such as reinforcement learning (RL), have emerged as new control strategies for operating these systems, but they have not yet been applied to system design. This paper aims to bridge this gap by studying the use of an RL-based method for joint design and control of a real-world PV and battery system. The design problem is first formulated as a mixed-integer linear programming problem (MILP). The optimal MILP solution is then used to evaluate the performance of an RL agent trained in a surrogate environment designed for applying an existing data-driven algorithm. The main difference between the two models lies in their optimization approaches: while MILP finds a solution that minimizes the total costs for a one-year operation given the deterministic historical data, RL is a stochastic method that searches for an optimal strategy over one week of data on expectation over all weeks in the historical dataset. Both methods were applied on a toy example using one-week data and on a case study using one-year data. In both cases, models were found to converge to similar control solutions, but their investment decisions differed. Overall, these outcomes are an initial step illustrating benefits and challenges of using RL for the joint design and control of energy systems.&quot;,&quot;container-title-short&quot;:&quot;&quot;},&quot;isTemporary&quot;:false}]}]"/>
+    <we:property name="MENDELEY_CITATIONS" value="[{&quot;citationID&quot;:&quot;MENDELEY_CITATION_9a69a8b0-b116-4a8e-be9e-ca9faac00dd4&quot;,&quot;properties&quot;:{&quot;noteIndex&quot;:0},&quot;isEdited&quot;:false,&quot;manualOverride&quot;:{&quot;isManuallyOverridden&quot;:false,&quot;citeprocText&quot;:&quot;[1]&quot;,&quot;manualOverrideText&quot;:&quot;&quot;},&quot;citationTag&quot;:&quot;MENDELEY_CITATION_v3_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&quot;,&quot;citationItems&quot;:[{&quot;id&quot;:&quot;9f54496b-fc3d-3546-b057-55b552d0253d&quot;,&quot;itemData&quot;:{&quot;type&quot;:&quot;article-journal&quot;,&quot;id&quot;:&quot;9f54496b-fc3d-3546-b057-55b552d0253d&quot;,&quot;title&quot;:&quot;Hard-to-Abate Sectors: The role of industrial carbon capture and storage (CCS) in emission mitigation&quot;,&quot;author&quot;:[{&quot;family&quot;:&quot;Paltsev&quot;,&quot;given&quot;:&quot;Sergey&quot;,&quot;parse-names&quot;:false,&quot;dropping-particle&quot;:&quot;&quot;,&quot;non-dropping-particle&quot;:&quot;&quot;},{&quot;family&quot;:&quot;Morris&quot;,&quot;given&quot;:&quot;Jennifer&quot;,&quot;parse-names&quot;:false,&quot;dropping-particle&quot;:&quot;&quot;,&quot;non-dropping-particle&quot;:&quot;&quot;},{&quot;family&quot;:&quot;Kheshgi&quot;,&quot;given&quot;:&quot;Haroon&quot;,&quot;parse-names&quot;:false,&quot;dropping-particle&quot;:&quot;&quot;,&quot;non-dropping-particle&quot;:&quot;&quot;},{&quot;family&quot;:&quot;Herzog&quot;,&quot;given&quot;:&quot;Howard&quot;,&quot;parse-names&quot;:false,&quot;dropping-particle&quot;:&quot;&quot;,&quot;non-dropping-particle&quot;:&quot;&quot;}],&quot;container-title&quot;:&quot;Applied Energy&quot;,&quot;DOI&quot;:&quot;10.1016/j.apenergy.2021.117322&quot;,&quot;ISSN&quot;:&quot;03062619&quot;,&quot;issued&quot;:{&quot;date-parts&quot;:[[2021,10]]},&quot;page&quot;:&quot;117322&quot;,&quot;volume&quot;:&quot;300&quot;,&quot;container-title-short&quot;:&quot;Appl. Energy&quot;},&quot;isTemporary&quot;:false}]},{&quot;citationID&quot;:&quot;MENDELEY_CITATION_8d7bd39f-5014-4a97-bce1-d22efa7dbd0b&quot;,&quot;properties&quot;:{&quot;noteIndex&quot;:0},&quot;isEdited&quot;:false,&quot;manualOverride&quot;:{&quot;isManuallyOverridden&quot;:false,&quot;citeprocText&quot;:&quot;[2]&quot;,&quot;manualOverrideText&quot;:&quot;&quot;},&quot;citationTag&quot;:&quot;MENDELEY_CITATION_v3_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&quot;,&quot;citationItems&quot;:[{&quot;id&quot;:&quot;956a38fa-e422-3333-a9ab-81f96dae1644&quot;,&quot;itemData&quot;:{&quot;type&quot;:&quot;article-journal&quot;,&quot;id&quot;:&quot;956a38fa-e422-3333-a9ab-81f96dae1644&quot;,&quot;title&quot;:&quot;Decarbonizing Hard-to-Abate Sectors with Renewable Hydrogen: A Real Case Application to the Ceramics Industry&quot;,&quot;author&quot;:[{&quot;family&quot;:&quot;Sousa&quot;,&quot;given&quot;:&quot;Jorge&quot;,&quot;parse-names&quot;:false,&quot;dropping-particle&quot;:&quot;&quot;,&quot;non-dropping-particle&quot;:&quot;&quot;},{&quot;family&quot;:&quot;Azevedo&quot;,&quot;given&quot;:&quot;Inês&quot;,&quot;parse-names&quot;:false,&quot;dropping-particle&quot;:&quot;&quot;,&quot;non-dropping-particle&quot;:&quot;&quot;},{&quot;family&quot;:&quot;Camus&quot;,&quot;given&quot;:&quot;Cristina&quot;,&quot;parse-names&quot;:false,&quot;dropping-particle&quot;:&quot;&quot;,&quot;non-dropping-particle&quot;:&quot;&quot;},{&quot;family&quot;:&quot;Mendes&quot;,&quot;given&quot;:&quot;Luís&quot;,&quot;parse-names&quot;:false,&quot;dropping-particle&quot;:&quot;&quot;,&quot;non-dropping-particle&quot;:&quot;&quot;},{&quot;family&quot;:&quot;Viveiros&quot;,&quot;given&quot;:&quot;Carla&quot;,&quot;parse-names&quot;:false,&quot;dropping-particle&quot;:&quot;&quot;,&quot;non-dropping-particle&quot;:&quot;&quot;},{&quot;family&quot;:&quot;Barata&quot;,&quot;given&quot;:&quot;Filipe&quot;,&quot;parse-names&quot;:false,&quot;dropping-particle&quot;:&quot;&quot;,&quot;non-dropping-particle&quot;:&quot;&quot;}],&quot;container-title&quot;:&quot;Energies&quot;,&quot;DOI&quot;:&quot;10.3390/en17153661&quot;,&quot;ISSN&quot;:&quot;1996-1073&quot;,&quot;issued&quot;:{&quot;date-parts&quot;:[[2024,7,25]]},&quot;page&quot;:&quot;3661&quot;,&quot;abstract&quot;:&quot;&lt;p&gt;Hydrogen produced from renewable energy sources is a valuable energy carrier for linking growing renewable electricity generation with the hard-to-abate sectors, such as cement, steel, glass, chemical, and ceramics industries. In this context, this paper presents a new model of hydrogen production based on solar photovoltaics and wind energy with application to a real-world ceramics factory. For this task, a novel multipurpose profit-maximizing model is implemented using GAMS. The developed model explores hydrogen production with multiple value streams that enable technical and economical informed decisions under specific scenarios. Our results show that it is profitable to sell the hydrogen produced to the gas grid rather than using it for self-consumption for low-gas-price scenarios. On the other hand, when the price of gas is significantly high, it is more profitable to use as much hydrogen as possible for self-consumption to supply the factory and reduce the internal use of natural gas. The role of electricity self-consumption has proven to be key for the project’s profitability as, without this revenue stream, the project would not be profitable in any analysed scenario.&lt;/p&gt;&quot;,&quot;issue&quot;:&quot;15&quot;,&quot;volume&quot;:&quot;17&quot;,&quot;container-title-short&quot;:&quot;Energies (Basel).&quot;},&quot;isTemporary&quot;:false}]},{&quot;citationID&quot;:&quot;MENDELEY_CITATION_cc9a11a7-48e8-4bcd-9601-05385ccebf02&quot;,&quot;properties&quot;:{&quot;noteIndex&quot;:0},&quot;isEdited&quot;:false,&quot;manualOverride&quot;:{&quot;isManuallyOverridden&quot;:false,&quot;citeprocText&quot;:&quot;[3]&quot;,&quot;manualOverrideText&quot;:&quot;&quot;},&quot;citationTag&quot;:&quot;MENDELEY_CITATION_v3_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&quot;,&quot;citationItems&quot;:[{&quot;id&quot;:&quot;66781a91-8ce9-38c0-8b80-b0de4bdb3cc9&quot;,&quot;itemData&quot;:{&quot;type&quot;:&quot;article-journal&quot;,&quot;id&quot;:&quot;66781a91-8ce9-38c0-8b80-b0de4bdb3cc9&quot;,&quot;title&quot;:&quot;From green hydrogen to electricity: A review on recent advances, challenges, and opportunities on power-to-hydrogen-to-power systems&quot;,&quot;author&quot;:[{&quot;family&quot;:&quot;Risco-Bravo&quot;,&quot;given&quot;:&quot;A.&quot;,&quot;parse-names&quot;:false,&quot;dropping-particle&quot;:&quot;&quot;,&quot;non-dropping-particle&quot;:&quot;&quot;},{&quot;family&quot;:&quot;Varela&quot;,&quot;given&quot;:&quot;C.&quot;,&quot;parse-names&quot;:false,&quot;dropping-particle&quot;:&quot;&quot;,&quot;non-dropping-particle&quot;:&quot;&quot;},{&quot;family&quot;:&quot;Bartels&quot;,&quot;given&quot;:&quot;J.&quot;,&quot;parse-names&quot;:false,&quot;dropping-particle&quot;:&quot;&quot;,&quot;non-dropping-particle&quot;:&quot;&quot;},{&quot;family&quot;:&quot;Zondervan&quot;,&quot;given&quot;:&quot;E.&quot;,&quot;parse-names&quot;:false,&quot;dropping-particle&quot;:&quot;&quot;,&quot;non-dropping-particle&quot;:&quot;&quot;}],&quot;container-title&quot;:&quot;Renewable and Sustainable Energy Reviews&quot;,&quot;DOI&quot;:&quot;10.1016/j.rser.2023.113930&quot;,&quot;ISSN&quot;:&quot;13640321&quot;,&quot;issued&quot;:{&quot;date-parts&quot;:[[2024,1]]},&quot;page&quot;:&quot;113930&quot;,&quot;volume&quot;:&quot;189&quot;,&quot;container-title-short&quot;:&quot;&quot;},&quot;isTemporary&quot;:false}]},{&quot;citationID&quot;:&quot;MENDELEY_CITATION_10ebcc1d-9e7d-475c-9706-140f1e237e74&quot;,&quot;properties&quot;:{&quot;noteIndex&quot;:0},&quot;isEdited&quot;:false,&quot;manualOverride&quot;:{&quot;isManuallyOverridden&quot;:false,&quot;citeprocText&quot;:&quot;[4]&quot;,&quot;manualOverrideText&quot;:&quot;&quot;},&quot;citationTag&quot;:&quot;MENDELEY_CITATION_v3_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&quot;,&quot;citationItems&quot;:[{&quot;id&quot;:&quot;d00ceab6-c269-3d86-a58b-dd8be99f154b&quot;,&quot;itemData&quot;:{&quot;type&quot;:&quot;article-journal&quot;,&quot;id&quot;:&quot;d00ceab6-c269-3d86-a58b-dd8be99f154b&quot;,&quot;title&quot;:&quot;A comprehensive review of optimizing hybrid renewable energy system using optimization techniques&quot;,&quot;author&quot;:[{&quot;family&quot;:&quot;Yao&quot;,&quot;given&quot;:&quot;Ye&quot;,&quot;parse-names&quot;:false,&quot;dropping-particle&quot;:&quot;&quot;,&quot;non-dropping-particle&quot;:&quot;&quot;},{&quot;family&quot;:&quot;Wang&quot;,&quot;given&quot;:&quot;Zhen&quot;,&quot;parse-names&quot;:false,&quot;dropping-particle&quot;:&quot;&quot;,&quot;non-dropping-particle&quot;:&quot;&quot;},{&quot;family&quot;:&quot;Ma&quot;,&quot;given&quot;:&quot;Chao&quot;,&quot;parse-names&quot;:false,&quot;dropping-particle&quot;:&quot;&quot;,&quot;non-dropping-particle&quot;:&quot;&quot;},{&quot;family&quot;:&quot;Liu&quot;,&quot;given&quot;:&quot;Mengmeng&quot;,&quot;parse-names&quot;:false,&quot;dropping-particle&quot;:&quot;&quot;,&quot;non-dropping-particle&quot;:&quot;&quot;},{&quot;family&quot;:&quot;Qi&quot;,&quot;given&quot;:&quot;Wenchao&quot;,&quot;parse-names&quot;:false,&quot;dropping-particle&quot;:&quot;&quot;,&quot;non-dropping-particle&quot;:&quot;&quot;},{&quot;family&quot;:&quot;Yang&quot;,&quot;given&quot;:&quot;Xiuwei&quot;,&quot;parse-names&quot;:false,&quot;dropping-particle&quot;:&quot;&quot;,&quot;non-dropping-particle&quot;:&quot;&quot;},{&quot;family&quot;:&quot;Gao&quot;,&quot;given&quot;:&quot;Xifeng&quot;,&quot;parse-names&quot;:false,&quot;dropping-particle&quot;:&quot;&quot;,&quot;non-dropping-particle&quot;:&quot;&quot;},{&quot;family&quot;:&quot;Liu&quot;,&quot;given&quot;:&quot;Yingzhou&quot;,&quot;parse-names&quot;:false,&quot;dropping-particle&quot;:&quot;&quot;,&quot;non-dropping-particle&quot;:&quot;&quot;},{&quot;family&quot;:&quot;Lian&quot;,&quot;given&quot;:&quot;Jijian&quot;,&quot;parse-names&quot;:false,&quot;dropping-particle&quot;:&quot;&quot;,&quot;non-dropping-particle&quot;:&quot;&quot;},{&quot;family&quot;:&quot;Wang&quot;,&quot;given&quot;:&quot;Haolin&quot;,&quot;parse-names&quot;:false,&quot;dropping-particle&quot;:&quot;&quot;,&quot;non-dropping-particle&quot;:&quot;&quot;}],&quot;container-title&quot;:&quot;Engineering Science and Technology, an International Journal&quot;,&quot;DOI&quot;:&quot;10.1016/j.jestch.2026.102384&quot;,&quot;ISSN&quot;:&quot;22150986&quot;,&quot;issued&quot;:{&quot;date-parts&quot;:[[2026,6]]},&quot;page&quot;:&quot;102384&quot;,&quot;volume&quot;:&quot;78&quot;,&quot;container-title-short&quot;:&quot;&quot;},&quot;isTemporary&quot;:false}]},{&quot;citationID&quot;:&quot;MENDELEY_CITATION_883842a3-a21f-4bfa-9084-5059522ad981&quot;,&quot;properties&quot;:{&quot;noteIndex&quot;:0},&quot;isEdited&quot;:false,&quot;manualOverride&quot;:{&quot;isManuallyOverridden&quot;:false,&quot;citeprocText&quot;:&quot;[5]&quot;,&quot;manualOverrideText&quot;:&quot;&quot;},&quot;citationTag&quot;:&quot;MENDELEY_CITATION_v3_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&quot;,&quot;citationItems&quot;:[{&quot;id&quot;:&quot;37e1e1c6-a2f3-3486-92e6-469dc2e4adc9&quot;,&quot;itemData&quot;:{&quot;type&quot;:&quot;article-journal&quot;,&quot;id&quot;:&quot;37e1e1c6-a2f3-3486-92e6-469dc2e4adc9&quot;,&quot;title&quot;:&quot;Energy Demand Response in a Food-Processing Plant: A Deep Reinforcement Learning Approach&quot;,&quot;author&quot;:[{&quot;family&quot;:&quot;Wohlgenannt&quot;,&quot;given&quot;:&quot;Philipp&quot;,&quot;parse-names&quot;:false,&quot;dropping-particle&quot;:&quot;&quot;,&quot;non-dropping-particle&quot;:&quot;&quot;},{&quot;family&quot;:&quot;Hegenbart&quot;,&quot;given&quot;:&quot;Sebastian&quot;,&quot;parse-names&quot;:false,&quot;dropping-particle&quot;:&quot;&quot;,&quot;non-dropping-particle&quot;:&quot;&quot;},{&quot;family&quot;:&quot;Eder&quot;,&quot;given&quot;:&quot;Elias&quot;,&quot;parse-names&quot;:false,&quot;dropping-particle&quot;:&quot;&quot;,&quot;non-dropping-particle&quot;:&quot;&quot;},{&quot;family&quot;:&quot;Kolhe&quot;,&quot;given&quot;:&quot;Mohan&quot;,&quot;parse-names&quot;:false,&quot;dropping-particle&quot;:&quot;&quot;,&quot;non-dropping-particle&quot;:&quot;&quot;},{&quot;family&quot;:&quot;Kepplinger&quot;,&quot;given&quot;:&quot;Peter&quot;,&quot;parse-names&quot;:false,&quot;dropping-particle&quot;:&quot;&quot;,&quot;non-dropping-particle&quot;:&quot;&quot;}],&quot;container-title&quot;:&quot;Energies&quot;,&quot;container-title-short&quot;:&quot;Energies (Basel).&quot;,&quot;DOI&quot;:&quot;10.3390/en17246430&quot;,&quot;ISSN&quot;:&quot;1996-1073&quot;,&quot;issued&quot;:{&quot;date-parts&quot;:[[2024,12,20]]},&quot;page&quot;:&quot;6430&quot;,&quot;abstract&quot;:&quot;&lt;p&gt;The food industry faces significant challenges in managing operational costs due to its high energy intensity and rising energy prices. Industrial food-processing facilities, with substantial thermal capacities and large demands for cooling and heating, offer promising opportunities for demand response (DR) strategies. This study explores the application of deep reinforcement learning (RL) as an innovative, data-driven approach for DR in the food industry. By leveraging the adaptive, self-learning capabilities of RL, energy costs in the investigated plant are effectively decreased. The RL algorithm was compared with the well-established optimization method Mixed Integer Linear Programming (MILP), and both were benchmarked against a reference scenario without DR. The two optimization strategies demonstrate cost savings of 17.57% and 18.65% for RL and MILP, respectively. Although RL is slightly less efficient in cost reduction, it significantly outperforms in computational speed, being approximately 20 times faster. During operation, RL only needs 2ms per optimization compared to 19s for MILP, making it a promising optimization tool for edge computing. Moreover, while MILP’s computation time increases considerably with the number of binary variables, RL efficiently learns dynamic system behavior and scales to more complex systems without significant performance degradation. These results highlight that deep RL, when applied to DR, offers substantial cost savings and computational efficiency, with broad applicability to energy management in various applications.&lt;/p&gt;&quot;,&quot;issue&quot;:&quot;24&quot;,&quot;volume&quot;:&quot;17&quot;},&quot;isTemporary&quot;:false}]},{&quot;citationID&quot;:&quot;MENDELEY_CITATION_d7370189-8bad-428a-bf96-f6e0b77e7bf5&quot;,&quot;properties&quot;:{&quot;noteIndex&quot;:0},&quot;isEdited&quot;:false,&quot;manualOverride&quot;:{&quot;isManuallyOverridden&quot;:false,&quot;citeprocText&quot;:&quot;[6]&quot;,&quot;manualOverrideText&quot;:&quot;&quot;},&quot;citationTag&quot;:&quot;MENDELEY_CITATION_v3_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&quot;,&quot;citationItems&quot;:[{&quot;id&quot;:&quot;f01623cd-5b09-3de7-90db-88f6efe9d97e&quot;,&quot;itemData&quot;:{&quot;type&quot;:&quot;article-journal&quot;,&quot;id&quot;:&quot;f01623cd-5b09-3de7-90db-88f6efe9d97e&quot;,&quot;title&quot;:&quot;Optimization of energy supply systems by MILP branch and bound method in consideration of hierarchical relationship between design and operation&quot;,&quot;author&quot;:[{&quot;family&quot;:&quot;Yokoyama&quot;,&quot;given&quot;:&quot;Ryohei&quot;,&quot;parse-names&quot;:false,&quot;dropping-particle&quot;:&quot;&quot;,&quot;non-dropping-particle&quot;:&quot;&quot;},{&quot;family&quot;:&quot;Shinano&quot;,&quot;given&quot;:&quot;Yuji&quot;,&quot;parse-names&quot;:false,&quot;dropping-particle&quot;:&quot;&quot;,&quot;non-dropping-particle&quot;:&quot;&quot;},{&quot;family&quot;:&quot;Taniguchi&quot;,&quot;given&quot;:&quot;Syusuke&quot;,&quot;parse-names&quot;:false,&quot;dropping-particle&quot;:&quot;&quot;,&quot;non-dropping-particle&quot;:&quot;&quot;},{&quot;family&quot;:&quot;Ohkura&quot;,&quot;given&quot;:&quot;Masashi&quot;,&quot;parse-names&quot;:false,&quot;dropping-particle&quot;:&quot;&quot;,&quot;non-dropping-particle&quot;:&quot;&quot;},{&quot;family&quot;:&quot;Wakui&quot;,&quot;given&quot;:&quot;Tetsuya&quot;,&quot;parse-names&quot;:false,&quot;dropping-particle&quot;:&quot;&quot;,&quot;non-dropping-particle&quot;:&quot;&quot;}],&quot;container-title&quot;:&quot;Energy Conversion and Management&quot;,&quot;DOI&quot;:&quot;10.1016/j.enconman.2014.12.020&quot;,&quot;ISSN&quot;:&quot;01968904&quot;,&quot;issued&quot;:{&quot;date-parts&quot;:[[2015,3]]},&quot;page&quot;:&quot;92-104&quot;,&quot;volume&quot;:&quot;92&quot;,&quot;container-title-short&quot;:&quot;Energy Convers. Manag.&quot;},&quot;isTemporary&quot;:false}]},{&quot;citationID&quot;:&quot;MENDELEY_CITATION_25f810e2-1387-4860-bc8b-20e968f8adf0&quot;,&quot;properties&quot;:{&quot;noteIndex&quot;:0},&quot;isEdited&quot;:false,&quot;manualOverride&quot;:{&quot;isManuallyOverridden&quot;:false,&quot;citeprocText&quot;:&quot;[7]&quot;,&quot;manualOverrideText&quot;:&quot;&quot;},&quot;citationTag&quot;:&quot;MENDELEY_CITATION_v3_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&quot;,&quot;citationItems&quot;:[{&quot;id&quot;:&quot;85308694-191e-34ed-aa20-9e1aa6f08e43&quot;,&quot;itemData&quot;:{&quot;type&quot;:&quot;article-journal&quot;,&quot;id&quot;:&quot;85308694-191e-34ed-aa20-9e1aa6f08e43&quot;,&quot;title&quot;:&quot;Reinforcement Learning Techniques in Optimizing Energy Systems&quot;,&quot;author&quot;:[{&quot;family&quot;:&quot;Stavrev&quot;,&quot;given&quot;:&quot;Stefan&quot;,&quot;parse-names&quot;:false,&quot;dropping-particle&quot;:&quot;&quot;,&quot;non-dropping-particle&quot;:&quot;&quot;},{&quot;family&quot;:&quot;Ginchev&quot;,&quot;given&quot;:&quot;Dimitar&quot;,&quot;parse-names&quot;:false,&quot;dropping-particle&quot;:&quot;&quot;,&quot;non-dropping-particle&quot;:&quot;&quot;}],&quot;container-title&quot;:&quot;Electronics&quot;,&quot;DOI&quot;:&quot;10.3390/electronics13081459&quot;,&quot;ISSN&quot;:&quot;2079-9292&quot;,&quot;issued&quot;:{&quot;date-parts&quot;:[[2024,4,12]]},&quot;page&quot;:&quot;1459&quot;,&quot;abstract&quot;:&quot;&lt;p&gt;Reinforcement learning (RL) techniques have emerged as powerful tools for optimizing energy systems, offering the potential to enhance efficiency, reliability, and sustainability. This review paper provides a comprehensive examination of the applications of RL in the field of energy system optimization, spanning various domains such as energy management, grid control, and renewable energy integration. Beginning with an overview of RL fundamentals, the paper explores recent advancements in RL algorithms and their adaptation to address the unique challenges of energy system optimization. Case studies and real-world applications demonstrate the efficacy of RL-based approaches in improving energy efficiency, reducing costs, and mitigating environmental impacts. Furthermore, the paper discusses future directions and challenges, including scalability, interpretability, and integration with domain knowledge. By synthesizing the latest research findings and identifying key areas for further investigation, this paper aims to inform and inspire future research endeavors in the intersection of reinforcement learning and energy system optimization.&lt;/p&gt;&quot;,&quot;issue&quot;:&quot;8&quot;,&quot;volume&quot;:&quot;13&quot;,&quot;container-title-short&quot;:&quot;Electronics (Basel).&quot;},&quot;isTemporary&quot;:false}]},{&quot;citationID&quot;:&quot;MENDELEY_CITATION_51c152f6-c4bd-46c0-a730-f4779c171221&quot;,&quot;properties&quot;:{&quot;noteIndex&quot;:0},&quot;isEdited&quot;:false,&quot;manualOverride&quot;:{&quot;isManuallyOverridden&quot;:false,&quot;citeprocText&quot;:&quot;[8]&quot;,&quot;manualOverrideText&quot;:&quot;&quot;},&quot;citationTag&quot;:&quot;MENDELEY_CITATION_v3_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&quot;,&quot;citationItems&quot;:[{&quot;id&quot;:&quot;19ead3b7-e80b-3f24-a3e3-22a038f3385c&quot;,&quot;itemData&quot;:{&quot;type&quot;:&quot;article-journal&quot;,&quot;id&quot;:&quot;19ead3b7-e80b-3f24-a3e3-22a038f3385c&quot;,&quot;title&quot;:&quot;LCA and exergy-economic evaluation of a biogas-to-fuels system using CO2 hydrogenation and exhaust gas recycling&quot;,&quot;author&quot;:[{&quot;family&quot;:&quot;Ghiasirad&quot;,&quot;given&quot;:&quot;Hamed&quot;,&quot;parse-names&quot;:false,&quot;dropping-particle&quot;:&quot;&quot;,&quot;non-dropping-particle&quot;:&quot;&quot;},{&quot;family&quot;:&quot;Ebrahimian&quot;,&quot;given&quot;:&quot;Farinaz&quot;,&quot;parse-names&quot;:false,&quot;dropping-particle&quot;:&quot;&quot;,&quot;non-dropping-particle&quot;:&quot;&quot;},{&quot;family&quot;:&quot;Gholizadeh&quot;,&quot;given&quot;:&quot;Towhid&quot;,&quot;parse-names&quot;:false,&quot;dropping-particle&quot;:&quot;&quot;,&quot;non-dropping-particle&quot;:&quot;&quot;},{&quot;family&quot;:&quot;Mohammadi&quot;,&quot;given&quot;:&quot;Ali&quot;,&quot;parse-names&quot;:false,&quot;dropping-particle&quot;:&quot;&quot;,&quot;non-dropping-particle&quot;:&quot;&quot;},{&quot;family&quot;:&quot;Mirmasoumi&quot;,&quot;given&quot;:&quot;Siamak&quot;,&quot;parse-names&quot;:false,&quot;dropping-particle&quot;:&quot;&quot;,&quot;non-dropping-particle&quot;:&quot;&quot;},{&quot;family&quot;:&quot;Saray&quot;,&quot;given&quot;:&quot;Rahim Khoshbakhti&quot;,&quot;parse-names&quot;:false,&quot;dropping-particle&quot;:&quot;&quot;,&quot;non-dropping-particle&quot;:&quot;&quot;},{&quot;family&quot;:&quot;Skorek-Osikowska&quot;,&quot;given&quot;:&quot;Anna&quot;,&quot;parse-names&quot;:false,&quot;dropping-particle&quot;:&quot;&quot;,&quot;non-dropping-particle&quot;:&quot;&quot;}],&quot;container-title&quot;:&quot;Energy Conversion and Management: X&quot;,&quot;DOI&quot;:&quot;10.1016/j.ecmx.2025.100897&quot;,&quot;ISSN&quot;:&quot;25901745&quot;,&quot;issued&quot;:{&quot;date-parts&quot;:[[2025,4]]},&quot;page&quot;:&quot;100897&quot;,&quot;volume&quot;:&quot;26&quot;,&quot;container-title-short&quot;:&quot;&quot;},&quot;isTemporary&quot;:false}]},{&quot;citationID&quot;:&quot;MENDELEY_CITATION_105cda64-5b6c-464e-beda-2ca75d02300e&quot;,&quot;properties&quot;:{&quot;noteIndex&quot;:0},&quot;isEdited&quot;:false,&quot;manualOverride&quot;:{&quot;isManuallyOverridden&quot;:false,&quot;citeprocText&quot;:&quot;[9]&quot;,&quot;manualOverrideText&quot;:&quot;&quot;},&quot;citationTag&quot;:&quot;MENDELEY_CITATION_v3_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&quot;,&quot;citationItems&quot;:[{&quot;id&quot;:&quot;56e0ce24-6bd0-3ca6-ad59-9e041fc06482&quot;,&quot;itemData&quot;:{&quot;type&quot;:&quot;article-journal&quot;,&quot;id&quot;:&quot;56e0ce24-6bd0-3ca6-ad59-9e041fc06482&quot;,&quot;title&quot;:&quot;Syngas biomethanation: state‐of‐the‐art review and perspectives&quot;,&quot;author&quot;:[{&quot;family&quot;:&quot;Grimalt‐Alemany&quot;,&quot;given&quot;:&quot;Antonio&quot;,&quot;parse-names&quot;:false,&quot;dropping-particle&quot;:&quot;&quot;,&quot;non-dropping-particle&quot;:&quot;&quot;},{&quot;family&quot;:&quot;Skiadas&quot;,&quot;given&quot;:&quot;Ioannis&quot;,&quot;parse-names&quot;:false,&quot;dropping-particle&quot;:&quot;V.&quot;,&quot;non-dropping-particle&quot;:&quot;&quot;},{&quot;family&quot;:&quot;Gavala&quot;,&quot;given&quot;:&quot;Hariklia N.&quot;,&quot;parse-names&quot;:false,&quot;dropping-particle&quot;:&quot;&quot;,&quot;non-dropping-particle&quot;:&quot;&quot;}],&quot;container-title&quot;:&quot;Biofuels, Bioproducts and Biorefining&quot;,&quot;DOI&quot;:&quot;10.1002/bbb.1826&quot;,&quot;ISSN&quot;:&quot;1932-104X&quot;,&quot;issued&quot;:{&quot;date-parts&quot;:[[2018,1,10]]},&quot;page&quot;:&quot;139-158&quot;,&quot;abstract&quot;:&quot;&lt;p&gt;Significant research efforts are currently being made worldwide to develop more efficient biomethane production processes from a variety of waste streams. The biomethanation of biomass‐derived syngas can contribute to increasing the potential of methane production as it opens the way for the conversion of recalcitrant biomasses, generally not fully exploitable by anaerobic digestion systems. Additionally, this biological process presents several advantages over its analogous process of catalytic methanation such as the use of inexpensive biocatalysts, milder operational conditions, higher tolerance to the impurities of syngas, and higher product selectivity. However, there are still several challenges to be addressed for this technology to reach commercial stage. This work reviews the progress made over the last few years in syngas biomethanation processes in order to provide an overview of the current state of the art of this technology. The most relevant aspects determining the performance of syngas biomethanation processes are extensively discussed here, including microbial diversity and metabolic interactions in mixed microbial consortia, the influence of operating parameters and bioreactor designs, and the potential of modelling as a tool for the design and control of this bioprocess. © 2017 Society of Chemical Industry and John Wiley &amp;amp; Sons, Ltd&lt;/p&gt;&quot;,&quot;issue&quot;:&quot;1&quot;,&quot;volume&quot;:&quot;12&quot;,&quot;container-title-short&quot;:&quot;&quot;},&quot;isTemporary&quot;:false}]},{&quot;citationID&quot;:&quot;MENDELEY_CITATION_790cd8fb-1a04-4124-9aa6-1645a459196b&quot;,&quot;properties&quot;:{&quot;noteIndex&quot;:0},&quot;isEdited&quot;:false,&quot;manualOverride&quot;:{&quot;isManuallyOverridden&quot;:false,&quot;citeprocText&quot;:&quot;[9], [10]&quot;,&quot;manualOverrideText&quot;:&quot;&quot;},&quot;citationTag&quot;:&quot;MENDELEY_CITATION_v3_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&quot;,&quot;citationItems&quot;:[{&quot;id&quot;:&quot;aa2feb8d-c9bd-3781-bba9-d18156ecd3e8&quot;,&quot;itemData&quot;:{&quot;type&quot;:&quot;article-journal&quot;,&quot;id&quot;:&quot;aa2feb8d-c9bd-3781-bba9-d18156ecd3e8&quot;,&quot;title&quot;:&quot;Alternative sustainable routes to methanol production: Techno-economic and environmental assessment&quot;,&quot;author&quot;:[{&quot;family&quot;:&quot;Scomazzon&quot;,&quot;given&quot;:&quot;Marco&quot;,&quot;parse-names&quot;:false,&quot;dropping-particle&quot;:&quot;&quot;,&quot;non-dropping-particle&quot;:&quot;&quot;},{&quot;family&quot;:&quot;Barbera&quot;,&quot;given&quot;:&quot;Elena&quot;,&quot;parse-names&quot;:false,&quot;dropping-particle&quot;:&quot;&quot;,&quot;non-dropping-particle&quot;:&quot;&quot;},{&quot;family&quot;:&quot;Bezzo&quot;,&quot;given&quot;:&quot;Fabrizio&quot;,&quot;parse-names&quot;:false,&quot;dropping-particle&quot;:&quot;&quot;,&quot;non-dropping-particle&quot;:&quot;&quot;}],&quot;container-title&quot;:&quot;Journal of Environmental Chemical Engineering&quot;,&quot;DOI&quot;:&quot;10.1016/j.jece.2024.112674&quot;,&quot;ISSN&quot;:&quot;22133437&quot;,&quot;issued&quot;:{&quot;date-parts&quot;:[[2024,6]]},&quot;page&quot;:&quot;112674&quot;,&quot;issue&quot;:&quot;3&quot;,&quot;volume&quot;:&quot;12&quot;,&quot;container-title-short&quot;:&quot;J. Environ. Chem. Eng.&quot;},&quot;isTemporary&quot;:false},{&quot;id&quot;:&quot;56e0ce24-6bd0-3ca6-ad59-9e041fc06482&quot;,&quot;itemData&quot;:{&quot;type&quot;:&quot;article-journal&quot;,&quot;id&quot;:&quot;56e0ce24-6bd0-3ca6-ad59-9e041fc06482&quot;,&quot;title&quot;:&quot;Syngas biomethanation: state‐of‐the‐art review and perspectives&quot;,&quot;author&quot;:[{&quot;family&quot;:&quot;Grimalt‐Alemany&quot;,&quot;given&quot;:&quot;Antonio&quot;,&quot;parse-names&quot;:false,&quot;dropping-particle&quot;:&quot;&quot;,&quot;non-dropping-particle&quot;:&quot;&quot;},{&quot;family&quot;:&quot;Skiadas&quot;,&quot;given&quot;:&quot;Ioannis&quot;,&quot;parse-names&quot;:false,&quot;dropping-particle&quot;:&quot;V.&quot;,&quot;non-dropping-particle&quot;:&quot;&quot;},{&quot;family&quot;:&quot;Gavala&quot;,&quot;given&quot;:&quot;Hariklia N.&quot;,&quot;parse-names&quot;:false,&quot;dropping-particle&quot;:&quot;&quot;,&quot;non-dropping-particle&quot;:&quot;&quot;}],&quot;container-title&quot;:&quot;Biofuels, Bioproducts and Biorefining&quot;,&quot;DOI&quot;:&quot;10.1002/bbb.1826&quot;,&quot;ISSN&quot;:&quot;1932-104X&quot;,&quot;issued&quot;:{&quot;date-parts&quot;:[[2018,1,10]]},&quot;page&quot;:&quot;139-158&quot;,&quot;abstract&quot;:&quot;&lt;p&gt;Significant research efforts are currently being made worldwide to develop more efficient biomethane production processes from a variety of waste streams. The biomethanation of biomass‐derived syngas can contribute to increasing the potential of methane production as it opens the way for the conversion of recalcitrant biomasses, generally not fully exploitable by anaerobic digestion systems. Additionally, this biological process presents several advantages over its analogous process of catalytic methanation such as the use of inexpensive biocatalysts, milder operational conditions, higher tolerance to the impurities of syngas, and higher product selectivity. However, there are still several challenges to be addressed for this technology to reach commercial stage. This work reviews the progress made over the last few years in syngas biomethanation processes in order to provide an overview of the current state of the art of this technology. The most relevant aspects determining the performance of syngas biomethanation processes are extensively discussed here, including microbial diversity and metabolic interactions in mixed microbial consortia, the influence of operating parameters and bioreactor designs, and the potential of modelling as a tool for the design and control of this bioprocess. © 2017 Society of Chemical Industry and John Wiley &amp;amp; Sons, Ltd&lt;/p&gt;&quot;,&quot;issue&quot;:&quot;1&quot;,&quot;volume&quot;:&quot;12&quot;,&quot;container-title-short&quot;:&quot;&quot;},&quot;isTemporary&quot;:false}]},{&quot;citationID&quot;:&quot;MENDELEY_CITATION_b4c44ef8-e2c2-413d-b321-be21b9ddc9bc&quot;,&quot;properties&quot;:{&quot;noteIndex&quot;:0},&quot;isEdited&quot;:false,&quot;manualOverride&quot;:{&quot;isManuallyOverridden&quot;:false,&quot;citeprocText&quot;:&quot;[9]&quot;,&quot;manualOverrideText&quot;:&quot;&quot;},&quot;citationTag&quot;:&quot;MENDELEY_CITATION_v3_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&quot;,&quot;citationItems&quot;:[{&quot;id&quot;:&quot;56e0ce24-6bd0-3ca6-ad59-9e041fc06482&quot;,&quot;itemData&quot;:{&quot;type&quot;:&quot;article-journal&quot;,&quot;id&quot;:&quot;56e0ce24-6bd0-3ca6-ad59-9e041fc06482&quot;,&quot;title&quot;:&quot;Syngas biomethanation: state‐of‐the‐art review and perspectives&quot;,&quot;author&quot;:[{&quot;family&quot;:&quot;Grimalt‐Alemany&quot;,&quot;given&quot;:&quot;Antonio&quot;,&quot;parse-names&quot;:false,&quot;dropping-particle&quot;:&quot;&quot;,&quot;non-dropping-particle&quot;:&quot;&quot;},{&quot;family&quot;:&quot;Skiadas&quot;,&quot;given&quot;:&quot;Ioannis&quot;,&quot;parse-names&quot;:false,&quot;dropping-particle&quot;:&quot;V.&quot;,&quot;non-dropping-particle&quot;:&quot;&quot;},{&quot;family&quot;:&quot;Gavala&quot;,&quot;given&quot;:&quot;Hariklia N.&quot;,&quot;parse-names&quot;:false,&quot;dropping-particle&quot;:&quot;&quot;,&quot;non-dropping-particle&quot;:&quot;&quot;}],&quot;container-title&quot;:&quot;Biofuels, Bioproducts and Biorefining&quot;,&quot;DOI&quot;:&quot;10.1002/bbb.1826&quot;,&quot;ISSN&quot;:&quot;1932-104X&quot;,&quot;issued&quot;:{&quot;date-parts&quot;:[[2018,1,10]]},&quot;page&quot;:&quot;139-158&quot;,&quot;abstract&quot;:&quot;&lt;p&gt;Significant research efforts are currently being made worldwide to develop more efficient biomethane production processes from a variety of waste streams. The biomethanation of biomass‐derived syngas can contribute to increasing the potential of methane production as it opens the way for the conversion of recalcitrant biomasses, generally not fully exploitable by anaerobic digestion systems. Additionally, this biological process presents several advantages over its analogous process of catalytic methanation such as the use of inexpensive biocatalysts, milder operational conditions, higher tolerance to the impurities of syngas, and higher product selectivity. However, there are still several challenges to be addressed for this technology to reach commercial stage. This work reviews the progress made over the last few years in syngas biomethanation processes in order to provide an overview of the current state of the art of this technology. The most relevant aspects determining the performance of syngas biomethanation processes are extensively discussed here, including microbial diversity and metabolic interactions in mixed microbial consortia, the influence of operating parameters and bioreactor designs, and the potential of modelling as a tool for the design and control of this bioprocess. © 2017 Society of Chemical Industry and John Wiley &amp;amp; Sons, Ltd&lt;/p&gt;&quot;,&quot;issue&quot;:&quot;1&quot;,&quot;volume&quot;:&quot;12&quot;,&quot;container-title-short&quot;:&quot;&quot;},&quot;isTemporary&quot;:false}]},{&quot;citationID&quot;:&quot;MENDELEY_CITATION_ff939063-8c0e-47e0-8f2f-be64fc1a6c11&quot;,&quot;properties&quot;:{&quot;noteIndex&quot;:0},&quot;isEdited&quot;:false,&quot;manualOverride&quot;:{&quot;isManuallyOverridden&quot;:false,&quot;citeprocText&quot;:&quot;[9], [11]&quot;,&quot;manualOverrideText&quot;:&quot;&quot;},&quot;citationTag&quot;:&quot;MENDELEY_CITATION_v3_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&quot;,&quot;citationItems&quot;:[{&quot;id&quot;:&quot;05ccdcdc-ca9b-3b81-a51a-6f8632295c3c&quot;,&quot;itemData&quot;:{&quot;type&quot;:&quot;article-journal&quot;,&quot;id&quot;:&quot;05ccdcdc-ca9b-3b81-a51a-6f8632295c3c&quot;,&quot;title&quot;:&quot;Techno-economic-environmental assessment of the integration of power-to-X and biogas utilization towards the production of electricity, hydrogen, methane and methanol&quot;,&quot;author&quot;:[{&quot;family&quot;:&quot;Moioli&quot;,&quot;given&quot;:&quot;Emanuele&quot;,&quot;parse-names&quot;:false,&quot;dropping-particle&quot;:&quot;&quot;,&quot;non-dropping-particle&quot;:&quot;&quot;},{&quot;family&quot;:&quot;Schildhauer&quot;,&quot;given&quot;:&quot;Tilman&quot;,&quot;parse-names&quot;:false,&quot;dropping-particle&quot;:&quot;&quot;,&quot;non-dropping-particle&quot;:&quot;&quot;}],&quot;container-title&quot;:&quot;Sustainable Energy &amp; Fuels&quot;,&quot;DOI&quot;:&quot;10.1039/D3SE00052D&quot;,&quot;ISSN&quot;:&quot;2398-4902&quot;,&quot;issued&quot;:{&quot;date-parts&quot;:[[2023]]},&quot;page&quot;:&quot;2690-2706&quot;,&quot;abstract&quot;:&quot;&lt;p&gt;Various routes for the valorisation of biogas towards methane and methanol and for electricity or hydrogen storage is assessed.&lt;/p&gt;&quot;,&quot;issue&quot;:&quot;11&quot;,&quot;volume&quot;:&quot;7&quot;,&quot;container-title-short&quot;:&quot;Sustain. Energy Fuels&quot;},&quot;isTemporary&quot;:false},{&quot;id&quot;:&quot;56e0ce24-6bd0-3ca6-ad59-9e041fc06482&quot;,&quot;itemData&quot;:{&quot;type&quot;:&quot;article-journal&quot;,&quot;id&quot;:&quot;56e0ce24-6bd0-3ca6-ad59-9e041fc06482&quot;,&quot;title&quot;:&quot;Syngas biomethanation: state‐of‐the‐art review and perspectives&quot;,&quot;author&quot;:[{&quot;family&quot;:&quot;Grimalt‐Alemany&quot;,&quot;given&quot;:&quot;Antonio&quot;,&quot;parse-names&quot;:false,&quot;dropping-particle&quot;:&quot;&quot;,&quot;non-dropping-particle&quot;:&quot;&quot;},{&quot;family&quot;:&quot;Skiadas&quot;,&quot;given&quot;:&quot;Ioannis&quot;,&quot;parse-names&quot;:false,&quot;dropping-particle&quot;:&quot;V.&quot;,&quot;non-dropping-particle&quot;:&quot;&quot;},{&quot;family&quot;:&quot;Gavala&quot;,&quot;given&quot;:&quot;Hariklia N.&quot;,&quot;parse-names&quot;:false,&quot;dropping-particle&quot;:&quot;&quot;,&quot;non-dropping-particle&quot;:&quot;&quot;}],&quot;container-title&quot;:&quot;Biofuels, Bioproducts and Biorefining&quot;,&quot;DOI&quot;:&quot;10.1002/bbb.1826&quot;,&quot;ISSN&quot;:&quot;1932-104X&quot;,&quot;issued&quot;:{&quot;date-parts&quot;:[[2018,1,10]]},&quot;page&quot;:&quot;139-158&quot;,&quot;abstract&quot;:&quot;&lt;p&gt;Significant research efforts are currently being made worldwide to develop more efficient biomethane production processes from a variety of waste streams. The biomethanation of biomass‐derived syngas can contribute to increasing the potential of methane production as it opens the way for the conversion of recalcitrant biomasses, generally not fully exploitable by anaerobic digestion systems. Additionally, this biological process presents several advantages over its analogous process of catalytic methanation such as the use of inexpensive biocatalysts, milder operational conditions, higher tolerance to the impurities of syngas, and higher product selectivity. However, there are still several challenges to be addressed for this technology to reach commercial stage. This work reviews the progress made over the last few years in syngas biomethanation processes in order to provide an overview of the current state of the art of this technology. The most relevant aspects determining the performance of syngas biomethanation processes are extensively discussed here, including microbial diversity and metabolic interactions in mixed microbial consortia, the influence of operating parameters and bioreactor designs, and the potential of modelling as a tool for the design and control of this bioprocess. © 2017 Society of Chemical Industry and John Wiley &amp;amp; Sons, Ltd&lt;/p&gt;&quot;,&quot;issue&quot;:&quot;1&quot;,&quot;volume&quot;:&quot;12&quot;,&quot;container-title-short&quot;:&quot;&quot;},&quot;isTemporary&quot;:false}]},{&quot;citationID&quot;:&quot;MENDELEY_CITATION_df48a702-88dc-4563-926b-cf46720d5673&quot;,&quot;properties&quot;:{&quot;noteIndex&quot;:0},&quot;isEdited&quot;:false,&quot;manualOverride&quot;:{&quot;isManuallyOverridden&quot;:false,&quot;citeprocText&quot;:&quot;[10]&quot;,&quot;manualOverrideText&quot;:&quot;&quot;},&quot;citationTag&quot;:&quot;MENDELEY_CITATION_v3_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&quot;,&quot;citationItems&quot;:[{&quot;id&quot;:&quot;aa2feb8d-c9bd-3781-bba9-d18156ecd3e8&quot;,&quot;itemData&quot;:{&quot;type&quot;:&quot;article-journal&quot;,&quot;id&quot;:&quot;aa2feb8d-c9bd-3781-bba9-d18156ecd3e8&quot;,&quot;title&quot;:&quot;Alternative sustainable routes to methanol production: Techno-economic and environmental assessment&quot;,&quot;author&quot;:[{&quot;family&quot;:&quot;Scomazzon&quot;,&quot;given&quot;:&quot;Marco&quot;,&quot;parse-names&quot;:false,&quot;dropping-particle&quot;:&quot;&quot;,&quot;non-dropping-particle&quot;:&quot;&quot;},{&quot;family&quot;:&quot;Barbera&quot;,&quot;given&quot;:&quot;Elena&quot;,&quot;parse-names&quot;:false,&quot;dropping-particle&quot;:&quot;&quot;,&quot;non-dropping-particle&quot;:&quot;&quot;},{&quot;family&quot;:&quot;Bezzo&quot;,&quot;given&quot;:&quot;Fabrizio&quot;,&quot;parse-names&quot;:false,&quot;dropping-particle&quot;:&quot;&quot;,&quot;non-dropping-particle&quot;:&quot;&quot;}],&quot;container-title&quot;:&quot;Journal of Environmental Chemical Engineering&quot;,&quot;DOI&quot;:&quot;10.1016/j.jece.2024.112674&quot;,&quot;ISSN&quot;:&quot;22133437&quot;,&quot;issued&quot;:{&quot;date-parts&quot;:[[2024,6]]},&quot;page&quot;:&quot;112674&quot;,&quot;issue&quot;:&quot;3&quot;,&quot;volume&quot;:&quot;12&quot;,&quot;container-title-short&quot;:&quot;J. Environ. Chem. Eng.&quot;},&quot;isTemporary&quot;:false}]},{&quot;citationID&quot;:&quot;MENDELEY_CITATION_8eef8f75-1f87-4dff-a071-68987bdeee67&quot;,&quot;properties&quot;:{&quot;noteIndex&quot;:0},&quot;isEdited&quot;:false,&quot;manualOverride&quot;:{&quot;isManuallyOverridden&quot;:false,&quot;citeprocText&quot;:&quot;[10]&quot;,&quot;manualOverrideText&quot;:&quot;&quot;},&quot;citationTag&quot;:&quot;MENDELEY_CITATION_v3_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&quot;,&quot;citationItems&quot;:[{&quot;id&quot;:&quot;aa2feb8d-c9bd-3781-bba9-d18156ecd3e8&quot;,&quot;itemData&quot;:{&quot;type&quot;:&quot;article-journal&quot;,&quot;id&quot;:&quot;aa2feb8d-c9bd-3781-bba9-d18156ecd3e8&quot;,&quot;title&quot;:&quot;Alternative sustainable routes to methanol production: Techno-economic and environmental assessment&quot;,&quot;author&quot;:[{&quot;family&quot;:&quot;Scomazzon&quot;,&quot;given&quot;:&quot;Marco&quot;,&quot;parse-names&quot;:false,&quot;dropping-particle&quot;:&quot;&quot;,&quot;non-dropping-particle&quot;:&quot;&quot;},{&quot;family&quot;:&quot;Barbera&quot;,&quot;given&quot;:&quot;Elena&quot;,&quot;parse-names&quot;:false,&quot;dropping-particle&quot;:&quot;&quot;,&quot;non-dropping-particle&quot;:&quot;&quot;},{&quot;family&quot;:&quot;Bezzo&quot;,&quot;given&quot;:&quot;Fabrizio&quot;,&quot;parse-names&quot;:false,&quot;dropping-particle&quot;:&quot;&quot;,&quot;non-dropping-particle&quot;:&quot;&quot;}],&quot;container-title&quot;:&quot;Journal of Environmental Chemical Engineering&quot;,&quot;DOI&quot;:&quot;10.1016/j.jece.2024.112674&quot;,&quot;ISSN&quot;:&quot;22133437&quot;,&quot;issued&quot;:{&quot;date-parts&quot;:[[2024,6]]},&quot;page&quot;:&quot;112674&quot;,&quot;issue&quot;:&quot;3&quot;,&quot;volume&quot;:&quot;12&quot;,&quot;container-title-short&quot;:&quot;J. Environ. Chem. Eng.&quot;},&quot;isTemporary&quot;:false}]},{&quot;citationID&quot;:&quot;MENDELEY_CITATION_8a70196d-3ff9-41c8-be39-fcf525822331&quot;,&quot;properties&quot;:{&quot;noteIndex&quot;:0},&quot;isEdited&quot;:false,&quot;manualOverride&quot;:{&quot;isManuallyOverridden&quot;:false,&quot;citeprocText&quot;:&quot;[12]&quot;,&quot;manualOverrideText&quot;:&quot;&quot;},&quot;citationTag&quot;:&quot;MENDELEY_CITATION_v3_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&quot;,&quot;citationItems&quot;:[{&quot;id&quot;:&quot;1310fab5-b88a-3b52-8d94-488c61413bed&quot;,&quot;itemData&quot;:{&quot;type&quot;:&quot;article-journal&quot;,&quot;id&quot;:&quot;1310fab5-b88a-3b52-8d94-488c61413bed&quot;,&quot;title&quot;:&quot;Techno-economic evaluation of biomass-to-fuels with solid-oxide electrolyzer&quot;,&quot;author&quot;:[{&quot;family&quot;:&quot;Zhang&quot;,&quot;given&quot;:&quot;Hanfei&quot;,&quot;parse-names&quot;:false,&quot;dropping-particle&quot;:&quot;&quot;,&quot;non-dropping-particle&quot;:&quot;&quot;},{&quot;family&quot;:&quot;Wang&quot;,&quot;given&quot;:&quot;Ligang&quot;,&quot;parse-names&quot;:false,&quot;dropping-particle&quot;:&quot;&quot;,&quot;non-dropping-particle&quot;:&quot;&quot;},{&quot;family&quot;:&quot;herle&quot;,&quot;given&quot;:&quot;Jan&quot;,&quot;parse-names&quot;:false,&quot;dropping-particle&quot;:&quot;&quot;,&quot;non-dropping-particle&quot;:&quot;Van&quot;},{&quot;family&quot;:&quot;Maréchal&quot;,&quot;given&quot;:&quot;François&quot;,&quot;parse-names&quot;:false,&quot;dropping-particle&quot;:&quot;&quot;,&quot;non-dropping-particle&quot;:&quot;&quot;},{&quot;family&quot;:&quot;Desideri&quot;,&quot;given&quot;:&quot;Umberto&quot;,&quot;parse-names&quot;:false,&quot;dropping-particle&quot;:&quot;&quot;,&quot;non-dropping-particle&quot;:&quot;&quot;}],&quot;container-title&quot;:&quot;Applied Energy&quot;,&quot;DOI&quot;:&quot;10.1016/j.apenergy.2020.115113&quot;,&quot;ISSN&quot;:&quot;03062619&quot;,&quot;issued&quot;:{&quot;date-parts&quot;:[[2020,7]]},&quot;page&quot;:&quot;115113&quot;,&quot;volume&quot;:&quot;270&quot;,&quot;container-title-short&quot;:&quot;Appl. Energy&quot;},&quot;isTemporary&quot;:false}]},{&quot;citationID&quot;:&quot;MENDELEY_CITATION_13304e8f-750e-4a08-8b1d-6a0f67b53a03&quot;,&quot;properties&quot;:{&quot;noteIndex&quot;:0},&quot;isEdited&quot;:false,&quot;manualOverride&quot;:{&quot;isManuallyOverridden&quot;:false,&quot;citeprocText&quot;:&quot;[13]&quot;,&quot;manualOverrideText&quot;:&quot;&quot;},&quot;citationTag&quot;:&quot;MENDELEY_CITATION_v3_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&quot;,&quot;citationItems&quot;:[{&quot;id&quot;:&quot;190b1267-cffd-3b0f-acfd-1ca4b15c3e7b&quot;,&quot;itemData&quot;:{&quot;type&quot;:&quot;article-journal&quot;,&quot;id&quot;:&quot;190b1267-cffd-3b0f-acfd-1ca4b15c3e7b&quot;,&quot;title&quot;:&quot;Techno-economic assessment of the impact of electrolysis technology on power-to-methanol processes&quot;,&quot;author&quot;:[{&quot;family&quot;:&quot;Walther&quot;,&quot;given&quot;:&quot;Aniko&quot;,&quot;parse-names&quot;:false,&quot;dropping-particle&quot;:&quot;&quot;,&quot;non-dropping-particle&quot;:&quot;&quot;},{&quot;family&quot;:&quot;Löning&quot;,&quot;given&quot;:&quot;Kai&quot;,&quot;parse-names&quot;:false,&quot;dropping-particle&quot;:&quot;&quot;,&quot;non-dropping-particle&quot;:&quot;&quot;},{&quot;family&quot;:&quot;Reichelt&quot;,&quot;given&quot;:&quot;Erik&quot;,&quot;parse-names&quot;:false,&quot;dropping-particle&quot;:&quot;&quot;,&quot;non-dropping-particle&quot;:&quot;&quot;}],&quot;container-title&quot;:&quot;International Journal of Hydrogen Energy&quot;,&quot;DOI&quot;:&quot;10.1016/j.ijhydene.2026.153394&quot;,&quot;ISSN&quot;:&quot;03603199&quot;,&quot;issued&quot;:{&quot;date-parts&quot;:[[2026,2]]},&quot;page&quot;:&quot;153394&quot;,&quot;volume&quot;:&quot;206&quot;,&quot;container-title-short&quot;:&quot;Int. J. Hydrogen Energy&quot;},&quot;isTemporary&quot;:false}]},{&quot;citationID&quot;:&quot;MENDELEY_CITATION_6a736241-62e6-4de8-9385-e50fe6f3ae30&quot;,&quot;properties&quot;:{&quot;noteIndex&quot;:0},&quot;isEdited&quot;:false,&quot;manualOverride&quot;:{&quot;isManuallyOverridden&quot;:false,&quot;citeprocText&quot;:&quot;[14], [15], [16]&quot;,&quot;manualOverrideText&quot;:&quot;&quot;},&quot;citationTag&quot;:&quot;MENDELEY_CITATION_v3_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&quot;,&quot;citationItems&quot;:[{&quot;id&quot;:&quot;d24a77c3-65ad-3302-bdd5-2971e96b5fe6&quot;,&quot;itemData&quot;:{&quot;type&quot;:&quot;article-journal&quot;,&quot;id&quot;:&quot;d24a77c3-65ad-3302-bdd5-2971e96b5fe6&quot;,&quot;title&quot;:&quot;Alkaline Water Electrolysis Powered by Renewable Energy: A Review&quot;,&quot;author&quot;:[{&quot;family&quot;:&quot;Brauns&quot;,&quot;given&quot;:&quot;Jörn&quot;,&quot;parse-names&quot;:false,&quot;dropping-particle&quot;:&quot;&quot;,&quot;non-dropping-particle&quot;:&quot;&quot;},{&quot;family&quot;:&quot;Turek&quot;,&quot;given&quot;:&quot;Thomas&quot;,&quot;parse-names&quot;:false,&quot;dropping-particle&quot;:&quot;&quot;,&quot;non-dropping-particle&quot;:&quot;&quot;}],&quot;container-title&quot;:&quot;Processes&quot;,&quot;DOI&quot;:&quot;10.3390/pr8020248&quot;,&quot;ISSN&quot;:&quot;2227-9717&quot;,&quot;issued&quot;:{&quot;date-parts&quot;:[[2020,2,21]]},&quot;page&quot;:&quot;248&quot;,&quot;abstract&quot;:&quot;&lt;p&gt;Alkaline water electrolysis is a key technology for large-scale hydrogen production powered by renewable energy. As conventional electrolyzers are designed for operation at fixed process conditions, the implementation of fluctuating and highly intermittent renewable energy is challenging. This contribution shows the recent state of system descriptions for alkaline water electrolysis and renewable energies, such as solar and wind power. Each component of a hydrogen energy system needs to be optimized to increase the operation time and system efficiency. Only in this way can hydrogen produced by electrolysis processes be competitive with the conventional path based on fossil energy sources. Conventional alkaline water electrolyzers show a limited part-load range due to an increased gas impurity at low power availability. As explosive mixtures of hydrogen and oxygen must be prevented, a safety shutdown is performed when reaching specific gas contamination. Furthermore, the cell voltage should be optimized to maintain a high efficiency. While photovoltaic panels can be directly coupled to alkaline water electrolyzers, wind turbines require suitable converters with additional losses. By combining alkaline water electrolysis with hydrogen storage tanks and fuel cells, power grid stabilization can be performed. As a consequence, the conventional spinning reserve can be reduced, which additionally lowers the carbon dioxide emissions.&lt;/p&gt;&quot;,&quot;issue&quot;:&quot;2&quot;,&quot;volume&quot;:&quot;8&quot;,&quot;container-title-short&quot;:&quot;&quot;},&quot;isTemporary&quot;:false},{&quot;id&quot;:&quot;fb305ddc-d308-30ab-8f80-782b0f32ba1c&quot;,&quot;itemData&quot;:{&quot;type&quot;:&quot;article-journal&quot;,&quot;id&quot;:&quot;fb305ddc-d308-30ab-8f80-782b0f32ba1c&quot;,&quot;title&quot;:&quot;Electrofuels for the transport sector: A review of production costs&quot;,&quot;author&quot;:[{&quot;family&quot;:&quot;Brynolf&quot;,&quot;given&quot;:&quot;Selma&quot;,&quot;parse-names&quot;:false,&quot;dropping-particle&quot;:&quot;&quot;,&quot;non-dropping-particle&quot;:&quot;&quot;},{&quot;family&quot;:&quot;Taljegard&quot;,&quot;given&quot;:&quot;Maria&quot;,&quot;parse-names&quot;:false,&quot;dropping-particle&quot;:&quot;&quot;,&quot;non-dropping-particle&quot;:&quot;&quot;},{&quot;family&quot;:&quot;Grahn&quot;,&quot;given&quot;:&quot;Maria&quot;,&quot;parse-names&quot;:false,&quot;dropping-particle&quot;:&quot;&quot;,&quot;non-dropping-particle&quot;:&quot;&quot;},{&quot;family&quot;:&quot;Hansson&quot;,&quot;given&quot;:&quot;Julia&quot;,&quot;parse-names&quot;:false,&quot;dropping-particle&quot;:&quot;&quot;,&quot;non-dropping-particle&quot;:&quot;&quot;}],&quot;container-title&quot;:&quot;Renewable and Sustainable Energy Reviews&quot;,&quot;DOI&quot;:&quot;10.1016/j.rser.2017.05.288&quot;,&quot;ISSN&quot;:&quot;13640321&quot;,&quot;issued&quot;:{&quot;date-parts&quot;:[[2018,1]]},&quot;page&quot;:&quot;1887-1905&quot;,&quot;volume&quot;:&quot;81&quot;,&quot;container-title-short&quot;:&quot;&quot;},&quot;isTemporary&quot;:false},{&quot;id&quot;:&quot;1b5f443a-d989-3c31-80b4-27044204c02c&quot;,&quot;itemData&quot;:{&quot;type&quot;:&quot;article-journal&quot;,&quot;id&quot;:&quot;1b5f443a-d989-3c31-80b4-27044204c02c&quot;,&quot;title&quot;:&quot;Hydrogen production by PEM water electrolysis – A review&quot;,&quot;author&quot;:[{&quot;family&quot;:&quot;Shiva Kumar&quot;,&quot;given&quot;:&quot;S.&quot;,&quot;parse-names&quot;:false,&quot;dropping-particle&quot;:&quot;&quot;,&quot;non-dropping-particle&quot;:&quot;&quot;},{&quot;family&quot;:&quot;Himabindu&quot;,&quot;given&quot;:&quot;V.&quot;,&quot;parse-names&quot;:false,&quot;dropping-particle&quot;:&quot;&quot;,&quot;non-dropping-particle&quot;:&quot;&quot;}],&quot;container-title&quot;:&quot;Materials Science for Energy Technologies&quot;,&quot;DOI&quot;:&quot;10.1016/j.mset.2019.03.002&quot;,&quot;ISSN&quot;:&quot;25892991&quot;,&quot;issued&quot;:{&quot;date-parts&quot;:[[2019,12]]},&quot;page&quot;:&quot;442-454&quot;,&quot;issue&quot;:&quot;3&quot;,&quot;volume&quot;:&quot;2&quot;,&quot;container-title-short&quot;:&quot;Mater. Sci. Energy Technol.&quot;},&quot;isTemporary&quot;:false}]},{&quot;citationID&quot;:&quot;MENDELEY_CITATION_e23df023-1b0e-4c7d-a81a-d4f5c2bec620&quot;,&quot;properties&quot;:{&quot;noteIndex&quot;:0},&quot;isEdited&quot;:false,&quot;manualOverride&quot;:{&quot;isManuallyOverridden&quot;:false,&quot;citeprocText&quot;:&quot;[17]&quot;,&quot;manualOverrideText&quot;:&quot;&quot;},&quot;citationTag&quot;:&quot;MENDELEY_CITATION_v3_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&quot;,&quot;citationItems&quot;:[{&quot;id&quot;:&quot;8c3b2930-cd0d-331a-8923-1e74c3142273&quot;,&quot;itemData&quot;:{&quot;type&quot;:&quot;article-journal&quot;,&quot;id&quot;:&quot;8c3b2930-cd0d-331a-8923-1e74c3142273&quot;,&quot;title&quot;:&quot;LCA and exergy-economic evaluation of a biogas-to-fuels system using CO2 hydrogenation and exhaust gas recycling&quot;,&quot;author&quot;:[{&quot;family&quot;:&quot;Ghiasirad&quot;,&quot;given&quot;:&quot;Hamed&quot;,&quot;parse-names&quot;:false,&quot;dropping-particle&quot;:&quot;&quot;,&quot;non-dropping-particle&quot;:&quot;&quot;},{&quot;family&quot;:&quot;Ebrahimian&quot;,&quot;given&quot;:&quot;Farinaz&quot;,&quot;parse-names&quot;:false,&quot;dropping-particle&quot;:&quot;&quot;,&quot;non-dropping-particle&quot;:&quot;&quot;},{&quot;family&quot;:&quot;Gholizadeh&quot;,&quot;given&quot;:&quot;Towhid&quot;,&quot;parse-names&quot;:false,&quot;dropping-particle&quot;:&quot;&quot;,&quot;non-dropping-particle&quot;:&quot;&quot;},{&quot;family&quot;:&quot;Mohammadi&quot;,&quot;given&quot;:&quot;Ali&quot;,&quot;parse-names&quot;:false,&quot;dropping-particle&quot;:&quot;&quot;,&quot;non-dropping-particle&quot;:&quot;&quot;},{&quot;family&quot;:&quot;Mirmasoumi&quot;,&quot;given&quot;:&quot;Siamak&quot;,&quot;parse-names&quot;:false,&quot;dropping-particle&quot;:&quot;&quot;,&quot;non-dropping-particle&quot;:&quot;&quot;},{&quot;family&quot;:&quot;Saray&quot;,&quot;given&quot;:&quot;Rahim Khoshbakhti&quot;,&quot;parse-names&quot;:false,&quot;dropping-particle&quot;:&quot;&quot;,&quot;non-dropping-particle&quot;:&quot;&quot;},{&quot;family&quot;:&quot;Skorek-Osikowska&quot;,&quot;given&quot;:&quot;Anna&quot;,&quot;parse-names&quot;:false,&quot;dropping-particle&quot;:&quot;&quot;,&quot;non-dropping-particle&quot;:&quot;&quot;}],&quot;container-title&quot;:&quot;Energy Conversion and Management: X&quot;,&quot;DOI&quot;:&quot;10.1016/j.ecmx.2025.100897&quot;,&quot;ISSN&quot;:&quot;25901745&quot;,&quot;issued&quot;:{&quot;date-parts&quot;:[[2025,4]]},&quot;page&quot;:&quot;100897&quot;,&quot;volume&quot;:&quot;26&quot;,&quot;container-title-short&quot;:&quot;&quot;},&quot;isTemporary&quot;:false}]},{&quot;citationID&quot;:&quot;MENDELEY_CITATION_f5902acf-3f1b-4f47-a295-09ff9652d7b2&quot;,&quot;properties&quot;:{&quot;noteIndex&quot;:0},&quot;isEdited&quot;:false,&quot;manualOverride&quot;:{&quot;isManuallyOverridden&quot;:false,&quot;citeprocText&quot;:&quot;[18]&quot;,&quot;manualOverrideText&quot;:&quot;&quot;},&quot;citationTag&quot;:&quot;MENDELEY_CITATION_v3_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&quot;,&quot;citationItems&quot;:[{&quot;id&quot;:&quot;cb817469-f165-3488-91d4-ffe692974354&quot;,&quot;itemData&quot;:{&quot;type&quot;:&quot;article-journal&quot;,&quot;id&quot;:&quot;cb817469-f165-3488-91d4-ffe692974354&quot;,&quot;title&quot;:&quot;Alternative sustainable routes to methanol production: Techno-economic and environmental assessment&quot;,&quot;author&quot;:[{&quot;family&quot;:&quot;Scomazzon&quot;,&quot;given&quot;:&quot;Marco&quot;,&quot;parse-names&quot;:false,&quot;dropping-particle&quot;:&quot;&quot;,&quot;non-dropping-particle&quot;:&quot;&quot;},{&quot;family&quot;:&quot;Barbera&quot;,&quot;given&quot;:&quot;Elena&quot;,&quot;parse-names&quot;:false,&quot;dropping-particle&quot;:&quot;&quot;,&quot;non-dropping-particle&quot;:&quot;&quot;},{&quot;family&quot;:&quot;Bezzo&quot;,&quot;given&quot;:&quot;Fabrizio&quot;,&quot;parse-names&quot;:false,&quot;dropping-particle&quot;:&quot;&quot;,&quot;non-dropping-particle&quot;:&quot;&quot;}],&quot;container-title&quot;:&quot;Journal of Environmental Chemical Engineering&quot;,&quot;DOI&quot;:&quot;10.1016/j.jece.2024.112674&quot;,&quot;ISSN&quot;:&quot;22133437&quot;,&quot;issued&quot;:{&quot;date-parts&quot;:[[2024,6]]},&quot;page&quot;:&quot;112674&quot;,&quot;issue&quot;:&quot;3&quot;,&quot;volume&quot;:&quot;12&quot;,&quot;container-title-short&quot;:&quot;J. Environ. Chem. Eng.&quot;},&quot;isTemporary&quot;:false}]},{&quot;citationID&quot;:&quot;MENDELEY_CITATION_50e16af0-91a6-43f9-862e-188051a6076b&quot;,&quot;properties&quot;:{&quot;noteIndex&quot;:0},&quot;isEdited&quot;:false,&quot;manualOverride&quot;:{&quot;isManuallyOverridden&quot;:false,&quot;citeprocText&quot;:&quot;[17]&quot;,&quot;manualOverrideText&quot;:&quot;&quot;},&quot;citationTag&quot;:&quot;MENDELEY_CITATION_v3_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&quot;,&quot;citationItems&quot;:[{&quot;id&quot;:&quot;8c3b2930-cd0d-331a-8923-1e74c3142273&quot;,&quot;itemData&quot;:{&quot;type&quot;:&quot;article-journal&quot;,&quot;id&quot;:&quot;8c3b2930-cd0d-331a-8923-1e74c3142273&quot;,&quot;title&quot;:&quot;LCA and exergy-economic evaluation of a biogas-to-fuels system using CO2 hydrogenation and exhaust gas recycling&quot;,&quot;author&quot;:[{&quot;family&quot;:&quot;Ghiasirad&quot;,&quot;given&quot;:&quot;Hamed&quot;,&quot;parse-names&quot;:false,&quot;dropping-particle&quot;:&quot;&quot;,&quot;non-dropping-particle&quot;:&quot;&quot;},{&quot;family&quot;:&quot;Ebrahimian&quot;,&quot;given&quot;:&quot;Farinaz&quot;,&quot;parse-names&quot;:false,&quot;dropping-particle&quot;:&quot;&quot;,&quot;non-dropping-particle&quot;:&quot;&quot;},{&quot;family&quot;:&quot;Gholizadeh&quot;,&quot;given&quot;:&quot;Towhid&quot;,&quot;parse-names&quot;:false,&quot;dropping-particle&quot;:&quot;&quot;,&quot;non-dropping-particle&quot;:&quot;&quot;},{&quot;family&quot;:&quot;Mohammadi&quot;,&quot;given&quot;:&quot;Ali&quot;,&quot;parse-names&quot;:false,&quot;dropping-particle&quot;:&quot;&quot;,&quot;non-dropping-particle&quot;:&quot;&quot;},{&quot;family&quot;:&quot;Mirmasoumi&quot;,&quot;given&quot;:&quot;Siamak&quot;,&quot;parse-names&quot;:false,&quot;dropping-particle&quot;:&quot;&quot;,&quot;non-dropping-particle&quot;:&quot;&quot;},{&quot;family&quot;:&quot;Saray&quot;,&quot;given&quot;:&quot;Rahim Khoshbakhti&quot;,&quot;parse-names&quot;:false,&quot;dropping-particle&quot;:&quot;&quot;,&quot;non-dropping-particle&quot;:&quot;&quot;},{&quot;family&quot;:&quot;Skorek-Osikowska&quot;,&quot;given&quot;:&quot;Anna&quot;,&quot;parse-names&quot;:false,&quot;dropping-particle&quot;:&quot;&quot;,&quot;non-dropping-particle&quot;:&quot;&quot;}],&quot;container-title&quot;:&quot;Energy Conversion and Management: X&quot;,&quot;DOI&quot;:&quot;10.1016/j.ecmx.2025.100897&quot;,&quot;ISSN&quot;:&quot;25901745&quot;,&quot;issued&quot;:{&quot;date-parts&quot;:[[2025,4]]},&quot;page&quot;:&quot;100897&quot;,&quot;volume&quot;:&quot;26&quot;,&quot;container-title-short&quot;:&quot;&quot;},&quot;isTemporary&quot;:false}]},{&quot;citationID&quot;:&quot;MENDELEY_CITATION_f6f42889-26df-4dbb-987f-6da6adaab487&quot;,&quot;properties&quot;:{&quot;noteIndex&quot;:0},&quot;isEdited&quot;:false,&quot;manualOverride&quot;:{&quot;isManuallyOverridden&quot;:false,&quot;citeprocText&quot;:&quot;[19]&quot;,&quot;manualOverrideText&quot;:&quot;&quot;},&quot;citationTag&quot;:&quot;MENDELEY_CITATION_v3_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&quot;,&quot;citationItems&quot;:[{&quot;id&quot;:&quot;28a53769-a0e5-3c5a-80f0-90f7301702eb&quot;,&quot;itemData&quot;:{&quot;type&quot;:&quot;article-journal&quot;,&quot;id&quot;:&quot;28a53769-a0e5-3c5a-80f0-90f7301702eb&quot;,&quot;title&quot;:&quot;Techno-economic-environmental assessment of the integration of power-to-X and biogas utilization towards the production of electricity, hydrogen, methane and methanol&quot;,&quot;author&quot;:[{&quot;family&quot;:&quot;Moioli&quot;,&quot;given&quot;:&quot;Emanuele&quot;,&quot;parse-names&quot;:false,&quot;dropping-particle&quot;:&quot;&quot;,&quot;non-dropping-particle&quot;:&quot;&quot;},{&quot;family&quot;:&quot;Schildhauer&quot;,&quot;given&quot;:&quot;Tilman&quot;,&quot;parse-names&quot;:false,&quot;dropping-particle&quot;:&quot;&quot;,&quot;non-dropping-particle&quot;:&quot;&quot;}],&quot;container-title&quot;:&quot;Sustainable Energy &amp; Fuels&quot;,&quot;DOI&quot;:&quot;10.1039/D3SE00052D&quot;,&quot;ISSN&quot;:&quot;2398-4902&quot;,&quot;issued&quot;:{&quot;date-parts&quot;:[[2023]]},&quot;page&quot;:&quot;2690-2706&quot;,&quot;abstract&quot;:&quot;&lt;p&gt;Various routes for the valorisation of biogas towards methane and methanol and for electricity or hydrogen storage is assessed.&lt;/p&gt;&quot;,&quot;issue&quot;:&quot;11&quot;,&quot;volume&quot;:&quot;7&quot;,&quot;container-title-short&quot;:&quot;Sustain. Energy Fuels&quot;},&quot;isTemporary&quot;:false}]},{&quot;citationID&quot;:&quot;MENDELEY_CITATION_8e42163d-fd20-4d53-837d-ec79437e85ea&quot;,&quot;properties&quot;:{&quot;noteIndex&quot;:0},&quot;isEdited&quot;:false,&quot;manualOverride&quot;:{&quot;isManuallyOverridden&quot;:false,&quot;citeprocText&quot;:&quot;[20]&quot;,&quot;manualOverrideText&quot;:&quot;&quot;},&quot;citationTag&quot;:&quot;MENDELEY_CITATION_v3_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&quot;,&quot;citationItems&quot;:[{&quot;id&quot;:&quot;104cea19-ccc6-37e7-9959-f839fd356eec&quot;,&quot;itemData&quot;:{&quot;type&quot;:&quot;article-journal&quot;,&quot;id&quot;:&quot;104cea19-ccc6-37e7-9959-f839fd356eec&quot;,&quot;title&quot;:&quot;Improving carbon efficiency for an advanced Biomass-to-Liquid process using hydrogen and oxygen from electrolysis&quot;,&quot;author&quot;:[{&quot;family&quot;:&quot;Dossow&quot;,&quot;given&quot;:&quot;Marcel&quot;,&quot;parse-names&quot;:false,&quot;dropping-particle&quot;:&quot;&quot;,&quot;non-dropping-particle&quot;:&quot;&quot;},{&quot;family&quot;:&quot;Dieterich&quot;,&quot;given&quot;:&quot;Vincent&quot;,&quot;parse-names&quot;:false,&quot;dropping-particle&quot;:&quot;&quot;,&quot;non-dropping-particle&quot;:&quot;&quot;},{&quot;family&quot;:&quot;Hanel&quot;,&quot;given&quot;:&quot;Andreas&quot;,&quot;parse-names&quot;:false,&quot;dropping-particle&quot;:&quot;&quot;,&quot;non-dropping-particle&quot;:&quot;&quot;},{&quot;family&quot;:&quot;Spliethoff&quot;,&quot;given&quot;:&quot;Hartmut&quot;,&quot;parse-names&quot;:false,&quot;dropping-particle&quot;:&quot;&quot;,&quot;non-dropping-particle&quot;:&quot;&quot;},{&quot;family&quot;:&quot;Fendt&quot;,&quot;given&quot;:&quot;Sebastian&quot;,&quot;parse-names&quot;:false,&quot;dropping-particle&quot;:&quot;&quot;,&quot;non-dropping-particle&quot;:&quot;&quot;}],&quot;container-title&quot;:&quot;Renewable and Sustainable Energy Reviews&quot;,&quot;DOI&quot;:&quot;10.1016/j.rser.2021.111670&quot;,&quot;ISSN&quot;:&quot;13640321&quot;,&quot;issued&quot;:{&quot;date-parts&quot;:[[2021,12]]},&quot;page&quot;:&quot;111670&quot;,&quot;volume&quot;:&quot;152&quot;,&quot;container-title-short&quot;:&quot;&quot;},&quot;isTemporary&quot;:false}]},{&quot;citationID&quot;:&quot;MENDELEY_CITATION_88d0ffc1-318e-4fe5-b886-2a172eaebfef&quot;,&quot;properties&quot;:{&quot;noteIndex&quot;:0},&quot;isEdited&quot;:false,&quot;manualOverride&quot;:{&quot;isManuallyOverridden&quot;:false,&quot;citeprocText&quot;:&quot;[21]&quot;,&quot;manualOverrideText&quot;:&quot;&quot;},&quot;citationTag&quot;:&quot;MENDELEY_CITATION_v3_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&quot;,&quot;citationItems&quot;:[{&quot;id&quot;:&quot;70edddc8-ee03-31fd-86e6-6cf7a4858b7a&quot;,&quot;itemData&quot;:{&quot;type&quot;:&quot;article-journal&quot;,&quot;id&quot;:&quot;70edddc8-ee03-31fd-86e6-6cf7a4858b7a&quot;,&quot;title&quot;:&quot;Flexible Power and Biomass-To-Methanol Plants With Different Gasification Technologies&quot;,&quot;author&quot;:[{&quot;family&quot;:&quot;Poluzzi&quot;,&quot;given&quot;:&quot;A.&quot;,&quot;parse-names&quot;:false,&quot;dropping-particle&quot;:&quot;&quot;,&quot;non-dropping-particle&quot;:&quot;&quot;},{&quot;family&quot;:&quot;Guandalini&quot;,&quot;given&quot;:&quot;G.&quot;,&quot;parse-names&quot;:false,&quot;dropping-particle&quot;:&quot;&quot;,&quot;non-dropping-particle&quot;:&quot;&quot;},{&quot;family&quot;:&quot;Guffanti&quot;,&quot;given&quot;:&quot;S.&quot;,&quot;parse-names&quot;:false,&quot;dropping-particle&quot;:&quot;&quot;,&quot;non-dropping-particle&quot;:&quot;&quot;},{&quot;family&quot;:&quot;Martinelli&quot;,&quot;given&quot;:&quot;M.&quot;,&quot;parse-names&quot;:false,&quot;dropping-particle&quot;:&quot;&quot;,&quot;non-dropping-particle&quot;:&quot;&quot;},{&quot;family&quot;:&quot;Moioli&quot;,&quot;given&quot;:&quot;S.&quot;,&quot;parse-names&quot;:false,&quot;dropping-particle&quot;:&quot;&quot;,&quot;non-dropping-particle&quot;:&quot;&quot;},{&quot;family&quot;:&quot;Huttenhuis&quot;,&quot;given&quot;:&quot;P.&quot;,&quot;parse-names&quot;:false,&quot;dropping-particle&quot;:&quot;&quot;,&quot;non-dropping-particle&quot;:&quot;&quot;},{&quot;family&quot;:&quot;Rexwinkel&quot;,&quot;given&quot;:&quot;G.&quot;,&quot;parse-names&quot;:false,&quot;dropping-particle&quot;:&quot;&quot;,&quot;non-dropping-particle&quot;:&quot;&quot;},{&quot;family&quot;:&quot;Palonen&quot;,&quot;given&quot;:&quot;J.&quot;,&quot;parse-names&quot;:false,&quot;dropping-particle&quot;:&quot;&quot;,&quot;non-dropping-particle&quot;:&quot;&quot;},{&quot;family&quot;:&quot;Martelli&quot;,&quot;given&quot;:&quot;E.&quot;,&quot;parse-names&quot;:false,&quot;dropping-particle&quot;:&quot;&quot;,&quot;non-dropping-particle&quot;:&quot;&quot;},{&quot;family&quot;:&quot;Groppi&quot;,&quot;given&quot;:&quot;G.&quot;,&quot;parse-names&quot;:false,&quot;dropping-particle&quot;:&quot;&quot;,&quot;non-dropping-particle&quot;:&quot;&quot;},{&quot;family&quot;:&quot;Romano&quot;,&quot;given&quot;:&quot;M. C.&quot;,&quot;parse-names&quot;:false,&quot;dropping-particle&quot;:&quot;&quot;,&quot;non-dropping-particle&quot;:&quot;&quot;}],&quot;container-title&quot;:&quot;Frontiers in Energy Research&quot;,&quot;DOI&quot;:&quot;10.3389/fenrg.2021.795673&quot;,&quot;ISSN&quot;:&quot;2296-598X&quot;,&quot;issued&quot;:{&quot;date-parts&quot;:[[2022,1,27]]},&quot;abstract&quot;:&quot;&lt;p&gt; The competitiveness of biofuels may be increased by integrating biomass gasification plants with electrolysis units, which generate hydrogen to be combined with carbon-rich syngas. This option allows increasing the yield of the final product by retaining a higher amount of biogenic carbon and improving the resilience of the energy sector by favoring electric grid services and sector coupling. This article illustrates a techno-economic comparative analysis of three flexible power and biomass to methanol plants based on different gasification technologies: direct gasification, indirect gasification, and sorption-enhanced gasification. The design and operational criteria of each plant are conceived to operate both without green hydrogen addition (baseline mode) and with hydrogen addition (enhanced mode), following an intermittent use of the electrolysis system, which is turned on when the electricity price allows an economically viable hydrogen production. The methanol production plants include a gasification section, syngas cleaning, conditioning and compression section, methanol synthesis and purification, and heat recovery steam cycle to be flexibly operated. Due to the high oxygen demand in the gasifier, the direct gasification-based plant obtains a great advantage to be operated between a minimum load to satisfy the oxygen demand at high electricity prices and a maximum load to maximize methanol production at low electricity prices. This allows avoiding large oxygen storages with significant benefits for Capex and safety issues. The analysis reports specific fixed-capital investments between 1823 and 2048 €/kW of methanol output in the enhanced operation and LCOFs between 29.7 and 31.7 €/GJ &lt;sub&gt;LHV&lt;/sub&gt; . Economic advantages may be derived from a decrease in the electrolysis capital investment, especially for the direct gasification-based plants, which employ the greatest sized electrolyzer. Methanol breakeven selling prices range between 545 and 582 €/t with the 2019 reference Denmark electricity price curve and between 484 and 535 €/t with an assumed modified electricity price curve of a future energy mix with increased penetration of intermittent renewables. &lt;/p&gt;&quot;,&quot;volume&quot;:&quot;9&quot;,&quot;container-title-short&quot;:&quot;Front. Energy Res.&quot;},&quot;isTemporary&quot;:false}]},{&quot;citationID&quot;:&quot;MENDELEY_CITATION_e06c8150-ca7f-4bb6-8b73-8555f96f90d4&quot;,&quot;properties&quot;:{&quot;noteIndex&quot;:0},&quot;isEdited&quot;:false,&quot;manualOverride&quot;:{&quot;isManuallyOverridden&quot;:false,&quot;citeprocText&quot;:&quot;[22]&quot;,&quot;manualOverrideText&quot;:&quot;&quot;},&quot;citationTag&quot;:&quot;MENDELEY_CITATION_v3_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&quot;,&quot;citationItems&quot;:[{&quot;id&quot;:&quot;a36d5e43-f1b3-3f4c-8cdc-446f28ab3924&quot;,&quot;itemData&quot;:{&quot;type&quot;:&quot;article-journal&quot;,&quot;id&quot;:&quot;a36d5e43-f1b3-3f4c-8cdc-446f28ab3924&quot;,&quot;title&quot;:&quot;Benefits of Hybrid Production of E-Methanol in Connection with Biomass Gasification&quot;,&quot;author&quot;:[{&quot;family&quot;:&quot;Anetjärvi&quot;,&quot;given&quot;:&quot;Eemeli&quot;,&quot;parse-names&quot;:false,&quot;dropping-particle&quot;:&quot;&quot;,&quot;non-dropping-particle&quot;:&quot;&quot;},{&quot;family&quot;:&quot;Vakkilainen&quot;,&quot;given&quot;:&quot;Esa&quot;,&quot;parse-names&quot;:false,&quot;dropping-particle&quot;:&quot;&quot;,&quot;non-dropping-particle&quot;:&quot;&quot;},{&quot;family&quot;:&quot;Melin&quot;,&quot;given&quot;:&quot;Kristian&quot;,&quot;parse-names&quot;:false,&quot;dropping-particle&quot;:&quot;&quot;,&quot;non-dropping-particle&quot;:&quot;&quot;}],&quot;container-title&quot;:&quot;SSRN Electronic Journal&quot;,&quot;DOI&quot;:&quot;10.2139/ssrn.4184476&quot;,&quot;ISSN&quot;:&quot;1556-5068&quot;,&quot;issued&quot;:{&quot;date-parts&quot;:[[2022]]},&quot;container-title-short&quot;:&quot;&quot;},&quot;isTemporary&quot;:false}]},{&quot;citationID&quot;:&quot;MENDELEY_CITATION_cd84c5ed-f67d-47d0-afce-d099ac46029a&quot;,&quot;properties&quot;:{&quot;noteIndex&quot;:0},&quot;isEdited&quot;:false,&quot;manualOverride&quot;:{&quot;isManuallyOverridden&quot;:false,&quot;citeprocText&quot;:&quot;[23]&quot;,&quot;manualOverrideText&quot;:&quot;&quot;},&quot;citationTag&quot;:&quot;MENDELEY_CITATION_v3_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&quot;,&quot;citationItems&quot;:[{&quot;id&quot;:&quot;048c482b-30be-34eb-bade-6c65560bb00c&quot;,&quot;itemData&quot;:{&quot;type&quot;:&quot;article-journal&quot;,&quot;id&quot;:&quot;048c482b-30be-34eb-bade-6c65560bb00c&quot;,&quot;title&quot;:&quot;Techno-economic optimization of biomass-to-methanol with solid-oxide electrolyzer&quot;,&quot;author&quot;:[{&quot;family&quot;:&quot;Zhang&quot;,&quot;given&quot;:&quot;Hanfei&quot;,&quot;parse-names&quot;:false,&quot;dropping-particle&quot;:&quot;&quot;,&quot;non-dropping-particle&quot;:&quot;&quot;},{&quot;family&quot;:&quot;Wang&quot;,&quot;given&quot;:&quot;Ligang&quot;,&quot;parse-names&quot;:false,&quot;dropping-particle&quot;:&quot;&quot;,&quot;non-dropping-particle&quot;:&quot;&quot;},{&quot;family&quot;:&quot;Pérez-Fortes&quot;,&quot;given&quot;:&quot;Mar&quot;,&quot;parse-names&quot;:false,&quot;dropping-particle&quot;:&quot;&quot;,&quot;non-dropping-particle&quot;:&quot;&quot;},{&quot;family&quot;:&quot;herle&quot;,&quot;given&quot;:&quot;Jan&quot;,&quot;parse-names&quot;:false,&quot;dropping-particle&quot;:&quot;&quot;,&quot;non-dropping-particle&quot;:&quot;Van&quot;},{&quot;family&quot;:&quot;Maréchal&quot;,&quot;given&quot;:&quot;François&quot;,&quot;parse-names&quot;:false,&quot;dropping-particle&quot;:&quot;&quot;,&quot;non-dropping-particle&quot;:&quot;&quot;},{&quot;family&quot;:&quot;Desideri&quot;,&quot;given&quot;:&quot;Umberto&quot;,&quot;parse-names&quot;:false,&quot;dropping-particle&quot;:&quot;&quot;,&quot;non-dropping-particle&quot;:&quot;&quot;}],&quot;container-title&quot;:&quot;Applied Energy&quot;,&quot;DOI&quot;:&quot;10.1016/j.apenergy.2019.114071&quot;,&quot;ISSN&quot;:&quot;03062619&quot;,&quot;issued&quot;:{&quot;date-parts&quot;:[[2020,1]]},&quot;page&quot;:&quot;114071&quot;,&quot;volume&quot;:&quot;258&quot;,&quot;container-title-short&quot;:&quot;Appl. Energy&quot;},&quot;isTemporary&quot;:false}]},{&quot;citationID&quot;:&quot;MENDELEY_CITATION_42ff2c48-5158-4a41-83ab-c9fb9e7d73b7&quot;,&quot;properties&quot;:{&quot;noteIndex&quot;:0},&quot;isEdited&quot;:false,&quot;manualOverride&quot;:{&quot;isManuallyOverridden&quot;:false,&quot;citeprocText&quot;:&quot;[24]&quot;,&quot;manualOverrideText&quot;:&quot;&quot;},&quot;citationTag&quot;:&quot;MENDELEY_CITATION_v3_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&quot;,&quot;citationItems&quot;:[{&quot;id&quot;:&quot;ded22db1-0dce-3c1b-981f-fd5847a7cce1&quot;,&quot;itemData&quot;:{&quot;type&quot;:&quot;article-journal&quot;,&quot;id&quot;:&quot;ded22db1-0dce-3c1b-981f-fd5847a7cce1&quot;,&quot;title&quot;:&quot;Flexible Power &amp;amp; Biomass-to-Methanol plants: Design optimization and economic viability of the electrolysis integration&quot;,&quot;author&quot;:[{&quot;family&quot;:&quot;Poluzzi&quot;,&quot;given&quot;:&quot;Alessandro&quot;,&quot;parse-names&quot;:false,&quot;dropping-particle&quot;:&quot;&quot;,&quot;non-dropping-particle&quot;:&quot;&quot;},{&quot;family&quot;:&quot;Guandalini&quot;,&quot;given&quot;:&quot;Giulio&quot;,&quot;parse-names&quot;:false,&quot;dropping-particle&quot;:&quot;&quot;,&quot;non-dropping-particle&quot;:&quot;&quot;},{&quot;family&quot;:&quot;Guffanti&quot;,&quot;given&quot;:&quot;Simone&quot;,&quot;parse-names&quot;:false,&quot;dropping-particle&quot;:&quot;&quot;,&quot;non-dropping-particle&quot;:&quot;&quot;},{&quot;family&quot;:&quot;Elsido&quot;,&quot;given&quot;:&quot;Cristina&quot;,&quot;parse-names&quot;:false,&quot;dropping-particle&quot;:&quot;&quot;,&quot;non-dropping-particle&quot;:&quot;&quot;},{&quot;family&quot;:&quot;Moioli&quot;,&quot;given&quot;:&quot;Stefania&quot;,&quot;parse-names&quot;:false,&quot;dropping-particle&quot;:&quot;&quot;,&quot;non-dropping-particle&quot;:&quot;&quot;},{&quot;family&quot;:&quot;Huttenhuis&quot;,&quot;given&quot;:&quot;Patrick&quot;,&quot;parse-names&quot;:false,&quot;dropping-particle&quot;:&quot;&quot;,&quot;non-dropping-particle&quot;:&quot;&quot;},{&quot;family&quot;:&quot;Rexwinkel&quot;,&quot;given&quot;:&quot;Glenn&quot;,&quot;parse-names&quot;:false,&quot;dropping-particle&quot;:&quot;&quot;,&quot;non-dropping-particle&quot;:&quot;&quot;},{&quot;family&quot;:&quot;Martelli&quot;,&quot;given&quot;:&quot;Emanuele&quot;,&quot;parse-names&quot;:false,&quot;dropping-particle&quot;:&quot;&quot;,&quot;non-dropping-particle&quot;:&quot;&quot;},{&quot;family&quot;:&quot;Groppi&quot;,&quot;given&quot;:&quot;Gianpiero&quot;,&quot;parse-names&quot;:false,&quot;dropping-particle&quot;:&quot;&quot;,&quot;non-dropping-particle&quot;:&quot;&quot;},{&quot;family&quot;:&quot;Romano&quot;,&quot;given&quot;:&quot;Matteo C.&quot;,&quot;parse-names&quot;:false,&quot;dropping-particle&quot;:&quot;&quot;,&quot;non-dropping-particle&quot;:&quot;&quot;}],&quot;container-title&quot;:&quot;Fuel&quot;,&quot;DOI&quot;:&quot;10.1016/j.fuel.2021.122113&quot;,&quot;ISSN&quot;:&quot;00162361&quot;,&quot;issued&quot;:{&quot;date-parts&quot;:[[2022,2]]},&quot;page&quot;:&quot;122113&quot;,&quot;volume&quot;:&quot;310&quot;,&quot;container-title-short&quot;:&quot;&quot;},&quot;isTemporary&quot;:false}]},{&quot;citationID&quot;:&quot;MENDELEY_CITATION_a84a64c2-5cd9-45b5-8dd3-eed0901210e0&quot;,&quot;properties&quot;:{&quot;noteIndex&quot;:0},&quot;isEdited&quot;:false,&quot;manualOverride&quot;:{&quot;isManuallyOverridden&quot;:false,&quot;citeprocText&quot;:&quot;[25]&quot;,&quot;manualOverrideText&quot;:&quot;&quot;},&quot;citationTag&quot;:&quot;MENDELEY_CITATION_v3_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&quot;,&quot;citationItems&quot;:[{&quot;id&quot;:&quot;a332ee91-b343-3289-860a-430557bbc5fa&quot;,&quot;itemData&quot;:{&quot;type&quot;:&quot;article-journal&quot;,&quot;id&quot;:&quot;a332ee91-b343-3289-860a-430557bbc5fa&quot;,&quot;title&quot;:&quot;Flexible Power &amp;amp; Biomass-to-Methanol plants: Design optimization and economic viability of the electrolysis integration&quot;,&quot;author&quot;:[{&quot;family&quot;:&quot;Poluzzi&quot;,&quot;given&quot;:&quot;Alessandro&quot;,&quot;parse-names&quot;:false,&quot;dropping-particle&quot;:&quot;&quot;,&quot;non-dropping-particle&quot;:&quot;&quot;},{&quot;family&quot;:&quot;Guandalini&quot;,&quot;given&quot;:&quot;Giulio&quot;,&quot;parse-names&quot;:false,&quot;dropping-particle&quot;:&quot;&quot;,&quot;non-dropping-particle&quot;:&quot;&quot;},{&quot;family&quot;:&quot;Guffanti&quot;,&quot;given&quot;:&quot;Simone&quot;,&quot;parse-names&quot;:false,&quot;dropping-particle&quot;:&quot;&quot;,&quot;non-dropping-particle&quot;:&quot;&quot;},{&quot;family&quot;:&quot;Elsido&quot;,&quot;given&quot;:&quot;Cristina&quot;,&quot;parse-names&quot;:false,&quot;dropping-particle&quot;:&quot;&quot;,&quot;non-dropping-particle&quot;:&quot;&quot;},{&quot;family&quot;:&quot;Moioli&quot;,&quot;given&quot;:&quot;Stefania&quot;,&quot;parse-names&quot;:false,&quot;dropping-particle&quot;:&quot;&quot;,&quot;non-dropping-particle&quot;:&quot;&quot;},{&quot;family&quot;:&quot;Huttenhuis&quot;,&quot;given&quot;:&quot;Patrick&quot;,&quot;parse-names&quot;:false,&quot;dropping-particle&quot;:&quot;&quot;,&quot;non-dropping-particle&quot;:&quot;&quot;},{&quot;family&quot;:&quot;Rexwinkel&quot;,&quot;given&quot;:&quot;Glenn&quot;,&quot;parse-names&quot;:false,&quot;dropping-particle&quot;:&quot;&quot;,&quot;non-dropping-particle&quot;:&quot;&quot;},{&quot;family&quot;:&quot;Martelli&quot;,&quot;given&quot;:&quot;Emanuele&quot;,&quot;parse-names&quot;:false,&quot;dropping-particle&quot;:&quot;&quot;,&quot;non-dropping-particle&quot;:&quot;&quot;},{&quot;family&quot;:&quot;Groppi&quot;,&quot;given&quot;:&quot;Gianpiero&quot;,&quot;parse-names&quot;:false,&quot;dropping-particle&quot;:&quot;&quot;,&quot;non-dropping-particle&quot;:&quot;&quot;},{&quot;family&quot;:&quot;Romano&quot;,&quot;given&quot;:&quot;Matteo C.&quot;,&quot;parse-names&quot;:false,&quot;dropping-particle&quot;:&quot;&quot;,&quot;non-dropping-particle&quot;:&quot;&quot;}],&quot;container-title&quot;:&quot;Fuel&quot;,&quot;DOI&quot;:&quot;10.1016/j.fuel.2021.122113&quot;,&quot;ISSN&quot;:&quot;00162361&quot;,&quot;issued&quot;:{&quot;date-parts&quot;:[[2022,2]]},&quot;page&quot;:&quot;122113&quot;,&quot;volume&quot;:&quot;310&quot;,&quot;container-title-short&quot;:&quot;&quot;},&quot;isTemporary&quot;:false}]},{&quot;citationID&quot;:&quot;MENDELEY_CITATION_8c83e7a2-71cf-4160-9fdd-2510731786cf&quot;,&quot;properties&quot;:{&quot;noteIndex&quot;:0},&quot;isEdited&quot;:false,&quot;manualOverride&quot;:{&quot;isManuallyOverridden&quot;:false,&quot;citeprocText&quot;:&quot;[21]&quot;,&quot;manualOverrideText&quot;:&quot;&quot;},&quot;citationTag&quot;:&quot;MENDELEY_CITATION_v3_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&quot;,&quot;citationItems&quot;:[{&quot;id&quot;:&quot;70edddc8-ee03-31fd-86e6-6cf7a4858b7a&quot;,&quot;itemData&quot;:{&quot;type&quot;:&quot;article-journal&quot;,&quot;id&quot;:&quot;70edddc8-ee03-31fd-86e6-6cf7a4858b7a&quot;,&quot;title&quot;:&quot;Flexible Power and Biomass-To-Methanol Plants With Different Gasification Technologies&quot;,&quot;author&quot;:[{&quot;family&quot;:&quot;Poluzzi&quot;,&quot;given&quot;:&quot;A.&quot;,&quot;parse-names&quot;:false,&quot;dropping-particle&quot;:&quot;&quot;,&quot;non-dropping-particle&quot;:&quot;&quot;},{&quot;family&quot;:&quot;Guandalini&quot;,&quot;given&quot;:&quot;G.&quot;,&quot;parse-names&quot;:false,&quot;dropping-particle&quot;:&quot;&quot;,&quot;non-dropping-particle&quot;:&quot;&quot;},{&quot;family&quot;:&quot;Guffanti&quot;,&quot;given&quot;:&quot;S.&quot;,&quot;parse-names&quot;:false,&quot;dropping-particle&quot;:&quot;&quot;,&quot;non-dropping-particle&quot;:&quot;&quot;},{&quot;family&quot;:&quot;Martinelli&quot;,&quot;given&quot;:&quot;M.&quot;,&quot;parse-names&quot;:false,&quot;dropping-particle&quot;:&quot;&quot;,&quot;non-dropping-particle&quot;:&quot;&quot;},{&quot;family&quot;:&quot;Moioli&quot;,&quot;given&quot;:&quot;S.&quot;,&quot;parse-names&quot;:false,&quot;dropping-particle&quot;:&quot;&quot;,&quot;non-dropping-particle&quot;:&quot;&quot;},{&quot;family&quot;:&quot;Huttenhuis&quot;,&quot;given&quot;:&quot;P.&quot;,&quot;parse-names&quot;:false,&quot;dropping-particle&quot;:&quot;&quot;,&quot;non-dropping-particle&quot;:&quot;&quot;},{&quot;family&quot;:&quot;Rexwinkel&quot;,&quot;given&quot;:&quot;G.&quot;,&quot;parse-names&quot;:false,&quot;dropping-particle&quot;:&quot;&quot;,&quot;non-dropping-particle&quot;:&quot;&quot;},{&quot;family&quot;:&quot;Palonen&quot;,&quot;given&quot;:&quot;J.&quot;,&quot;parse-names&quot;:false,&quot;dropping-particle&quot;:&quot;&quot;,&quot;non-dropping-particle&quot;:&quot;&quot;},{&quot;family&quot;:&quot;Martelli&quot;,&quot;given&quot;:&quot;E.&quot;,&quot;parse-names&quot;:false,&quot;dropping-particle&quot;:&quot;&quot;,&quot;non-dropping-particle&quot;:&quot;&quot;},{&quot;family&quot;:&quot;Groppi&quot;,&quot;given&quot;:&quot;G.&quot;,&quot;parse-names&quot;:false,&quot;dropping-particle&quot;:&quot;&quot;,&quot;non-dropping-particle&quot;:&quot;&quot;},{&quot;family&quot;:&quot;Romano&quot;,&quot;given&quot;:&quot;M. C.&quot;,&quot;parse-names&quot;:false,&quot;dropping-particle&quot;:&quot;&quot;,&quot;non-dropping-particle&quot;:&quot;&quot;}],&quot;container-title&quot;:&quot;Frontiers in Energy Research&quot;,&quot;DOI&quot;:&quot;10.3389/fenrg.2021.795673&quot;,&quot;ISSN&quot;:&quot;2296-598X&quot;,&quot;issued&quot;:{&quot;date-parts&quot;:[[2022,1,27]]},&quot;abstract&quot;:&quot;&lt;p&gt; The competitiveness of biofuels may be increased by integrating biomass gasification plants with electrolysis units, which generate hydrogen to be combined with carbon-rich syngas. This option allows increasing the yield of the final product by retaining a higher amount of biogenic carbon and improving the resilience of the energy sector by favoring electric grid services and sector coupling. This article illustrates a techno-economic comparative analysis of three flexible power and biomass to methanol plants based on different gasification technologies: direct gasification, indirect gasification, and sorption-enhanced gasification. The design and operational criteria of each plant are conceived to operate both without green hydrogen addition (baseline mode) and with hydrogen addition (enhanced mode), following an intermittent use of the electrolysis system, which is turned on when the electricity price allows an economically viable hydrogen production. The methanol production plants include a gasification section, syngas cleaning, conditioning and compression section, methanol synthesis and purification, and heat recovery steam cycle to be flexibly operated. Due to the high oxygen demand in the gasifier, the direct gasification-based plant obtains a great advantage to be operated between a minimum load to satisfy the oxygen demand at high electricity prices and a maximum load to maximize methanol production at low electricity prices. This allows avoiding large oxygen storages with significant benefits for Capex and safety issues. The analysis reports specific fixed-capital investments between 1823 and 2048 €/kW of methanol output in the enhanced operation and LCOFs between 29.7 and 31.7 €/GJ &lt;sub&gt;LHV&lt;/sub&gt; . Economic advantages may be derived from a decrease in the electrolysis capital investment, especially for the direct gasification-based plants, which employ the greatest sized electrolyzer. Methanol breakeven selling prices range between 545 and 582 €/t with the 2019 reference Denmark electricity price curve and between 484 and 535 €/t with an assumed modified electricity price curve of a future energy mix with increased penetration of intermittent renewables. &lt;/p&gt;&quot;,&quot;volume&quot;:&quot;9&quot;,&quot;container-title-short&quot;:&quot;Front. Energy Res.&quot;},&quot;isTemporary&quot;:false}]},{&quot;citationID&quot;:&quot;MENDELEY_CITATION_e2d98fbf-79a4-429b-9796-2be5c079023d&quot;,&quot;properties&quot;:{&quot;noteIndex&quot;:0},&quot;isEdited&quot;:false,&quot;manualOverride&quot;:{&quot;isManuallyOverridden&quot;:false,&quot;citeprocText&quot;:&quot;[25]&quot;,&quot;manualOverrideText&quot;:&quot;&quot;},&quot;citationTag&quot;:&quot;MENDELEY_CITATION_v3_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&quot;,&quot;citationItems&quot;:[{&quot;id&quot;:&quot;a332ee91-b343-3289-860a-430557bbc5fa&quot;,&quot;itemData&quot;:{&quot;type&quot;:&quot;article-journal&quot;,&quot;id&quot;:&quot;a332ee91-b343-3289-860a-430557bbc5fa&quot;,&quot;title&quot;:&quot;Flexible Power &amp;amp; Biomass-to-Methanol plants: Design optimization and economic viability of the electrolysis integration&quot;,&quot;author&quot;:[{&quot;family&quot;:&quot;Poluzzi&quot;,&quot;given&quot;:&quot;Alessandro&quot;,&quot;parse-names&quot;:false,&quot;dropping-particle&quot;:&quot;&quot;,&quot;non-dropping-particle&quot;:&quot;&quot;},{&quot;family&quot;:&quot;Guandalini&quot;,&quot;given&quot;:&quot;Giulio&quot;,&quot;parse-names&quot;:false,&quot;dropping-particle&quot;:&quot;&quot;,&quot;non-dropping-particle&quot;:&quot;&quot;},{&quot;family&quot;:&quot;Guffanti&quot;,&quot;given&quot;:&quot;Simone&quot;,&quot;parse-names&quot;:false,&quot;dropping-particle&quot;:&quot;&quot;,&quot;non-dropping-particle&quot;:&quot;&quot;},{&quot;family&quot;:&quot;Elsido&quot;,&quot;given&quot;:&quot;Cristina&quot;,&quot;parse-names&quot;:false,&quot;dropping-particle&quot;:&quot;&quot;,&quot;non-dropping-particle&quot;:&quot;&quot;},{&quot;family&quot;:&quot;Moioli&quot;,&quot;given&quot;:&quot;Stefania&quot;,&quot;parse-names&quot;:false,&quot;dropping-particle&quot;:&quot;&quot;,&quot;non-dropping-particle&quot;:&quot;&quot;},{&quot;family&quot;:&quot;Huttenhuis&quot;,&quot;given&quot;:&quot;Patrick&quot;,&quot;parse-names&quot;:false,&quot;dropping-particle&quot;:&quot;&quot;,&quot;non-dropping-particle&quot;:&quot;&quot;},{&quot;family&quot;:&quot;Rexwinkel&quot;,&quot;given&quot;:&quot;Glenn&quot;,&quot;parse-names&quot;:false,&quot;dropping-particle&quot;:&quot;&quot;,&quot;non-dropping-particle&quot;:&quot;&quot;},{&quot;family&quot;:&quot;Martelli&quot;,&quot;given&quot;:&quot;Emanuele&quot;,&quot;parse-names&quot;:false,&quot;dropping-particle&quot;:&quot;&quot;,&quot;non-dropping-particle&quot;:&quot;&quot;},{&quot;family&quot;:&quot;Groppi&quot;,&quot;given&quot;:&quot;Gianpiero&quot;,&quot;parse-names&quot;:false,&quot;dropping-particle&quot;:&quot;&quot;,&quot;non-dropping-particle&quot;:&quot;&quot;},{&quot;family&quot;:&quot;Romano&quot;,&quot;given&quot;:&quot;Matteo C.&quot;,&quot;parse-names&quot;:false,&quot;dropping-particle&quot;:&quot;&quot;,&quot;non-dropping-particle&quot;:&quot;&quot;}],&quot;container-title&quot;:&quot;Fuel&quot;,&quot;DOI&quot;:&quot;10.1016/j.fuel.2021.122113&quot;,&quot;ISSN&quot;:&quot;00162361&quot;,&quot;issued&quot;:{&quot;date-parts&quot;:[[2022,2]]},&quot;page&quot;:&quot;122113&quot;,&quot;volume&quot;:&quot;310&quot;,&quot;container-title-short&quot;:&quot;&quot;},&quot;isTemporary&quot;:false}]},{&quot;citationID&quot;:&quot;MENDELEY_CITATION_b7c42850-3893-430a-a91a-ba071b5a549f&quot;,&quot;properties&quot;:{&quot;noteIndex&quot;:0},&quot;isEdited&quot;:false,&quot;manualOverride&quot;:{&quot;isManuallyOverridden&quot;:false,&quot;citeprocText&quot;:&quot;[26]&quot;,&quot;manualOverrideText&quot;:&quot;&quot;},&quot;citationTag&quot;:&quot;MENDELEY_CITATION_v3_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&quot;,&quot;citationItems&quot;:[{&quot;id&quot;:&quot;31848458-a34e-370b-af77-81d1d893a1c5&quot;,&quot;itemData&quot;:{&quot;type&quot;:&quot;article-journal&quot;,&quot;id&quot;:&quot;31848458-a34e-370b-af77-81d1d893a1c5&quot;,&quot;title&quot;:&quot;Deep Reinforcement Learning Approaches the MILP Optimum of a Multi-Energy Optimization in Energy Communities&quot;,&quot;author&quot;:[{&quot;family&quot;:&quot;Vetter&quot;,&quot;given&quot;:&quot;Vinzent&quot;,&quot;parse-names&quot;:false,&quot;dropping-particle&quot;:&quot;&quot;,&quot;non-dropping-particle&quot;:&quot;&quot;},{&quot;family&quot;:&quot;Wohlgenannt&quot;,&quot;given&quot;:&quot;Philipp&quot;,&quot;parse-names&quot;:false,&quot;dropping-particle&quot;:&quot;&quot;,&quot;non-dropping-particle&quot;:&quot;&quot;},{&quot;family&quot;:&quot;Kepplinger&quot;,&quot;given&quot;:&quot;Peter&quot;,&quot;parse-names&quot;:false,&quot;dropping-particle&quot;:&quot;&quot;,&quot;non-dropping-particle&quot;:&quot;&quot;},{&quot;family&quot;:&quot;Eder&quot;,&quot;given&quot;:&quot;Elias&quot;,&quot;parse-names&quot;:false,&quot;dropping-particle&quot;:&quot;&quot;,&quot;non-dropping-particle&quot;:&quot;&quot;}],&quot;container-title&quot;:&quot;Energies&quot;,&quot;container-title-short&quot;:&quot;Energies (Basel).&quot;,&quot;DOI&quot;:&quot;10.3390/en18174489&quot;,&quot;ISSN&quot;:&quot;1996-1073&quot;,&quot;issued&quot;:{&quot;date-parts&quot;:[[2025,8,23]]},&quot;page&quot;:&quot;4489&quot;,&quot;abstract&quot;:&quot;&lt;p&gt;As energy systems transition toward high shares of variable renewable generation, local energy communities (ECs) are increasingly relevant for enabling demand-side flexibility and self-sufficiency. This shift is particularly evident in the residential sector, where the deployment of photovoltaic (PV) systems is rapidly growing. While mixed-integer linear programming (MILP) remains the standard for operational optimization and demand response in such systems, its computational burden limits scalability and responsiveness under real-time or uncertain conditions. Reinforcement learning (RL), by contrast, offers a model-free, adaptive alternative. However, its application to real-world energy system operation remains limited. This study explores the application of a Deep Q-Network (DQN) to a real residential EC, which has received limited attention in prior work. The system comprises three single-family homes sharing a centralized heating system with a thermal energy storage (TES), a PV installation, and a grid connection. We compare the performance of MILP and RL controllers across economic and environmental metrics. Relative to a reference scenario without TES, MILP and RL reduce energy costs by 10.06% and 8.78%, respectively, and both approaches yield lower total energy consumption and CO2-equivalent emissions. Notably, the trained RL agent achieves a near-optimal outcome while requiring only 22% of the MILP’s computation time. These results demonstrate that DQNs can offer a computationally efficient and practically viable alternative to MILP for real-time control in residential energy systems.&lt;/p&gt;&quot;,&quot;issue&quot;:&quot;17&quot;,&quot;volume&quot;:&quot;18&quot;},&quot;isTemporary&quot;:false}]},{&quot;citationID&quot;:&quot;MENDELEY_CITATION_03d18768-2530-4173-a512-ec7dc06e4ecc&quot;,&quot;properties&quot;:{&quot;noteIndex&quot;:0},&quot;isEdited&quot;:false,&quot;manualOverride&quot;:{&quot;isManuallyOverridden&quot;:false,&quot;citeprocText&quot;:&quot;[27]&quot;,&quot;manualOverrideText&quot;:&quot;&quot;},&quot;citationTag&quot;:&quot;MENDELEY_CITATION_v3_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&quot;,&quot;citationItems&quot;:[{&quot;id&quot;:&quot;185586bd-ce77-3f7d-ae64-0f509db4cf05&quot;,&quot;itemData&quot;:{&quot;type&quot;:&quot;article-journal&quot;,&quot;id&quot;:&quot;185586bd-ce77-3f7d-ae64-0f509db4cf05&quot;,&quot;title&quot;:&quot;Energy Demand Response in a Food-Processing Plant: A Deep Reinforcement Learning Approach&quot;,&quot;author&quot;:[{&quot;family&quot;:&quot;Wohlgenannt&quot;,&quot;given&quot;:&quot;Philipp&quot;,&quot;parse-names&quot;:false,&quot;dropping-particle&quot;:&quot;&quot;,&quot;non-dropping-particle&quot;:&quot;&quot;},{&quot;family&quot;:&quot;Hegenbart&quot;,&quot;given&quot;:&quot;Sebastian&quot;,&quot;parse-names&quot;:false,&quot;dropping-particle&quot;:&quot;&quot;,&quot;non-dropping-particle&quot;:&quot;&quot;},{&quot;family&quot;:&quot;Eder&quot;,&quot;given&quot;:&quot;Elias&quot;,&quot;parse-names&quot;:false,&quot;dropping-particle&quot;:&quot;&quot;,&quot;non-dropping-particle&quot;:&quot;&quot;},{&quot;family&quot;:&quot;Kolhe&quot;,&quot;given&quot;:&quot;Mohan&quot;,&quot;parse-names&quot;:false,&quot;dropping-particle&quot;:&quot;&quot;,&quot;non-dropping-particle&quot;:&quot;&quot;},{&quot;family&quot;:&quot;Kepplinger&quot;,&quot;given&quot;:&quot;Peter&quot;,&quot;parse-names&quot;:false,&quot;dropping-particle&quot;:&quot;&quot;,&quot;non-dropping-particle&quot;:&quot;&quot;}],&quot;container-title&quot;:&quot;Energies&quot;,&quot;DOI&quot;:&quot;10.3390/en17246430&quot;,&quot;ISSN&quot;:&quot;1996-1073&quot;,&quot;issued&quot;:{&quot;date-parts&quot;:[[2024,12,20]]},&quot;page&quot;:&quot;6430&quot;,&quot;abstract&quot;:&quot;&lt;p&gt;The food industry faces significant challenges in managing operational costs due to its high energy intensity and rising energy prices. Industrial food-processing facilities, with substantial thermal capacities and large demands for cooling and heating, offer promising opportunities for demand response (DR) strategies. This study explores the application of deep reinforcement learning (RL) as an innovative, data-driven approach for DR in the food industry. By leveraging the adaptive, self-learning capabilities of RL, energy costs in the investigated plant are effectively decreased. The RL algorithm was compared with the well-established optimization method Mixed Integer Linear Programming (MILP), and both were benchmarked against a reference scenario without DR. The two optimization strategies demonstrate cost savings of 17.57% and 18.65% for RL and MILP, respectively. Although RL is slightly less efficient in cost reduction, it significantly outperforms in computational speed, being approximately 20 times faster. During operation, RL only needs 2ms per optimization compared to 19s for MILP, making it a promising optimization tool for edge computing. Moreover, while MILP’s computation time increases considerably with the number of binary variables, RL efficiently learns dynamic system behavior and scales to more complex systems without significant performance degradation. These results highlight that deep RL, when applied to DR, offers substantial cost savings and computational efficiency, with broad applicability to energy management in various applications.&lt;/p&gt;&quot;,&quot;issue&quot;:&quot;24&quot;,&quot;volume&quot;:&quot;17&quot;,&quot;container-title-short&quot;:&quot;Energies (Basel).&quot;},&quot;isTemporary&quot;:false}]},{&quot;citationID&quot;:&quot;MENDELEY_CITATION_d0ae8956-c2f2-4f72-9054-a8ca53b2504b&quot;,&quot;properties&quot;:{&quot;noteIndex&quot;:0},&quot;isEdited&quot;:false,&quot;manualOverride&quot;:{&quot;isManuallyOverridden&quot;:false,&quot;citeprocText&quot;:&quot;[28]&quot;,&quot;manualOverrideText&quot;:&quot;&quot;},&quot;citationTag&quot;:&quot;MENDELEY_CITATION_v3_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&quot;,&quot;citationItems&quot;:[{&quot;id&quot;:&quot;b510e037-8e3e-36b2-9b7f-53d097c80a2d&quot;,&quot;itemData&quot;:{&quot;type&quot;:&quot;article-journal&quot;,&quot;id&quot;:&quot;b510e037-8e3e-36b2-9b7f-53d097c80a2d&quot;,&quot;title&quot;:&quot;A comprehensive review on optimization of hybrid renewable energy systems using various optimization techniques&quot;,&quot;author&quot;:[{&quot;family&quot;:&quot;Thirunavukkarasu&quot;,&quot;given&quot;:&quot;M.&quot;,&quot;parse-names&quot;:false,&quot;dropping-particle&quot;:&quot;&quot;,&quot;non-dropping-particle&quot;:&quot;&quot;},{&quot;family&quot;:&quot;Sawle&quot;,&quot;given&quot;:&quot;Yashwant&quot;,&quot;parse-names&quot;:false,&quot;dropping-particle&quot;:&quot;&quot;,&quot;non-dropping-particle&quot;:&quot;&quot;},{&quot;family&quot;:&quot;Lala&quot;,&quot;given&quot;:&quot;Himadri&quot;,&quot;parse-names&quot;:false,&quot;dropping-particle&quot;:&quot;&quot;,&quot;non-dropping-particle&quot;:&quot;&quot;}],&quot;container-title&quot;:&quot;Renewable and Sustainable Energy Reviews&quot;,&quot;DOI&quot;:&quot;10.1016/j.rser.2023.113192&quot;,&quot;ISSN&quot;:&quot;13640321&quot;,&quot;issued&quot;:{&quot;date-parts&quot;:[[2023,4]]},&quot;page&quot;:&quot;113192&quot;,&quot;volume&quot;:&quot;176&quot;,&quot;container-title-short&quot;:&quot;&quot;},&quot;isTemporary&quot;:false}]},{&quot;citationID&quot;:&quot;MENDELEY_CITATION_b63a1021-7346-498d-adf3-73382c63a827&quot;,&quot;properties&quot;:{&quot;noteIndex&quot;:0},&quot;isEdited&quot;:false,&quot;manualOverride&quot;:{&quot;isManuallyOverridden&quot;:false,&quot;citeprocText&quot;:&quot;[29]&quot;,&quot;manualOverrideText&quot;:&quot;&quot;},&quot;citationTag&quot;:&quot;MENDELEY_CITATION_v3_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&quot;,&quot;citationItems&quot;:[{&quot;id&quot;:&quot;0f89bf4c-80d3-3ce8-8c18-b8917957c10b&quot;,&quot;itemData&quot;:{&quot;type&quot;:&quot;article-journal&quot;,&quot;id&quot;:&quot;0f89bf4c-80d3-3ce8-8c18-b8917957c10b&quot;,&quot;title&quot;:&quot;Optimal energy system scheduling using a constraint-aware reinforcement learning algorithm&quot;,&quot;author&quot;:[{&quot;family&quot;:&quot;Shengren&quot;,&quot;given&quot;:&quot;Hou&quot;,&quot;parse-names&quot;:false,&quot;dropping-particle&quot;:&quot;&quot;,&quot;non-dropping-particle&quot;:&quot;&quot;},{&quot;family&quot;:&quot;Vergara&quot;,&quot;given&quot;:&quot;Pedro P.&quot;,&quot;parse-names&quot;:false,&quot;dropping-particle&quot;:&quot;&quot;,&quot;non-dropping-particle&quot;:&quot;&quot;},{&quot;family&quot;:&quot;Salazar Duque&quot;,&quot;given&quot;:&quot;Edgar Mauricio&quot;,&quot;parse-names&quot;:false,&quot;dropping-particle&quot;:&quot;&quot;,&quot;non-dropping-particle&quot;:&quot;&quot;},{&quot;family&quot;:&quot;Palensky&quot;,&quot;given&quot;:&quot;Peter&quot;,&quot;parse-names&quot;:false,&quot;dropping-particle&quot;:&quot;&quot;,&quot;non-dropping-particle&quot;:&quot;&quot;}],&quot;container-title&quot;:&quot;International Journal of Electrical Power &amp; Energy Systems&quot;,&quot;DOI&quot;:&quot;10.1016/j.ijepes.2023.109230&quot;,&quot;ISSN&quot;:&quot;01420615&quot;,&quot;issued&quot;:{&quot;date-parts&quot;:[[2023,10]]},&quot;page&quot;:&quot;109230&quot;,&quot;volume&quot;:&quot;152&quot;,&quot;container-title-short&quot;:&quot;&quot;},&quot;isTemporary&quot;:false}]},{&quot;citationID&quot;:&quot;MENDELEY_CITATION_6d8a7862-c0c2-4c71-b5ea-7e17817e262d&quot;,&quot;properties&quot;:{&quot;noteIndex&quot;:0},&quot;isEdited&quot;:false,&quot;manualOverride&quot;:{&quot;isManuallyOverridden&quot;:false,&quot;citeprocText&quot;:&quot;[30]&quot;,&quot;manualOverrideText&quot;:&quot;&quot;},&quot;citationTag&quot;:&quot;MENDELEY_CITATION_v3_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&quot;,&quot;citationItems&quot;:[{&quot;id&quot;:&quot;32d54ec3-73fd-3a7d-a2b9-efadea2d2319&quot;,&quot;itemData&quot;:{&quot;type&quot;:&quot;article-journal&quot;,&quot;id&quot;:&quot;32d54ec3-73fd-3a7d-a2b9-efadea2d2319&quot;,&quot;title&quot;:&quot;A Review on Multi-Objective Mixed-Integer Non-Linear Optimization Programming Methods&quot;,&quot;author&quot;:[{&quot;family&quot;:&quot;Jaber&quot;,&quot;given&quot;:&quot;Ahmed&quot;,&quot;parse-names&quot;:false,&quot;dropping-particle&quot;:&quot;&quot;,&quot;non-dropping-particle&quot;:&quot;&quot;},{&quot;family&quot;:&quot;Younes&quot;,&quot;given&quot;:&quot;Rafic&quot;,&quot;parse-names&quot;:false,&quot;dropping-particle&quot;:&quot;&quot;,&quot;non-dropping-particle&quot;:&quot;&quot;},{&quot;family&quot;:&quot;Lafon&quot;,&quot;given&quot;:&quot;Pascal&quot;,&quot;parse-names&quot;:false,&quot;dropping-particle&quot;:&quot;&quot;,&quot;non-dropping-particle&quot;:&quot;&quot;},{&quot;family&quot;:&quot;Khoder&quot;,&quot;given&quot;:&quot;Jihan&quot;,&quot;parse-names&quot;:false,&quot;dropping-particle&quot;:&quot;&quot;,&quot;non-dropping-particle&quot;:&quot;&quot;}],&quot;container-title&quot;:&quot;Eng&quot;,&quot;DOI&quot;:&quot;10.3390/eng5030104&quot;,&quot;ISSN&quot;:&quot;2673-4117&quot;,&quot;issued&quot;:{&quot;date-parts&quot;:[[2024,8,17]]},&quot;page&quot;:&quot;1961-1979&quot;,&quot;abstract&quot;:&quot;&lt;p&gt;This paper provides a recent overview of the exact, approximate, and hybrid optimization methods that handle Multi-Objective Mixed-Integer Non-Linear Programming (MO-MINLP) problems. Both the domains of exact and approximate research have experienced significant growth, driven by their shared goal of addressing a wide range of real-world problems. This work presents a comprehensive literature review that highlights the significant theoretical contributions in the field of hybrid approaches between these research areas. We also point out possible research gaps in the literature. Hence, the main research questions to be answered in this paper involve the following: (1) how to exactly or approximately solve a MO-MINLP problem? (2) What are the drawbacks of exact methods as well as approximate methods? (3) What are the research lines that are currently underway to enhance the performances of these methods? and (4) Where are the research gaps in this field? This work aims to provide enough descriptive information for newcomers in this area about the research that has been carried out and that is currently underway concerning exact, approximate, and hybrid methods used to solve MO-MINLP problems.&lt;/p&gt;&quot;,&quot;issue&quot;:&quot;3&quot;,&quot;volume&quot;:&quot;5&quot;,&quot;container-title-short&quot;:&quot;&quot;},&quot;isTemporary&quot;:false}]},{&quot;citationID&quot;:&quot;MENDELEY_CITATION_43edfd88-7e00-44e3-af12-138762045627&quot;,&quot;properties&quot;:{&quot;noteIndex&quot;:0},&quot;isEdited&quot;:false,&quot;manualOverride&quot;:{&quot;isManuallyOverridden&quot;:false,&quot;citeprocText&quot;:&quot;[31]&quot;,&quot;manualOverrideText&quot;:&quot;&quot;},&quot;citationTag&quot;:&quot;MENDELEY_CITATION_v3_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&quot;,&quot;citationItems&quot;:[{&quot;id&quot;:&quot;3491985c-2e0b-31bc-84e8-6823f88df629&quot;,&quot;itemData&quot;:{&quot;type&quot;:&quot;article-journal&quot;,&quot;id&quot;:&quot;3491985c-2e0b-31bc-84e8-6823f88df629&quot;,&quot;title&quot;:&quot;Multi-objective stochastic optimization problem: a systematic literature review&quot;,&quot;author&quot;:[{&quot;family&quot;:&quot;Pirouz&quot;,&quot;given&quot;:&quot;Behzad&quot;,&quot;parse-names&quot;:false,&quot;dropping-particle&quot;:&quot;&quot;,&quot;non-dropping-particle&quot;:&quot;&quot;},{&quot;family&quot;:&quot;Guerriero&quot;,&quot;given&quot;:&quot;Francesca&quot;,&quot;parse-names&quot;:false,&quot;dropping-particle&quot;:&quot;&quot;,&quot;non-dropping-particle&quot;:&quot;&quot;}],&quot;container-title&quot;:&quot;Applied Energy&quot;,&quot;DOI&quot;:&quot;10.1016/j.apenergy.2025.127237&quot;,&quot;ISSN&quot;:&quot;03062619&quot;,&quot;issued&quot;:{&quot;date-parts&quot;:[[2026,2]]},&quot;page&quot;:&quot;127237&quot;,&quot;volume&quot;:&quot;405&quot;,&quot;container-title-short&quot;:&quot;Appl. Energy&quot;},&quot;isTemporary&quot;:false}]},{&quot;citationID&quot;:&quot;MENDELEY_CITATION_b6249101-b808-40c8-a033-78980999aeb7&quot;,&quot;properties&quot;:{&quot;noteIndex&quot;:0},&quot;isEdited&quot;:false,&quot;manualOverride&quot;:{&quot;isManuallyOverridden&quot;:false,&quot;citeprocText&quot;:&quot;[32]&quot;,&quot;manualOverrideText&quot;:&quot;&quot;},&quot;citationTag&quot;:&quot;MENDELEY_CITATION_v3_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&quot;,&quot;citationItems&quot;:[{&quot;id&quot;:&quot;54e38a01-fa83-3801-a318-6f19e94cb79c&quot;,&quot;itemData&quot;:{&quot;type&quot;:&quot;article-journal&quot;,&quot;id&quot;:&quot;54e38a01-fa83-3801-a318-6f19e94cb79c&quot;,&quot;title&quot;:&quot;A review on recent standalone and grid integrated hybrid renewable energy systems: System optimization and energy management strategies&quot;,&quot;author&quot;:[{&quot;family&quot;:&quot;Basnet&quot;,&quot;given&quot;:&quot;Sarad&quot;,&quot;parse-names&quot;:false,&quot;dropping-particle&quot;:&quot;&quot;,&quot;non-dropping-particle&quot;:&quot;&quot;},{&quot;family&quot;:&quot;Deschinkel&quot;,&quot;given&quot;:&quot;Karine&quot;,&quot;parse-names&quot;:false,&quot;dropping-particle&quot;:&quot;&quot;,&quot;non-dropping-particle&quot;:&quot;&quot;},{&quot;family&quot;:&quot;Moyne&quot;,&quot;given&quot;:&quot;Luis&quot;,&quot;parse-names&quot;:false,&quot;dropping-particle&quot;:&quot;&quot;,&quot;non-dropping-particle&quot;:&quot;Le&quot;},{&quot;family&quot;:&quot;Cécile Péra&quot;,&quot;given&quot;:&quot;Marie&quot;,&quot;parse-names&quot;:false,&quot;dropping-particle&quot;:&quot;&quot;,&quot;non-dropping-particle&quot;:&quot;&quot;}],&quot;container-title&quot;:&quot;Renewable Energy Focus&quot;,&quot;DOI&quot;:&quot;10.1016/j.ref.2023.06.001&quot;,&quot;ISSN&quot;:&quot;17550084&quot;,&quot;issued&quot;:{&quot;date-parts&quot;:[[2023,9]]},&quot;page&quot;:&quot;103-125&quot;,&quot;volume&quot;:&quot;46&quot;,&quot;container-title-short&quot;:&quot;&quot;},&quot;isTemporary&quot;:false}]},{&quot;citationID&quot;:&quot;MENDELEY_CITATION_9c9f6d6b-0d28-4cda-88a9-65954fd94b49&quot;,&quot;properties&quot;:{&quot;noteIndex&quot;:0},&quot;isEdited&quot;:false,&quot;manualOverride&quot;:{&quot;isManuallyOverridden&quot;:false,&quot;citeprocText&quot;:&quot;[33]&quot;,&quot;manualOverrideText&quot;:&quot;&quot;},&quot;citationTag&quot;:&quot;MENDELEY_CITATION_v3_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&quot;,&quot;citationItems&quot;:[{&quot;id&quot;:&quot;a7dd1c28-2105-373b-8623-5d74e7cdc012&quot;,&quot;itemData&quot;:{&quot;type&quot;:&quot;article-journal&quot;,&quot;id&quot;:&quot;a7dd1c28-2105-373b-8623-5d74e7cdc012&quot;,&quot;title&quot;:&quot;A Survey on Mixed-Integer Programming Techniques in Bilevel Optimization&quot;,&quot;author&quot;:[{&quot;family&quot;:&quot;Kleinert&quot;,&quot;given&quot;:&quot;Thomas&quot;,&quot;parse-names&quot;:false,&quot;dropping-particle&quot;:&quot;&quot;,&quot;non-dropping-particle&quot;:&quot;&quot;},{&quot;family&quot;:&quot;Labbé&quot;,&quot;given&quot;:&quot;Martine&quot;,&quot;parse-names&quot;:false,&quot;dropping-particle&quot;:&quot;&quot;,&quot;non-dropping-particle&quot;:&quot;&quot;},{&quot;family&quot;:&quot;Ljubić&quot;,&quot;given&quot;:&quot;Ivana&quot;,&quot;parse-names&quot;:false,&quot;dropping-particle&quot;:&quot;&quot;,&quot;non-dropping-particle&quot;:&quot;&quot;},{&quot;family&quot;:&quot;Schmidt&quot;,&quot;given&quot;:&quot;Martin&quot;,&quot;parse-names&quot;:false,&quot;dropping-particle&quot;:&quot;&quot;,&quot;non-dropping-particle&quot;:&quot;&quot;}],&quot;container-title&quot;:&quot;EURO Journal on Computational Optimization&quot;,&quot;DOI&quot;:&quot;10.1016/j.ejco.2021.100007&quot;,&quot;ISSN&quot;:&quot;21924406&quot;,&quot;issued&quot;:{&quot;date-parts&quot;:[[2021]]},&quot;page&quot;:&quot;100007&quot;,&quot;volume&quot;:&quot;9&quot;,&quot;container-title-short&quot;:&quot;&quot;},&quot;isTemporary&quot;:false}]},{&quot;citationID&quot;:&quot;MENDELEY_CITATION_33ef091a-ded0-4a74-8b85-848522b9880f&quot;,&quot;properties&quot;:{&quot;noteIndex&quot;:0},&quot;isEdited&quot;:false,&quot;manualOverride&quot;:{&quot;isManuallyOverridden&quot;:false,&quot;citeprocText&quot;:&quot;[32], [33], [34], [35]&quot;,&quot;manualOverrideText&quot;:&quot;&quot;},&quot;citationTag&quot;:&quot;MENDELEY_CITATION_v3_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&quot;,&quot;citationItems&quot;:[{&quot;id&quot;:&quot;f5b03336-6a29-3705-ac39-a115ab7d476b&quot;,&quot;itemData&quot;:{&quot;type&quot;:&quot;article-journal&quot;,&quot;id&quot;:&quot;f5b03336-6a29-3705-ac39-a115ab7d476b&quot;,&quot;title&quot;:&quot;Recent advances in mathematical programming techniques for the optimization of process systems under uncertainty&quot;,&quot;author&quot;:[{&quot;family&quot;:&quot;Grossmann&quot;,&quot;given&quot;:&quot;Ignacio E.&quot;,&quot;parse-names&quot;:false,&quot;dropping-particle&quot;:&quot;&quot;,&quot;non-dropping-particle&quot;:&quot;&quot;},{&quot;family&quot;:&quot;Apap&quot;,&quot;given&quot;:&quot;Robert M.&quot;,&quot;parse-names&quot;:false,&quot;dropping-particle&quot;:&quot;&quot;,&quot;non-dropping-particle&quot;:&quot;&quot;},{&quot;family&quot;:&quot;Calfa&quot;,&quot;given&quot;:&quot;Bruno A.&quot;,&quot;parse-names&quot;:false,&quot;dropping-particle&quot;:&quot;&quot;,&quot;non-dropping-particle&quot;:&quot;&quot;},{&quot;family&quot;:&quot;García-Herreros&quot;,&quot;given&quot;:&quot;Pablo&quot;,&quot;parse-names&quot;:false,&quot;dropping-particle&quot;:&quot;&quot;,&quot;non-dropping-particle&quot;:&quot;&quot;},{&quot;family&quot;:&quot;Zhang&quot;,&quot;given&quot;:&quot;Qi&quot;,&quot;parse-names&quot;:false,&quot;dropping-particle&quot;:&quot;&quot;,&quot;non-dropping-particle&quot;:&quot;&quot;}],&quot;container-title&quot;:&quot;Computers &amp; Chemical Engineering&quot;,&quot;DOI&quot;:&quot;10.1016/j.compchemeng.2016.03.002&quot;,&quot;ISSN&quot;:&quot;00981354&quot;,&quot;issued&quot;:{&quot;date-parts&quot;:[[2016,8]]},&quot;page&quot;:&quot;3-14&quot;,&quot;volume&quot;:&quot;91&quot;,&quot;container-title-short&quot;:&quot;Comput. Chem. Eng.&quot;},&quot;isTemporary&quot;:false},{&quot;id&quot;:&quot;1c837bc1-1688-320b-9cef-676437130233&quot;,&quot;itemData&quot;:{&quot;type&quot;:&quot;article-journal&quot;,&quot;id&quot;:&quot;1c837bc1-1688-320b-9cef-676437130233&quot;,&quot;title&quot;:&quot;A Review of Stochastic Programming Methods for Optimization of Process Systems Under Uncertainty&quot;,&quot;author&quot;:[{&quot;family&quot;:&quot;Li&quot;,&quot;given&quot;:&quot;Can&quot;,&quot;parse-names&quot;:false,&quot;dropping-particle&quot;:&quot;&quot;,&quot;non-dropping-particle&quot;:&quot;&quot;},{&quot;family&quot;:&quot;Grossmann&quot;,&quot;given&quot;:&quot;Ignacio E.&quot;,&quot;parse-names&quot;:false,&quot;dropping-particle&quot;:&quot;&quot;,&quot;non-dropping-particle&quot;:&quot;&quot;}],&quot;container-title&quot;:&quot;Frontiers in Chemical Engineering&quot;,&quot;DOI&quot;:&quot;10.3389/fceng.2020.622241&quot;,&quot;ISSN&quot;:&quot;2673-2718&quot;,&quot;issued&quot;:{&quot;date-parts&quot;:[[2021,1,28]]},&quot;abstract&quot;:&quot;&lt;p&gt;Uncertainties are widespread in the optimization of process systems, such as uncertainties in process technologies, prices, and customer demands. In this paper, we review the basic concepts and recent advances of a risk-neutral mathematical framework called “stochastic programming” and its applications in solving process systems engineering problems under uncertainty. This review intends to provide both a tutorial for beginners without prior experience and a high-level overview of the current state-of-the-art developments for experts in process systems engineering and stochastic programming. The mathematical formulations and algorithms for two-stage and multistage stochastic programming are reviewed with illustrative examples from process industries. The differences between stochastic programming under exogenous uncertainty and endogenous uncertainties are discussed. The concepts and several data-driven methods for generating scenario trees are also reviewed.&lt;/p&gt;&quot;,&quot;volume&quot;:&quot;2&quot;,&quot;container-title-short&quot;:&quot;&quot;},&quot;isTemporary&quot;:false},{&quot;id&quot;:&quot;a7dd1c28-2105-373b-8623-5d74e7cdc012&quot;,&quot;itemData&quot;:{&quot;type&quot;:&quot;article-journal&quot;,&quot;id&quot;:&quot;a7dd1c28-2105-373b-8623-5d74e7cdc012&quot;,&quot;title&quot;:&quot;A Survey on Mixed-Integer Programming Techniques in Bilevel Optimization&quot;,&quot;author&quot;:[{&quot;family&quot;:&quot;Kleinert&quot;,&quot;given&quot;:&quot;Thomas&quot;,&quot;parse-names&quot;:false,&quot;dropping-particle&quot;:&quot;&quot;,&quot;non-dropping-particle&quot;:&quot;&quot;},{&quot;family&quot;:&quot;Labbé&quot;,&quot;given&quot;:&quot;Martine&quot;,&quot;parse-names&quot;:false,&quot;dropping-particle&quot;:&quot;&quot;,&quot;non-dropping-particle&quot;:&quot;&quot;},{&quot;family&quot;:&quot;Ljubić&quot;,&quot;given&quot;:&quot;Ivana&quot;,&quot;parse-names&quot;:false,&quot;dropping-particle&quot;:&quot;&quot;,&quot;non-dropping-particle&quot;:&quot;&quot;},{&quot;family&quot;:&quot;Schmidt&quot;,&quot;given&quot;:&quot;Martin&quot;,&quot;parse-names&quot;:false,&quot;dropping-particle&quot;:&quot;&quot;,&quot;non-dropping-particle&quot;:&quot;&quot;}],&quot;container-title&quot;:&quot;EURO Journal on Computational Optimization&quot;,&quot;DOI&quot;:&quot;10.1016/j.ejco.2021.100007&quot;,&quot;ISSN&quot;:&quot;21924406&quot;,&quot;issued&quot;:{&quot;date-parts&quot;:[[2021]]},&quot;page&quot;:&quot;100007&quot;,&quot;volume&quot;:&quot;9&quot;,&quot;container-title-short&quot;:&quot;&quot;},&quot;isTemporary&quot;:false},{&quot;id&quot;:&quot;54e38a01-fa83-3801-a318-6f19e94cb79c&quot;,&quot;itemData&quot;:{&quot;type&quot;:&quot;article-journal&quot;,&quot;id&quot;:&quot;54e38a01-fa83-3801-a318-6f19e94cb79c&quot;,&quot;title&quot;:&quot;A review on recent standalone and grid integrated hybrid renewable energy systems: System optimization and energy management strategies&quot;,&quot;author&quot;:[{&quot;family&quot;:&quot;Basnet&quot;,&quot;given&quot;:&quot;Sarad&quot;,&quot;parse-names&quot;:false,&quot;dropping-particle&quot;:&quot;&quot;,&quot;non-dropping-particle&quot;:&quot;&quot;},{&quot;family&quot;:&quot;Deschinkel&quot;,&quot;given&quot;:&quot;Karine&quot;,&quot;parse-names&quot;:false,&quot;dropping-particle&quot;:&quot;&quot;,&quot;non-dropping-particle&quot;:&quot;&quot;},{&quot;family&quot;:&quot;Moyne&quot;,&quot;given&quot;:&quot;Luis&quot;,&quot;parse-names&quot;:false,&quot;dropping-particle&quot;:&quot;&quot;,&quot;non-dropping-particle&quot;:&quot;Le&quot;},{&quot;family&quot;:&quot;Cécile Péra&quot;,&quot;given&quot;:&quot;Marie&quot;,&quot;parse-names&quot;:false,&quot;dropping-particle&quot;:&quot;&quot;,&quot;non-dropping-particle&quot;:&quot;&quot;}],&quot;container-title&quot;:&quot;Renewable Energy Focus&quot;,&quot;DOI&quot;:&quot;10.1016/j.ref.2023.06.001&quot;,&quot;ISSN&quot;:&quot;17550084&quot;,&quot;issued&quot;:{&quot;date-parts&quot;:[[2023,9]]},&quot;page&quot;:&quot;103-125&quot;,&quot;volume&quot;:&quot;46&quot;,&quot;container-title-short&quot;:&quot;&quot;},&quot;isTemporary&quot;:false}]},{&quot;citationID&quot;:&quot;MENDELEY_CITATION_4a4c6769-de4f-4723-ad1a-7b324cf3f736&quot;,&quot;properties&quot;:{&quot;noteIndex&quot;:0},&quot;isEdited&quot;:false,&quot;manualOverride&quot;:{&quot;isManuallyOverridden&quot;:false,&quot;citeprocText&quot;:&quot;[36]&quot;,&quot;manualOverrideText&quot;:&quot;&quot;},&quot;citationTag&quot;:&quot;MENDELEY_CITATION_v3_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&quot;,&quot;citationItems&quot;:[{&quot;id&quot;:&quot;657631e7-7854-321d-9660-90161531164b&quot;,&quot;itemData&quot;:{&quot;type&quot;:&quot;article-journal&quot;,&quot;id&quot;:&quot;657631e7-7854-321d-9660-90161531164b&quot;,&quot;title&quot;:&quot;Integrating multi-objective superstructure optimization and multi-criteria assessment: a novel methodology for sustainable process design&quot;,&quot;author&quot;:[{&quot;family&quot;:&quot;Kenkel&quot;,&quot;given&quot;:&quot;Philipp&quot;,&quot;parse-names&quot;:false,&quot;dropping-particle&quot;:&quot;&quot;,&quot;non-dropping-particle&quot;:&quot;&quot;},{&quot;family&quot;:&quot;Schnuelle&quot;,&quot;given&quot;:&quot;Christian&quot;,&quot;parse-names&quot;:false,&quot;dropping-particle&quot;:&quot;&quot;,&quot;non-dropping-particle&quot;:&quot;&quot;},{&quot;family&quot;:&quot;Wassermann&quot;,&quot;given&quot;:&quot;Timo&quot;,&quot;parse-names&quot;:false,&quot;dropping-particle&quot;:&quot;&quot;,&quot;non-dropping-particle&quot;:&quot;&quot;},{&quot;family&quot;:&quot;Zondervan&quot;,&quot;given&quot;:&quot;Edwin&quot;,&quot;parse-names&quot;:false,&quot;dropping-particle&quot;:&quot;&quot;,&quot;non-dropping-particle&quot;:&quot;&quot;}],&quot;container-title&quot;:&quot;Physical Sciences Reviews&quot;,&quot;DOI&quot;:&quot;10.1515/psr-2020-0058&quot;,&quot;ISSN&quot;:&quot;2365-659X&quot;,&quot;issued&quot;:{&quot;date-parts&quot;:[[2023,9,25]]},&quot;page&quot;:&quot;2361-2394&quot;,&quot;abstract&quot;:&quot;&lt;p&gt; This work presents a novel methodology for integrated multi-objective superstructure optimization and multi-criteria assessment. The method is tailored for sustainable process synthesis utilizing mixed-integer linear programming (MILP). The six-step algorithm includes 1) superstructure formulation, 2) criteria definition and implementation, 3) criteria weighting, 4) single-criterion optimization, 5) reformulation and 6) multi-criteria optimization. It is automated in the &lt;bold&gt; &lt;italic&gt;O&lt;/italic&gt; &lt;/bold&gt; &lt;italic&gt;pen s&lt;/italic&gt; &lt;bold&gt; &lt;italic&gt;U&lt;/italic&gt; &lt;/bold&gt; &lt;italic&gt;perstruc&lt;/italic&gt; &lt;bold&gt; &lt;italic&gt;T&lt;/italic&gt; &lt;/bold&gt; &lt;italic&gt;ure mo&lt;/italic&gt; &lt;bold&gt; &lt;italic&gt;D&lt;/italic&gt; &lt;/bold&gt; &lt;italic&gt;eling and&lt;/italic&gt; &lt;bold&gt; &lt;italic&gt;O&lt;/italic&gt; &lt;/bold&gt; &lt;italic&gt;ptimizati&lt;/italic&gt; &lt;bold&gt; &lt;italic&gt;O&lt;/italic&gt; &lt;/bold&gt; &lt;italic&gt;n f&lt;/italic&gt; &lt;bold&gt; &lt;italic&gt;R&lt;/italic&gt; &lt;/bold&gt; &lt;italic&gt;amework&lt;/italic&gt; (OUTDOOR) and tested on integrated power-to-X and biomass-to-X processes for methanol production. Three criteria are considered, namely net production costs ( &lt;italic&gt;NPC&lt;/italic&gt; ), net production greenhouse gas emissions ( &lt;italic&gt;NPE&lt;/italic&gt; ) and net production fresh water demand ( &lt;italic&gt;NPFWD&lt;/italic&gt; ). The optimization indicates &lt;italic&gt;NPC&lt;/italic&gt; of 1307 €/t &lt;sub&gt;MeOH&lt;/sub&gt; with &lt;italic&gt;NPE&lt;/italic&gt; of −2.23 &lt;inline-formula id=\&quot;j_psr-2020-0058_ineq_001\&quot;&gt; &lt;alternatives&gt; &lt;math&gt; &lt;mrow&gt; &lt;msub&gt; &lt;mtext&gt;t&lt;/mtext&gt; &lt;msub&gt; &lt;mtext&gt;CO&lt;/mtext&gt; &lt;mn&gt;2&lt;/mn&gt; &lt;/msub&gt; &lt;/msub&gt; &lt;mo&gt;/&lt;/mo&gt; &lt;msub&gt; &lt;mtext&gt;t&lt;/mtext&gt; &lt;mtext&gt;MeOH&lt;/mtext&gt; &lt;/msub&gt; &lt;/mrow&gt; &lt;/math&gt; &lt;tex-math&gt;${\\text{t}}_{{\\text{CO}}_{2}}/{\\text{t}}_{\\text{MeOH}}$&lt;/tex-math&gt; &lt;inline-graphic href=\&quot;graphic/j_psr-2020-0058_ineq_001.png\&quot;/&gt; &lt;/alternatives&gt; &lt;/inline-formula&gt; and &lt;italic&gt;NPFWD&lt;/italic&gt; of −3.42 &lt;inline-formula id=\&quot;j_psr-2020-0058_ineq_002\&quot;&gt; &lt;alternatives&gt; &lt;math&gt; &lt;mrow&gt; &lt;msub&gt; &lt;mtext&gt;t&lt;/mtext&gt; &lt;mrow&gt; &lt;msub&gt; &lt;mtext&gt;H&lt;/mtext&gt; &lt;mn&gt;2&lt;/mn&gt; &lt;/msub&gt; &lt;mtext&gt;O&lt;/mtext&gt; &lt;/mrow&gt; &lt;/msub&gt; &lt;mo&gt;/&lt;/mo&gt; &lt;msub&gt; &lt;mtext&gt;t&lt;/mtext&gt; &lt;mtext&gt;MeOH&lt;/mtext&gt; &lt;/msub&gt; &lt;/mrow&gt; &lt;/math&gt; &lt;tex-math&gt;${\\text{t}}_{{\\text{H}}_{2}\\text{O}}/{\\text{t}}_{\\text{MeOH}}$&lt;/tex-math&gt; &lt;inline-graphic href=\&quot;graphic/j_psr-2020-0058_ineq_002.png\&quot;/&gt; &lt;/alternatives&gt; &lt;/inline-formula&gt; for an optimal trade-off plant. The plant configuration features low-pressure alkaline electrolysis for hydrogen supply, absorption-based CO &lt;sub&gt;2&lt;/sub&gt; capture and steam production from methanol purge gas for internal heat supply. Conducted variation and sensitivity analyses indicate that methanol costs can drop to about 500 €/t &lt;sub&gt;MeOH&lt;/sub&gt; if electricity is free of charge, or to 805 €/t &lt;sub&gt;MeOH&lt;/sub&gt; if biogas is available at large quantities, if a least-cost process layouts are considered. However, all performed multi-criteria analyses imply a robust optimal process design utilizing electricity-based methanol production. &lt;/p&gt;&quot;,&quot;issue&quot;:&quot;9&quot;,&quot;volume&quot;:&quot;8&quot;,&quot;container-title-short&quot;:&quot;&quot;},&quot;isTemporary&quot;:false}]},{&quot;citationID&quot;:&quot;MENDELEY_CITATION_17f6286c-8eea-4653-85d8-bedf5256b8a1&quot;,&quot;properties&quot;:{&quot;noteIndex&quot;:0},&quot;isEdited&quot;:false,&quot;manualOverride&quot;:{&quot;isManuallyOverridden&quot;:false,&quot;citeprocText&quot;:&quot;[37]&quot;,&quot;manualOverrideText&quot;:&quot;&quot;},&quot;citationTag&quot;:&quot;MENDELEY_CITATION_v3_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&quot;,&quot;citationItems&quot;:[{&quot;id&quot;:&quot;a94934b4-96b0-3079-8b75-f945ca40e652&quot;,&quot;itemData&quot;:{&quot;type&quot;:&quot;article-journal&quot;,&quot;id&quot;:&quot;a94934b4-96b0-3079-8b75-f945ca40e652&quot;,&quot;title&quot;:&quot;Multi-Objective Optimization of an Energy Community Powered by a Distributed Polygeneration System&quot;,&quot;author&quot;:[{&quot;family&quot;:&quot;Souza&quot;,&quot;given&quot;:&quot;Ronelly José&quot;,&quot;parse-names&quot;:false,&quot;dropping-particle&quot;:&quot;&quot;,&quot;non-dropping-particle&quot;:&quot;De&quot;},{&quot;family&quot;:&quot;Reini&quot;,&quot;given&quot;:&quot;Mauro&quot;,&quot;parse-names&quot;:false,&quot;dropping-particle&quot;:&quot;&quot;,&quot;non-dropping-particle&quot;:&quot;&quot;},{&quot;family&quot;:&quot;Serra&quot;,&quot;given&quot;:&quot;Luis M.&quot;,&quot;parse-names&quot;:false,&quot;dropping-particle&quot;:&quot;&quot;,&quot;non-dropping-particle&quot;:&quot;&quot;},{&quot;family&quot;:&quot;Lozano&quot;,&quot;given&quot;:&quot;Miguel A.&quot;,&quot;parse-names&quot;:false,&quot;dropping-particle&quot;:&quot;&quot;,&quot;non-dropping-particle&quot;:&quot;&quot;},{&quot;family&quot;:&quot;Nadalon&quot;,&quot;given&quot;:&quot;Emanuele&quot;,&quot;parse-names&quot;:false,&quot;dropping-particle&quot;:&quot;&quot;,&quot;non-dropping-particle&quot;:&quot;&quot;},{&quot;family&quot;:&quot;Casisi&quot;,&quot;given&quot;:&quot;Melchiorre&quot;,&quot;parse-names&quot;:false,&quot;dropping-particle&quot;:&quot;&quot;,&quot;non-dropping-particle&quot;:&quot;&quot;}],&quot;container-title&quot;:&quot;Energies&quot;,&quot;DOI&quot;:&quot;10.3390/en17133085&quot;,&quot;ISSN&quot;:&quot;1996-1073&quot;,&quot;issued&quot;:{&quot;date-parts&quot;:[[2024,6,22]]},&quot;page&quot;:&quot;3085&quot;,&quot;abstract&quot;:&quot;&lt;p&gt;This paper presents a multi-objective optimization model for the integration of polygeneration systems into energy communities (ECs), by analyzing a case study. The concept of ECs is increasingly seen as beneficial for reducing global energy consumption and greenhouse gas emissions. Polygeneration systems have the potential to play a crucial role in this context, since they are known for producing multiple energy services from a single energy resource, besides the possibility of being fed also by renewable energy sources. However, optimizing the configuration and operation of these systems within ECs presents complex challenges due to the variety of technologies involved, their interactions, and the dynamic behavior of buildings. Therefore, the aim of this work is developing a mathematical model using a mixed integer linear programming (MILP) algorithm to optimally design and operate polygeneration systems integrated into ECs. The model is applied to a case study of an EC comprising nine buildings in a small city in the northeast of Italy. The work rests on the single- and multi-objective optimization of the polygeneration systems taking into account the sharing of electricity among the buildings (both self-produced and/or the purchased from the grid), as well as the sharing of heating and cooling between the buildings through a district heating and cooling network (DHCN). The main results from the EC case study show the possibility of reducing the total annual CO2 emissions by around 24.3% (about 1.72 kt CO2/year) while increasing the total annual costs by 1.9% (about 0.09 M€/year) or reducing the total annual costs by 31.9% (about 1.47 M€/year) while increasing the total annual CO2 emissions by 2.2% (about 0.16 kt CO2/year). The work developed within this research can be adapted to different case studies, such as in the residential–commercial buildings and industrial sectors. Therefore, the model resulting from this work constitutes an effective tool to optimally design and operate polygeneration systems integrated into ECs.&lt;/p&gt;&quot;,&quot;issue&quot;:&quot;13&quot;,&quot;volume&quot;:&quot;17&quot;,&quot;container-title-short&quot;:&quot;Energies (Basel).&quot;},&quot;isTemporary&quot;:false}]},{&quot;citationID&quot;:&quot;MENDELEY_CITATION_94464e02-64aa-4b84-948c-989aee7cb4eb&quot;,&quot;properties&quot;:{&quot;noteIndex&quot;:0},&quot;isEdited&quot;:false,&quot;manualOverride&quot;:{&quot;isManuallyOverridden&quot;:false,&quot;citeprocText&quot;:&quot;[38]&quot;,&quot;manualOverrideText&quot;:&quot;&quot;},&quot;citationTag&quot;:&quot;MENDELEY_CITATION_v3_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&quot;,&quot;citationItems&quot;:[{&quot;id&quot;:&quot;39e6e63a-abdc-38b4-bc7e-087f23193300&quot;,&quot;itemData&quot;:{&quot;type&quot;:&quot;article-journal&quot;,&quot;id&quot;:&quot;39e6e63a-abdc-38b4-bc7e-087f23193300&quot;,&quot;title&quot;:&quot;Energy Demand Response in a Food-Processing Plant: A Deep Reinforcement Learning Approach&quot;,&quot;author&quot;:[{&quot;family&quot;:&quot;Wohlgenannt&quot;,&quot;given&quot;:&quot;Philipp&quot;,&quot;parse-names&quot;:false,&quot;dropping-particle&quot;:&quot;&quot;,&quot;non-dropping-particle&quot;:&quot;&quot;},{&quot;family&quot;:&quot;Hegenbart&quot;,&quot;given&quot;:&quot;Sebastian&quot;,&quot;parse-names&quot;:false,&quot;dropping-particle&quot;:&quot;&quot;,&quot;non-dropping-particle&quot;:&quot;&quot;},{&quot;family&quot;:&quot;Eder&quot;,&quot;given&quot;:&quot;Elias&quot;,&quot;parse-names&quot;:false,&quot;dropping-particle&quot;:&quot;&quot;,&quot;non-dropping-particle&quot;:&quot;&quot;},{&quot;family&quot;:&quot;Kolhe&quot;,&quot;given&quot;:&quot;Mohan&quot;,&quot;parse-names&quot;:false,&quot;dropping-particle&quot;:&quot;&quot;,&quot;non-dropping-particle&quot;:&quot;&quot;},{&quot;family&quot;:&quot;Kepplinger&quot;,&quot;given&quot;:&quot;Peter&quot;,&quot;parse-names&quot;:false,&quot;dropping-particle&quot;:&quot;&quot;,&quot;non-dropping-particle&quot;:&quot;&quot;}],&quot;container-title&quot;:&quot;Energies&quot;,&quot;container-title-short&quot;:&quot;Energies (Basel).&quot;,&quot;DOI&quot;:&quot;10.3390/en17246430&quot;,&quot;ISSN&quot;:&quot;1996-1073&quot;,&quot;issued&quot;:{&quot;date-parts&quot;:[[2024,12,20]]},&quot;page&quot;:&quot;6430&quot;,&quot;abstract&quot;:&quot;&lt;p&gt;The food industry faces significant challenges in managing operational costs due to its high energy intensity and rising energy prices. Industrial food-processing facilities, with substantial thermal capacities and large demands for cooling and heating, offer promising opportunities for demand response (DR) strategies. This study explores the application of deep reinforcement learning (RL) as an innovative, data-driven approach for DR in the food industry. By leveraging the adaptive, self-learning capabilities of RL, energy costs in the investigated plant are effectively decreased. The RL algorithm was compared with the well-established optimization method Mixed Integer Linear Programming (MILP), and both were benchmarked against a reference scenario without DR. The two optimization strategies demonstrate cost savings of 17.57% and 18.65% for RL and MILP, respectively. Although RL is slightly less efficient in cost reduction, it significantly outperforms in computational speed, being approximately 20 times faster. During operation, RL only needs 2ms per optimization compared to 19s for MILP, making it a promising optimization tool for edge computing. Moreover, while MILP’s computation time increases considerably with the number of binary variables, RL efficiently learns dynamic system behavior and scales to more complex systems without significant performance degradation. These results highlight that deep RL, when applied to DR, offers substantial cost savings and computational efficiency, with broad applicability to energy management in various applications.&lt;/p&gt;&quot;,&quot;issue&quot;:&quot;24&quot;,&quot;volume&quot;:&quot;17&quot;},&quot;isTemporary&quot;:false}]},{&quot;citationID&quot;:&quot;MENDELEY_CITATION_f6ee1e61-1bbe-43ae-916b-e4b52f3e034f&quot;,&quot;properties&quot;:{&quot;noteIndex&quot;:0},&quot;isEdited&quot;:false,&quot;manualOverride&quot;:{&quot;isManuallyOverridden&quot;:false,&quot;citeprocText&quot;:&quot;[39]&quot;,&quot;manualOverrideText&quot;:&quot;&quot;},&quot;citationTag&quot;:&quot;MENDELEY_CITATION_v3_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&quot;,&quot;citationItems&quot;:[{&quot;id&quot;:&quot;db0b8039-29f3-359f-944c-e94a21d1ea11&quot;,&quot;itemData&quot;:{&quot;type&quot;:&quot;paper-conference&quot;,&quot;id&quot;:&quot;db0b8039-29f3-359f-944c-e94a21d1ea11&quot;,&quot;title&quot;:&quot;Performance Comparison of Deep RL Algorithms for Energy Systems Optimal Scheduling&quot;,&quot;author&quot;:[{&quot;family&quot;:&quot;Shengren&quot;,&quot;given&quot;:&quot;Hou&quot;,&quot;parse-names&quot;:false,&quot;dropping-particle&quot;:&quot;&quot;,&quot;non-dropping-particle&quot;:&quot;&quot;},{&quot;family&quot;:&quot;Salazar&quot;,&quot;given&quot;:&quot;Edgar Mauricio&quot;,&quot;parse-names&quot;:false,&quot;dropping-particle&quot;:&quot;&quot;,&quot;non-dropping-particle&quot;:&quot;&quot;},{&quot;family&quot;:&quot;Vergara&quot;,&quot;given&quot;:&quot;Pedro P.&quot;,&quot;parse-names&quot;:false,&quot;dropping-particle&quot;:&quot;&quot;,&quot;non-dropping-particle&quot;:&quot;&quot;},{&quot;family&quot;:&quot;Palensky&quot;,&quot;given&quot;:&quot;Peter&quot;,&quot;parse-names&quot;:false,&quot;dropping-particle&quot;:&quot;&quot;,&quot;non-dropping-particle&quot;:&quot;&quot;}],&quot;container-title&quot;:&quot;2022 IEEE PES Innovative Smart Grid Technologies Conference Europe (ISGT-Europe)&quot;,&quot;DOI&quot;:&quot;10.1109/ISGT-Europe54678.2022.9960642&quot;,&quot;ISBN&quot;:&quot;978-1-6654-8032-1&quot;,&quot;issued&quot;:{&quot;date-parts&quot;:[[2022,10,10]]},&quot;page&quot;:&quot;1-6&quot;,&quot;publisher&quot;:&quot;IEEE&quot;,&quot;container-title-short&quot;:&quot;&quot;},&quot;isTemporary&quot;:false}]},{&quot;citationID&quot;:&quot;MENDELEY_CITATION_96ae9baa-ea86-4a08-9c4f-af9c24e3165b&quot;,&quot;properties&quot;:{&quot;noteIndex&quot;:0},&quot;isEdited&quot;:false,&quot;manualOverride&quot;:{&quot;isManuallyOverridden&quot;:false,&quot;citeprocText&quot;:&quot;[40]&quot;,&quot;manualOverrideText&quot;:&quot;&quot;},&quot;citationTag&quot;:&quot;MENDELEY_CITATION_v3_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&quot;,&quot;citationItems&quot;:[{&quot;id&quot;:&quot;24483df0-3b18-335c-b6c9-40541914d90d&quot;,&quot;itemData&quot;:{&quot;type&quot;:&quot;article-journal&quot;,&quot;id&quot;:&quot;24483df0-3b18-335c-b6c9-40541914d90d&quot;,&quot;title&quot;:&quot;Mixed Deep Reinforcement Learning Considering Discrete-continuous Hybrid Action Space for Smart Home Energy Management&quot;,&quot;author&quot;:[{&quot;family&quot;:&quot;Huang&quot;,&quot;given&quot;:&quot;Chao&quot;,&quot;parse-names&quot;:false,&quot;dropping-particle&quot;:&quot;&quot;,&quot;non-dropping-particle&quot;:&quot;&quot;},{&quot;family&quot;:&quot;Zhang&quot;,&quot;given&quot;:&quot;Hongcai&quot;,&quot;parse-names&quot;:false,&quot;dropping-particle&quot;:&quot;&quot;,&quot;non-dropping-particle&quot;:&quot;&quot;},{&quot;family&quot;:&quot;Wang&quot;,&quot;given&quot;:&quot;Long&quot;,&quot;parse-names&quot;:false,&quot;dropping-particle&quot;:&quot;&quot;,&quot;non-dropping-particle&quot;:&quot;&quot;},{&quot;family&quot;:&quot;Luo&quot;,&quot;given&quot;:&quot;Xiong&quot;,&quot;parse-names&quot;:false,&quot;dropping-particle&quot;:&quot;&quot;,&quot;non-dropping-particle&quot;:&quot;&quot;},{&quot;family&quot;:&quot;Song&quot;,&quot;given&quot;:&quot;Yonghua&quot;,&quot;parse-names&quot;:false,&quot;dropping-particle&quot;:&quot;&quot;,&quot;non-dropping-particle&quot;:&quot;&quot;}],&quot;container-title&quot;:&quot;Journal of Modern Power Systems and Clean Energy&quot;,&quot;DOI&quot;:&quot;10.35833/MPCE.2021.000394&quot;,&quot;ISSN&quot;:&quot;2196-5625&quot;,&quot;issued&quot;:{&quot;date-parts&quot;:[[2022]]},&quot;page&quot;:&quot;743-754&quot;,&quot;issue&quot;:&quot;3&quot;,&quot;volume&quot;:&quot;10&quot;,&quot;container-title-short&quot;:&quot;&quot;},&quot;isTemporary&quot;:false}]},{&quot;citationID&quot;:&quot;MENDELEY_CITATION_6c73ec7e-f594-40ea-aad9-4c624f81d6ce&quot;,&quot;properties&quot;:{&quot;noteIndex&quot;:0},&quot;isEdited&quot;:false,&quot;manualOverride&quot;:{&quot;isManuallyOverridden&quot;:false,&quot;citeprocText&quot;:&quot;[41]&quot;,&quot;manualOverrideText&quot;:&quot;&quot;},&quot;citationTag&quot;:&quot;MENDELEY_CITATION_v3_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&quot;,&quot;citationItems&quot;:[{&quot;id&quot;:&quot;e6b87f49-da3a-31c2-9708-c2655a7acf54&quot;,&quot;itemData&quot;:{&quot;type&quot;:&quot;article-journal&quot;,&quot;id&quot;:&quot;e6b87f49-da3a-31c2-9708-c2655a7acf54&quot;,&quot;title&quot;:&quot;Deep reinforcement learning-based energy management for design and control of off-grid renewable microgrids with dual-battery storage&quot;,&quot;author&quot;:[{&quot;family&quot;:&quot;Khan&quot;,&quot;given&quot;:&quot;Wajid&quot;,&quot;parse-names&quot;:false,&quot;dropping-particle&quot;:&quot;&quot;,&quot;non-dropping-particle&quot;:&quot;&quot;},{&quot;family&quot;:&quot;Renhai&quot;,&quot;given&quot;:&quot;Feng&quot;,&quot;parse-names&quot;:false,&quot;dropping-particle&quot;:&quot;&quot;,&quot;non-dropping-particle&quot;:&quot;&quot;},{&quot;family&quot;:&quot;Aziz&quot;,&quot;given&quot;:&quot;Abdul&quot;,&quot;parse-names&quot;:false,&quot;dropping-particle&quot;:&quot;&quot;,&quot;non-dropping-particle&quot;:&quot;&quot;},{&quot;family&quot;:&quot;Yousaf&quot;,&quot;given&quot;:&quot;Muhammad Zain&quot;,&quot;parse-names&quot;:false,&quot;dropping-particle&quot;:&quot;&quot;,&quot;non-dropping-particle&quot;:&quot;&quot;},{&quot;family&quot;:&quot;Cai&quot;,&quot;given&quot;:&quot;Zhi&quot;,&quot;parse-names&quot;:false,&quot;dropping-particle&quot;:&quot;&quot;,&quot;non-dropping-particle&quot;:&quot;&quot;},{&quot;family&quot;:&quot;Iqbal&quot;,&quot;given&quot;:&quot;Muhammad Umair&quot;,&quot;parse-names&quot;:false,&quot;dropping-particle&quot;:&quot;&quot;,&quot;non-dropping-particle&quot;:&quot;&quot;},{&quot;family&quot;:&quot;Wang&quot;,&quot;given&quot;:&quot;Jiang&quot;,&quot;parse-names&quot;:false,&quot;dropping-particle&quot;:&quot;&quot;,&quot;non-dropping-particle&quot;:&quot;&quot;},{&quot;family&quot;:&quot;Abdullah&quot;,&quot;given&quot;:&quot;Mustafa&quot;,&quot;parse-names&quot;:false,&quot;dropping-particle&quot;:&quot;&quot;,&quot;non-dropping-particle&quot;:&quot;&quot;},{&quot;family&quot;:&quot;Geremew&quot;,&quot;given&quot;:&quot;Mebratu Sintie&quot;,&quot;parse-names&quot;:false,&quot;dropping-particle&quot;:&quot;&quot;,&quot;non-dropping-particle&quot;:&quot;&quot;}],&quot;container-title&quot;:&quot;Energy Exploration &amp; Exploitation&quot;,&quot;DOI&quot;:&quot;10.1177/01445987251387368&quot;,&quot;ISSN&quot;:&quot;0144-5987&quot;,&quot;issued&quot;:{&quot;date-parts&quot;:[[2026,3,16]]},&quot;page&quot;:&quot;821-869&quot;,&quot;abstract&quot;:&quot;&lt;p&gt; Meeting the growing global electricity demand in remote and off-grid regions requires cost-effective and reliable power solutions that overcome the intermittency of renewable energy sources. This paper presents a comprehensive techno-economic optimization framework for the design and operation of off-grid hybrid renewable energy systems (HRES) integrating photovoltaic (PV), wind turbine, biomass generator, diesel backup, and a dual-chemistry hybrid battery energy storage system (HBESS) combining lithium-ion and nickel-iron batteries. A detailed mathematical modeling approach is employed to capture the nonlinear dynamics, stochastic renewable behavior, battery degradation, and temperature-adjusted component efficiencies. The system is formulated as a multi-objective mixed-integer nonlinear programming problem targeting the minimization of life cycle cost (LCC), levelized cost of energy (LCOE), and CO &lt;sub&gt;2&lt;/sub&gt; emissions while satisfying reliability constraints such as loss of power supply probability (LPSP &amp;lt; 0.01). To solve the optimization problem, advanced metaheuristic algorithms—Particle Swarm Optimization (PSO), Genetic Algorithms (GA), Grey Wolf Optimizer (GWO), and Differential Evolution (DE), and Salp Swarm Algorithm (SSA)—and a Deep Q-Network (DQN)-based reinforcement learning energy management strategy are implemented and benchmarked. The proposed DQN-based controller demonstrates superior performance over conventional rule-based and static dispatch methods by maintaining more stable battery state-of-charge (SOC) profiles, reducing degradation, and enabling intelligent real-time decision-making. Simulation results based on realistic meteorological and demand profiles reveal that the integrated DQN and HBESS strategy reduces total LCC by over 20%, CO &lt;sub&gt;2&lt;/sub&gt; emissions by up to 30%, and battery degradation costs by over 10% compared to baseline systems. The Salp Swarm Algorithm (SSA) achieves the fastest convergence and the highest-quality Pareto-optimal solutions among all metaheuristics evaluated. Sensitivity analysis identifies diesel price and interest rate as the most influential parameters on LCOE, while load shifting through aggressive demand-side management further minimizes battery usage, operating costs, and emissions. The proposed framework not only addresses key challenges in off-grid microgrid design but also provides a scalable and robust pathway for sustainable rural electrification using hybrid storage and intelligent control. &lt;/p&gt;&quot;,&quot;issue&quot;:&quot;2&quot;,&quot;volume&quot;:&quot;44&quot;,&quot;container-title-short&quot;:&quot;&quot;},&quot;isTemporary&quot;:false}]},{&quot;citationID&quot;:&quot;MENDELEY_CITATION_4aa9aa38-c6f8-4655-adad-651820be928f&quot;,&quot;properties&quot;:{&quot;noteIndex&quot;:0},&quot;isEdited&quot;:false,&quot;manualOverride&quot;:{&quot;isManuallyOverridden&quot;:false,&quot;citeprocText&quot;:&quot;[42]&quot;,&quot;manualOverrideText&quot;:&quot;&quot;},&quot;citationTag&quot;:&quot;MENDELEY_CITATION_v3_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&quot;,&quot;citationItems&quot;:[{&quot;id&quot;:&quot;724df896-ae80-37a5-bbb1-ea526b483901&quot;,&quot;itemData&quot;:{&quot;type&quot;:&quot;article-journal&quot;,&quot;id&quot;:&quot;724df896-ae80-37a5-bbb1-ea526b483901&quot;,&quot;title&quot;:&quot;Energy Demand Response in a Food-Processing Plant: A Deep Reinforcement Learning Approach&quot;,&quot;author&quot;:[{&quot;family&quot;:&quot;Wohlgenannt&quot;,&quot;given&quot;:&quot;Philipp&quot;,&quot;parse-names&quot;:false,&quot;dropping-particle&quot;:&quot;&quot;,&quot;non-dropping-particle&quot;:&quot;&quot;},{&quot;family&quot;:&quot;Hegenbart&quot;,&quot;given&quot;:&quot;Sebastian&quot;,&quot;parse-names&quot;:false,&quot;dropping-particle&quot;:&quot;&quot;,&quot;non-dropping-particle&quot;:&quot;&quot;},{&quot;family&quot;:&quot;Eder&quot;,&quot;given&quot;:&quot;Elias&quot;,&quot;parse-names&quot;:false,&quot;dropping-particle&quot;:&quot;&quot;,&quot;non-dropping-particle&quot;:&quot;&quot;},{&quot;family&quot;:&quot;Kolhe&quot;,&quot;given&quot;:&quot;Mohan&quot;,&quot;parse-names&quot;:false,&quot;dropping-particle&quot;:&quot;&quot;,&quot;non-dropping-particle&quot;:&quot;&quot;},{&quot;family&quot;:&quot;Kepplinger&quot;,&quot;given&quot;:&quot;Peter&quot;,&quot;parse-names&quot;:false,&quot;dropping-particle&quot;:&quot;&quot;,&quot;non-dropping-particle&quot;:&quot;&quot;}],&quot;container-title&quot;:&quot;Energies&quot;,&quot;container-title-short&quot;:&quot;Energies (Basel).&quot;,&quot;DOI&quot;:&quot;10.3390/en17246430&quot;,&quot;ISSN&quot;:&quot;1996-1073&quot;,&quot;issued&quot;:{&quot;date-parts&quot;:[[2024,12,20]]},&quot;page&quot;:&quot;6430&quot;,&quot;abstract&quot;:&quot;&lt;p&gt;The food industry faces significant challenges in managing operational costs due to its high energy intensity and rising energy prices. Industrial food-processing facilities, with substantial thermal capacities and large demands for cooling and heating, offer promising opportunities for demand response (DR) strategies. This study explores the application of deep reinforcement learning (RL) as an innovative, data-driven approach for DR in the food industry. By leveraging the adaptive, self-learning capabilities of RL, energy costs in the investigated plant are effectively decreased. The RL algorithm was compared with the well-established optimization method Mixed Integer Linear Programming (MILP), and both were benchmarked against a reference scenario without DR. The two optimization strategies demonstrate cost savings of 17.57% and 18.65% for RL and MILP, respectively. Although RL is slightly less efficient in cost reduction, it significantly outperforms in computational speed, being approximately 20 times faster. During operation, RL only needs 2ms per optimization compared to 19s for MILP, making it a promising optimization tool for edge computing. Moreover, while MILP’s computation time increases considerably with the number of binary variables, RL efficiently learns dynamic system behavior and scales to more complex systems without significant performance degradation. These results highlight that deep RL, when applied to DR, offers substantial cost savings and computational efficiency, with broad applicability to energy management in various applications.&lt;/p&gt;&quot;,&quot;issue&quot;:&quot;24&quot;,&quot;volume&quot;:&quot;17&quot;},&quot;isTemporary&quot;:false}]},{&quot;citationID&quot;:&quot;MENDELEY_CITATION_7cbe8449-6ae3-4327-a6e1-c91a210c1a1d&quot;,&quot;properties&quot;:{&quot;noteIndex&quot;:0},&quot;isEdited&quot;:false,&quot;manualOverride&quot;:{&quot;isManuallyOverridden&quot;:false,&quot;citeprocText&quot;:&quot;[43], [44]&quot;,&quot;manualOverrideText&quot;:&quot;&quot;},&quot;citationTag&quot;:&quot;MENDELEY_CITATION_v3_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&quot;,&quot;citationItems&quot;:[{&quot;id&quot;:&quot;80e0b832-1c6f-3864-9f71-9b273477a917&quot;,&quot;itemData&quot;:{&quot;type&quot;:&quot;article-journal&quot;,&quot;id&quot;:&quot;80e0b832-1c6f-3864-9f71-9b273477a917&quot;,&quot;title&quot;:&quot;Reinforcement Learning Techniques in Optimizing Energy Systems&quot;,&quot;author&quot;:[{&quot;family&quot;:&quot;Stavrev&quot;,&quot;given&quot;:&quot;Stefan&quot;,&quot;parse-names&quot;:false,&quot;dropping-particle&quot;:&quot;&quot;,&quot;non-dropping-particle&quot;:&quot;&quot;},{&quot;family&quot;:&quot;Ginchev&quot;,&quot;given&quot;:&quot;Dimitar&quot;,&quot;parse-names&quot;:false,&quot;dropping-particle&quot;:&quot;&quot;,&quot;non-dropping-particle&quot;:&quot;&quot;}],&quot;container-title&quot;:&quot;Electronics&quot;,&quot;DOI&quot;:&quot;10.3390/electronics13081459&quot;,&quot;ISSN&quot;:&quot;2079-9292&quot;,&quot;issued&quot;:{&quot;date-parts&quot;:[[2024,4,12]]},&quot;page&quot;:&quot;1459&quot;,&quot;abstract&quot;:&quot;&lt;p&gt;Reinforcement learning (RL) techniques have emerged as powerful tools for optimizing energy systems, offering the potential to enhance efficiency, reliability, and sustainability. This review paper provides a comprehensive examination of the applications of RL in the field of energy system optimization, spanning various domains such as energy management, grid control, and renewable energy integration. Beginning with an overview of RL fundamentals, the paper explores recent advancements in RL algorithms and their adaptation to address the unique challenges of energy system optimization. Case studies and real-world applications demonstrate the efficacy of RL-based approaches in improving energy efficiency, reducing costs, and mitigating environmental impacts. Furthermore, the paper discusses future directions and challenges, including scalability, interpretability, and integration with domain knowledge. By synthesizing the latest research findings and identifying key areas for further investigation, this paper aims to inform and inspire future research endeavors in the intersection of reinforcement learning and energy system optimization.&lt;/p&gt;&quot;,&quot;issue&quot;:&quot;8&quot;,&quot;volume&quot;:&quot;13&quot;,&quot;container-title-short&quot;:&quot;Electronics (Basel).&quot;},&quot;isTemporary&quot;:false},{&quot;id&quot;:&quot;71c1ace4-7085-3db1-9b31-493a7b2fcde3&quot;,&quot;itemData&quot;:{&quot;type&quot;:&quot;article-journal&quot;,&quot;id&quot;:&quot;71c1ace4-7085-3db1-9b31-493a7b2fcde3&quot;,&quot;title&quot;:&quot;Deep Reinforcement Learning Approaches the MILP Optimum of a Multi-Energy Optimization in Energy Communities&quot;,&quot;author&quot;:[{&quot;family&quot;:&quot;Vetter&quot;,&quot;given&quot;:&quot;Vinzent&quot;,&quot;parse-names&quot;:false,&quot;dropping-particle&quot;:&quot;&quot;,&quot;non-dropping-particle&quot;:&quot;&quot;},{&quot;family&quot;:&quot;Wohlgenannt&quot;,&quot;given&quot;:&quot;Philipp&quot;,&quot;parse-names&quot;:false,&quot;dropping-particle&quot;:&quot;&quot;,&quot;non-dropping-particle&quot;:&quot;&quot;},{&quot;family&quot;:&quot;Kepplinger&quot;,&quot;given&quot;:&quot;Peter&quot;,&quot;parse-names&quot;:false,&quot;dropping-particle&quot;:&quot;&quot;,&quot;non-dropping-particle&quot;:&quot;&quot;},{&quot;family&quot;:&quot;Eder&quot;,&quot;given&quot;:&quot;Elias&quot;,&quot;parse-names&quot;:false,&quot;dropping-particle&quot;:&quot;&quot;,&quot;non-dropping-particle&quot;:&quot;&quot;}],&quot;container-title&quot;:&quot;Energies&quot;,&quot;DOI&quot;:&quot;10.3390/en18174489&quot;,&quot;ISSN&quot;:&quot;1996-1073&quot;,&quot;issued&quot;:{&quot;date-parts&quot;:[[2025,8,23]]},&quot;page&quot;:&quot;4489&quot;,&quot;abstract&quot;:&quot;&lt;p&gt;As energy systems transition toward high shares of variable renewable generation, local energy communities (ECs) are increasingly relevant for enabling demand-side flexibility and self-sufficiency. This shift is particularly evident in the residential sector, where the deployment of photovoltaic (PV) systems is rapidly growing. While mixed-integer linear programming (MILP) remains the standard for operational optimization and demand response in such systems, its computational burden limits scalability and responsiveness under real-time or uncertain conditions. Reinforcement learning (RL), by contrast, offers a model-free, adaptive alternative. However, its application to real-world energy system operation remains limited. This study explores the application of a Deep Q-Network (DQN) to a real residential EC, which has received limited attention in prior work. The system comprises three single-family homes sharing a centralized heating system with a thermal energy storage (TES), a PV installation, and a grid connection. We compare the performance of MILP and RL controllers across economic and environmental metrics. Relative to a reference scenario without TES, MILP and RL reduce energy costs by 10.06% and 8.78%, respectively, and both approaches yield lower total energy consumption and CO2-equivalent emissions. Notably, the trained RL agent achieves a near-optimal outcome while requiring only 22% of the MILP’s computation time. These results demonstrate that DQNs can offer a computationally efficient and practically viable alternative to MILP for real-time control in residential energy systems.&lt;/p&gt;&quot;,&quot;issue&quot;:&quot;17&quot;,&quot;volume&quot;:&quot;18&quot;,&quot;container-title-short&quot;:&quot;Energies (Basel).&quot;},&quot;isTemporary&quot;:false}]},{&quot;citationID&quot;:&quot;MENDELEY_CITATION_fb974e0b-7e67-4c93-a30f-ed459a189960&quot;,&quot;properties&quot;:{&quot;noteIndex&quot;:0},&quot;isEdited&quot;:false,&quot;manualOverride&quot;:{&quot;isManuallyOverridden&quot;:false,&quot;citeprocText&quot;:&quot;[45]&quot;,&quot;manualOverrideText&quot;:&quot;&quot;},&quot;citationTag&quot;:&quot;MENDELEY_CITATION_v3_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&quot;,&quot;citationItems&quot;:[{&quot;id&quot;:&quot;8dce386b-1be0-3f7f-90b3-85aff7b0a20e&quot;,&quot;itemData&quot;:{&quot;type&quot;:&quot;article-journal&quot;,&quot;id&quot;:&quot;8dce386b-1be0-3f7f-90b3-85aff7b0a20e&quot;,&quot;title&quot;:&quot;Optimal energy system scheduling using a constraint-aware reinforcement learning algorithm&quot;,&quot;author&quot;:[{&quot;family&quot;:&quot;Shengren&quot;,&quot;given&quot;:&quot;Hou&quot;,&quot;parse-names&quot;:false,&quot;dropping-particle&quot;:&quot;&quot;,&quot;non-dropping-particle&quot;:&quot;&quot;},{&quot;family&quot;:&quot;Vergara&quot;,&quot;given&quot;:&quot;Pedro P.&quot;,&quot;parse-names&quot;:false,&quot;dropping-particle&quot;:&quot;&quot;,&quot;non-dropping-particle&quot;:&quot;&quot;},{&quot;family&quot;:&quot;Salazar Duque&quot;,&quot;given&quot;:&quot;Edgar Mauricio&quot;,&quot;parse-names&quot;:false,&quot;dropping-particle&quot;:&quot;&quot;,&quot;non-dropping-particle&quot;:&quot;&quot;},{&quot;family&quot;:&quot;Palensky&quot;,&quot;given&quot;:&quot;Peter&quot;,&quot;parse-names&quot;:false,&quot;dropping-particle&quot;:&quot;&quot;,&quot;non-dropping-particle&quot;:&quot;&quot;}],&quot;container-title&quot;:&quot;International Journal of Electrical Power &amp; Energy Systems&quot;,&quot;DOI&quot;:&quot;10.1016/j.ijepes.2023.109230&quot;,&quot;ISSN&quot;:&quot;01420615&quot;,&quot;issued&quot;:{&quot;date-parts&quot;:[[2023,10]]},&quot;page&quot;:&quot;109230&quot;,&quot;volume&quot;:&quot;152&quot;,&quot;container-title-short&quot;:&quot;&quot;},&quot;isTemporary&quot;:false}]},{&quot;citationID&quot;:&quot;MENDELEY_CITATION_1cdcd498-a953-4c56-9fed-7dd79ae2f0e4&quot;,&quot;properties&quot;:{&quot;noteIndex&quot;:0},&quot;isEdited&quot;:false,&quot;manualOverride&quot;:{&quot;isManuallyOverridden&quot;:false,&quot;citeprocText&quot;:&quot;[46]&quot;,&quot;manualOverrideText&quot;:&quot;&quot;},&quot;citationTag&quot;:&quot;MENDELEY_CITATION_v3_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&quot;,&quot;citationItems&quot;:[{&quot;id&quot;:&quot;06c2b8d2-b2dc-3af5-b126-6311b944aca0&quot;,&quot;itemData&quot;:{&quot;type&quot;:&quot;article&quot;,&quot;id&quot;:&quot;06c2b8d2-b2dc-3af5-b126-6311b944aca0&quot;,&quot;title&quot;:&quot;Reinforcement Learning Techniques in Optimizing Energy Systems&quot;,&quot;author&quot;:[{&quot;family&quot;:&quot;Stavrev&quot;,&quot;given&quot;:&quot;Stefan&quot;,&quot;parse-names&quot;:false,&quot;dropping-particle&quot;:&quot;&quot;,&quot;non-dropping-particle&quot;:&quot;&quot;},{&quot;family&quot;:&quot;Ginchev&quot;,&quot;given&quot;:&quot;Dimitar&quot;,&quot;parse-names&quot;:false,&quot;dropping-particle&quot;:&quot;&quot;,&quot;non-dropping-particle&quot;:&quot;&quot;}],&quot;container-title&quot;:&quot;Electronics (Switzerland)&quot;,&quot;DOI&quot;:&quot;10.3390/electronics13081459&quot;,&quot;ISSN&quot;:&quot;20799292&quot;,&quot;issued&quot;:{&quot;date-parts&quot;:[[2024,4,1]]},&quot;abstract&quot;:&quot;Reinforcement learning (RL) techniques have emerged as powerful tools for optimizing energy systems, offering the potential to enhance efficiency, reliability, and sustainability. This review paper provides a comprehensive examination of the applications of RL in the field of energy system optimization, spanning various domains such as energy management, grid control, and renewable energy integration. Beginning with an overview of RL fundamentals, the paper explores recent advancements in RL algorithms and their adaptation to address the unique challenges of energy system optimization. Case studies and real-world applications demonstrate the efficacy of RL-based approaches in improving energy efficiency, reducing costs, and mitigating environmental impacts. Furthermore, the paper discusses future directions and challenges, including scalability, interpretability, and integration with domain knowledge. By synthesizing the latest research findings and identifying key areas for further investigation, this paper aims to inform and inspire future research endeavors in the intersection of reinforcement learning and energy system optimization.&quot;,&quot;publisher&quot;:&quot;Multidisciplinary Digital Publishing Institute (MDPI)&quot;,&quot;issue&quot;:&quot;8&quot;,&quot;volume&quot;:&quot;13&quot;,&quot;container-title-short&quot;:&quot;&quot;},&quot;isTemporary&quot;:false}]},{&quot;citationID&quot;:&quot;MENDELEY_CITATION_8f9fc719-49df-456a-8934-5bb7891faa53&quot;,&quot;properties&quot;:{&quot;noteIndex&quot;:0},&quot;isEdited&quot;:false,&quot;manualOverride&quot;:{&quot;isManuallyOverridden&quot;:false,&quot;citeprocText&quot;:&quot;[47]&quot;,&quot;manualOverrideText&quot;:&quot;&quot;},&quot;citationTag&quot;:&quot;MENDELEY_CITATION_v3_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&quot;,&quot;citationItems&quot;:[{&quot;id&quot;:&quot;b748b453-1bc9-3b06-a2bc-accd4d93d9d9&quot;,&quot;itemData&quot;:{&quot;type&quot;:&quot;article-journal&quot;,&quot;id&quot;:&quot;b748b453-1bc9-3b06-a2bc-accd4d93d9d9&quot;,&quot;title&quot;:&quot;Applications of reinforcement learning in energy systems&quot;,&quot;author&quot;:[{&quot;family&quot;:&quot;Perera&quot;,&quot;given&quot;:&quot;A.T.D.&quot;,&quot;parse-names&quot;:false,&quot;dropping-particle&quot;:&quot;&quot;,&quot;non-dropping-particle&quot;:&quot;&quot;},{&quot;family&quot;:&quot;Kamalaruban&quot;,&quot;given&quot;:&quot;Parameswaran&quot;,&quot;parse-names&quot;:false,&quot;dropping-particle&quot;:&quot;&quot;,&quot;non-dropping-particle&quot;:&quot;&quot;}],&quot;container-title&quot;:&quot;Renewable and Sustainable Energy Reviews&quot;,&quot;DOI&quot;:&quot;10.1016/j.rser.2020.110618&quot;,&quot;ISSN&quot;:&quot;13640321&quot;,&quot;issued&quot;:{&quot;date-parts&quot;:[[2021,3]]},&quot;page&quot;:&quot;110618&quot;,&quot;volume&quot;:&quot;137&quot;,&quot;container-title-short&quot;:&quot;&quot;},&quot;isTemporary&quot;:false}]},{&quot;citationID&quot;:&quot;MENDELEY_CITATION_92567a48-90b0-46c9-bfb8-195d222dd6c2&quot;,&quot;properties&quot;:{&quot;noteIndex&quot;:0},&quot;isEdited&quot;:false,&quot;manualOverride&quot;:{&quot;isManuallyOverridden&quot;:false,&quot;citeprocText&quot;:&quot;[48]&quot;,&quot;manualOverrideText&quot;:&quot;&quot;},&quot;citationTag&quot;:&quot;MENDELEY_CITATION_v3_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&quot;,&quot;citationItems&quot;:[{&quot;id&quot;:&quot;408e45c0-460c-38aa-8310-19b6e3612eca&quot;,&quot;itemData&quot;:{&quot;type&quot;:&quot;article-journal&quot;,&quot;id&quot;:&quot;408e45c0-460c-38aa-8310-19b6e3612eca&quot;,&quot;title&quot;:&quot;Reinforcement Learning Techniques in Optimizing Energy Systems&quot;,&quot;author&quot;:[{&quot;family&quot;:&quot;Stavrev&quot;,&quot;given&quot;:&quot;Stefan&quot;,&quot;parse-names&quot;:false,&quot;dropping-particle&quot;:&quot;&quot;,&quot;non-dropping-particle&quot;:&quot;&quot;},{&quot;family&quot;:&quot;Ginchev&quot;,&quot;given&quot;:&quot;Dimitar&quot;,&quot;parse-names&quot;:false,&quot;dropping-particle&quot;:&quot;&quot;,&quot;non-dropping-particle&quot;:&quot;&quot;}],&quot;container-title&quot;:&quot;Electronics&quot;,&quot;container-title-short&quot;:&quot;Electronics (Basel).&quot;,&quot;DOI&quot;:&quot;10.3390/electronics13081459&quot;,&quot;ISSN&quot;:&quot;2079-9292&quot;,&quot;issued&quot;:{&quot;date-parts&quot;:[[2024,4,12]]},&quot;page&quot;:&quot;1459&quot;,&quot;abstract&quot;:&quot;&lt;p&gt;Reinforcement learning (RL) techniques have emerged as powerful tools for optimizing energy systems, offering the potential to enhance efficiency, reliability, and sustainability. This review paper provides a comprehensive examination of the applications of RL in the field of energy system optimization, spanning various domains such as energy management, grid control, and renewable energy integration. Beginning with an overview of RL fundamentals, the paper explores recent advancements in RL algorithms and their adaptation to address the unique challenges of energy system optimization. Case studies and real-world applications demonstrate the efficacy of RL-based approaches in improving energy efficiency, reducing costs, and mitigating environmental impacts. Furthermore, the paper discusses future directions and challenges, including scalability, interpretability, and integration with domain knowledge. By synthesizing the latest research findings and identifying key areas for further investigation, this paper aims to inform and inspire future research endeavors in the intersection of reinforcement learning and energy system optimization.&lt;/p&gt;&quot;,&quot;issue&quot;:&quot;8&quot;,&quot;volume&quot;:&quot;13&quot;},&quot;isTemporary&quot;:false}]},{&quot;citationID&quot;:&quot;MENDELEY_CITATION_2d90f837-c9a3-4da7-9b2d-0b187fae7ad5&quot;,&quot;properties&quot;:{&quot;noteIndex&quot;:0},&quot;isEdited&quot;:false,&quot;manualOverride&quot;:{&quot;isManuallyOverridden&quot;:false,&quot;citeprocText&quot;:&quot;[49]&quot;,&quot;manualOverrideText&quot;:&quot;&quot;},&quot;citationTag&quot;:&quot;MENDELEY_CITATION_v3_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&quot;,&quot;citationItems&quot;:[{&quot;id&quot;:&quot;94630c80-577c-3ded-896b-4aaf82147c8b&quot;,&quot;itemData&quot;:{&quot;type&quot;:&quot;chapter&quot;,&quot;id&quot;:&quot;94630c80-577c-3ded-896b-4aaf82147c8b&quot;,&quot;title&quot;:&quot;Efficient Exploration in Reinforcement Learning&quot;,&quot;author&quot;:[{&quot;family&quot;:&quot;Langford&quot;,&quot;given&quot;:&quot;John&quot;,&quot;parse-names&quot;:false,&quot;dropping-particle&quot;:&quot;&quot;,&quot;non-dropping-particle&quot;:&quot;&quot;}],&quot;container-title&quot;:&quot;Encyclopedia of Machine Learning&quot;,&quot;DOI&quot;:&quot;10.1007/978-0-387-30164-8_244&quot;,&quot;issued&quot;:{&quot;date-parts&quot;:[[2011]]},&quot;publisher-place&quot;:&quot;Boston, MA&quot;,&quot;page&quot;:&quot;309-311&quot;,&quot;publisher&quot;:&quot;Springer US&quot;,&quot;container-title-short&quot;:&quot;&quot;},&quot;isTemporary&quot;:false}]},{&quot;citationID&quot;:&quot;MENDELEY_CITATION_409cf5ec-19c5-4b5e-b434-08af62e0486e&quot;,&quot;properties&quot;:{&quot;noteIndex&quot;:0},&quot;isEdited&quot;:false,&quot;manualOverride&quot;:{&quot;isManuallyOverridden&quot;:false,&quot;citeprocText&quot;:&quot;[50]&quot;,&quot;manualOverrideText&quot;:&quot;&quot;},&quot;citationTag&quot;:&quot;MENDELEY_CITATION_v3_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&quot;,&quot;citationItems&quot;:[{&quot;id&quot;:&quot;b87850aa-a581-31c2-a694-b706eafaefa3&quot;,&quot;itemData&quot;:{&quot;type&quot;:&quot;article-journal&quot;,&quot;id&quot;:&quot;b87850aa-a581-31c2-a694-b706eafaefa3&quot;,&quot;title&quot;:&quot;ROBOT LEARNING&quot;,&quot;author&quot;:[{&quot;family&quot;:&quot;Sutton&quot;,&quot;given&quot;:&quot;Richard&quot;,&quot;parse-names&quot;:false,&quot;dropping-particle&quot;:&quot;&quot;,&quot;non-dropping-particle&quot;:&quot;&quot;},{&quot;family&quot;:&quot;Barto&quot;,&quot;given&quot;:&quot;Andrew&quot;,&quot;parse-names&quot;:false,&quot;dropping-particle&quot;:&quot;&quot;,&quot;non-dropping-particle&quot;:&quot;&quot;}],&quot;container-title&quot;:&quot;Robotica&quot;,&quot;container-title-short&quot;:&quot;Robotica&quot;,&quot;DOI&quot;:&quot;10.1017/S0263574799271172&quot;,&quot;ISSN&quot;:&quot;0263-5747&quot;,&quot;issued&quot;:{&quot;date-parts&quot;:[[1999,3,1]]},&quot;page&quot;:&quot;229-235&quot;,&quot;issue&quot;:&quot;2&quot;,&quot;volume&quot;:&quot;17&quot;},&quot;isTemporary&quot;:false}]},{&quot;citationID&quot;:&quot;MENDELEY_CITATION_275dbc2a-bca7-47b7-904d-467adf502462&quot;,&quot;properties&quot;:{&quot;noteIndex&quot;:0},&quot;isEdited&quot;:false,&quot;manualOverride&quot;:{&quot;isManuallyOverridden&quot;:false,&quot;citeprocText&quot;:&quot;[51]&quot;,&quot;manualOverrideText&quot;:&quot;&quot;},&quot;citationTag&quot;:&quot;MENDELEY_CITATION_v3_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&quot;,&quot;citationItems&quot;:[{&quot;id&quot;:&quot;8a2da654-28fe-395b-8105-172abb9e04b0&quot;,&quot;itemData&quot;:{&quot;type&quot;:&quot;paper-conference&quot;,&quot;id&quot;:&quot;8a2da654-28fe-395b-8105-172abb9e04b0&quot;,&quot;title&quot;:&quot;Overview of Reinforcement Learning Based on Value and Policy&quot;,&quot;author&quot;:[{&quot;family&quot;:&quot;Liu&quot;,&quot;given&quot;:&quot;Yun-ting&quot;,&quot;parse-names&quot;:false,&quot;dropping-particle&quot;:&quot;&quot;,&quot;non-dropping-particle&quot;:&quot;&quot;},{&quot;family&quot;:&quot;Yang&quot;,&quot;given&quot;:&quot;Jia-ming&quot;,&quot;parse-names&quot;:false,&quot;dropping-particle&quot;:&quot;&quot;,&quot;non-dropping-particle&quot;:&quot;&quot;},{&quot;family&quot;:&quot;Chen&quot;,&quot;given&quot;:&quot;Liang&quot;,&quot;parse-names&quot;:false,&quot;dropping-particle&quot;:&quot;&quot;,&quot;non-dropping-particle&quot;:&quot;&quot;},{&quot;family&quot;:&quot;Guo&quot;,&quot;given&quot;:&quot;Ting&quot;,&quot;parse-names&quot;:false,&quot;dropping-particle&quot;:&quot;&quot;,&quot;non-dropping-particle&quot;:&quot;&quot;},{&quot;family&quot;:&quot;Jiang&quot;,&quot;given&quot;:&quot;Yu&quot;,&quot;parse-names&quot;:false,&quot;dropping-particle&quot;:&quot;&quot;,&quot;non-dropping-particle&quot;:&quot;&quot;}],&quot;container-title&quot;:&quot;2020 Chinese Control And Decision Conference (CCDC)&quot;,&quot;DOI&quot;:&quot;10.1109/CCDC49329.2020.9164615&quot;,&quot;ISBN&quot;:&quot;978-1-7281-5855-6&quot;,&quot;issued&quot;:{&quot;date-parts&quot;:[[2020,8]]},&quot;page&quot;:&quot;598-603&quot;,&quot;publisher&quot;:&quot;IEEE&quot;,&quot;container-title-short&quot;:&quot;&quot;},&quot;isTemporary&quot;:false}]},{&quot;citationID&quot;:&quot;MENDELEY_CITATION_ef102693-b21e-49bd-8961-a5f9603586b2&quot;,&quot;properties&quot;:{&quot;noteIndex&quot;:0},&quot;isEdited&quot;:false,&quot;manualOverride&quot;:{&quot;isManuallyOverridden&quot;:false,&quot;citeprocText&quot;:&quot;[52]&quot;,&quot;manualOverrideText&quot;:&quot;&quot;},&quot;citationTag&quot;:&quot;MENDELEY_CITATION_v3_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&quot;,&quot;citationItems&quot;:[{&quot;id&quot;:&quot;ffddf98e-e370-3452-8a14-62d7c8029a56&quot;,&quot;itemData&quot;:{&quot;type&quot;:&quot;article-journal&quot;,&quot;id&quot;:&quot;ffddf98e-e370-3452-8a14-62d7c8029a56&quot;,&quot;title&quot;:&quot;Comparing Policy Gradient and Value Function Based Reinforcement Learning Methods in Simulated Electrical Power Trade&quot;,&quot;author&quot;:[{&quot;family&quot;:&quot;Lincoln&quot;,&quot;given&quot;:&quot;Richard&quot;,&quot;parse-names&quot;:false,&quot;dropping-particle&quot;:&quot;&quot;,&quot;non-dropping-particle&quot;:&quot;&quot;},{&quot;family&quot;:&quot;Galloway&quot;,&quot;given&quot;:&quot;Stuart&quot;,&quot;parse-names&quot;:false,&quot;dropping-particle&quot;:&quot;&quot;,&quot;non-dropping-particle&quot;:&quot;&quot;},{&quot;family&quot;:&quot;Stephen&quot;,&quot;given&quot;:&quot;Bruce&quot;,&quot;parse-names&quot;:false,&quot;dropping-particle&quot;:&quot;&quot;,&quot;non-dropping-particle&quot;:&quot;&quot;},{&quot;family&quot;:&quot;Burt&quot;,&quot;given&quot;:&quot;Graeme&quot;,&quot;parse-names&quot;:false,&quot;dropping-particle&quot;:&quot;&quot;,&quot;non-dropping-particle&quot;:&quot;&quot;}],&quot;container-title&quot;:&quot;IEEE Transactions on Power Systems&quot;,&quot;DOI&quot;:&quot;10.1109/TPWRS.2011.2166091&quot;,&quot;ISSN&quot;:&quot;0885-8950&quot;,&quot;issued&quot;:{&quot;date-parts&quot;:[[2012,2]]},&quot;page&quot;:&quot;373-380&quot;,&quot;issue&quot;:&quot;1&quot;,&quot;volume&quot;:&quot;27&quot;,&quot;container-title-short&quot;:&quot;&quot;},&quot;isTemporary&quot;:false}]},{&quot;citationID&quot;:&quot;MENDELEY_CITATION_2803f5df-7f60-4bed-8861-5d6e31d32156&quot;,&quot;properties&quot;:{&quot;noteIndex&quot;:0},&quot;isEdited&quot;:false,&quot;manualOverride&quot;:{&quot;isManuallyOverridden&quot;:false,&quot;citeprocText&quot;:&quot;[53]&quot;,&quot;manualOverrideText&quot;:&quot;&quot;},&quot;citationTag&quot;:&quot;MENDELEY_CITATION_v3_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&quot;,&quot;citationItems&quot;:[{&quot;id&quot;:&quot;e54e5b56-d131-3a66-9ffb-14ae92ea0215&quot;,&quot;itemData&quot;:{&quot;type&quot;:&quot;article-journal&quot;,&quot;id&quot;:&quot;e54e5b56-d131-3a66-9ffb-14ae92ea0215&quot;,&quot;title&quot;:&quot;Policy Gradient Methods in Deep Reinforcement Learning&quot;,&quot;author&quot;:[{&quot;family&quot;:&quot;Gao&quot;,&quot;given&quot;:&quot;Yuhan&quot;,&quot;parse-names&quot;:false,&quot;dropping-particle&quot;:&quot;&quot;,&quot;non-dropping-particle&quot;:&quot;&quot;}],&quot;container-title&quot;:&quot;Applied and Computational Engineering&quot;,&quot;DOI&quot;:&quot;10.54254/2755-2721/2025.TJ23321&quot;,&quot;ISSN&quot;:&quot;2755-2721&quot;,&quot;issued&quot;:{&quot;date-parts&quot;:[[2025,5,22]]},&quot;page&quot;:&quot;27-34&quot;,&quot;abstract&quot;:&quot;&lt;p&gt;Policy gradient (PG) methods are a fundamental component of deep reinforcement learning (DRL), particularly effective in continuous and high-dimensional control tasks. This paper presents a structured review of PG algorithms, tracing their development from basic Monte Carlo methods like REINFORCE to advanced techniques such as asynchronous advantage actor-critic (A3C), trust region policy optimization (TRPO), proximal policy optimization (PPO), deep deterministic policy gradient (DDPG), and soft actor-critic (SAC). These methods differ in terms of policy structure, optimization stability, and sample efficiency, addressing core challenges in policy learning through gradient-based updates. In addition, this review explores the application of PG methods in real-world domains, including autonomous driving, financial portfolio management, and smart grid energy systems. These applications demonstrate PG methods’ capacity to operate under uncertainty and adapt to complex dynamic environments. However, limitations such as high variance, low sample efficiency, and instability in multi-agent and offline settings remain significant obstacles. The review concludes by outlining emerging research directions, including entropy-based exploration, model-based policy optimization, meta-learning, and Transformer-based sequence modeling. This work aims to offer theoretical insights and practical guidance to support the continued advancement and application of policy gradient methods in reinforcement learning.&lt;/p&gt;&quot;,&quot;issue&quot;:&quot;1&quot;,&quot;volume&quot;:&quot;158&quot;,&quot;container-title-short&quot;:&quot;&quot;},&quot;isTemporary&quot;:false}]},{&quot;citationID&quot;:&quot;MENDELEY_CITATION_6b0aa260-f728-4cb7-8d42-c258b6a59a24&quot;,&quot;properties&quot;:{&quot;noteIndex&quot;:0},&quot;isEdited&quot;:false,&quot;manualOverride&quot;:{&quot;isManuallyOverridden&quot;:false,&quot;citeprocText&quot;:&quot;[54]&quot;,&quot;manualOverrideText&quot;:&quot;&quot;},&quot;citationTag&quot;:&quot;MENDELEY_CITATION_v3_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&quot;,&quot;citationItems&quot;:[{&quot;id&quot;:&quot;695f87ef-b1a7-3d24-bf63-54c6c4a9499c&quot;,&quot;itemData&quot;:{&quot;type&quot;:&quot;article-journal&quot;,&quot;id&quot;:&quot;695f87ef-b1a7-3d24-bf63-54c6c4a9499c&quot;,&quot;title&quot;:&quot;Reinforcement Learning and Its Applications in Modern Power and Energy Systems: A Review&quot;,&quot;author&quot;:[{&quot;family&quot;:&quot;Cao&quot;,&quot;given&quot;:&quot;Di&quot;,&quot;parse-names&quot;:false,&quot;dropping-particle&quot;:&quot;&quot;,&quot;non-dropping-particle&quot;:&quot;&quot;},{&quot;family&quot;:&quot;Hu&quot;,&quot;given&quot;:&quot;Weihao&quot;,&quot;parse-names&quot;:false,&quot;dropping-particle&quot;:&quot;&quot;,&quot;non-dropping-particle&quot;:&quot;&quot;},{&quot;family&quot;:&quot;Zhao&quot;,&quot;given&quot;:&quot;Junbo&quot;,&quot;parse-names&quot;:false,&quot;dropping-particle&quot;:&quot;&quot;,&quot;non-dropping-particle&quot;:&quot;&quot;},{&quot;family&quot;:&quot;Zhang&quot;,&quot;given&quot;:&quot;Guozhou&quot;,&quot;parse-names&quot;:false,&quot;dropping-particle&quot;:&quot;&quot;,&quot;non-dropping-particle&quot;:&quot;&quot;},{&quot;family&quot;:&quot;Zhang&quot;,&quot;given&quot;:&quot;Bin&quot;,&quot;parse-names&quot;:false,&quot;dropping-particle&quot;:&quot;&quot;,&quot;non-dropping-particle&quot;:&quot;&quot;},{&quot;family&quot;:&quot;Liu&quot;,&quot;given&quot;:&quot;Zhou&quot;,&quot;parse-names&quot;:false,&quot;dropping-particle&quot;:&quot;&quot;,&quot;non-dropping-particle&quot;:&quot;&quot;},{&quot;family&quot;:&quot;Chen&quot;,&quot;given&quot;:&quot;Zhe&quot;,&quot;parse-names&quot;:false,&quot;dropping-particle&quot;:&quot;&quot;,&quot;non-dropping-particle&quot;:&quot;&quot;},{&quot;family&quot;:&quot;Blaabjerg&quot;,&quot;given&quot;:&quot;Frede&quot;,&quot;parse-names&quot;:false,&quot;dropping-particle&quot;:&quot;&quot;,&quot;non-dropping-particle&quot;:&quot;&quot;}],&quot;container-title&quot;:&quot;Journal of Modern Power Systems and Clean Energy&quot;,&quot;DOI&quot;:&quot;10.35833/MPCE.2020.000552&quot;,&quot;ISSN&quot;:&quot;2196-5625&quot;,&quot;issued&quot;:{&quot;date-parts&quot;:[[2020]]},&quot;page&quot;:&quot;1029-1042&quot;,&quot;issue&quot;:&quot;6&quot;,&quot;volume&quot;:&quot;8&quot;,&quot;container-title-short&quot;:&quot;&quot;},&quot;isTemporary&quot;:false}]},{&quot;citationID&quot;:&quot;MENDELEY_CITATION_77016d76-bbff-470c-acaf-6a996a49373b&quot;,&quot;properties&quot;:{&quot;noteIndex&quot;:0},&quot;isEdited&quot;:false,&quot;manualOverride&quot;:{&quot;isManuallyOverridden&quot;:false,&quot;citeprocText&quot;:&quot;[55]&quot;,&quot;manualOverrideText&quot;:&quot;&quot;},&quot;citationTag&quot;:&quot;MENDELEY_CITATION_v3_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&quot;,&quot;citationItems&quot;:[{&quot;id&quot;:&quot;e45cab0b-e52f-3cff-b734-fbaac9d65a24&quot;,&quot;itemData&quot;:{&quot;type&quot;:&quot;paper-conference&quot;,&quot;id&quot;:&quot;e45cab0b-e52f-3cff-b734-fbaac9d65a24&quot;,&quot;title&quot;:&quot;Performance Comparison of Deep RL Algorithms for Energy Systems Optimal Scheduling&quot;,&quot;author&quot;:[{&quot;family&quot;:&quot;Shengren&quot;,&quot;given&quot;:&quot;Hou&quot;,&quot;parse-names&quot;:false,&quot;dropping-particle&quot;:&quot;&quot;,&quot;non-dropping-particle&quot;:&quot;&quot;},{&quot;family&quot;:&quot;Salazar&quot;,&quot;given&quot;:&quot;Edgar Mauricio&quot;,&quot;parse-names&quot;:false,&quot;dropping-particle&quot;:&quot;&quot;,&quot;non-dropping-particle&quot;:&quot;&quot;},{&quot;family&quot;:&quot;Vergara&quot;,&quot;given&quot;:&quot;Pedro P.&quot;,&quot;parse-names&quot;:false,&quot;dropping-particle&quot;:&quot;&quot;,&quot;non-dropping-particle&quot;:&quot;&quot;},{&quot;family&quot;:&quot;Palensky&quot;,&quot;given&quot;:&quot;Peter&quot;,&quot;parse-names&quot;:false,&quot;dropping-particle&quot;:&quot;&quot;,&quot;non-dropping-particle&quot;:&quot;&quot;}],&quot;container-title&quot;:&quot;2022 IEEE PES Innovative Smart Grid Technologies Conference Europe (ISGT-Europe)&quot;,&quot;DOI&quot;:&quot;10.1109/ISGT-Europe54678.2022.9960642&quot;,&quot;ISBN&quot;:&quot;978-1-6654-8032-1&quot;,&quot;issued&quot;:{&quot;date-parts&quot;:[[2022,10,10]]},&quot;page&quot;:&quot;1-6&quot;,&quot;publisher&quot;:&quot;IEEE&quot;,&quot;container-title-short&quot;:&quot;&quot;},&quot;isTemporary&quot;:false}]},{&quot;citationID&quot;:&quot;MENDELEY_CITATION_fb2fc071-3f5b-4fb6-b316-f06ec1993bea&quot;,&quot;properties&quot;:{&quot;noteIndex&quot;:0},&quot;isEdited&quot;:false,&quot;manualOverride&quot;:{&quot;isManuallyOverridden&quot;:false,&quot;citeprocText&quot;:&quot;[47], [56]&quot;,&quot;manualOverrideText&quot;:&quot;&quot;},&quot;citationTag&quot;:&quot;MENDELEY_CITATION_v3_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&quot;,&quot;citationItems&quot;:[{&quot;id&quot;:&quot;287b606c-b40e-3f97-b41d-bcd33d0ee05c&quot;,&quot;itemData&quot;:{&quot;type&quot;:&quot;article-journal&quot;,&quot;id&quot;:&quot;287b606c-b40e-3f97-b41d-bcd33d0ee05c&quot;,&quot;title&quot;:&quot;Reward Shaping-Based Actor–Critic Deep Reinforcement Learning for Residential Energy Management&quot;,&quot;author&quot;:[{&quot;family&quot;:&quot;Lu&quot;,&quot;given&quot;:&quot;Renzhi&quot;,&quot;parse-names&quot;:false,&quot;dropping-particle&quot;:&quot;&quot;,&quot;non-dropping-particle&quot;:&quot;&quot;},{&quot;family&quot;:&quot;Jiang&quot;,&quot;given&quot;:&quot;Zhenyu&quot;,&quot;parse-names&quot;:false,&quot;dropping-particle&quot;:&quot;&quot;,&quot;non-dropping-particle&quot;:&quot;&quot;},{&quot;family&quot;:&quot;Wu&quot;,&quot;given&quot;:&quot;Huaming&quot;,&quot;parse-names&quot;:false,&quot;dropping-particle&quot;:&quot;&quot;,&quot;non-dropping-particle&quot;:&quot;&quot;},{&quot;family&quot;:&quot;Ding&quot;,&quot;given&quot;:&quot;Yuemin&quot;,&quot;parse-names&quot;:false,&quot;dropping-particle&quot;:&quot;&quot;,&quot;non-dropping-particle&quot;:&quot;&quot;},{&quot;family&quot;:&quot;Wang&quot;,&quot;given&quot;:&quot;Dong&quot;,&quot;parse-names&quot;:false,&quot;dropping-particle&quot;:&quot;&quot;,&quot;non-dropping-particle&quot;:&quot;&quot;},{&quot;family&quot;:&quot;Zhang&quot;,&quot;given&quot;:&quot;Hai-Tao&quot;,&quot;parse-names&quot;:false,&quot;dropping-particle&quot;:&quot;&quot;,&quot;non-dropping-particle&quot;:&quot;&quot;}],&quot;container-title&quot;:&quot;IEEE Transactions on Industrial Informatics&quot;,&quot;container-title-short&quot;:&quot;IEEE Trans. Industr. Inform.&quot;,&quot;DOI&quot;:&quot;10.1109/TII.2022.3183802&quot;,&quot;ISSN&quot;:&quot;1551-3203&quot;,&quot;issued&quot;:{&quot;date-parts&quot;:[[2023,3]]},&quot;page&quot;:&quot;2662-2673&quot;,&quot;issue&quot;:&quot;3&quot;,&quot;volume&quot;:&quot;19&quot;},&quot;isTemporary&quot;:false},{&quot;id&quot;:&quot;b748b453-1bc9-3b06-a2bc-accd4d93d9d9&quot;,&quot;itemData&quot;:{&quot;type&quot;:&quot;article-journal&quot;,&quot;id&quot;:&quot;b748b453-1bc9-3b06-a2bc-accd4d93d9d9&quot;,&quot;title&quot;:&quot;Applications of reinforcement learning in energy systems&quot;,&quot;author&quot;:[{&quot;family&quot;:&quot;Perera&quot;,&quot;given&quot;:&quot;A.T.D.&quot;,&quot;parse-names&quot;:false,&quot;dropping-particle&quot;:&quot;&quot;,&quot;non-dropping-particle&quot;:&quot;&quot;},{&quot;family&quot;:&quot;Kamalaruban&quot;,&quot;given&quot;:&quot;Parameswaran&quot;,&quot;parse-names&quot;:false,&quot;dropping-particle&quot;:&quot;&quot;,&quot;non-dropping-particle&quot;:&quot;&quot;}],&quot;container-title&quot;:&quot;Renewable and Sustainable Energy Reviews&quot;,&quot;DOI&quot;:&quot;10.1016/j.rser.2020.110618&quot;,&quot;ISSN&quot;:&quot;13640321&quot;,&quot;issued&quot;:{&quot;date-parts&quot;:[[2021,3]]},&quot;page&quot;:&quot;110618&quot;,&quot;volume&quot;:&quot;137&quot;},&quot;isTemporary&quot;:false}]},{&quot;citationID&quot;:&quot;MENDELEY_CITATION_0a510372-57a7-426b-836c-f53f7d26b1fe&quot;,&quot;properties&quot;:{&quot;noteIndex&quot;:0},&quot;isEdited&quot;:false,&quot;manualOverride&quot;:{&quot;isManuallyOverridden&quot;:false,&quot;citeprocText&quot;:&quot;[26]&quot;,&quot;manualOverrideText&quot;:&quot;&quot;},&quot;citationTag&quot;:&quot;MENDELEY_CITATION_v3_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&quot;,&quot;citationItems&quot;:[{&quot;id&quot;:&quot;31848458-a34e-370b-af77-81d1d893a1c5&quot;,&quot;itemData&quot;:{&quot;type&quot;:&quot;article-journal&quot;,&quot;id&quot;:&quot;31848458-a34e-370b-af77-81d1d893a1c5&quot;,&quot;title&quot;:&quot;Deep Reinforcement Learning Approaches the MILP Optimum of a Multi-Energy Optimization in Energy Communities&quot;,&quot;author&quot;:[{&quot;family&quot;:&quot;Vetter&quot;,&quot;given&quot;:&quot;Vinzent&quot;,&quot;parse-names&quot;:false,&quot;dropping-particle&quot;:&quot;&quot;,&quot;non-dropping-particle&quot;:&quot;&quot;},{&quot;family&quot;:&quot;Wohlgenannt&quot;,&quot;given&quot;:&quot;Philipp&quot;,&quot;parse-names&quot;:false,&quot;dropping-particle&quot;:&quot;&quot;,&quot;non-dropping-particle&quot;:&quot;&quot;},{&quot;family&quot;:&quot;Kepplinger&quot;,&quot;given&quot;:&quot;Peter&quot;,&quot;parse-names&quot;:false,&quot;dropping-particle&quot;:&quot;&quot;,&quot;non-dropping-particle&quot;:&quot;&quot;},{&quot;family&quot;:&quot;Eder&quot;,&quot;given&quot;:&quot;Elias&quot;,&quot;parse-names&quot;:false,&quot;dropping-particle&quot;:&quot;&quot;,&quot;non-dropping-particle&quot;:&quot;&quot;}],&quot;container-title&quot;:&quot;Energies&quot;,&quot;DOI&quot;:&quot;10.3390/en18174489&quot;,&quot;ISSN&quot;:&quot;1996-1073&quot;,&quot;issued&quot;:{&quot;date-parts&quot;:[[2025,8,23]]},&quot;page&quot;:&quot;4489&quot;,&quot;abstract&quot;:&quot;&lt;p&gt;As energy systems transition toward high shares of variable renewable generation, local energy communities (ECs) are increasingly relevant for enabling demand-side flexibility and self-sufficiency. This shift is particularly evident in the residential sector, where the deployment of photovoltaic (PV) systems is rapidly growing. While mixed-integer linear programming (MILP) remains the standard for operational optimization and demand response in such systems, its computational burden limits scalability and responsiveness under real-time or uncertain conditions. Reinforcement learning (RL), by contrast, offers a model-free, adaptive alternative. However, its application to real-world energy system operation remains limited. This study explores the application of a Deep Q-Network (DQN) to a real residential EC, which has received limited attention in prior work. The system comprises three single-family homes sharing a centralized heating system with a thermal energy storage (TES), a PV installation, and a grid connection. We compare the performance of MILP and RL controllers across economic and environmental metrics. Relative to a reference scenario without TES, MILP and RL reduce energy costs by 10.06% and 8.78%, respectively, and both approaches yield lower total energy consumption and CO2-equivalent emissions. Notably, the trained RL agent achieves a near-optimal outcome while requiring only 22% of the MILP’s computation time. These results demonstrate that DQNs can offer a computationally efficient and practically viable alternative to MILP for real-time control in residential energy systems.&lt;/p&gt;&quot;,&quot;issue&quot;:&quot;17&quot;,&quot;volume&quot;:&quot;18&quot;,&quot;container-title-short&quot;:&quot;Energies (Basel).&quot;},&quot;isTemporary&quot;:false}]},{&quot;citationID&quot;:&quot;MENDELEY_CITATION_d44b77f0-61f7-4c28-821a-92a263b68faa&quot;,&quot;properties&quot;:{&quot;noteIndex&quot;:0},&quot;isEdited&quot;:false,&quot;manualOverride&quot;:{&quot;isManuallyOverridden&quot;:false,&quot;citeprocText&quot;:&quot;[57]&quot;,&quot;manualOverrideText&quot;:&quot;&quot;},&quot;citationTag&quot;:&quot;MENDELEY_CITATION_v3_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&quot;,&quot;citationItems&quot;:[{&quot;id&quot;:&quot;878a73bd-0c5d-3e77-a841-71aeb93db99a&quot;,&quot;itemData&quot;:{&quot;type&quot;:&quot;article-journal&quot;,&quot;id&quot;:&quot;878a73bd-0c5d-3e77-a841-71aeb93db99a&quot;,&quot;title&quot;:&quot;Reinforcement Learning for Joint Design and Control of Battery-PV Systems&quot;,&quot;author&quot;:[{&quot;family&quot;:&quot;Cauz&quot;,&quot;given&quot;:&quot;Marine&quot;,&quot;parse-names&quot;:false,&quot;dropping-particle&quot;:&quot;&quot;,&quot;non-dropping-particle&quot;:&quot;&quot;},{&quot;family&quot;:&quot;Bolland&quot;,&quot;given&quot;:&quot;Adrien&quot;,&quot;parse-names&quot;:false,&quot;dropping-particle&quot;:&quot;&quot;,&quot;non-dropping-particle&quot;:&quot;&quot;},{&quot;family&quot;:&quot;Miftari&quot;,&quot;given&quot;:&quot;Bardhyl&quot;,&quot;parse-names&quot;:false,&quot;dropping-particle&quot;:&quot;&quot;,&quot;non-dropping-particle&quot;:&quot;&quot;},{&quot;family&quot;:&quot;Perret&quot;,&quot;given&quot;:&quot;Lionel&quot;,&quot;parse-names&quot;:false,&quot;dropping-particle&quot;:&quot;&quot;,&quot;non-dropping-particle&quot;:&quot;&quot;},{&quot;family&quot;:&quot;Ballif&quot;,&quot;given&quot;:&quot;Christophe&quot;,&quot;parse-names&quot;:false,&quot;dropping-particle&quot;:&quot;&quot;,&quot;non-dropping-particle&quot;:&quot;&quot;},{&quot;family&quot;:&quot;Wyrsch&quot;,&quot;given&quot;:&quot;Nicolas&quot;,&quot;parse-names&quot;:false,&quot;dropping-particle&quot;:&quot;&quot;,&quot;non-dropping-particle&quot;:&quot;&quot;}],&quot;URL&quot;:&quot;http://arxiv.org/abs/2307.04244&quot;,&quot;issued&quot;:{&quot;date-parts&quot;:[[2023,7,9]]},&quot;abstract&quot;:&quot;The decentralisation and unpredictability of new renewable energy sources require rethinking our energy system. Data-driven approaches, such as reinforcement learning (RL), have emerged as new control strategies for operating these systems, but they have not yet been applied to system design. This paper aims to bridge this gap by studying the use of an RL-based method for joint design and control of a real-world PV and battery system. The design problem is first formulated as a mixed-integer linear programming problem (MILP). The optimal MILP solution is then used to evaluate the performance of an RL agent trained in a surrogate environment designed for applying an existing data-driven algorithm. The main difference between the two models lies in their optimization approaches: while MILP finds a solution that minimizes the total costs for a one-year operation given the deterministic historical data, RL is a stochastic method that searches for an optimal strategy over one week of data on expectation over all weeks in the historical dataset. Both methods were applied on a toy example using one-week data and on a case study using one-year data. In both cases, models were found to converge to similar control solutions, but their investment decisions differed. Overall, these outcomes are an initial step illustrating benefits and challenges of using RL for the joint design and control of energy systems.&quot;,&quot;container-title-short&quot;:&quot;&quot;},&quot;isTemporary&quot;:false}]},{&quot;citationID&quot;:&quot;MENDELEY_CITATION_ad01b917-344f-4c3a-bbf6-4c037af3c5a8&quot;,&quot;properties&quot;:{&quot;noteIndex&quot;:0},&quot;isEdited&quot;:false,&quot;manualOverride&quot;:{&quot;isManuallyOverridden&quot;:false,&quot;citeprocText&quot;:&quot;[58]&quot;,&quot;manualOverrideText&quot;:&quot;&quot;},&quot;citationTag&quot;:&quot;MENDELEY_CITATION_v3_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&quot;,&quot;citationItems&quot;:[{&quot;id&quot;:&quot;f9d59068-a5c5-321b-98f4-f48ae0ee5cc2&quot;,&quot;itemData&quot;:{&quot;type&quot;:&quot;article-journal&quot;,&quot;id&quot;:&quot;f9d59068-a5c5-321b-98f4-f48ae0ee5cc2&quot;,&quot;title&quot;:&quot;Reinforcement Learning-Based Energy Management for Hybrid Power Systems: State-of-the-Art Survey, Review, and Perspectives&quot;,&quot;author&quot;:[{&quot;family&quot;:&quot;Tang&quot;,&quot;given&quot;:&quot;Xiaolin&quot;,&quot;parse-names&quot;:false,&quot;dropping-particle&quot;:&quot;&quot;,&quot;non-dropping-particle&quot;:&quot;&quot;},{&quot;family&quot;:&quot;Chen&quot;,&quot;given&quot;:&quot;Jiaxin&quot;,&quot;parse-names&quot;:false,&quot;dropping-particle&quot;:&quot;&quot;,&quot;non-dropping-particle&quot;:&quot;&quot;},{&quot;family&quot;:&quot;Qin&quot;,&quot;given&quot;:&quot;Yechen&quot;,&quot;parse-names&quot;:false,&quot;dropping-particle&quot;:&quot;&quot;,&quot;non-dropping-particle&quot;:&quot;&quot;},{&quot;family&quot;:&quot;Liu&quot;,&quot;given&quot;:&quot;Teng&quot;,&quot;parse-names&quot;:false,&quot;dropping-particle&quot;:&quot;&quot;,&quot;non-dropping-particle&quot;:&quot;&quot;},{&quot;family&quot;:&quot;Yang&quot;,&quot;given&quot;:&quot;Kai&quot;,&quot;parse-names&quot;:false,&quot;dropping-particle&quot;:&quot;&quot;,&quot;non-dropping-particle&quot;:&quot;&quot;},{&quot;family&quot;:&quot;Khajepour&quot;,&quot;given&quot;:&quot;Amir&quot;,&quot;parse-names&quot;:false,&quot;dropping-particle&quot;:&quot;&quot;,&quot;non-dropping-particle&quot;:&quot;&quot;},{&quot;family&quot;:&quot;Li&quot;,&quot;given&quot;:&quot;Shen&quot;,&quot;parse-names&quot;:false,&quot;dropping-particle&quot;:&quot;&quot;,&quot;non-dropping-particle&quot;:&quot;&quot;}],&quot;container-title&quot;:&quot;Chinese Journal of Mechanical Engineering&quot;,&quot;DOI&quot;:&quot;10.1186/s10033-024-01026-4&quot;,&quot;ISSN&quot;:&quot;2192-8258&quot;,&quot;issued&quot;:{&quot;date-parts&quot;:[[2024,5,17]]},&quot;page&quot;:&quot;43&quot;,&quot;abstract&quot;:&quot;&lt;p&gt;The new energy vehicle plays a crucial role in green transportation, and the energy management strategy of hybrid power systems is essential for ensuring energy-efficient driving. This paper presents a state-of-the-art survey and review of reinforcement learning-based energy management strategies for hybrid power systems. Additionally, it envisions the outlook for autonomous intelligent hybrid electric vehicles, with reinforcement learning as the foundational technology. First of all, to provide a macro view of historical development, the brief history of deep learning, reinforcement learning, and deep reinforcement learning is presented in the form of a timeline. Then, the comprehensive survey and review are conducted by collecting papers from mainstream academic databases. Enumerating most of the contributions based on three main directions—algorithm innovation, powertrain innovation, and environment innovation—provides an objective review of the research status. Finally, to advance the application of reinforcement learning in autonomous intelligent hybrid electric vehicles, future research plans positioned as “Alpha HEV” are envisioned, integrating Autopilot and energy-saving control.&lt;/p&gt;&quot;,&quot;issue&quot;:&quot;1&quot;,&quot;volume&quot;:&quot;37&quot;,&quot;container-title-short&quot;:&quot;&quot;},&quot;isTemporary&quot;:false}]}]"/>
     <we:property name="MENDELEY_CITATIONS_STYLE" value="{&quot;id&quot;:&quot;https://www.zotero.org/styles/ieee&quot;,&quot;title&quot;:&quot;IEEE Reference Guide version 11.29.2023&quot;,&quot;format&quot;:&quot;numeric&quot;,&quot;defaultLocale&quot;:null,&quot;isLocaleCodeValid&quot;:true}"/>
   </we:properties>
   <we:bindings/>
@@ -22719,44 +23862,6 @@
 </file>
 
 <file path=customXml/item1.xml><?xml version="1.0" encoding="utf-8"?>
-<b:Sources xmlns:b="http://schemas.openxmlformats.org/officeDocument/2006/bibliography" xmlns="http://schemas.openxmlformats.org/officeDocument/2006/bibliography" SelectedStyle="/IEEE2006OfficeOnline.xsl" StyleName="IEEE" Version="2006">
-  <b:Source>
-    <b:Tag>Placeholder1</b:Tag>
-    <b:SourceType>Book</b:SourceType>
-    <b:Guid>{61C2BEB0-04B1-424E-AEC0-322EDBD1A18A}</b:Guid>
-    <b:RefOrder>2</b:RefOrder>
-  </b:Source>
-  <b:Source>
-    <b:Tag>Placeholder2</b:Tag>
-    <b:SourceType>Book</b:SourceType>
-    <b:Guid>{26E93F14-F601-D04A-A10D-E3BC3760B577}</b:Guid>
-    <b:RefOrder>1</b:RefOrder>
-  </b:Source>
-</b:Sources>
-</file>
-
-<file path=customXml/item2.xml><?xml version="1.0" encoding="utf-8"?>
-<?mso-contentType ?>
-<FormTemplates xmlns="http://schemas.microsoft.com/sharepoint/v3/contenttype/forms">
-  <Display>DocumentLibraryForm</Display>
-  <Edit>DocumentLibraryForm</Edit>
-  <New>DocumentLibraryForm</New>
-</FormTemplates>
-</file>
-
-<file path=customXml/item3.xml><?xml version="1.0" encoding="utf-8"?>
-<p:properties xmlns:p="http://schemas.microsoft.com/office/2006/metadata/properties" xmlns:xsi="http://www.w3.org/2001/XMLSchema-instance" xmlns:pc="http://schemas.microsoft.com/office/infopath/2007/PartnerControls">
-  <documentManagement>
-    <TaxCatchAll xmlns="4de74af2-d2a7-4bc3-a319-420167317553" xsi:nil="true"/>
-    <ArchiverLinkFileType xmlns="c0991f74-233a-4c46-9c55-a176f0e8ba44" xsi:nil="true"/>
-    <lcf76f155ced4ddcb4097134ff3c332f xmlns="c0991f74-233a-4c46-9c55-a176f0e8ba44">
-      <Terms xmlns="http://schemas.microsoft.com/office/infopath/2007/PartnerControls"/>
-    </lcf76f155ced4ddcb4097134ff3c332f>
-  </documentManagement>
-</p:properties>
-</file>
-
-<file path=customXml/item4.xml><?xml version="1.0" encoding="utf-8"?>
 <ct:contentTypeSchema xmlns:ct="http://schemas.microsoft.com/office/2006/metadata/contentType" xmlns:ma="http://schemas.microsoft.com/office/2006/metadata/properties/metaAttributes" ct:_="" ma:_="" ma:contentTypeName="Dokument" ma:contentTypeID="0x0101003A15E957932D6F4AB4FD28F85AF4FFD8" ma:contentTypeVersion="14" ma:contentTypeDescription="Ein neues Dokument erstellen." ma:contentTypeScope="" ma:versionID="e040dc8dbf4a4132031beaaf90e02bdd">
   <xsd:schema xmlns:xsd="http://www.w3.org/2001/XMLSchema" xmlns:xs="http://www.w3.org/2001/XMLSchema" xmlns:p="http://schemas.microsoft.com/office/2006/metadata/properties" xmlns:ns2="c0991f74-233a-4c46-9c55-a176f0e8ba44" xmlns:ns3="4de74af2-d2a7-4bc3-a319-420167317553" targetNamespace="http://schemas.microsoft.com/office/2006/metadata/properties" ma:root="true" ma:fieldsID="63fe477e893c7cf9e00d7d25e31408c1" ns2:_="" ns3:_="">
     <xsd:import namespace="c0991f74-233a-4c46-9c55-a176f0e8ba44"/>
@@ -22985,34 +24090,45 @@
 </ct:contentTypeSchema>
 </file>
 
-<file path=customXml/itemProps1.xml><?xml version="1.0" encoding="utf-8"?>
-<ds:datastoreItem xmlns:ds="http://schemas.openxmlformats.org/officeDocument/2006/customXml" ds:itemID="{8ED87741-333E-524C-B42D-A34782CE569A}">
-  <ds:schemaRefs>
-    <ds:schemaRef ds:uri="http://schemas.openxmlformats.org/officeDocument/2006/bibliography"/>
-  </ds:schemaRefs>
-</ds:datastoreItem>
+<file path=customXml/item2.xml><?xml version="1.0" encoding="utf-8"?>
+<b:Sources xmlns:b="http://schemas.openxmlformats.org/officeDocument/2006/bibliography" xmlns="http://schemas.openxmlformats.org/officeDocument/2006/bibliography" SelectedStyle="/IEEE2006OfficeOnline.xsl" StyleName="IEEE" Version="2006">
+  <b:Source>
+    <b:Tag>Placeholder1</b:Tag>
+    <b:SourceType>Book</b:SourceType>
+    <b:Guid>{61C2BEB0-04B1-424E-AEC0-322EDBD1A18A}</b:Guid>
+    <b:RefOrder>2</b:RefOrder>
+  </b:Source>
+  <b:Source>
+    <b:Tag>Placeholder2</b:Tag>
+    <b:SourceType>Book</b:SourceType>
+    <b:Guid>{26E93F14-F601-D04A-A10D-E3BC3760B577}</b:Guid>
+    <b:RefOrder>1</b:RefOrder>
+  </b:Source>
+</b:Sources>
 </file>
 
-<file path=customXml/itemProps2.xml><?xml version="1.0" encoding="utf-8"?>
-<ds:datastoreItem xmlns:ds="http://schemas.openxmlformats.org/officeDocument/2006/customXml" ds:itemID="{123745DA-69E4-464B-8AAF-512AB146EAEF}">
-  <ds:schemaRefs>
-    <ds:schemaRef ds:uri="http://schemas.microsoft.com/sharepoint/v3/contenttype/forms"/>
-  </ds:schemaRefs>
-</ds:datastoreItem>
+<file path=customXml/item3.xml><?xml version="1.0" encoding="utf-8"?>
+<?mso-contentType ?>
+<FormTemplates xmlns="http://schemas.microsoft.com/sharepoint/v3/contenttype/forms">
+  <Display>DocumentLibraryForm</Display>
+  <Edit>DocumentLibraryForm</Edit>
+  <New>DocumentLibraryForm</New>
+</FormTemplates>
 </file>
 
-<file path=customXml/itemProps3.xml><?xml version="1.0" encoding="utf-8"?>
-<ds:datastoreItem xmlns:ds="http://schemas.openxmlformats.org/officeDocument/2006/customXml" ds:itemID="{5DB99EA3-5A91-4DE8-9C2E-5E2756FB8116}">
-  <ds:schemaRefs>
-    <ds:schemaRef ds:uri="http://schemas.microsoft.com/office/2006/metadata/properties"/>
-    <ds:schemaRef ds:uri="http://schemas.microsoft.com/office/infopath/2007/PartnerControls"/>
-    <ds:schemaRef ds:uri="4de74af2-d2a7-4bc3-a319-420167317553"/>
-    <ds:schemaRef ds:uri="c0991f74-233a-4c46-9c55-a176f0e8ba44"/>
-  </ds:schemaRefs>
-</ds:datastoreItem>
+<file path=customXml/item4.xml><?xml version="1.0" encoding="utf-8"?>
+<p:properties xmlns:p="http://schemas.microsoft.com/office/2006/metadata/properties" xmlns:xsi="http://www.w3.org/2001/XMLSchema-instance" xmlns:pc="http://schemas.microsoft.com/office/infopath/2007/PartnerControls">
+  <documentManagement>
+    <TaxCatchAll xmlns="4de74af2-d2a7-4bc3-a319-420167317553" xsi:nil="true"/>
+    <ArchiverLinkFileType xmlns="c0991f74-233a-4c46-9c55-a176f0e8ba44" xsi:nil="true"/>
+    <lcf76f155ced4ddcb4097134ff3c332f xmlns="c0991f74-233a-4c46-9c55-a176f0e8ba44">
+      <Terms xmlns="http://schemas.microsoft.com/office/infopath/2007/PartnerControls"/>
+    </lcf76f155ced4ddcb4097134ff3c332f>
+  </documentManagement>
+</p:properties>
 </file>
 
-<file path=customXml/itemProps4.xml><?xml version="1.0" encoding="utf-8"?>
+<file path=customXml/itemProps1.xml><?xml version="1.0" encoding="utf-8"?>
 <ds:datastoreItem xmlns:ds="http://schemas.openxmlformats.org/officeDocument/2006/customXml" ds:itemID="{DB59158D-15C5-4DFF-AEB5-CA02C610712D}">
   <ds:schemaRefs>
     <ds:schemaRef ds:uri="http://schemas.microsoft.com/office/2006/metadata/contentType"/>
@@ -23029,4 +24145,31 @@
     <ds:schemaRef ds:uri="http://schemas.microsoft.com/internal/obd"/>
   </ds:schemaRefs>
 </ds:datastoreItem>
+</file>
+
+<file path=customXml/itemProps2.xml><?xml version="1.0" encoding="utf-8"?>
+<ds:datastoreItem xmlns:ds="http://schemas.openxmlformats.org/officeDocument/2006/customXml" ds:itemID="{8ED87741-333E-524C-B42D-A34782CE569A}">
+  <ds:schemaRefs>
+    <ds:schemaRef ds:uri="http://schemas.openxmlformats.org/officeDocument/2006/bibliography"/>
+  </ds:schemaRefs>
+</ds:datastoreItem>
+</file>
+
+<file path=customXml/itemProps3.xml><?xml version="1.0" encoding="utf-8"?>
+<ds:datastoreItem xmlns:ds="http://schemas.openxmlformats.org/officeDocument/2006/customXml" ds:itemID="{123745DA-69E4-464B-8AAF-512AB146EAEF}">
+  <ds:schemaRefs>
+    <ds:schemaRef ds:uri="http://schemas.microsoft.com/sharepoint/v3/contenttype/forms"/>
+  </ds:schemaRefs>
+</ds:datastoreItem>
+</file>
+
+<file path=customXml/itemProps4.xml><?xml version="1.0" encoding="utf-8"?>
+<ds:datastoreItem xmlns:ds="http://schemas.openxmlformats.org/officeDocument/2006/customXml" ds:itemID="{5DB99EA3-5A91-4DE8-9C2E-5E2756FB8116}">
+  <ds:schemaRefs>
+    <ds:schemaRef ds:uri="http://schemas.microsoft.com/office/2006/metadata/properties"/>
+    <ds:schemaRef ds:uri="http://schemas.microsoft.com/office/infopath/2007/PartnerControls"/>
+    <ds:schemaRef ds:uri="4de74af2-d2a7-4bc3-a319-420167317553"/>
+    <ds:schemaRef ds:uri="c0991f74-233a-4c46-9c55-a176f0e8ba44"/>
+  </ds:schemaRefs>
+</ds:datastoreItem>
 </file>
</xml_diff>

<commit_message>
finished introduction and lit review draft 1
</commit_message>
<xml_diff>
--- a/Thesis Rafi Draft 1.docx
+++ b/Thesis Rafi Draft 1.docx
@@ -9846,7 +9846,20 @@
       </w:r>
       <w:bookmarkEnd w:id="11"/>
       <w:r>
-        <w:t>and Industrial Systems</w:t>
+        <w:t xml:space="preserve">and Industrial </w:t>
+      </w:r>
+      <w:commentRangeStart w:id="12"/>
+      <w:r>
+        <w:t>Systems</w:t>
+      </w:r>
+      <w:commentRangeEnd w:id="12"/>
+      <w:r>
+        <w:rPr>
+          <w:rStyle w:val="CommentReference"/>
+          <w:sz w:val="24"/>
+          <w:szCs w:val="28"/>
+        </w:rPr>
+        <w:commentReference w:id="12"/>
       </w:r>
       <w:r>
         <w:t xml:space="preserve"> </w:t>
@@ -10344,7 +10357,7 @@
             </w:rPr>
             <m:t xml:space="preserve">+ </m:t>
           </m:r>
-          <w:bookmarkStart w:id="12" w:name="OLE_LINK2"/>
+          <w:bookmarkStart w:id="13" w:name="OLE_LINK2"/>
           <m:r>
             <w:rPr>
               <w:rFonts w:ascii="Cambria Math" w:hAnsi="Cambria Math"/>
@@ -10352,7 +10365,7 @@
             </w:rPr>
             <m:t>γ</m:t>
           </m:r>
-          <w:bookmarkEnd w:id="12"/>
+          <w:bookmarkEnd w:id="13"/>
           <m:sSub>
             <m:sSubPr>
               <m:ctrlPr>
@@ -12456,6 +12469,7 @@
         <w:t xml:space="preserve">. </w:t>
       </w:r>
     </w:p>
+    <w:p/>
     <w:p>
       <w:pPr>
         <w:pStyle w:val="Heading3"/>
@@ -12765,7 +12779,11 @@
         <w:t xml:space="preserve">, </w:t>
       </w:r>
       <w:r>
-        <w:t>Twin Delayed Deep Deterministic Policy Gradient (</w:t>
+        <w:t xml:space="preserve">Twin Delayed </w:t>
+      </w:r>
+      <w:r>
+        <w:lastRenderedPageBreak/>
+        <w:t>Deep Deterministic Policy Gradient (</w:t>
       </w:r>
       <w:r>
         <w:t>TD3</w:t>
@@ -12789,7 +12807,6 @@
         <w:t xml:space="preserve">. </w:t>
       </w:r>
       <w:r>
-        <w:lastRenderedPageBreak/>
         <w:t>Numerous</w:t>
       </w:r>
       <w:r>
@@ -12806,7 +12823,7 @@
           <w:rPr>
             <w:color w:val="000000"/>
           </w:rPr>
-          <w:tag w:val="MENDELEY_CITATION_v3_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"/>
+          <w:tag w:val="MENDELEY_CITATION_v3_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"/>
           <w:id w:val="-1254361031"/>
           <w:placeholder>
             <w:docPart w:val="DefaultPlaceholder_-1854013440"/>
@@ -12828,29 +12845,9 @@
     <w:p/>
     <w:p>
       <w:pPr>
-        <w:pStyle w:val="ListParagraph"/>
-        <w:numPr>
-          <w:ilvl w:val="0"/>
-          <w:numId w:val="14"/>
-        </w:numPr>
-        <w:rPr>
-          <w:color w:val="EE0000"/>
-        </w:rPr>
-      </w:pPr>
-      <w:r>
-        <w:rPr>
-          <w:color w:val="EE0000"/>
-        </w:rPr>
-        <w:t>Table that compares the different algorithms of RL</w:t>
-      </w:r>
-    </w:p>
-    <w:p/>
-    <w:p/>
-    <w:p>
-      <w:pPr>
         <w:pStyle w:val="Heading2"/>
       </w:pPr>
-      <w:bookmarkStart w:id="13" w:name="_Toc235289156"/>
+      <w:bookmarkStart w:id="14" w:name="_Toc235289156"/>
       <w:r>
         <w:t>RL vs MILP for Different</w:t>
       </w:r>
@@ -12860,19 +12857,19 @@
       <w:r>
         <w:t xml:space="preserve"> </w:t>
       </w:r>
-      <w:commentRangeStart w:id="14"/>
+      <w:commentRangeStart w:id="15"/>
       <w:r>
         <w:t>Applications</w:t>
       </w:r>
-      <w:bookmarkEnd w:id="13"/>
-      <w:commentRangeEnd w:id="14"/>
+      <w:bookmarkEnd w:id="14"/>
+      <w:commentRangeEnd w:id="15"/>
       <w:r>
         <w:rPr>
           <w:rStyle w:val="CommentReference"/>
           <w:sz w:val="24"/>
           <w:szCs w:val="28"/>
         </w:rPr>
-        <w:commentReference w:id="14"/>
+        <w:commentReference w:id="15"/>
       </w:r>
     </w:p>
     <w:p>
@@ -13466,104 +13463,424 @@
         <w:rPr>
           <w:color w:val="000000"/>
         </w:rPr>
-        <w:t xml:space="preserve"> and the second stage tests </w:t>
+        <w:t xml:space="preserve"> and the second stage tests both frameworks</w:t>
       </w:r>
       <w:r>
         <w:rPr>
           <w:color w:val="000000"/>
         </w:rPr>
+        <w:t>’</w:t>
+      </w:r>
+      <w:r>
+        <w:rPr>
+          <w:color w:val="000000"/>
+        </w:rPr>
+        <w:t xml:space="preserve"> performance in </w:t>
+      </w:r>
+      <w:r>
+        <w:rPr>
+          <w:color w:val="000000"/>
+        </w:rPr>
+        <w:t>a</w:t>
+      </w:r>
+      <w:r>
+        <w:rPr>
+          <w:color w:val="000000"/>
+        </w:rPr>
+        <w:t xml:space="preserve"> </w:t>
+      </w:r>
+      <w:r>
+        <w:rPr>
+          <w:color w:val="000000"/>
+        </w:rPr>
+        <w:t>one-</w:t>
+      </w:r>
+      <w:r>
+        <w:rPr>
+          <w:color w:val="000000"/>
+        </w:rPr>
+        <w:t xml:space="preserve">year case study. </w:t>
+      </w:r>
+      <w:r>
+        <w:rPr>
+          <w:color w:val="000000"/>
+        </w:rPr>
+        <w:t xml:space="preserve">For the </w:t>
+      </w:r>
+      <w:r>
+        <w:rPr>
+          <w:color w:val="000000"/>
+        </w:rPr>
+        <w:t xml:space="preserve">first stage, the authors </w:t>
+      </w:r>
+      <w:r>
+        <w:rPr>
+          <w:color w:val="000000"/>
+        </w:rPr>
+        <w:t xml:space="preserve">discovered that under a fixed sizing scenario, both frameworks manage to converge to </w:t>
+      </w:r>
+      <w:r>
+        <w:rPr>
+          <w:color w:val="000000"/>
+        </w:rPr>
+        <w:t xml:space="preserve">the </w:t>
+      </w:r>
+      <w:r>
+        <w:rPr>
+          <w:color w:val="000000"/>
+        </w:rPr>
+        <w:t>global optimum</w:t>
+      </w:r>
+      <w:r>
+        <w:rPr>
+          <w:color w:val="000000"/>
+        </w:rPr>
+        <w:t xml:space="preserve">. </w:t>
+      </w:r>
+      <w:r>
+        <w:rPr>
+          <w:color w:val="000000"/>
+        </w:rPr>
         <w:lastRenderedPageBreak/>
-        <w:t>both frameworks</w:t>
+        <w:t>However, while introducing the design decision problem</w:t>
       </w:r>
       <w:r>
         <w:rPr>
           <w:color w:val="000000"/>
         </w:rPr>
-        <w:t>’</w:t>
+        <w:t>,</w:t>
       </w:r>
       <w:r>
         <w:rPr>
           <w:color w:val="000000"/>
         </w:rPr>
-        <w:t xml:space="preserve"> performance in </w:t>
+        <w:t xml:space="preserve"> the RL </w:t>
       </w:r>
       <w:r>
         <w:rPr>
           <w:color w:val="000000"/>
         </w:rPr>
-        <w:t>a</w:t>
+        <w:t>at first managed to produce a better result in terms of cost</w:t>
       </w:r>
       <w:r>
         <w:rPr>
           <w:color w:val="000000"/>
         </w:rPr>
+        <w:t>;</w:t>
+      </w:r>
+      <w:r>
+        <w:rPr>
+          <w:color w:val="000000"/>
+        </w:rPr>
+        <w:t xml:space="preserve"> however, the authors later found that this is due to the </w:t>
+      </w:r>
+      <w:r>
+        <w:rPr>
+          <w:color w:val="000000"/>
+        </w:rPr>
+        <w:t>modelling limitations that the RL excludes</w:t>
+      </w:r>
+      <w:r>
+        <w:rPr>
+          <w:color w:val="000000"/>
+        </w:rPr>
+        <w:t>,</w:t>
+      </w:r>
+      <w:r>
+        <w:rPr>
+          <w:color w:val="000000"/>
+        </w:rPr>
         <w:t xml:space="preserve"> </w:t>
       </w:r>
       <w:r>
         <w:rPr>
           <w:color w:val="000000"/>
         </w:rPr>
-        <w:t>one-</w:t>
+        <w:t xml:space="preserve">which is the battery SOC </w:t>
       </w:r>
       <w:r>
         <w:rPr>
           <w:color w:val="000000"/>
         </w:rPr>
-        <w:t xml:space="preserve">year case study. </w:t>
+        <w:t>balance at the end</w:t>
       </w:r>
       <w:r>
         <w:rPr>
           <w:color w:val="000000"/>
         </w:rPr>
-        <w:t xml:space="preserve">For the </w:t>
+        <w:t xml:space="preserve"> that should be the same as the initial SOC state. </w:t>
       </w:r>
       <w:r>
         <w:rPr>
           <w:color w:val="000000"/>
         </w:rPr>
-        <w:t xml:space="preserve">first stage, the authors </w:t>
+        <w:t xml:space="preserve">With this assumption being included in the calculation, the cost result of RL </w:t>
       </w:r>
       <w:r>
         <w:rPr>
           <w:color w:val="000000"/>
         </w:rPr>
-        <w:t xml:space="preserve">discovered that under a fixed sizing scenario, both frameworks manage to converge to </w:t>
+        <w:t>drops,</w:t>
       </w:r>
       <w:r>
         <w:rPr>
           <w:color w:val="000000"/>
         </w:rPr>
+        <w:t xml:space="preserve"> </w:t>
+      </w:r>
+      <w:r>
+        <w:rPr>
+          <w:color w:val="000000"/>
+        </w:rPr>
+        <w:t>and MILP prevails to become cheaper.</w:t>
+      </w:r>
+      <w:r>
+        <w:rPr>
+          <w:color w:val="000000"/>
+        </w:rPr>
+        <w:t xml:space="preserve"> This shows </w:t>
+      </w:r>
+      <w:r>
+        <w:rPr>
+          <w:color w:val="000000"/>
+        </w:rPr>
+        <w:t>how important the modelling phase and identical assumption are for a fair comparison.</w:t>
+      </w:r>
+      <w:r>
+        <w:rPr>
+          <w:color w:val="000000"/>
+        </w:rPr>
+        <w:t xml:space="preserve"> </w:t>
+      </w:r>
+      <w:r>
+        <w:rPr>
+          <w:color w:val="000000"/>
+        </w:rPr>
+        <w:t xml:space="preserve">Interestingly, </w:t>
+      </w:r>
+      <w:r>
+        <w:rPr>
+          <w:color w:val="000000"/>
+        </w:rPr>
+        <w:t>the RL approach manages to converge to a near</w:t>
+      </w:r>
+      <w:r>
+        <w:rPr>
+          <w:color w:val="000000"/>
+        </w:rPr>
+        <w:t>-</w:t>
+      </w:r>
+      <w:r>
+        <w:rPr>
+          <w:color w:val="000000"/>
+        </w:rPr>
+        <w:t>optimal solution with a design variable that is significantly different from the MILP</w:t>
+      </w:r>
+      <w:r>
+        <w:rPr>
+          <w:color w:val="000000"/>
+        </w:rPr>
+        <w:t>:</w:t>
+      </w:r>
+      <w:r>
+        <w:rPr>
+          <w:color w:val="000000"/>
+        </w:rPr>
+        <w:t xml:space="preserve"> </w:t>
+      </w:r>
+      <w:r>
+        <w:rPr>
+          <w:color w:val="000000"/>
+        </w:rPr>
+        <w:t xml:space="preserve">62 kWh and 41 kWp for RL and 40 kWh and 103 kWp for </w:t>
+      </w:r>
+      <w:r>
+        <w:rPr>
+          <w:color w:val="000000"/>
+        </w:rPr>
+        <w:t>MILP for battery and PV</w:t>
+      </w:r>
+      <w:r>
+        <w:rPr>
+          <w:color w:val="000000"/>
+        </w:rPr>
+        <w:t>,</w:t>
+      </w:r>
+      <w:r>
+        <w:rPr>
+          <w:color w:val="000000"/>
+        </w:rPr>
+        <w:t xml:space="preserve"> respectively</w:t>
+      </w:r>
+      <w:r>
+        <w:rPr>
+          <w:color w:val="000000"/>
+        </w:rPr>
+        <w:t>, with the</w:t>
+      </w:r>
+      <w:r>
+        <w:rPr>
+          <w:color w:val="000000"/>
+        </w:rPr>
+        <w:t xml:space="preserve"> RL layout having 145.65% cost of MILP after considering th</w:t>
+      </w:r>
+      <w:r>
+        <w:rPr>
+          <w:color w:val="000000"/>
+        </w:rPr>
+        <w:t xml:space="preserve">e additional SOC calculations. </w:t>
+      </w:r>
+    </w:p>
+    <w:p>
+      <w:pPr>
+        <w:rPr>
+          <w:color w:val="000000"/>
+        </w:rPr>
+      </w:pPr>
+    </w:p>
+    <w:p>
+      <w:pPr>
+        <w:rPr>
+          <w:color w:val="000000"/>
+        </w:rPr>
+      </w:pPr>
+      <w:r>
+        <w:rPr>
+          <w:color w:val="000000"/>
+        </w:rPr>
+        <w:t xml:space="preserve">In the second stage of this study, </w:t>
+      </w:r>
+      <w:r>
+        <w:rPr>
+          <w:color w:val="000000"/>
+        </w:rPr>
         <w:t xml:space="preserve">the </w:t>
       </w:r>
       <w:r>
         <w:rPr>
           <w:color w:val="000000"/>
         </w:rPr>
-        <w:t>global optimum</w:t>
+        <w:t>RL</w:t>
       </w:r>
       <w:r>
         <w:rPr>
           <w:color w:val="000000"/>
         </w:rPr>
-        <w:t>. However, while introducing the design decision problem</w:t>
+        <w:t xml:space="preserve"> </w:t>
       </w:r>
       <w:r>
         <w:rPr>
           <w:color w:val="000000"/>
         </w:rPr>
+        <w:t>approach failed</w:t>
+      </w:r>
+      <w:r>
+        <w:rPr>
+          <w:color w:val="000000"/>
+        </w:rPr>
+        <w:t xml:space="preserve"> to converge to the same cost value of MILP</w:t>
+      </w:r>
+      <w:r>
+        <w:rPr>
+          <w:color w:val="000000"/>
+        </w:rPr>
+        <w:t xml:space="preserve"> under the fixed sizing scenario, with it being </w:t>
+      </w:r>
+      <w:r>
+        <w:rPr>
+          <w:color w:val="000000"/>
+        </w:rPr>
+        <w:t>12% more expensive</w:t>
+      </w:r>
+      <w:r>
+        <w:rPr>
+          <w:color w:val="000000"/>
+        </w:rPr>
+        <w:t xml:space="preserve">. Under the joint operational and sizing decision optimization scenario, </w:t>
+      </w:r>
+      <w:r>
+        <w:rPr>
+          <w:color w:val="000000"/>
+        </w:rPr>
+        <w:t xml:space="preserve">RL </w:t>
+      </w:r>
+      <w:r>
+        <w:rPr>
+          <w:color w:val="000000"/>
+        </w:rPr>
+        <w:t xml:space="preserve">ends up </w:t>
+      </w:r>
+      <w:r>
+        <w:rPr>
+          <w:color w:val="000000"/>
+        </w:rPr>
+        <w:t xml:space="preserve">having 22% more cost than MILP, while the design </w:t>
+      </w:r>
+      <w:r>
+        <w:rPr>
+          <w:color w:val="000000"/>
+        </w:rPr>
+        <w:t>decision</w:t>
+      </w:r>
+      <w:r>
+        <w:rPr>
+          <w:color w:val="000000"/>
+        </w:rPr>
+        <w:t>s</w:t>
+      </w:r>
+      <w:r>
+        <w:rPr>
+          <w:color w:val="000000"/>
+        </w:rPr>
+        <w:t xml:space="preserve"> are significantly smaller than MILP (44 kWh &amp; 57 kWp</w:t>
+      </w:r>
+      <w:r>
+        <w:rPr>
+          <w:color w:val="000000"/>
+        </w:rPr>
+        <w:t xml:space="preserve"> RL and </w:t>
+      </w:r>
+      <w:r>
+        <w:rPr>
+          <w:color w:val="000000"/>
+        </w:rPr>
+        <w:t>95 kWh &amp; 81 kWp</w:t>
+      </w:r>
+      <w:r>
+        <w:rPr>
+          <w:color w:val="000000"/>
+        </w:rPr>
+        <w:t xml:space="preserve"> </w:t>
+      </w:r>
+      <w:r>
+        <w:rPr>
+          <w:color w:val="000000"/>
+        </w:rPr>
+        <w:t>for MILP</w:t>
+      </w:r>
+      <w:r>
+        <w:rPr>
+          <w:color w:val="000000"/>
+        </w:rPr>
+        <w:t xml:space="preserve"> for battery and PV</w:t>
+      </w:r>
+      <w:r>
+        <w:rPr>
+          <w:color w:val="000000"/>
+        </w:rPr>
         <w:t>,</w:t>
       </w:r>
       <w:r>
         <w:rPr>
           <w:color w:val="000000"/>
         </w:rPr>
-        <w:t xml:space="preserve"> the RL </w:t>
+        <w:t xml:space="preserve"> respectively)</w:t>
       </w:r>
       <w:r>
         <w:rPr>
           <w:color w:val="000000"/>
         </w:rPr>
-        <w:t>at first managed to produce a better result in terms of cost</w:t>
+        <w:t>. According to the authors of the study, this poorer performance of RL could be due to a lot of reasons</w:t>
       </w:r>
       <w:r>
         <w:rPr>
@@ -13575,357 +13892,130 @@
         <w:rPr>
           <w:color w:val="000000"/>
         </w:rPr>
-        <w:t xml:space="preserve"> however, the authors later found that this is due to the </w:t>
+        <w:t xml:space="preserve"> two of the notable reasons includ</w:t>
       </w:r>
       <w:r>
         <w:rPr>
           <w:color w:val="000000"/>
         </w:rPr>
-        <w:t>modelling limitations that the RL excludes</w:t>
+        <w:t xml:space="preserve">e hyperparameter tuning and </w:t>
       </w:r>
       <w:r>
         <w:rPr>
           <w:color w:val="000000"/>
         </w:rPr>
-        <w:t>,</w:t>
+        <w:t xml:space="preserve">the </w:t>
       </w:r>
       <w:r>
         <w:rPr>
           <w:color w:val="000000"/>
         </w:rPr>
+        <w:t xml:space="preserve">outdated </w:t>
+      </w:r>
+      <w:r>
+        <w:rPr>
+          <w:color w:val="000000"/>
+        </w:rPr>
+        <w:t xml:space="preserve">RL algorithm </w:t>
+      </w:r>
+      <w:r>
+        <w:rPr>
+          <w:rFonts w:hint="eastAsia"/>
+          <w:color w:val="000000"/>
+        </w:rPr>
+        <w:t>chosen, which</w:t>
+      </w:r>
+      <w:r>
+        <w:rPr>
+          <w:color w:val="000000"/>
+        </w:rPr>
+        <w:t xml:space="preserve"> was developed in 1992.</w:t>
+      </w:r>
+      <w:r>
+        <w:rPr>
+          <w:rFonts w:hint="eastAsia"/>
+          <w:color w:val="000000"/>
+        </w:rPr>
         <w:t xml:space="preserve"> </w:t>
       </w:r>
       <w:r>
         <w:rPr>
+          <w:rFonts w:hint="eastAsia"/>
           <w:color w:val="000000"/>
         </w:rPr>
-        <w:t xml:space="preserve">which is the battery SOC </w:t>
+        <w:tab/>
       </w:r>
       <w:r>
         <w:rPr>
           <w:color w:val="000000"/>
         </w:rPr>
-        <w:t>balance at the end</w:t>
+        <w:tab/>
       </w:r>
       <w:r>
         <w:rPr>
           <w:color w:val="000000"/>
         </w:rPr>
-        <w:t xml:space="preserve"> that should be the same as the initial SOC state. </w:t>
+        <w:tab/>
       </w:r>
       <w:r>
         <w:rPr>
           <w:color w:val="000000"/>
         </w:rPr>
-        <w:t xml:space="preserve">With this assumption being included in the calculation, the cost result of RL </w:t>
+        <w:tab/>
       </w:r>
       <w:r>
         <w:rPr>
           <w:color w:val="000000"/>
         </w:rPr>
-        <w:t>drops,</w:t>
+        <w:tab/>
       </w:r>
       <w:r>
         <w:rPr>
           <w:color w:val="000000"/>
         </w:rPr>
-        <w:t xml:space="preserve"> </w:t>
+        <w:tab/>
       </w:r>
       <w:r>
         <w:rPr>
           <w:color w:val="000000"/>
         </w:rPr>
-        <w:t>and MILP prevails to become cheaper.</w:t>
+        <w:tab/>
       </w:r>
       <w:r>
         <w:rPr>
           <w:color w:val="000000"/>
         </w:rPr>
-        <w:t xml:space="preserve"> This shows </w:t>
+        <w:tab/>
       </w:r>
       <w:r>
         <w:rPr>
           <w:color w:val="000000"/>
         </w:rPr>
-        <w:t>how important the modelling phase and identical assumption are for a fair comparison.</w:t>
+        <w:tab/>
       </w:r>
       <w:r>
         <w:rPr>
           <w:color w:val="000000"/>
         </w:rPr>
-        <w:t xml:space="preserve"> </w:t>
+        <w:tab/>
       </w:r>
       <w:r>
         <w:rPr>
           <w:color w:val="000000"/>
         </w:rPr>
-        <w:t xml:space="preserve">Interestingly, </w:t>
+        <w:tab/>
       </w:r>
       <w:r>
         <w:rPr>
           <w:color w:val="000000"/>
         </w:rPr>
-        <w:t>the RL approach manages to converge to a near</w:t>
+        <w:tab/>
       </w:r>
       <w:r>
         <w:rPr>
           <w:color w:val="000000"/>
         </w:rPr>
-        <w:t>-</w:t>
-      </w:r>
-      <w:r>
-        <w:rPr>
-          <w:color w:val="000000"/>
-        </w:rPr>
-        <w:t>optimal solution with a design variable that is significantly different from the MILP</w:t>
-      </w:r>
-      <w:r>
-        <w:rPr>
-          <w:color w:val="000000"/>
-        </w:rPr>
-        <w:t>:</w:t>
-      </w:r>
-      <w:r>
-        <w:rPr>
-          <w:color w:val="000000"/>
-        </w:rPr>
-        <w:t xml:space="preserve"> </w:t>
-      </w:r>
-      <w:r>
-        <w:rPr>
-          <w:color w:val="000000"/>
-        </w:rPr>
-        <w:t xml:space="preserve">62 kWh and 41 kWp for RL and 40 kWh and 103 kWp for </w:t>
-      </w:r>
-      <w:r>
-        <w:rPr>
-          <w:color w:val="000000"/>
-        </w:rPr>
-        <w:t>MILP for battery and PV</w:t>
-      </w:r>
-      <w:r>
-        <w:rPr>
-          <w:color w:val="000000"/>
-        </w:rPr>
-        <w:t>,</w:t>
-      </w:r>
-      <w:r>
-        <w:rPr>
-          <w:color w:val="000000"/>
-        </w:rPr>
-        <w:t xml:space="preserve"> respectively</w:t>
-      </w:r>
-      <w:r>
-        <w:rPr>
-          <w:color w:val="000000"/>
-        </w:rPr>
-        <w:t>, with the</w:t>
-      </w:r>
-      <w:r>
-        <w:rPr>
-          <w:color w:val="000000"/>
-        </w:rPr>
-        <w:t xml:space="preserve"> RL layout having 145.65% cost of MILP after considering th</w:t>
-      </w:r>
-      <w:r>
-        <w:rPr>
-          <w:color w:val="000000"/>
-        </w:rPr>
-        <w:t xml:space="preserve">e additional SOC calculations. </w:t>
-      </w:r>
-    </w:p>
-    <w:p>
-      <w:pPr>
-        <w:rPr>
-          <w:color w:val="000000"/>
-        </w:rPr>
-      </w:pPr>
-    </w:p>
-    <w:p>
-      <w:pPr>
-        <w:rPr>
-          <w:color w:val="000000"/>
-        </w:rPr>
-      </w:pPr>
-      <w:r>
-        <w:rPr>
-          <w:color w:val="000000"/>
-        </w:rPr>
-        <w:t xml:space="preserve">In the second stage of this study, </w:t>
-      </w:r>
-      <w:r>
-        <w:rPr>
-          <w:color w:val="000000"/>
-        </w:rPr>
-        <w:t xml:space="preserve">the </w:t>
-      </w:r>
-      <w:r>
-        <w:rPr>
-          <w:color w:val="000000"/>
-        </w:rPr>
-        <w:t>RL</w:t>
-      </w:r>
-      <w:r>
-        <w:rPr>
-          <w:color w:val="000000"/>
-        </w:rPr>
-        <w:t xml:space="preserve"> </w:t>
-      </w:r>
-      <w:r>
-        <w:rPr>
-          <w:color w:val="000000"/>
-        </w:rPr>
-        <w:t>approach failed</w:t>
-      </w:r>
-      <w:r>
-        <w:rPr>
-          <w:color w:val="000000"/>
-        </w:rPr>
-        <w:t xml:space="preserve"> to converge to the same cost value of MILP</w:t>
-      </w:r>
-      <w:r>
-        <w:rPr>
-          <w:color w:val="000000"/>
-        </w:rPr>
-        <w:t xml:space="preserve"> under the fixed sizing scenario, with it being </w:t>
-      </w:r>
-      <w:r>
-        <w:rPr>
-          <w:color w:val="000000"/>
-        </w:rPr>
-        <w:t>12% more expensive</w:t>
-      </w:r>
-      <w:r>
-        <w:rPr>
-          <w:color w:val="000000"/>
-        </w:rPr>
-        <w:t xml:space="preserve">. Under the joint operational and sizing decision optimization scenario, </w:t>
-      </w:r>
-      <w:r>
-        <w:rPr>
-          <w:color w:val="000000"/>
-        </w:rPr>
-        <w:t xml:space="preserve">RL </w:t>
-      </w:r>
-      <w:r>
-        <w:rPr>
-          <w:color w:val="000000"/>
-        </w:rPr>
-        <w:t xml:space="preserve">ends up </w:t>
-      </w:r>
-      <w:r>
-        <w:rPr>
-          <w:color w:val="000000"/>
-        </w:rPr>
-        <w:t xml:space="preserve">having 22% more cost than MILP, while the design </w:t>
-      </w:r>
-      <w:r>
-        <w:rPr>
-          <w:color w:val="000000"/>
-        </w:rPr>
-        <w:t>decision</w:t>
-      </w:r>
-      <w:r>
-        <w:rPr>
-          <w:color w:val="000000"/>
-        </w:rPr>
-        <w:t>s</w:t>
-      </w:r>
-      <w:r>
-        <w:rPr>
-          <w:color w:val="000000"/>
-        </w:rPr>
-        <w:t xml:space="preserve"> are significantly smaller than MILP (44 kWh &amp; 57 kWp</w:t>
-      </w:r>
-      <w:r>
-        <w:rPr>
-          <w:color w:val="000000"/>
-        </w:rPr>
-        <w:t xml:space="preserve"> RL and </w:t>
-      </w:r>
-      <w:r>
-        <w:rPr>
-          <w:color w:val="000000"/>
-        </w:rPr>
-        <w:t>95 kWh &amp; 81 kWp</w:t>
-      </w:r>
-      <w:r>
-        <w:rPr>
-          <w:color w:val="000000"/>
-        </w:rPr>
-        <w:t xml:space="preserve"> </w:t>
-      </w:r>
-      <w:r>
-        <w:rPr>
-          <w:color w:val="000000"/>
-        </w:rPr>
-        <w:t>for MILP</w:t>
-      </w:r>
-      <w:r>
-        <w:rPr>
-          <w:color w:val="000000"/>
-        </w:rPr>
-        <w:t xml:space="preserve"> for battery and PV</w:t>
-      </w:r>
-      <w:r>
-        <w:rPr>
-          <w:color w:val="000000"/>
-        </w:rPr>
-        <w:t>,</w:t>
-      </w:r>
-      <w:r>
-        <w:rPr>
-          <w:color w:val="000000"/>
-        </w:rPr>
-        <w:t xml:space="preserve"> respectively)</w:t>
-      </w:r>
-      <w:r>
-        <w:rPr>
-          <w:color w:val="000000"/>
-        </w:rPr>
-        <w:t>. According to the authors of the study, this poorer performance of RL could be due to a lot of reasons</w:t>
-      </w:r>
-      <w:r>
-        <w:rPr>
-          <w:color w:val="000000"/>
-        </w:rPr>
-        <w:t>;</w:t>
-      </w:r>
-      <w:r>
-        <w:rPr>
-          <w:color w:val="000000"/>
-        </w:rPr>
-        <w:t xml:space="preserve"> two of the notable reasons includ</w:t>
-      </w:r>
-      <w:r>
-        <w:rPr>
-          <w:color w:val="000000"/>
-        </w:rPr>
-        <w:t xml:space="preserve">e hyperparameter tuning and </w:t>
-      </w:r>
-      <w:r>
-        <w:rPr>
-          <w:color w:val="000000"/>
-        </w:rPr>
-        <w:t xml:space="preserve">the </w:t>
-      </w:r>
-      <w:r>
-        <w:rPr>
-          <w:color w:val="000000"/>
-        </w:rPr>
-        <w:t xml:space="preserve">outdated </w:t>
-      </w:r>
-      <w:r>
-        <w:rPr>
-          <w:color w:val="000000"/>
-        </w:rPr>
-        <w:t>chosen RL algorithm that</w:t>
-      </w:r>
-      <w:r>
-        <w:rPr>
-          <w:color w:val="000000"/>
-        </w:rPr>
-        <w:t xml:space="preserve"> was developed in 1992. </w:t>
+        <w:tab/>
       </w:r>
     </w:p>
     <w:p>
@@ -13991,68 +14081,88 @@
         </w:rPr>
         <w:t xml:space="preserve">. </w:t>
       </w:r>
-    </w:p>
-    <w:p>
-      <w:pPr>
+      <w:r>
         <w:rPr>
           <w:color w:val="000000"/>
         </w:rPr>
-      </w:pPr>
-    </w:p>
-    <w:p>
-      <w:pPr>
-        <w:pStyle w:val="ListParagraph"/>
-        <w:numPr>
-          <w:ilvl w:val="0"/>
-          <w:numId w:val="14"/>
-        </w:numPr>
+        <w:t xml:space="preserve">As an on-policy policy-gradient framework, PPO utilizes a clipped surrogate objective function that constrains policy updates within a selected trust region, which ensures high training stability and steady convergence across continuous control domains </w:t>
+      </w:r>
+      <w:sdt>
+        <w:sdtPr>
+          <w:rPr>
+            <w:color w:val="000000"/>
+          </w:rPr>
+          <w:tag w:val="MENDELEY_CITATION_v3_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"/>
+          <w:id w:val="-103577360"/>
+          <w:placeholder>
+            <w:docPart w:val="DefaultPlaceholder_-1854013440"/>
+          </w:placeholder>
+        </w:sdtPr>
+        <w:sdtContent>
+          <w:r>
+            <w:rPr>
+              <w:color w:val="000000"/>
+            </w:rPr>
+            <w:t>[59]</w:t>
+          </w:r>
+        </w:sdtContent>
+      </w:sdt>
+      <w:r>
         <w:rPr>
           <w:color w:val="000000"/>
         </w:rPr>
-      </w:pPr>
+        <w:t>. In one study on</w:t>
+      </w:r>
       <w:r>
         <w:rPr>
           <w:color w:val="000000"/>
         </w:rPr>
-        <w:t>MILP vs RL for SAC and PPO, and other state-of-the-art RL algorithms</w:t>
-      </w:r>
-    </w:p>
-    <w:p>
-      <w:pPr>
-        <w:pStyle w:val="ListParagraph"/>
-        <w:numPr>
-          <w:ilvl w:val="0"/>
-          <w:numId w:val="14"/>
-        </w:numPr>
+        <w:t xml:space="preserve"> optimizing the operation of</w:t>
+      </w:r>
+      <w:r>
         <w:rPr>
           <w:color w:val="000000"/>
         </w:rPr>
-      </w:pPr>
+        <w:t xml:space="preserve"> multireservoir hydropower, </w:t>
+      </w:r>
       <w:r>
         <w:rPr>
           <w:color w:val="000000"/>
         </w:rPr>
-        <w:t>RL &amp; MILP hybrid approach in optimizing energy system (if actually recommended, mention as future outlook that can be implemented in the future)</w:t>
-      </w:r>
-    </w:p>
-    <w:p>
-      <w:pPr>
-        <w:pStyle w:val="ListParagraph"/>
-        <w:numPr>
-          <w:ilvl w:val="0"/>
-          <w:numId w:val="14"/>
-        </w:numPr>
+        <w:t xml:space="preserve">Castro-Freibott et al. </w:t>
+      </w:r>
+      <w:sdt>
+        <w:sdtPr>
+          <w:rPr>
+            <w:color w:val="000000"/>
+          </w:rPr>
+          <w:tag w:val="MENDELEY_CITATION_v3_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"/>
+          <w:id w:val="2122636886"/>
+          <w:placeholder>
+            <w:docPart w:val="FB2AC7218A57B14F9E773BB78C396CFE"/>
+          </w:placeholder>
+        </w:sdtPr>
+        <w:sdtContent>
+          <w:r>
+            <w:rPr>
+              <w:color w:val="000000"/>
+            </w:rPr>
+            <w:t>[60]</w:t>
+          </w:r>
+        </w:sdtContent>
+      </w:sdt>
+      <w:r>
         <w:rPr>
           <w:color w:val="000000"/>
         </w:rPr>
-      </w:pPr>
-    </w:p>
-    <w:p>
-      <w:pPr>
+        <w:t xml:space="preserve"> implemented different RL algorithms (A2C, PPO, and SAC) in comparison to an MILP baseline. The experiment demonstrated that MILP</w:t>
+      </w:r>
+      <w:r>
         <w:rPr>
           <w:color w:val="000000"/>
         </w:rPr>
-      </w:pPr>
+        <w:t xml:space="preserve"> achieves superior performance in the smaller system, but</w:t>
+      </w:r>
     </w:p>
     <w:p>
       <w:pPr>
@@ -14060,26 +14170,116 @@
           <w:color w:val="000000"/>
         </w:rPr>
       </w:pPr>
-    </w:p>
-    <w:p>
-      <w:pPr>
+      <w:r>
         <w:rPr>
           <w:color w:val="000000"/>
         </w:rPr>
-      </w:pPr>
-    </w:p>
-    <w:p>
-      <w:pPr>
+        <w:t>PPO</w:t>
+      </w:r>
+      <w:r>
         <w:rPr>
           <w:color w:val="000000"/>
         </w:rPr>
-      </w:pPr>
-    </w:p>
-    <w:p>
-      <w:pPr>
+        <w:t xml:space="preserve"> was the strongest RL method tested and scaled far better than MILP when the system gets bigger.</w:t>
+      </w:r>
+      <w:r>
         <w:rPr>
           <w:color w:val="000000"/>
         </w:rPr>
+        <w:t xml:space="preserve"> This result also shows that PPO could maintain consistent performance across discrete and continuous action spaces while achieving it with less than one second of execution time. Another </w:t>
+      </w:r>
+      <w:r>
+        <w:rPr>
+          <w:color w:val="000000"/>
+        </w:rPr>
+        <w:lastRenderedPageBreak/>
+        <w:t xml:space="preserve">study compared four RL algorithms: PPO, A2C, SAC, TD3 for a battery power plant control problem and demonstrated TD3 superior results among the RL algorithms and outperformed MILP by 5% in cost savings </w:t>
+      </w:r>
+      <w:sdt>
+        <w:sdtPr>
+          <w:rPr>
+            <w:color w:val="000000"/>
+          </w:rPr>
+          <w:tag w:val="MENDELEY_CITATION_v3_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"/>
+          <w:id w:val="-2030715240"/>
+          <w:placeholder>
+            <w:docPart w:val="DefaultPlaceholder_-1854013440"/>
+          </w:placeholder>
+        </w:sdtPr>
+        <w:sdtContent>
+          <w:r>
+            <w:rPr>
+              <w:color w:val="000000"/>
+            </w:rPr>
+            <w:t>[61]</w:t>
+          </w:r>
+        </w:sdtContent>
+      </w:sdt>
+      <w:r>
+        <w:rPr>
+          <w:color w:val="000000"/>
+        </w:rPr>
+        <w:t>.</w:t>
+      </w:r>
+      <w:r>
+        <w:rPr>
+          <w:color w:val="000000"/>
+        </w:rPr>
+        <w:t xml:space="preserve"> </w:t>
+      </w:r>
+      <w:r>
+        <w:rPr>
+          <w:color w:val="000000"/>
+        </w:rPr>
+        <w:t xml:space="preserve">In a study on optimizing renewables penetration in modern smart grids, a comparative analysis was conducted between rule-based, MILP, and DRL algorithms (DDPG, PPO, SAC). The result demonstrated SAC superiority in delivering the best results, reducing operational costs by 20%, achieving 92.8 % renewable application, while minimizing loss-of-load probability. From diving deep into the literature, it is possible to argue that many RL strategies are </w:t>
+      </w:r>
+      <w:r>
+        <w:rPr>
+          <w:color w:val="000000"/>
+        </w:rPr>
+        <w:t xml:space="preserve">already competitive with MILP even some better, however, this highly dependent on the system complexity and uncertainty assumption. </w:t>
+      </w:r>
+    </w:p>
+    <w:p>
+      <w:pPr>
+        <w:rPr>
+          <w:color w:val="000000"/>
+        </w:rPr>
+      </w:pPr>
+    </w:p>
+    <w:p>
+      <w:pPr>
+        <w:rPr>
+          <w:color w:val="000000"/>
+        </w:rPr>
+      </w:pPr>
+    </w:p>
+    <w:p>
+      <w:pPr>
+        <w:rPr>
+          <w:color w:val="000000"/>
+        </w:rPr>
+      </w:pPr>
+    </w:p>
+    <w:p>
+      <w:pPr>
+        <w:rPr>
+          <w:color w:val="000000"/>
+        </w:rPr>
+      </w:pPr>
+    </w:p>
+    <w:p>
+      <w:pPr>
+        <w:rPr>
+          <w:color w:val="000000"/>
+        </w:rPr>
+      </w:pPr>
+    </w:p>
+    <w:p>
+      <w:pPr>
+        <w:rPr>
+          <w:color w:val="000000"/>
+        </w:rPr>
       </w:pPr>
     </w:p>
     <w:p/>
@@ -14092,22 +14292,22 @@
       <w:pPr>
         <w:pStyle w:val="Heading1"/>
       </w:pPr>
-      <w:bookmarkStart w:id="15" w:name="_Toc235289157"/>
+      <w:bookmarkStart w:id="16" w:name="_Toc235289157"/>
       <w:r>
         <w:lastRenderedPageBreak/>
         <w:t>Methodology</w:t>
       </w:r>
-      <w:bookmarkEnd w:id="15"/>
+      <w:bookmarkEnd w:id="16"/>
     </w:p>
     <w:p>
       <w:pPr>
         <w:pStyle w:val="Heading2"/>
       </w:pPr>
-      <w:bookmarkStart w:id="16" w:name="_Toc235289158"/>
+      <w:bookmarkStart w:id="17" w:name="_Toc235289158"/>
       <w:r>
         <w:t>Hybrid Biomass Power-to-Methanol System Model</w:t>
       </w:r>
-      <w:bookmarkEnd w:id="16"/>
+      <w:bookmarkEnd w:id="17"/>
     </w:p>
     <w:p>
       <w:pPr>
@@ -14149,17 +14349,17 @@
       <w:pPr>
         <w:pStyle w:val="Heading2"/>
       </w:pPr>
-      <w:bookmarkStart w:id="17" w:name="_Toc235289159"/>
+      <w:bookmarkStart w:id="18" w:name="_Toc235289159"/>
       <w:r>
         <w:t>Two-steps Outerloop &amp; Innerloop Strategy</w:t>
       </w:r>
-      <w:bookmarkEnd w:id="17"/>
+      <w:bookmarkEnd w:id="18"/>
     </w:p>
     <w:p>
       <w:pPr>
         <w:pStyle w:val="Heading2"/>
       </w:pPr>
-      <w:bookmarkStart w:id="18" w:name="_Toc235289160"/>
+      <w:bookmarkStart w:id="19" w:name="_Toc235289160"/>
       <w:r>
         <w:t xml:space="preserve">Level 2 </w:t>
       </w:r>
@@ -14169,7 +14369,7 @@
       <w:r>
         <w:t>(MILP)</w:t>
       </w:r>
-      <w:bookmarkEnd w:id="18"/>
+      <w:bookmarkEnd w:id="19"/>
     </w:p>
     <w:p>
       <w:pPr>
@@ -14241,7 +14441,7 @@
       <w:pPr>
         <w:pStyle w:val="Heading2"/>
       </w:pPr>
-      <w:bookmarkStart w:id="19" w:name="_Toc235289161"/>
+      <w:bookmarkStart w:id="20" w:name="_Toc235289161"/>
       <w:r>
         <w:t xml:space="preserve">Level 3 </w:t>
       </w:r>
@@ -14251,7 +14451,7 @@
       <w:r>
         <w:t>(RL)</w:t>
       </w:r>
-      <w:bookmarkEnd w:id="19"/>
+      <w:bookmarkEnd w:id="20"/>
     </w:p>
     <w:p>
       <w:pPr>
@@ -14329,24 +14529,24 @@
       <w:pPr>
         <w:pStyle w:val="Heading2"/>
       </w:pPr>
-      <w:bookmarkStart w:id="20" w:name="_Toc235289162"/>
+      <w:bookmarkStart w:id="21" w:name="_Toc235289162"/>
       <w:r>
         <w:t>Data</w:t>
       </w:r>
-      <w:bookmarkEnd w:id="20"/>
+      <w:bookmarkEnd w:id="21"/>
     </w:p>
     <w:p>
       <w:pPr>
         <w:pStyle w:val="Heading2"/>
       </w:pPr>
-      <w:bookmarkStart w:id="21" w:name="_Toc235289163"/>
+      <w:bookmarkStart w:id="22" w:name="_Toc235289163"/>
       <w:r>
         <w:t>Comparison Stages</w:t>
       </w:r>
       <w:r>
         <w:t xml:space="preserve"> &amp; Scenario Definition</w:t>
       </w:r>
-      <w:bookmarkEnd w:id="21"/>
+      <w:bookmarkEnd w:id="22"/>
     </w:p>
     <w:p>
       <w:pPr>
@@ -14368,18 +14568,18 @@
           <w:numId w:val="2"/>
         </w:numPr>
       </w:pPr>
-      <w:commentRangeStart w:id="22"/>
+      <w:commentRangeStart w:id="23"/>
       <w:r>
         <w:t>Outerloop comparison</w:t>
       </w:r>
-      <w:commentRangeEnd w:id="22"/>
+      <w:commentRangeEnd w:id="23"/>
       <w:r>
         <w:rPr>
           <w:rStyle w:val="CommentReference"/>
           <w:sz w:val="24"/>
           <w:szCs w:val="22"/>
         </w:rPr>
-        <w:commentReference w:id="22"/>
+        <w:commentReference w:id="23"/>
       </w:r>
       <w:r>
         <w:t xml:space="preserve"> </w:t>
@@ -14436,7 +14636,7 @@
       <w:r>
         <w:t>.</w:t>
       </w:r>
-      <w:commentRangeStart w:id="23"/>
+      <w:commentRangeStart w:id="24"/>
     </w:p>
     <w:p>
       <w:pPr>
@@ -14452,14 +14652,14 @@
       <w:r>
         <w:t>Electricity Supply &amp; Power to X Optimization</w:t>
       </w:r>
-      <w:commentRangeEnd w:id="23"/>
+      <w:commentRangeEnd w:id="24"/>
       <w:r>
         <w:rPr>
           <w:rStyle w:val="CommentReference"/>
           <w:sz w:val="24"/>
           <w:szCs w:val="22"/>
         </w:rPr>
-        <w:commentReference w:id="23"/>
+        <w:commentReference w:id="24"/>
       </w:r>
     </w:p>
     <w:p>
@@ -14470,18 +14670,18 @@
           <w:numId w:val="2"/>
         </w:numPr>
       </w:pPr>
-      <w:commentRangeStart w:id="24"/>
+      <w:commentRangeStart w:id="25"/>
       <w:r>
         <w:t>Innerloop comparison</w:t>
       </w:r>
-      <w:commentRangeEnd w:id="24"/>
+      <w:commentRangeEnd w:id="25"/>
       <w:r>
         <w:rPr>
           <w:rStyle w:val="CommentReference"/>
           <w:sz w:val="24"/>
           <w:szCs w:val="22"/>
         </w:rPr>
-        <w:commentReference w:id="24"/>
+        <w:commentReference w:id="25"/>
       </w:r>
       <w:r>
         <w:t xml:space="preserve">: </w:t>
@@ -14633,7 +14833,7 @@
           <w:numId w:val="2"/>
         </w:numPr>
       </w:pPr>
-      <w:commentRangeStart w:id="25"/>
+      <w:commentRangeStart w:id="26"/>
       <w:r>
         <w:t xml:space="preserve">Stage </w:t>
       </w:r>
@@ -14655,21 +14855,21 @@
       <w:r>
         <w:t xml:space="preserve">vs </w:t>
       </w:r>
-      <w:commentRangeStart w:id="26"/>
+      <w:commentRangeStart w:id="27"/>
       <w:r>
         <w:t xml:space="preserve">BO </w:t>
       </w:r>
       <w:r>
         <w:t xml:space="preserve">Oemof Linear </w:t>
       </w:r>
-      <w:commentRangeEnd w:id="26"/>
+      <w:commentRangeEnd w:id="27"/>
       <w:r>
         <w:rPr>
           <w:rStyle w:val="CommentReference"/>
           <w:sz w:val="24"/>
           <w:szCs w:val="22"/>
         </w:rPr>
-        <w:commentReference w:id="26"/>
+        <w:commentReference w:id="27"/>
       </w:r>
       <w:r>
         <w:t>pathway</w:t>
@@ -14677,14 +14877,14 @@
       <w:r>
         <w:t xml:space="preserve"> </w:t>
       </w:r>
-      <w:commentRangeEnd w:id="25"/>
+      <w:commentRangeEnd w:id="26"/>
       <w:r>
         <w:rPr>
           <w:rStyle w:val="CommentReference"/>
           <w:sz w:val="24"/>
           <w:szCs w:val="22"/>
         </w:rPr>
-        <w:commentReference w:id="25"/>
+        <w:commentReference w:id="26"/>
       </w:r>
     </w:p>
     <w:p>
@@ -15386,19 +15586,19 @@
       <w:pPr>
         <w:pStyle w:val="Heading1"/>
       </w:pPr>
-      <w:bookmarkStart w:id="27" w:name="_Toc235289164"/>
+      <w:bookmarkStart w:id="28" w:name="_Toc235289164"/>
       <w:r>
         <w:lastRenderedPageBreak/>
         <w:t>Results and Discussions</w:t>
       </w:r>
-      <w:bookmarkEnd w:id="27"/>
+      <w:bookmarkEnd w:id="28"/>
     </w:p>
     <w:p>
       <w:pPr>
         <w:pStyle w:val="Heading2"/>
       </w:pPr>
-      <w:bookmarkStart w:id="28" w:name="_Toc235289165"/>
-      <w:bookmarkEnd w:id="28"/>
+      <w:bookmarkStart w:id="29" w:name="_Toc235289165"/>
+      <w:bookmarkEnd w:id="29"/>
     </w:p>
     <w:p>
       <w:pPr>
@@ -15413,12 +15613,12 @@
       <w:pPr>
         <w:pStyle w:val="Heading1"/>
       </w:pPr>
-      <w:bookmarkStart w:id="29" w:name="_Toc235289166"/>
+      <w:bookmarkStart w:id="30" w:name="_Toc235289166"/>
       <w:r>
         <w:lastRenderedPageBreak/>
         <w:t>Conclusions</w:t>
       </w:r>
-      <w:bookmarkEnd w:id="29"/>
+      <w:bookmarkEnd w:id="30"/>
     </w:p>
     <w:p>
       <w:pPr>
@@ -15449,12 +15649,12 @@
       <w:pPr>
         <w:pStyle w:val="Heading1"/>
       </w:pPr>
-      <w:bookmarkStart w:id="30" w:name="_Toc235289167"/>
+      <w:bookmarkStart w:id="31" w:name="_Toc235289167"/>
       <w:r>
         <w:lastRenderedPageBreak/>
         <w:t>References</w:t>
       </w:r>
-      <w:bookmarkEnd w:id="30"/>
+      <w:bookmarkEnd w:id="31"/>
     </w:p>
     <w:sdt>
       <w:sdtPr>
@@ -18105,7 +18305,7 @@
       </w:r>
     </w:p>
   </w:comment>
-  <w:comment w:id="14" w:author="rafi indrajaya" w:date="2026-07-24T21:12:00Z" w:initials="ri">
+  <w:comment w:id="12" w:author="rafi indrajaya" w:date="2026-07-26T21:43:00Z" w:initials="ri">
     <w:p>
       <w:pPr>
         <w:jc w:val="left"/>
@@ -18121,11 +18321,31 @@
           <w:sz w:val="20"/>
           <w:szCs w:val="20"/>
         </w:rPr>
+        <w:t>Should I include table that compares different RL algorithms?</w:t>
+      </w:r>
+    </w:p>
+  </w:comment>
+  <w:comment w:id="15" w:author="rafi indrajaya" w:date="2026-07-24T21:12:00Z" w:initials="ri">
+    <w:p>
+      <w:pPr>
+        <w:jc w:val="left"/>
+      </w:pPr>
+      <w:r>
+        <w:rPr>
+          <w:rStyle w:val="CommentReference"/>
+        </w:rPr>
+        <w:annotationRef/>
+      </w:r>
+      <w:r>
+        <w:rPr>
+          <w:sz w:val="20"/>
+          <w:szCs w:val="20"/>
+        </w:rPr>
         <w:t>Mention in the end of this section of this thesis approaches the comparison differently compared to the existing literature</w:t>
       </w:r>
     </w:p>
   </w:comment>
-  <w:comment w:id="22" w:author="Indrajaya, Muhammad Rafi Afif" w:date="2026-05-06T09:20:00Z" w:initials="MI">
+  <w:comment w:id="23" w:author="Indrajaya, Muhammad Rafi Afif" w:date="2026-05-06T09:20:00Z" w:initials="MI">
     <w:p>
       <w:pPr>
         <w:pStyle w:val="CommentText"/>
@@ -18145,7 +18365,7 @@
       </w:r>
     </w:p>
   </w:comment>
-  <w:comment w:id="23" w:author="Indrajaya, Muhammad Rafi Afif" w:date="2026-05-06T09:23:00Z" w:initials="MI">
+  <w:comment w:id="24" w:author="Indrajaya, Muhammad Rafi Afif" w:date="2026-05-06T09:23:00Z" w:initials="MI">
     <w:p>
       <w:pPr>
         <w:pStyle w:val="CommentText"/>
@@ -18165,7 +18385,7 @@
       </w:r>
     </w:p>
   </w:comment>
-  <w:comment w:id="24" w:author="Indrajaya, Muhammad Rafi Afif" w:date="2026-05-05T16:56:00Z" w:initials="MI">
+  <w:comment w:id="25" w:author="Indrajaya, Muhammad Rafi Afif" w:date="2026-05-05T16:56:00Z" w:initials="MI">
     <w:p>
       <w:pPr>
         <w:pStyle w:val="CommentText"/>
@@ -18231,7 +18451,7 @@
       </w:r>
     </w:p>
   </w:comment>
-  <w:comment w:id="26" w:author="Indrajaya, Muhammad Rafi Afif" w:date="2026-05-12T16:47:00Z" w:initials="MI">
+  <w:comment w:id="27" w:author="Indrajaya, Muhammad Rafi Afif" w:date="2026-05-12T16:47:00Z" w:initials="MI">
     <w:p>
       <w:pPr>
         <w:pStyle w:val="CommentText"/>
@@ -18251,7 +18471,7 @@
       </w:r>
     </w:p>
   </w:comment>
-  <w:comment w:id="25" w:author="Indrajaya, Muhammad Rafi Afif" w:date="2026-05-12T16:48:00Z" w:initials="MI">
+  <w:comment w:id="26" w:author="Indrajaya, Muhammad Rafi Afif" w:date="2026-05-12T16:48:00Z" w:initials="MI">
     <w:p>
       <w:pPr>
         <w:pStyle w:val="CommentText"/>
@@ -18279,6 +18499,7 @@
   <w15:commentEx w15:paraId="5FD0776A" w15:done="0"/>
   <w15:commentEx w15:paraId="1CE5B39B" w15:done="0"/>
   <w15:commentEx w15:paraId="49CD925A" w15:done="1"/>
+  <w15:commentEx w15:paraId="603C0E52" w15:done="0"/>
   <w15:commentEx w15:paraId="3A8D0534" w15:done="0"/>
   <w15:commentEx w15:paraId="1034419E" w15:done="0"/>
   <w15:commentEx w15:paraId="19E49370" w15:done="0"/>
@@ -18305,6 +18526,7 @@
       </w16:ext>
     </w16cex:extLst>
   </w16cex:commentExtensible>
+  <w16cex:commentExtensible w16cex:durableId="5093E17B" w16cex:dateUtc="2026-07-26T19:43:00Z"/>
   <w16cex:commentExtensible w16cex:durableId="0BF1A1FF" w16cex:dateUtc="2026-07-24T19:12:00Z"/>
   <w16cex:commentExtensible w16cex:durableId="14DFEBD2" w16cex:dateUtc="2026-05-06T07:20:00Z"/>
   <w16cex:commentExtensible w16cex:durableId="3016A959" w16cex:dateUtc="2026-05-06T07:23:00Z"/>
@@ -18319,6 +18541,7 @@
   <w16cid:commentId w16cid:paraId="5FD0776A" w16cid:durableId="51FD6FA9"/>
   <w16cid:commentId w16cid:paraId="1CE5B39B" w16cid:durableId="490C994B"/>
   <w16cid:commentId w16cid:paraId="49CD925A" w16cid:durableId="4AA1067B"/>
+  <w16cid:commentId w16cid:paraId="603C0E52" w16cid:durableId="5093E17B"/>
   <w16cid:commentId w16cid:paraId="3A8D0534" w16cid:durableId="0BF1A1FF"/>
   <w16cid:commentId w16cid:paraId="1034419E" w16cid:durableId="14DFEBD2"/>
   <w16cid:commentId w16cid:paraId="19E49370" w16cid:durableId="3016A959"/>
@@ -22846,6 +23069,35 @@
         </w:p>
       </w:docPartBody>
     </w:docPart>
+    <w:docPart>
+      <w:docPartPr>
+        <w:name w:val="FB2AC7218A57B14F9E773BB78C396CFE"/>
+        <w:category>
+          <w:name w:val="General"/>
+          <w:gallery w:val="placeholder"/>
+        </w:category>
+        <w:types>
+          <w:type w:val="bbPlcHdr"/>
+        </w:types>
+        <w:behaviors>
+          <w:behavior w:val="content"/>
+        </w:behaviors>
+        <w:guid w:val="{A8ED9C13-6E0F-4243-966F-D677D5F1475C}"/>
+      </w:docPartPr>
+      <w:docPartBody>
+        <w:p>
+          <w:pPr>
+            <w:pStyle w:val="FB2AC7218A57B14F9E773BB78C396CFE"/>
+          </w:pPr>
+          <w:r>
+            <w:rPr>
+              <w:rStyle w:val="PlaceholderText"/>
+            </w:rPr>
+            <w:t>Click or tap here to enter text.</w:t>
+          </w:r>
+        </w:p>
+      </w:docPartBody>
+    </w:docPart>
   </w:docParts>
 </w:glossaryDocument>
 </file>
@@ -22976,12 +23228,14 @@
     <w:rsid w:val="00276DE2"/>
     <w:rsid w:val="002A1E29"/>
     <w:rsid w:val="002B3829"/>
+    <w:rsid w:val="002F0F58"/>
     <w:rsid w:val="00310846"/>
     <w:rsid w:val="00313DDE"/>
     <w:rsid w:val="00324602"/>
     <w:rsid w:val="00364EE5"/>
     <w:rsid w:val="003746C4"/>
     <w:rsid w:val="003834D4"/>
+    <w:rsid w:val="003862E2"/>
     <w:rsid w:val="00387AFB"/>
     <w:rsid w:val="00393659"/>
     <w:rsid w:val="003A3213"/>
@@ -23018,11 +23272,14 @@
     <w:rsid w:val="00972ECE"/>
     <w:rsid w:val="00990BD7"/>
     <w:rsid w:val="00994A7B"/>
+    <w:rsid w:val="0099567D"/>
     <w:rsid w:val="009C0C40"/>
     <w:rsid w:val="009D185F"/>
+    <w:rsid w:val="009E366D"/>
     <w:rsid w:val="00A0380F"/>
     <w:rsid w:val="00A04B4C"/>
     <w:rsid w:val="00A16840"/>
+    <w:rsid w:val="00A74143"/>
     <w:rsid w:val="00A9316A"/>
     <w:rsid w:val="00AA3301"/>
     <w:rsid w:val="00AE3127"/>
@@ -23500,7 +23757,7 @@
     <w:basedOn w:val="DefaultParagraphFont"/>
     <w:uiPriority w:val="99"/>
     <w:semiHidden/>
-    <w:rsid w:val="00001801"/>
+    <w:rsid w:val="002F0F58"/>
     <w:rPr>
       <w:color w:val="808080"/>
     </w:rPr>
@@ -23528,6 +23785,18 @@
       <w:rFonts w:eastAsiaTheme="minorEastAsia"/>
       <w:kern w:val="2"/>
       <w:lang w:eastAsia="en-US"/>
+      <w14:ligatures w14:val="standardContextual"/>
+    </w:rPr>
+  </w:style>
+  <w:style w:type="paragraph" w:customStyle="1" w:styleId="FB2AC7218A57B14F9E773BB78C396CFE">
+    <w:name w:val="FB2AC7218A57B14F9E773BB78C396CFE"/>
+    <w:rsid w:val="002F0F58"/>
+    <w:pPr>
+      <w:spacing w:after="160" w:line="278" w:lineRule="auto"/>
+    </w:pPr>
+    <w:rPr>
+      <w:kern w:val="2"/>
+      <w:lang w:val="en-JP"/>
       <w14:ligatures w14:val="standardContextual"/>
     </w:rPr>
   </w:style>
@@ -23853,7 +24122,7 @@
   <we:properties>
     <we:property name="MENDELEY_BIBLIOGRAPHY_IS_DIRTY" value="true"/>
     <we:property name="MENDELEY_BIBLIOGRAPHY_LAST_MODIFIED" value="1784919424295"/>
-    <we:property name="MENDELEY_CITATIONS" value="[{&quot;citationID&quot;:&quot;MENDELEY_CITATION_9a69a8b0-b116-4a8e-be9e-ca9faac00dd4&quot;,&quot;properties&quot;:{&quot;noteIndex&quot;:0},&quot;isEdited&quot;:false,&quot;manualOverride&quot;:{&quot;isManuallyOverridden&quot;:false,&quot;citeprocText&quot;:&quot;[1]&quot;,&quot;manualOverrideText&quot;:&quot;&quot;},&quot;citationTag&quot;:&quot;MENDELEY_CITATION_v3_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&quot;,&quot;citationItems&quot;:[{&quot;id&quot;:&quot;9f54496b-fc3d-3546-b057-55b552d0253d&quot;,&quot;itemData&quot;:{&quot;type&quot;:&quot;article-journal&quot;,&quot;id&quot;:&quot;9f54496b-fc3d-3546-b057-55b552d0253d&quot;,&quot;title&quot;:&quot;Hard-to-Abate Sectors: The role of industrial carbon capture and storage (CCS) in emission mitigation&quot;,&quot;author&quot;:[{&quot;family&quot;:&quot;Paltsev&quot;,&quot;given&quot;:&quot;Sergey&quot;,&quot;parse-names&quot;:false,&quot;dropping-particle&quot;:&quot;&quot;,&quot;non-dropping-particle&quot;:&quot;&quot;},{&quot;family&quot;:&quot;Morris&quot;,&quot;given&quot;:&quot;Jennifer&quot;,&quot;parse-names&quot;:false,&quot;dropping-particle&quot;:&quot;&quot;,&quot;non-dropping-particle&quot;:&quot;&quot;},{&quot;family&quot;:&quot;Kheshgi&quot;,&quot;given&quot;:&quot;Haroon&quot;,&quot;parse-names&quot;:false,&quot;dropping-particle&quot;:&quot;&quot;,&quot;non-dropping-particle&quot;:&quot;&quot;},{&quot;family&quot;:&quot;Herzog&quot;,&quot;given&quot;:&quot;Howard&quot;,&quot;parse-names&quot;:false,&quot;dropping-particle&quot;:&quot;&quot;,&quot;non-dropping-particle&quot;:&quot;&quot;}],&quot;container-title&quot;:&quot;Applied Energy&quot;,&quot;DOI&quot;:&quot;10.1016/j.apenergy.2021.117322&quot;,&quot;ISSN&quot;:&quot;03062619&quot;,&quot;issued&quot;:{&quot;date-parts&quot;:[[2021,10]]},&quot;page&quot;:&quot;117322&quot;,&quot;volume&quot;:&quot;300&quot;,&quot;container-title-short&quot;:&quot;Appl. Energy&quot;},&quot;isTemporary&quot;:false}]},{&quot;citationID&quot;:&quot;MENDELEY_CITATION_8d7bd39f-5014-4a97-bce1-d22efa7dbd0b&quot;,&quot;properties&quot;:{&quot;noteIndex&quot;:0},&quot;isEdited&quot;:false,&quot;manualOverride&quot;:{&quot;isManuallyOverridden&quot;:false,&quot;citeprocText&quot;:&quot;[2]&quot;,&quot;manualOverrideText&quot;:&quot;&quot;},&quot;citationTag&quot;:&quot;MENDELEY_CITATION_v3_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&quot;,&quot;citationItems&quot;:[{&quot;id&quot;:&quot;956a38fa-e422-3333-a9ab-81f96dae1644&quot;,&quot;itemData&quot;:{&quot;type&quot;:&quot;article-journal&quot;,&quot;id&quot;:&quot;956a38fa-e422-3333-a9ab-81f96dae1644&quot;,&quot;title&quot;:&quot;Decarbonizing Hard-to-Abate Sectors with Renewable Hydrogen: A Real Case Application to the Ceramics Industry&quot;,&quot;author&quot;:[{&quot;family&quot;:&quot;Sousa&quot;,&quot;given&quot;:&quot;Jorge&quot;,&quot;parse-names&quot;:false,&quot;dropping-particle&quot;:&quot;&quot;,&quot;non-dropping-particle&quot;:&quot;&quot;},{&quot;family&quot;:&quot;Azevedo&quot;,&quot;given&quot;:&quot;Inês&quot;,&quot;parse-names&quot;:false,&quot;dropping-particle&quot;:&quot;&quot;,&quot;non-dropping-particle&quot;:&quot;&quot;},{&quot;family&quot;:&quot;Camus&quot;,&quot;given&quot;:&quot;Cristina&quot;,&quot;parse-names&quot;:false,&quot;dropping-particle&quot;:&quot;&quot;,&quot;non-dropping-particle&quot;:&quot;&quot;},{&quot;family&quot;:&quot;Mendes&quot;,&quot;given&quot;:&quot;Luís&quot;,&quot;parse-names&quot;:false,&quot;dropping-particle&quot;:&quot;&quot;,&quot;non-dropping-particle&quot;:&quot;&quot;},{&quot;family&quot;:&quot;Viveiros&quot;,&quot;given&quot;:&quot;Carla&quot;,&quot;parse-names&quot;:false,&quot;dropping-particle&quot;:&quot;&quot;,&quot;non-dropping-particle&quot;:&quot;&quot;},{&quot;family&quot;:&quot;Barata&quot;,&quot;given&quot;:&quot;Filipe&quot;,&quot;parse-names&quot;:false,&quot;dropping-particle&quot;:&quot;&quot;,&quot;non-dropping-particle&quot;:&quot;&quot;}],&quot;container-title&quot;:&quot;Energies&quot;,&quot;DOI&quot;:&quot;10.3390/en17153661&quot;,&quot;ISSN&quot;:&quot;1996-1073&quot;,&quot;issued&quot;:{&quot;date-parts&quot;:[[2024,7,25]]},&quot;page&quot;:&quot;3661&quot;,&quot;abstract&quot;:&quot;&lt;p&gt;Hydrogen produced from renewable energy sources is a valuable energy carrier for linking growing renewable electricity generation with the hard-to-abate sectors, such as cement, steel, glass, chemical, and ceramics industries. In this context, this paper presents a new model of hydrogen production based on solar photovoltaics and wind energy with application to a real-world ceramics factory. For this task, a novel multipurpose profit-maximizing model is implemented using GAMS. The developed model explores hydrogen production with multiple value streams that enable technical and economical informed decisions under specific scenarios. Our results show that it is profitable to sell the hydrogen produced to the gas grid rather than using it for self-consumption for low-gas-price scenarios. On the other hand, when the price of gas is significantly high, it is more profitable to use as much hydrogen as possible for self-consumption to supply the factory and reduce the internal use of natural gas. The role of electricity self-consumption has proven to be key for the project’s profitability as, without this revenue stream, the project would not be profitable in any analysed scenario.&lt;/p&gt;&quot;,&quot;issue&quot;:&quot;15&quot;,&quot;volume&quot;:&quot;17&quot;,&quot;container-title-short&quot;:&quot;Energies (Basel).&quot;},&quot;isTemporary&quot;:false}]},{&quot;citationID&quot;:&quot;MENDELEY_CITATION_cc9a11a7-48e8-4bcd-9601-05385ccebf02&quot;,&quot;properties&quot;:{&quot;noteIndex&quot;:0},&quot;isEdited&quot;:false,&quot;manualOverride&quot;:{&quot;isManuallyOverridden&quot;:false,&quot;citeprocText&quot;:&quot;[3]&quot;,&quot;manualOverrideText&quot;:&quot;&quot;},&quot;citationTag&quot;:&quot;MENDELEY_CITATION_v3_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&quot;,&quot;citationItems&quot;:[{&quot;id&quot;:&quot;66781a91-8ce9-38c0-8b80-b0de4bdb3cc9&quot;,&quot;itemData&quot;:{&quot;type&quot;:&quot;article-journal&quot;,&quot;id&quot;:&quot;66781a91-8ce9-38c0-8b80-b0de4bdb3cc9&quot;,&quot;title&quot;:&quot;From green hydrogen to electricity: A review on recent advances, challenges, and opportunities on power-to-hydrogen-to-power systems&quot;,&quot;author&quot;:[{&quot;family&quot;:&quot;Risco-Bravo&quot;,&quot;given&quot;:&quot;A.&quot;,&quot;parse-names&quot;:false,&quot;dropping-particle&quot;:&quot;&quot;,&quot;non-dropping-particle&quot;:&quot;&quot;},{&quot;family&quot;:&quot;Varela&quot;,&quot;given&quot;:&quot;C.&quot;,&quot;parse-names&quot;:false,&quot;dropping-particle&quot;:&quot;&quot;,&quot;non-dropping-particle&quot;:&quot;&quot;},{&quot;family&quot;:&quot;Bartels&quot;,&quot;given&quot;:&quot;J.&quot;,&quot;parse-names&quot;:false,&quot;dropping-particle&quot;:&quot;&quot;,&quot;non-dropping-particle&quot;:&quot;&quot;},{&quot;family&quot;:&quot;Zondervan&quot;,&quot;given&quot;:&quot;E.&quot;,&quot;parse-names&quot;:false,&quot;dropping-particle&quot;:&quot;&quot;,&quot;non-dropping-particle&quot;:&quot;&quot;}],&quot;container-title&quot;:&quot;Renewable and Sustainable Energy Reviews&quot;,&quot;DOI&quot;:&quot;10.1016/j.rser.2023.113930&quot;,&quot;ISSN&quot;:&quot;13640321&quot;,&quot;issued&quot;:{&quot;date-parts&quot;:[[2024,1]]},&quot;page&quot;:&quot;113930&quot;,&quot;volume&quot;:&quot;189&quot;,&quot;container-title-short&quot;:&quot;&quot;},&quot;isTemporary&quot;:false}]},{&quot;citationID&quot;:&quot;MENDELEY_CITATION_10ebcc1d-9e7d-475c-9706-140f1e237e74&quot;,&quot;properties&quot;:{&quot;noteIndex&quot;:0},&quot;isEdited&quot;:false,&quot;manualOverride&quot;:{&quot;isManuallyOverridden&quot;:false,&quot;citeprocText&quot;:&quot;[4]&quot;,&quot;manualOverrideText&quot;:&quot;&quot;},&quot;citationTag&quot;:&quot;MENDELEY_CITATION_v3_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&quot;,&quot;citationItems&quot;:[{&quot;id&quot;:&quot;d00ceab6-c269-3d86-a58b-dd8be99f154b&quot;,&quot;itemData&quot;:{&quot;type&quot;:&quot;article-journal&quot;,&quot;id&quot;:&quot;d00ceab6-c269-3d86-a58b-dd8be99f154b&quot;,&quot;title&quot;:&quot;A comprehensive review of optimizing hybrid renewable energy system using optimization techniques&quot;,&quot;author&quot;:[{&quot;family&quot;:&quot;Yao&quot;,&quot;given&quot;:&quot;Ye&quot;,&quot;parse-names&quot;:false,&quot;dropping-particle&quot;:&quot;&quot;,&quot;non-dropping-particle&quot;:&quot;&quot;},{&quot;family&quot;:&quot;Wang&quot;,&quot;given&quot;:&quot;Zhen&quot;,&quot;parse-names&quot;:false,&quot;dropping-particle&quot;:&quot;&quot;,&quot;non-dropping-particle&quot;:&quot;&quot;},{&quot;family&quot;:&quot;Ma&quot;,&quot;given&quot;:&quot;Chao&quot;,&quot;parse-names&quot;:false,&quot;dropping-particle&quot;:&quot;&quot;,&quot;non-dropping-particle&quot;:&quot;&quot;},{&quot;family&quot;:&quot;Liu&quot;,&quot;given&quot;:&quot;Mengmeng&quot;,&quot;parse-names&quot;:false,&quot;dropping-particle&quot;:&quot;&quot;,&quot;non-dropping-particle&quot;:&quot;&quot;},{&quot;family&quot;:&quot;Qi&quot;,&quot;given&quot;:&quot;Wenchao&quot;,&quot;parse-names&quot;:false,&quot;dropping-particle&quot;:&quot;&quot;,&quot;non-dropping-particle&quot;:&quot;&quot;},{&quot;family&quot;:&quot;Yang&quot;,&quot;given&quot;:&quot;Xiuwei&quot;,&quot;parse-names&quot;:false,&quot;dropping-particle&quot;:&quot;&quot;,&quot;non-dropping-particle&quot;:&quot;&quot;},{&quot;family&quot;:&quot;Gao&quot;,&quot;given&quot;:&quot;Xifeng&quot;,&quot;parse-names&quot;:false,&quot;dropping-particle&quot;:&quot;&quot;,&quot;non-dropping-particle&quot;:&quot;&quot;},{&quot;family&quot;:&quot;Liu&quot;,&quot;given&quot;:&quot;Yingzhou&quot;,&quot;parse-names&quot;:false,&quot;dropping-particle&quot;:&quot;&quot;,&quot;non-dropping-particle&quot;:&quot;&quot;},{&quot;family&quot;:&quot;Lian&quot;,&quot;given&quot;:&quot;Jijian&quot;,&quot;parse-names&quot;:false,&quot;dropping-particle&quot;:&quot;&quot;,&quot;non-dropping-particle&quot;:&quot;&quot;},{&quot;family&quot;:&quot;Wang&quot;,&quot;given&quot;:&quot;Haolin&quot;,&quot;parse-names&quot;:false,&quot;dropping-particle&quot;:&quot;&quot;,&quot;non-dropping-particle&quot;:&quot;&quot;}],&quot;container-title&quot;:&quot;Engineering Science and Technology, an International Journal&quot;,&quot;DOI&quot;:&quot;10.1016/j.jestch.2026.102384&quot;,&quot;ISSN&quot;:&quot;22150986&quot;,&quot;issued&quot;:{&quot;date-parts&quot;:[[2026,6]]},&quot;page&quot;:&quot;102384&quot;,&quot;volume&quot;:&quot;78&quot;,&quot;container-title-short&quot;:&quot;&quot;},&quot;isTemporary&quot;:false}]},{&quot;citationID&quot;:&quot;MENDELEY_CITATION_883842a3-a21f-4bfa-9084-5059522ad981&quot;,&quot;properties&quot;:{&quot;noteIndex&quot;:0},&quot;isEdited&quot;:false,&quot;manualOverride&quot;:{&quot;isManuallyOverridden&quot;:false,&quot;citeprocText&quot;:&quot;[5]&quot;,&quot;manualOverrideText&quot;:&quot;&quot;},&quot;citationTag&quot;:&quot;MENDELEY_CITATION_v3_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&quot;,&quot;citationItems&quot;:[{&quot;id&quot;:&quot;37e1e1c6-a2f3-3486-92e6-469dc2e4adc9&quot;,&quot;itemData&quot;:{&quot;type&quot;:&quot;article-journal&quot;,&quot;id&quot;:&quot;37e1e1c6-a2f3-3486-92e6-469dc2e4adc9&quot;,&quot;title&quot;:&quot;Energy Demand Response in a Food-Processing Plant: A Deep Reinforcement Learning Approach&quot;,&quot;author&quot;:[{&quot;family&quot;:&quot;Wohlgenannt&quot;,&quot;given&quot;:&quot;Philipp&quot;,&quot;parse-names&quot;:false,&quot;dropping-particle&quot;:&quot;&quot;,&quot;non-dropping-particle&quot;:&quot;&quot;},{&quot;family&quot;:&quot;Hegenbart&quot;,&quot;given&quot;:&quot;Sebastian&quot;,&quot;parse-names&quot;:false,&quot;dropping-particle&quot;:&quot;&quot;,&quot;non-dropping-particle&quot;:&quot;&quot;},{&quot;family&quot;:&quot;Eder&quot;,&quot;given&quot;:&quot;Elias&quot;,&quot;parse-names&quot;:false,&quot;dropping-particle&quot;:&quot;&quot;,&quot;non-dropping-particle&quot;:&quot;&quot;},{&quot;family&quot;:&quot;Kolhe&quot;,&quot;given&quot;:&quot;Mohan&quot;,&quot;parse-names&quot;:false,&quot;dropping-particle&quot;:&quot;&quot;,&quot;non-dropping-particle&quot;:&quot;&quot;},{&quot;family&quot;:&quot;Kepplinger&quot;,&quot;given&quot;:&quot;Peter&quot;,&quot;parse-names&quot;:false,&quot;dropping-particle&quot;:&quot;&quot;,&quot;non-dropping-particle&quot;:&quot;&quot;}],&quot;container-title&quot;:&quot;Energies&quot;,&quot;container-title-short&quot;:&quot;Energies (Basel).&quot;,&quot;DOI&quot;:&quot;10.3390/en17246430&quot;,&quot;ISSN&quot;:&quot;1996-1073&quot;,&quot;issued&quot;:{&quot;date-parts&quot;:[[2024,12,20]]},&quot;page&quot;:&quot;6430&quot;,&quot;abstract&quot;:&quot;&lt;p&gt;The food industry faces significant challenges in managing operational costs due to its high energy intensity and rising energy prices. Industrial food-processing facilities, with substantial thermal capacities and large demands for cooling and heating, offer promising opportunities for demand response (DR) strategies. This study explores the application of deep reinforcement learning (RL) as an innovative, data-driven approach for DR in the food industry. By leveraging the adaptive, self-learning capabilities of RL, energy costs in the investigated plant are effectively decreased. The RL algorithm was compared with the well-established optimization method Mixed Integer Linear Programming (MILP), and both were benchmarked against a reference scenario without DR. The two optimization strategies demonstrate cost savings of 17.57% and 18.65% for RL and MILP, respectively. Although RL is slightly less efficient in cost reduction, it significantly outperforms in computational speed, being approximately 20 times faster. During operation, RL only needs 2ms per optimization compared to 19s for MILP, making it a promising optimization tool for edge computing. Moreover, while MILP’s computation time increases considerably with the number of binary variables, RL efficiently learns dynamic system behavior and scales to more complex systems without significant performance degradation. These results highlight that deep RL, when applied to DR, offers substantial cost savings and computational efficiency, with broad applicability to energy management in various applications.&lt;/p&gt;&quot;,&quot;issue&quot;:&quot;24&quot;,&quot;volume&quot;:&quot;17&quot;},&quot;isTemporary&quot;:false}]},{&quot;citationID&quot;:&quot;MENDELEY_CITATION_d7370189-8bad-428a-bf96-f6e0b77e7bf5&quot;,&quot;properties&quot;:{&quot;noteIndex&quot;:0},&quot;isEdited&quot;:false,&quot;manualOverride&quot;:{&quot;isManuallyOverridden&quot;:false,&quot;citeprocText&quot;:&quot;[6]&quot;,&quot;manualOverrideText&quot;:&quot;&quot;},&quot;citationTag&quot;:&quot;MENDELEY_CITATION_v3_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&quot;,&quot;citationItems&quot;:[{&quot;id&quot;:&quot;f01623cd-5b09-3de7-90db-88f6efe9d97e&quot;,&quot;itemData&quot;:{&quot;type&quot;:&quot;article-journal&quot;,&quot;id&quot;:&quot;f01623cd-5b09-3de7-90db-88f6efe9d97e&quot;,&quot;title&quot;:&quot;Optimization of energy supply systems by MILP branch and bound method in consideration of hierarchical relationship between design and operation&quot;,&quot;author&quot;:[{&quot;family&quot;:&quot;Yokoyama&quot;,&quot;given&quot;:&quot;Ryohei&quot;,&quot;parse-names&quot;:false,&quot;dropping-particle&quot;:&quot;&quot;,&quot;non-dropping-particle&quot;:&quot;&quot;},{&quot;family&quot;:&quot;Shinano&quot;,&quot;given&quot;:&quot;Yuji&quot;,&quot;parse-names&quot;:false,&quot;dropping-particle&quot;:&quot;&quot;,&quot;non-dropping-particle&quot;:&quot;&quot;},{&quot;family&quot;:&quot;Taniguchi&quot;,&quot;given&quot;:&quot;Syusuke&quot;,&quot;parse-names&quot;:false,&quot;dropping-particle&quot;:&quot;&quot;,&quot;non-dropping-particle&quot;:&quot;&quot;},{&quot;family&quot;:&quot;Ohkura&quot;,&quot;given&quot;:&quot;Masashi&quot;,&quot;parse-names&quot;:false,&quot;dropping-particle&quot;:&quot;&quot;,&quot;non-dropping-particle&quot;:&quot;&quot;},{&quot;family&quot;:&quot;Wakui&quot;,&quot;given&quot;:&quot;Tetsuya&quot;,&quot;parse-names&quot;:false,&quot;dropping-particle&quot;:&quot;&quot;,&quot;non-dropping-particle&quot;:&quot;&quot;}],&quot;container-title&quot;:&quot;Energy Conversion and Management&quot;,&quot;DOI&quot;:&quot;10.1016/j.enconman.2014.12.020&quot;,&quot;ISSN&quot;:&quot;01968904&quot;,&quot;issued&quot;:{&quot;date-parts&quot;:[[2015,3]]},&quot;page&quot;:&quot;92-104&quot;,&quot;volume&quot;:&quot;92&quot;,&quot;container-title-short&quot;:&quot;Energy Convers. Manag.&quot;},&quot;isTemporary&quot;:false}]},{&quot;citationID&quot;:&quot;MENDELEY_CITATION_25f810e2-1387-4860-bc8b-20e968f8adf0&quot;,&quot;properties&quot;:{&quot;noteIndex&quot;:0},&quot;isEdited&quot;:false,&quot;manualOverride&quot;:{&quot;isManuallyOverridden&quot;:false,&quot;citeprocText&quot;:&quot;[7]&quot;,&quot;manualOverrideText&quot;:&quot;&quot;},&quot;citationTag&quot;:&quot;MENDELEY_CITATION_v3_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&quot;,&quot;citationItems&quot;:[{&quot;id&quot;:&quot;85308694-191e-34ed-aa20-9e1aa6f08e43&quot;,&quot;itemData&quot;:{&quot;type&quot;:&quot;article-journal&quot;,&quot;id&quot;:&quot;85308694-191e-34ed-aa20-9e1aa6f08e43&quot;,&quot;title&quot;:&quot;Reinforcement Learning Techniques in Optimizing Energy Systems&quot;,&quot;author&quot;:[{&quot;family&quot;:&quot;Stavrev&quot;,&quot;given&quot;:&quot;Stefan&quot;,&quot;parse-names&quot;:false,&quot;dropping-particle&quot;:&quot;&quot;,&quot;non-dropping-particle&quot;:&quot;&quot;},{&quot;family&quot;:&quot;Ginchev&quot;,&quot;given&quot;:&quot;Dimitar&quot;,&quot;parse-names&quot;:false,&quot;dropping-particle&quot;:&quot;&quot;,&quot;non-dropping-particle&quot;:&quot;&quot;}],&quot;container-title&quot;:&quot;Electronics&quot;,&quot;DOI&quot;:&quot;10.3390/electronics13081459&quot;,&quot;ISSN&quot;:&quot;2079-9292&quot;,&quot;issued&quot;:{&quot;date-parts&quot;:[[2024,4,12]]},&quot;page&quot;:&quot;1459&quot;,&quot;abstract&quot;:&quot;&lt;p&gt;Reinforcement learning (RL) techniques have emerged as powerful tools for optimizing energy systems, offering the potential to enhance efficiency, reliability, and sustainability. This review paper provides a comprehensive examination of the applications of RL in the field of energy system optimization, spanning various domains such as energy management, grid control, and renewable energy integration. Beginning with an overview of RL fundamentals, the paper explores recent advancements in RL algorithms and their adaptation to address the unique challenges of energy system optimization. Case studies and real-world applications demonstrate the efficacy of RL-based approaches in improving energy efficiency, reducing costs, and mitigating environmental impacts. Furthermore, the paper discusses future directions and challenges, including scalability, interpretability, and integration with domain knowledge. By synthesizing the latest research findings and identifying key areas for further investigation, this paper aims to inform and inspire future research endeavors in the intersection of reinforcement learning and energy system optimization.&lt;/p&gt;&quot;,&quot;issue&quot;:&quot;8&quot;,&quot;volume&quot;:&quot;13&quot;,&quot;container-title-short&quot;:&quot;Electronics (Basel).&quot;},&quot;isTemporary&quot;:false}]},{&quot;citationID&quot;:&quot;MENDELEY_CITATION_51c152f6-c4bd-46c0-a730-f4779c171221&quot;,&quot;properties&quot;:{&quot;noteIndex&quot;:0},&quot;isEdited&quot;:false,&quot;manualOverride&quot;:{&quot;isManuallyOverridden&quot;:false,&quot;citeprocText&quot;:&quot;[8]&quot;,&quot;manualOverrideText&quot;:&quot;&quot;},&quot;citationTag&quot;:&quot;MENDELEY_CITATION_v3_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&quot;,&quot;citationItems&quot;:[{&quot;id&quot;:&quot;19ead3b7-e80b-3f24-a3e3-22a038f3385c&quot;,&quot;itemData&quot;:{&quot;type&quot;:&quot;article-journal&quot;,&quot;id&quot;:&quot;19ead3b7-e80b-3f24-a3e3-22a038f3385c&quot;,&quot;title&quot;:&quot;LCA and exergy-economic evaluation of a biogas-to-fuels system using CO2 hydrogenation and exhaust gas recycling&quot;,&quot;author&quot;:[{&quot;family&quot;:&quot;Ghiasirad&quot;,&quot;given&quot;:&quot;Hamed&quot;,&quot;parse-names&quot;:false,&quot;dropping-particle&quot;:&quot;&quot;,&quot;non-dropping-particle&quot;:&quot;&quot;},{&quot;family&quot;:&quot;Ebrahimian&quot;,&quot;given&quot;:&quot;Farinaz&quot;,&quot;parse-names&quot;:false,&quot;dropping-particle&quot;:&quot;&quot;,&quot;non-dropping-particle&quot;:&quot;&quot;},{&quot;family&quot;:&quot;Gholizadeh&quot;,&quot;given&quot;:&quot;Towhid&quot;,&quot;parse-names&quot;:false,&quot;dropping-particle&quot;:&quot;&quot;,&quot;non-dropping-particle&quot;:&quot;&quot;},{&quot;family&quot;:&quot;Mohammadi&quot;,&quot;given&quot;:&quot;Ali&quot;,&quot;parse-names&quot;:false,&quot;dropping-particle&quot;:&quot;&quot;,&quot;non-dropping-particle&quot;:&quot;&quot;},{&quot;family&quot;:&quot;Mirmasoumi&quot;,&quot;given&quot;:&quot;Siamak&quot;,&quot;parse-names&quot;:false,&quot;dropping-particle&quot;:&quot;&quot;,&quot;non-dropping-particle&quot;:&quot;&quot;},{&quot;family&quot;:&quot;Saray&quot;,&quot;given&quot;:&quot;Rahim Khoshbakhti&quot;,&quot;parse-names&quot;:false,&quot;dropping-particle&quot;:&quot;&quot;,&quot;non-dropping-particle&quot;:&quot;&quot;},{&quot;family&quot;:&quot;Skorek-Osikowska&quot;,&quot;given&quot;:&quot;Anna&quot;,&quot;parse-names&quot;:false,&quot;dropping-particle&quot;:&quot;&quot;,&quot;non-dropping-particle&quot;:&quot;&quot;}],&quot;container-title&quot;:&quot;Energy Conversion and Management: X&quot;,&quot;DOI&quot;:&quot;10.1016/j.ecmx.2025.100897&quot;,&quot;ISSN&quot;:&quot;25901745&quot;,&quot;issued&quot;:{&quot;date-parts&quot;:[[2025,4]]},&quot;page&quot;:&quot;100897&quot;,&quot;volume&quot;:&quot;26&quot;,&quot;container-title-short&quot;:&quot;&quot;},&quot;isTemporary&quot;:false}]},{&quot;citationID&quot;:&quot;MENDELEY_CITATION_105cda64-5b6c-464e-beda-2ca75d02300e&quot;,&quot;properties&quot;:{&quot;noteIndex&quot;:0},&quot;isEdited&quot;:false,&quot;manualOverride&quot;:{&quot;isManuallyOverridden&quot;:false,&quot;citeprocText&quot;:&quot;[9]&quot;,&quot;manualOverrideText&quot;:&quot;&quot;},&quot;citationTag&quot;:&quot;MENDELEY_CITATION_v3_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&quot;,&quot;citationItems&quot;:[{&quot;id&quot;:&quot;56e0ce24-6bd0-3ca6-ad59-9e041fc06482&quot;,&quot;itemData&quot;:{&quot;type&quot;:&quot;article-journal&quot;,&quot;id&quot;:&quot;56e0ce24-6bd0-3ca6-ad59-9e041fc06482&quot;,&quot;title&quot;:&quot;Syngas biomethanation: state‐of‐the‐art review and perspectives&quot;,&quot;author&quot;:[{&quot;family&quot;:&quot;Grimalt‐Alemany&quot;,&quot;given&quot;:&quot;Antonio&quot;,&quot;parse-names&quot;:false,&quot;dropping-particle&quot;:&quot;&quot;,&quot;non-dropping-particle&quot;:&quot;&quot;},{&quot;family&quot;:&quot;Skiadas&quot;,&quot;given&quot;:&quot;Ioannis&quot;,&quot;parse-names&quot;:false,&quot;dropping-particle&quot;:&quot;V.&quot;,&quot;non-dropping-particle&quot;:&quot;&quot;},{&quot;family&quot;:&quot;Gavala&quot;,&quot;given&quot;:&quot;Hariklia N.&quot;,&quot;parse-names&quot;:false,&quot;dropping-particle&quot;:&quot;&quot;,&quot;non-dropping-particle&quot;:&quot;&quot;}],&quot;container-title&quot;:&quot;Biofuels, Bioproducts and Biorefining&quot;,&quot;DOI&quot;:&quot;10.1002/bbb.1826&quot;,&quot;ISSN&quot;:&quot;1932-104X&quot;,&quot;issued&quot;:{&quot;date-parts&quot;:[[2018,1,10]]},&quot;page&quot;:&quot;139-158&quot;,&quot;abstract&quot;:&quot;&lt;p&gt;Significant research efforts are currently being made worldwide to develop more efficient biomethane production processes from a variety of waste streams. The biomethanation of biomass‐derived syngas can contribute to increasing the potential of methane production as it opens the way for the conversion of recalcitrant biomasses, generally not fully exploitable by anaerobic digestion systems. Additionally, this biological process presents several advantages over its analogous process of catalytic methanation such as the use of inexpensive biocatalysts, milder operational conditions, higher tolerance to the impurities of syngas, and higher product selectivity. However, there are still several challenges to be addressed for this technology to reach commercial stage. This work reviews the progress made over the last few years in syngas biomethanation processes in order to provide an overview of the current state of the art of this technology. The most relevant aspects determining the performance of syngas biomethanation processes are extensively discussed here, including microbial diversity and metabolic interactions in mixed microbial consortia, the influence of operating parameters and bioreactor designs, and the potential of modelling as a tool for the design and control of this bioprocess. © 2017 Society of Chemical Industry and John Wiley &amp;amp; Sons, Ltd&lt;/p&gt;&quot;,&quot;issue&quot;:&quot;1&quot;,&quot;volume&quot;:&quot;12&quot;,&quot;container-title-short&quot;:&quot;&quot;},&quot;isTemporary&quot;:false}]},{&quot;citationID&quot;:&quot;MENDELEY_CITATION_790cd8fb-1a04-4124-9aa6-1645a459196b&quot;,&quot;properties&quot;:{&quot;noteIndex&quot;:0},&quot;isEdited&quot;:false,&quot;manualOverride&quot;:{&quot;isManuallyOverridden&quot;:false,&quot;citeprocText&quot;:&quot;[9], [10]&quot;,&quot;manualOverrideText&quot;:&quot;&quot;},&quot;citationTag&quot;:&quot;MENDELEY_CITATION_v3_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&quot;,&quot;citationItems&quot;:[{&quot;id&quot;:&quot;aa2feb8d-c9bd-3781-bba9-d18156ecd3e8&quot;,&quot;itemData&quot;:{&quot;type&quot;:&quot;article-journal&quot;,&quot;id&quot;:&quot;aa2feb8d-c9bd-3781-bba9-d18156ecd3e8&quot;,&quot;title&quot;:&quot;Alternative sustainable routes to methanol production: Techno-economic and environmental assessment&quot;,&quot;author&quot;:[{&quot;family&quot;:&quot;Scomazzon&quot;,&quot;given&quot;:&quot;Marco&quot;,&quot;parse-names&quot;:false,&quot;dropping-particle&quot;:&quot;&quot;,&quot;non-dropping-particle&quot;:&quot;&quot;},{&quot;family&quot;:&quot;Barbera&quot;,&quot;given&quot;:&quot;Elena&quot;,&quot;parse-names&quot;:false,&quot;dropping-particle&quot;:&quot;&quot;,&quot;non-dropping-particle&quot;:&quot;&quot;},{&quot;family&quot;:&quot;Bezzo&quot;,&quot;given&quot;:&quot;Fabrizio&quot;,&quot;parse-names&quot;:false,&quot;dropping-particle&quot;:&quot;&quot;,&quot;non-dropping-particle&quot;:&quot;&quot;}],&quot;container-title&quot;:&quot;Journal of Environmental Chemical Engineering&quot;,&quot;DOI&quot;:&quot;10.1016/j.jece.2024.112674&quot;,&quot;ISSN&quot;:&quot;22133437&quot;,&quot;issued&quot;:{&quot;date-parts&quot;:[[2024,6]]},&quot;page&quot;:&quot;112674&quot;,&quot;issue&quot;:&quot;3&quot;,&quot;volume&quot;:&quot;12&quot;,&quot;container-title-short&quot;:&quot;J. Environ. Chem. Eng.&quot;},&quot;isTemporary&quot;:false},{&quot;id&quot;:&quot;56e0ce24-6bd0-3ca6-ad59-9e041fc06482&quot;,&quot;itemData&quot;:{&quot;type&quot;:&quot;article-journal&quot;,&quot;id&quot;:&quot;56e0ce24-6bd0-3ca6-ad59-9e041fc06482&quot;,&quot;title&quot;:&quot;Syngas biomethanation: state‐of‐the‐art review and perspectives&quot;,&quot;author&quot;:[{&quot;family&quot;:&quot;Grimalt‐Alemany&quot;,&quot;given&quot;:&quot;Antonio&quot;,&quot;parse-names&quot;:false,&quot;dropping-particle&quot;:&quot;&quot;,&quot;non-dropping-particle&quot;:&quot;&quot;},{&quot;family&quot;:&quot;Skiadas&quot;,&quot;given&quot;:&quot;Ioannis&quot;,&quot;parse-names&quot;:false,&quot;dropping-particle&quot;:&quot;V.&quot;,&quot;non-dropping-particle&quot;:&quot;&quot;},{&quot;family&quot;:&quot;Gavala&quot;,&quot;given&quot;:&quot;Hariklia N.&quot;,&quot;parse-names&quot;:false,&quot;dropping-particle&quot;:&quot;&quot;,&quot;non-dropping-particle&quot;:&quot;&quot;}],&quot;container-title&quot;:&quot;Biofuels, Bioproducts and Biorefining&quot;,&quot;DOI&quot;:&quot;10.1002/bbb.1826&quot;,&quot;ISSN&quot;:&quot;1932-104X&quot;,&quot;issued&quot;:{&quot;date-parts&quot;:[[2018,1,10]]},&quot;page&quot;:&quot;139-158&quot;,&quot;abstract&quot;:&quot;&lt;p&gt;Significant research efforts are currently being made worldwide to develop more efficient biomethane production processes from a variety of waste streams. The biomethanation of biomass‐derived syngas can contribute to increasing the potential of methane production as it opens the way for the conversion of recalcitrant biomasses, generally not fully exploitable by anaerobic digestion systems. Additionally, this biological process presents several advantages over its analogous process of catalytic methanation such as the use of inexpensive biocatalysts, milder operational conditions, higher tolerance to the impurities of syngas, and higher product selectivity. However, there are still several challenges to be addressed for this technology to reach commercial stage. This work reviews the progress made over the last few years in syngas biomethanation processes in order to provide an overview of the current state of the art of this technology. The most relevant aspects determining the performance of syngas biomethanation processes are extensively discussed here, including microbial diversity and metabolic interactions in mixed microbial consortia, the influence of operating parameters and bioreactor designs, and the potential of modelling as a tool for the design and control of this bioprocess. © 2017 Society of Chemical Industry and John Wiley &amp;amp; Sons, Ltd&lt;/p&gt;&quot;,&quot;issue&quot;:&quot;1&quot;,&quot;volume&quot;:&quot;12&quot;,&quot;container-title-short&quot;:&quot;&quot;},&quot;isTemporary&quot;:false}]},{&quot;citationID&quot;:&quot;MENDELEY_CITATION_b4c44ef8-e2c2-413d-b321-be21b9ddc9bc&quot;,&quot;properties&quot;:{&quot;noteIndex&quot;:0},&quot;isEdited&quot;:false,&quot;manualOverride&quot;:{&quot;isManuallyOverridden&quot;:false,&quot;citeprocText&quot;:&quot;[9]&quot;,&quot;manualOverrideText&quot;:&quot;&quot;},&quot;citationTag&quot;:&quot;MENDELEY_CITATION_v3_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&quot;,&quot;citationItems&quot;:[{&quot;id&quot;:&quot;56e0ce24-6bd0-3ca6-ad59-9e041fc06482&quot;,&quot;itemData&quot;:{&quot;type&quot;:&quot;article-journal&quot;,&quot;id&quot;:&quot;56e0ce24-6bd0-3ca6-ad59-9e041fc06482&quot;,&quot;title&quot;:&quot;Syngas biomethanation: state‐of‐the‐art review and perspectives&quot;,&quot;author&quot;:[{&quot;family&quot;:&quot;Grimalt‐Alemany&quot;,&quot;given&quot;:&quot;Antonio&quot;,&quot;parse-names&quot;:false,&quot;dropping-particle&quot;:&quot;&quot;,&quot;non-dropping-particle&quot;:&quot;&quot;},{&quot;family&quot;:&quot;Skiadas&quot;,&quot;given&quot;:&quot;Ioannis&quot;,&quot;parse-names&quot;:false,&quot;dropping-particle&quot;:&quot;V.&quot;,&quot;non-dropping-particle&quot;:&quot;&quot;},{&quot;family&quot;:&quot;Gavala&quot;,&quot;given&quot;:&quot;Hariklia N.&quot;,&quot;parse-names&quot;:false,&quot;dropping-particle&quot;:&quot;&quot;,&quot;non-dropping-particle&quot;:&quot;&quot;}],&quot;container-title&quot;:&quot;Biofuels, Bioproducts and Biorefining&quot;,&quot;DOI&quot;:&quot;10.1002/bbb.1826&quot;,&quot;ISSN&quot;:&quot;1932-104X&quot;,&quot;issued&quot;:{&quot;date-parts&quot;:[[2018,1,10]]},&quot;page&quot;:&quot;139-158&quot;,&quot;abstract&quot;:&quot;&lt;p&gt;Significant research efforts are currently being made worldwide to develop more efficient biomethane production processes from a variety of waste streams. The biomethanation of biomass‐derived syngas can contribute to increasing the potential of methane production as it opens the way for the conversion of recalcitrant biomasses, generally not fully exploitable by anaerobic digestion systems. Additionally, this biological process presents several advantages over its analogous process of catalytic methanation such as the use of inexpensive biocatalysts, milder operational conditions, higher tolerance to the impurities of syngas, and higher product selectivity. However, there are still several challenges to be addressed for this technology to reach commercial stage. This work reviews the progress made over the last few years in syngas biomethanation processes in order to provide an overview of the current state of the art of this technology. The most relevant aspects determining the performance of syngas biomethanation processes are extensively discussed here, including microbial diversity and metabolic interactions in mixed microbial consortia, the influence of operating parameters and bioreactor designs, and the potential of modelling as a tool for the design and control of this bioprocess. © 2017 Society of Chemical Industry and John Wiley &amp;amp; Sons, Ltd&lt;/p&gt;&quot;,&quot;issue&quot;:&quot;1&quot;,&quot;volume&quot;:&quot;12&quot;,&quot;container-title-short&quot;:&quot;&quot;},&quot;isTemporary&quot;:false}]},{&quot;citationID&quot;:&quot;MENDELEY_CITATION_ff939063-8c0e-47e0-8f2f-be64fc1a6c11&quot;,&quot;properties&quot;:{&quot;noteIndex&quot;:0},&quot;isEdited&quot;:false,&quot;manualOverride&quot;:{&quot;isManuallyOverridden&quot;:false,&quot;citeprocText&quot;:&quot;[9], [11]&quot;,&quot;manualOverrideText&quot;:&quot;&quot;},&quot;citationTag&quot;:&quot;MENDELEY_CITATION_v3_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&quot;,&quot;citationItems&quot;:[{&quot;id&quot;:&quot;05ccdcdc-ca9b-3b81-a51a-6f8632295c3c&quot;,&quot;itemData&quot;:{&quot;type&quot;:&quot;article-journal&quot;,&quot;id&quot;:&quot;05ccdcdc-ca9b-3b81-a51a-6f8632295c3c&quot;,&quot;title&quot;:&quot;Techno-economic-environmental assessment of the integration of power-to-X and biogas utilization towards the production of electricity, hydrogen, methane and methanol&quot;,&quot;author&quot;:[{&quot;family&quot;:&quot;Moioli&quot;,&quot;given&quot;:&quot;Emanuele&quot;,&quot;parse-names&quot;:false,&quot;dropping-particle&quot;:&quot;&quot;,&quot;non-dropping-particle&quot;:&quot;&quot;},{&quot;family&quot;:&quot;Schildhauer&quot;,&quot;given&quot;:&quot;Tilman&quot;,&quot;parse-names&quot;:false,&quot;dropping-particle&quot;:&quot;&quot;,&quot;non-dropping-particle&quot;:&quot;&quot;}],&quot;container-title&quot;:&quot;Sustainable Energy &amp; Fuels&quot;,&quot;DOI&quot;:&quot;10.1039/D3SE00052D&quot;,&quot;ISSN&quot;:&quot;2398-4902&quot;,&quot;issued&quot;:{&quot;date-parts&quot;:[[2023]]},&quot;page&quot;:&quot;2690-2706&quot;,&quot;abstract&quot;:&quot;&lt;p&gt;Various routes for the valorisation of biogas towards methane and methanol and for electricity or hydrogen storage is assessed.&lt;/p&gt;&quot;,&quot;issue&quot;:&quot;11&quot;,&quot;volume&quot;:&quot;7&quot;,&quot;container-title-short&quot;:&quot;Sustain. Energy Fuels&quot;},&quot;isTemporary&quot;:false},{&quot;id&quot;:&quot;56e0ce24-6bd0-3ca6-ad59-9e041fc06482&quot;,&quot;itemData&quot;:{&quot;type&quot;:&quot;article-journal&quot;,&quot;id&quot;:&quot;56e0ce24-6bd0-3ca6-ad59-9e041fc06482&quot;,&quot;title&quot;:&quot;Syngas biomethanation: state‐of‐the‐art review and perspectives&quot;,&quot;author&quot;:[{&quot;family&quot;:&quot;Grimalt‐Alemany&quot;,&quot;given&quot;:&quot;Antonio&quot;,&quot;parse-names&quot;:false,&quot;dropping-particle&quot;:&quot;&quot;,&quot;non-dropping-particle&quot;:&quot;&quot;},{&quot;family&quot;:&quot;Skiadas&quot;,&quot;given&quot;:&quot;Ioannis&quot;,&quot;parse-names&quot;:false,&quot;dropping-particle&quot;:&quot;V.&quot;,&quot;non-dropping-particle&quot;:&quot;&quot;},{&quot;family&quot;:&quot;Gavala&quot;,&quot;given&quot;:&quot;Hariklia N.&quot;,&quot;parse-names&quot;:false,&quot;dropping-particle&quot;:&quot;&quot;,&quot;non-dropping-particle&quot;:&quot;&quot;}],&quot;container-title&quot;:&quot;Biofuels, Bioproducts and Biorefining&quot;,&quot;DOI&quot;:&quot;10.1002/bbb.1826&quot;,&quot;ISSN&quot;:&quot;1932-104X&quot;,&quot;issued&quot;:{&quot;date-parts&quot;:[[2018,1,10]]},&quot;page&quot;:&quot;139-158&quot;,&quot;abstract&quot;:&quot;&lt;p&gt;Significant research efforts are currently being made worldwide to develop more efficient biomethane production processes from a variety of waste streams. The biomethanation of biomass‐derived syngas can contribute to increasing the potential of methane production as it opens the way for the conversion of recalcitrant biomasses, generally not fully exploitable by anaerobic digestion systems. Additionally, this biological process presents several advantages over its analogous process of catalytic methanation such as the use of inexpensive biocatalysts, milder operational conditions, higher tolerance to the impurities of syngas, and higher product selectivity. However, there are still several challenges to be addressed for this technology to reach commercial stage. This work reviews the progress made over the last few years in syngas biomethanation processes in order to provide an overview of the current state of the art of this technology. The most relevant aspects determining the performance of syngas biomethanation processes are extensively discussed here, including microbial diversity and metabolic interactions in mixed microbial consortia, the influence of operating parameters and bioreactor designs, and the potential of modelling as a tool for the design and control of this bioprocess. © 2017 Society of Chemical Industry and John Wiley &amp;amp; Sons, Ltd&lt;/p&gt;&quot;,&quot;issue&quot;:&quot;1&quot;,&quot;volume&quot;:&quot;12&quot;,&quot;container-title-short&quot;:&quot;&quot;},&quot;isTemporary&quot;:false}]},{&quot;citationID&quot;:&quot;MENDELEY_CITATION_df48a702-88dc-4563-926b-cf46720d5673&quot;,&quot;properties&quot;:{&quot;noteIndex&quot;:0},&quot;isEdited&quot;:false,&quot;manualOverride&quot;:{&quot;isManuallyOverridden&quot;:false,&quot;citeprocText&quot;:&quot;[10]&quot;,&quot;manualOverrideText&quot;:&quot;&quot;},&quot;citationTag&quot;:&quot;MENDELEY_CITATION_v3_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&quot;,&quot;citationItems&quot;:[{&quot;id&quot;:&quot;aa2feb8d-c9bd-3781-bba9-d18156ecd3e8&quot;,&quot;itemData&quot;:{&quot;type&quot;:&quot;article-journal&quot;,&quot;id&quot;:&quot;aa2feb8d-c9bd-3781-bba9-d18156ecd3e8&quot;,&quot;title&quot;:&quot;Alternative sustainable routes to methanol production: Techno-economic and environmental assessment&quot;,&quot;author&quot;:[{&quot;family&quot;:&quot;Scomazzon&quot;,&quot;given&quot;:&quot;Marco&quot;,&quot;parse-names&quot;:false,&quot;dropping-particle&quot;:&quot;&quot;,&quot;non-dropping-particle&quot;:&quot;&quot;},{&quot;family&quot;:&quot;Barbera&quot;,&quot;given&quot;:&quot;Elena&quot;,&quot;parse-names&quot;:false,&quot;dropping-particle&quot;:&quot;&quot;,&quot;non-dropping-particle&quot;:&quot;&quot;},{&quot;family&quot;:&quot;Bezzo&quot;,&quot;given&quot;:&quot;Fabrizio&quot;,&quot;parse-names&quot;:false,&quot;dropping-particle&quot;:&quot;&quot;,&quot;non-dropping-particle&quot;:&quot;&quot;}],&quot;container-title&quot;:&quot;Journal of Environmental Chemical Engineering&quot;,&quot;DOI&quot;:&quot;10.1016/j.jece.2024.112674&quot;,&quot;ISSN&quot;:&quot;22133437&quot;,&quot;issued&quot;:{&quot;date-parts&quot;:[[2024,6]]},&quot;page&quot;:&quot;112674&quot;,&quot;issue&quot;:&quot;3&quot;,&quot;volume&quot;:&quot;12&quot;,&quot;container-title-short&quot;:&quot;J. Environ. Chem. Eng.&quot;},&quot;isTemporary&quot;:false}]},{&quot;citationID&quot;:&quot;MENDELEY_CITATION_8eef8f75-1f87-4dff-a071-68987bdeee67&quot;,&quot;properties&quot;:{&quot;noteIndex&quot;:0},&quot;isEdited&quot;:false,&quot;manualOverride&quot;:{&quot;isManuallyOverridden&quot;:false,&quot;citeprocText&quot;:&quot;[10]&quot;,&quot;manualOverrideText&quot;:&quot;&quot;},&quot;citationTag&quot;:&quot;MENDELEY_CITATION_v3_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&quot;,&quot;citationItems&quot;:[{&quot;id&quot;:&quot;aa2feb8d-c9bd-3781-bba9-d18156ecd3e8&quot;,&quot;itemData&quot;:{&quot;type&quot;:&quot;article-journal&quot;,&quot;id&quot;:&quot;aa2feb8d-c9bd-3781-bba9-d18156ecd3e8&quot;,&quot;title&quot;:&quot;Alternative sustainable routes to methanol production: Techno-economic and environmental assessment&quot;,&quot;author&quot;:[{&quot;family&quot;:&quot;Scomazzon&quot;,&quot;given&quot;:&quot;Marco&quot;,&quot;parse-names&quot;:false,&quot;dropping-particle&quot;:&quot;&quot;,&quot;non-dropping-particle&quot;:&quot;&quot;},{&quot;family&quot;:&quot;Barbera&quot;,&quot;given&quot;:&quot;Elena&quot;,&quot;parse-names&quot;:false,&quot;dropping-particle&quot;:&quot;&quot;,&quot;non-dropping-particle&quot;:&quot;&quot;},{&quot;family&quot;:&quot;Bezzo&quot;,&quot;given&quot;:&quot;Fabrizio&quot;,&quot;parse-names&quot;:false,&quot;dropping-particle&quot;:&quot;&quot;,&quot;non-dropping-particle&quot;:&quot;&quot;}],&quot;container-title&quot;:&quot;Journal of Environmental Chemical Engineering&quot;,&quot;DOI&quot;:&quot;10.1016/j.jece.2024.112674&quot;,&quot;ISSN&quot;:&quot;22133437&quot;,&quot;issued&quot;:{&quot;date-parts&quot;:[[2024,6]]},&quot;page&quot;:&quot;112674&quot;,&quot;issue&quot;:&quot;3&quot;,&quot;volume&quot;:&quot;12&quot;,&quot;container-title-short&quot;:&quot;J. Environ. Chem. Eng.&quot;},&quot;isTemporary&quot;:false}]},{&quot;citationID&quot;:&quot;MENDELEY_CITATION_8a70196d-3ff9-41c8-be39-fcf525822331&quot;,&quot;properties&quot;:{&quot;noteIndex&quot;:0},&quot;isEdited&quot;:false,&quot;manualOverride&quot;:{&quot;isManuallyOverridden&quot;:false,&quot;citeprocText&quot;:&quot;[12]&quot;,&quot;manualOverrideText&quot;:&quot;&quot;},&quot;citationTag&quot;:&quot;MENDELEY_CITATION_v3_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&quot;,&quot;citationItems&quot;:[{&quot;id&quot;:&quot;1310fab5-b88a-3b52-8d94-488c61413bed&quot;,&quot;itemData&quot;:{&quot;type&quot;:&quot;article-journal&quot;,&quot;id&quot;:&quot;1310fab5-b88a-3b52-8d94-488c61413bed&quot;,&quot;title&quot;:&quot;Techno-economic evaluation of biomass-to-fuels with solid-oxide electrolyzer&quot;,&quot;author&quot;:[{&quot;family&quot;:&quot;Zhang&quot;,&quot;given&quot;:&quot;Hanfei&quot;,&quot;parse-names&quot;:false,&quot;dropping-particle&quot;:&quot;&quot;,&quot;non-dropping-particle&quot;:&quot;&quot;},{&quot;family&quot;:&quot;Wang&quot;,&quot;given&quot;:&quot;Ligang&quot;,&quot;parse-names&quot;:false,&quot;dropping-particle&quot;:&quot;&quot;,&quot;non-dropping-particle&quot;:&quot;&quot;},{&quot;family&quot;:&quot;herle&quot;,&quot;given&quot;:&quot;Jan&quot;,&quot;parse-names&quot;:false,&quot;dropping-particle&quot;:&quot;&quot;,&quot;non-dropping-particle&quot;:&quot;Van&quot;},{&quot;family&quot;:&quot;Maréchal&quot;,&quot;given&quot;:&quot;François&quot;,&quot;parse-names&quot;:false,&quot;dropping-particle&quot;:&quot;&quot;,&quot;non-dropping-particle&quot;:&quot;&quot;},{&quot;family&quot;:&quot;Desideri&quot;,&quot;given&quot;:&quot;Umberto&quot;,&quot;parse-names&quot;:false,&quot;dropping-particle&quot;:&quot;&quot;,&quot;non-dropping-particle&quot;:&quot;&quot;}],&quot;container-title&quot;:&quot;Applied Energy&quot;,&quot;DOI&quot;:&quot;10.1016/j.apenergy.2020.115113&quot;,&quot;ISSN&quot;:&quot;03062619&quot;,&quot;issued&quot;:{&quot;date-parts&quot;:[[2020,7]]},&quot;page&quot;:&quot;115113&quot;,&quot;volume&quot;:&quot;270&quot;,&quot;container-title-short&quot;:&quot;Appl. Energy&quot;},&quot;isTemporary&quot;:false}]},{&quot;citationID&quot;:&quot;MENDELEY_CITATION_13304e8f-750e-4a08-8b1d-6a0f67b53a03&quot;,&quot;properties&quot;:{&quot;noteIndex&quot;:0},&quot;isEdited&quot;:false,&quot;manualOverride&quot;:{&quot;isManuallyOverridden&quot;:false,&quot;citeprocText&quot;:&quot;[13]&quot;,&quot;manualOverrideText&quot;:&quot;&quot;},&quot;citationTag&quot;:&quot;MENDELEY_CITATION_v3_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&quot;,&quot;citationItems&quot;:[{&quot;id&quot;:&quot;190b1267-cffd-3b0f-acfd-1ca4b15c3e7b&quot;,&quot;itemData&quot;:{&quot;type&quot;:&quot;article-journal&quot;,&quot;id&quot;:&quot;190b1267-cffd-3b0f-acfd-1ca4b15c3e7b&quot;,&quot;title&quot;:&quot;Techno-economic assessment of the impact of electrolysis technology on power-to-methanol processes&quot;,&quot;author&quot;:[{&quot;family&quot;:&quot;Walther&quot;,&quot;given&quot;:&quot;Aniko&quot;,&quot;parse-names&quot;:false,&quot;dropping-particle&quot;:&quot;&quot;,&quot;non-dropping-particle&quot;:&quot;&quot;},{&quot;family&quot;:&quot;Löning&quot;,&quot;given&quot;:&quot;Kai&quot;,&quot;parse-names&quot;:false,&quot;dropping-particle&quot;:&quot;&quot;,&quot;non-dropping-particle&quot;:&quot;&quot;},{&quot;family&quot;:&quot;Reichelt&quot;,&quot;given&quot;:&quot;Erik&quot;,&quot;parse-names&quot;:false,&quot;dropping-particle&quot;:&quot;&quot;,&quot;non-dropping-particle&quot;:&quot;&quot;}],&quot;container-title&quot;:&quot;International Journal of Hydrogen Energy&quot;,&quot;DOI&quot;:&quot;10.1016/j.ijhydene.2026.153394&quot;,&quot;ISSN&quot;:&quot;03603199&quot;,&quot;issued&quot;:{&quot;date-parts&quot;:[[2026,2]]},&quot;page&quot;:&quot;153394&quot;,&quot;volume&quot;:&quot;206&quot;,&quot;container-title-short&quot;:&quot;Int. J. Hydrogen Energy&quot;},&quot;isTemporary&quot;:false}]},{&quot;citationID&quot;:&quot;MENDELEY_CITATION_6a736241-62e6-4de8-9385-e50fe6f3ae30&quot;,&quot;properties&quot;:{&quot;noteIndex&quot;:0},&quot;isEdited&quot;:false,&quot;manualOverride&quot;:{&quot;isManuallyOverridden&quot;:false,&quot;citeprocText&quot;:&quot;[14], [15], [16]&quot;,&quot;manualOverrideText&quot;:&quot;&quot;},&quot;citationTag&quot;:&quot;MENDELEY_CITATION_v3_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&quot;,&quot;citationItems&quot;:[{&quot;id&quot;:&quot;d24a77c3-65ad-3302-bdd5-2971e96b5fe6&quot;,&quot;itemData&quot;:{&quot;type&quot;:&quot;article-journal&quot;,&quot;id&quot;:&quot;d24a77c3-65ad-3302-bdd5-2971e96b5fe6&quot;,&quot;title&quot;:&quot;Alkaline Water Electrolysis Powered by Renewable Energy: A Review&quot;,&quot;author&quot;:[{&quot;family&quot;:&quot;Brauns&quot;,&quot;given&quot;:&quot;Jörn&quot;,&quot;parse-names&quot;:false,&quot;dropping-particle&quot;:&quot;&quot;,&quot;non-dropping-particle&quot;:&quot;&quot;},{&quot;family&quot;:&quot;Turek&quot;,&quot;given&quot;:&quot;Thomas&quot;,&quot;parse-names&quot;:false,&quot;dropping-particle&quot;:&quot;&quot;,&quot;non-dropping-particle&quot;:&quot;&quot;}],&quot;container-title&quot;:&quot;Processes&quot;,&quot;DOI&quot;:&quot;10.3390/pr8020248&quot;,&quot;ISSN&quot;:&quot;2227-9717&quot;,&quot;issued&quot;:{&quot;date-parts&quot;:[[2020,2,21]]},&quot;page&quot;:&quot;248&quot;,&quot;abstract&quot;:&quot;&lt;p&gt;Alkaline water electrolysis is a key technology for large-scale hydrogen production powered by renewable energy. As conventional electrolyzers are designed for operation at fixed process conditions, the implementation of fluctuating and highly intermittent renewable energy is challenging. This contribution shows the recent state of system descriptions for alkaline water electrolysis and renewable energies, such as solar and wind power. Each component of a hydrogen energy system needs to be optimized to increase the operation time and system efficiency. Only in this way can hydrogen produced by electrolysis processes be competitive with the conventional path based on fossil energy sources. Conventional alkaline water electrolyzers show a limited part-load range due to an increased gas impurity at low power availability. As explosive mixtures of hydrogen and oxygen must be prevented, a safety shutdown is performed when reaching specific gas contamination. Furthermore, the cell voltage should be optimized to maintain a high efficiency. While photovoltaic panels can be directly coupled to alkaline water electrolyzers, wind turbines require suitable converters with additional losses. By combining alkaline water electrolysis with hydrogen storage tanks and fuel cells, power grid stabilization can be performed. As a consequence, the conventional spinning reserve can be reduced, which additionally lowers the carbon dioxide emissions.&lt;/p&gt;&quot;,&quot;issue&quot;:&quot;2&quot;,&quot;volume&quot;:&quot;8&quot;,&quot;container-title-short&quot;:&quot;&quot;},&quot;isTemporary&quot;:false},{&quot;id&quot;:&quot;fb305ddc-d308-30ab-8f80-782b0f32ba1c&quot;,&quot;itemData&quot;:{&quot;type&quot;:&quot;article-journal&quot;,&quot;id&quot;:&quot;fb305ddc-d308-30ab-8f80-782b0f32ba1c&quot;,&quot;title&quot;:&quot;Electrofuels for the transport sector: A review of production costs&quot;,&quot;author&quot;:[{&quot;family&quot;:&quot;Brynolf&quot;,&quot;given&quot;:&quot;Selma&quot;,&quot;parse-names&quot;:false,&quot;dropping-particle&quot;:&quot;&quot;,&quot;non-dropping-particle&quot;:&quot;&quot;},{&quot;family&quot;:&quot;Taljegard&quot;,&quot;given&quot;:&quot;Maria&quot;,&quot;parse-names&quot;:false,&quot;dropping-particle&quot;:&quot;&quot;,&quot;non-dropping-particle&quot;:&quot;&quot;},{&quot;family&quot;:&quot;Grahn&quot;,&quot;given&quot;:&quot;Maria&quot;,&quot;parse-names&quot;:false,&quot;dropping-particle&quot;:&quot;&quot;,&quot;non-dropping-particle&quot;:&quot;&quot;},{&quot;family&quot;:&quot;Hansson&quot;,&quot;given&quot;:&quot;Julia&quot;,&quot;parse-names&quot;:false,&quot;dropping-particle&quot;:&quot;&quot;,&quot;non-dropping-particle&quot;:&quot;&quot;}],&quot;container-title&quot;:&quot;Renewable and Sustainable Energy Reviews&quot;,&quot;DOI&quot;:&quot;10.1016/j.rser.2017.05.288&quot;,&quot;ISSN&quot;:&quot;13640321&quot;,&quot;issued&quot;:{&quot;date-parts&quot;:[[2018,1]]},&quot;page&quot;:&quot;1887-1905&quot;,&quot;volume&quot;:&quot;81&quot;,&quot;container-title-short&quot;:&quot;&quot;},&quot;isTemporary&quot;:false},{&quot;id&quot;:&quot;1b5f443a-d989-3c31-80b4-27044204c02c&quot;,&quot;itemData&quot;:{&quot;type&quot;:&quot;article-journal&quot;,&quot;id&quot;:&quot;1b5f443a-d989-3c31-80b4-27044204c02c&quot;,&quot;title&quot;:&quot;Hydrogen production by PEM water electrolysis – A review&quot;,&quot;author&quot;:[{&quot;family&quot;:&quot;Shiva Kumar&quot;,&quot;given&quot;:&quot;S.&quot;,&quot;parse-names&quot;:false,&quot;dropping-particle&quot;:&quot;&quot;,&quot;non-dropping-particle&quot;:&quot;&quot;},{&quot;family&quot;:&quot;Himabindu&quot;,&quot;given&quot;:&quot;V.&quot;,&quot;parse-names&quot;:false,&quot;dropping-particle&quot;:&quot;&quot;,&quot;non-dropping-particle&quot;:&quot;&quot;}],&quot;container-title&quot;:&quot;Materials Science for Energy Technologies&quot;,&quot;DOI&quot;:&quot;10.1016/j.mset.2019.03.002&quot;,&quot;ISSN&quot;:&quot;25892991&quot;,&quot;issued&quot;:{&quot;date-parts&quot;:[[2019,12]]},&quot;page&quot;:&quot;442-454&quot;,&quot;issue&quot;:&quot;3&quot;,&quot;volume&quot;:&quot;2&quot;,&quot;container-title-short&quot;:&quot;Mater. Sci. Energy Technol.&quot;},&quot;isTemporary&quot;:false}]},{&quot;citationID&quot;:&quot;MENDELEY_CITATION_e23df023-1b0e-4c7d-a81a-d4f5c2bec620&quot;,&quot;properties&quot;:{&quot;noteIndex&quot;:0},&quot;isEdited&quot;:false,&quot;manualOverride&quot;:{&quot;isManuallyOverridden&quot;:false,&quot;citeprocText&quot;:&quot;[17]&quot;,&quot;manualOverrideText&quot;:&quot;&quot;},&quot;citationTag&quot;:&quot;MENDELEY_CITATION_v3_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&quot;,&quot;citationItems&quot;:[{&quot;id&quot;:&quot;8c3b2930-cd0d-331a-8923-1e74c3142273&quot;,&quot;itemData&quot;:{&quot;type&quot;:&quot;article-journal&quot;,&quot;id&quot;:&quot;8c3b2930-cd0d-331a-8923-1e74c3142273&quot;,&quot;title&quot;:&quot;LCA and exergy-economic evaluation of a biogas-to-fuels system using CO2 hydrogenation and exhaust gas recycling&quot;,&quot;author&quot;:[{&quot;family&quot;:&quot;Ghiasirad&quot;,&quot;given&quot;:&quot;Hamed&quot;,&quot;parse-names&quot;:false,&quot;dropping-particle&quot;:&quot;&quot;,&quot;non-dropping-particle&quot;:&quot;&quot;},{&quot;family&quot;:&quot;Ebrahimian&quot;,&quot;given&quot;:&quot;Farinaz&quot;,&quot;parse-names&quot;:false,&quot;dropping-particle&quot;:&quot;&quot;,&quot;non-dropping-particle&quot;:&quot;&quot;},{&quot;family&quot;:&quot;Gholizadeh&quot;,&quot;given&quot;:&quot;Towhid&quot;,&quot;parse-names&quot;:false,&quot;dropping-particle&quot;:&quot;&quot;,&quot;non-dropping-particle&quot;:&quot;&quot;},{&quot;family&quot;:&quot;Mohammadi&quot;,&quot;given&quot;:&quot;Ali&quot;,&quot;parse-names&quot;:false,&quot;dropping-particle&quot;:&quot;&quot;,&quot;non-dropping-particle&quot;:&quot;&quot;},{&quot;family&quot;:&quot;Mirmasoumi&quot;,&quot;given&quot;:&quot;Siamak&quot;,&quot;parse-names&quot;:false,&quot;dropping-particle&quot;:&quot;&quot;,&quot;non-dropping-particle&quot;:&quot;&quot;},{&quot;family&quot;:&quot;Saray&quot;,&quot;given&quot;:&quot;Rahim Khoshbakhti&quot;,&quot;parse-names&quot;:false,&quot;dropping-particle&quot;:&quot;&quot;,&quot;non-dropping-particle&quot;:&quot;&quot;},{&quot;family&quot;:&quot;Skorek-Osikowska&quot;,&quot;given&quot;:&quot;Anna&quot;,&quot;parse-names&quot;:false,&quot;dropping-particle&quot;:&quot;&quot;,&quot;non-dropping-particle&quot;:&quot;&quot;}],&quot;container-title&quot;:&quot;Energy Conversion and Management: X&quot;,&quot;DOI&quot;:&quot;10.1016/j.ecmx.2025.100897&quot;,&quot;ISSN&quot;:&quot;25901745&quot;,&quot;issued&quot;:{&quot;date-parts&quot;:[[2025,4]]},&quot;page&quot;:&quot;100897&quot;,&quot;volume&quot;:&quot;26&quot;,&quot;container-title-short&quot;:&quot;&quot;},&quot;isTemporary&quot;:false}]},{&quot;citationID&quot;:&quot;MENDELEY_CITATION_f5902acf-3f1b-4f47-a295-09ff9652d7b2&quot;,&quot;properties&quot;:{&quot;noteIndex&quot;:0},&quot;isEdited&quot;:false,&quot;manualOverride&quot;:{&quot;isManuallyOverridden&quot;:false,&quot;citeprocText&quot;:&quot;[18]&quot;,&quot;manualOverrideText&quot;:&quot;&quot;},&quot;citationTag&quot;:&quot;MENDELEY_CITATION_v3_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&quot;,&quot;citationItems&quot;:[{&quot;id&quot;:&quot;cb817469-f165-3488-91d4-ffe692974354&quot;,&quot;itemData&quot;:{&quot;type&quot;:&quot;article-journal&quot;,&quot;id&quot;:&quot;cb817469-f165-3488-91d4-ffe692974354&quot;,&quot;title&quot;:&quot;Alternative sustainable routes to methanol production: Techno-economic and environmental assessment&quot;,&quot;author&quot;:[{&quot;family&quot;:&quot;Scomazzon&quot;,&quot;given&quot;:&quot;Marco&quot;,&quot;parse-names&quot;:false,&quot;dropping-particle&quot;:&quot;&quot;,&quot;non-dropping-particle&quot;:&quot;&quot;},{&quot;family&quot;:&quot;Barbera&quot;,&quot;given&quot;:&quot;Elena&quot;,&quot;parse-names&quot;:false,&quot;dropping-particle&quot;:&quot;&quot;,&quot;non-dropping-particle&quot;:&quot;&quot;},{&quot;family&quot;:&quot;Bezzo&quot;,&quot;given&quot;:&quot;Fabrizio&quot;,&quot;parse-names&quot;:false,&quot;dropping-particle&quot;:&quot;&quot;,&quot;non-dropping-particle&quot;:&quot;&quot;}],&quot;container-title&quot;:&quot;Journal of Environmental Chemical Engineering&quot;,&quot;DOI&quot;:&quot;10.1016/j.jece.2024.112674&quot;,&quot;ISSN&quot;:&quot;22133437&quot;,&quot;issued&quot;:{&quot;date-parts&quot;:[[2024,6]]},&quot;page&quot;:&quot;112674&quot;,&quot;issue&quot;:&quot;3&quot;,&quot;volume&quot;:&quot;12&quot;,&quot;container-title-short&quot;:&quot;J. Environ. Chem. Eng.&quot;},&quot;isTemporary&quot;:false}]},{&quot;citationID&quot;:&quot;MENDELEY_CITATION_50e16af0-91a6-43f9-862e-188051a6076b&quot;,&quot;properties&quot;:{&quot;noteIndex&quot;:0},&quot;isEdited&quot;:false,&quot;manualOverride&quot;:{&quot;isManuallyOverridden&quot;:false,&quot;citeprocText&quot;:&quot;[17]&quot;,&quot;manualOverrideText&quot;:&quot;&quot;},&quot;citationTag&quot;:&quot;MENDELEY_CITATION_v3_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&quot;,&quot;citationItems&quot;:[{&quot;id&quot;:&quot;8c3b2930-cd0d-331a-8923-1e74c3142273&quot;,&quot;itemData&quot;:{&quot;type&quot;:&quot;article-journal&quot;,&quot;id&quot;:&quot;8c3b2930-cd0d-331a-8923-1e74c3142273&quot;,&quot;title&quot;:&quot;LCA and exergy-economic evaluation of a biogas-to-fuels system using CO2 hydrogenation and exhaust gas recycling&quot;,&quot;author&quot;:[{&quot;family&quot;:&quot;Ghiasirad&quot;,&quot;given&quot;:&quot;Hamed&quot;,&quot;parse-names&quot;:false,&quot;dropping-particle&quot;:&quot;&quot;,&quot;non-dropping-particle&quot;:&quot;&quot;},{&quot;family&quot;:&quot;Ebrahimian&quot;,&quot;given&quot;:&quot;Farinaz&quot;,&quot;parse-names&quot;:false,&quot;dropping-particle&quot;:&quot;&quot;,&quot;non-dropping-particle&quot;:&quot;&quot;},{&quot;family&quot;:&quot;Gholizadeh&quot;,&quot;given&quot;:&quot;Towhid&quot;,&quot;parse-names&quot;:false,&quot;dropping-particle&quot;:&quot;&quot;,&quot;non-dropping-particle&quot;:&quot;&quot;},{&quot;family&quot;:&quot;Mohammadi&quot;,&quot;given&quot;:&quot;Ali&quot;,&quot;parse-names&quot;:false,&quot;dropping-particle&quot;:&quot;&quot;,&quot;non-dropping-particle&quot;:&quot;&quot;},{&quot;family&quot;:&quot;Mirmasoumi&quot;,&quot;given&quot;:&quot;Siamak&quot;,&quot;parse-names&quot;:false,&quot;dropping-particle&quot;:&quot;&quot;,&quot;non-dropping-particle&quot;:&quot;&quot;},{&quot;family&quot;:&quot;Saray&quot;,&quot;given&quot;:&quot;Rahim Khoshbakhti&quot;,&quot;parse-names&quot;:false,&quot;dropping-particle&quot;:&quot;&quot;,&quot;non-dropping-particle&quot;:&quot;&quot;},{&quot;family&quot;:&quot;Skorek-Osikowska&quot;,&quot;given&quot;:&quot;Anna&quot;,&quot;parse-names&quot;:false,&quot;dropping-particle&quot;:&quot;&quot;,&quot;non-dropping-particle&quot;:&quot;&quot;}],&quot;container-title&quot;:&quot;Energy Conversion and Management: X&quot;,&quot;DOI&quot;:&quot;10.1016/j.ecmx.2025.100897&quot;,&quot;ISSN&quot;:&quot;25901745&quot;,&quot;issued&quot;:{&quot;date-parts&quot;:[[2025,4]]},&quot;page&quot;:&quot;100897&quot;,&quot;volume&quot;:&quot;26&quot;,&quot;container-title-short&quot;:&quot;&quot;},&quot;isTemporary&quot;:false}]},{&quot;citationID&quot;:&quot;MENDELEY_CITATION_f6f42889-26df-4dbb-987f-6da6adaab487&quot;,&quot;properties&quot;:{&quot;noteIndex&quot;:0},&quot;isEdited&quot;:false,&quot;manualOverride&quot;:{&quot;isManuallyOverridden&quot;:false,&quot;citeprocText&quot;:&quot;[19]&quot;,&quot;manualOverrideText&quot;:&quot;&quot;},&quot;citationTag&quot;:&quot;MENDELEY_CITATION_v3_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&quot;,&quot;citationItems&quot;:[{&quot;id&quot;:&quot;28a53769-a0e5-3c5a-80f0-90f7301702eb&quot;,&quot;itemData&quot;:{&quot;type&quot;:&quot;article-journal&quot;,&quot;id&quot;:&quot;28a53769-a0e5-3c5a-80f0-90f7301702eb&quot;,&quot;title&quot;:&quot;Techno-economic-environmental assessment of the integration of power-to-X and biogas utilization towards the production of electricity, hydrogen, methane and methanol&quot;,&quot;author&quot;:[{&quot;family&quot;:&quot;Moioli&quot;,&quot;given&quot;:&quot;Emanuele&quot;,&quot;parse-names&quot;:false,&quot;dropping-particle&quot;:&quot;&quot;,&quot;non-dropping-particle&quot;:&quot;&quot;},{&quot;family&quot;:&quot;Schildhauer&quot;,&quot;given&quot;:&quot;Tilman&quot;,&quot;parse-names&quot;:false,&quot;dropping-particle&quot;:&quot;&quot;,&quot;non-dropping-particle&quot;:&quot;&quot;}],&quot;container-title&quot;:&quot;Sustainable Energy &amp; Fuels&quot;,&quot;DOI&quot;:&quot;10.1039/D3SE00052D&quot;,&quot;ISSN&quot;:&quot;2398-4902&quot;,&quot;issued&quot;:{&quot;date-parts&quot;:[[2023]]},&quot;page&quot;:&quot;2690-2706&quot;,&quot;abstract&quot;:&quot;&lt;p&gt;Various routes for the valorisation of biogas towards methane and methanol and for electricity or hydrogen storage is assessed.&lt;/p&gt;&quot;,&quot;issue&quot;:&quot;11&quot;,&quot;volume&quot;:&quot;7&quot;,&quot;container-title-short&quot;:&quot;Sustain. Energy Fuels&quot;},&quot;isTemporary&quot;:false}]},{&quot;citationID&quot;:&quot;MENDELEY_CITATION_8e42163d-fd20-4d53-837d-ec79437e85ea&quot;,&quot;properties&quot;:{&quot;noteIndex&quot;:0},&quot;isEdited&quot;:false,&quot;manualOverride&quot;:{&quot;isManuallyOverridden&quot;:false,&quot;citeprocText&quot;:&quot;[20]&quot;,&quot;manualOverrideText&quot;:&quot;&quot;},&quot;citationTag&quot;:&quot;MENDELEY_CITATION_v3_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&quot;,&quot;citationItems&quot;:[{&quot;id&quot;:&quot;104cea19-ccc6-37e7-9959-f839fd356eec&quot;,&quot;itemData&quot;:{&quot;type&quot;:&quot;article-journal&quot;,&quot;id&quot;:&quot;104cea19-ccc6-37e7-9959-f839fd356eec&quot;,&quot;title&quot;:&quot;Improving carbon efficiency for an advanced Biomass-to-Liquid process using hydrogen and oxygen from electrolysis&quot;,&quot;author&quot;:[{&quot;family&quot;:&quot;Dossow&quot;,&quot;given&quot;:&quot;Marcel&quot;,&quot;parse-names&quot;:false,&quot;dropping-particle&quot;:&quot;&quot;,&quot;non-dropping-particle&quot;:&quot;&quot;},{&quot;family&quot;:&quot;Dieterich&quot;,&quot;given&quot;:&quot;Vincent&quot;,&quot;parse-names&quot;:false,&quot;dropping-particle&quot;:&quot;&quot;,&quot;non-dropping-particle&quot;:&quot;&quot;},{&quot;family&quot;:&quot;Hanel&quot;,&quot;given&quot;:&quot;Andreas&quot;,&quot;parse-names&quot;:false,&quot;dropping-particle&quot;:&quot;&quot;,&quot;non-dropping-particle&quot;:&quot;&quot;},{&quot;family&quot;:&quot;Spliethoff&quot;,&quot;given&quot;:&quot;Hartmut&quot;,&quot;parse-names&quot;:false,&quot;dropping-particle&quot;:&quot;&quot;,&quot;non-dropping-particle&quot;:&quot;&quot;},{&quot;family&quot;:&quot;Fendt&quot;,&quot;given&quot;:&quot;Sebastian&quot;,&quot;parse-names&quot;:false,&quot;dropping-particle&quot;:&quot;&quot;,&quot;non-dropping-particle&quot;:&quot;&quot;}],&quot;container-title&quot;:&quot;Renewable and Sustainable Energy Reviews&quot;,&quot;DOI&quot;:&quot;10.1016/j.rser.2021.111670&quot;,&quot;ISSN&quot;:&quot;13640321&quot;,&quot;issued&quot;:{&quot;date-parts&quot;:[[2021,12]]},&quot;page&quot;:&quot;111670&quot;,&quot;volume&quot;:&quot;152&quot;,&quot;container-title-short&quot;:&quot;&quot;},&quot;isTemporary&quot;:false}]},{&quot;citationID&quot;:&quot;MENDELEY_CITATION_88d0ffc1-318e-4fe5-b886-2a172eaebfef&quot;,&quot;properties&quot;:{&quot;noteIndex&quot;:0},&quot;isEdited&quot;:false,&quot;manualOverride&quot;:{&quot;isManuallyOverridden&quot;:false,&quot;citeprocText&quot;:&quot;[21]&quot;,&quot;manualOverrideText&quot;:&quot;&quot;},&quot;citationTag&quot;:&quot;MENDELEY_CITATION_v3_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&quot;,&quot;citationItems&quot;:[{&quot;id&quot;:&quot;70edddc8-ee03-31fd-86e6-6cf7a4858b7a&quot;,&quot;itemData&quot;:{&quot;type&quot;:&quot;article-journal&quot;,&quot;id&quot;:&quot;70edddc8-ee03-31fd-86e6-6cf7a4858b7a&quot;,&quot;title&quot;:&quot;Flexible Power and Biomass-To-Methanol Plants With Different Gasification Technologies&quot;,&quot;author&quot;:[{&quot;family&quot;:&quot;Poluzzi&quot;,&quot;given&quot;:&quot;A.&quot;,&quot;parse-names&quot;:false,&quot;dropping-particle&quot;:&quot;&quot;,&quot;non-dropping-particle&quot;:&quot;&quot;},{&quot;family&quot;:&quot;Guandalini&quot;,&quot;given&quot;:&quot;G.&quot;,&quot;parse-names&quot;:false,&quot;dropping-particle&quot;:&quot;&quot;,&quot;non-dropping-particle&quot;:&quot;&quot;},{&quot;family&quot;:&quot;Guffanti&quot;,&quot;given&quot;:&quot;S.&quot;,&quot;parse-names&quot;:false,&quot;dropping-particle&quot;:&quot;&quot;,&quot;non-dropping-particle&quot;:&quot;&quot;},{&quot;family&quot;:&quot;Martinelli&quot;,&quot;given&quot;:&quot;M.&quot;,&quot;parse-names&quot;:false,&quot;dropping-particle&quot;:&quot;&quot;,&quot;non-dropping-particle&quot;:&quot;&quot;},{&quot;family&quot;:&quot;Moioli&quot;,&quot;given&quot;:&quot;S.&quot;,&quot;parse-names&quot;:false,&quot;dropping-particle&quot;:&quot;&quot;,&quot;non-dropping-particle&quot;:&quot;&quot;},{&quot;family&quot;:&quot;Huttenhuis&quot;,&quot;given&quot;:&quot;P.&quot;,&quot;parse-names&quot;:false,&quot;dropping-particle&quot;:&quot;&quot;,&quot;non-dropping-particle&quot;:&quot;&quot;},{&quot;family&quot;:&quot;Rexwinkel&quot;,&quot;given&quot;:&quot;G.&quot;,&quot;parse-names&quot;:false,&quot;dropping-particle&quot;:&quot;&quot;,&quot;non-dropping-particle&quot;:&quot;&quot;},{&quot;family&quot;:&quot;Palonen&quot;,&quot;given&quot;:&quot;J.&quot;,&quot;parse-names&quot;:false,&quot;dropping-particle&quot;:&quot;&quot;,&quot;non-dropping-particle&quot;:&quot;&quot;},{&quot;family&quot;:&quot;Martelli&quot;,&quot;given&quot;:&quot;E.&quot;,&quot;parse-names&quot;:false,&quot;dropping-particle&quot;:&quot;&quot;,&quot;non-dropping-particle&quot;:&quot;&quot;},{&quot;family&quot;:&quot;Groppi&quot;,&quot;given&quot;:&quot;G.&quot;,&quot;parse-names&quot;:false,&quot;dropping-particle&quot;:&quot;&quot;,&quot;non-dropping-particle&quot;:&quot;&quot;},{&quot;family&quot;:&quot;Romano&quot;,&quot;given&quot;:&quot;M. C.&quot;,&quot;parse-names&quot;:false,&quot;dropping-particle&quot;:&quot;&quot;,&quot;non-dropping-particle&quot;:&quot;&quot;}],&quot;container-title&quot;:&quot;Frontiers in Energy Research&quot;,&quot;DOI&quot;:&quot;10.3389/fenrg.2021.795673&quot;,&quot;ISSN&quot;:&quot;2296-598X&quot;,&quot;issued&quot;:{&quot;date-parts&quot;:[[2022,1,27]]},&quot;abstract&quot;:&quot;&lt;p&gt; The competitiveness of biofuels may be increased by integrating biomass gasification plants with electrolysis units, which generate hydrogen to be combined with carbon-rich syngas. This option allows increasing the yield of the final product by retaining a higher amount of biogenic carbon and improving the resilience of the energy sector by favoring electric grid services and sector coupling. This article illustrates a techno-economic comparative analysis of three flexible power and biomass to methanol plants based on different gasification technologies: direct gasification, indirect gasification, and sorption-enhanced gasification. The design and operational criteria of each plant are conceived to operate both without green hydrogen addition (baseline mode) and with hydrogen addition (enhanced mode), following an intermittent use of the electrolysis system, which is turned on when the electricity price allows an economically viable hydrogen production. The methanol production plants include a gasification section, syngas cleaning, conditioning and compression section, methanol synthesis and purification, and heat recovery steam cycle to be flexibly operated. Due to the high oxygen demand in the gasifier, the direct gasification-based plant obtains a great advantage to be operated between a minimum load to satisfy the oxygen demand at high electricity prices and a maximum load to maximize methanol production at low electricity prices. This allows avoiding large oxygen storages with significant benefits for Capex and safety issues. The analysis reports specific fixed-capital investments between 1823 and 2048 €/kW of methanol output in the enhanced operation and LCOFs between 29.7 and 31.7 €/GJ &lt;sub&gt;LHV&lt;/sub&gt; . Economic advantages may be derived from a decrease in the electrolysis capital investment, especially for the direct gasification-based plants, which employ the greatest sized electrolyzer. Methanol breakeven selling prices range between 545 and 582 €/t with the 2019 reference Denmark electricity price curve and between 484 and 535 €/t with an assumed modified electricity price curve of a future energy mix with increased penetration of intermittent renewables. &lt;/p&gt;&quot;,&quot;volume&quot;:&quot;9&quot;,&quot;container-title-short&quot;:&quot;Front. Energy Res.&quot;},&quot;isTemporary&quot;:false}]},{&quot;citationID&quot;:&quot;MENDELEY_CITATION_e06c8150-ca7f-4bb6-8b73-8555f96f90d4&quot;,&quot;properties&quot;:{&quot;noteIndex&quot;:0},&quot;isEdited&quot;:false,&quot;manualOverride&quot;:{&quot;isManuallyOverridden&quot;:false,&quot;citeprocText&quot;:&quot;[22]&quot;,&quot;manualOverrideText&quot;:&quot;&quot;},&quot;citationTag&quot;:&quot;MENDELEY_CITATION_v3_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&quot;,&quot;citationItems&quot;:[{&quot;id&quot;:&quot;a36d5e43-f1b3-3f4c-8cdc-446f28ab3924&quot;,&quot;itemData&quot;:{&quot;type&quot;:&quot;article-journal&quot;,&quot;id&quot;:&quot;a36d5e43-f1b3-3f4c-8cdc-446f28ab3924&quot;,&quot;title&quot;:&quot;Benefits of Hybrid Production of E-Methanol in Connection with Biomass Gasification&quot;,&quot;author&quot;:[{&quot;family&quot;:&quot;Anetjärvi&quot;,&quot;given&quot;:&quot;Eemeli&quot;,&quot;parse-names&quot;:false,&quot;dropping-particle&quot;:&quot;&quot;,&quot;non-dropping-particle&quot;:&quot;&quot;},{&quot;family&quot;:&quot;Vakkilainen&quot;,&quot;given&quot;:&quot;Esa&quot;,&quot;parse-names&quot;:false,&quot;dropping-particle&quot;:&quot;&quot;,&quot;non-dropping-particle&quot;:&quot;&quot;},{&quot;family&quot;:&quot;Melin&quot;,&quot;given&quot;:&quot;Kristian&quot;,&quot;parse-names&quot;:false,&quot;dropping-particle&quot;:&quot;&quot;,&quot;non-dropping-particle&quot;:&quot;&quot;}],&quot;container-title&quot;:&quot;SSRN Electronic Journal&quot;,&quot;DOI&quot;:&quot;10.2139/ssrn.4184476&quot;,&quot;ISSN&quot;:&quot;1556-5068&quot;,&quot;issued&quot;:{&quot;date-parts&quot;:[[2022]]},&quot;container-title-short&quot;:&quot;&quot;},&quot;isTemporary&quot;:false}]},{&quot;citationID&quot;:&quot;MENDELEY_CITATION_cd84c5ed-f67d-47d0-afce-d099ac46029a&quot;,&quot;properties&quot;:{&quot;noteIndex&quot;:0},&quot;isEdited&quot;:false,&quot;manualOverride&quot;:{&quot;isManuallyOverridden&quot;:false,&quot;citeprocText&quot;:&quot;[23]&quot;,&quot;manualOverrideText&quot;:&quot;&quot;},&quot;citationTag&quot;:&quot;MENDELEY_CITATION_v3_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&quot;,&quot;citationItems&quot;:[{&quot;id&quot;:&quot;048c482b-30be-34eb-bade-6c65560bb00c&quot;,&quot;itemData&quot;:{&quot;type&quot;:&quot;article-journal&quot;,&quot;id&quot;:&quot;048c482b-30be-34eb-bade-6c65560bb00c&quot;,&quot;title&quot;:&quot;Techno-economic optimization of biomass-to-methanol with solid-oxide electrolyzer&quot;,&quot;author&quot;:[{&quot;family&quot;:&quot;Zhang&quot;,&quot;given&quot;:&quot;Hanfei&quot;,&quot;parse-names&quot;:false,&quot;dropping-particle&quot;:&quot;&quot;,&quot;non-dropping-particle&quot;:&quot;&quot;},{&quot;family&quot;:&quot;Wang&quot;,&quot;given&quot;:&quot;Ligang&quot;,&quot;parse-names&quot;:false,&quot;dropping-particle&quot;:&quot;&quot;,&quot;non-dropping-particle&quot;:&quot;&quot;},{&quot;family&quot;:&quot;Pérez-Fortes&quot;,&quot;given&quot;:&quot;Mar&quot;,&quot;parse-names&quot;:false,&quot;dropping-particle&quot;:&quot;&quot;,&quot;non-dropping-particle&quot;:&quot;&quot;},{&quot;family&quot;:&quot;herle&quot;,&quot;given&quot;:&quot;Jan&quot;,&quot;parse-names&quot;:false,&quot;dropping-particle&quot;:&quot;&quot;,&quot;non-dropping-particle&quot;:&quot;Van&quot;},{&quot;family&quot;:&quot;Maréchal&quot;,&quot;given&quot;:&quot;François&quot;,&quot;parse-names&quot;:false,&quot;dropping-particle&quot;:&quot;&quot;,&quot;non-dropping-particle&quot;:&quot;&quot;},{&quot;family&quot;:&quot;Desideri&quot;,&quot;given&quot;:&quot;Umberto&quot;,&quot;parse-names&quot;:false,&quot;dropping-particle&quot;:&quot;&quot;,&quot;non-dropping-particle&quot;:&quot;&quot;}],&quot;container-title&quot;:&quot;Applied Energy&quot;,&quot;DOI&quot;:&quot;10.1016/j.apenergy.2019.114071&quot;,&quot;ISSN&quot;:&quot;03062619&quot;,&quot;issued&quot;:{&quot;date-parts&quot;:[[2020,1]]},&quot;page&quot;:&quot;114071&quot;,&quot;volume&quot;:&quot;258&quot;,&quot;container-title-short&quot;:&quot;Appl. Energy&quot;},&quot;isTemporary&quot;:false}]},{&quot;citationID&quot;:&quot;MENDELEY_CITATION_42ff2c48-5158-4a41-83ab-c9fb9e7d73b7&quot;,&quot;properties&quot;:{&quot;noteIndex&quot;:0},&quot;isEdited&quot;:false,&quot;manualOverride&quot;:{&quot;isManuallyOverridden&quot;:false,&quot;citeprocText&quot;:&quot;[24]&quot;,&quot;manualOverrideText&quot;:&quot;&quot;},&quot;citationTag&quot;:&quot;MENDELEY_CITATION_v3_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&quot;,&quot;citationItems&quot;:[{&quot;id&quot;:&quot;ded22db1-0dce-3c1b-981f-fd5847a7cce1&quot;,&quot;itemData&quot;:{&quot;type&quot;:&quot;article-journal&quot;,&quot;id&quot;:&quot;ded22db1-0dce-3c1b-981f-fd5847a7cce1&quot;,&quot;title&quot;:&quot;Flexible Power &amp;amp; Biomass-to-Methanol plants: Design optimization and economic viability of the electrolysis integration&quot;,&quot;author&quot;:[{&quot;family&quot;:&quot;Poluzzi&quot;,&quot;given&quot;:&quot;Alessandro&quot;,&quot;parse-names&quot;:false,&quot;dropping-particle&quot;:&quot;&quot;,&quot;non-dropping-particle&quot;:&quot;&quot;},{&quot;family&quot;:&quot;Guandalini&quot;,&quot;given&quot;:&quot;Giulio&quot;,&quot;parse-names&quot;:false,&quot;dropping-particle&quot;:&quot;&quot;,&quot;non-dropping-particle&quot;:&quot;&quot;},{&quot;family&quot;:&quot;Guffanti&quot;,&quot;given&quot;:&quot;Simone&quot;,&quot;parse-names&quot;:false,&quot;dropping-particle&quot;:&quot;&quot;,&quot;non-dropping-particle&quot;:&quot;&quot;},{&quot;family&quot;:&quot;Elsido&quot;,&quot;given&quot;:&quot;Cristina&quot;,&quot;parse-names&quot;:false,&quot;dropping-particle&quot;:&quot;&quot;,&quot;non-dropping-particle&quot;:&quot;&quot;},{&quot;family&quot;:&quot;Moioli&quot;,&quot;given&quot;:&quot;Stefania&quot;,&quot;parse-names&quot;:false,&quot;dropping-particle&quot;:&quot;&quot;,&quot;non-dropping-particle&quot;:&quot;&quot;},{&quot;family&quot;:&quot;Huttenhuis&quot;,&quot;given&quot;:&quot;Patrick&quot;,&quot;parse-names&quot;:false,&quot;dropping-particle&quot;:&quot;&quot;,&quot;non-dropping-particle&quot;:&quot;&quot;},{&quot;family&quot;:&quot;Rexwinkel&quot;,&quot;given&quot;:&quot;Glenn&quot;,&quot;parse-names&quot;:false,&quot;dropping-particle&quot;:&quot;&quot;,&quot;non-dropping-particle&quot;:&quot;&quot;},{&quot;family&quot;:&quot;Martelli&quot;,&quot;given&quot;:&quot;Emanuele&quot;,&quot;parse-names&quot;:false,&quot;dropping-particle&quot;:&quot;&quot;,&quot;non-dropping-particle&quot;:&quot;&quot;},{&quot;family&quot;:&quot;Groppi&quot;,&quot;given&quot;:&quot;Gianpiero&quot;,&quot;parse-names&quot;:false,&quot;dropping-particle&quot;:&quot;&quot;,&quot;non-dropping-particle&quot;:&quot;&quot;},{&quot;family&quot;:&quot;Romano&quot;,&quot;given&quot;:&quot;Matteo C.&quot;,&quot;parse-names&quot;:false,&quot;dropping-particle&quot;:&quot;&quot;,&quot;non-dropping-particle&quot;:&quot;&quot;}],&quot;container-title&quot;:&quot;Fuel&quot;,&quot;DOI&quot;:&quot;10.1016/j.fuel.2021.122113&quot;,&quot;ISSN&quot;:&quot;00162361&quot;,&quot;issued&quot;:{&quot;date-parts&quot;:[[2022,2]]},&quot;page&quot;:&quot;122113&quot;,&quot;volume&quot;:&quot;310&quot;,&quot;container-title-short&quot;:&quot;&quot;},&quot;isTemporary&quot;:false}]},{&quot;citationID&quot;:&quot;MENDELEY_CITATION_a84a64c2-5cd9-45b5-8dd3-eed0901210e0&quot;,&quot;properties&quot;:{&quot;noteIndex&quot;:0},&quot;isEdited&quot;:false,&quot;manualOverride&quot;:{&quot;isManuallyOverridden&quot;:false,&quot;citeprocText&quot;:&quot;[25]&quot;,&quot;manualOverrideText&quot;:&quot;&quot;},&quot;citationTag&quot;:&quot;MENDELEY_CITATION_v3_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&quot;,&quot;citationItems&quot;:[{&quot;id&quot;:&quot;a332ee91-b343-3289-860a-430557bbc5fa&quot;,&quot;itemData&quot;:{&quot;type&quot;:&quot;article-journal&quot;,&quot;id&quot;:&quot;a332ee91-b343-3289-860a-430557bbc5fa&quot;,&quot;title&quot;:&quot;Flexible Power &amp;amp; Biomass-to-Methanol plants: Design optimization and economic viability of the electrolysis integration&quot;,&quot;author&quot;:[{&quot;family&quot;:&quot;Poluzzi&quot;,&quot;given&quot;:&quot;Alessandro&quot;,&quot;parse-names&quot;:false,&quot;dropping-particle&quot;:&quot;&quot;,&quot;non-dropping-particle&quot;:&quot;&quot;},{&quot;family&quot;:&quot;Guandalini&quot;,&quot;given&quot;:&quot;Giulio&quot;,&quot;parse-names&quot;:false,&quot;dropping-particle&quot;:&quot;&quot;,&quot;non-dropping-particle&quot;:&quot;&quot;},{&quot;family&quot;:&quot;Guffanti&quot;,&quot;given&quot;:&quot;Simone&quot;,&quot;parse-names&quot;:false,&quot;dropping-particle&quot;:&quot;&quot;,&quot;non-dropping-particle&quot;:&quot;&quot;},{&quot;family&quot;:&quot;Elsido&quot;,&quot;given&quot;:&quot;Cristina&quot;,&quot;parse-names&quot;:false,&quot;dropping-particle&quot;:&quot;&quot;,&quot;non-dropping-particle&quot;:&quot;&quot;},{&quot;family&quot;:&quot;Moioli&quot;,&quot;given&quot;:&quot;Stefania&quot;,&quot;parse-names&quot;:false,&quot;dropping-particle&quot;:&quot;&quot;,&quot;non-dropping-particle&quot;:&quot;&quot;},{&quot;family&quot;:&quot;Huttenhuis&quot;,&quot;given&quot;:&quot;Patrick&quot;,&quot;parse-names&quot;:false,&quot;dropping-particle&quot;:&quot;&quot;,&quot;non-dropping-particle&quot;:&quot;&quot;},{&quot;family&quot;:&quot;Rexwinkel&quot;,&quot;given&quot;:&quot;Glenn&quot;,&quot;parse-names&quot;:false,&quot;dropping-particle&quot;:&quot;&quot;,&quot;non-dropping-particle&quot;:&quot;&quot;},{&quot;family&quot;:&quot;Martelli&quot;,&quot;given&quot;:&quot;Emanuele&quot;,&quot;parse-names&quot;:false,&quot;dropping-particle&quot;:&quot;&quot;,&quot;non-dropping-particle&quot;:&quot;&quot;},{&quot;family&quot;:&quot;Groppi&quot;,&quot;given&quot;:&quot;Gianpiero&quot;,&quot;parse-names&quot;:false,&quot;dropping-particle&quot;:&quot;&quot;,&quot;non-dropping-particle&quot;:&quot;&quot;},{&quot;family&quot;:&quot;Romano&quot;,&quot;given&quot;:&quot;Matteo C.&quot;,&quot;parse-names&quot;:false,&quot;dropping-particle&quot;:&quot;&quot;,&quot;non-dropping-particle&quot;:&quot;&quot;}],&quot;container-title&quot;:&quot;Fuel&quot;,&quot;DOI&quot;:&quot;10.1016/j.fuel.2021.122113&quot;,&quot;ISSN&quot;:&quot;00162361&quot;,&quot;issued&quot;:{&quot;date-parts&quot;:[[2022,2]]},&quot;page&quot;:&quot;122113&quot;,&quot;volume&quot;:&quot;310&quot;,&quot;container-title-short&quot;:&quot;&quot;},&quot;isTemporary&quot;:false}]},{&quot;citationID&quot;:&quot;MENDELEY_CITATION_8c83e7a2-71cf-4160-9fdd-2510731786cf&quot;,&quot;properties&quot;:{&quot;noteIndex&quot;:0},&quot;isEdited&quot;:false,&quot;manualOverride&quot;:{&quot;isManuallyOverridden&quot;:false,&quot;citeprocText&quot;:&quot;[21]&quot;,&quot;manualOverrideText&quot;:&quot;&quot;},&quot;citationTag&quot;:&quot;MENDELEY_CITATION_v3_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&quot;,&quot;citationItems&quot;:[{&quot;id&quot;:&quot;70edddc8-ee03-31fd-86e6-6cf7a4858b7a&quot;,&quot;itemData&quot;:{&quot;type&quot;:&quot;article-journal&quot;,&quot;id&quot;:&quot;70edddc8-ee03-31fd-86e6-6cf7a4858b7a&quot;,&quot;title&quot;:&quot;Flexible Power and Biomass-To-Methanol Plants With Different Gasification Technologies&quot;,&quot;author&quot;:[{&quot;family&quot;:&quot;Poluzzi&quot;,&quot;given&quot;:&quot;A.&quot;,&quot;parse-names&quot;:false,&quot;dropping-particle&quot;:&quot;&quot;,&quot;non-dropping-particle&quot;:&quot;&quot;},{&quot;family&quot;:&quot;Guandalini&quot;,&quot;given&quot;:&quot;G.&quot;,&quot;parse-names&quot;:false,&quot;dropping-particle&quot;:&quot;&quot;,&quot;non-dropping-particle&quot;:&quot;&quot;},{&quot;family&quot;:&quot;Guffanti&quot;,&quot;given&quot;:&quot;S.&quot;,&quot;parse-names&quot;:false,&quot;dropping-particle&quot;:&quot;&quot;,&quot;non-dropping-particle&quot;:&quot;&quot;},{&quot;family&quot;:&quot;Martinelli&quot;,&quot;given&quot;:&quot;M.&quot;,&quot;parse-names&quot;:false,&quot;dropping-particle&quot;:&quot;&quot;,&quot;non-dropping-particle&quot;:&quot;&quot;},{&quot;family&quot;:&quot;Moioli&quot;,&quot;given&quot;:&quot;S.&quot;,&quot;parse-names&quot;:false,&quot;dropping-particle&quot;:&quot;&quot;,&quot;non-dropping-particle&quot;:&quot;&quot;},{&quot;family&quot;:&quot;Huttenhuis&quot;,&quot;given&quot;:&quot;P.&quot;,&quot;parse-names&quot;:false,&quot;dropping-particle&quot;:&quot;&quot;,&quot;non-dropping-particle&quot;:&quot;&quot;},{&quot;family&quot;:&quot;Rexwinkel&quot;,&quot;given&quot;:&quot;G.&quot;,&quot;parse-names&quot;:false,&quot;dropping-particle&quot;:&quot;&quot;,&quot;non-dropping-particle&quot;:&quot;&quot;},{&quot;family&quot;:&quot;Palonen&quot;,&quot;given&quot;:&quot;J.&quot;,&quot;parse-names&quot;:false,&quot;dropping-particle&quot;:&quot;&quot;,&quot;non-dropping-particle&quot;:&quot;&quot;},{&quot;family&quot;:&quot;Martelli&quot;,&quot;given&quot;:&quot;E.&quot;,&quot;parse-names&quot;:false,&quot;dropping-particle&quot;:&quot;&quot;,&quot;non-dropping-particle&quot;:&quot;&quot;},{&quot;family&quot;:&quot;Groppi&quot;,&quot;given&quot;:&quot;G.&quot;,&quot;parse-names&quot;:false,&quot;dropping-particle&quot;:&quot;&quot;,&quot;non-dropping-particle&quot;:&quot;&quot;},{&quot;family&quot;:&quot;Romano&quot;,&quot;given&quot;:&quot;M. C.&quot;,&quot;parse-names&quot;:false,&quot;dropping-particle&quot;:&quot;&quot;,&quot;non-dropping-particle&quot;:&quot;&quot;}],&quot;container-title&quot;:&quot;Frontiers in Energy Research&quot;,&quot;DOI&quot;:&quot;10.3389/fenrg.2021.795673&quot;,&quot;ISSN&quot;:&quot;2296-598X&quot;,&quot;issued&quot;:{&quot;date-parts&quot;:[[2022,1,27]]},&quot;abstract&quot;:&quot;&lt;p&gt; The competitiveness of biofuels may be increased by integrating biomass gasification plants with electrolysis units, which generate hydrogen to be combined with carbon-rich syngas. This option allows increasing the yield of the final product by retaining a higher amount of biogenic carbon and improving the resilience of the energy sector by favoring electric grid services and sector coupling. This article illustrates a techno-economic comparative analysis of three flexible power and biomass to methanol plants based on different gasification technologies: direct gasification, indirect gasification, and sorption-enhanced gasification. The design and operational criteria of each plant are conceived to operate both without green hydrogen addition (baseline mode) and with hydrogen addition (enhanced mode), following an intermittent use of the electrolysis system, which is turned on when the electricity price allows an economically viable hydrogen production. The methanol production plants include a gasification section, syngas cleaning, conditioning and compression section, methanol synthesis and purification, and heat recovery steam cycle to be flexibly operated. Due to the high oxygen demand in the gasifier, the direct gasification-based plant obtains a great advantage to be operated between a minimum load to satisfy the oxygen demand at high electricity prices and a maximum load to maximize methanol production at low electricity prices. This allows avoiding large oxygen storages with significant benefits for Capex and safety issues. The analysis reports specific fixed-capital investments between 1823 and 2048 €/kW of methanol output in the enhanced operation and LCOFs between 29.7 and 31.7 €/GJ &lt;sub&gt;LHV&lt;/sub&gt; . Economic advantages may be derived from a decrease in the electrolysis capital investment, especially for the direct gasification-based plants, which employ the greatest sized electrolyzer. Methanol breakeven selling prices range between 545 and 582 €/t with the 2019 reference Denmark electricity price curve and between 484 and 535 €/t with an assumed modified electricity price curve of a future energy mix with increased penetration of intermittent renewables. &lt;/p&gt;&quot;,&quot;volume&quot;:&quot;9&quot;,&quot;container-title-short&quot;:&quot;Front. Energy Res.&quot;},&quot;isTemporary&quot;:false}]},{&quot;citationID&quot;:&quot;MENDELEY_CITATION_e2d98fbf-79a4-429b-9796-2be5c079023d&quot;,&quot;properties&quot;:{&quot;noteIndex&quot;:0},&quot;isEdited&quot;:false,&quot;manualOverride&quot;:{&quot;isManuallyOverridden&quot;:false,&quot;citeprocText&quot;:&quot;[25]&quot;,&quot;manualOverrideText&quot;:&quot;&quot;},&quot;citationTag&quot;:&quot;MENDELEY_CITATION_v3_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&quot;,&quot;citationItems&quot;:[{&quot;id&quot;:&quot;a332ee91-b343-3289-860a-430557bbc5fa&quot;,&quot;itemData&quot;:{&quot;type&quot;:&quot;article-journal&quot;,&quot;id&quot;:&quot;a332ee91-b343-3289-860a-430557bbc5fa&quot;,&quot;title&quot;:&quot;Flexible Power &amp;amp; Biomass-to-Methanol plants: Design optimization and economic viability of the electrolysis integration&quot;,&quot;author&quot;:[{&quot;family&quot;:&quot;Poluzzi&quot;,&quot;given&quot;:&quot;Alessandro&quot;,&quot;parse-names&quot;:false,&quot;dropping-particle&quot;:&quot;&quot;,&quot;non-dropping-particle&quot;:&quot;&quot;},{&quot;family&quot;:&quot;Guandalini&quot;,&quot;given&quot;:&quot;Giulio&quot;,&quot;parse-names&quot;:false,&quot;dropping-particle&quot;:&quot;&quot;,&quot;non-dropping-particle&quot;:&quot;&quot;},{&quot;family&quot;:&quot;Guffanti&quot;,&quot;given&quot;:&quot;Simone&quot;,&quot;parse-names&quot;:false,&quot;dropping-particle&quot;:&quot;&quot;,&quot;non-dropping-particle&quot;:&quot;&quot;},{&quot;family&quot;:&quot;Elsido&quot;,&quot;given&quot;:&quot;Cristina&quot;,&quot;parse-names&quot;:false,&quot;dropping-particle&quot;:&quot;&quot;,&quot;non-dropping-particle&quot;:&quot;&quot;},{&quot;family&quot;:&quot;Moioli&quot;,&quot;given&quot;:&quot;Stefania&quot;,&quot;parse-names&quot;:false,&quot;dropping-particle&quot;:&quot;&quot;,&quot;non-dropping-particle&quot;:&quot;&quot;},{&quot;family&quot;:&quot;Huttenhuis&quot;,&quot;given&quot;:&quot;Patrick&quot;,&quot;parse-names&quot;:false,&quot;dropping-particle&quot;:&quot;&quot;,&quot;non-dropping-particle&quot;:&quot;&quot;},{&quot;family&quot;:&quot;Rexwinkel&quot;,&quot;given&quot;:&quot;Glenn&quot;,&quot;parse-names&quot;:false,&quot;dropping-particle&quot;:&quot;&quot;,&quot;non-dropping-particle&quot;:&quot;&quot;},{&quot;family&quot;:&quot;Martelli&quot;,&quot;given&quot;:&quot;Emanuele&quot;,&quot;parse-names&quot;:false,&quot;dropping-particle&quot;:&quot;&quot;,&quot;non-dropping-particle&quot;:&quot;&quot;},{&quot;family&quot;:&quot;Groppi&quot;,&quot;given&quot;:&quot;Gianpiero&quot;,&quot;parse-names&quot;:false,&quot;dropping-particle&quot;:&quot;&quot;,&quot;non-dropping-particle&quot;:&quot;&quot;},{&quot;family&quot;:&quot;Romano&quot;,&quot;given&quot;:&quot;Matteo C.&quot;,&quot;parse-names&quot;:false,&quot;dropping-particle&quot;:&quot;&quot;,&quot;non-dropping-particle&quot;:&quot;&quot;}],&quot;container-title&quot;:&quot;Fuel&quot;,&quot;DOI&quot;:&quot;10.1016/j.fuel.2021.122113&quot;,&quot;ISSN&quot;:&quot;00162361&quot;,&quot;issued&quot;:{&quot;date-parts&quot;:[[2022,2]]},&quot;page&quot;:&quot;122113&quot;,&quot;volume&quot;:&quot;310&quot;,&quot;container-title-short&quot;:&quot;&quot;},&quot;isTemporary&quot;:false}]},{&quot;citationID&quot;:&quot;MENDELEY_CITATION_b7c42850-3893-430a-a91a-ba071b5a549f&quot;,&quot;properties&quot;:{&quot;noteIndex&quot;:0},&quot;isEdited&quot;:false,&quot;manualOverride&quot;:{&quot;isManuallyOverridden&quot;:false,&quot;citeprocText&quot;:&quot;[26]&quot;,&quot;manualOverrideText&quot;:&quot;&quot;},&quot;citationTag&quot;:&quot;MENDELEY_CITATION_v3_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&quot;,&quot;citationItems&quot;:[{&quot;id&quot;:&quot;31848458-a34e-370b-af77-81d1d893a1c5&quot;,&quot;itemData&quot;:{&quot;type&quot;:&quot;article-journal&quot;,&quot;id&quot;:&quot;31848458-a34e-370b-af77-81d1d893a1c5&quot;,&quot;title&quot;:&quot;Deep Reinforcement Learning Approaches the MILP Optimum of a Multi-Energy Optimization in Energy Communities&quot;,&quot;author&quot;:[{&quot;family&quot;:&quot;Vetter&quot;,&quot;given&quot;:&quot;Vinzent&quot;,&quot;parse-names&quot;:false,&quot;dropping-particle&quot;:&quot;&quot;,&quot;non-dropping-particle&quot;:&quot;&quot;},{&quot;family&quot;:&quot;Wohlgenannt&quot;,&quot;given&quot;:&quot;Philipp&quot;,&quot;parse-names&quot;:false,&quot;dropping-particle&quot;:&quot;&quot;,&quot;non-dropping-particle&quot;:&quot;&quot;},{&quot;family&quot;:&quot;Kepplinger&quot;,&quot;given&quot;:&quot;Peter&quot;,&quot;parse-names&quot;:false,&quot;dropping-particle&quot;:&quot;&quot;,&quot;non-dropping-particle&quot;:&quot;&quot;},{&quot;family&quot;:&quot;Eder&quot;,&quot;given&quot;:&quot;Elias&quot;,&quot;parse-names&quot;:false,&quot;dropping-particle&quot;:&quot;&quot;,&quot;non-dropping-particle&quot;:&quot;&quot;}],&quot;container-title&quot;:&quot;Energies&quot;,&quot;container-title-short&quot;:&quot;Energies (Basel).&quot;,&quot;DOI&quot;:&quot;10.3390/en18174489&quot;,&quot;ISSN&quot;:&quot;1996-1073&quot;,&quot;issued&quot;:{&quot;date-parts&quot;:[[2025,8,23]]},&quot;page&quot;:&quot;4489&quot;,&quot;abstract&quot;:&quot;&lt;p&gt;As energy systems transition toward high shares of variable renewable generation, local energy communities (ECs) are increasingly relevant for enabling demand-side flexibility and self-sufficiency. This shift is particularly evident in the residential sector, where the deployment of photovoltaic (PV) systems is rapidly growing. While mixed-integer linear programming (MILP) remains the standard for operational optimization and demand response in such systems, its computational burden limits scalability and responsiveness under real-time or uncertain conditions. Reinforcement learning (RL), by contrast, offers a model-free, adaptive alternative. However, its application to real-world energy system operation remains limited. This study explores the application of a Deep Q-Network (DQN) to a real residential EC, which has received limited attention in prior work. The system comprises three single-family homes sharing a centralized heating system with a thermal energy storage (TES), a PV installation, and a grid connection. We compare the performance of MILP and RL controllers across economic and environmental metrics. Relative to a reference scenario without TES, MILP and RL reduce energy costs by 10.06% and 8.78%, respectively, and both approaches yield lower total energy consumption and CO2-equivalent emissions. Notably, the trained RL agent achieves a near-optimal outcome while requiring only 22% of the MILP’s computation time. These results demonstrate that DQNs can offer a computationally efficient and practically viable alternative to MILP for real-time control in residential energy systems.&lt;/p&gt;&quot;,&quot;issue&quot;:&quot;17&quot;,&quot;volume&quot;:&quot;18&quot;},&quot;isTemporary&quot;:false}]},{&quot;citationID&quot;:&quot;MENDELEY_CITATION_03d18768-2530-4173-a512-ec7dc06e4ecc&quot;,&quot;properties&quot;:{&quot;noteIndex&quot;:0},&quot;isEdited&quot;:false,&quot;manualOverride&quot;:{&quot;isManuallyOverridden&quot;:false,&quot;citeprocText&quot;:&quot;[27]&quot;,&quot;manualOverrideText&quot;:&quot;&quot;},&quot;citationTag&quot;:&quot;MENDELEY_CITATION_v3_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&quot;,&quot;citationItems&quot;:[{&quot;id&quot;:&quot;185586bd-ce77-3f7d-ae64-0f509db4cf05&quot;,&quot;itemData&quot;:{&quot;type&quot;:&quot;article-journal&quot;,&quot;id&quot;:&quot;185586bd-ce77-3f7d-ae64-0f509db4cf05&quot;,&quot;title&quot;:&quot;Energy Demand Response in a Food-Processing Plant: A Deep Reinforcement Learning Approach&quot;,&quot;author&quot;:[{&quot;family&quot;:&quot;Wohlgenannt&quot;,&quot;given&quot;:&quot;Philipp&quot;,&quot;parse-names&quot;:false,&quot;dropping-particle&quot;:&quot;&quot;,&quot;non-dropping-particle&quot;:&quot;&quot;},{&quot;family&quot;:&quot;Hegenbart&quot;,&quot;given&quot;:&quot;Sebastian&quot;,&quot;parse-names&quot;:false,&quot;dropping-particle&quot;:&quot;&quot;,&quot;non-dropping-particle&quot;:&quot;&quot;},{&quot;family&quot;:&quot;Eder&quot;,&quot;given&quot;:&quot;Elias&quot;,&quot;parse-names&quot;:false,&quot;dropping-particle&quot;:&quot;&quot;,&quot;non-dropping-particle&quot;:&quot;&quot;},{&quot;family&quot;:&quot;Kolhe&quot;,&quot;given&quot;:&quot;Mohan&quot;,&quot;parse-names&quot;:false,&quot;dropping-particle&quot;:&quot;&quot;,&quot;non-dropping-particle&quot;:&quot;&quot;},{&quot;family&quot;:&quot;Kepplinger&quot;,&quot;given&quot;:&quot;Peter&quot;,&quot;parse-names&quot;:false,&quot;dropping-particle&quot;:&quot;&quot;,&quot;non-dropping-particle&quot;:&quot;&quot;}],&quot;container-title&quot;:&quot;Energies&quot;,&quot;DOI&quot;:&quot;10.3390/en17246430&quot;,&quot;ISSN&quot;:&quot;1996-1073&quot;,&quot;issued&quot;:{&quot;date-parts&quot;:[[2024,12,20]]},&quot;page&quot;:&quot;6430&quot;,&quot;abstract&quot;:&quot;&lt;p&gt;The food industry faces significant challenges in managing operational costs due to its high energy intensity and rising energy prices. Industrial food-processing facilities, with substantial thermal capacities and large demands for cooling and heating, offer promising opportunities for demand response (DR) strategies. This study explores the application of deep reinforcement learning (RL) as an innovative, data-driven approach for DR in the food industry. By leveraging the adaptive, self-learning capabilities of RL, energy costs in the investigated plant are effectively decreased. The RL algorithm was compared with the well-established optimization method Mixed Integer Linear Programming (MILP), and both were benchmarked against a reference scenario without DR. The two optimization strategies demonstrate cost savings of 17.57% and 18.65% for RL and MILP, respectively. Although RL is slightly less efficient in cost reduction, it significantly outperforms in computational speed, being approximately 20 times faster. During operation, RL only needs 2ms per optimization compared to 19s for MILP, making it a promising optimization tool for edge computing. Moreover, while MILP’s computation time increases considerably with the number of binary variables, RL efficiently learns dynamic system behavior and scales to more complex systems without significant performance degradation. These results highlight that deep RL, when applied to DR, offers substantial cost savings and computational efficiency, with broad applicability to energy management in various applications.&lt;/p&gt;&quot;,&quot;issue&quot;:&quot;24&quot;,&quot;volume&quot;:&quot;17&quot;,&quot;container-title-short&quot;:&quot;Energies (Basel).&quot;},&quot;isTemporary&quot;:false}]},{&quot;citationID&quot;:&quot;MENDELEY_CITATION_d0ae8956-c2f2-4f72-9054-a8ca53b2504b&quot;,&quot;properties&quot;:{&quot;noteIndex&quot;:0},&quot;isEdited&quot;:false,&quot;manualOverride&quot;:{&quot;isManuallyOverridden&quot;:false,&quot;citeprocText&quot;:&quot;[28]&quot;,&quot;manualOverrideText&quot;:&quot;&quot;},&quot;citationTag&quot;:&quot;MENDELEY_CITATION_v3_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&quot;,&quot;citationItems&quot;:[{&quot;id&quot;:&quot;b510e037-8e3e-36b2-9b7f-53d097c80a2d&quot;,&quot;itemData&quot;:{&quot;type&quot;:&quot;article-journal&quot;,&quot;id&quot;:&quot;b510e037-8e3e-36b2-9b7f-53d097c80a2d&quot;,&quot;title&quot;:&quot;A comprehensive review on optimization of hybrid renewable energy systems using various optimization techniques&quot;,&quot;author&quot;:[{&quot;family&quot;:&quot;Thirunavukkarasu&quot;,&quot;given&quot;:&quot;M.&quot;,&quot;parse-names&quot;:false,&quot;dropping-particle&quot;:&quot;&quot;,&quot;non-dropping-particle&quot;:&quot;&quot;},{&quot;family&quot;:&quot;Sawle&quot;,&quot;given&quot;:&quot;Yashwant&quot;,&quot;parse-names&quot;:false,&quot;dropping-particle&quot;:&quot;&quot;,&quot;non-dropping-particle&quot;:&quot;&quot;},{&quot;family&quot;:&quot;Lala&quot;,&quot;given&quot;:&quot;Himadri&quot;,&quot;parse-names&quot;:false,&quot;dropping-particle&quot;:&quot;&quot;,&quot;non-dropping-particle&quot;:&quot;&quot;}],&quot;container-title&quot;:&quot;Renewable and Sustainable Energy Reviews&quot;,&quot;DOI&quot;:&quot;10.1016/j.rser.2023.113192&quot;,&quot;ISSN&quot;:&quot;13640321&quot;,&quot;issued&quot;:{&quot;date-parts&quot;:[[2023,4]]},&quot;page&quot;:&quot;113192&quot;,&quot;volume&quot;:&quot;176&quot;,&quot;container-title-short&quot;:&quot;&quot;},&quot;isTemporary&quot;:false}]},{&quot;citationID&quot;:&quot;MENDELEY_CITATION_b63a1021-7346-498d-adf3-73382c63a827&quot;,&quot;properties&quot;:{&quot;noteIndex&quot;:0},&quot;isEdited&quot;:false,&quot;manualOverride&quot;:{&quot;isManuallyOverridden&quot;:false,&quot;citeprocText&quot;:&quot;[29]&quot;,&quot;manualOverrideText&quot;:&quot;&quot;},&quot;citationTag&quot;:&quot;MENDELEY_CITATION_v3_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&quot;,&quot;citationItems&quot;:[{&quot;id&quot;:&quot;0f89bf4c-80d3-3ce8-8c18-b8917957c10b&quot;,&quot;itemData&quot;:{&quot;type&quot;:&quot;article-journal&quot;,&quot;id&quot;:&quot;0f89bf4c-80d3-3ce8-8c18-b8917957c10b&quot;,&quot;title&quot;:&quot;Optimal energy system scheduling using a constraint-aware reinforcement learning algorithm&quot;,&quot;author&quot;:[{&quot;family&quot;:&quot;Shengren&quot;,&quot;given&quot;:&quot;Hou&quot;,&quot;parse-names&quot;:false,&quot;dropping-particle&quot;:&quot;&quot;,&quot;non-dropping-particle&quot;:&quot;&quot;},{&quot;family&quot;:&quot;Vergara&quot;,&quot;given&quot;:&quot;Pedro P.&quot;,&quot;parse-names&quot;:false,&quot;dropping-particle&quot;:&quot;&quot;,&quot;non-dropping-particle&quot;:&quot;&quot;},{&quot;family&quot;:&quot;Salazar Duque&quot;,&quot;given&quot;:&quot;Edgar Mauricio&quot;,&quot;parse-names&quot;:false,&quot;dropping-particle&quot;:&quot;&quot;,&quot;non-dropping-particle&quot;:&quot;&quot;},{&quot;family&quot;:&quot;Palensky&quot;,&quot;given&quot;:&quot;Peter&quot;,&quot;parse-names&quot;:false,&quot;dropping-particle&quot;:&quot;&quot;,&quot;non-dropping-particle&quot;:&quot;&quot;}],&quot;container-title&quot;:&quot;International Journal of Electrical Power &amp; Energy Systems&quot;,&quot;DOI&quot;:&quot;10.1016/j.ijepes.2023.109230&quot;,&quot;ISSN&quot;:&quot;01420615&quot;,&quot;issued&quot;:{&quot;date-parts&quot;:[[2023,10]]},&quot;page&quot;:&quot;109230&quot;,&quot;volume&quot;:&quot;152&quot;,&quot;container-title-short&quot;:&quot;&quot;},&quot;isTemporary&quot;:false}]},{&quot;citationID&quot;:&quot;MENDELEY_CITATION_6d8a7862-c0c2-4c71-b5ea-7e17817e262d&quot;,&quot;properties&quot;:{&quot;noteIndex&quot;:0},&quot;isEdited&quot;:false,&quot;manualOverride&quot;:{&quot;isManuallyOverridden&quot;:false,&quot;citeprocText&quot;:&quot;[30]&quot;,&quot;manualOverrideText&quot;:&quot;&quot;},&quot;citationTag&quot;:&quot;MENDELEY_CITATION_v3_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&quot;,&quot;citationItems&quot;:[{&quot;id&quot;:&quot;32d54ec3-73fd-3a7d-a2b9-efadea2d2319&quot;,&quot;itemData&quot;:{&quot;type&quot;:&quot;article-journal&quot;,&quot;id&quot;:&quot;32d54ec3-73fd-3a7d-a2b9-efadea2d2319&quot;,&quot;title&quot;:&quot;A Review on Multi-Objective Mixed-Integer Non-Linear Optimization Programming Methods&quot;,&quot;author&quot;:[{&quot;family&quot;:&quot;Jaber&quot;,&quot;given&quot;:&quot;Ahmed&quot;,&quot;parse-names&quot;:false,&quot;dropping-particle&quot;:&quot;&quot;,&quot;non-dropping-particle&quot;:&quot;&quot;},{&quot;family&quot;:&quot;Younes&quot;,&quot;given&quot;:&quot;Rafic&quot;,&quot;parse-names&quot;:false,&quot;dropping-particle&quot;:&quot;&quot;,&quot;non-dropping-particle&quot;:&quot;&quot;},{&quot;family&quot;:&quot;Lafon&quot;,&quot;given&quot;:&quot;Pascal&quot;,&quot;parse-names&quot;:false,&quot;dropping-particle&quot;:&quot;&quot;,&quot;non-dropping-particle&quot;:&quot;&quot;},{&quot;family&quot;:&quot;Khoder&quot;,&quot;given&quot;:&quot;Jihan&quot;,&quot;parse-names&quot;:false,&quot;dropping-particle&quot;:&quot;&quot;,&quot;non-dropping-particle&quot;:&quot;&quot;}],&quot;container-title&quot;:&quot;Eng&quot;,&quot;DOI&quot;:&quot;10.3390/eng5030104&quot;,&quot;ISSN&quot;:&quot;2673-4117&quot;,&quot;issued&quot;:{&quot;date-parts&quot;:[[2024,8,17]]},&quot;page&quot;:&quot;1961-1979&quot;,&quot;abstract&quot;:&quot;&lt;p&gt;This paper provides a recent overview of the exact, approximate, and hybrid optimization methods that handle Multi-Objective Mixed-Integer Non-Linear Programming (MO-MINLP) problems. Both the domains of exact and approximate research have experienced significant growth, driven by their shared goal of addressing a wide range of real-world problems. This work presents a comprehensive literature review that highlights the significant theoretical contributions in the field of hybrid approaches between these research areas. We also point out possible research gaps in the literature. Hence, the main research questions to be answered in this paper involve the following: (1) how to exactly or approximately solve a MO-MINLP problem? (2) What are the drawbacks of exact methods as well as approximate methods? (3) What are the research lines that are currently underway to enhance the performances of these methods? and (4) Where are the research gaps in this field? This work aims to provide enough descriptive information for newcomers in this area about the research that has been carried out and that is currently underway concerning exact, approximate, and hybrid methods used to solve MO-MINLP problems.&lt;/p&gt;&quot;,&quot;issue&quot;:&quot;3&quot;,&quot;volume&quot;:&quot;5&quot;,&quot;container-title-short&quot;:&quot;&quot;},&quot;isTemporary&quot;:false}]},{&quot;citationID&quot;:&quot;MENDELEY_CITATION_43edfd88-7e00-44e3-af12-138762045627&quot;,&quot;properties&quot;:{&quot;noteIndex&quot;:0},&quot;isEdited&quot;:false,&quot;manualOverride&quot;:{&quot;isManuallyOverridden&quot;:false,&quot;citeprocText&quot;:&quot;[31]&quot;,&quot;manualOverrideText&quot;:&quot;&quot;},&quot;citationTag&quot;:&quot;MENDELEY_CITATION_v3_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&quot;,&quot;citationItems&quot;:[{&quot;id&quot;:&quot;3491985c-2e0b-31bc-84e8-6823f88df629&quot;,&quot;itemData&quot;:{&quot;type&quot;:&quot;article-journal&quot;,&quot;id&quot;:&quot;3491985c-2e0b-31bc-84e8-6823f88df629&quot;,&quot;title&quot;:&quot;Multi-objective stochastic optimization problem: a systematic literature review&quot;,&quot;author&quot;:[{&quot;family&quot;:&quot;Pirouz&quot;,&quot;given&quot;:&quot;Behzad&quot;,&quot;parse-names&quot;:false,&quot;dropping-particle&quot;:&quot;&quot;,&quot;non-dropping-particle&quot;:&quot;&quot;},{&quot;family&quot;:&quot;Guerriero&quot;,&quot;given&quot;:&quot;Francesca&quot;,&quot;parse-names&quot;:false,&quot;dropping-particle&quot;:&quot;&quot;,&quot;non-dropping-particle&quot;:&quot;&quot;}],&quot;container-title&quot;:&quot;Applied Energy&quot;,&quot;DOI&quot;:&quot;10.1016/j.apenergy.2025.127237&quot;,&quot;ISSN&quot;:&quot;03062619&quot;,&quot;issued&quot;:{&quot;date-parts&quot;:[[2026,2]]},&quot;page&quot;:&quot;127237&quot;,&quot;volume&quot;:&quot;405&quot;,&quot;container-title-short&quot;:&quot;Appl. Energy&quot;},&quot;isTemporary&quot;:false}]},{&quot;citationID&quot;:&quot;MENDELEY_CITATION_b6249101-b808-40c8-a033-78980999aeb7&quot;,&quot;properties&quot;:{&quot;noteIndex&quot;:0},&quot;isEdited&quot;:false,&quot;manualOverride&quot;:{&quot;isManuallyOverridden&quot;:false,&quot;citeprocText&quot;:&quot;[32]&quot;,&quot;manualOverrideText&quot;:&quot;&quot;},&quot;citationTag&quot;:&quot;MENDELEY_CITATION_v3_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&quot;,&quot;citationItems&quot;:[{&quot;id&quot;:&quot;54e38a01-fa83-3801-a318-6f19e94cb79c&quot;,&quot;itemData&quot;:{&quot;type&quot;:&quot;article-journal&quot;,&quot;id&quot;:&quot;54e38a01-fa83-3801-a318-6f19e94cb79c&quot;,&quot;title&quot;:&quot;A review on recent standalone and grid integrated hybrid renewable energy systems: System optimization and energy management strategies&quot;,&quot;author&quot;:[{&quot;family&quot;:&quot;Basnet&quot;,&quot;given&quot;:&quot;Sarad&quot;,&quot;parse-names&quot;:false,&quot;dropping-particle&quot;:&quot;&quot;,&quot;non-dropping-particle&quot;:&quot;&quot;},{&quot;family&quot;:&quot;Deschinkel&quot;,&quot;given&quot;:&quot;Karine&quot;,&quot;parse-names&quot;:false,&quot;dropping-particle&quot;:&quot;&quot;,&quot;non-dropping-particle&quot;:&quot;&quot;},{&quot;family&quot;:&quot;Moyne&quot;,&quot;given&quot;:&quot;Luis&quot;,&quot;parse-names&quot;:false,&quot;dropping-particle&quot;:&quot;&quot;,&quot;non-dropping-particle&quot;:&quot;Le&quot;},{&quot;family&quot;:&quot;Cécile Péra&quot;,&quot;given&quot;:&quot;Marie&quot;,&quot;parse-names&quot;:false,&quot;dropping-particle&quot;:&quot;&quot;,&quot;non-dropping-particle&quot;:&quot;&quot;}],&quot;container-title&quot;:&quot;Renewable Energy Focus&quot;,&quot;DOI&quot;:&quot;10.1016/j.ref.2023.06.001&quot;,&quot;ISSN&quot;:&quot;17550084&quot;,&quot;issued&quot;:{&quot;date-parts&quot;:[[2023,9]]},&quot;page&quot;:&quot;103-125&quot;,&quot;volume&quot;:&quot;46&quot;,&quot;container-title-short&quot;:&quot;&quot;},&quot;isTemporary&quot;:false}]},{&quot;citationID&quot;:&quot;MENDELEY_CITATION_9c9f6d6b-0d28-4cda-88a9-65954fd94b49&quot;,&quot;properties&quot;:{&quot;noteIndex&quot;:0},&quot;isEdited&quot;:false,&quot;manualOverride&quot;:{&quot;isManuallyOverridden&quot;:false,&quot;citeprocText&quot;:&quot;[33]&quot;,&quot;manualOverrideText&quot;:&quot;&quot;},&quot;citationTag&quot;:&quot;MENDELEY_CITATION_v3_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&quot;,&quot;citationItems&quot;:[{&quot;id&quot;:&quot;a7dd1c28-2105-373b-8623-5d74e7cdc012&quot;,&quot;itemData&quot;:{&quot;type&quot;:&quot;article-journal&quot;,&quot;id&quot;:&quot;a7dd1c28-2105-373b-8623-5d74e7cdc012&quot;,&quot;title&quot;:&quot;A Survey on Mixed-Integer Programming Techniques in Bilevel Optimization&quot;,&quot;author&quot;:[{&quot;family&quot;:&quot;Kleinert&quot;,&quot;given&quot;:&quot;Thomas&quot;,&quot;parse-names&quot;:false,&quot;dropping-particle&quot;:&quot;&quot;,&quot;non-dropping-particle&quot;:&quot;&quot;},{&quot;family&quot;:&quot;Labbé&quot;,&quot;given&quot;:&quot;Martine&quot;,&quot;parse-names&quot;:false,&quot;dropping-particle&quot;:&quot;&quot;,&quot;non-dropping-particle&quot;:&quot;&quot;},{&quot;family&quot;:&quot;Ljubić&quot;,&quot;given&quot;:&quot;Ivana&quot;,&quot;parse-names&quot;:false,&quot;dropping-particle&quot;:&quot;&quot;,&quot;non-dropping-particle&quot;:&quot;&quot;},{&quot;family&quot;:&quot;Schmidt&quot;,&quot;given&quot;:&quot;Martin&quot;,&quot;parse-names&quot;:false,&quot;dropping-particle&quot;:&quot;&quot;,&quot;non-dropping-particle&quot;:&quot;&quot;}],&quot;container-title&quot;:&quot;EURO Journal on Computational Optimization&quot;,&quot;DOI&quot;:&quot;10.1016/j.ejco.2021.100007&quot;,&quot;ISSN&quot;:&quot;21924406&quot;,&quot;issued&quot;:{&quot;date-parts&quot;:[[2021]]},&quot;page&quot;:&quot;100007&quot;,&quot;volume&quot;:&quot;9&quot;,&quot;container-title-short&quot;:&quot;&quot;},&quot;isTemporary&quot;:false}]},{&quot;citationID&quot;:&quot;MENDELEY_CITATION_33ef091a-ded0-4a74-8b85-848522b9880f&quot;,&quot;properties&quot;:{&quot;noteIndex&quot;:0},&quot;isEdited&quot;:false,&quot;manualOverride&quot;:{&quot;isManuallyOverridden&quot;:false,&quot;citeprocText&quot;:&quot;[32], [33], [34], [35]&quot;,&quot;manualOverrideText&quot;:&quot;&quot;},&quot;citationTag&quot;:&quot;MENDELEY_CITATION_v3_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&quot;,&quot;citationItems&quot;:[{&quot;id&quot;:&quot;f5b03336-6a29-3705-ac39-a115ab7d476b&quot;,&quot;itemData&quot;:{&quot;type&quot;:&quot;article-journal&quot;,&quot;id&quot;:&quot;f5b03336-6a29-3705-ac39-a115ab7d476b&quot;,&quot;title&quot;:&quot;Recent advances in mathematical programming techniques for the optimization of process systems under uncertainty&quot;,&quot;author&quot;:[{&quot;family&quot;:&quot;Grossmann&quot;,&quot;given&quot;:&quot;Ignacio E.&quot;,&quot;parse-names&quot;:false,&quot;dropping-particle&quot;:&quot;&quot;,&quot;non-dropping-particle&quot;:&quot;&quot;},{&quot;family&quot;:&quot;Apap&quot;,&quot;given&quot;:&quot;Robert M.&quot;,&quot;parse-names&quot;:false,&quot;dropping-particle&quot;:&quot;&quot;,&quot;non-dropping-particle&quot;:&quot;&quot;},{&quot;family&quot;:&quot;Calfa&quot;,&quot;given&quot;:&quot;Bruno A.&quot;,&quot;parse-names&quot;:false,&quot;dropping-particle&quot;:&quot;&quot;,&quot;non-dropping-particle&quot;:&quot;&quot;},{&quot;family&quot;:&quot;García-Herreros&quot;,&quot;given&quot;:&quot;Pablo&quot;,&quot;parse-names&quot;:false,&quot;dropping-particle&quot;:&quot;&quot;,&quot;non-dropping-particle&quot;:&quot;&quot;},{&quot;family&quot;:&quot;Zhang&quot;,&quot;given&quot;:&quot;Qi&quot;,&quot;parse-names&quot;:false,&quot;dropping-particle&quot;:&quot;&quot;,&quot;non-dropping-particle&quot;:&quot;&quot;}],&quot;container-title&quot;:&quot;Computers &amp; Chemical Engineering&quot;,&quot;DOI&quot;:&quot;10.1016/j.compchemeng.2016.03.002&quot;,&quot;ISSN&quot;:&quot;00981354&quot;,&quot;issued&quot;:{&quot;date-parts&quot;:[[2016,8]]},&quot;page&quot;:&quot;3-14&quot;,&quot;volume&quot;:&quot;91&quot;,&quot;container-title-short&quot;:&quot;Comput. Chem. Eng.&quot;},&quot;isTemporary&quot;:false},{&quot;id&quot;:&quot;1c837bc1-1688-320b-9cef-676437130233&quot;,&quot;itemData&quot;:{&quot;type&quot;:&quot;article-journal&quot;,&quot;id&quot;:&quot;1c837bc1-1688-320b-9cef-676437130233&quot;,&quot;title&quot;:&quot;A Review of Stochastic Programming Methods for Optimization of Process Systems Under Uncertainty&quot;,&quot;author&quot;:[{&quot;family&quot;:&quot;Li&quot;,&quot;given&quot;:&quot;Can&quot;,&quot;parse-names&quot;:false,&quot;dropping-particle&quot;:&quot;&quot;,&quot;non-dropping-particle&quot;:&quot;&quot;},{&quot;family&quot;:&quot;Grossmann&quot;,&quot;given&quot;:&quot;Ignacio E.&quot;,&quot;parse-names&quot;:false,&quot;dropping-particle&quot;:&quot;&quot;,&quot;non-dropping-particle&quot;:&quot;&quot;}],&quot;container-title&quot;:&quot;Frontiers in Chemical Engineering&quot;,&quot;DOI&quot;:&quot;10.3389/fceng.2020.622241&quot;,&quot;ISSN&quot;:&quot;2673-2718&quot;,&quot;issued&quot;:{&quot;date-parts&quot;:[[2021,1,28]]},&quot;abstract&quot;:&quot;&lt;p&gt;Uncertainties are widespread in the optimization of process systems, such as uncertainties in process technologies, prices, and customer demands. In this paper, we review the basic concepts and recent advances of a risk-neutral mathematical framework called “stochastic programming” and its applications in solving process systems engineering problems under uncertainty. This review intends to provide both a tutorial for beginners without prior experience and a high-level overview of the current state-of-the-art developments for experts in process systems engineering and stochastic programming. The mathematical formulations and algorithms for two-stage and multistage stochastic programming are reviewed with illustrative examples from process industries. The differences between stochastic programming under exogenous uncertainty and endogenous uncertainties are discussed. The concepts and several data-driven methods for generating scenario trees are also reviewed.&lt;/p&gt;&quot;,&quot;volume&quot;:&quot;2&quot;,&quot;container-title-short&quot;:&quot;&quot;},&quot;isTemporary&quot;:false},{&quot;id&quot;:&quot;a7dd1c28-2105-373b-8623-5d74e7cdc012&quot;,&quot;itemData&quot;:{&quot;type&quot;:&quot;article-journal&quot;,&quot;id&quot;:&quot;a7dd1c28-2105-373b-8623-5d74e7cdc012&quot;,&quot;title&quot;:&quot;A Survey on Mixed-Integer Programming Techniques in Bilevel Optimization&quot;,&quot;author&quot;:[{&quot;family&quot;:&quot;Kleinert&quot;,&quot;given&quot;:&quot;Thomas&quot;,&quot;parse-names&quot;:false,&quot;dropping-particle&quot;:&quot;&quot;,&quot;non-dropping-particle&quot;:&quot;&quot;},{&quot;family&quot;:&quot;Labbé&quot;,&quot;given&quot;:&quot;Martine&quot;,&quot;parse-names&quot;:false,&quot;dropping-particle&quot;:&quot;&quot;,&quot;non-dropping-particle&quot;:&quot;&quot;},{&quot;family&quot;:&quot;Ljubić&quot;,&quot;given&quot;:&quot;Ivana&quot;,&quot;parse-names&quot;:false,&quot;dropping-particle&quot;:&quot;&quot;,&quot;non-dropping-particle&quot;:&quot;&quot;},{&quot;family&quot;:&quot;Schmidt&quot;,&quot;given&quot;:&quot;Martin&quot;,&quot;parse-names&quot;:false,&quot;dropping-particle&quot;:&quot;&quot;,&quot;non-dropping-particle&quot;:&quot;&quot;}],&quot;container-title&quot;:&quot;EURO Journal on Computational Optimization&quot;,&quot;DOI&quot;:&quot;10.1016/j.ejco.2021.100007&quot;,&quot;ISSN&quot;:&quot;21924406&quot;,&quot;issued&quot;:{&quot;date-parts&quot;:[[2021]]},&quot;page&quot;:&quot;100007&quot;,&quot;volume&quot;:&quot;9&quot;,&quot;container-title-short&quot;:&quot;&quot;},&quot;isTemporary&quot;:false},{&quot;id&quot;:&quot;54e38a01-fa83-3801-a318-6f19e94cb79c&quot;,&quot;itemData&quot;:{&quot;type&quot;:&quot;article-journal&quot;,&quot;id&quot;:&quot;54e38a01-fa83-3801-a318-6f19e94cb79c&quot;,&quot;title&quot;:&quot;A review on recent standalone and grid integrated hybrid renewable energy systems: System optimization and energy management strategies&quot;,&quot;author&quot;:[{&quot;family&quot;:&quot;Basnet&quot;,&quot;given&quot;:&quot;Sarad&quot;,&quot;parse-names&quot;:false,&quot;dropping-particle&quot;:&quot;&quot;,&quot;non-dropping-particle&quot;:&quot;&quot;},{&quot;family&quot;:&quot;Deschinkel&quot;,&quot;given&quot;:&quot;Karine&quot;,&quot;parse-names&quot;:false,&quot;dropping-particle&quot;:&quot;&quot;,&quot;non-dropping-particle&quot;:&quot;&quot;},{&quot;family&quot;:&quot;Moyne&quot;,&quot;given&quot;:&quot;Luis&quot;,&quot;parse-names&quot;:false,&quot;dropping-particle&quot;:&quot;&quot;,&quot;non-dropping-particle&quot;:&quot;Le&quot;},{&quot;family&quot;:&quot;Cécile Péra&quot;,&quot;given&quot;:&quot;Marie&quot;,&quot;parse-names&quot;:false,&quot;dropping-particle&quot;:&quot;&quot;,&quot;non-dropping-particle&quot;:&quot;&quot;}],&quot;container-title&quot;:&quot;Renewable Energy Focus&quot;,&quot;DOI&quot;:&quot;10.1016/j.ref.2023.06.001&quot;,&quot;ISSN&quot;:&quot;17550084&quot;,&quot;issued&quot;:{&quot;date-parts&quot;:[[2023,9]]},&quot;page&quot;:&quot;103-125&quot;,&quot;volume&quot;:&quot;46&quot;,&quot;container-title-short&quot;:&quot;&quot;},&quot;isTemporary&quot;:false}]},{&quot;citationID&quot;:&quot;MENDELEY_CITATION_4a4c6769-de4f-4723-ad1a-7b324cf3f736&quot;,&quot;properties&quot;:{&quot;noteIndex&quot;:0},&quot;isEdited&quot;:false,&quot;manualOverride&quot;:{&quot;isManuallyOverridden&quot;:false,&quot;citeprocText&quot;:&quot;[36]&quot;,&quot;manualOverrideText&quot;:&quot;&quot;},&quot;citationTag&quot;:&quot;MENDELEY_CITATION_v3_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&quot;,&quot;citationItems&quot;:[{&quot;id&quot;:&quot;657631e7-7854-321d-9660-90161531164b&quot;,&quot;itemData&quot;:{&quot;type&quot;:&quot;article-journal&quot;,&quot;id&quot;:&quot;657631e7-7854-321d-9660-90161531164b&quot;,&quot;title&quot;:&quot;Integrating multi-objective superstructure optimization and multi-criteria assessment: a novel methodology for sustainable process design&quot;,&quot;author&quot;:[{&quot;family&quot;:&quot;Kenkel&quot;,&quot;given&quot;:&quot;Philipp&quot;,&quot;parse-names&quot;:false,&quot;dropping-particle&quot;:&quot;&quot;,&quot;non-dropping-particle&quot;:&quot;&quot;},{&quot;family&quot;:&quot;Schnuelle&quot;,&quot;given&quot;:&quot;Christian&quot;,&quot;parse-names&quot;:false,&quot;dropping-particle&quot;:&quot;&quot;,&quot;non-dropping-particle&quot;:&quot;&quot;},{&quot;family&quot;:&quot;Wassermann&quot;,&quot;given&quot;:&quot;Timo&quot;,&quot;parse-names&quot;:false,&quot;dropping-particle&quot;:&quot;&quot;,&quot;non-dropping-particle&quot;:&quot;&quot;},{&quot;family&quot;:&quot;Zondervan&quot;,&quot;given&quot;:&quot;Edwin&quot;,&quot;parse-names&quot;:false,&quot;dropping-particle&quot;:&quot;&quot;,&quot;non-dropping-particle&quot;:&quot;&quot;}],&quot;container-title&quot;:&quot;Physical Sciences Reviews&quot;,&quot;DOI&quot;:&quot;10.1515/psr-2020-0058&quot;,&quot;ISSN&quot;:&quot;2365-659X&quot;,&quot;issued&quot;:{&quot;date-parts&quot;:[[2023,9,25]]},&quot;page&quot;:&quot;2361-2394&quot;,&quot;abstract&quot;:&quot;&lt;p&gt; This work presents a novel methodology for integrated multi-objective superstructure optimization and multi-criteria assessment. The method is tailored for sustainable process synthesis utilizing mixed-integer linear programming (MILP). The six-step algorithm includes 1) superstructure formulation, 2) criteria definition and implementation, 3) criteria weighting, 4) single-criterion optimization, 5) reformulation and 6) multi-criteria optimization. It is automated in the &lt;bold&gt; &lt;italic&gt;O&lt;/italic&gt; &lt;/bold&gt; &lt;italic&gt;pen s&lt;/italic&gt; &lt;bold&gt; &lt;italic&gt;U&lt;/italic&gt; &lt;/bold&gt; &lt;italic&gt;perstruc&lt;/italic&gt; &lt;bold&gt; &lt;italic&gt;T&lt;/italic&gt; &lt;/bold&gt; &lt;italic&gt;ure mo&lt;/italic&gt; &lt;bold&gt; &lt;italic&gt;D&lt;/italic&gt; &lt;/bold&gt; &lt;italic&gt;eling and&lt;/italic&gt; &lt;bold&gt; &lt;italic&gt;O&lt;/italic&gt; &lt;/bold&gt; &lt;italic&gt;ptimizati&lt;/italic&gt; &lt;bold&gt; &lt;italic&gt;O&lt;/italic&gt; &lt;/bold&gt; &lt;italic&gt;n f&lt;/italic&gt; &lt;bold&gt; &lt;italic&gt;R&lt;/italic&gt; &lt;/bold&gt; &lt;italic&gt;amework&lt;/italic&gt; (OUTDOOR) and tested on integrated power-to-X and biomass-to-X processes for methanol production. Three criteria are considered, namely net production costs ( &lt;italic&gt;NPC&lt;/italic&gt; ), net production greenhouse gas emissions ( &lt;italic&gt;NPE&lt;/italic&gt; ) and net production fresh water demand ( &lt;italic&gt;NPFWD&lt;/italic&gt; ). The optimization indicates &lt;italic&gt;NPC&lt;/italic&gt; of 1307 €/t &lt;sub&gt;MeOH&lt;/sub&gt; with &lt;italic&gt;NPE&lt;/italic&gt; of −2.23 &lt;inline-formula id=\&quot;j_psr-2020-0058_ineq_001\&quot;&gt; &lt;alternatives&gt; &lt;math&gt; &lt;mrow&gt; &lt;msub&gt; &lt;mtext&gt;t&lt;/mtext&gt; &lt;msub&gt; &lt;mtext&gt;CO&lt;/mtext&gt; &lt;mn&gt;2&lt;/mn&gt; &lt;/msub&gt; &lt;/msub&gt; &lt;mo&gt;/&lt;/mo&gt; &lt;msub&gt; &lt;mtext&gt;t&lt;/mtext&gt; &lt;mtext&gt;MeOH&lt;/mtext&gt; &lt;/msub&gt; &lt;/mrow&gt; &lt;/math&gt; &lt;tex-math&gt;${\\text{t}}_{{\\text{CO}}_{2}}/{\\text{t}}_{\\text{MeOH}}$&lt;/tex-math&gt; &lt;inline-graphic href=\&quot;graphic/j_psr-2020-0058_ineq_001.png\&quot;/&gt; &lt;/alternatives&gt; &lt;/inline-formula&gt; and &lt;italic&gt;NPFWD&lt;/italic&gt; of −3.42 &lt;inline-formula id=\&quot;j_psr-2020-0058_ineq_002\&quot;&gt; &lt;alternatives&gt; &lt;math&gt; &lt;mrow&gt; &lt;msub&gt; &lt;mtext&gt;t&lt;/mtext&gt; &lt;mrow&gt; &lt;msub&gt; &lt;mtext&gt;H&lt;/mtext&gt; &lt;mn&gt;2&lt;/mn&gt; &lt;/msub&gt; &lt;mtext&gt;O&lt;/mtext&gt; &lt;/mrow&gt; &lt;/msub&gt; &lt;mo&gt;/&lt;/mo&gt; &lt;msub&gt; &lt;mtext&gt;t&lt;/mtext&gt; &lt;mtext&gt;MeOH&lt;/mtext&gt; &lt;/msub&gt; &lt;/mrow&gt; &lt;/math&gt; &lt;tex-math&gt;${\\text{t}}_{{\\text{H}}_{2}\\text{O}}/{\\text{t}}_{\\text{MeOH}}$&lt;/tex-math&gt; &lt;inline-graphic href=\&quot;graphic/j_psr-2020-0058_ineq_002.png\&quot;/&gt; &lt;/alternatives&gt; &lt;/inline-formula&gt; for an optimal trade-off plant. The plant configuration features low-pressure alkaline electrolysis for hydrogen supply, absorption-based CO &lt;sub&gt;2&lt;/sub&gt; capture and steam production from methanol purge gas for internal heat supply. Conducted variation and sensitivity analyses indicate that methanol costs can drop to about 500 €/t &lt;sub&gt;MeOH&lt;/sub&gt; if electricity is free of charge, or to 805 €/t &lt;sub&gt;MeOH&lt;/sub&gt; if biogas is available at large quantities, if a least-cost process layouts are considered. However, all performed multi-criteria analyses imply a robust optimal process design utilizing electricity-based methanol production. &lt;/p&gt;&quot;,&quot;issue&quot;:&quot;9&quot;,&quot;volume&quot;:&quot;8&quot;,&quot;container-title-short&quot;:&quot;&quot;},&quot;isTemporary&quot;:false}]},{&quot;citationID&quot;:&quot;MENDELEY_CITATION_17f6286c-8eea-4653-85d8-bedf5256b8a1&quot;,&quot;properties&quot;:{&quot;noteIndex&quot;:0},&quot;isEdited&quot;:false,&quot;manualOverride&quot;:{&quot;isManuallyOverridden&quot;:false,&quot;citeprocText&quot;:&quot;[37]&quot;,&quot;manualOverrideText&quot;:&quot;&quot;},&quot;citationTag&quot;:&quot;MENDELEY_CITATION_v3_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&quot;,&quot;citationItems&quot;:[{&quot;id&quot;:&quot;a94934b4-96b0-3079-8b75-f945ca40e652&quot;,&quot;itemData&quot;:{&quot;type&quot;:&quot;article-journal&quot;,&quot;id&quot;:&quot;a94934b4-96b0-3079-8b75-f945ca40e652&quot;,&quot;title&quot;:&quot;Multi-Objective Optimization of an Energy Community Powered by a Distributed Polygeneration System&quot;,&quot;author&quot;:[{&quot;family&quot;:&quot;Souza&quot;,&quot;given&quot;:&quot;Ronelly José&quot;,&quot;parse-names&quot;:false,&quot;dropping-particle&quot;:&quot;&quot;,&quot;non-dropping-particle&quot;:&quot;De&quot;},{&quot;family&quot;:&quot;Reini&quot;,&quot;given&quot;:&quot;Mauro&quot;,&quot;parse-names&quot;:false,&quot;dropping-particle&quot;:&quot;&quot;,&quot;non-dropping-particle&quot;:&quot;&quot;},{&quot;family&quot;:&quot;Serra&quot;,&quot;given&quot;:&quot;Luis M.&quot;,&quot;parse-names&quot;:false,&quot;dropping-particle&quot;:&quot;&quot;,&quot;non-dropping-particle&quot;:&quot;&quot;},{&quot;family&quot;:&quot;Lozano&quot;,&quot;given&quot;:&quot;Miguel A.&quot;,&quot;parse-names&quot;:false,&quot;dropping-particle&quot;:&quot;&quot;,&quot;non-dropping-particle&quot;:&quot;&quot;},{&quot;family&quot;:&quot;Nadalon&quot;,&quot;given&quot;:&quot;Emanuele&quot;,&quot;parse-names&quot;:false,&quot;dropping-particle&quot;:&quot;&quot;,&quot;non-dropping-particle&quot;:&quot;&quot;},{&quot;family&quot;:&quot;Casisi&quot;,&quot;given&quot;:&quot;Melchiorre&quot;,&quot;parse-names&quot;:false,&quot;dropping-particle&quot;:&quot;&quot;,&quot;non-dropping-particle&quot;:&quot;&quot;}],&quot;container-title&quot;:&quot;Energies&quot;,&quot;DOI&quot;:&quot;10.3390/en17133085&quot;,&quot;ISSN&quot;:&quot;1996-1073&quot;,&quot;issued&quot;:{&quot;date-parts&quot;:[[2024,6,22]]},&quot;page&quot;:&quot;3085&quot;,&quot;abstract&quot;:&quot;&lt;p&gt;This paper presents a multi-objective optimization model for the integration of polygeneration systems into energy communities (ECs), by analyzing a case study. The concept of ECs is increasingly seen as beneficial for reducing global energy consumption and greenhouse gas emissions. Polygeneration systems have the potential to play a crucial role in this context, since they are known for producing multiple energy services from a single energy resource, besides the possibility of being fed also by renewable energy sources. However, optimizing the configuration and operation of these systems within ECs presents complex challenges due to the variety of technologies involved, their interactions, and the dynamic behavior of buildings. Therefore, the aim of this work is developing a mathematical model using a mixed integer linear programming (MILP) algorithm to optimally design and operate polygeneration systems integrated into ECs. The model is applied to a case study of an EC comprising nine buildings in a small city in the northeast of Italy. The work rests on the single- and multi-objective optimization of the polygeneration systems taking into account the sharing of electricity among the buildings (both self-produced and/or the purchased from the grid), as well as the sharing of heating and cooling between the buildings through a district heating and cooling network (DHCN). The main results from the EC case study show the possibility of reducing the total annual CO2 emissions by around 24.3% (about 1.72 kt CO2/year) while increasing the total annual costs by 1.9% (about 0.09 M€/year) or reducing the total annual costs by 31.9% (about 1.47 M€/year) while increasing the total annual CO2 emissions by 2.2% (about 0.16 kt CO2/year). The work developed within this research can be adapted to different case studies, such as in the residential–commercial buildings and industrial sectors. Therefore, the model resulting from this work constitutes an effective tool to optimally design and operate polygeneration systems integrated into ECs.&lt;/p&gt;&quot;,&quot;issue&quot;:&quot;13&quot;,&quot;volume&quot;:&quot;17&quot;,&quot;container-title-short&quot;:&quot;Energies (Basel).&quot;},&quot;isTemporary&quot;:false}]},{&quot;citationID&quot;:&quot;MENDELEY_CITATION_94464e02-64aa-4b84-948c-989aee7cb4eb&quot;,&quot;properties&quot;:{&quot;noteIndex&quot;:0},&quot;isEdited&quot;:false,&quot;manualOverride&quot;:{&quot;isManuallyOverridden&quot;:false,&quot;citeprocText&quot;:&quot;[38]&quot;,&quot;manualOverrideText&quot;:&quot;&quot;},&quot;citationTag&quot;:&quot;MENDELEY_CITATION_v3_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&quot;,&quot;citationItems&quot;:[{&quot;id&quot;:&quot;39e6e63a-abdc-38b4-bc7e-087f23193300&quot;,&quot;itemData&quot;:{&quot;type&quot;:&quot;article-journal&quot;,&quot;id&quot;:&quot;39e6e63a-abdc-38b4-bc7e-087f23193300&quot;,&quot;title&quot;:&quot;Energy Demand Response in a Food-Processing Plant: A Deep Reinforcement Learning Approach&quot;,&quot;author&quot;:[{&quot;family&quot;:&quot;Wohlgenannt&quot;,&quot;given&quot;:&quot;Philipp&quot;,&quot;parse-names&quot;:false,&quot;dropping-particle&quot;:&quot;&quot;,&quot;non-dropping-particle&quot;:&quot;&quot;},{&quot;family&quot;:&quot;Hegenbart&quot;,&quot;given&quot;:&quot;Sebastian&quot;,&quot;parse-names&quot;:false,&quot;dropping-particle&quot;:&quot;&quot;,&quot;non-dropping-particle&quot;:&quot;&quot;},{&quot;family&quot;:&quot;Eder&quot;,&quot;given&quot;:&quot;Elias&quot;,&quot;parse-names&quot;:false,&quot;dropping-particle&quot;:&quot;&quot;,&quot;non-dropping-particle&quot;:&quot;&quot;},{&quot;family&quot;:&quot;Kolhe&quot;,&quot;given&quot;:&quot;Mohan&quot;,&quot;parse-names&quot;:false,&quot;dropping-particle&quot;:&quot;&quot;,&quot;non-dropping-particle&quot;:&quot;&quot;},{&quot;family&quot;:&quot;Kepplinger&quot;,&quot;given&quot;:&quot;Peter&quot;,&quot;parse-names&quot;:false,&quot;dropping-particle&quot;:&quot;&quot;,&quot;non-dropping-particle&quot;:&quot;&quot;}],&quot;container-title&quot;:&quot;Energies&quot;,&quot;container-title-short&quot;:&quot;Energies (Basel).&quot;,&quot;DOI&quot;:&quot;10.3390/en17246430&quot;,&quot;ISSN&quot;:&quot;1996-1073&quot;,&quot;issued&quot;:{&quot;date-parts&quot;:[[2024,12,20]]},&quot;page&quot;:&quot;6430&quot;,&quot;abstract&quot;:&quot;&lt;p&gt;The food industry faces significant challenges in managing operational costs due to its high energy intensity and rising energy prices. Industrial food-processing facilities, with substantial thermal capacities and large demands for cooling and heating, offer promising opportunities for demand response (DR) strategies. This study explores the application of deep reinforcement learning (RL) as an innovative, data-driven approach for DR in the food industry. By leveraging the adaptive, self-learning capabilities of RL, energy costs in the investigated plant are effectively decreased. The RL algorithm was compared with the well-established optimization method Mixed Integer Linear Programming (MILP), and both were benchmarked against a reference scenario without DR. The two optimization strategies demonstrate cost savings of 17.57% and 18.65% for RL and MILP, respectively. Although RL is slightly less efficient in cost reduction, it significantly outperforms in computational speed, being approximately 20 times faster. During operation, RL only needs 2ms per optimization compared to 19s for MILP, making it a promising optimization tool for edge computing. Moreover, while MILP’s computation time increases considerably with the number of binary variables, RL efficiently learns dynamic system behavior and scales to more complex systems without significant performance degradation. These results highlight that deep RL, when applied to DR, offers substantial cost savings and computational efficiency, with broad applicability to energy management in various applications.&lt;/p&gt;&quot;,&quot;issue&quot;:&quot;24&quot;,&quot;volume&quot;:&quot;17&quot;},&quot;isTemporary&quot;:false}]},{&quot;citationID&quot;:&quot;MENDELEY_CITATION_f6ee1e61-1bbe-43ae-916b-e4b52f3e034f&quot;,&quot;properties&quot;:{&quot;noteIndex&quot;:0},&quot;isEdited&quot;:false,&quot;manualOverride&quot;:{&quot;isManuallyOverridden&quot;:false,&quot;citeprocText&quot;:&quot;[39]&quot;,&quot;manualOverrideText&quot;:&quot;&quot;},&quot;citationTag&quot;:&quot;MENDELEY_CITATION_v3_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&quot;,&quot;citationItems&quot;:[{&quot;id&quot;:&quot;db0b8039-29f3-359f-944c-e94a21d1ea11&quot;,&quot;itemData&quot;:{&quot;type&quot;:&quot;paper-conference&quot;,&quot;id&quot;:&quot;db0b8039-29f3-359f-944c-e94a21d1ea11&quot;,&quot;title&quot;:&quot;Performance Comparison of Deep RL Algorithms for Energy Systems Optimal Scheduling&quot;,&quot;author&quot;:[{&quot;family&quot;:&quot;Shengren&quot;,&quot;given&quot;:&quot;Hou&quot;,&quot;parse-names&quot;:false,&quot;dropping-particle&quot;:&quot;&quot;,&quot;non-dropping-particle&quot;:&quot;&quot;},{&quot;family&quot;:&quot;Salazar&quot;,&quot;given&quot;:&quot;Edgar Mauricio&quot;,&quot;parse-names&quot;:false,&quot;dropping-particle&quot;:&quot;&quot;,&quot;non-dropping-particle&quot;:&quot;&quot;},{&quot;family&quot;:&quot;Vergara&quot;,&quot;given&quot;:&quot;Pedro P.&quot;,&quot;parse-names&quot;:false,&quot;dropping-particle&quot;:&quot;&quot;,&quot;non-dropping-particle&quot;:&quot;&quot;},{&quot;family&quot;:&quot;Palensky&quot;,&quot;given&quot;:&quot;Peter&quot;,&quot;parse-names&quot;:false,&quot;dropping-particle&quot;:&quot;&quot;,&quot;non-dropping-particle&quot;:&quot;&quot;}],&quot;container-title&quot;:&quot;2022 IEEE PES Innovative Smart Grid Technologies Conference Europe (ISGT-Europe)&quot;,&quot;DOI&quot;:&quot;10.1109/ISGT-Europe54678.2022.9960642&quot;,&quot;ISBN&quot;:&quot;978-1-6654-8032-1&quot;,&quot;issued&quot;:{&quot;date-parts&quot;:[[2022,10,10]]},&quot;page&quot;:&quot;1-6&quot;,&quot;publisher&quot;:&quot;IEEE&quot;,&quot;container-title-short&quot;:&quot;&quot;},&quot;isTemporary&quot;:false}]},{&quot;citationID&quot;:&quot;MENDELEY_CITATION_96ae9baa-ea86-4a08-9c4f-af9c24e3165b&quot;,&quot;properties&quot;:{&quot;noteIndex&quot;:0},&quot;isEdited&quot;:false,&quot;manualOverride&quot;:{&quot;isManuallyOverridden&quot;:false,&quot;citeprocText&quot;:&quot;[40]&quot;,&quot;manualOverrideText&quot;:&quot;&quot;},&quot;citationTag&quot;:&quot;MENDELEY_CITATION_v3_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&quot;,&quot;citationItems&quot;:[{&quot;id&quot;:&quot;24483df0-3b18-335c-b6c9-40541914d90d&quot;,&quot;itemData&quot;:{&quot;type&quot;:&quot;article-journal&quot;,&quot;id&quot;:&quot;24483df0-3b18-335c-b6c9-40541914d90d&quot;,&quot;title&quot;:&quot;Mixed Deep Reinforcement Learning Considering Discrete-continuous Hybrid Action Space for Smart Home Energy Management&quot;,&quot;author&quot;:[{&quot;family&quot;:&quot;Huang&quot;,&quot;given&quot;:&quot;Chao&quot;,&quot;parse-names&quot;:false,&quot;dropping-particle&quot;:&quot;&quot;,&quot;non-dropping-particle&quot;:&quot;&quot;},{&quot;family&quot;:&quot;Zhang&quot;,&quot;given&quot;:&quot;Hongcai&quot;,&quot;parse-names&quot;:false,&quot;dropping-particle&quot;:&quot;&quot;,&quot;non-dropping-particle&quot;:&quot;&quot;},{&quot;family&quot;:&quot;Wang&quot;,&quot;given&quot;:&quot;Long&quot;,&quot;parse-names&quot;:false,&quot;dropping-particle&quot;:&quot;&quot;,&quot;non-dropping-particle&quot;:&quot;&quot;},{&quot;family&quot;:&quot;Luo&quot;,&quot;given&quot;:&quot;Xiong&quot;,&quot;parse-names&quot;:false,&quot;dropping-particle&quot;:&quot;&quot;,&quot;non-dropping-particle&quot;:&quot;&quot;},{&quot;family&quot;:&quot;Song&quot;,&quot;given&quot;:&quot;Yonghua&quot;,&quot;parse-names&quot;:false,&quot;dropping-particle&quot;:&quot;&quot;,&quot;non-dropping-particle&quot;:&quot;&quot;}],&quot;container-title&quot;:&quot;Journal of Modern Power Systems and Clean Energy&quot;,&quot;DOI&quot;:&quot;10.35833/MPCE.2021.000394&quot;,&quot;ISSN&quot;:&quot;2196-5625&quot;,&quot;issued&quot;:{&quot;date-parts&quot;:[[2022]]},&quot;page&quot;:&quot;743-754&quot;,&quot;issue&quot;:&quot;3&quot;,&quot;volume&quot;:&quot;10&quot;,&quot;container-title-short&quot;:&quot;&quot;},&quot;isTemporary&quot;:false}]},{&quot;citationID&quot;:&quot;MENDELEY_CITATION_6c73ec7e-f594-40ea-aad9-4c624f81d6ce&quot;,&quot;properties&quot;:{&quot;noteIndex&quot;:0},&quot;isEdited&quot;:false,&quot;manualOverride&quot;:{&quot;isManuallyOverridden&quot;:false,&quot;citeprocText&quot;:&quot;[41]&quot;,&quot;manualOverrideText&quot;:&quot;&quot;},&quot;citationTag&quot;:&quot;MENDELEY_CITATION_v3_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&quot;,&quot;citationItems&quot;:[{&quot;id&quot;:&quot;e6b87f49-da3a-31c2-9708-c2655a7acf54&quot;,&quot;itemData&quot;:{&quot;type&quot;:&quot;article-journal&quot;,&quot;id&quot;:&quot;e6b87f49-da3a-31c2-9708-c2655a7acf54&quot;,&quot;title&quot;:&quot;Deep reinforcement learning-based energy management for design and control of off-grid renewable microgrids with dual-battery storage&quot;,&quot;author&quot;:[{&quot;family&quot;:&quot;Khan&quot;,&quot;given&quot;:&quot;Wajid&quot;,&quot;parse-names&quot;:false,&quot;dropping-particle&quot;:&quot;&quot;,&quot;non-dropping-particle&quot;:&quot;&quot;},{&quot;family&quot;:&quot;Renhai&quot;,&quot;given&quot;:&quot;Feng&quot;,&quot;parse-names&quot;:false,&quot;dropping-particle&quot;:&quot;&quot;,&quot;non-dropping-particle&quot;:&quot;&quot;},{&quot;family&quot;:&quot;Aziz&quot;,&quot;given&quot;:&quot;Abdul&quot;,&quot;parse-names&quot;:false,&quot;dropping-particle&quot;:&quot;&quot;,&quot;non-dropping-particle&quot;:&quot;&quot;},{&quot;family&quot;:&quot;Yousaf&quot;,&quot;given&quot;:&quot;Muhammad Zain&quot;,&quot;parse-names&quot;:false,&quot;dropping-particle&quot;:&quot;&quot;,&quot;non-dropping-particle&quot;:&quot;&quot;},{&quot;family&quot;:&quot;Cai&quot;,&quot;given&quot;:&quot;Zhi&quot;,&quot;parse-names&quot;:false,&quot;dropping-particle&quot;:&quot;&quot;,&quot;non-dropping-particle&quot;:&quot;&quot;},{&quot;family&quot;:&quot;Iqbal&quot;,&quot;given&quot;:&quot;Muhammad Umair&quot;,&quot;parse-names&quot;:false,&quot;dropping-particle&quot;:&quot;&quot;,&quot;non-dropping-particle&quot;:&quot;&quot;},{&quot;family&quot;:&quot;Wang&quot;,&quot;given&quot;:&quot;Jiang&quot;,&quot;parse-names&quot;:false,&quot;dropping-particle&quot;:&quot;&quot;,&quot;non-dropping-particle&quot;:&quot;&quot;},{&quot;family&quot;:&quot;Abdullah&quot;,&quot;given&quot;:&quot;Mustafa&quot;,&quot;parse-names&quot;:false,&quot;dropping-particle&quot;:&quot;&quot;,&quot;non-dropping-particle&quot;:&quot;&quot;},{&quot;family&quot;:&quot;Geremew&quot;,&quot;given&quot;:&quot;Mebratu Sintie&quot;,&quot;parse-names&quot;:false,&quot;dropping-particle&quot;:&quot;&quot;,&quot;non-dropping-particle&quot;:&quot;&quot;}],&quot;container-title&quot;:&quot;Energy Exploration &amp; Exploitation&quot;,&quot;DOI&quot;:&quot;10.1177/01445987251387368&quot;,&quot;ISSN&quot;:&quot;0144-5987&quot;,&quot;issued&quot;:{&quot;date-parts&quot;:[[2026,3,16]]},&quot;page&quot;:&quot;821-869&quot;,&quot;abstract&quot;:&quot;&lt;p&gt; Meeting the growing global electricity demand in remote and off-grid regions requires cost-effective and reliable power solutions that overcome the intermittency of renewable energy sources. This paper presents a comprehensive techno-economic optimization framework for the design and operation of off-grid hybrid renewable energy systems (HRES) integrating photovoltaic (PV), wind turbine, biomass generator, diesel backup, and a dual-chemistry hybrid battery energy storage system (HBESS) combining lithium-ion and nickel-iron batteries. A detailed mathematical modeling approach is employed to capture the nonlinear dynamics, stochastic renewable behavior, battery degradation, and temperature-adjusted component efficiencies. The system is formulated as a multi-objective mixed-integer nonlinear programming problem targeting the minimization of life cycle cost (LCC), levelized cost of energy (LCOE), and CO &lt;sub&gt;2&lt;/sub&gt; emissions while satisfying reliability constraints such as loss of power supply probability (LPSP &amp;lt; 0.01). To solve the optimization problem, advanced metaheuristic algorithms—Particle Swarm Optimization (PSO), Genetic Algorithms (GA), Grey Wolf Optimizer (GWO), and Differential Evolution (DE), and Salp Swarm Algorithm (SSA)—and a Deep Q-Network (DQN)-based reinforcement learning energy management strategy are implemented and benchmarked. The proposed DQN-based controller demonstrates superior performance over conventional rule-based and static dispatch methods by maintaining more stable battery state-of-charge (SOC) profiles, reducing degradation, and enabling intelligent real-time decision-making. Simulation results based on realistic meteorological and demand profiles reveal that the integrated DQN and HBESS strategy reduces total LCC by over 20%, CO &lt;sub&gt;2&lt;/sub&gt; emissions by up to 30%, and battery degradation costs by over 10% compared to baseline systems. The Salp Swarm Algorithm (SSA) achieves the fastest convergence and the highest-quality Pareto-optimal solutions among all metaheuristics evaluated. Sensitivity analysis identifies diesel price and interest rate as the most influential parameters on LCOE, while load shifting through aggressive demand-side management further minimizes battery usage, operating costs, and emissions. The proposed framework not only addresses key challenges in off-grid microgrid design but also provides a scalable and robust pathway for sustainable rural electrification using hybrid storage and intelligent control. &lt;/p&gt;&quot;,&quot;issue&quot;:&quot;2&quot;,&quot;volume&quot;:&quot;44&quot;,&quot;container-title-short&quot;:&quot;&quot;},&quot;isTemporary&quot;:false}]},{&quot;citationID&quot;:&quot;MENDELEY_CITATION_4aa9aa38-c6f8-4655-adad-651820be928f&quot;,&quot;properties&quot;:{&quot;noteIndex&quot;:0},&quot;isEdited&quot;:false,&quot;manualOverride&quot;:{&quot;isManuallyOverridden&quot;:false,&quot;citeprocText&quot;:&quot;[42]&quot;,&quot;manualOverrideText&quot;:&quot;&quot;},&quot;citationTag&quot;:&quot;MENDELEY_CITATION_v3_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&quot;,&quot;citationItems&quot;:[{&quot;id&quot;:&quot;724df896-ae80-37a5-bbb1-ea526b483901&quot;,&quot;itemData&quot;:{&quot;type&quot;:&quot;article-journal&quot;,&quot;id&quot;:&quot;724df896-ae80-37a5-bbb1-ea526b483901&quot;,&quot;title&quot;:&quot;Energy Demand Response in a Food-Processing Plant: A Deep Reinforcement Learning Approach&quot;,&quot;author&quot;:[{&quot;family&quot;:&quot;Wohlgenannt&quot;,&quot;given&quot;:&quot;Philipp&quot;,&quot;parse-names&quot;:false,&quot;dropping-particle&quot;:&quot;&quot;,&quot;non-dropping-particle&quot;:&quot;&quot;},{&quot;family&quot;:&quot;Hegenbart&quot;,&quot;given&quot;:&quot;Sebastian&quot;,&quot;parse-names&quot;:false,&quot;dropping-particle&quot;:&quot;&quot;,&quot;non-dropping-particle&quot;:&quot;&quot;},{&quot;family&quot;:&quot;Eder&quot;,&quot;given&quot;:&quot;Elias&quot;,&quot;parse-names&quot;:false,&quot;dropping-particle&quot;:&quot;&quot;,&quot;non-dropping-particle&quot;:&quot;&quot;},{&quot;family&quot;:&quot;Kolhe&quot;,&quot;given&quot;:&quot;Mohan&quot;,&quot;parse-names&quot;:false,&quot;dropping-particle&quot;:&quot;&quot;,&quot;non-dropping-particle&quot;:&quot;&quot;},{&quot;family&quot;:&quot;Kepplinger&quot;,&quot;given&quot;:&quot;Peter&quot;,&quot;parse-names&quot;:false,&quot;dropping-particle&quot;:&quot;&quot;,&quot;non-dropping-particle&quot;:&quot;&quot;}],&quot;container-title&quot;:&quot;Energies&quot;,&quot;container-title-short&quot;:&quot;Energies (Basel).&quot;,&quot;DOI&quot;:&quot;10.3390/en17246430&quot;,&quot;ISSN&quot;:&quot;1996-1073&quot;,&quot;issued&quot;:{&quot;date-parts&quot;:[[2024,12,20]]},&quot;page&quot;:&quot;6430&quot;,&quot;abstract&quot;:&quot;&lt;p&gt;The food industry faces significant challenges in managing operational costs due to its high energy intensity and rising energy prices. Industrial food-processing facilities, with substantial thermal capacities and large demands for cooling and heating, offer promising opportunities for demand response (DR) strategies. This study explores the application of deep reinforcement learning (RL) as an innovative, data-driven approach for DR in the food industry. By leveraging the adaptive, self-learning capabilities of RL, energy costs in the investigated plant are effectively decreased. The RL algorithm was compared with the well-established optimization method Mixed Integer Linear Programming (MILP), and both were benchmarked against a reference scenario without DR. The two optimization strategies demonstrate cost savings of 17.57% and 18.65% for RL and MILP, respectively. Although RL is slightly less efficient in cost reduction, it significantly outperforms in computational speed, being approximately 20 times faster. During operation, RL only needs 2ms per optimization compared to 19s for MILP, making it a promising optimization tool for edge computing. Moreover, while MILP’s computation time increases considerably with the number of binary variables, RL efficiently learns dynamic system behavior and scales to more complex systems without significant performance degradation. These results highlight that deep RL, when applied to DR, offers substantial cost savings and computational efficiency, with broad applicability to energy management in various applications.&lt;/p&gt;&quot;,&quot;issue&quot;:&quot;24&quot;,&quot;volume&quot;:&quot;17&quot;},&quot;isTemporary&quot;:false}]},{&quot;citationID&quot;:&quot;MENDELEY_CITATION_7cbe8449-6ae3-4327-a6e1-c91a210c1a1d&quot;,&quot;properties&quot;:{&quot;noteIndex&quot;:0},&quot;isEdited&quot;:false,&quot;manualOverride&quot;:{&quot;isManuallyOverridden&quot;:false,&quot;citeprocText&quot;:&quot;[43], [44]&quot;,&quot;manualOverrideText&quot;:&quot;&quot;},&quot;citationTag&quot;:&quot;MENDELEY_CITATION_v3_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&quot;,&quot;citationItems&quot;:[{&quot;id&quot;:&quot;80e0b832-1c6f-3864-9f71-9b273477a917&quot;,&quot;itemData&quot;:{&quot;type&quot;:&quot;article-journal&quot;,&quot;id&quot;:&quot;80e0b832-1c6f-3864-9f71-9b273477a917&quot;,&quot;title&quot;:&quot;Reinforcement Learning Techniques in Optimizing Energy Systems&quot;,&quot;author&quot;:[{&quot;family&quot;:&quot;Stavrev&quot;,&quot;given&quot;:&quot;Stefan&quot;,&quot;parse-names&quot;:false,&quot;dropping-particle&quot;:&quot;&quot;,&quot;non-dropping-particle&quot;:&quot;&quot;},{&quot;family&quot;:&quot;Ginchev&quot;,&quot;given&quot;:&quot;Dimitar&quot;,&quot;parse-names&quot;:false,&quot;dropping-particle&quot;:&quot;&quot;,&quot;non-dropping-particle&quot;:&quot;&quot;}],&quot;container-title&quot;:&quot;Electronics&quot;,&quot;DOI&quot;:&quot;10.3390/electronics13081459&quot;,&quot;ISSN&quot;:&quot;2079-9292&quot;,&quot;issued&quot;:{&quot;date-parts&quot;:[[2024,4,12]]},&quot;page&quot;:&quot;1459&quot;,&quot;abstract&quot;:&quot;&lt;p&gt;Reinforcement learning (RL) techniques have emerged as powerful tools for optimizing energy systems, offering the potential to enhance efficiency, reliability, and sustainability. This review paper provides a comprehensive examination of the applications of RL in the field of energy system optimization, spanning various domains such as energy management, grid control, and renewable energy integration. Beginning with an overview of RL fundamentals, the paper explores recent advancements in RL algorithms and their adaptation to address the unique challenges of energy system optimization. Case studies and real-world applications demonstrate the efficacy of RL-based approaches in improving energy efficiency, reducing costs, and mitigating environmental impacts. Furthermore, the paper discusses future directions and challenges, including scalability, interpretability, and integration with domain knowledge. By synthesizing the latest research findings and identifying key areas for further investigation, this paper aims to inform and inspire future research endeavors in the intersection of reinforcement learning and energy system optimization.&lt;/p&gt;&quot;,&quot;issue&quot;:&quot;8&quot;,&quot;volume&quot;:&quot;13&quot;,&quot;container-title-short&quot;:&quot;Electronics (Basel).&quot;},&quot;isTemporary&quot;:false},{&quot;id&quot;:&quot;71c1ace4-7085-3db1-9b31-493a7b2fcde3&quot;,&quot;itemData&quot;:{&quot;type&quot;:&quot;article-journal&quot;,&quot;id&quot;:&quot;71c1ace4-7085-3db1-9b31-493a7b2fcde3&quot;,&quot;title&quot;:&quot;Deep Reinforcement Learning Approaches the MILP Optimum of a Multi-Energy Optimization in Energy Communities&quot;,&quot;author&quot;:[{&quot;family&quot;:&quot;Vetter&quot;,&quot;given&quot;:&quot;Vinzent&quot;,&quot;parse-names&quot;:false,&quot;dropping-particle&quot;:&quot;&quot;,&quot;non-dropping-particle&quot;:&quot;&quot;},{&quot;family&quot;:&quot;Wohlgenannt&quot;,&quot;given&quot;:&quot;Philipp&quot;,&quot;parse-names&quot;:false,&quot;dropping-particle&quot;:&quot;&quot;,&quot;non-dropping-particle&quot;:&quot;&quot;},{&quot;family&quot;:&quot;Kepplinger&quot;,&quot;given&quot;:&quot;Peter&quot;,&quot;parse-names&quot;:false,&quot;dropping-particle&quot;:&quot;&quot;,&quot;non-dropping-particle&quot;:&quot;&quot;},{&quot;family&quot;:&quot;Eder&quot;,&quot;given&quot;:&quot;Elias&quot;,&quot;parse-names&quot;:false,&quot;dropping-particle&quot;:&quot;&quot;,&quot;non-dropping-particle&quot;:&quot;&quot;}],&quot;container-title&quot;:&quot;Energies&quot;,&quot;DOI&quot;:&quot;10.3390/en18174489&quot;,&quot;ISSN&quot;:&quot;1996-1073&quot;,&quot;issued&quot;:{&quot;date-parts&quot;:[[2025,8,23]]},&quot;page&quot;:&quot;4489&quot;,&quot;abstract&quot;:&quot;&lt;p&gt;As energy systems transition toward high shares of variable renewable generation, local energy communities (ECs) are increasingly relevant for enabling demand-side flexibility and self-sufficiency. This shift is particularly evident in the residential sector, where the deployment of photovoltaic (PV) systems is rapidly growing. While mixed-integer linear programming (MILP) remains the standard for operational optimization and demand response in such systems, its computational burden limits scalability and responsiveness under real-time or uncertain conditions. Reinforcement learning (RL), by contrast, offers a model-free, adaptive alternative. However, its application to real-world energy system operation remains limited. This study explores the application of a Deep Q-Network (DQN) to a real residential EC, which has received limited attention in prior work. The system comprises three single-family homes sharing a centralized heating system with a thermal energy storage (TES), a PV installation, and a grid connection. We compare the performance of MILP and RL controllers across economic and environmental metrics. Relative to a reference scenario without TES, MILP and RL reduce energy costs by 10.06% and 8.78%, respectively, and both approaches yield lower total energy consumption and CO2-equivalent emissions. Notably, the trained RL agent achieves a near-optimal outcome while requiring only 22% of the MILP’s computation time. These results demonstrate that DQNs can offer a computationally efficient and practically viable alternative to MILP for real-time control in residential energy systems.&lt;/p&gt;&quot;,&quot;issue&quot;:&quot;17&quot;,&quot;volume&quot;:&quot;18&quot;,&quot;container-title-short&quot;:&quot;Energies (Basel).&quot;},&quot;isTemporary&quot;:false}]},{&quot;citationID&quot;:&quot;MENDELEY_CITATION_fb974e0b-7e67-4c93-a30f-ed459a189960&quot;,&quot;properties&quot;:{&quot;noteIndex&quot;:0},&quot;isEdited&quot;:false,&quot;manualOverride&quot;:{&quot;isManuallyOverridden&quot;:false,&quot;citeprocText&quot;:&quot;[45]&quot;,&quot;manualOverrideText&quot;:&quot;&quot;},&quot;citationTag&quot;:&quot;MENDELEY_CITATION_v3_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&quot;,&quot;citationItems&quot;:[{&quot;id&quot;:&quot;8dce386b-1be0-3f7f-90b3-85aff7b0a20e&quot;,&quot;itemData&quot;:{&quot;type&quot;:&quot;article-journal&quot;,&quot;id&quot;:&quot;8dce386b-1be0-3f7f-90b3-85aff7b0a20e&quot;,&quot;title&quot;:&quot;Optimal energy system scheduling using a constraint-aware reinforcement learning algorithm&quot;,&quot;author&quot;:[{&quot;family&quot;:&quot;Shengren&quot;,&quot;given&quot;:&quot;Hou&quot;,&quot;parse-names&quot;:false,&quot;dropping-particle&quot;:&quot;&quot;,&quot;non-dropping-particle&quot;:&quot;&quot;},{&quot;family&quot;:&quot;Vergara&quot;,&quot;given&quot;:&quot;Pedro P.&quot;,&quot;parse-names&quot;:false,&quot;dropping-particle&quot;:&quot;&quot;,&quot;non-dropping-particle&quot;:&quot;&quot;},{&quot;family&quot;:&quot;Salazar Duque&quot;,&quot;given&quot;:&quot;Edgar Mauricio&quot;,&quot;parse-names&quot;:false,&quot;dropping-particle&quot;:&quot;&quot;,&quot;non-dropping-particle&quot;:&quot;&quot;},{&quot;family&quot;:&quot;Palensky&quot;,&quot;given&quot;:&quot;Peter&quot;,&quot;parse-names&quot;:false,&quot;dropping-particle&quot;:&quot;&quot;,&quot;non-dropping-particle&quot;:&quot;&quot;}],&quot;container-title&quot;:&quot;International Journal of Electrical Power &amp; Energy Systems&quot;,&quot;DOI&quot;:&quot;10.1016/j.ijepes.2023.109230&quot;,&quot;ISSN&quot;:&quot;01420615&quot;,&quot;issued&quot;:{&quot;date-parts&quot;:[[2023,10]]},&quot;page&quot;:&quot;109230&quot;,&quot;volume&quot;:&quot;152&quot;,&quot;container-title-short&quot;:&quot;&quot;},&quot;isTemporary&quot;:false}]},{&quot;citationID&quot;:&quot;MENDELEY_CITATION_1cdcd498-a953-4c56-9fed-7dd79ae2f0e4&quot;,&quot;properties&quot;:{&quot;noteIndex&quot;:0},&quot;isEdited&quot;:false,&quot;manualOverride&quot;:{&quot;isManuallyOverridden&quot;:false,&quot;citeprocText&quot;:&quot;[46]&quot;,&quot;manualOverrideText&quot;:&quot;&quot;},&quot;citationTag&quot;:&quot;MENDELEY_CITATION_v3_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&quot;,&quot;citationItems&quot;:[{&quot;id&quot;:&quot;06c2b8d2-b2dc-3af5-b126-6311b944aca0&quot;,&quot;itemData&quot;:{&quot;type&quot;:&quot;article&quot;,&quot;id&quot;:&quot;06c2b8d2-b2dc-3af5-b126-6311b944aca0&quot;,&quot;title&quot;:&quot;Reinforcement Learning Techniques in Optimizing Energy Systems&quot;,&quot;author&quot;:[{&quot;family&quot;:&quot;Stavrev&quot;,&quot;given&quot;:&quot;Stefan&quot;,&quot;parse-names&quot;:false,&quot;dropping-particle&quot;:&quot;&quot;,&quot;non-dropping-particle&quot;:&quot;&quot;},{&quot;family&quot;:&quot;Ginchev&quot;,&quot;given&quot;:&quot;Dimitar&quot;,&quot;parse-names&quot;:false,&quot;dropping-particle&quot;:&quot;&quot;,&quot;non-dropping-particle&quot;:&quot;&quot;}],&quot;container-title&quot;:&quot;Electronics (Switzerland)&quot;,&quot;DOI&quot;:&quot;10.3390/electronics13081459&quot;,&quot;ISSN&quot;:&quot;20799292&quot;,&quot;issued&quot;:{&quot;date-parts&quot;:[[2024,4,1]]},&quot;abstract&quot;:&quot;Reinforcement learning (RL) techniques have emerged as powerful tools for optimizing energy systems, offering the potential to enhance efficiency, reliability, and sustainability. This review paper provides a comprehensive examination of the applications of RL in the field of energy system optimization, spanning various domains such as energy management, grid control, and renewable energy integration. Beginning with an overview of RL fundamentals, the paper explores recent advancements in RL algorithms and their adaptation to address the unique challenges of energy system optimization. Case studies and real-world applications demonstrate the efficacy of RL-based approaches in improving energy efficiency, reducing costs, and mitigating environmental impacts. Furthermore, the paper discusses future directions and challenges, including scalability, interpretability, and integration with domain knowledge. By synthesizing the latest research findings and identifying key areas for further investigation, this paper aims to inform and inspire future research endeavors in the intersection of reinforcement learning and energy system optimization.&quot;,&quot;publisher&quot;:&quot;Multidisciplinary Digital Publishing Institute (MDPI)&quot;,&quot;issue&quot;:&quot;8&quot;,&quot;volume&quot;:&quot;13&quot;,&quot;container-title-short&quot;:&quot;&quot;},&quot;isTemporary&quot;:false}]},{&quot;citationID&quot;:&quot;MENDELEY_CITATION_8f9fc719-49df-456a-8934-5bb7891faa53&quot;,&quot;properties&quot;:{&quot;noteIndex&quot;:0},&quot;isEdited&quot;:false,&quot;manualOverride&quot;:{&quot;isManuallyOverridden&quot;:false,&quot;citeprocText&quot;:&quot;[47]&quot;,&quot;manualOverrideText&quot;:&quot;&quot;},&quot;citationTag&quot;:&quot;MENDELEY_CITATION_v3_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&quot;,&quot;citationItems&quot;:[{&quot;id&quot;:&quot;b748b453-1bc9-3b06-a2bc-accd4d93d9d9&quot;,&quot;itemData&quot;:{&quot;type&quot;:&quot;article-journal&quot;,&quot;id&quot;:&quot;b748b453-1bc9-3b06-a2bc-accd4d93d9d9&quot;,&quot;title&quot;:&quot;Applications of reinforcement learning in energy systems&quot;,&quot;author&quot;:[{&quot;family&quot;:&quot;Perera&quot;,&quot;given&quot;:&quot;A.T.D.&quot;,&quot;parse-names&quot;:false,&quot;dropping-particle&quot;:&quot;&quot;,&quot;non-dropping-particle&quot;:&quot;&quot;},{&quot;family&quot;:&quot;Kamalaruban&quot;,&quot;given&quot;:&quot;Parameswaran&quot;,&quot;parse-names&quot;:false,&quot;dropping-particle&quot;:&quot;&quot;,&quot;non-dropping-particle&quot;:&quot;&quot;}],&quot;container-title&quot;:&quot;Renewable and Sustainable Energy Reviews&quot;,&quot;DOI&quot;:&quot;10.1016/j.rser.2020.110618&quot;,&quot;ISSN&quot;:&quot;13640321&quot;,&quot;issued&quot;:{&quot;date-parts&quot;:[[2021,3]]},&quot;page&quot;:&quot;110618&quot;,&quot;volume&quot;:&quot;137&quot;,&quot;container-title-short&quot;:&quot;&quot;},&quot;isTemporary&quot;:false}]},{&quot;citationID&quot;:&quot;MENDELEY_CITATION_92567a48-90b0-46c9-bfb8-195d222dd6c2&quot;,&quot;properties&quot;:{&quot;noteIndex&quot;:0},&quot;isEdited&quot;:false,&quot;manualOverride&quot;:{&quot;isManuallyOverridden&quot;:false,&quot;citeprocText&quot;:&quot;[48]&quot;,&quot;manualOverrideText&quot;:&quot;&quot;},&quot;citationTag&quot;:&quot;MENDELEY_CITATION_v3_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&quot;,&quot;citationItems&quot;:[{&quot;id&quot;:&quot;408e45c0-460c-38aa-8310-19b6e3612eca&quot;,&quot;itemData&quot;:{&quot;type&quot;:&quot;article-journal&quot;,&quot;id&quot;:&quot;408e45c0-460c-38aa-8310-19b6e3612eca&quot;,&quot;title&quot;:&quot;Reinforcement Learning Techniques in Optimizing Energy Systems&quot;,&quot;author&quot;:[{&quot;family&quot;:&quot;Stavrev&quot;,&quot;given&quot;:&quot;Stefan&quot;,&quot;parse-names&quot;:false,&quot;dropping-particle&quot;:&quot;&quot;,&quot;non-dropping-particle&quot;:&quot;&quot;},{&quot;family&quot;:&quot;Ginchev&quot;,&quot;given&quot;:&quot;Dimitar&quot;,&quot;parse-names&quot;:false,&quot;dropping-particle&quot;:&quot;&quot;,&quot;non-dropping-particle&quot;:&quot;&quot;}],&quot;container-title&quot;:&quot;Electronics&quot;,&quot;container-title-short&quot;:&quot;Electronics (Basel).&quot;,&quot;DOI&quot;:&quot;10.3390/electronics13081459&quot;,&quot;ISSN&quot;:&quot;2079-9292&quot;,&quot;issued&quot;:{&quot;date-parts&quot;:[[2024,4,12]]},&quot;page&quot;:&quot;1459&quot;,&quot;abstract&quot;:&quot;&lt;p&gt;Reinforcement learning (RL) techniques have emerged as powerful tools for optimizing energy systems, offering the potential to enhance efficiency, reliability, and sustainability. This review paper provides a comprehensive examination of the applications of RL in the field of energy system optimization, spanning various domains such as energy management, grid control, and renewable energy integration. Beginning with an overview of RL fundamentals, the paper explores recent advancements in RL algorithms and their adaptation to address the unique challenges of energy system optimization. Case studies and real-world applications demonstrate the efficacy of RL-based approaches in improving energy efficiency, reducing costs, and mitigating environmental impacts. Furthermore, the paper discusses future directions and challenges, including scalability, interpretability, and integration with domain knowledge. By synthesizing the latest research findings and identifying key areas for further investigation, this paper aims to inform and inspire future research endeavors in the intersection of reinforcement learning and energy system optimization.&lt;/p&gt;&quot;,&quot;issue&quot;:&quot;8&quot;,&quot;volume&quot;:&quot;13&quot;},&quot;isTemporary&quot;:false}]},{&quot;citationID&quot;:&quot;MENDELEY_CITATION_2d90f837-c9a3-4da7-9b2d-0b187fae7ad5&quot;,&quot;properties&quot;:{&quot;noteIndex&quot;:0},&quot;isEdited&quot;:false,&quot;manualOverride&quot;:{&quot;isManuallyOverridden&quot;:false,&quot;citeprocText&quot;:&quot;[49]&quot;,&quot;manualOverrideText&quot;:&quot;&quot;},&quot;citationTag&quot;:&quot;MENDELEY_CITATION_v3_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&quot;,&quot;citationItems&quot;:[{&quot;id&quot;:&quot;94630c80-577c-3ded-896b-4aaf82147c8b&quot;,&quot;itemData&quot;:{&quot;type&quot;:&quot;chapter&quot;,&quot;id&quot;:&quot;94630c80-577c-3ded-896b-4aaf82147c8b&quot;,&quot;title&quot;:&quot;Efficient Exploration in Reinforcement Learning&quot;,&quot;author&quot;:[{&quot;family&quot;:&quot;Langford&quot;,&quot;given&quot;:&quot;John&quot;,&quot;parse-names&quot;:false,&quot;dropping-particle&quot;:&quot;&quot;,&quot;non-dropping-particle&quot;:&quot;&quot;}],&quot;container-title&quot;:&quot;Encyclopedia of Machine Learning&quot;,&quot;DOI&quot;:&quot;10.1007/978-0-387-30164-8_244&quot;,&quot;issued&quot;:{&quot;date-parts&quot;:[[2011]]},&quot;publisher-place&quot;:&quot;Boston, MA&quot;,&quot;page&quot;:&quot;309-311&quot;,&quot;publisher&quot;:&quot;Springer US&quot;,&quot;container-title-short&quot;:&quot;&quot;},&quot;isTemporary&quot;:false}]},{&quot;citationID&quot;:&quot;MENDELEY_CITATION_409cf5ec-19c5-4b5e-b434-08af62e0486e&quot;,&quot;properties&quot;:{&quot;noteIndex&quot;:0},&quot;isEdited&quot;:false,&quot;manualOverride&quot;:{&quot;isManuallyOverridden&quot;:false,&quot;citeprocText&quot;:&quot;[50]&quot;,&quot;manualOverrideText&quot;:&quot;&quot;},&quot;citationTag&quot;:&quot;MENDELEY_CITATION_v3_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&quot;,&quot;citationItems&quot;:[{&quot;id&quot;:&quot;b87850aa-a581-31c2-a694-b706eafaefa3&quot;,&quot;itemData&quot;:{&quot;type&quot;:&quot;article-journal&quot;,&quot;id&quot;:&quot;b87850aa-a581-31c2-a694-b706eafaefa3&quot;,&quot;title&quot;:&quot;ROBOT LEARNING&quot;,&quot;author&quot;:[{&quot;family&quot;:&quot;Sutton&quot;,&quot;given&quot;:&quot;Richard&quot;,&quot;parse-names&quot;:false,&quot;dropping-particle&quot;:&quot;&quot;,&quot;non-dropping-particle&quot;:&quot;&quot;},{&quot;family&quot;:&quot;Barto&quot;,&quot;given&quot;:&quot;Andrew&quot;,&quot;parse-names&quot;:false,&quot;dropping-particle&quot;:&quot;&quot;,&quot;non-dropping-particle&quot;:&quot;&quot;}],&quot;container-title&quot;:&quot;Robotica&quot;,&quot;container-title-short&quot;:&quot;Robotica&quot;,&quot;DOI&quot;:&quot;10.1017/S0263574799271172&quot;,&quot;ISSN&quot;:&quot;0263-5747&quot;,&quot;issued&quot;:{&quot;date-parts&quot;:[[1999,3,1]]},&quot;page&quot;:&quot;229-235&quot;,&quot;issue&quot;:&quot;2&quot;,&quot;volume&quot;:&quot;17&quot;},&quot;isTemporary&quot;:false}]},{&quot;citationID&quot;:&quot;MENDELEY_CITATION_275dbc2a-bca7-47b7-904d-467adf502462&quot;,&quot;properties&quot;:{&quot;noteIndex&quot;:0},&quot;isEdited&quot;:false,&quot;manualOverride&quot;:{&quot;isManuallyOverridden&quot;:false,&quot;citeprocText&quot;:&quot;[51]&quot;,&quot;manualOverrideText&quot;:&quot;&quot;},&quot;citationTag&quot;:&quot;MENDELEY_CITATION_v3_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&quot;,&quot;citationItems&quot;:[{&quot;id&quot;:&quot;8a2da654-28fe-395b-8105-172abb9e04b0&quot;,&quot;itemData&quot;:{&quot;type&quot;:&quot;paper-conference&quot;,&quot;id&quot;:&quot;8a2da654-28fe-395b-8105-172abb9e04b0&quot;,&quot;title&quot;:&quot;Overview of Reinforcement Learning Based on Value and Policy&quot;,&quot;author&quot;:[{&quot;family&quot;:&quot;Liu&quot;,&quot;given&quot;:&quot;Yun-ting&quot;,&quot;parse-names&quot;:false,&quot;dropping-particle&quot;:&quot;&quot;,&quot;non-dropping-particle&quot;:&quot;&quot;},{&quot;family&quot;:&quot;Yang&quot;,&quot;given&quot;:&quot;Jia-ming&quot;,&quot;parse-names&quot;:false,&quot;dropping-particle&quot;:&quot;&quot;,&quot;non-dropping-particle&quot;:&quot;&quot;},{&quot;family&quot;:&quot;Chen&quot;,&quot;given&quot;:&quot;Liang&quot;,&quot;parse-names&quot;:false,&quot;dropping-particle&quot;:&quot;&quot;,&quot;non-dropping-particle&quot;:&quot;&quot;},{&quot;family&quot;:&quot;Guo&quot;,&quot;given&quot;:&quot;Ting&quot;,&quot;parse-names&quot;:false,&quot;dropping-particle&quot;:&quot;&quot;,&quot;non-dropping-particle&quot;:&quot;&quot;},{&quot;family&quot;:&quot;Jiang&quot;,&quot;given&quot;:&quot;Yu&quot;,&quot;parse-names&quot;:false,&quot;dropping-particle&quot;:&quot;&quot;,&quot;non-dropping-particle&quot;:&quot;&quot;}],&quot;container-title&quot;:&quot;2020 Chinese Control And Decision Conference (CCDC)&quot;,&quot;DOI&quot;:&quot;10.1109/CCDC49329.2020.9164615&quot;,&quot;ISBN&quot;:&quot;978-1-7281-5855-6&quot;,&quot;issued&quot;:{&quot;date-parts&quot;:[[2020,8]]},&quot;page&quot;:&quot;598-603&quot;,&quot;publisher&quot;:&quot;IEEE&quot;,&quot;container-title-short&quot;:&quot;&quot;},&quot;isTemporary&quot;:false}]},{&quot;citationID&quot;:&quot;MENDELEY_CITATION_ef102693-b21e-49bd-8961-a5f9603586b2&quot;,&quot;properties&quot;:{&quot;noteIndex&quot;:0},&quot;isEdited&quot;:false,&quot;manualOverride&quot;:{&quot;isManuallyOverridden&quot;:false,&quot;citeprocText&quot;:&quot;[52]&quot;,&quot;manualOverrideText&quot;:&quot;&quot;},&quot;citationTag&quot;:&quot;MENDELEY_CITATION_v3_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&quot;,&quot;citationItems&quot;:[{&quot;id&quot;:&quot;ffddf98e-e370-3452-8a14-62d7c8029a56&quot;,&quot;itemData&quot;:{&quot;type&quot;:&quot;article-journal&quot;,&quot;id&quot;:&quot;ffddf98e-e370-3452-8a14-62d7c8029a56&quot;,&quot;title&quot;:&quot;Comparing Policy Gradient and Value Function Based Reinforcement Learning Methods in Simulated Electrical Power Trade&quot;,&quot;author&quot;:[{&quot;family&quot;:&quot;Lincoln&quot;,&quot;given&quot;:&quot;Richard&quot;,&quot;parse-names&quot;:false,&quot;dropping-particle&quot;:&quot;&quot;,&quot;non-dropping-particle&quot;:&quot;&quot;},{&quot;family&quot;:&quot;Galloway&quot;,&quot;given&quot;:&quot;Stuart&quot;,&quot;parse-names&quot;:false,&quot;dropping-particle&quot;:&quot;&quot;,&quot;non-dropping-particle&quot;:&quot;&quot;},{&quot;family&quot;:&quot;Stephen&quot;,&quot;given&quot;:&quot;Bruce&quot;,&quot;parse-names&quot;:false,&quot;dropping-particle&quot;:&quot;&quot;,&quot;non-dropping-particle&quot;:&quot;&quot;},{&quot;family&quot;:&quot;Burt&quot;,&quot;given&quot;:&quot;Graeme&quot;,&quot;parse-names&quot;:false,&quot;dropping-particle&quot;:&quot;&quot;,&quot;non-dropping-particle&quot;:&quot;&quot;}],&quot;container-title&quot;:&quot;IEEE Transactions on Power Systems&quot;,&quot;DOI&quot;:&quot;10.1109/TPWRS.2011.2166091&quot;,&quot;ISSN&quot;:&quot;0885-8950&quot;,&quot;issued&quot;:{&quot;date-parts&quot;:[[2012,2]]},&quot;page&quot;:&quot;373-380&quot;,&quot;issue&quot;:&quot;1&quot;,&quot;volume&quot;:&quot;27&quot;,&quot;container-title-short&quot;:&quot;&quot;},&quot;isTemporary&quot;:false}]},{&quot;citationID&quot;:&quot;MENDELEY_CITATION_2803f5df-7f60-4bed-8861-5d6e31d32156&quot;,&quot;properties&quot;:{&quot;noteIndex&quot;:0},&quot;isEdited&quot;:false,&quot;manualOverride&quot;:{&quot;isManuallyOverridden&quot;:false,&quot;citeprocText&quot;:&quot;[53]&quot;,&quot;manualOverrideText&quot;:&quot;&quot;},&quot;citationTag&quot;:&quot;MENDELEY_CITATION_v3_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&quot;,&quot;citationItems&quot;:[{&quot;id&quot;:&quot;e54e5b56-d131-3a66-9ffb-14ae92ea0215&quot;,&quot;itemData&quot;:{&quot;type&quot;:&quot;article-journal&quot;,&quot;id&quot;:&quot;e54e5b56-d131-3a66-9ffb-14ae92ea0215&quot;,&quot;title&quot;:&quot;Policy Gradient Methods in Deep Reinforcement Learning&quot;,&quot;author&quot;:[{&quot;family&quot;:&quot;Gao&quot;,&quot;given&quot;:&quot;Yuhan&quot;,&quot;parse-names&quot;:false,&quot;dropping-particle&quot;:&quot;&quot;,&quot;non-dropping-particle&quot;:&quot;&quot;}],&quot;container-title&quot;:&quot;Applied and Computational Engineering&quot;,&quot;DOI&quot;:&quot;10.54254/2755-2721/2025.TJ23321&quot;,&quot;ISSN&quot;:&quot;2755-2721&quot;,&quot;issued&quot;:{&quot;date-parts&quot;:[[2025,5,22]]},&quot;page&quot;:&quot;27-34&quot;,&quot;abstract&quot;:&quot;&lt;p&gt;Policy gradient (PG) methods are a fundamental component of deep reinforcement learning (DRL), particularly effective in continuous and high-dimensional control tasks. This paper presents a structured review of PG algorithms, tracing their development from basic Monte Carlo methods like REINFORCE to advanced techniques such as asynchronous advantage actor-critic (A3C), trust region policy optimization (TRPO), proximal policy optimization (PPO), deep deterministic policy gradient (DDPG), and soft actor-critic (SAC). These methods differ in terms of policy structure, optimization stability, and sample efficiency, addressing core challenges in policy learning through gradient-based updates. In addition, this review explores the application of PG methods in real-world domains, including autonomous driving, financial portfolio management, and smart grid energy systems. These applications demonstrate PG methods’ capacity to operate under uncertainty and adapt to complex dynamic environments. However, limitations such as high variance, low sample efficiency, and instability in multi-agent and offline settings remain significant obstacles. The review concludes by outlining emerging research directions, including entropy-based exploration, model-based policy optimization, meta-learning, and Transformer-based sequence modeling. This work aims to offer theoretical insights and practical guidance to support the continued advancement and application of policy gradient methods in reinforcement learning.&lt;/p&gt;&quot;,&quot;issue&quot;:&quot;1&quot;,&quot;volume&quot;:&quot;158&quot;,&quot;container-title-short&quot;:&quot;&quot;},&quot;isTemporary&quot;:false}]},{&quot;citationID&quot;:&quot;MENDELEY_CITATION_6b0aa260-f728-4cb7-8d42-c258b6a59a24&quot;,&quot;properties&quot;:{&quot;noteIndex&quot;:0},&quot;isEdited&quot;:false,&quot;manualOverride&quot;:{&quot;isManuallyOverridden&quot;:false,&quot;citeprocText&quot;:&quot;[54]&quot;,&quot;manualOverrideText&quot;:&quot;&quot;},&quot;citationTag&quot;:&quot;MENDELEY_CITATION_v3_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&quot;,&quot;citationItems&quot;:[{&quot;id&quot;:&quot;695f87ef-b1a7-3d24-bf63-54c6c4a9499c&quot;,&quot;itemData&quot;:{&quot;type&quot;:&quot;article-journal&quot;,&quot;id&quot;:&quot;695f87ef-b1a7-3d24-bf63-54c6c4a9499c&quot;,&quot;title&quot;:&quot;Reinforcement Learning and Its Applications in Modern Power and Energy Systems: A Review&quot;,&quot;author&quot;:[{&quot;family&quot;:&quot;Cao&quot;,&quot;given&quot;:&quot;Di&quot;,&quot;parse-names&quot;:false,&quot;dropping-particle&quot;:&quot;&quot;,&quot;non-dropping-particle&quot;:&quot;&quot;},{&quot;family&quot;:&quot;Hu&quot;,&quot;given&quot;:&quot;Weihao&quot;,&quot;parse-names&quot;:false,&quot;dropping-particle&quot;:&quot;&quot;,&quot;non-dropping-particle&quot;:&quot;&quot;},{&quot;family&quot;:&quot;Zhao&quot;,&quot;given&quot;:&quot;Junbo&quot;,&quot;parse-names&quot;:false,&quot;dropping-particle&quot;:&quot;&quot;,&quot;non-dropping-particle&quot;:&quot;&quot;},{&quot;family&quot;:&quot;Zhang&quot;,&quot;given&quot;:&quot;Guozhou&quot;,&quot;parse-names&quot;:false,&quot;dropping-particle&quot;:&quot;&quot;,&quot;non-dropping-particle&quot;:&quot;&quot;},{&quot;family&quot;:&quot;Zhang&quot;,&quot;given&quot;:&quot;Bin&quot;,&quot;parse-names&quot;:false,&quot;dropping-particle&quot;:&quot;&quot;,&quot;non-dropping-particle&quot;:&quot;&quot;},{&quot;family&quot;:&quot;Liu&quot;,&quot;given&quot;:&quot;Zhou&quot;,&quot;parse-names&quot;:false,&quot;dropping-particle&quot;:&quot;&quot;,&quot;non-dropping-particle&quot;:&quot;&quot;},{&quot;family&quot;:&quot;Chen&quot;,&quot;given&quot;:&quot;Zhe&quot;,&quot;parse-names&quot;:false,&quot;dropping-particle&quot;:&quot;&quot;,&quot;non-dropping-particle&quot;:&quot;&quot;},{&quot;family&quot;:&quot;Blaabjerg&quot;,&quot;given&quot;:&quot;Frede&quot;,&quot;parse-names&quot;:false,&quot;dropping-particle&quot;:&quot;&quot;,&quot;non-dropping-particle&quot;:&quot;&quot;}],&quot;container-title&quot;:&quot;Journal of Modern Power Systems and Clean Energy&quot;,&quot;DOI&quot;:&quot;10.35833/MPCE.2020.000552&quot;,&quot;ISSN&quot;:&quot;2196-5625&quot;,&quot;issued&quot;:{&quot;date-parts&quot;:[[2020]]},&quot;page&quot;:&quot;1029-1042&quot;,&quot;issue&quot;:&quot;6&quot;,&quot;volume&quot;:&quot;8&quot;,&quot;container-title-short&quot;:&quot;&quot;},&quot;isTemporary&quot;:false}]},{&quot;citationID&quot;:&quot;MENDELEY_CITATION_77016d76-bbff-470c-acaf-6a996a49373b&quot;,&quot;properties&quot;:{&quot;noteIndex&quot;:0},&quot;isEdited&quot;:false,&quot;manualOverride&quot;:{&quot;isManuallyOverridden&quot;:false,&quot;citeprocText&quot;:&quot;[55]&quot;,&quot;manualOverrideText&quot;:&quot;&quot;},&quot;citationTag&quot;:&quot;MENDELEY_CITATION_v3_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&quot;,&quot;citationItems&quot;:[{&quot;id&quot;:&quot;e45cab0b-e52f-3cff-b734-fbaac9d65a24&quot;,&quot;itemData&quot;:{&quot;type&quot;:&quot;paper-conference&quot;,&quot;id&quot;:&quot;e45cab0b-e52f-3cff-b734-fbaac9d65a24&quot;,&quot;title&quot;:&quot;Performance Comparison of Deep RL Algorithms for Energy Systems Optimal Scheduling&quot;,&quot;author&quot;:[{&quot;family&quot;:&quot;Shengren&quot;,&quot;given&quot;:&quot;Hou&quot;,&quot;parse-names&quot;:false,&quot;dropping-particle&quot;:&quot;&quot;,&quot;non-dropping-particle&quot;:&quot;&quot;},{&quot;family&quot;:&quot;Salazar&quot;,&quot;given&quot;:&quot;Edgar Mauricio&quot;,&quot;parse-names&quot;:false,&quot;dropping-particle&quot;:&quot;&quot;,&quot;non-dropping-particle&quot;:&quot;&quot;},{&quot;family&quot;:&quot;Vergara&quot;,&quot;given&quot;:&quot;Pedro P.&quot;,&quot;parse-names&quot;:false,&quot;dropping-particle&quot;:&quot;&quot;,&quot;non-dropping-particle&quot;:&quot;&quot;},{&quot;family&quot;:&quot;Palensky&quot;,&quot;given&quot;:&quot;Peter&quot;,&quot;parse-names&quot;:false,&quot;dropping-particle&quot;:&quot;&quot;,&quot;non-dropping-particle&quot;:&quot;&quot;}],&quot;container-title&quot;:&quot;2022 IEEE PES Innovative Smart Grid Technologies Conference Europe (ISGT-Europe)&quot;,&quot;DOI&quot;:&quot;10.1109/ISGT-Europe54678.2022.9960642&quot;,&quot;ISBN&quot;:&quot;978-1-6654-8032-1&quot;,&quot;issued&quot;:{&quot;date-parts&quot;:[[2022,10,10]]},&quot;page&quot;:&quot;1-6&quot;,&quot;publisher&quot;:&quot;IEEE&quot;,&quot;container-title-short&quot;:&quot;&quot;},&quot;isTemporary&quot;:false}]},{&quot;citationID&quot;:&quot;MENDELEY_CITATION_fb2fc071-3f5b-4fb6-b316-f06ec1993bea&quot;,&quot;properties&quot;:{&quot;noteIndex&quot;:0},&quot;isEdited&quot;:false,&quot;manualOverride&quot;:{&quot;isManuallyOverridden&quot;:false,&quot;citeprocText&quot;:&quot;[47], [56]&quot;,&quot;manualOverrideText&quot;:&quot;&quot;},&quot;citationTag&quot;:&quot;MENDELEY_CITATION_v3_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&quot;,&quot;citationItems&quot;:[{&quot;id&quot;:&quot;287b606c-b40e-3f97-b41d-bcd33d0ee05c&quot;,&quot;itemData&quot;:{&quot;type&quot;:&quot;article-journal&quot;,&quot;id&quot;:&quot;287b606c-b40e-3f97-b41d-bcd33d0ee05c&quot;,&quot;title&quot;:&quot;Reward Shaping-Based Actor–Critic Deep Reinforcement Learning for Residential Energy Management&quot;,&quot;author&quot;:[{&quot;family&quot;:&quot;Lu&quot;,&quot;given&quot;:&quot;Renzhi&quot;,&quot;parse-names&quot;:false,&quot;dropping-particle&quot;:&quot;&quot;,&quot;non-dropping-particle&quot;:&quot;&quot;},{&quot;family&quot;:&quot;Jiang&quot;,&quot;given&quot;:&quot;Zhenyu&quot;,&quot;parse-names&quot;:false,&quot;dropping-particle&quot;:&quot;&quot;,&quot;non-dropping-particle&quot;:&quot;&quot;},{&quot;family&quot;:&quot;Wu&quot;,&quot;given&quot;:&quot;Huaming&quot;,&quot;parse-names&quot;:false,&quot;dropping-particle&quot;:&quot;&quot;,&quot;non-dropping-particle&quot;:&quot;&quot;},{&quot;family&quot;:&quot;Ding&quot;,&quot;given&quot;:&quot;Yuemin&quot;,&quot;parse-names&quot;:false,&quot;dropping-particle&quot;:&quot;&quot;,&quot;non-dropping-particle&quot;:&quot;&quot;},{&quot;family&quot;:&quot;Wang&quot;,&quot;given&quot;:&quot;Dong&quot;,&quot;parse-names&quot;:false,&quot;dropping-particle&quot;:&quot;&quot;,&quot;non-dropping-particle&quot;:&quot;&quot;},{&quot;family&quot;:&quot;Zhang&quot;,&quot;given&quot;:&quot;Hai-Tao&quot;,&quot;parse-names&quot;:false,&quot;dropping-particle&quot;:&quot;&quot;,&quot;non-dropping-particle&quot;:&quot;&quot;}],&quot;container-title&quot;:&quot;IEEE Transactions on Industrial Informatics&quot;,&quot;container-title-short&quot;:&quot;IEEE Trans. Industr. Inform.&quot;,&quot;DOI&quot;:&quot;10.1109/TII.2022.3183802&quot;,&quot;ISSN&quot;:&quot;1551-3203&quot;,&quot;issued&quot;:{&quot;date-parts&quot;:[[2023,3]]},&quot;page&quot;:&quot;2662-2673&quot;,&quot;issue&quot;:&quot;3&quot;,&quot;volume&quot;:&quot;19&quot;},&quot;isTemporary&quot;:false},{&quot;id&quot;:&quot;b748b453-1bc9-3b06-a2bc-accd4d93d9d9&quot;,&quot;itemData&quot;:{&quot;type&quot;:&quot;article-journal&quot;,&quot;id&quot;:&quot;b748b453-1bc9-3b06-a2bc-accd4d93d9d9&quot;,&quot;title&quot;:&quot;Applications of reinforcement learning in energy systems&quot;,&quot;author&quot;:[{&quot;family&quot;:&quot;Perera&quot;,&quot;given&quot;:&quot;A.T.D.&quot;,&quot;parse-names&quot;:false,&quot;dropping-particle&quot;:&quot;&quot;,&quot;non-dropping-particle&quot;:&quot;&quot;},{&quot;family&quot;:&quot;Kamalaruban&quot;,&quot;given&quot;:&quot;Parameswaran&quot;,&quot;parse-names&quot;:false,&quot;dropping-particle&quot;:&quot;&quot;,&quot;non-dropping-particle&quot;:&quot;&quot;}],&quot;container-title&quot;:&quot;Renewable and Sustainable Energy Reviews&quot;,&quot;DOI&quot;:&quot;10.1016/j.rser.2020.110618&quot;,&quot;ISSN&quot;:&quot;13640321&quot;,&quot;issued&quot;:{&quot;date-parts&quot;:[[2021,3]]},&quot;page&quot;:&quot;110618&quot;,&quot;volume&quot;:&quot;137&quot;},&quot;isTemporary&quot;:false}]},{&quot;citationID&quot;:&quot;MENDELEY_CITATION_0a510372-57a7-426b-836c-f53f7d26b1fe&quot;,&quot;properties&quot;:{&quot;noteIndex&quot;:0},&quot;isEdited&quot;:false,&quot;manualOverride&quot;:{&quot;isManuallyOverridden&quot;:false,&quot;citeprocText&quot;:&quot;[26]&quot;,&quot;manualOverrideText&quot;:&quot;&quot;},&quot;citationTag&quot;:&quot;MENDELEY_CITATION_v3_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&quot;,&quot;citationItems&quot;:[{&quot;id&quot;:&quot;31848458-a34e-370b-af77-81d1d893a1c5&quot;,&quot;itemData&quot;:{&quot;type&quot;:&quot;article-journal&quot;,&quot;id&quot;:&quot;31848458-a34e-370b-af77-81d1d893a1c5&quot;,&quot;title&quot;:&quot;Deep Reinforcement Learning Approaches the MILP Optimum of a Multi-Energy Optimization in Energy Communities&quot;,&quot;author&quot;:[{&quot;family&quot;:&quot;Vetter&quot;,&quot;given&quot;:&quot;Vinzent&quot;,&quot;parse-names&quot;:false,&quot;dropping-particle&quot;:&quot;&quot;,&quot;non-dropping-particle&quot;:&quot;&quot;},{&quot;family&quot;:&quot;Wohlgenannt&quot;,&quot;given&quot;:&quot;Philipp&quot;,&quot;parse-names&quot;:false,&quot;dropping-particle&quot;:&quot;&quot;,&quot;non-dropping-particle&quot;:&quot;&quot;},{&quot;family&quot;:&quot;Kepplinger&quot;,&quot;given&quot;:&quot;Peter&quot;,&quot;parse-names&quot;:false,&quot;dropping-particle&quot;:&quot;&quot;,&quot;non-dropping-particle&quot;:&quot;&quot;},{&quot;family&quot;:&quot;Eder&quot;,&quot;given&quot;:&quot;Elias&quot;,&quot;parse-names&quot;:false,&quot;dropping-particle&quot;:&quot;&quot;,&quot;non-dropping-particle&quot;:&quot;&quot;}],&quot;container-title&quot;:&quot;Energies&quot;,&quot;DOI&quot;:&quot;10.3390/en18174489&quot;,&quot;ISSN&quot;:&quot;1996-1073&quot;,&quot;issued&quot;:{&quot;date-parts&quot;:[[2025,8,23]]},&quot;page&quot;:&quot;4489&quot;,&quot;abstract&quot;:&quot;&lt;p&gt;As energy systems transition toward high shares of variable renewable generation, local energy communities (ECs) are increasingly relevant for enabling demand-side flexibility and self-sufficiency. This shift is particularly evident in the residential sector, where the deployment of photovoltaic (PV) systems is rapidly growing. While mixed-integer linear programming (MILP) remains the standard for operational optimization and demand response in such systems, its computational burden limits scalability and responsiveness under real-time or uncertain conditions. Reinforcement learning (RL), by contrast, offers a model-free, adaptive alternative. However, its application to real-world energy system operation remains limited. This study explores the application of a Deep Q-Network (DQN) to a real residential EC, which has received limited attention in prior work. The system comprises three single-family homes sharing a centralized heating system with a thermal energy storage (TES), a PV installation, and a grid connection. We compare the performance of MILP and RL controllers across economic and environmental metrics. Relative to a reference scenario without TES, MILP and RL reduce energy costs by 10.06% and 8.78%, respectively, and both approaches yield lower total energy consumption and CO2-equivalent emissions. Notably, the trained RL agent achieves a near-optimal outcome while requiring only 22% of the MILP’s computation time. These results demonstrate that DQNs can offer a computationally efficient and practically viable alternative to MILP for real-time control in residential energy systems.&lt;/p&gt;&quot;,&quot;issue&quot;:&quot;17&quot;,&quot;volume&quot;:&quot;18&quot;,&quot;container-title-short&quot;:&quot;Energies (Basel).&quot;},&quot;isTemporary&quot;:false}]},{&quot;citationID&quot;:&quot;MENDELEY_CITATION_d44b77f0-61f7-4c28-821a-92a263b68faa&quot;,&quot;properties&quot;:{&quot;noteIndex&quot;:0},&quot;isEdited&quot;:false,&quot;manualOverride&quot;:{&quot;isManuallyOverridden&quot;:false,&quot;citeprocText&quot;:&quot;[57]&quot;,&quot;manualOverrideText&quot;:&quot;&quot;},&quot;citationTag&quot;:&quot;MENDELEY_CITATION_v3_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&quot;,&quot;citationItems&quot;:[{&quot;id&quot;:&quot;878a73bd-0c5d-3e77-a841-71aeb93db99a&quot;,&quot;itemData&quot;:{&quot;type&quot;:&quot;article-journal&quot;,&quot;id&quot;:&quot;878a73bd-0c5d-3e77-a841-71aeb93db99a&quot;,&quot;title&quot;:&quot;Reinforcement Learning for Joint Design and Control of Battery-PV Systems&quot;,&quot;author&quot;:[{&quot;family&quot;:&quot;Cauz&quot;,&quot;given&quot;:&quot;Marine&quot;,&quot;parse-names&quot;:false,&quot;dropping-particle&quot;:&quot;&quot;,&quot;non-dropping-particle&quot;:&quot;&quot;},{&quot;family&quot;:&quot;Bolland&quot;,&quot;given&quot;:&quot;Adrien&quot;,&quot;parse-names&quot;:false,&quot;dropping-particle&quot;:&quot;&quot;,&quot;non-dropping-particle&quot;:&quot;&quot;},{&quot;family&quot;:&quot;Miftari&quot;,&quot;given&quot;:&quot;Bardhyl&quot;,&quot;parse-names&quot;:false,&quot;dropping-particle&quot;:&quot;&quot;,&quot;non-dropping-particle&quot;:&quot;&quot;},{&quot;family&quot;:&quot;Perret&quot;,&quot;given&quot;:&quot;Lionel&quot;,&quot;parse-names&quot;:false,&quot;dropping-particle&quot;:&quot;&quot;,&quot;non-dropping-particle&quot;:&quot;&quot;},{&quot;family&quot;:&quot;Ballif&quot;,&quot;given&quot;:&quot;Christophe&quot;,&quot;parse-names&quot;:false,&quot;dropping-particle&quot;:&quot;&quot;,&quot;non-dropping-particle&quot;:&quot;&quot;},{&quot;family&quot;:&quot;Wyrsch&quot;,&quot;given&quot;:&quot;Nicolas&quot;,&quot;parse-names&quot;:false,&quot;dropping-particle&quot;:&quot;&quot;,&quot;non-dropping-particle&quot;:&quot;&quot;}],&quot;URL&quot;:&quot;http://arxiv.org/abs/2307.04244&quot;,&quot;issued&quot;:{&quot;date-parts&quot;:[[2023,7,9]]},&quot;abstract&quot;:&quot;The decentralisation and unpredictability of new renewable energy sources require rethinking our energy system. Data-driven approaches, such as reinforcement learning (RL), have emerged as new control strategies for operating these systems, but they have not yet been applied to system design. This paper aims to bridge this gap by studying the use of an RL-based method for joint design and control of a real-world PV and battery system. The design problem is first formulated as a mixed-integer linear programming problem (MILP). The optimal MILP solution is then used to evaluate the performance of an RL agent trained in a surrogate environment designed for applying an existing data-driven algorithm. The main difference between the two models lies in their optimization approaches: while MILP finds a solution that minimizes the total costs for a one-year operation given the deterministic historical data, RL is a stochastic method that searches for an optimal strategy over one week of data on expectation over all weeks in the historical dataset. Both methods were applied on a toy example using one-week data and on a case study using one-year data. In both cases, models were found to converge to similar control solutions, but their investment decisions differed. Overall, these outcomes are an initial step illustrating benefits and challenges of using RL for the joint design and control of energy systems.&quot;,&quot;container-title-short&quot;:&quot;&quot;},&quot;isTemporary&quot;:false}]},{&quot;citationID&quot;:&quot;MENDELEY_CITATION_ad01b917-344f-4c3a-bbf6-4c037af3c5a8&quot;,&quot;properties&quot;:{&quot;noteIndex&quot;:0},&quot;isEdited&quot;:false,&quot;manualOverride&quot;:{&quot;isManuallyOverridden&quot;:false,&quot;citeprocText&quot;:&quot;[58]&quot;,&quot;manualOverrideText&quot;:&quot;&quot;},&quot;citationTag&quot;:&quot;MENDELEY_CITATION_v3_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&quot;,&quot;citationItems&quot;:[{&quot;id&quot;:&quot;f9d59068-a5c5-321b-98f4-f48ae0ee5cc2&quot;,&quot;itemData&quot;:{&quot;type&quot;:&quot;article-journal&quot;,&quot;id&quot;:&quot;f9d59068-a5c5-321b-98f4-f48ae0ee5cc2&quot;,&quot;title&quot;:&quot;Reinforcement Learning-Based Energy Management for Hybrid Power Systems: State-of-the-Art Survey, Review, and Perspectives&quot;,&quot;author&quot;:[{&quot;family&quot;:&quot;Tang&quot;,&quot;given&quot;:&quot;Xiaolin&quot;,&quot;parse-names&quot;:false,&quot;dropping-particle&quot;:&quot;&quot;,&quot;non-dropping-particle&quot;:&quot;&quot;},{&quot;family&quot;:&quot;Chen&quot;,&quot;given&quot;:&quot;Jiaxin&quot;,&quot;parse-names&quot;:false,&quot;dropping-particle&quot;:&quot;&quot;,&quot;non-dropping-particle&quot;:&quot;&quot;},{&quot;family&quot;:&quot;Qin&quot;,&quot;given&quot;:&quot;Yechen&quot;,&quot;parse-names&quot;:false,&quot;dropping-particle&quot;:&quot;&quot;,&quot;non-dropping-particle&quot;:&quot;&quot;},{&quot;family&quot;:&quot;Liu&quot;,&quot;given&quot;:&quot;Teng&quot;,&quot;parse-names&quot;:false,&quot;dropping-particle&quot;:&quot;&quot;,&quot;non-dropping-particle&quot;:&quot;&quot;},{&quot;family&quot;:&quot;Yang&quot;,&quot;given&quot;:&quot;Kai&quot;,&quot;parse-names&quot;:false,&quot;dropping-particle&quot;:&quot;&quot;,&quot;non-dropping-particle&quot;:&quot;&quot;},{&quot;family&quot;:&quot;Khajepour&quot;,&quot;given&quot;:&quot;Amir&quot;,&quot;parse-names&quot;:false,&quot;dropping-particle&quot;:&quot;&quot;,&quot;non-dropping-particle&quot;:&quot;&quot;},{&quot;family&quot;:&quot;Li&quot;,&quot;given&quot;:&quot;Shen&quot;,&quot;parse-names&quot;:false,&quot;dropping-particle&quot;:&quot;&quot;,&quot;non-dropping-particle&quot;:&quot;&quot;}],&quot;container-title&quot;:&quot;Chinese Journal of Mechanical Engineering&quot;,&quot;DOI&quot;:&quot;10.1186/s10033-024-01026-4&quot;,&quot;ISSN&quot;:&quot;2192-8258&quot;,&quot;issued&quot;:{&quot;date-parts&quot;:[[2024,5,17]]},&quot;page&quot;:&quot;43&quot;,&quot;abstract&quot;:&quot;&lt;p&gt;The new energy vehicle plays a crucial role in green transportation, and the energy management strategy of hybrid power systems is essential for ensuring energy-efficient driving. This paper presents a state-of-the-art survey and review of reinforcement learning-based energy management strategies for hybrid power systems. Additionally, it envisions the outlook for autonomous intelligent hybrid electric vehicles, with reinforcement learning as the foundational technology. First of all, to provide a macro view of historical development, the brief history of deep learning, reinforcement learning, and deep reinforcement learning is presented in the form of a timeline. Then, the comprehensive survey and review are conducted by collecting papers from mainstream academic databases. Enumerating most of the contributions based on three main directions—algorithm innovation, powertrain innovation, and environment innovation—provides an objective review of the research status. Finally, to advance the application of reinforcement learning in autonomous intelligent hybrid electric vehicles, future research plans positioned as “Alpha HEV” are envisioned, integrating Autopilot and energy-saving control.&lt;/p&gt;&quot;,&quot;issue&quot;:&quot;1&quot;,&quot;volume&quot;:&quot;37&quot;,&quot;container-title-short&quot;:&quot;&quot;},&quot;isTemporary&quot;:false}]}]"/>
+    <we:property name="MENDELEY_CITATIONS" value="[{&quot;citationID&quot;:&quot;MENDELEY_CITATION_9a69a8b0-b116-4a8e-be9e-ca9faac00dd4&quot;,&quot;properties&quot;:{&quot;noteIndex&quot;:0},&quot;isEdited&quot;:false,&quot;manualOverride&quot;:{&quot;isManuallyOverridden&quot;:false,&quot;citeprocText&quot;:&quot;[1]&quot;,&quot;manualOverrideText&quot;:&quot;&quot;},&quot;citationTag&quot;:&quot;MENDELEY_CITATION_v3_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&quot;,&quot;citationItems&quot;:[{&quot;id&quot;:&quot;9f54496b-fc3d-3546-b057-55b552d0253d&quot;,&quot;itemData&quot;:{&quot;type&quot;:&quot;article-journal&quot;,&quot;id&quot;:&quot;9f54496b-fc3d-3546-b057-55b552d0253d&quot;,&quot;title&quot;:&quot;Hard-to-Abate Sectors: The role of industrial carbon capture and storage (CCS) in emission mitigation&quot;,&quot;author&quot;:[{&quot;family&quot;:&quot;Paltsev&quot;,&quot;given&quot;:&quot;Sergey&quot;,&quot;parse-names&quot;:false,&quot;dropping-particle&quot;:&quot;&quot;,&quot;non-dropping-particle&quot;:&quot;&quot;},{&quot;family&quot;:&quot;Morris&quot;,&quot;given&quot;:&quot;Jennifer&quot;,&quot;parse-names&quot;:false,&quot;dropping-particle&quot;:&quot;&quot;,&quot;non-dropping-particle&quot;:&quot;&quot;},{&quot;family&quot;:&quot;Kheshgi&quot;,&quot;given&quot;:&quot;Haroon&quot;,&quot;parse-names&quot;:false,&quot;dropping-particle&quot;:&quot;&quot;,&quot;non-dropping-particle&quot;:&quot;&quot;},{&quot;family&quot;:&quot;Herzog&quot;,&quot;given&quot;:&quot;Howard&quot;,&quot;parse-names&quot;:false,&quot;dropping-particle&quot;:&quot;&quot;,&quot;non-dropping-particle&quot;:&quot;&quot;}],&quot;container-title&quot;:&quot;Applied Energy&quot;,&quot;DOI&quot;:&quot;10.1016/j.apenergy.2021.117322&quot;,&quot;ISSN&quot;:&quot;03062619&quot;,&quot;issued&quot;:{&quot;date-parts&quot;:[[2021,10]]},&quot;page&quot;:&quot;117322&quot;,&quot;volume&quot;:&quot;300&quot;,&quot;container-title-short&quot;:&quot;Appl. Energy&quot;},&quot;isTemporary&quot;:false}]},{&quot;citationID&quot;:&quot;MENDELEY_CITATION_8d7bd39f-5014-4a97-bce1-d22efa7dbd0b&quot;,&quot;properties&quot;:{&quot;noteIndex&quot;:0},&quot;isEdited&quot;:false,&quot;manualOverride&quot;:{&quot;isManuallyOverridden&quot;:false,&quot;citeprocText&quot;:&quot;[2]&quot;,&quot;manualOverrideText&quot;:&quot;&quot;},&quot;citationTag&quot;:&quot;MENDELEY_CITATION_v3_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&quot;,&quot;citationItems&quot;:[{&quot;id&quot;:&quot;956a38fa-e422-3333-a9ab-81f96dae1644&quot;,&quot;itemData&quot;:{&quot;type&quot;:&quot;article-journal&quot;,&quot;id&quot;:&quot;956a38fa-e422-3333-a9ab-81f96dae1644&quot;,&quot;title&quot;:&quot;Decarbonizing Hard-to-Abate Sectors with Renewable Hydrogen: A Real Case Application to the Ceramics Industry&quot;,&quot;author&quot;:[{&quot;family&quot;:&quot;Sousa&quot;,&quot;given&quot;:&quot;Jorge&quot;,&quot;parse-names&quot;:false,&quot;dropping-particle&quot;:&quot;&quot;,&quot;non-dropping-particle&quot;:&quot;&quot;},{&quot;family&quot;:&quot;Azevedo&quot;,&quot;given&quot;:&quot;Inês&quot;,&quot;parse-names&quot;:false,&quot;dropping-particle&quot;:&quot;&quot;,&quot;non-dropping-particle&quot;:&quot;&quot;},{&quot;family&quot;:&quot;Camus&quot;,&quot;given&quot;:&quot;Cristina&quot;,&quot;parse-names&quot;:false,&quot;dropping-particle&quot;:&quot;&quot;,&quot;non-dropping-particle&quot;:&quot;&quot;},{&quot;family&quot;:&quot;Mendes&quot;,&quot;given&quot;:&quot;Luís&quot;,&quot;parse-names&quot;:false,&quot;dropping-particle&quot;:&quot;&quot;,&quot;non-dropping-particle&quot;:&quot;&quot;},{&quot;family&quot;:&quot;Viveiros&quot;,&quot;given&quot;:&quot;Carla&quot;,&quot;parse-names&quot;:false,&quot;dropping-particle&quot;:&quot;&quot;,&quot;non-dropping-particle&quot;:&quot;&quot;},{&quot;family&quot;:&quot;Barata&quot;,&quot;given&quot;:&quot;Filipe&quot;,&quot;parse-names&quot;:false,&quot;dropping-particle&quot;:&quot;&quot;,&quot;non-dropping-particle&quot;:&quot;&quot;}],&quot;container-title&quot;:&quot;Energies&quot;,&quot;DOI&quot;:&quot;10.3390/en17153661&quot;,&quot;ISSN&quot;:&quot;1996-1073&quot;,&quot;issued&quot;:{&quot;date-parts&quot;:[[2024,7,25]]},&quot;page&quot;:&quot;3661&quot;,&quot;abstract&quot;:&quot;&lt;p&gt;Hydrogen produced from renewable energy sources is a valuable energy carrier for linking growing renewable electricity generation with the hard-to-abate sectors, such as cement, steel, glass, chemical, and ceramics industries. In this context, this paper presents a new model of hydrogen production based on solar photovoltaics and wind energy with application to a real-world ceramics factory. For this task, a novel multipurpose profit-maximizing model is implemented using GAMS. The developed model explores hydrogen production with multiple value streams that enable technical and economical informed decisions under specific scenarios. Our results show that it is profitable to sell the hydrogen produced to the gas grid rather than using it for self-consumption for low-gas-price scenarios. On the other hand, when the price of gas is significantly high, it is more profitable to use as much hydrogen as possible for self-consumption to supply the factory and reduce the internal use of natural gas. The role of electricity self-consumption has proven to be key for the project’s profitability as, without this revenue stream, the project would not be profitable in any analysed scenario.&lt;/p&gt;&quot;,&quot;issue&quot;:&quot;15&quot;,&quot;volume&quot;:&quot;17&quot;,&quot;container-title-short&quot;:&quot;Energies (Basel).&quot;},&quot;isTemporary&quot;:false}]},{&quot;citationID&quot;:&quot;MENDELEY_CITATION_cc9a11a7-48e8-4bcd-9601-05385ccebf02&quot;,&quot;properties&quot;:{&quot;noteIndex&quot;:0},&quot;isEdited&quot;:false,&quot;manualOverride&quot;:{&quot;isManuallyOverridden&quot;:false,&quot;citeprocText&quot;:&quot;[3]&quot;,&quot;manualOverrideText&quot;:&quot;&quot;},&quot;citationTag&quot;:&quot;MENDELEY_CITATION_v3_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&quot;,&quot;citationItems&quot;:[{&quot;id&quot;:&quot;66781a91-8ce9-38c0-8b80-b0de4bdb3cc9&quot;,&quot;itemData&quot;:{&quot;type&quot;:&quot;article-journal&quot;,&quot;id&quot;:&quot;66781a91-8ce9-38c0-8b80-b0de4bdb3cc9&quot;,&quot;title&quot;:&quot;From green hydrogen to electricity: A review on recent advances, challenges, and opportunities on power-to-hydrogen-to-power systems&quot;,&quot;author&quot;:[{&quot;family&quot;:&quot;Risco-Bravo&quot;,&quot;given&quot;:&quot;A.&quot;,&quot;parse-names&quot;:false,&quot;dropping-particle&quot;:&quot;&quot;,&quot;non-dropping-particle&quot;:&quot;&quot;},{&quot;family&quot;:&quot;Varela&quot;,&quot;given&quot;:&quot;C.&quot;,&quot;parse-names&quot;:false,&quot;dropping-particle&quot;:&quot;&quot;,&quot;non-dropping-particle&quot;:&quot;&quot;},{&quot;family&quot;:&quot;Bartels&quot;,&quot;given&quot;:&quot;J.&quot;,&quot;parse-names&quot;:false,&quot;dropping-particle&quot;:&quot;&quot;,&quot;non-dropping-particle&quot;:&quot;&quot;},{&quot;family&quot;:&quot;Zondervan&quot;,&quot;given&quot;:&quot;E.&quot;,&quot;parse-names&quot;:false,&quot;dropping-particle&quot;:&quot;&quot;,&quot;non-dropping-particle&quot;:&quot;&quot;}],&quot;container-title&quot;:&quot;Renewable and Sustainable Energy Reviews&quot;,&quot;DOI&quot;:&quot;10.1016/j.rser.2023.113930&quot;,&quot;ISSN&quot;:&quot;13640321&quot;,&quot;issued&quot;:{&quot;date-parts&quot;:[[2024,1]]},&quot;page&quot;:&quot;113930&quot;,&quot;volume&quot;:&quot;189&quot;,&quot;container-title-short&quot;:&quot;&quot;},&quot;isTemporary&quot;:false}]},{&quot;citationID&quot;:&quot;MENDELEY_CITATION_10ebcc1d-9e7d-475c-9706-140f1e237e74&quot;,&quot;properties&quot;:{&quot;noteIndex&quot;:0},&quot;isEdited&quot;:false,&quot;manualOverride&quot;:{&quot;isManuallyOverridden&quot;:false,&quot;citeprocText&quot;:&quot;[4]&quot;,&quot;manualOverrideText&quot;:&quot;&quot;},&quot;citationTag&quot;:&quot;MENDELEY_CITATION_v3_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&quot;,&quot;citationItems&quot;:[{&quot;id&quot;:&quot;d00ceab6-c269-3d86-a58b-dd8be99f154b&quot;,&quot;itemData&quot;:{&quot;type&quot;:&quot;article-journal&quot;,&quot;id&quot;:&quot;d00ceab6-c269-3d86-a58b-dd8be99f154b&quot;,&quot;title&quot;:&quot;A comprehensive review of optimizing hybrid renewable energy system using optimization techniques&quot;,&quot;author&quot;:[{&quot;family&quot;:&quot;Yao&quot;,&quot;given&quot;:&quot;Ye&quot;,&quot;parse-names&quot;:false,&quot;dropping-particle&quot;:&quot;&quot;,&quot;non-dropping-particle&quot;:&quot;&quot;},{&quot;family&quot;:&quot;Wang&quot;,&quot;given&quot;:&quot;Zhen&quot;,&quot;parse-names&quot;:false,&quot;dropping-particle&quot;:&quot;&quot;,&quot;non-dropping-particle&quot;:&quot;&quot;},{&quot;family&quot;:&quot;Ma&quot;,&quot;given&quot;:&quot;Chao&quot;,&quot;parse-names&quot;:false,&quot;dropping-particle&quot;:&quot;&quot;,&quot;non-dropping-particle&quot;:&quot;&quot;},{&quot;family&quot;:&quot;Liu&quot;,&quot;given&quot;:&quot;Mengmeng&quot;,&quot;parse-names&quot;:false,&quot;dropping-particle&quot;:&quot;&quot;,&quot;non-dropping-particle&quot;:&quot;&quot;},{&quot;family&quot;:&quot;Qi&quot;,&quot;given&quot;:&quot;Wenchao&quot;,&quot;parse-names&quot;:false,&quot;dropping-particle&quot;:&quot;&quot;,&quot;non-dropping-particle&quot;:&quot;&quot;},{&quot;family&quot;:&quot;Yang&quot;,&quot;given&quot;:&quot;Xiuwei&quot;,&quot;parse-names&quot;:false,&quot;dropping-particle&quot;:&quot;&quot;,&quot;non-dropping-particle&quot;:&quot;&quot;},{&quot;family&quot;:&quot;Gao&quot;,&quot;given&quot;:&quot;Xifeng&quot;,&quot;parse-names&quot;:false,&quot;dropping-particle&quot;:&quot;&quot;,&quot;non-dropping-particle&quot;:&quot;&quot;},{&quot;family&quot;:&quot;Liu&quot;,&quot;given&quot;:&quot;Yingzhou&quot;,&quot;parse-names&quot;:false,&quot;dropping-particle&quot;:&quot;&quot;,&quot;non-dropping-particle&quot;:&quot;&quot;},{&quot;family&quot;:&quot;Lian&quot;,&quot;given&quot;:&quot;Jijian&quot;,&quot;parse-names&quot;:false,&quot;dropping-particle&quot;:&quot;&quot;,&quot;non-dropping-particle&quot;:&quot;&quot;},{&quot;family&quot;:&quot;Wang&quot;,&quot;given&quot;:&quot;Haolin&quot;,&quot;parse-names&quot;:false,&quot;dropping-particle&quot;:&quot;&quot;,&quot;non-dropping-particle&quot;:&quot;&quot;}],&quot;container-title&quot;:&quot;Engineering Science and Technology, an International Journal&quot;,&quot;DOI&quot;:&quot;10.1016/j.jestch.2026.102384&quot;,&quot;ISSN&quot;:&quot;22150986&quot;,&quot;issued&quot;:{&quot;date-parts&quot;:[[2026,6]]},&quot;page&quot;:&quot;102384&quot;,&quot;volume&quot;:&quot;78&quot;,&quot;container-title-short&quot;:&quot;&quot;},&quot;isTemporary&quot;:false}]},{&quot;citationID&quot;:&quot;MENDELEY_CITATION_883842a3-a21f-4bfa-9084-5059522ad981&quot;,&quot;properties&quot;:{&quot;noteIndex&quot;:0},&quot;isEdited&quot;:false,&quot;manualOverride&quot;:{&quot;isManuallyOverridden&quot;:false,&quot;citeprocText&quot;:&quot;[5]&quot;,&quot;manualOverrideText&quot;:&quot;&quot;},&quot;citationTag&quot;:&quot;MENDELEY_CITATION_v3_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&quot;,&quot;citationItems&quot;:[{&quot;id&quot;:&quot;37e1e1c6-a2f3-3486-92e6-469dc2e4adc9&quot;,&quot;itemData&quot;:{&quot;type&quot;:&quot;article-journal&quot;,&quot;id&quot;:&quot;37e1e1c6-a2f3-3486-92e6-469dc2e4adc9&quot;,&quot;title&quot;:&quot;Energy Demand Response in a Food-Processing Plant: A Deep Reinforcement Learning Approach&quot;,&quot;author&quot;:[{&quot;family&quot;:&quot;Wohlgenannt&quot;,&quot;given&quot;:&quot;Philipp&quot;,&quot;parse-names&quot;:false,&quot;dropping-particle&quot;:&quot;&quot;,&quot;non-dropping-particle&quot;:&quot;&quot;},{&quot;family&quot;:&quot;Hegenbart&quot;,&quot;given&quot;:&quot;Sebastian&quot;,&quot;parse-names&quot;:false,&quot;dropping-particle&quot;:&quot;&quot;,&quot;non-dropping-particle&quot;:&quot;&quot;},{&quot;family&quot;:&quot;Eder&quot;,&quot;given&quot;:&quot;Elias&quot;,&quot;parse-names&quot;:false,&quot;dropping-particle&quot;:&quot;&quot;,&quot;non-dropping-particle&quot;:&quot;&quot;},{&quot;family&quot;:&quot;Kolhe&quot;,&quot;given&quot;:&quot;Mohan&quot;,&quot;parse-names&quot;:false,&quot;dropping-particle&quot;:&quot;&quot;,&quot;non-dropping-particle&quot;:&quot;&quot;},{&quot;family&quot;:&quot;Kepplinger&quot;,&quot;given&quot;:&quot;Peter&quot;,&quot;parse-names&quot;:false,&quot;dropping-particle&quot;:&quot;&quot;,&quot;non-dropping-particle&quot;:&quot;&quot;}],&quot;container-title&quot;:&quot;Energies&quot;,&quot;container-title-short&quot;:&quot;Energies (Basel).&quot;,&quot;DOI&quot;:&quot;10.3390/en17246430&quot;,&quot;ISSN&quot;:&quot;1996-1073&quot;,&quot;issued&quot;:{&quot;date-parts&quot;:[[2024,12,20]]},&quot;page&quot;:&quot;6430&quot;,&quot;abstract&quot;:&quot;&lt;p&gt;The food industry faces significant challenges in managing operational costs due to its high energy intensity and rising energy prices. Industrial food-processing facilities, with substantial thermal capacities and large demands for cooling and heating, offer promising opportunities for demand response (DR) strategies. This study explores the application of deep reinforcement learning (RL) as an innovative, data-driven approach for DR in the food industry. By leveraging the adaptive, self-learning capabilities of RL, energy costs in the investigated plant are effectively decreased. The RL algorithm was compared with the well-established optimization method Mixed Integer Linear Programming (MILP), and both were benchmarked against a reference scenario without DR. The two optimization strategies demonstrate cost savings of 17.57% and 18.65% for RL and MILP, respectively. Although RL is slightly less efficient in cost reduction, it significantly outperforms in computational speed, being approximately 20 times faster. During operation, RL only needs 2ms per optimization compared to 19s for MILP, making it a promising optimization tool for edge computing. Moreover, while MILP’s computation time increases considerably with the number of binary variables, RL efficiently learns dynamic system behavior and scales to more complex systems without significant performance degradation. These results highlight that deep RL, when applied to DR, offers substantial cost savings and computational efficiency, with broad applicability to energy management in various applications.&lt;/p&gt;&quot;,&quot;issue&quot;:&quot;24&quot;,&quot;volume&quot;:&quot;17&quot;},&quot;isTemporary&quot;:false}]},{&quot;citationID&quot;:&quot;MENDELEY_CITATION_d7370189-8bad-428a-bf96-f6e0b77e7bf5&quot;,&quot;properties&quot;:{&quot;noteIndex&quot;:0},&quot;isEdited&quot;:false,&quot;manualOverride&quot;:{&quot;isManuallyOverridden&quot;:false,&quot;citeprocText&quot;:&quot;[6]&quot;,&quot;manualOverrideText&quot;:&quot;&quot;},&quot;citationTag&quot;:&quot;MENDELEY_CITATION_v3_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&quot;,&quot;citationItems&quot;:[{&quot;id&quot;:&quot;f01623cd-5b09-3de7-90db-88f6efe9d97e&quot;,&quot;itemData&quot;:{&quot;type&quot;:&quot;article-journal&quot;,&quot;id&quot;:&quot;f01623cd-5b09-3de7-90db-88f6efe9d97e&quot;,&quot;title&quot;:&quot;Optimization of energy supply systems by MILP branch and bound method in consideration of hierarchical relationship between design and operation&quot;,&quot;author&quot;:[{&quot;family&quot;:&quot;Yokoyama&quot;,&quot;given&quot;:&quot;Ryohei&quot;,&quot;parse-names&quot;:false,&quot;dropping-particle&quot;:&quot;&quot;,&quot;non-dropping-particle&quot;:&quot;&quot;},{&quot;family&quot;:&quot;Shinano&quot;,&quot;given&quot;:&quot;Yuji&quot;,&quot;parse-names&quot;:false,&quot;dropping-particle&quot;:&quot;&quot;,&quot;non-dropping-particle&quot;:&quot;&quot;},{&quot;family&quot;:&quot;Taniguchi&quot;,&quot;given&quot;:&quot;Syusuke&quot;,&quot;parse-names&quot;:false,&quot;dropping-particle&quot;:&quot;&quot;,&quot;non-dropping-particle&quot;:&quot;&quot;},{&quot;family&quot;:&quot;Ohkura&quot;,&quot;given&quot;:&quot;Masashi&quot;,&quot;parse-names&quot;:false,&quot;dropping-particle&quot;:&quot;&quot;,&quot;non-dropping-particle&quot;:&quot;&quot;},{&quot;family&quot;:&quot;Wakui&quot;,&quot;given&quot;:&quot;Tetsuya&quot;,&quot;parse-names&quot;:false,&quot;dropping-particle&quot;:&quot;&quot;,&quot;non-dropping-particle&quot;:&quot;&quot;}],&quot;container-title&quot;:&quot;Energy Conversion and Management&quot;,&quot;DOI&quot;:&quot;10.1016/j.enconman.2014.12.020&quot;,&quot;ISSN&quot;:&quot;01968904&quot;,&quot;issued&quot;:{&quot;date-parts&quot;:[[2015,3]]},&quot;page&quot;:&quot;92-104&quot;,&quot;volume&quot;:&quot;92&quot;,&quot;container-title-short&quot;:&quot;Energy Convers. Manag.&quot;},&quot;isTemporary&quot;:false}]},{&quot;citationID&quot;:&quot;MENDELEY_CITATION_25f810e2-1387-4860-bc8b-20e968f8adf0&quot;,&quot;properties&quot;:{&quot;noteIndex&quot;:0},&quot;isEdited&quot;:false,&quot;manualOverride&quot;:{&quot;isManuallyOverridden&quot;:false,&quot;citeprocText&quot;:&quot;[7]&quot;,&quot;manualOverrideText&quot;:&quot;&quot;},&quot;citationTag&quot;:&quot;MENDELEY_CITATION_v3_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&quot;,&quot;citationItems&quot;:[{&quot;id&quot;:&quot;85308694-191e-34ed-aa20-9e1aa6f08e43&quot;,&quot;itemData&quot;:{&quot;type&quot;:&quot;article-journal&quot;,&quot;id&quot;:&quot;85308694-191e-34ed-aa20-9e1aa6f08e43&quot;,&quot;title&quot;:&quot;Reinforcement Learning Techniques in Optimizing Energy Systems&quot;,&quot;author&quot;:[{&quot;family&quot;:&quot;Stavrev&quot;,&quot;given&quot;:&quot;Stefan&quot;,&quot;parse-names&quot;:false,&quot;dropping-particle&quot;:&quot;&quot;,&quot;non-dropping-particle&quot;:&quot;&quot;},{&quot;family&quot;:&quot;Ginchev&quot;,&quot;given&quot;:&quot;Dimitar&quot;,&quot;parse-names&quot;:false,&quot;dropping-particle&quot;:&quot;&quot;,&quot;non-dropping-particle&quot;:&quot;&quot;}],&quot;container-title&quot;:&quot;Electronics&quot;,&quot;DOI&quot;:&quot;10.3390/electronics13081459&quot;,&quot;ISSN&quot;:&quot;2079-9292&quot;,&quot;issued&quot;:{&quot;date-parts&quot;:[[2024,4,12]]},&quot;page&quot;:&quot;1459&quot;,&quot;abstract&quot;:&quot;&lt;p&gt;Reinforcement learning (RL) techniques have emerged as powerful tools for optimizing energy systems, offering the potential to enhance efficiency, reliability, and sustainability. This review paper provides a comprehensive examination of the applications of RL in the field of energy system optimization, spanning various domains such as energy management, grid control, and renewable energy integration. Beginning with an overview of RL fundamentals, the paper explores recent advancements in RL algorithms and their adaptation to address the unique challenges of energy system optimization. Case studies and real-world applications demonstrate the efficacy of RL-based approaches in improving energy efficiency, reducing costs, and mitigating environmental impacts. Furthermore, the paper discusses future directions and challenges, including scalability, interpretability, and integration with domain knowledge. By synthesizing the latest research findings and identifying key areas for further investigation, this paper aims to inform and inspire future research endeavors in the intersection of reinforcement learning and energy system optimization.&lt;/p&gt;&quot;,&quot;issue&quot;:&quot;8&quot;,&quot;volume&quot;:&quot;13&quot;,&quot;container-title-short&quot;:&quot;Electronics (Basel).&quot;},&quot;isTemporary&quot;:false}]},{&quot;citationID&quot;:&quot;MENDELEY_CITATION_51c152f6-c4bd-46c0-a730-f4779c171221&quot;,&quot;properties&quot;:{&quot;noteIndex&quot;:0},&quot;isEdited&quot;:false,&quot;manualOverride&quot;:{&quot;isManuallyOverridden&quot;:false,&quot;citeprocText&quot;:&quot;[8]&quot;,&quot;manualOverrideText&quot;:&quot;&quot;},&quot;citationTag&quot;:&quot;MENDELEY_CITATION_v3_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&quot;,&quot;citationItems&quot;:[{&quot;id&quot;:&quot;19ead3b7-e80b-3f24-a3e3-22a038f3385c&quot;,&quot;itemData&quot;:{&quot;type&quot;:&quot;article-journal&quot;,&quot;id&quot;:&quot;19ead3b7-e80b-3f24-a3e3-22a038f3385c&quot;,&quot;title&quot;:&quot;LCA and exergy-economic evaluation of a biogas-to-fuels system using CO2 hydrogenation and exhaust gas recycling&quot;,&quot;author&quot;:[{&quot;family&quot;:&quot;Ghiasirad&quot;,&quot;given&quot;:&quot;Hamed&quot;,&quot;parse-names&quot;:false,&quot;dropping-particle&quot;:&quot;&quot;,&quot;non-dropping-particle&quot;:&quot;&quot;},{&quot;family&quot;:&quot;Ebrahimian&quot;,&quot;given&quot;:&quot;Farinaz&quot;,&quot;parse-names&quot;:false,&quot;dropping-particle&quot;:&quot;&quot;,&quot;non-dropping-particle&quot;:&quot;&quot;},{&quot;family&quot;:&quot;Gholizadeh&quot;,&quot;given&quot;:&quot;Towhid&quot;,&quot;parse-names&quot;:false,&quot;dropping-particle&quot;:&quot;&quot;,&quot;non-dropping-particle&quot;:&quot;&quot;},{&quot;family&quot;:&quot;Mohammadi&quot;,&quot;given&quot;:&quot;Ali&quot;,&quot;parse-names&quot;:false,&quot;dropping-particle&quot;:&quot;&quot;,&quot;non-dropping-particle&quot;:&quot;&quot;},{&quot;family&quot;:&quot;Mirmasoumi&quot;,&quot;given&quot;:&quot;Siamak&quot;,&quot;parse-names&quot;:false,&quot;dropping-particle&quot;:&quot;&quot;,&quot;non-dropping-particle&quot;:&quot;&quot;},{&quot;family&quot;:&quot;Saray&quot;,&quot;given&quot;:&quot;Rahim Khoshbakhti&quot;,&quot;parse-names&quot;:false,&quot;dropping-particle&quot;:&quot;&quot;,&quot;non-dropping-particle&quot;:&quot;&quot;},{&quot;family&quot;:&quot;Skorek-Osikowska&quot;,&quot;given&quot;:&quot;Anna&quot;,&quot;parse-names&quot;:false,&quot;dropping-particle&quot;:&quot;&quot;,&quot;non-dropping-particle&quot;:&quot;&quot;}],&quot;container-title&quot;:&quot;Energy Conversion and Management: X&quot;,&quot;DOI&quot;:&quot;10.1016/j.ecmx.2025.100897&quot;,&quot;ISSN&quot;:&quot;25901745&quot;,&quot;issued&quot;:{&quot;date-parts&quot;:[[2025,4]]},&quot;page&quot;:&quot;100897&quot;,&quot;volume&quot;:&quot;26&quot;,&quot;container-title-short&quot;:&quot;&quot;},&quot;isTemporary&quot;:false}]},{&quot;citationID&quot;:&quot;MENDELEY_CITATION_105cda64-5b6c-464e-beda-2ca75d02300e&quot;,&quot;properties&quot;:{&quot;noteIndex&quot;:0},&quot;isEdited&quot;:false,&quot;manualOverride&quot;:{&quot;isManuallyOverridden&quot;:false,&quot;citeprocText&quot;:&quot;[9]&quot;,&quot;manualOverrideText&quot;:&quot;&quot;},&quot;citationTag&quot;:&quot;MENDELEY_CITATION_v3_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&quot;,&quot;citationItems&quot;:[{&quot;id&quot;:&quot;56e0ce24-6bd0-3ca6-ad59-9e041fc06482&quot;,&quot;itemData&quot;:{&quot;type&quot;:&quot;article-journal&quot;,&quot;id&quot;:&quot;56e0ce24-6bd0-3ca6-ad59-9e041fc06482&quot;,&quot;title&quot;:&quot;Syngas biomethanation: state‐of‐the‐art review and perspectives&quot;,&quot;author&quot;:[{&quot;family&quot;:&quot;Grimalt‐Alemany&quot;,&quot;given&quot;:&quot;Antonio&quot;,&quot;parse-names&quot;:false,&quot;dropping-particle&quot;:&quot;&quot;,&quot;non-dropping-particle&quot;:&quot;&quot;},{&quot;family&quot;:&quot;Skiadas&quot;,&quot;given&quot;:&quot;Ioannis&quot;,&quot;parse-names&quot;:false,&quot;dropping-particle&quot;:&quot;V.&quot;,&quot;non-dropping-particle&quot;:&quot;&quot;},{&quot;family&quot;:&quot;Gavala&quot;,&quot;given&quot;:&quot;Hariklia N.&quot;,&quot;parse-names&quot;:false,&quot;dropping-particle&quot;:&quot;&quot;,&quot;non-dropping-particle&quot;:&quot;&quot;}],&quot;container-title&quot;:&quot;Biofuels, Bioproducts and Biorefining&quot;,&quot;DOI&quot;:&quot;10.1002/bbb.1826&quot;,&quot;ISSN&quot;:&quot;1932-104X&quot;,&quot;issued&quot;:{&quot;date-parts&quot;:[[2018,1,10]]},&quot;page&quot;:&quot;139-158&quot;,&quot;abstract&quot;:&quot;&lt;p&gt;Significant research efforts are currently being made worldwide to develop more efficient biomethane production processes from a variety of waste streams. The biomethanation of biomass‐derived syngas can contribute to increasing the potential of methane production as it opens the way for the conversion of recalcitrant biomasses, generally not fully exploitable by anaerobic digestion systems. Additionally, this biological process presents several advantages over its analogous process of catalytic methanation such as the use of inexpensive biocatalysts, milder operational conditions, higher tolerance to the impurities of syngas, and higher product selectivity. However, there are still several challenges to be addressed for this technology to reach commercial stage. This work reviews the progress made over the last few years in syngas biomethanation processes in order to provide an overview of the current state of the art of this technology. The most relevant aspects determining the performance of syngas biomethanation processes are extensively discussed here, including microbial diversity and metabolic interactions in mixed microbial consortia, the influence of operating parameters and bioreactor designs, and the potential of modelling as a tool for the design and control of this bioprocess. © 2017 Society of Chemical Industry and John Wiley &amp;amp; Sons, Ltd&lt;/p&gt;&quot;,&quot;issue&quot;:&quot;1&quot;,&quot;volume&quot;:&quot;12&quot;,&quot;container-title-short&quot;:&quot;&quot;},&quot;isTemporary&quot;:false}]},{&quot;citationID&quot;:&quot;MENDELEY_CITATION_790cd8fb-1a04-4124-9aa6-1645a459196b&quot;,&quot;properties&quot;:{&quot;noteIndex&quot;:0},&quot;isEdited&quot;:false,&quot;manualOverride&quot;:{&quot;isManuallyOverridden&quot;:false,&quot;citeprocText&quot;:&quot;[9], [10]&quot;,&quot;manualOverrideText&quot;:&quot;&quot;},&quot;citationTag&quot;:&quot;MENDELEY_CITATION_v3_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&quot;,&quot;citationItems&quot;:[{&quot;id&quot;:&quot;aa2feb8d-c9bd-3781-bba9-d18156ecd3e8&quot;,&quot;itemData&quot;:{&quot;type&quot;:&quot;article-journal&quot;,&quot;id&quot;:&quot;aa2feb8d-c9bd-3781-bba9-d18156ecd3e8&quot;,&quot;title&quot;:&quot;Alternative sustainable routes to methanol production: Techno-economic and environmental assessment&quot;,&quot;author&quot;:[{&quot;family&quot;:&quot;Scomazzon&quot;,&quot;given&quot;:&quot;Marco&quot;,&quot;parse-names&quot;:false,&quot;dropping-particle&quot;:&quot;&quot;,&quot;non-dropping-particle&quot;:&quot;&quot;},{&quot;family&quot;:&quot;Barbera&quot;,&quot;given&quot;:&quot;Elena&quot;,&quot;parse-names&quot;:false,&quot;dropping-particle&quot;:&quot;&quot;,&quot;non-dropping-particle&quot;:&quot;&quot;},{&quot;family&quot;:&quot;Bezzo&quot;,&quot;given&quot;:&quot;Fabrizio&quot;,&quot;parse-names&quot;:false,&quot;dropping-particle&quot;:&quot;&quot;,&quot;non-dropping-particle&quot;:&quot;&quot;}],&quot;container-title&quot;:&quot;Journal of Environmental Chemical Engineering&quot;,&quot;DOI&quot;:&quot;10.1016/j.jece.2024.112674&quot;,&quot;ISSN&quot;:&quot;22133437&quot;,&quot;issued&quot;:{&quot;date-parts&quot;:[[2024,6]]},&quot;page&quot;:&quot;112674&quot;,&quot;issue&quot;:&quot;3&quot;,&quot;volume&quot;:&quot;12&quot;,&quot;container-title-short&quot;:&quot;J. Environ. Chem. Eng.&quot;},&quot;isTemporary&quot;:false},{&quot;id&quot;:&quot;56e0ce24-6bd0-3ca6-ad59-9e041fc06482&quot;,&quot;itemData&quot;:{&quot;type&quot;:&quot;article-journal&quot;,&quot;id&quot;:&quot;56e0ce24-6bd0-3ca6-ad59-9e041fc06482&quot;,&quot;title&quot;:&quot;Syngas biomethanation: state‐of‐the‐art review and perspectives&quot;,&quot;author&quot;:[{&quot;family&quot;:&quot;Grimalt‐Alemany&quot;,&quot;given&quot;:&quot;Antonio&quot;,&quot;parse-names&quot;:false,&quot;dropping-particle&quot;:&quot;&quot;,&quot;non-dropping-particle&quot;:&quot;&quot;},{&quot;family&quot;:&quot;Skiadas&quot;,&quot;given&quot;:&quot;Ioannis&quot;,&quot;parse-names&quot;:false,&quot;dropping-particle&quot;:&quot;V.&quot;,&quot;non-dropping-particle&quot;:&quot;&quot;},{&quot;family&quot;:&quot;Gavala&quot;,&quot;given&quot;:&quot;Hariklia N.&quot;,&quot;parse-names&quot;:false,&quot;dropping-particle&quot;:&quot;&quot;,&quot;non-dropping-particle&quot;:&quot;&quot;}],&quot;container-title&quot;:&quot;Biofuels, Bioproducts and Biorefining&quot;,&quot;DOI&quot;:&quot;10.1002/bbb.1826&quot;,&quot;ISSN&quot;:&quot;1932-104X&quot;,&quot;issued&quot;:{&quot;date-parts&quot;:[[2018,1,10]]},&quot;page&quot;:&quot;139-158&quot;,&quot;abstract&quot;:&quot;&lt;p&gt;Significant research efforts are currently being made worldwide to develop more efficient biomethane production processes from a variety of waste streams. The biomethanation of biomass‐derived syngas can contribute to increasing the potential of methane production as it opens the way for the conversion of recalcitrant biomasses, generally not fully exploitable by anaerobic digestion systems. Additionally, this biological process presents several advantages over its analogous process of catalytic methanation such as the use of inexpensive biocatalysts, milder operational conditions, higher tolerance to the impurities of syngas, and higher product selectivity. However, there are still several challenges to be addressed for this technology to reach commercial stage. This work reviews the progress made over the last few years in syngas biomethanation processes in order to provide an overview of the current state of the art of this technology. The most relevant aspects determining the performance of syngas biomethanation processes are extensively discussed here, including microbial diversity and metabolic interactions in mixed microbial consortia, the influence of operating parameters and bioreactor designs, and the potential of modelling as a tool for the design and control of this bioprocess. © 2017 Society of Chemical Industry and John Wiley &amp;amp; Sons, Ltd&lt;/p&gt;&quot;,&quot;issue&quot;:&quot;1&quot;,&quot;volume&quot;:&quot;12&quot;,&quot;container-title-short&quot;:&quot;&quot;},&quot;isTemporary&quot;:false}]},{&quot;citationID&quot;:&quot;MENDELEY_CITATION_b4c44ef8-e2c2-413d-b321-be21b9ddc9bc&quot;,&quot;properties&quot;:{&quot;noteIndex&quot;:0},&quot;isEdited&quot;:false,&quot;manualOverride&quot;:{&quot;isManuallyOverridden&quot;:false,&quot;citeprocText&quot;:&quot;[9]&quot;,&quot;manualOverrideText&quot;:&quot;&quot;},&quot;citationTag&quot;:&quot;MENDELEY_CITATION_v3_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&quot;,&quot;citationItems&quot;:[{&quot;id&quot;:&quot;56e0ce24-6bd0-3ca6-ad59-9e041fc06482&quot;,&quot;itemData&quot;:{&quot;type&quot;:&quot;article-journal&quot;,&quot;id&quot;:&quot;56e0ce24-6bd0-3ca6-ad59-9e041fc06482&quot;,&quot;title&quot;:&quot;Syngas biomethanation: state‐of‐the‐art review and perspectives&quot;,&quot;author&quot;:[{&quot;family&quot;:&quot;Grimalt‐Alemany&quot;,&quot;given&quot;:&quot;Antonio&quot;,&quot;parse-names&quot;:false,&quot;dropping-particle&quot;:&quot;&quot;,&quot;non-dropping-particle&quot;:&quot;&quot;},{&quot;family&quot;:&quot;Skiadas&quot;,&quot;given&quot;:&quot;Ioannis&quot;,&quot;parse-names&quot;:false,&quot;dropping-particle&quot;:&quot;V.&quot;,&quot;non-dropping-particle&quot;:&quot;&quot;},{&quot;family&quot;:&quot;Gavala&quot;,&quot;given&quot;:&quot;Hariklia N.&quot;,&quot;parse-names&quot;:false,&quot;dropping-particle&quot;:&quot;&quot;,&quot;non-dropping-particle&quot;:&quot;&quot;}],&quot;container-title&quot;:&quot;Biofuels, Bioproducts and Biorefining&quot;,&quot;DOI&quot;:&quot;10.1002/bbb.1826&quot;,&quot;ISSN&quot;:&quot;1932-104X&quot;,&quot;issued&quot;:{&quot;date-parts&quot;:[[2018,1,10]]},&quot;page&quot;:&quot;139-158&quot;,&quot;abstract&quot;:&quot;&lt;p&gt;Significant research efforts are currently being made worldwide to develop more efficient biomethane production processes from a variety of waste streams. The biomethanation of biomass‐derived syngas can contribute to increasing the potential of methane production as it opens the way for the conversion of recalcitrant biomasses, generally not fully exploitable by anaerobic digestion systems. Additionally, this biological process presents several advantages over its analogous process of catalytic methanation such as the use of inexpensive biocatalysts, milder operational conditions, higher tolerance to the impurities of syngas, and higher product selectivity. However, there are still several challenges to be addressed for this technology to reach commercial stage. This work reviews the progress made over the last few years in syngas biomethanation processes in order to provide an overview of the current state of the art of this technology. The most relevant aspects determining the performance of syngas biomethanation processes are extensively discussed here, including microbial diversity and metabolic interactions in mixed microbial consortia, the influence of operating parameters and bioreactor designs, and the potential of modelling as a tool for the design and control of this bioprocess. © 2017 Society of Chemical Industry and John Wiley &amp;amp; Sons, Ltd&lt;/p&gt;&quot;,&quot;issue&quot;:&quot;1&quot;,&quot;volume&quot;:&quot;12&quot;,&quot;container-title-short&quot;:&quot;&quot;},&quot;isTemporary&quot;:false}]},{&quot;citationID&quot;:&quot;MENDELEY_CITATION_ff939063-8c0e-47e0-8f2f-be64fc1a6c11&quot;,&quot;properties&quot;:{&quot;noteIndex&quot;:0},&quot;isEdited&quot;:false,&quot;manualOverride&quot;:{&quot;isManuallyOverridden&quot;:false,&quot;citeprocText&quot;:&quot;[9], [11]&quot;,&quot;manualOverrideText&quot;:&quot;&quot;},&quot;citationTag&quot;:&quot;MENDELEY_CITATION_v3_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&quot;,&quot;citationItems&quot;:[{&quot;id&quot;:&quot;05ccdcdc-ca9b-3b81-a51a-6f8632295c3c&quot;,&quot;itemData&quot;:{&quot;type&quot;:&quot;article-journal&quot;,&quot;id&quot;:&quot;05ccdcdc-ca9b-3b81-a51a-6f8632295c3c&quot;,&quot;title&quot;:&quot;Techno-economic-environmental assessment of the integration of power-to-X and biogas utilization towards the production of electricity, hydrogen, methane and methanol&quot;,&quot;author&quot;:[{&quot;family&quot;:&quot;Moioli&quot;,&quot;given&quot;:&quot;Emanuele&quot;,&quot;parse-names&quot;:false,&quot;dropping-particle&quot;:&quot;&quot;,&quot;non-dropping-particle&quot;:&quot;&quot;},{&quot;family&quot;:&quot;Schildhauer&quot;,&quot;given&quot;:&quot;Tilman&quot;,&quot;parse-names&quot;:false,&quot;dropping-particle&quot;:&quot;&quot;,&quot;non-dropping-particle&quot;:&quot;&quot;}],&quot;container-title&quot;:&quot;Sustainable Energy &amp; Fuels&quot;,&quot;DOI&quot;:&quot;10.1039/D3SE00052D&quot;,&quot;ISSN&quot;:&quot;2398-4902&quot;,&quot;issued&quot;:{&quot;date-parts&quot;:[[2023]]},&quot;page&quot;:&quot;2690-2706&quot;,&quot;abstract&quot;:&quot;&lt;p&gt;Various routes for the valorisation of biogas towards methane and methanol and for electricity or hydrogen storage is assessed.&lt;/p&gt;&quot;,&quot;issue&quot;:&quot;11&quot;,&quot;volume&quot;:&quot;7&quot;,&quot;container-title-short&quot;:&quot;Sustain. Energy Fuels&quot;},&quot;isTemporary&quot;:false},{&quot;id&quot;:&quot;56e0ce24-6bd0-3ca6-ad59-9e041fc06482&quot;,&quot;itemData&quot;:{&quot;type&quot;:&quot;article-journal&quot;,&quot;id&quot;:&quot;56e0ce24-6bd0-3ca6-ad59-9e041fc06482&quot;,&quot;title&quot;:&quot;Syngas biomethanation: state‐of‐the‐art review and perspectives&quot;,&quot;author&quot;:[{&quot;family&quot;:&quot;Grimalt‐Alemany&quot;,&quot;given&quot;:&quot;Antonio&quot;,&quot;parse-names&quot;:false,&quot;dropping-particle&quot;:&quot;&quot;,&quot;non-dropping-particle&quot;:&quot;&quot;},{&quot;family&quot;:&quot;Skiadas&quot;,&quot;given&quot;:&quot;Ioannis&quot;,&quot;parse-names&quot;:false,&quot;dropping-particle&quot;:&quot;V.&quot;,&quot;non-dropping-particle&quot;:&quot;&quot;},{&quot;family&quot;:&quot;Gavala&quot;,&quot;given&quot;:&quot;Hariklia N.&quot;,&quot;parse-names&quot;:false,&quot;dropping-particle&quot;:&quot;&quot;,&quot;non-dropping-particle&quot;:&quot;&quot;}],&quot;container-title&quot;:&quot;Biofuels, Bioproducts and Biorefining&quot;,&quot;DOI&quot;:&quot;10.1002/bbb.1826&quot;,&quot;ISSN&quot;:&quot;1932-104X&quot;,&quot;issued&quot;:{&quot;date-parts&quot;:[[2018,1,10]]},&quot;page&quot;:&quot;139-158&quot;,&quot;abstract&quot;:&quot;&lt;p&gt;Significant research efforts are currently being made worldwide to develop more efficient biomethane production processes from a variety of waste streams. The biomethanation of biomass‐derived syngas can contribute to increasing the potential of methane production as it opens the way for the conversion of recalcitrant biomasses, generally not fully exploitable by anaerobic digestion systems. Additionally, this biological process presents several advantages over its analogous process of catalytic methanation such as the use of inexpensive biocatalysts, milder operational conditions, higher tolerance to the impurities of syngas, and higher product selectivity. However, there are still several challenges to be addressed for this technology to reach commercial stage. This work reviews the progress made over the last few years in syngas biomethanation processes in order to provide an overview of the current state of the art of this technology. The most relevant aspects determining the performance of syngas biomethanation processes are extensively discussed here, including microbial diversity and metabolic interactions in mixed microbial consortia, the influence of operating parameters and bioreactor designs, and the potential of modelling as a tool for the design and control of this bioprocess. © 2017 Society of Chemical Industry and John Wiley &amp;amp; Sons, Ltd&lt;/p&gt;&quot;,&quot;issue&quot;:&quot;1&quot;,&quot;volume&quot;:&quot;12&quot;,&quot;container-title-short&quot;:&quot;&quot;},&quot;isTemporary&quot;:false}]},{&quot;citationID&quot;:&quot;MENDELEY_CITATION_df48a702-88dc-4563-926b-cf46720d5673&quot;,&quot;properties&quot;:{&quot;noteIndex&quot;:0},&quot;isEdited&quot;:false,&quot;manualOverride&quot;:{&quot;isManuallyOverridden&quot;:false,&quot;citeprocText&quot;:&quot;[10]&quot;,&quot;manualOverrideText&quot;:&quot;&quot;},&quot;citationTag&quot;:&quot;MENDELEY_CITATION_v3_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&quot;,&quot;citationItems&quot;:[{&quot;id&quot;:&quot;aa2feb8d-c9bd-3781-bba9-d18156ecd3e8&quot;,&quot;itemData&quot;:{&quot;type&quot;:&quot;article-journal&quot;,&quot;id&quot;:&quot;aa2feb8d-c9bd-3781-bba9-d18156ecd3e8&quot;,&quot;title&quot;:&quot;Alternative sustainable routes to methanol production: Techno-economic and environmental assessment&quot;,&quot;author&quot;:[{&quot;family&quot;:&quot;Scomazzon&quot;,&quot;given&quot;:&quot;Marco&quot;,&quot;parse-names&quot;:false,&quot;dropping-particle&quot;:&quot;&quot;,&quot;non-dropping-particle&quot;:&quot;&quot;},{&quot;family&quot;:&quot;Barbera&quot;,&quot;given&quot;:&quot;Elena&quot;,&quot;parse-names&quot;:false,&quot;dropping-particle&quot;:&quot;&quot;,&quot;non-dropping-particle&quot;:&quot;&quot;},{&quot;family&quot;:&quot;Bezzo&quot;,&quot;given&quot;:&quot;Fabrizio&quot;,&quot;parse-names&quot;:false,&quot;dropping-particle&quot;:&quot;&quot;,&quot;non-dropping-particle&quot;:&quot;&quot;}],&quot;container-title&quot;:&quot;Journal of Environmental Chemical Engineering&quot;,&quot;DOI&quot;:&quot;10.1016/j.jece.2024.112674&quot;,&quot;ISSN&quot;:&quot;22133437&quot;,&quot;issued&quot;:{&quot;date-parts&quot;:[[2024,6]]},&quot;page&quot;:&quot;112674&quot;,&quot;issue&quot;:&quot;3&quot;,&quot;volume&quot;:&quot;12&quot;,&quot;container-title-short&quot;:&quot;J. Environ. Chem. Eng.&quot;},&quot;isTemporary&quot;:false}]},{&quot;citationID&quot;:&quot;MENDELEY_CITATION_8eef8f75-1f87-4dff-a071-68987bdeee67&quot;,&quot;properties&quot;:{&quot;noteIndex&quot;:0},&quot;isEdited&quot;:false,&quot;manualOverride&quot;:{&quot;isManuallyOverridden&quot;:false,&quot;citeprocText&quot;:&quot;[10]&quot;,&quot;manualOverrideText&quot;:&quot;&quot;},&quot;citationTag&quot;:&quot;MENDELEY_CITATION_v3_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&quot;,&quot;citationItems&quot;:[{&quot;id&quot;:&quot;aa2feb8d-c9bd-3781-bba9-d18156ecd3e8&quot;,&quot;itemData&quot;:{&quot;type&quot;:&quot;article-journal&quot;,&quot;id&quot;:&quot;aa2feb8d-c9bd-3781-bba9-d18156ecd3e8&quot;,&quot;title&quot;:&quot;Alternative sustainable routes to methanol production: Techno-economic and environmental assessment&quot;,&quot;author&quot;:[{&quot;family&quot;:&quot;Scomazzon&quot;,&quot;given&quot;:&quot;Marco&quot;,&quot;parse-names&quot;:false,&quot;dropping-particle&quot;:&quot;&quot;,&quot;non-dropping-particle&quot;:&quot;&quot;},{&quot;family&quot;:&quot;Barbera&quot;,&quot;given&quot;:&quot;Elena&quot;,&quot;parse-names&quot;:false,&quot;dropping-particle&quot;:&quot;&quot;,&quot;non-dropping-particle&quot;:&quot;&quot;},{&quot;family&quot;:&quot;Bezzo&quot;,&quot;given&quot;:&quot;Fabrizio&quot;,&quot;parse-names&quot;:false,&quot;dropping-particle&quot;:&quot;&quot;,&quot;non-dropping-particle&quot;:&quot;&quot;}],&quot;container-title&quot;:&quot;Journal of Environmental Chemical Engineering&quot;,&quot;DOI&quot;:&quot;10.1016/j.jece.2024.112674&quot;,&quot;ISSN&quot;:&quot;22133437&quot;,&quot;issued&quot;:{&quot;date-parts&quot;:[[2024,6]]},&quot;page&quot;:&quot;112674&quot;,&quot;issue&quot;:&quot;3&quot;,&quot;volume&quot;:&quot;12&quot;,&quot;container-title-short&quot;:&quot;J. Environ. Chem. Eng.&quot;},&quot;isTemporary&quot;:false}]},{&quot;citationID&quot;:&quot;MENDELEY_CITATION_8a70196d-3ff9-41c8-be39-fcf525822331&quot;,&quot;properties&quot;:{&quot;noteIndex&quot;:0},&quot;isEdited&quot;:false,&quot;manualOverride&quot;:{&quot;isManuallyOverridden&quot;:false,&quot;citeprocText&quot;:&quot;[12]&quot;,&quot;manualOverrideText&quot;:&quot;&quot;},&quot;citationTag&quot;:&quot;MENDELEY_CITATION_v3_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&quot;,&quot;citationItems&quot;:[{&quot;id&quot;:&quot;1310fab5-b88a-3b52-8d94-488c61413bed&quot;,&quot;itemData&quot;:{&quot;type&quot;:&quot;article-journal&quot;,&quot;id&quot;:&quot;1310fab5-b88a-3b52-8d94-488c61413bed&quot;,&quot;title&quot;:&quot;Techno-economic evaluation of biomass-to-fuels with solid-oxide electrolyzer&quot;,&quot;author&quot;:[{&quot;family&quot;:&quot;Zhang&quot;,&quot;given&quot;:&quot;Hanfei&quot;,&quot;parse-names&quot;:false,&quot;dropping-particle&quot;:&quot;&quot;,&quot;non-dropping-particle&quot;:&quot;&quot;},{&quot;family&quot;:&quot;Wang&quot;,&quot;given&quot;:&quot;Ligang&quot;,&quot;parse-names&quot;:false,&quot;dropping-particle&quot;:&quot;&quot;,&quot;non-dropping-particle&quot;:&quot;&quot;},{&quot;family&quot;:&quot;herle&quot;,&quot;given&quot;:&quot;Jan&quot;,&quot;parse-names&quot;:false,&quot;dropping-particle&quot;:&quot;&quot;,&quot;non-dropping-particle&quot;:&quot;Van&quot;},{&quot;family&quot;:&quot;Maréchal&quot;,&quot;given&quot;:&quot;François&quot;,&quot;parse-names&quot;:false,&quot;dropping-particle&quot;:&quot;&quot;,&quot;non-dropping-particle&quot;:&quot;&quot;},{&quot;family&quot;:&quot;Desideri&quot;,&quot;given&quot;:&quot;Umberto&quot;,&quot;parse-names&quot;:false,&quot;dropping-particle&quot;:&quot;&quot;,&quot;non-dropping-particle&quot;:&quot;&quot;}],&quot;container-title&quot;:&quot;Applied Energy&quot;,&quot;DOI&quot;:&quot;10.1016/j.apenergy.2020.115113&quot;,&quot;ISSN&quot;:&quot;03062619&quot;,&quot;issued&quot;:{&quot;date-parts&quot;:[[2020,7]]},&quot;page&quot;:&quot;115113&quot;,&quot;volume&quot;:&quot;270&quot;,&quot;container-title-short&quot;:&quot;Appl. Energy&quot;},&quot;isTemporary&quot;:false}]},{&quot;citationID&quot;:&quot;MENDELEY_CITATION_13304e8f-750e-4a08-8b1d-6a0f67b53a03&quot;,&quot;properties&quot;:{&quot;noteIndex&quot;:0},&quot;isEdited&quot;:false,&quot;manualOverride&quot;:{&quot;isManuallyOverridden&quot;:false,&quot;citeprocText&quot;:&quot;[13]&quot;,&quot;manualOverrideText&quot;:&quot;&quot;},&quot;citationTag&quot;:&quot;MENDELEY_CITATION_v3_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&quot;,&quot;citationItems&quot;:[{&quot;id&quot;:&quot;190b1267-cffd-3b0f-acfd-1ca4b15c3e7b&quot;,&quot;itemData&quot;:{&quot;type&quot;:&quot;article-journal&quot;,&quot;id&quot;:&quot;190b1267-cffd-3b0f-acfd-1ca4b15c3e7b&quot;,&quot;title&quot;:&quot;Techno-economic assessment of the impact of electrolysis technology on power-to-methanol processes&quot;,&quot;author&quot;:[{&quot;family&quot;:&quot;Walther&quot;,&quot;given&quot;:&quot;Aniko&quot;,&quot;parse-names&quot;:false,&quot;dropping-particle&quot;:&quot;&quot;,&quot;non-dropping-particle&quot;:&quot;&quot;},{&quot;family&quot;:&quot;Löning&quot;,&quot;given&quot;:&quot;Kai&quot;,&quot;parse-names&quot;:false,&quot;dropping-particle&quot;:&quot;&quot;,&quot;non-dropping-particle&quot;:&quot;&quot;},{&quot;family&quot;:&quot;Reichelt&quot;,&quot;given&quot;:&quot;Erik&quot;,&quot;parse-names&quot;:false,&quot;dropping-particle&quot;:&quot;&quot;,&quot;non-dropping-particle&quot;:&quot;&quot;}],&quot;container-title&quot;:&quot;International Journal of Hydrogen Energy&quot;,&quot;DOI&quot;:&quot;10.1016/j.ijhydene.2026.153394&quot;,&quot;ISSN&quot;:&quot;03603199&quot;,&quot;issued&quot;:{&quot;date-parts&quot;:[[2026,2]]},&quot;page&quot;:&quot;153394&quot;,&quot;volume&quot;:&quot;206&quot;,&quot;container-title-short&quot;:&quot;Int. J. Hydrogen Energy&quot;},&quot;isTemporary&quot;:false}]},{&quot;citationID&quot;:&quot;MENDELEY_CITATION_6a736241-62e6-4de8-9385-e50fe6f3ae30&quot;,&quot;properties&quot;:{&quot;noteIndex&quot;:0},&quot;isEdited&quot;:false,&quot;manualOverride&quot;:{&quot;isManuallyOverridden&quot;:false,&quot;citeprocText&quot;:&quot;[14], [15], [16]&quot;,&quot;manualOverrideText&quot;:&quot;&quot;},&quot;citationTag&quot;:&quot;MENDELEY_CITATION_v3_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&quot;,&quot;citationItems&quot;:[{&quot;id&quot;:&quot;d24a77c3-65ad-3302-bdd5-2971e96b5fe6&quot;,&quot;itemData&quot;:{&quot;type&quot;:&quot;article-journal&quot;,&quot;id&quot;:&quot;d24a77c3-65ad-3302-bdd5-2971e96b5fe6&quot;,&quot;title&quot;:&quot;Alkaline Water Electrolysis Powered by Renewable Energy: A Review&quot;,&quot;author&quot;:[{&quot;family&quot;:&quot;Brauns&quot;,&quot;given&quot;:&quot;Jörn&quot;,&quot;parse-names&quot;:false,&quot;dropping-particle&quot;:&quot;&quot;,&quot;non-dropping-particle&quot;:&quot;&quot;},{&quot;family&quot;:&quot;Turek&quot;,&quot;given&quot;:&quot;Thomas&quot;,&quot;parse-names&quot;:false,&quot;dropping-particle&quot;:&quot;&quot;,&quot;non-dropping-particle&quot;:&quot;&quot;}],&quot;container-title&quot;:&quot;Processes&quot;,&quot;DOI&quot;:&quot;10.3390/pr8020248&quot;,&quot;ISSN&quot;:&quot;2227-9717&quot;,&quot;issued&quot;:{&quot;date-parts&quot;:[[2020,2,21]]},&quot;page&quot;:&quot;248&quot;,&quot;abstract&quot;:&quot;&lt;p&gt;Alkaline water electrolysis is a key technology for large-scale hydrogen production powered by renewable energy. As conventional electrolyzers are designed for operation at fixed process conditions, the implementation of fluctuating and highly intermittent renewable energy is challenging. This contribution shows the recent state of system descriptions for alkaline water electrolysis and renewable energies, such as solar and wind power. Each component of a hydrogen energy system needs to be optimized to increase the operation time and system efficiency. Only in this way can hydrogen produced by electrolysis processes be competitive with the conventional path based on fossil energy sources. Conventional alkaline water electrolyzers show a limited part-load range due to an increased gas impurity at low power availability. As explosive mixtures of hydrogen and oxygen must be prevented, a safety shutdown is performed when reaching specific gas contamination. Furthermore, the cell voltage should be optimized to maintain a high efficiency. While photovoltaic panels can be directly coupled to alkaline water electrolyzers, wind turbines require suitable converters with additional losses. By combining alkaline water electrolysis with hydrogen storage tanks and fuel cells, power grid stabilization can be performed. As a consequence, the conventional spinning reserve can be reduced, which additionally lowers the carbon dioxide emissions.&lt;/p&gt;&quot;,&quot;issue&quot;:&quot;2&quot;,&quot;volume&quot;:&quot;8&quot;,&quot;container-title-short&quot;:&quot;&quot;},&quot;isTemporary&quot;:false},{&quot;id&quot;:&quot;fb305ddc-d308-30ab-8f80-782b0f32ba1c&quot;,&quot;itemData&quot;:{&quot;type&quot;:&quot;article-journal&quot;,&quot;id&quot;:&quot;fb305ddc-d308-30ab-8f80-782b0f32ba1c&quot;,&quot;title&quot;:&quot;Electrofuels for the transport sector: A review of production costs&quot;,&quot;author&quot;:[{&quot;family&quot;:&quot;Brynolf&quot;,&quot;given&quot;:&quot;Selma&quot;,&quot;parse-names&quot;:false,&quot;dropping-particle&quot;:&quot;&quot;,&quot;non-dropping-particle&quot;:&quot;&quot;},{&quot;family&quot;:&quot;Taljegard&quot;,&quot;given&quot;:&quot;Maria&quot;,&quot;parse-names&quot;:false,&quot;dropping-particle&quot;:&quot;&quot;,&quot;non-dropping-particle&quot;:&quot;&quot;},{&quot;family&quot;:&quot;Grahn&quot;,&quot;given&quot;:&quot;Maria&quot;,&quot;parse-names&quot;:false,&quot;dropping-particle&quot;:&quot;&quot;,&quot;non-dropping-particle&quot;:&quot;&quot;},{&quot;family&quot;:&quot;Hansson&quot;,&quot;given&quot;:&quot;Julia&quot;,&quot;parse-names&quot;:false,&quot;dropping-particle&quot;:&quot;&quot;,&quot;non-dropping-particle&quot;:&quot;&quot;}],&quot;container-title&quot;:&quot;Renewable and Sustainable Energy Reviews&quot;,&quot;DOI&quot;:&quot;10.1016/j.rser.2017.05.288&quot;,&quot;ISSN&quot;:&quot;13640321&quot;,&quot;issued&quot;:{&quot;date-parts&quot;:[[2018,1]]},&quot;page&quot;:&quot;1887-1905&quot;,&quot;volume&quot;:&quot;81&quot;,&quot;container-title-short&quot;:&quot;&quot;},&quot;isTemporary&quot;:false},{&quot;id&quot;:&quot;1b5f443a-d989-3c31-80b4-27044204c02c&quot;,&quot;itemData&quot;:{&quot;type&quot;:&quot;article-journal&quot;,&quot;id&quot;:&quot;1b5f443a-d989-3c31-80b4-27044204c02c&quot;,&quot;title&quot;:&quot;Hydrogen production by PEM water electrolysis – A review&quot;,&quot;author&quot;:[{&quot;family&quot;:&quot;Shiva Kumar&quot;,&quot;given&quot;:&quot;S.&quot;,&quot;parse-names&quot;:false,&quot;dropping-particle&quot;:&quot;&quot;,&quot;non-dropping-particle&quot;:&quot;&quot;},{&quot;family&quot;:&quot;Himabindu&quot;,&quot;given&quot;:&quot;V.&quot;,&quot;parse-names&quot;:false,&quot;dropping-particle&quot;:&quot;&quot;,&quot;non-dropping-particle&quot;:&quot;&quot;}],&quot;container-title&quot;:&quot;Materials Science for Energy Technologies&quot;,&quot;DOI&quot;:&quot;10.1016/j.mset.2019.03.002&quot;,&quot;ISSN&quot;:&quot;25892991&quot;,&quot;issued&quot;:{&quot;date-parts&quot;:[[2019,12]]},&quot;page&quot;:&quot;442-454&quot;,&quot;issue&quot;:&quot;3&quot;,&quot;volume&quot;:&quot;2&quot;,&quot;container-title-short&quot;:&quot;Mater. Sci. Energy Technol.&quot;},&quot;isTemporary&quot;:false}]},{&quot;citationID&quot;:&quot;MENDELEY_CITATION_e23df023-1b0e-4c7d-a81a-d4f5c2bec620&quot;,&quot;properties&quot;:{&quot;noteIndex&quot;:0},&quot;isEdited&quot;:false,&quot;manualOverride&quot;:{&quot;isManuallyOverridden&quot;:false,&quot;citeprocText&quot;:&quot;[17]&quot;,&quot;manualOverrideText&quot;:&quot;&quot;},&quot;citationTag&quot;:&quot;MENDELEY_CITATION_v3_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&quot;,&quot;citationItems&quot;:[{&quot;id&quot;:&quot;8c3b2930-cd0d-331a-8923-1e74c3142273&quot;,&quot;itemData&quot;:{&quot;type&quot;:&quot;article-journal&quot;,&quot;id&quot;:&quot;8c3b2930-cd0d-331a-8923-1e74c3142273&quot;,&quot;title&quot;:&quot;LCA and exergy-economic evaluation of a biogas-to-fuels system using CO2 hydrogenation and exhaust gas recycling&quot;,&quot;author&quot;:[{&quot;family&quot;:&quot;Ghiasirad&quot;,&quot;given&quot;:&quot;Hamed&quot;,&quot;parse-names&quot;:false,&quot;dropping-particle&quot;:&quot;&quot;,&quot;non-dropping-particle&quot;:&quot;&quot;},{&quot;family&quot;:&quot;Ebrahimian&quot;,&quot;given&quot;:&quot;Farinaz&quot;,&quot;parse-names&quot;:false,&quot;dropping-particle&quot;:&quot;&quot;,&quot;non-dropping-particle&quot;:&quot;&quot;},{&quot;family&quot;:&quot;Gholizadeh&quot;,&quot;given&quot;:&quot;Towhid&quot;,&quot;parse-names&quot;:false,&quot;dropping-particle&quot;:&quot;&quot;,&quot;non-dropping-particle&quot;:&quot;&quot;},{&quot;family&quot;:&quot;Mohammadi&quot;,&quot;given&quot;:&quot;Ali&quot;,&quot;parse-names&quot;:false,&quot;dropping-particle&quot;:&quot;&quot;,&quot;non-dropping-particle&quot;:&quot;&quot;},{&quot;family&quot;:&quot;Mirmasoumi&quot;,&quot;given&quot;:&quot;Siamak&quot;,&quot;parse-names&quot;:false,&quot;dropping-particle&quot;:&quot;&quot;,&quot;non-dropping-particle&quot;:&quot;&quot;},{&quot;family&quot;:&quot;Saray&quot;,&quot;given&quot;:&quot;Rahim Khoshbakhti&quot;,&quot;parse-names&quot;:false,&quot;dropping-particle&quot;:&quot;&quot;,&quot;non-dropping-particle&quot;:&quot;&quot;},{&quot;family&quot;:&quot;Skorek-Osikowska&quot;,&quot;given&quot;:&quot;Anna&quot;,&quot;parse-names&quot;:false,&quot;dropping-particle&quot;:&quot;&quot;,&quot;non-dropping-particle&quot;:&quot;&quot;}],&quot;container-title&quot;:&quot;Energy Conversion and Management: X&quot;,&quot;DOI&quot;:&quot;10.1016/j.ecmx.2025.100897&quot;,&quot;ISSN&quot;:&quot;25901745&quot;,&quot;issued&quot;:{&quot;date-parts&quot;:[[2025,4]]},&quot;page&quot;:&quot;100897&quot;,&quot;volume&quot;:&quot;26&quot;,&quot;container-title-short&quot;:&quot;&quot;},&quot;isTemporary&quot;:false}]},{&quot;citationID&quot;:&quot;MENDELEY_CITATION_f5902acf-3f1b-4f47-a295-09ff9652d7b2&quot;,&quot;properties&quot;:{&quot;noteIndex&quot;:0},&quot;isEdited&quot;:false,&quot;manualOverride&quot;:{&quot;isManuallyOverridden&quot;:false,&quot;citeprocText&quot;:&quot;[18]&quot;,&quot;manualOverrideText&quot;:&quot;&quot;},&quot;citationTag&quot;:&quot;MENDELEY_CITATION_v3_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&quot;,&quot;citationItems&quot;:[{&quot;id&quot;:&quot;cb817469-f165-3488-91d4-ffe692974354&quot;,&quot;itemData&quot;:{&quot;type&quot;:&quot;article-journal&quot;,&quot;id&quot;:&quot;cb817469-f165-3488-91d4-ffe692974354&quot;,&quot;title&quot;:&quot;Alternative sustainable routes to methanol production: Techno-economic and environmental assessment&quot;,&quot;author&quot;:[{&quot;family&quot;:&quot;Scomazzon&quot;,&quot;given&quot;:&quot;Marco&quot;,&quot;parse-names&quot;:false,&quot;dropping-particle&quot;:&quot;&quot;,&quot;non-dropping-particle&quot;:&quot;&quot;},{&quot;family&quot;:&quot;Barbera&quot;,&quot;given&quot;:&quot;Elena&quot;,&quot;parse-names&quot;:false,&quot;dropping-particle&quot;:&quot;&quot;,&quot;non-dropping-particle&quot;:&quot;&quot;},{&quot;family&quot;:&quot;Bezzo&quot;,&quot;given&quot;:&quot;Fabrizio&quot;,&quot;parse-names&quot;:false,&quot;dropping-particle&quot;:&quot;&quot;,&quot;non-dropping-particle&quot;:&quot;&quot;}],&quot;container-title&quot;:&quot;Journal of Environmental Chemical Engineering&quot;,&quot;DOI&quot;:&quot;10.1016/j.jece.2024.112674&quot;,&quot;ISSN&quot;:&quot;22133437&quot;,&quot;issued&quot;:{&quot;date-parts&quot;:[[2024,6]]},&quot;page&quot;:&quot;112674&quot;,&quot;issue&quot;:&quot;3&quot;,&quot;volume&quot;:&quot;12&quot;,&quot;container-title-short&quot;:&quot;J. Environ. Chem. Eng.&quot;},&quot;isTemporary&quot;:false}]},{&quot;citationID&quot;:&quot;MENDELEY_CITATION_50e16af0-91a6-43f9-862e-188051a6076b&quot;,&quot;properties&quot;:{&quot;noteIndex&quot;:0},&quot;isEdited&quot;:false,&quot;manualOverride&quot;:{&quot;isManuallyOverridden&quot;:false,&quot;citeprocText&quot;:&quot;[17]&quot;,&quot;manualOverrideText&quot;:&quot;&quot;},&quot;citationTag&quot;:&quot;MENDELEY_CITATION_v3_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&quot;,&quot;citationItems&quot;:[{&quot;id&quot;:&quot;8c3b2930-cd0d-331a-8923-1e74c3142273&quot;,&quot;itemData&quot;:{&quot;type&quot;:&quot;article-journal&quot;,&quot;id&quot;:&quot;8c3b2930-cd0d-331a-8923-1e74c3142273&quot;,&quot;title&quot;:&quot;LCA and exergy-economic evaluation of a biogas-to-fuels system using CO2 hydrogenation and exhaust gas recycling&quot;,&quot;author&quot;:[{&quot;family&quot;:&quot;Ghiasirad&quot;,&quot;given&quot;:&quot;Hamed&quot;,&quot;parse-names&quot;:false,&quot;dropping-particle&quot;:&quot;&quot;,&quot;non-dropping-particle&quot;:&quot;&quot;},{&quot;family&quot;:&quot;Ebrahimian&quot;,&quot;given&quot;:&quot;Farinaz&quot;,&quot;parse-names&quot;:false,&quot;dropping-particle&quot;:&quot;&quot;,&quot;non-dropping-particle&quot;:&quot;&quot;},{&quot;family&quot;:&quot;Gholizadeh&quot;,&quot;given&quot;:&quot;Towhid&quot;,&quot;parse-names&quot;:false,&quot;dropping-particle&quot;:&quot;&quot;,&quot;non-dropping-particle&quot;:&quot;&quot;},{&quot;family&quot;:&quot;Mohammadi&quot;,&quot;given&quot;:&quot;Ali&quot;,&quot;parse-names&quot;:false,&quot;dropping-particle&quot;:&quot;&quot;,&quot;non-dropping-particle&quot;:&quot;&quot;},{&quot;family&quot;:&quot;Mirmasoumi&quot;,&quot;given&quot;:&quot;Siamak&quot;,&quot;parse-names&quot;:false,&quot;dropping-particle&quot;:&quot;&quot;,&quot;non-dropping-particle&quot;:&quot;&quot;},{&quot;family&quot;:&quot;Saray&quot;,&quot;given&quot;:&quot;Rahim Khoshbakhti&quot;,&quot;parse-names&quot;:false,&quot;dropping-particle&quot;:&quot;&quot;,&quot;non-dropping-particle&quot;:&quot;&quot;},{&quot;family&quot;:&quot;Skorek-Osikowska&quot;,&quot;given&quot;:&quot;Anna&quot;,&quot;parse-names&quot;:false,&quot;dropping-particle&quot;:&quot;&quot;,&quot;non-dropping-particle&quot;:&quot;&quot;}],&quot;container-title&quot;:&quot;Energy Conversion and Management: X&quot;,&quot;DOI&quot;:&quot;10.1016/j.ecmx.2025.100897&quot;,&quot;ISSN&quot;:&quot;25901745&quot;,&quot;issued&quot;:{&quot;date-parts&quot;:[[2025,4]]},&quot;page&quot;:&quot;100897&quot;,&quot;volume&quot;:&quot;26&quot;,&quot;container-title-short&quot;:&quot;&quot;},&quot;isTemporary&quot;:false}]},{&quot;citationID&quot;:&quot;MENDELEY_CITATION_f6f42889-26df-4dbb-987f-6da6adaab487&quot;,&quot;properties&quot;:{&quot;noteIndex&quot;:0},&quot;isEdited&quot;:false,&quot;manualOverride&quot;:{&quot;isManuallyOverridden&quot;:false,&quot;citeprocText&quot;:&quot;[19]&quot;,&quot;manualOverrideText&quot;:&quot;&quot;},&quot;citationTag&quot;:&quot;MENDELEY_CITATION_v3_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&quot;,&quot;citationItems&quot;:[{&quot;id&quot;:&quot;28a53769-a0e5-3c5a-80f0-90f7301702eb&quot;,&quot;itemData&quot;:{&quot;type&quot;:&quot;article-journal&quot;,&quot;id&quot;:&quot;28a53769-a0e5-3c5a-80f0-90f7301702eb&quot;,&quot;title&quot;:&quot;Techno-economic-environmental assessment of the integration of power-to-X and biogas utilization towards the production of electricity, hydrogen, methane and methanol&quot;,&quot;author&quot;:[{&quot;family&quot;:&quot;Moioli&quot;,&quot;given&quot;:&quot;Emanuele&quot;,&quot;parse-names&quot;:false,&quot;dropping-particle&quot;:&quot;&quot;,&quot;non-dropping-particle&quot;:&quot;&quot;},{&quot;family&quot;:&quot;Schildhauer&quot;,&quot;given&quot;:&quot;Tilman&quot;,&quot;parse-names&quot;:false,&quot;dropping-particle&quot;:&quot;&quot;,&quot;non-dropping-particle&quot;:&quot;&quot;}],&quot;container-title&quot;:&quot;Sustainable Energy &amp; Fuels&quot;,&quot;DOI&quot;:&quot;10.1039/D3SE00052D&quot;,&quot;ISSN&quot;:&quot;2398-4902&quot;,&quot;issued&quot;:{&quot;date-parts&quot;:[[2023]]},&quot;page&quot;:&quot;2690-2706&quot;,&quot;abstract&quot;:&quot;&lt;p&gt;Various routes for the valorisation of biogas towards methane and methanol and for electricity or hydrogen storage is assessed.&lt;/p&gt;&quot;,&quot;issue&quot;:&quot;11&quot;,&quot;volume&quot;:&quot;7&quot;,&quot;container-title-short&quot;:&quot;Sustain. Energy Fuels&quot;},&quot;isTemporary&quot;:false}]},{&quot;citationID&quot;:&quot;MENDELEY_CITATION_8e42163d-fd20-4d53-837d-ec79437e85ea&quot;,&quot;properties&quot;:{&quot;noteIndex&quot;:0},&quot;isEdited&quot;:false,&quot;manualOverride&quot;:{&quot;isManuallyOverridden&quot;:false,&quot;citeprocText&quot;:&quot;[20]&quot;,&quot;manualOverrideText&quot;:&quot;&quot;},&quot;citationTag&quot;:&quot;MENDELEY_CITATION_v3_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&quot;,&quot;citationItems&quot;:[{&quot;id&quot;:&quot;104cea19-ccc6-37e7-9959-f839fd356eec&quot;,&quot;itemData&quot;:{&quot;type&quot;:&quot;article-journal&quot;,&quot;id&quot;:&quot;104cea19-ccc6-37e7-9959-f839fd356eec&quot;,&quot;title&quot;:&quot;Improving carbon efficiency for an advanced Biomass-to-Liquid process using hydrogen and oxygen from electrolysis&quot;,&quot;author&quot;:[{&quot;family&quot;:&quot;Dossow&quot;,&quot;given&quot;:&quot;Marcel&quot;,&quot;parse-names&quot;:false,&quot;dropping-particle&quot;:&quot;&quot;,&quot;non-dropping-particle&quot;:&quot;&quot;},{&quot;family&quot;:&quot;Dieterich&quot;,&quot;given&quot;:&quot;Vincent&quot;,&quot;parse-names&quot;:false,&quot;dropping-particle&quot;:&quot;&quot;,&quot;non-dropping-particle&quot;:&quot;&quot;},{&quot;family&quot;:&quot;Hanel&quot;,&quot;given&quot;:&quot;Andreas&quot;,&quot;parse-names&quot;:false,&quot;dropping-particle&quot;:&quot;&quot;,&quot;non-dropping-particle&quot;:&quot;&quot;},{&quot;family&quot;:&quot;Spliethoff&quot;,&quot;given&quot;:&quot;Hartmut&quot;,&quot;parse-names&quot;:false,&quot;dropping-particle&quot;:&quot;&quot;,&quot;non-dropping-particle&quot;:&quot;&quot;},{&quot;family&quot;:&quot;Fendt&quot;,&quot;given&quot;:&quot;Sebastian&quot;,&quot;parse-names&quot;:false,&quot;dropping-particle&quot;:&quot;&quot;,&quot;non-dropping-particle&quot;:&quot;&quot;}],&quot;container-title&quot;:&quot;Renewable and Sustainable Energy Reviews&quot;,&quot;DOI&quot;:&quot;10.1016/j.rser.2021.111670&quot;,&quot;ISSN&quot;:&quot;13640321&quot;,&quot;issued&quot;:{&quot;date-parts&quot;:[[2021,12]]},&quot;page&quot;:&quot;111670&quot;,&quot;volume&quot;:&quot;152&quot;,&quot;container-title-short&quot;:&quot;&quot;},&quot;isTemporary&quot;:false}]},{&quot;citationID&quot;:&quot;MENDELEY_CITATION_88d0ffc1-318e-4fe5-b886-2a172eaebfef&quot;,&quot;properties&quot;:{&quot;noteIndex&quot;:0},&quot;isEdited&quot;:false,&quot;manualOverride&quot;:{&quot;isManuallyOverridden&quot;:false,&quot;citeprocText&quot;:&quot;[21]&quot;,&quot;manualOverrideText&quot;:&quot;&quot;},&quot;citationTag&quot;:&quot;MENDELEY_CITATION_v3_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&quot;,&quot;citationItems&quot;:[{&quot;id&quot;:&quot;70edddc8-ee03-31fd-86e6-6cf7a4858b7a&quot;,&quot;itemData&quot;:{&quot;type&quot;:&quot;article-journal&quot;,&quot;id&quot;:&quot;70edddc8-ee03-31fd-86e6-6cf7a4858b7a&quot;,&quot;title&quot;:&quot;Flexible Power and Biomass-To-Methanol Plants With Different Gasification Technologies&quot;,&quot;author&quot;:[{&quot;family&quot;:&quot;Poluzzi&quot;,&quot;given&quot;:&quot;A.&quot;,&quot;parse-names&quot;:false,&quot;dropping-particle&quot;:&quot;&quot;,&quot;non-dropping-particle&quot;:&quot;&quot;},{&quot;family&quot;:&quot;Guandalini&quot;,&quot;given&quot;:&quot;G.&quot;,&quot;parse-names&quot;:false,&quot;dropping-particle&quot;:&quot;&quot;,&quot;non-dropping-particle&quot;:&quot;&quot;},{&quot;family&quot;:&quot;Guffanti&quot;,&quot;given&quot;:&quot;S.&quot;,&quot;parse-names&quot;:false,&quot;dropping-particle&quot;:&quot;&quot;,&quot;non-dropping-particle&quot;:&quot;&quot;},{&quot;family&quot;:&quot;Martinelli&quot;,&quot;given&quot;:&quot;M.&quot;,&quot;parse-names&quot;:false,&quot;dropping-particle&quot;:&quot;&quot;,&quot;non-dropping-particle&quot;:&quot;&quot;},{&quot;family&quot;:&quot;Moioli&quot;,&quot;given&quot;:&quot;S.&quot;,&quot;parse-names&quot;:false,&quot;dropping-particle&quot;:&quot;&quot;,&quot;non-dropping-particle&quot;:&quot;&quot;},{&quot;family&quot;:&quot;Huttenhuis&quot;,&quot;given&quot;:&quot;P.&quot;,&quot;parse-names&quot;:false,&quot;dropping-particle&quot;:&quot;&quot;,&quot;non-dropping-particle&quot;:&quot;&quot;},{&quot;family&quot;:&quot;Rexwinkel&quot;,&quot;given&quot;:&quot;G.&quot;,&quot;parse-names&quot;:false,&quot;dropping-particle&quot;:&quot;&quot;,&quot;non-dropping-particle&quot;:&quot;&quot;},{&quot;family&quot;:&quot;Palonen&quot;,&quot;given&quot;:&quot;J.&quot;,&quot;parse-names&quot;:false,&quot;dropping-particle&quot;:&quot;&quot;,&quot;non-dropping-particle&quot;:&quot;&quot;},{&quot;family&quot;:&quot;Martelli&quot;,&quot;given&quot;:&quot;E.&quot;,&quot;parse-names&quot;:false,&quot;dropping-particle&quot;:&quot;&quot;,&quot;non-dropping-particle&quot;:&quot;&quot;},{&quot;family&quot;:&quot;Groppi&quot;,&quot;given&quot;:&quot;G.&quot;,&quot;parse-names&quot;:false,&quot;dropping-particle&quot;:&quot;&quot;,&quot;non-dropping-particle&quot;:&quot;&quot;},{&quot;family&quot;:&quot;Romano&quot;,&quot;given&quot;:&quot;M. C.&quot;,&quot;parse-names&quot;:false,&quot;dropping-particle&quot;:&quot;&quot;,&quot;non-dropping-particle&quot;:&quot;&quot;}],&quot;container-title&quot;:&quot;Frontiers in Energy Research&quot;,&quot;DOI&quot;:&quot;10.3389/fenrg.2021.795673&quot;,&quot;ISSN&quot;:&quot;2296-598X&quot;,&quot;issued&quot;:{&quot;date-parts&quot;:[[2022,1,27]]},&quot;abstract&quot;:&quot;&lt;p&gt; The competitiveness of biofuels may be increased by integrating biomass gasification plants with electrolysis units, which generate hydrogen to be combined with carbon-rich syngas. This option allows increasing the yield of the final product by retaining a higher amount of biogenic carbon and improving the resilience of the energy sector by favoring electric grid services and sector coupling. This article illustrates a techno-economic comparative analysis of three flexible power and biomass to methanol plants based on different gasification technologies: direct gasification, indirect gasification, and sorption-enhanced gasification. The design and operational criteria of each plant are conceived to operate both without green hydrogen addition (baseline mode) and with hydrogen addition (enhanced mode), following an intermittent use of the electrolysis system, which is turned on when the electricity price allows an economically viable hydrogen production. The methanol production plants include a gasification section, syngas cleaning, conditioning and compression section, methanol synthesis and purification, and heat recovery steam cycle to be flexibly operated. Due to the high oxygen demand in the gasifier, the direct gasification-based plant obtains a great advantage to be operated between a minimum load to satisfy the oxygen demand at high electricity prices and a maximum load to maximize methanol production at low electricity prices. This allows avoiding large oxygen storages with significant benefits for Capex and safety issues. The analysis reports specific fixed-capital investments between 1823 and 2048 €/kW of methanol output in the enhanced operation and LCOFs between 29.7 and 31.7 €/GJ &lt;sub&gt;LHV&lt;/sub&gt; . Economic advantages may be derived from a decrease in the electrolysis capital investment, especially for the direct gasification-based plants, which employ the greatest sized electrolyzer. Methanol breakeven selling prices range between 545 and 582 €/t with the 2019 reference Denmark electricity price curve and between 484 and 535 €/t with an assumed modified electricity price curve of a future energy mix with increased penetration of intermittent renewables. &lt;/p&gt;&quot;,&quot;volume&quot;:&quot;9&quot;,&quot;container-title-short&quot;:&quot;Front. Energy Res.&quot;},&quot;isTemporary&quot;:false}]},{&quot;citationID&quot;:&quot;MENDELEY_CITATION_e06c8150-ca7f-4bb6-8b73-8555f96f90d4&quot;,&quot;properties&quot;:{&quot;noteIndex&quot;:0},&quot;isEdited&quot;:false,&quot;manualOverride&quot;:{&quot;isManuallyOverridden&quot;:false,&quot;citeprocText&quot;:&quot;[22]&quot;,&quot;manualOverrideText&quot;:&quot;&quot;},&quot;citationTag&quot;:&quot;MENDELEY_CITATION_v3_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&quot;,&quot;citationItems&quot;:[{&quot;id&quot;:&quot;a36d5e43-f1b3-3f4c-8cdc-446f28ab3924&quot;,&quot;itemData&quot;:{&quot;type&quot;:&quot;article-journal&quot;,&quot;id&quot;:&quot;a36d5e43-f1b3-3f4c-8cdc-446f28ab3924&quot;,&quot;title&quot;:&quot;Benefits of Hybrid Production of E-Methanol in Connection with Biomass Gasification&quot;,&quot;author&quot;:[{&quot;family&quot;:&quot;Anetjärvi&quot;,&quot;given&quot;:&quot;Eemeli&quot;,&quot;parse-names&quot;:false,&quot;dropping-particle&quot;:&quot;&quot;,&quot;non-dropping-particle&quot;:&quot;&quot;},{&quot;family&quot;:&quot;Vakkilainen&quot;,&quot;given&quot;:&quot;Esa&quot;,&quot;parse-names&quot;:false,&quot;dropping-particle&quot;:&quot;&quot;,&quot;non-dropping-particle&quot;:&quot;&quot;},{&quot;family&quot;:&quot;Melin&quot;,&quot;given&quot;:&quot;Kristian&quot;,&quot;parse-names&quot;:false,&quot;dropping-particle&quot;:&quot;&quot;,&quot;non-dropping-particle&quot;:&quot;&quot;}],&quot;container-title&quot;:&quot;SSRN Electronic Journal&quot;,&quot;DOI&quot;:&quot;10.2139/ssrn.4184476&quot;,&quot;ISSN&quot;:&quot;1556-5068&quot;,&quot;issued&quot;:{&quot;date-parts&quot;:[[2022]]},&quot;container-title-short&quot;:&quot;&quot;},&quot;isTemporary&quot;:false}]},{&quot;citationID&quot;:&quot;MENDELEY_CITATION_cd84c5ed-f67d-47d0-afce-d099ac46029a&quot;,&quot;properties&quot;:{&quot;noteIndex&quot;:0},&quot;isEdited&quot;:false,&quot;manualOverride&quot;:{&quot;isManuallyOverridden&quot;:false,&quot;citeprocText&quot;:&quot;[23]&quot;,&quot;manualOverrideText&quot;:&quot;&quot;},&quot;citationTag&quot;:&quot;MENDELEY_CITATION_v3_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&quot;,&quot;citationItems&quot;:[{&quot;id&quot;:&quot;048c482b-30be-34eb-bade-6c65560bb00c&quot;,&quot;itemData&quot;:{&quot;type&quot;:&quot;article-journal&quot;,&quot;id&quot;:&quot;048c482b-30be-34eb-bade-6c65560bb00c&quot;,&quot;title&quot;:&quot;Techno-economic optimization of biomass-to-methanol with solid-oxide electrolyzer&quot;,&quot;author&quot;:[{&quot;family&quot;:&quot;Zhang&quot;,&quot;given&quot;:&quot;Hanfei&quot;,&quot;parse-names&quot;:false,&quot;dropping-particle&quot;:&quot;&quot;,&quot;non-dropping-particle&quot;:&quot;&quot;},{&quot;family&quot;:&quot;Wang&quot;,&quot;given&quot;:&quot;Ligang&quot;,&quot;parse-names&quot;:false,&quot;dropping-particle&quot;:&quot;&quot;,&quot;non-dropping-particle&quot;:&quot;&quot;},{&quot;family&quot;:&quot;Pérez-Fortes&quot;,&quot;given&quot;:&quot;Mar&quot;,&quot;parse-names&quot;:false,&quot;dropping-particle&quot;:&quot;&quot;,&quot;non-dropping-particle&quot;:&quot;&quot;},{&quot;family&quot;:&quot;herle&quot;,&quot;given&quot;:&quot;Jan&quot;,&quot;parse-names&quot;:false,&quot;dropping-particle&quot;:&quot;&quot;,&quot;non-dropping-particle&quot;:&quot;Van&quot;},{&quot;family&quot;:&quot;Maréchal&quot;,&quot;given&quot;:&quot;François&quot;,&quot;parse-names&quot;:false,&quot;dropping-particle&quot;:&quot;&quot;,&quot;non-dropping-particle&quot;:&quot;&quot;},{&quot;family&quot;:&quot;Desideri&quot;,&quot;given&quot;:&quot;Umberto&quot;,&quot;parse-names&quot;:false,&quot;dropping-particle&quot;:&quot;&quot;,&quot;non-dropping-particle&quot;:&quot;&quot;}],&quot;container-title&quot;:&quot;Applied Energy&quot;,&quot;DOI&quot;:&quot;10.1016/j.apenergy.2019.114071&quot;,&quot;ISSN&quot;:&quot;03062619&quot;,&quot;issued&quot;:{&quot;date-parts&quot;:[[2020,1]]},&quot;page&quot;:&quot;114071&quot;,&quot;volume&quot;:&quot;258&quot;,&quot;container-title-short&quot;:&quot;Appl. Energy&quot;},&quot;isTemporary&quot;:false}]},{&quot;citationID&quot;:&quot;MENDELEY_CITATION_42ff2c48-5158-4a41-83ab-c9fb9e7d73b7&quot;,&quot;properties&quot;:{&quot;noteIndex&quot;:0},&quot;isEdited&quot;:false,&quot;manualOverride&quot;:{&quot;isManuallyOverridden&quot;:false,&quot;citeprocText&quot;:&quot;[24]&quot;,&quot;manualOverrideText&quot;:&quot;&quot;},&quot;citationTag&quot;:&quot;MENDELEY_CITATION_v3_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&quot;,&quot;citationItems&quot;:[{&quot;id&quot;:&quot;ded22db1-0dce-3c1b-981f-fd5847a7cce1&quot;,&quot;itemData&quot;:{&quot;type&quot;:&quot;article-journal&quot;,&quot;id&quot;:&quot;ded22db1-0dce-3c1b-981f-fd5847a7cce1&quot;,&quot;title&quot;:&quot;Flexible Power &amp;amp; Biomass-to-Methanol plants: Design optimization and economic viability of the electrolysis integration&quot;,&quot;author&quot;:[{&quot;family&quot;:&quot;Poluzzi&quot;,&quot;given&quot;:&quot;Alessandro&quot;,&quot;parse-names&quot;:false,&quot;dropping-particle&quot;:&quot;&quot;,&quot;non-dropping-particle&quot;:&quot;&quot;},{&quot;family&quot;:&quot;Guandalini&quot;,&quot;given&quot;:&quot;Giulio&quot;,&quot;parse-names&quot;:false,&quot;dropping-particle&quot;:&quot;&quot;,&quot;non-dropping-particle&quot;:&quot;&quot;},{&quot;family&quot;:&quot;Guffanti&quot;,&quot;given&quot;:&quot;Simone&quot;,&quot;parse-names&quot;:false,&quot;dropping-particle&quot;:&quot;&quot;,&quot;non-dropping-particle&quot;:&quot;&quot;},{&quot;family&quot;:&quot;Elsido&quot;,&quot;given&quot;:&quot;Cristina&quot;,&quot;parse-names&quot;:false,&quot;dropping-particle&quot;:&quot;&quot;,&quot;non-dropping-particle&quot;:&quot;&quot;},{&quot;family&quot;:&quot;Moioli&quot;,&quot;given&quot;:&quot;Stefania&quot;,&quot;parse-names&quot;:false,&quot;dropping-particle&quot;:&quot;&quot;,&quot;non-dropping-particle&quot;:&quot;&quot;},{&quot;family&quot;:&quot;Huttenhuis&quot;,&quot;given&quot;:&quot;Patrick&quot;,&quot;parse-names&quot;:false,&quot;dropping-particle&quot;:&quot;&quot;,&quot;non-dropping-particle&quot;:&quot;&quot;},{&quot;family&quot;:&quot;Rexwinkel&quot;,&quot;given&quot;:&quot;Glenn&quot;,&quot;parse-names&quot;:false,&quot;dropping-particle&quot;:&quot;&quot;,&quot;non-dropping-particle&quot;:&quot;&quot;},{&quot;family&quot;:&quot;Martelli&quot;,&quot;given&quot;:&quot;Emanuele&quot;,&quot;parse-names&quot;:false,&quot;dropping-particle&quot;:&quot;&quot;,&quot;non-dropping-particle&quot;:&quot;&quot;},{&quot;family&quot;:&quot;Groppi&quot;,&quot;given&quot;:&quot;Gianpiero&quot;,&quot;parse-names&quot;:false,&quot;dropping-particle&quot;:&quot;&quot;,&quot;non-dropping-particle&quot;:&quot;&quot;},{&quot;family&quot;:&quot;Romano&quot;,&quot;given&quot;:&quot;Matteo C.&quot;,&quot;parse-names&quot;:false,&quot;dropping-particle&quot;:&quot;&quot;,&quot;non-dropping-particle&quot;:&quot;&quot;}],&quot;container-title&quot;:&quot;Fuel&quot;,&quot;DOI&quot;:&quot;10.1016/j.fuel.2021.122113&quot;,&quot;ISSN&quot;:&quot;00162361&quot;,&quot;issued&quot;:{&quot;date-parts&quot;:[[2022,2]]},&quot;page&quot;:&quot;122113&quot;,&quot;volume&quot;:&quot;310&quot;,&quot;container-title-short&quot;:&quot;&quot;},&quot;isTemporary&quot;:false}]},{&quot;citationID&quot;:&quot;MENDELEY_CITATION_a84a64c2-5cd9-45b5-8dd3-eed0901210e0&quot;,&quot;properties&quot;:{&quot;noteIndex&quot;:0},&quot;isEdited&quot;:false,&quot;manualOverride&quot;:{&quot;isManuallyOverridden&quot;:false,&quot;citeprocText&quot;:&quot;[25]&quot;,&quot;manualOverrideText&quot;:&quot;&quot;},&quot;citationTag&quot;:&quot;MENDELEY_CITATION_v3_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&quot;,&quot;citationItems&quot;:[{&quot;id&quot;:&quot;a332ee91-b343-3289-860a-430557bbc5fa&quot;,&quot;itemData&quot;:{&quot;type&quot;:&quot;article-journal&quot;,&quot;id&quot;:&quot;a332ee91-b343-3289-860a-430557bbc5fa&quot;,&quot;title&quot;:&quot;Flexible Power &amp;amp; Biomass-to-Methanol plants: Design optimization and economic viability of the electrolysis integration&quot;,&quot;author&quot;:[{&quot;family&quot;:&quot;Poluzzi&quot;,&quot;given&quot;:&quot;Alessandro&quot;,&quot;parse-names&quot;:false,&quot;dropping-particle&quot;:&quot;&quot;,&quot;non-dropping-particle&quot;:&quot;&quot;},{&quot;family&quot;:&quot;Guandalini&quot;,&quot;given&quot;:&quot;Giulio&quot;,&quot;parse-names&quot;:false,&quot;dropping-particle&quot;:&quot;&quot;,&quot;non-dropping-particle&quot;:&quot;&quot;},{&quot;family&quot;:&quot;Guffanti&quot;,&quot;given&quot;:&quot;Simone&quot;,&quot;parse-names&quot;:false,&quot;dropping-particle&quot;:&quot;&quot;,&quot;non-dropping-particle&quot;:&quot;&quot;},{&quot;family&quot;:&quot;Elsido&quot;,&quot;given&quot;:&quot;Cristina&quot;,&quot;parse-names&quot;:false,&quot;dropping-particle&quot;:&quot;&quot;,&quot;non-dropping-particle&quot;:&quot;&quot;},{&quot;family&quot;:&quot;Moioli&quot;,&quot;given&quot;:&quot;Stefania&quot;,&quot;parse-names&quot;:false,&quot;dropping-particle&quot;:&quot;&quot;,&quot;non-dropping-particle&quot;:&quot;&quot;},{&quot;family&quot;:&quot;Huttenhuis&quot;,&quot;given&quot;:&quot;Patrick&quot;,&quot;parse-names&quot;:false,&quot;dropping-particle&quot;:&quot;&quot;,&quot;non-dropping-particle&quot;:&quot;&quot;},{&quot;family&quot;:&quot;Rexwinkel&quot;,&quot;given&quot;:&quot;Glenn&quot;,&quot;parse-names&quot;:false,&quot;dropping-particle&quot;:&quot;&quot;,&quot;non-dropping-particle&quot;:&quot;&quot;},{&quot;family&quot;:&quot;Martelli&quot;,&quot;given&quot;:&quot;Emanuele&quot;,&quot;parse-names&quot;:false,&quot;dropping-particle&quot;:&quot;&quot;,&quot;non-dropping-particle&quot;:&quot;&quot;},{&quot;family&quot;:&quot;Groppi&quot;,&quot;given&quot;:&quot;Gianpiero&quot;,&quot;parse-names&quot;:false,&quot;dropping-particle&quot;:&quot;&quot;,&quot;non-dropping-particle&quot;:&quot;&quot;},{&quot;family&quot;:&quot;Romano&quot;,&quot;given&quot;:&quot;Matteo C.&quot;,&quot;parse-names&quot;:false,&quot;dropping-particle&quot;:&quot;&quot;,&quot;non-dropping-particle&quot;:&quot;&quot;}],&quot;container-title&quot;:&quot;Fuel&quot;,&quot;DOI&quot;:&quot;10.1016/j.fuel.2021.122113&quot;,&quot;ISSN&quot;:&quot;00162361&quot;,&quot;issued&quot;:{&quot;date-parts&quot;:[[2022,2]]},&quot;page&quot;:&quot;122113&quot;,&quot;volume&quot;:&quot;310&quot;,&quot;container-title-short&quot;:&quot;&quot;},&quot;isTemporary&quot;:false}]},{&quot;citationID&quot;:&quot;MENDELEY_CITATION_8c83e7a2-71cf-4160-9fdd-2510731786cf&quot;,&quot;properties&quot;:{&quot;noteIndex&quot;:0},&quot;isEdited&quot;:false,&quot;manualOverride&quot;:{&quot;isManuallyOverridden&quot;:false,&quot;citeprocText&quot;:&quot;[21]&quot;,&quot;manualOverrideText&quot;:&quot;&quot;},&quot;citationTag&quot;:&quot;MENDELEY_CITATION_v3_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&quot;,&quot;citationItems&quot;:[{&quot;id&quot;:&quot;70edddc8-ee03-31fd-86e6-6cf7a4858b7a&quot;,&quot;itemData&quot;:{&quot;type&quot;:&quot;article-journal&quot;,&quot;id&quot;:&quot;70edddc8-ee03-31fd-86e6-6cf7a4858b7a&quot;,&quot;title&quot;:&quot;Flexible Power and Biomass-To-Methanol Plants With Different Gasification Technologies&quot;,&quot;author&quot;:[{&quot;family&quot;:&quot;Poluzzi&quot;,&quot;given&quot;:&quot;A.&quot;,&quot;parse-names&quot;:false,&quot;dropping-particle&quot;:&quot;&quot;,&quot;non-dropping-particle&quot;:&quot;&quot;},{&quot;family&quot;:&quot;Guandalini&quot;,&quot;given&quot;:&quot;G.&quot;,&quot;parse-names&quot;:false,&quot;dropping-particle&quot;:&quot;&quot;,&quot;non-dropping-particle&quot;:&quot;&quot;},{&quot;family&quot;:&quot;Guffanti&quot;,&quot;given&quot;:&quot;S.&quot;,&quot;parse-names&quot;:false,&quot;dropping-particle&quot;:&quot;&quot;,&quot;non-dropping-particle&quot;:&quot;&quot;},{&quot;family&quot;:&quot;Martinelli&quot;,&quot;given&quot;:&quot;M.&quot;,&quot;parse-names&quot;:false,&quot;dropping-particle&quot;:&quot;&quot;,&quot;non-dropping-particle&quot;:&quot;&quot;},{&quot;family&quot;:&quot;Moioli&quot;,&quot;given&quot;:&quot;S.&quot;,&quot;parse-names&quot;:false,&quot;dropping-particle&quot;:&quot;&quot;,&quot;non-dropping-particle&quot;:&quot;&quot;},{&quot;family&quot;:&quot;Huttenhuis&quot;,&quot;given&quot;:&quot;P.&quot;,&quot;parse-names&quot;:false,&quot;dropping-particle&quot;:&quot;&quot;,&quot;non-dropping-particle&quot;:&quot;&quot;},{&quot;family&quot;:&quot;Rexwinkel&quot;,&quot;given&quot;:&quot;G.&quot;,&quot;parse-names&quot;:false,&quot;dropping-particle&quot;:&quot;&quot;,&quot;non-dropping-particle&quot;:&quot;&quot;},{&quot;family&quot;:&quot;Palonen&quot;,&quot;given&quot;:&quot;J.&quot;,&quot;parse-names&quot;:false,&quot;dropping-particle&quot;:&quot;&quot;,&quot;non-dropping-particle&quot;:&quot;&quot;},{&quot;family&quot;:&quot;Martelli&quot;,&quot;given&quot;:&quot;E.&quot;,&quot;parse-names&quot;:false,&quot;dropping-particle&quot;:&quot;&quot;,&quot;non-dropping-particle&quot;:&quot;&quot;},{&quot;family&quot;:&quot;Groppi&quot;,&quot;given&quot;:&quot;G.&quot;,&quot;parse-names&quot;:false,&quot;dropping-particle&quot;:&quot;&quot;,&quot;non-dropping-particle&quot;:&quot;&quot;},{&quot;family&quot;:&quot;Romano&quot;,&quot;given&quot;:&quot;M. C.&quot;,&quot;parse-names&quot;:false,&quot;dropping-particle&quot;:&quot;&quot;,&quot;non-dropping-particle&quot;:&quot;&quot;}],&quot;container-title&quot;:&quot;Frontiers in Energy Research&quot;,&quot;DOI&quot;:&quot;10.3389/fenrg.2021.795673&quot;,&quot;ISSN&quot;:&quot;2296-598X&quot;,&quot;issued&quot;:{&quot;date-parts&quot;:[[2022,1,27]]},&quot;abstract&quot;:&quot;&lt;p&gt; The competitiveness of biofuels may be increased by integrating biomass gasification plants with electrolysis units, which generate hydrogen to be combined with carbon-rich syngas. This option allows increasing the yield of the final product by retaining a higher amount of biogenic carbon and improving the resilience of the energy sector by favoring electric grid services and sector coupling. This article illustrates a techno-economic comparative analysis of three flexible power and biomass to methanol plants based on different gasification technologies: direct gasification, indirect gasification, and sorption-enhanced gasification. The design and operational criteria of each plant are conceived to operate both without green hydrogen addition (baseline mode) and with hydrogen addition (enhanced mode), following an intermittent use of the electrolysis system, which is turned on when the electricity price allows an economically viable hydrogen production. The methanol production plants include a gasification section, syngas cleaning, conditioning and compression section, methanol synthesis and purification, and heat recovery steam cycle to be flexibly operated. Due to the high oxygen demand in the gasifier, the direct gasification-based plant obtains a great advantage to be operated between a minimum load to satisfy the oxygen demand at high electricity prices and a maximum load to maximize methanol production at low electricity prices. This allows avoiding large oxygen storages with significant benefits for Capex and safety issues. The analysis reports specific fixed-capital investments between 1823 and 2048 €/kW of methanol output in the enhanced operation and LCOFs between 29.7 and 31.7 €/GJ &lt;sub&gt;LHV&lt;/sub&gt; . Economic advantages may be derived from a decrease in the electrolysis capital investment, especially for the direct gasification-based plants, which employ the greatest sized electrolyzer. Methanol breakeven selling prices range between 545 and 582 €/t with the 2019 reference Denmark electricity price curve and between 484 and 535 €/t with an assumed modified electricity price curve of a future energy mix with increased penetration of intermittent renewables. &lt;/p&gt;&quot;,&quot;volume&quot;:&quot;9&quot;,&quot;container-title-short&quot;:&quot;Front. Energy Res.&quot;},&quot;isTemporary&quot;:false}]},{&quot;citationID&quot;:&quot;MENDELEY_CITATION_e2d98fbf-79a4-429b-9796-2be5c079023d&quot;,&quot;properties&quot;:{&quot;noteIndex&quot;:0},&quot;isEdited&quot;:false,&quot;manualOverride&quot;:{&quot;isManuallyOverridden&quot;:false,&quot;citeprocText&quot;:&quot;[25]&quot;,&quot;manualOverrideText&quot;:&quot;&quot;},&quot;citationTag&quot;:&quot;MENDELEY_CITATION_v3_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&quot;,&quot;citationItems&quot;:[{&quot;id&quot;:&quot;a332ee91-b343-3289-860a-430557bbc5fa&quot;,&quot;itemData&quot;:{&quot;type&quot;:&quot;article-journal&quot;,&quot;id&quot;:&quot;a332ee91-b343-3289-860a-430557bbc5fa&quot;,&quot;title&quot;:&quot;Flexible Power &amp;amp; Biomass-to-Methanol plants: Design optimization and economic viability of the electrolysis integration&quot;,&quot;author&quot;:[{&quot;family&quot;:&quot;Poluzzi&quot;,&quot;given&quot;:&quot;Alessandro&quot;,&quot;parse-names&quot;:false,&quot;dropping-particle&quot;:&quot;&quot;,&quot;non-dropping-particle&quot;:&quot;&quot;},{&quot;family&quot;:&quot;Guandalini&quot;,&quot;given&quot;:&quot;Giulio&quot;,&quot;parse-names&quot;:false,&quot;dropping-particle&quot;:&quot;&quot;,&quot;non-dropping-particle&quot;:&quot;&quot;},{&quot;family&quot;:&quot;Guffanti&quot;,&quot;given&quot;:&quot;Simone&quot;,&quot;parse-names&quot;:false,&quot;dropping-particle&quot;:&quot;&quot;,&quot;non-dropping-particle&quot;:&quot;&quot;},{&quot;family&quot;:&quot;Elsido&quot;,&quot;given&quot;:&quot;Cristina&quot;,&quot;parse-names&quot;:false,&quot;dropping-particle&quot;:&quot;&quot;,&quot;non-dropping-particle&quot;:&quot;&quot;},{&quot;family&quot;:&quot;Moioli&quot;,&quot;given&quot;:&quot;Stefania&quot;,&quot;parse-names&quot;:false,&quot;dropping-particle&quot;:&quot;&quot;,&quot;non-dropping-particle&quot;:&quot;&quot;},{&quot;family&quot;:&quot;Huttenhuis&quot;,&quot;given&quot;:&quot;Patrick&quot;,&quot;parse-names&quot;:false,&quot;dropping-particle&quot;:&quot;&quot;,&quot;non-dropping-particle&quot;:&quot;&quot;},{&quot;family&quot;:&quot;Rexwinkel&quot;,&quot;given&quot;:&quot;Glenn&quot;,&quot;parse-names&quot;:false,&quot;dropping-particle&quot;:&quot;&quot;,&quot;non-dropping-particle&quot;:&quot;&quot;},{&quot;family&quot;:&quot;Martelli&quot;,&quot;given&quot;:&quot;Emanuele&quot;,&quot;parse-names&quot;:false,&quot;dropping-particle&quot;:&quot;&quot;,&quot;non-dropping-particle&quot;:&quot;&quot;},{&quot;family&quot;:&quot;Groppi&quot;,&quot;given&quot;:&quot;Gianpiero&quot;,&quot;parse-names&quot;:false,&quot;dropping-particle&quot;:&quot;&quot;,&quot;non-dropping-particle&quot;:&quot;&quot;},{&quot;family&quot;:&quot;Romano&quot;,&quot;given&quot;:&quot;Matteo C.&quot;,&quot;parse-names&quot;:false,&quot;dropping-particle&quot;:&quot;&quot;,&quot;non-dropping-particle&quot;:&quot;&quot;}],&quot;container-title&quot;:&quot;Fuel&quot;,&quot;DOI&quot;:&quot;10.1016/j.fuel.2021.122113&quot;,&quot;ISSN&quot;:&quot;00162361&quot;,&quot;issued&quot;:{&quot;date-parts&quot;:[[2022,2]]},&quot;page&quot;:&quot;122113&quot;,&quot;volume&quot;:&quot;310&quot;,&quot;container-title-short&quot;:&quot;&quot;},&quot;isTemporary&quot;:false}]},{&quot;citationID&quot;:&quot;MENDELEY_CITATION_b7c42850-3893-430a-a91a-ba071b5a549f&quot;,&quot;properties&quot;:{&quot;noteIndex&quot;:0},&quot;isEdited&quot;:false,&quot;manualOverride&quot;:{&quot;isManuallyOverridden&quot;:false,&quot;citeprocText&quot;:&quot;[26]&quot;,&quot;manualOverrideText&quot;:&quot;&quot;},&quot;citationTag&quot;:&quot;MENDELEY_CITATION_v3_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&quot;,&quot;citationItems&quot;:[{&quot;id&quot;:&quot;31848458-a34e-370b-af77-81d1d893a1c5&quot;,&quot;itemData&quot;:{&quot;type&quot;:&quot;article-journal&quot;,&quot;id&quot;:&quot;31848458-a34e-370b-af77-81d1d893a1c5&quot;,&quot;title&quot;:&quot;Deep Reinforcement Learning Approaches the MILP Optimum of a Multi-Energy Optimization in Energy Communities&quot;,&quot;author&quot;:[{&quot;family&quot;:&quot;Vetter&quot;,&quot;given&quot;:&quot;Vinzent&quot;,&quot;parse-names&quot;:false,&quot;dropping-particle&quot;:&quot;&quot;,&quot;non-dropping-particle&quot;:&quot;&quot;},{&quot;family&quot;:&quot;Wohlgenannt&quot;,&quot;given&quot;:&quot;Philipp&quot;,&quot;parse-names&quot;:false,&quot;dropping-particle&quot;:&quot;&quot;,&quot;non-dropping-particle&quot;:&quot;&quot;},{&quot;family&quot;:&quot;Kepplinger&quot;,&quot;given&quot;:&quot;Peter&quot;,&quot;parse-names&quot;:false,&quot;dropping-particle&quot;:&quot;&quot;,&quot;non-dropping-particle&quot;:&quot;&quot;},{&quot;family&quot;:&quot;Eder&quot;,&quot;given&quot;:&quot;Elias&quot;,&quot;parse-names&quot;:false,&quot;dropping-particle&quot;:&quot;&quot;,&quot;non-dropping-particle&quot;:&quot;&quot;}],&quot;container-title&quot;:&quot;Energies&quot;,&quot;container-title-short&quot;:&quot;Energies (Basel).&quot;,&quot;DOI&quot;:&quot;10.3390/en18174489&quot;,&quot;ISSN&quot;:&quot;1996-1073&quot;,&quot;issued&quot;:{&quot;date-parts&quot;:[[2025,8,23]]},&quot;page&quot;:&quot;4489&quot;,&quot;abstract&quot;:&quot;&lt;p&gt;As energy systems transition toward high shares of variable renewable generation, local energy communities (ECs) are increasingly relevant for enabling demand-side flexibility and self-sufficiency. This shift is particularly evident in the residential sector, where the deployment of photovoltaic (PV) systems is rapidly growing. While mixed-integer linear programming (MILP) remains the standard for operational optimization and demand response in such systems, its computational burden limits scalability and responsiveness under real-time or uncertain conditions. Reinforcement learning (RL), by contrast, offers a model-free, adaptive alternative. However, its application to real-world energy system operation remains limited. This study explores the application of a Deep Q-Network (DQN) to a real residential EC, which has received limited attention in prior work. The system comprises three single-family homes sharing a centralized heating system with a thermal energy storage (TES), a PV installation, and a grid connection. We compare the performance of MILP and RL controllers across economic and environmental metrics. Relative to a reference scenario without TES, MILP and RL reduce energy costs by 10.06% and 8.78%, respectively, and both approaches yield lower total energy consumption and CO2-equivalent emissions. Notably, the trained RL agent achieves a near-optimal outcome while requiring only 22% of the MILP’s computation time. These results demonstrate that DQNs can offer a computationally efficient and practically viable alternative to MILP for real-time control in residential energy systems.&lt;/p&gt;&quot;,&quot;issue&quot;:&quot;17&quot;,&quot;volume&quot;:&quot;18&quot;},&quot;isTemporary&quot;:false}]},{&quot;citationID&quot;:&quot;MENDELEY_CITATION_03d18768-2530-4173-a512-ec7dc06e4ecc&quot;,&quot;properties&quot;:{&quot;noteIndex&quot;:0},&quot;isEdited&quot;:false,&quot;manualOverride&quot;:{&quot;isManuallyOverridden&quot;:false,&quot;citeprocText&quot;:&quot;[27]&quot;,&quot;manualOverrideText&quot;:&quot;&quot;},&quot;citationTag&quot;:&quot;MENDELEY_CITATION_v3_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&quot;,&quot;citationItems&quot;:[{&quot;id&quot;:&quot;185586bd-ce77-3f7d-ae64-0f509db4cf05&quot;,&quot;itemData&quot;:{&quot;type&quot;:&quot;article-journal&quot;,&quot;id&quot;:&quot;185586bd-ce77-3f7d-ae64-0f509db4cf05&quot;,&quot;title&quot;:&quot;Energy Demand Response in a Food-Processing Plant: A Deep Reinforcement Learning Approach&quot;,&quot;author&quot;:[{&quot;family&quot;:&quot;Wohlgenannt&quot;,&quot;given&quot;:&quot;Philipp&quot;,&quot;parse-names&quot;:false,&quot;dropping-particle&quot;:&quot;&quot;,&quot;non-dropping-particle&quot;:&quot;&quot;},{&quot;family&quot;:&quot;Hegenbart&quot;,&quot;given&quot;:&quot;Sebastian&quot;,&quot;parse-names&quot;:false,&quot;dropping-particle&quot;:&quot;&quot;,&quot;non-dropping-particle&quot;:&quot;&quot;},{&quot;family&quot;:&quot;Eder&quot;,&quot;given&quot;:&quot;Elias&quot;,&quot;parse-names&quot;:false,&quot;dropping-particle&quot;:&quot;&quot;,&quot;non-dropping-particle&quot;:&quot;&quot;},{&quot;family&quot;:&quot;Kolhe&quot;,&quot;given&quot;:&quot;Mohan&quot;,&quot;parse-names&quot;:false,&quot;dropping-particle&quot;:&quot;&quot;,&quot;non-dropping-particle&quot;:&quot;&quot;},{&quot;family&quot;:&quot;Kepplinger&quot;,&quot;given&quot;:&quot;Peter&quot;,&quot;parse-names&quot;:false,&quot;dropping-particle&quot;:&quot;&quot;,&quot;non-dropping-particle&quot;:&quot;&quot;}],&quot;container-title&quot;:&quot;Energies&quot;,&quot;DOI&quot;:&quot;10.3390/en17246430&quot;,&quot;ISSN&quot;:&quot;1996-1073&quot;,&quot;issued&quot;:{&quot;date-parts&quot;:[[2024,12,20]]},&quot;page&quot;:&quot;6430&quot;,&quot;abstract&quot;:&quot;&lt;p&gt;The food industry faces significant challenges in managing operational costs due to its high energy intensity and rising energy prices. Industrial food-processing facilities, with substantial thermal capacities and large demands for cooling and heating, offer promising opportunities for demand response (DR) strategies. This study explores the application of deep reinforcement learning (RL) as an innovative, data-driven approach for DR in the food industry. By leveraging the adaptive, self-learning capabilities of RL, energy costs in the investigated plant are effectively decreased. The RL algorithm was compared with the well-established optimization method Mixed Integer Linear Programming (MILP), and both were benchmarked against a reference scenario without DR. The two optimization strategies demonstrate cost savings of 17.57% and 18.65% for RL and MILP, respectively. Although RL is slightly less efficient in cost reduction, it significantly outperforms in computational speed, being approximately 20 times faster. During operation, RL only needs 2ms per optimization compared to 19s for MILP, making it a promising optimization tool for edge computing. Moreover, while MILP’s computation time increases considerably with the number of binary variables, RL efficiently learns dynamic system behavior and scales to more complex systems without significant performance degradation. These results highlight that deep RL, when applied to DR, offers substantial cost savings and computational efficiency, with broad applicability to energy management in various applications.&lt;/p&gt;&quot;,&quot;issue&quot;:&quot;24&quot;,&quot;volume&quot;:&quot;17&quot;,&quot;container-title-short&quot;:&quot;Energies (Basel).&quot;},&quot;isTemporary&quot;:false}]},{&quot;citationID&quot;:&quot;MENDELEY_CITATION_d0ae8956-c2f2-4f72-9054-a8ca53b2504b&quot;,&quot;properties&quot;:{&quot;noteIndex&quot;:0},&quot;isEdited&quot;:false,&quot;manualOverride&quot;:{&quot;isManuallyOverridden&quot;:false,&quot;citeprocText&quot;:&quot;[28]&quot;,&quot;manualOverrideText&quot;:&quot;&quot;},&quot;citationTag&quot;:&quot;MENDELEY_CITATION_v3_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&quot;,&quot;citationItems&quot;:[{&quot;id&quot;:&quot;b510e037-8e3e-36b2-9b7f-53d097c80a2d&quot;,&quot;itemData&quot;:{&quot;type&quot;:&quot;article-journal&quot;,&quot;id&quot;:&quot;b510e037-8e3e-36b2-9b7f-53d097c80a2d&quot;,&quot;title&quot;:&quot;A comprehensive review on optimization of hybrid renewable energy systems using various optimization techniques&quot;,&quot;author&quot;:[{&quot;family&quot;:&quot;Thirunavukkarasu&quot;,&quot;given&quot;:&quot;M.&quot;,&quot;parse-names&quot;:false,&quot;dropping-particle&quot;:&quot;&quot;,&quot;non-dropping-particle&quot;:&quot;&quot;},{&quot;family&quot;:&quot;Sawle&quot;,&quot;given&quot;:&quot;Yashwant&quot;,&quot;parse-names&quot;:false,&quot;dropping-particle&quot;:&quot;&quot;,&quot;non-dropping-particle&quot;:&quot;&quot;},{&quot;family&quot;:&quot;Lala&quot;,&quot;given&quot;:&quot;Himadri&quot;,&quot;parse-names&quot;:false,&quot;dropping-particle&quot;:&quot;&quot;,&quot;non-dropping-particle&quot;:&quot;&quot;}],&quot;container-title&quot;:&quot;Renewable and Sustainable Energy Reviews&quot;,&quot;DOI&quot;:&quot;10.1016/j.rser.2023.113192&quot;,&quot;ISSN&quot;:&quot;13640321&quot;,&quot;issued&quot;:{&quot;date-parts&quot;:[[2023,4]]},&quot;page&quot;:&quot;113192&quot;,&quot;volume&quot;:&quot;176&quot;,&quot;container-title-short&quot;:&quot;&quot;},&quot;isTemporary&quot;:false}]},{&quot;citationID&quot;:&quot;MENDELEY_CITATION_b63a1021-7346-498d-adf3-73382c63a827&quot;,&quot;properties&quot;:{&quot;noteIndex&quot;:0},&quot;isEdited&quot;:false,&quot;manualOverride&quot;:{&quot;isManuallyOverridden&quot;:false,&quot;citeprocText&quot;:&quot;[29]&quot;,&quot;manualOverrideText&quot;:&quot;&quot;},&quot;citationTag&quot;:&quot;MENDELEY_CITATION_v3_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&quot;,&quot;citationItems&quot;:[{&quot;id&quot;:&quot;0f89bf4c-80d3-3ce8-8c18-b8917957c10b&quot;,&quot;itemData&quot;:{&quot;type&quot;:&quot;article-journal&quot;,&quot;id&quot;:&quot;0f89bf4c-80d3-3ce8-8c18-b8917957c10b&quot;,&quot;title&quot;:&quot;Optimal energy system scheduling using a constraint-aware reinforcement learning algorithm&quot;,&quot;author&quot;:[{&quot;family&quot;:&quot;Shengren&quot;,&quot;given&quot;:&quot;Hou&quot;,&quot;parse-names&quot;:false,&quot;dropping-particle&quot;:&quot;&quot;,&quot;non-dropping-particle&quot;:&quot;&quot;},{&quot;family&quot;:&quot;Vergara&quot;,&quot;given&quot;:&quot;Pedro P.&quot;,&quot;parse-names&quot;:false,&quot;dropping-particle&quot;:&quot;&quot;,&quot;non-dropping-particle&quot;:&quot;&quot;},{&quot;family&quot;:&quot;Salazar Duque&quot;,&quot;given&quot;:&quot;Edgar Mauricio&quot;,&quot;parse-names&quot;:false,&quot;dropping-particle&quot;:&quot;&quot;,&quot;non-dropping-particle&quot;:&quot;&quot;},{&quot;family&quot;:&quot;Palensky&quot;,&quot;given&quot;:&quot;Peter&quot;,&quot;parse-names&quot;:false,&quot;dropping-particle&quot;:&quot;&quot;,&quot;non-dropping-particle&quot;:&quot;&quot;}],&quot;container-title&quot;:&quot;International Journal of Electrical Power &amp; Energy Systems&quot;,&quot;DOI&quot;:&quot;10.1016/j.ijepes.2023.109230&quot;,&quot;ISSN&quot;:&quot;01420615&quot;,&quot;issued&quot;:{&quot;date-parts&quot;:[[2023,10]]},&quot;page&quot;:&quot;109230&quot;,&quot;volume&quot;:&quot;152&quot;,&quot;container-title-short&quot;:&quot;&quot;},&quot;isTemporary&quot;:false}]},{&quot;citationID&quot;:&quot;MENDELEY_CITATION_6d8a7862-c0c2-4c71-b5ea-7e17817e262d&quot;,&quot;properties&quot;:{&quot;noteIndex&quot;:0},&quot;isEdited&quot;:false,&quot;manualOverride&quot;:{&quot;isManuallyOverridden&quot;:false,&quot;citeprocText&quot;:&quot;[30]&quot;,&quot;manualOverrideText&quot;:&quot;&quot;},&quot;citationTag&quot;:&quot;MENDELEY_CITATION_v3_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&quot;,&quot;citationItems&quot;:[{&quot;id&quot;:&quot;32d54ec3-73fd-3a7d-a2b9-efadea2d2319&quot;,&quot;itemData&quot;:{&quot;type&quot;:&quot;article-journal&quot;,&quot;id&quot;:&quot;32d54ec3-73fd-3a7d-a2b9-efadea2d2319&quot;,&quot;title&quot;:&quot;A Review on Multi-Objective Mixed-Integer Non-Linear Optimization Programming Methods&quot;,&quot;author&quot;:[{&quot;family&quot;:&quot;Jaber&quot;,&quot;given&quot;:&quot;Ahmed&quot;,&quot;parse-names&quot;:false,&quot;dropping-particle&quot;:&quot;&quot;,&quot;non-dropping-particle&quot;:&quot;&quot;},{&quot;family&quot;:&quot;Younes&quot;,&quot;given&quot;:&quot;Rafic&quot;,&quot;parse-names&quot;:false,&quot;dropping-particle&quot;:&quot;&quot;,&quot;non-dropping-particle&quot;:&quot;&quot;},{&quot;family&quot;:&quot;Lafon&quot;,&quot;given&quot;:&quot;Pascal&quot;,&quot;parse-names&quot;:false,&quot;dropping-particle&quot;:&quot;&quot;,&quot;non-dropping-particle&quot;:&quot;&quot;},{&quot;family&quot;:&quot;Khoder&quot;,&quot;given&quot;:&quot;Jihan&quot;,&quot;parse-names&quot;:false,&quot;dropping-particle&quot;:&quot;&quot;,&quot;non-dropping-particle&quot;:&quot;&quot;}],&quot;container-title&quot;:&quot;Eng&quot;,&quot;DOI&quot;:&quot;10.3390/eng5030104&quot;,&quot;ISSN&quot;:&quot;2673-4117&quot;,&quot;issued&quot;:{&quot;date-parts&quot;:[[2024,8,17]]},&quot;page&quot;:&quot;1961-1979&quot;,&quot;abstract&quot;:&quot;&lt;p&gt;This paper provides a recent overview of the exact, approximate, and hybrid optimization methods that handle Multi-Objective Mixed-Integer Non-Linear Programming (MO-MINLP) problems. Both the domains of exact and approximate research have experienced significant growth, driven by their shared goal of addressing a wide range of real-world problems. This work presents a comprehensive literature review that highlights the significant theoretical contributions in the field of hybrid approaches between these research areas. We also point out possible research gaps in the literature. Hence, the main research questions to be answered in this paper involve the following: (1) how to exactly or approximately solve a MO-MINLP problem? (2) What are the drawbacks of exact methods as well as approximate methods? (3) What are the research lines that are currently underway to enhance the performances of these methods? and (4) Where are the research gaps in this field? This work aims to provide enough descriptive information for newcomers in this area about the research that has been carried out and that is currently underway concerning exact, approximate, and hybrid methods used to solve MO-MINLP problems.&lt;/p&gt;&quot;,&quot;issue&quot;:&quot;3&quot;,&quot;volume&quot;:&quot;5&quot;,&quot;container-title-short&quot;:&quot;&quot;},&quot;isTemporary&quot;:false}]},{&quot;citationID&quot;:&quot;MENDELEY_CITATION_43edfd88-7e00-44e3-af12-138762045627&quot;,&quot;properties&quot;:{&quot;noteIndex&quot;:0},&quot;isEdited&quot;:false,&quot;manualOverride&quot;:{&quot;isManuallyOverridden&quot;:false,&quot;citeprocText&quot;:&quot;[31]&quot;,&quot;manualOverrideText&quot;:&quot;&quot;},&quot;citationTag&quot;:&quot;MENDELEY_CITATION_v3_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&quot;,&quot;citationItems&quot;:[{&quot;id&quot;:&quot;3491985c-2e0b-31bc-84e8-6823f88df629&quot;,&quot;itemData&quot;:{&quot;type&quot;:&quot;article-journal&quot;,&quot;id&quot;:&quot;3491985c-2e0b-31bc-84e8-6823f88df629&quot;,&quot;title&quot;:&quot;Multi-objective stochastic optimization problem: a systematic literature review&quot;,&quot;author&quot;:[{&quot;family&quot;:&quot;Pirouz&quot;,&quot;given&quot;:&quot;Behzad&quot;,&quot;parse-names&quot;:false,&quot;dropping-particle&quot;:&quot;&quot;,&quot;non-dropping-particle&quot;:&quot;&quot;},{&quot;family&quot;:&quot;Guerriero&quot;,&quot;given&quot;:&quot;Francesca&quot;,&quot;parse-names&quot;:false,&quot;dropping-particle&quot;:&quot;&quot;,&quot;non-dropping-particle&quot;:&quot;&quot;}],&quot;container-title&quot;:&quot;Applied Energy&quot;,&quot;DOI&quot;:&quot;10.1016/j.apenergy.2025.127237&quot;,&quot;ISSN&quot;:&quot;03062619&quot;,&quot;issued&quot;:{&quot;date-parts&quot;:[[2026,2]]},&quot;page&quot;:&quot;127237&quot;,&quot;volume&quot;:&quot;405&quot;,&quot;container-title-short&quot;:&quot;Appl. Energy&quot;},&quot;isTemporary&quot;:false}]},{&quot;citationID&quot;:&quot;MENDELEY_CITATION_b6249101-b808-40c8-a033-78980999aeb7&quot;,&quot;properties&quot;:{&quot;noteIndex&quot;:0},&quot;isEdited&quot;:false,&quot;manualOverride&quot;:{&quot;isManuallyOverridden&quot;:false,&quot;citeprocText&quot;:&quot;[32]&quot;,&quot;manualOverrideText&quot;:&quot;&quot;},&quot;citationTag&quot;:&quot;MENDELEY_CITATION_v3_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&quot;,&quot;citationItems&quot;:[{&quot;id&quot;:&quot;54e38a01-fa83-3801-a318-6f19e94cb79c&quot;,&quot;itemData&quot;:{&quot;type&quot;:&quot;article-journal&quot;,&quot;id&quot;:&quot;54e38a01-fa83-3801-a318-6f19e94cb79c&quot;,&quot;title&quot;:&quot;A review on recent standalone and grid integrated hybrid renewable energy systems: System optimization and energy management strategies&quot;,&quot;author&quot;:[{&quot;family&quot;:&quot;Basnet&quot;,&quot;given&quot;:&quot;Sarad&quot;,&quot;parse-names&quot;:false,&quot;dropping-particle&quot;:&quot;&quot;,&quot;non-dropping-particle&quot;:&quot;&quot;},{&quot;family&quot;:&quot;Deschinkel&quot;,&quot;given&quot;:&quot;Karine&quot;,&quot;parse-names&quot;:false,&quot;dropping-particle&quot;:&quot;&quot;,&quot;non-dropping-particle&quot;:&quot;&quot;},{&quot;family&quot;:&quot;Moyne&quot;,&quot;given&quot;:&quot;Luis&quot;,&quot;parse-names&quot;:false,&quot;dropping-particle&quot;:&quot;&quot;,&quot;non-dropping-particle&quot;:&quot;Le&quot;},{&quot;family&quot;:&quot;Cécile Péra&quot;,&quot;given&quot;:&quot;Marie&quot;,&quot;parse-names&quot;:false,&quot;dropping-particle&quot;:&quot;&quot;,&quot;non-dropping-particle&quot;:&quot;&quot;}],&quot;container-title&quot;:&quot;Renewable Energy Focus&quot;,&quot;DOI&quot;:&quot;10.1016/j.ref.2023.06.001&quot;,&quot;ISSN&quot;:&quot;17550084&quot;,&quot;issued&quot;:{&quot;date-parts&quot;:[[2023,9]]},&quot;page&quot;:&quot;103-125&quot;,&quot;volume&quot;:&quot;46&quot;,&quot;container-title-short&quot;:&quot;&quot;},&quot;isTemporary&quot;:false}]},{&quot;citationID&quot;:&quot;MENDELEY_CITATION_9c9f6d6b-0d28-4cda-88a9-65954fd94b49&quot;,&quot;properties&quot;:{&quot;noteIndex&quot;:0},&quot;isEdited&quot;:false,&quot;manualOverride&quot;:{&quot;isManuallyOverridden&quot;:false,&quot;citeprocText&quot;:&quot;[33]&quot;,&quot;manualOverrideText&quot;:&quot;&quot;},&quot;citationTag&quot;:&quot;MENDELEY_CITATION_v3_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&quot;,&quot;citationItems&quot;:[{&quot;id&quot;:&quot;a7dd1c28-2105-373b-8623-5d74e7cdc012&quot;,&quot;itemData&quot;:{&quot;type&quot;:&quot;article-journal&quot;,&quot;id&quot;:&quot;a7dd1c28-2105-373b-8623-5d74e7cdc012&quot;,&quot;title&quot;:&quot;A Survey on Mixed-Integer Programming Techniques in Bilevel Optimization&quot;,&quot;author&quot;:[{&quot;family&quot;:&quot;Kleinert&quot;,&quot;given&quot;:&quot;Thomas&quot;,&quot;parse-names&quot;:false,&quot;dropping-particle&quot;:&quot;&quot;,&quot;non-dropping-particle&quot;:&quot;&quot;},{&quot;family&quot;:&quot;Labbé&quot;,&quot;given&quot;:&quot;Martine&quot;,&quot;parse-names&quot;:false,&quot;dropping-particle&quot;:&quot;&quot;,&quot;non-dropping-particle&quot;:&quot;&quot;},{&quot;family&quot;:&quot;Ljubić&quot;,&quot;given&quot;:&quot;Ivana&quot;,&quot;parse-names&quot;:false,&quot;dropping-particle&quot;:&quot;&quot;,&quot;non-dropping-particle&quot;:&quot;&quot;},{&quot;family&quot;:&quot;Schmidt&quot;,&quot;given&quot;:&quot;Martin&quot;,&quot;parse-names&quot;:false,&quot;dropping-particle&quot;:&quot;&quot;,&quot;non-dropping-particle&quot;:&quot;&quot;}],&quot;container-title&quot;:&quot;EURO Journal on Computational Optimization&quot;,&quot;DOI&quot;:&quot;10.1016/j.ejco.2021.100007&quot;,&quot;ISSN&quot;:&quot;21924406&quot;,&quot;issued&quot;:{&quot;date-parts&quot;:[[2021]]},&quot;page&quot;:&quot;100007&quot;,&quot;volume&quot;:&quot;9&quot;,&quot;container-title-short&quot;:&quot;&quot;},&quot;isTemporary&quot;:false}]},{&quot;citationID&quot;:&quot;MENDELEY_CITATION_33ef091a-ded0-4a74-8b85-848522b9880f&quot;,&quot;properties&quot;:{&quot;noteIndex&quot;:0},&quot;isEdited&quot;:false,&quot;manualOverride&quot;:{&quot;isManuallyOverridden&quot;:false,&quot;citeprocText&quot;:&quot;[32], [33], [34], [35]&quot;,&quot;manualOverrideText&quot;:&quot;&quot;},&quot;citationTag&quot;:&quot;MENDELEY_CITATION_v3_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&quot;,&quot;citationItems&quot;:[{&quot;id&quot;:&quot;f5b03336-6a29-3705-ac39-a115ab7d476b&quot;,&quot;itemData&quot;:{&quot;type&quot;:&quot;article-journal&quot;,&quot;id&quot;:&quot;f5b03336-6a29-3705-ac39-a115ab7d476b&quot;,&quot;title&quot;:&quot;Recent advances in mathematical programming techniques for the optimization of process systems under uncertainty&quot;,&quot;author&quot;:[{&quot;family&quot;:&quot;Grossmann&quot;,&quot;given&quot;:&quot;Ignacio E.&quot;,&quot;parse-names&quot;:false,&quot;dropping-particle&quot;:&quot;&quot;,&quot;non-dropping-particle&quot;:&quot;&quot;},{&quot;family&quot;:&quot;Apap&quot;,&quot;given&quot;:&quot;Robert M.&quot;,&quot;parse-names&quot;:false,&quot;dropping-particle&quot;:&quot;&quot;,&quot;non-dropping-particle&quot;:&quot;&quot;},{&quot;family&quot;:&quot;Calfa&quot;,&quot;given&quot;:&quot;Bruno A.&quot;,&quot;parse-names&quot;:false,&quot;dropping-particle&quot;:&quot;&quot;,&quot;non-dropping-particle&quot;:&quot;&quot;},{&quot;family&quot;:&quot;García-Herreros&quot;,&quot;given&quot;:&quot;Pablo&quot;,&quot;parse-names&quot;:false,&quot;dropping-particle&quot;:&quot;&quot;,&quot;non-dropping-particle&quot;:&quot;&quot;},{&quot;family&quot;:&quot;Zhang&quot;,&quot;given&quot;:&quot;Qi&quot;,&quot;parse-names&quot;:false,&quot;dropping-particle&quot;:&quot;&quot;,&quot;non-dropping-particle&quot;:&quot;&quot;}],&quot;container-title&quot;:&quot;Computers &amp; Chemical Engineering&quot;,&quot;DOI&quot;:&quot;10.1016/j.compchemeng.2016.03.002&quot;,&quot;ISSN&quot;:&quot;00981354&quot;,&quot;issued&quot;:{&quot;date-parts&quot;:[[2016,8]]},&quot;page&quot;:&quot;3-14&quot;,&quot;volume&quot;:&quot;91&quot;,&quot;container-title-short&quot;:&quot;Comput. Chem. Eng.&quot;},&quot;isTemporary&quot;:false},{&quot;id&quot;:&quot;1c837bc1-1688-320b-9cef-676437130233&quot;,&quot;itemData&quot;:{&quot;type&quot;:&quot;article-journal&quot;,&quot;id&quot;:&quot;1c837bc1-1688-320b-9cef-676437130233&quot;,&quot;title&quot;:&quot;A Review of Stochastic Programming Methods for Optimization of Process Systems Under Uncertainty&quot;,&quot;author&quot;:[{&quot;family&quot;:&quot;Li&quot;,&quot;given&quot;:&quot;Can&quot;,&quot;parse-names&quot;:false,&quot;dropping-particle&quot;:&quot;&quot;,&quot;non-dropping-particle&quot;:&quot;&quot;},{&quot;family&quot;:&quot;Grossmann&quot;,&quot;given&quot;:&quot;Ignacio E.&quot;,&quot;parse-names&quot;:false,&quot;dropping-particle&quot;:&quot;&quot;,&quot;non-dropping-particle&quot;:&quot;&quot;}],&quot;container-title&quot;:&quot;Frontiers in Chemical Engineering&quot;,&quot;DOI&quot;:&quot;10.3389/fceng.2020.622241&quot;,&quot;ISSN&quot;:&quot;2673-2718&quot;,&quot;issued&quot;:{&quot;date-parts&quot;:[[2021,1,28]]},&quot;abstract&quot;:&quot;&lt;p&gt;Uncertainties are widespread in the optimization of process systems, such as uncertainties in process technologies, prices, and customer demands. In this paper, we review the basic concepts and recent advances of a risk-neutral mathematical framework called “stochastic programming” and its applications in solving process systems engineering problems under uncertainty. This review intends to provide both a tutorial for beginners without prior experience and a high-level overview of the current state-of-the-art developments for experts in process systems engineering and stochastic programming. The mathematical formulations and algorithms for two-stage and multistage stochastic programming are reviewed with illustrative examples from process industries. The differences between stochastic programming under exogenous uncertainty and endogenous uncertainties are discussed. The concepts and several data-driven methods for generating scenario trees are also reviewed.&lt;/p&gt;&quot;,&quot;volume&quot;:&quot;2&quot;,&quot;container-title-short&quot;:&quot;&quot;},&quot;isTemporary&quot;:false},{&quot;id&quot;:&quot;a7dd1c28-2105-373b-8623-5d74e7cdc012&quot;,&quot;itemData&quot;:{&quot;type&quot;:&quot;article-journal&quot;,&quot;id&quot;:&quot;a7dd1c28-2105-373b-8623-5d74e7cdc012&quot;,&quot;title&quot;:&quot;A Survey on Mixed-Integer Programming Techniques in Bilevel Optimization&quot;,&quot;author&quot;:[{&quot;family&quot;:&quot;Kleinert&quot;,&quot;given&quot;:&quot;Thomas&quot;,&quot;parse-names&quot;:false,&quot;dropping-particle&quot;:&quot;&quot;,&quot;non-dropping-particle&quot;:&quot;&quot;},{&quot;family&quot;:&quot;Labbé&quot;,&quot;given&quot;:&quot;Martine&quot;,&quot;parse-names&quot;:false,&quot;dropping-particle&quot;:&quot;&quot;,&quot;non-dropping-particle&quot;:&quot;&quot;},{&quot;family&quot;:&quot;Ljubić&quot;,&quot;given&quot;:&quot;Ivana&quot;,&quot;parse-names&quot;:false,&quot;dropping-particle&quot;:&quot;&quot;,&quot;non-dropping-particle&quot;:&quot;&quot;},{&quot;family&quot;:&quot;Schmidt&quot;,&quot;given&quot;:&quot;Martin&quot;,&quot;parse-names&quot;:false,&quot;dropping-particle&quot;:&quot;&quot;,&quot;non-dropping-particle&quot;:&quot;&quot;}],&quot;container-title&quot;:&quot;EURO Journal on Computational Optimization&quot;,&quot;DOI&quot;:&quot;10.1016/j.ejco.2021.100007&quot;,&quot;ISSN&quot;:&quot;21924406&quot;,&quot;issued&quot;:{&quot;date-parts&quot;:[[2021]]},&quot;page&quot;:&quot;100007&quot;,&quot;volume&quot;:&quot;9&quot;,&quot;container-title-short&quot;:&quot;&quot;},&quot;isTemporary&quot;:false},{&quot;id&quot;:&quot;54e38a01-fa83-3801-a318-6f19e94cb79c&quot;,&quot;itemData&quot;:{&quot;type&quot;:&quot;article-journal&quot;,&quot;id&quot;:&quot;54e38a01-fa83-3801-a318-6f19e94cb79c&quot;,&quot;title&quot;:&quot;A review on recent standalone and grid integrated hybrid renewable energy systems: System optimization and energy management strategies&quot;,&quot;author&quot;:[{&quot;family&quot;:&quot;Basnet&quot;,&quot;given&quot;:&quot;Sarad&quot;,&quot;parse-names&quot;:false,&quot;dropping-particle&quot;:&quot;&quot;,&quot;non-dropping-particle&quot;:&quot;&quot;},{&quot;family&quot;:&quot;Deschinkel&quot;,&quot;given&quot;:&quot;Karine&quot;,&quot;parse-names&quot;:false,&quot;dropping-particle&quot;:&quot;&quot;,&quot;non-dropping-particle&quot;:&quot;&quot;},{&quot;family&quot;:&quot;Moyne&quot;,&quot;given&quot;:&quot;Luis&quot;,&quot;parse-names&quot;:false,&quot;dropping-particle&quot;:&quot;&quot;,&quot;non-dropping-particle&quot;:&quot;Le&quot;},{&quot;family&quot;:&quot;Cécile Péra&quot;,&quot;given&quot;:&quot;Marie&quot;,&quot;parse-names&quot;:false,&quot;dropping-particle&quot;:&quot;&quot;,&quot;non-dropping-particle&quot;:&quot;&quot;}],&quot;container-title&quot;:&quot;Renewable Energy Focus&quot;,&quot;DOI&quot;:&quot;10.1016/j.ref.2023.06.001&quot;,&quot;ISSN&quot;:&quot;17550084&quot;,&quot;issued&quot;:{&quot;date-parts&quot;:[[2023,9]]},&quot;page&quot;:&quot;103-125&quot;,&quot;volume&quot;:&quot;46&quot;,&quot;container-title-short&quot;:&quot;&quot;},&quot;isTemporary&quot;:false}]},{&quot;citationID&quot;:&quot;MENDELEY_CITATION_4a4c6769-de4f-4723-ad1a-7b324cf3f736&quot;,&quot;properties&quot;:{&quot;noteIndex&quot;:0},&quot;isEdited&quot;:false,&quot;manualOverride&quot;:{&quot;isManuallyOverridden&quot;:false,&quot;citeprocText&quot;:&quot;[36]&quot;,&quot;manualOverrideText&quot;:&quot;&quot;},&quot;citationTag&quot;:&quot;MENDELEY_CITATION_v3_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&quot;,&quot;citationItems&quot;:[{&quot;id&quot;:&quot;657631e7-7854-321d-9660-90161531164b&quot;,&quot;itemData&quot;:{&quot;type&quot;:&quot;article-journal&quot;,&quot;id&quot;:&quot;657631e7-7854-321d-9660-90161531164b&quot;,&quot;title&quot;:&quot;Integrating multi-objective superstructure optimization and multi-criteria assessment: a novel methodology for sustainable process design&quot;,&quot;author&quot;:[{&quot;family&quot;:&quot;Kenkel&quot;,&quot;given&quot;:&quot;Philipp&quot;,&quot;parse-names&quot;:false,&quot;dropping-particle&quot;:&quot;&quot;,&quot;non-dropping-particle&quot;:&quot;&quot;},{&quot;family&quot;:&quot;Schnuelle&quot;,&quot;given&quot;:&quot;Christian&quot;,&quot;parse-names&quot;:false,&quot;dropping-particle&quot;:&quot;&quot;,&quot;non-dropping-particle&quot;:&quot;&quot;},{&quot;family&quot;:&quot;Wassermann&quot;,&quot;given&quot;:&quot;Timo&quot;,&quot;parse-names&quot;:false,&quot;dropping-particle&quot;:&quot;&quot;,&quot;non-dropping-particle&quot;:&quot;&quot;},{&quot;family&quot;:&quot;Zondervan&quot;,&quot;given&quot;:&quot;Edwin&quot;,&quot;parse-names&quot;:false,&quot;dropping-particle&quot;:&quot;&quot;,&quot;non-dropping-particle&quot;:&quot;&quot;}],&quot;container-title&quot;:&quot;Physical Sciences Reviews&quot;,&quot;DOI&quot;:&quot;10.1515/psr-2020-0058&quot;,&quot;ISSN&quot;:&quot;2365-659X&quot;,&quot;issued&quot;:{&quot;date-parts&quot;:[[2023,9,25]]},&quot;page&quot;:&quot;2361-2394&quot;,&quot;abstract&quot;:&quot;&lt;p&gt; This work presents a novel methodology for integrated multi-objective superstructure optimization and multi-criteria assessment. The method is tailored for sustainable process synthesis utilizing mixed-integer linear programming (MILP). The six-step algorithm includes 1) superstructure formulation, 2) criteria definition and implementation, 3) criteria weighting, 4) single-criterion optimization, 5) reformulation and 6) multi-criteria optimization. It is automated in the &lt;bold&gt; &lt;italic&gt;O&lt;/italic&gt; &lt;/bold&gt; &lt;italic&gt;pen s&lt;/italic&gt; &lt;bold&gt; &lt;italic&gt;U&lt;/italic&gt; &lt;/bold&gt; &lt;italic&gt;perstruc&lt;/italic&gt; &lt;bold&gt; &lt;italic&gt;T&lt;/italic&gt; &lt;/bold&gt; &lt;italic&gt;ure mo&lt;/italic&gt; &lt;bold&gt; &lt;italic&gt;D&lt;/italic&gt; &lt;/bold&gt; &lt;italic&gt;eling and&lt;/italic&gt; &lt;bold&gt; &lt;italic&gt;O&lt;/italic&gt; &lt;/bold&gt; &lt;italic&gt;ptimizati&lt;/italic&gt; &lt;bold&gt; &lt;italic&gt;O&lt;/italic&gt; &lt;/bold&gt; &lt;italic&gt;n f&lt;/italic&gt; &lt;bold&gt; &lt;italic&gt;R&lt;/italic&gt; &lt;/bold&gt; &lt;italic&gt;amework&lt;/italic&gt; (OUTDOOR) and tested on integrated power-to-X and biomass-to-X processes for methanol production. Three criteria are considered, namely net production costs ( &lt;italic&gt;NPC&lt;/italic&gt; ), net production greenhouse gas emissions ( &lt;italic&gt;NPE&lt;/italic&gt; ) and net production fresh water demand ( &lt;italic&gt;NPFWD&lt;/italic&gt; ). The optimization indicates &lt;italic&gt;NPC&lt;/italic&gt; of 1307 €/t &lt;sub&gt;MeOH&lt;/sub&gt; with &lt;italic&gt;NPE&lt;/italic&gt; of −2.23 &lt;inline-formula id=\&quot;j_psr-2020-0058_ineq_001\&quot;&gt; &lt;alternatives&gt; &lt;math&gt; &lt;mrow&gt; &lt;msub&gt; &lt;mtext&gt;t&lt;/mtext&gt; &lt;msub&gt; &lt;mtext&gt;CO&lt;/mtext&gt; &lt;mn&gt;2&lt;/mn&gt; &lt;/msub&gt; &lt;/msub&gt; &lt;mo&gt;/&lt;/mo&gt; &lt;msub&gt; &lt;mtext&gt;t&lt;/mtext&gt; &lt;mtext&gt;MeOH&lt;/mtext&gt; &lt;/msub&gt; &lt;/mrow&gt; &lt;/math&gt; &lt;tex-math&gt;${\\text{t}}_{{\\text{CO}}_{2}}/{\\text{t}}_{\\text{MeOH}}$&lt;/tex-math&gt; &lt;inline-graphic href=\&quot;graphic/j_psr-2020-0058_ineq_001.png\&quot;/&gt; &lt;/alternatives&gt; &lt;/inline-formula&gt; and &lt;italic&gt;NPFWD&lt;/italic&gt; of −3.42 &lt;inline-formula id=\&quot;j_psr-2020-0058_ineq_002\&quot;&gt; &lt;alternatives&gt; &lt;math&gt; &lt;mrow&gt; &lt;msub&gt; &lt;mtext&gt;t&lt;/mtext&gt; &lt;mrow&gt; &lt;msub&gt; &lt;mtext&gt;H&lt;/mtext&gt; &lt;mn&gt;2&lt;/mn&gt; &lt;/msub&gt; &lt;mtext&gt;O&lt;/mtext&gt; &lt;/mrow&gt; &lt;/msub&gt; &lt;mo&gt;/&lt;/mo&gt; &lt;msub&gt; &lt;mtext&gt;t&lt;/mtext&gt; &lt;mtext&gt;MeOH&lt;/mtext&gt; &lt;/msub&gt; &lt;/mrow&gt; &lt;/math&gt; &lt;tex-math&gt;${\\text{t}}_{{\\text{H}}_{2}\\text{O}}/{\\text{t}}_{\\text{MeOH}}$&lt;/tex-math&gt; &lt;inline-graphic href=\&quot;graphic/j_psr-2020-0058_ineq_002.png\&quot;/&gt; &lt;/alternatives&gt; &lt;/inline-formula&gt; for an optimal trade-off plant. The plant configuration features low-pressure alkaline electrolysis for hydrogen supply, absorption-based CO &lt;sub&gt;2&lt;/sub&gt; capture and steam production from methanol purge gas for internal heat supply. Conducted variation and sensitivity analyses indicate that methanol costs can drop to about 500 €/t &lt;sub&gt;MeOH&lt;/sub&gt; if electricity is free of charge, or to 805 €/t &lt;sub&gt;MeOH&lt;/sub&gt; if biogas is available at large quantities, if a least-cost process layouts are considered. However, all performed multi-criteria analyses imply a robust optimal process design utilizing electricity-based methanol production. &lt;/p&gt;&quot;,&quot;issue&quot;:&quot;9&quot;,&quot;volume&quot;:&quot;8&quot;,&quot;container-title-short&quot;:&quot;&quot;},&quot;isTemporary&quot;:false}]},{&quot;citationID&quot;:&quot;MENDELEY_CITATION_17f6286c-8eea-4653-85d8-bedf5256b8a1&quot;,&quot;properties&quot;:{&quot;noteIndex&quot;:0},&quot;isEdited&quot;:false,&quot;manualOverride&quot;:{&quot;isManuallyOverridden&quot;:false,&quot;citeprocText&quot;:&quot;[37]&quot;,&quot;manualOverrideText&quot;:&quot;&quot;},&quot;citationTag&quot;:&quot;MENDELEY_CITATION_v3_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&quot;,&quot;citationItems&quot;:[{&quot;id&quot;:&quot;a94934b4-96b0-3079-8b75-f945ca40e652&quot;,&quot;itemData&quot;:{&quot;type&quot;:&quot;article-journal&quot;,&quot;id&quot;:&quot;a94934b4-96b0-3079-8b75-f945ca40e652&quot;,&quot;title&quot;:&quot;Multi-Objective Optimization of an Energy Community Powered by a Distributed Polygeneration System&quot;,&quot;author&quot;:[{&quot;family&quot;:&quot;Souza&quot;,&quot;given&quot;:&quot;Ronelly José&quot;,&quot;parse-names&quot;:false,&quot;dropping-particle&quot;:&quot;&quot;,&quot;non-dropping-particle&quot;:&quot;De&quot;},{&quot;family&quot;:&quot;Reini&quot;,&quot;given&quot;:&quot;Mauro&quot;,&quot;parse-names&quot;:false,&quot;dropping-particle&quot;:&quot;&quot;,&quot;non-dropping-particle&quot;:&quot;&quot;},{&quot;family&quot;:&quot;Serra&quot;,&quot;given&quot;:&quot;Luis M.&quot;,&quot;parse-names&quot;:false,&quot;dropping-particle&quot;:&quot;&quot;,&quot;non-dropping-particle&quot;:&quot;&quot;},{&quot;family&quot;:&quot;Lozano&quot;,&quot;given&quot;:&quot;Miguel A.&quot;,&quot;parse-names&quot;:false,&quot;dropping-particle&quot;:&quot;&quot;,&quot;non-dropping-particle&quot;:&quot;&quot;},{&quot;family&quot;:&quot;Nadalon&quot;,&quot;given&quot;:&quot;Emanuele&quot;,&quot;parse-names&quot;:false,&quot;dropping-particle&quot;:&quot;&quot;,&quot;non-dropping-particle&quot;:&quot;&quot;},{&quot;family&quot;:&quot;Casisi&quot;,&quot;given&quot;:&quot;Melchiorre&quot;,&quot;parse-names&quot;:false,&quot;dropping-particle&quot;:&quot;&quot;,&quot;non-dropping-particle&quot;:&quot;&quot;}],&quot;container-title&quot;:&quot;Energies&quot;,&quot;DOI&quot;:&quot;10.3390/en17133085&quot;,&quot;ISSN&quot;:&quot;1996-1073&quot;,&quot;issued&quot;:{&quot;date-parts&quot;:[[2024,6,22]]},&quot;page&quot;:&quot;3085&quot;,&quot;abstract&quot;:&quot;&lt;p&gt;This paper presents a multi-objective optimization model for the integration of polygeneration systems into energy communities (ECs), by analyzing a case study. The concept of ECs is increasingly seen as beneficial for reducing global energy consumption and greenhouse gas emissions. Polygeneration systems have the potential to play a crucial role in this context, since they are known for producing multiple energy services from a single energy resource, besides the possibility of being fed also by renewable energy sources. However, optimizing the configuration and operation of these systems within ECs presents complex challenges due to the variety of technologies involved, their interactions, and the dynamic behavior of buildings. Therefore, the aim of this work is developing a mathematical model using a mixed integer linear programming (MILP) algorithm to optimally design and operate polygeneration systems integrated into ECs. The model is applied to a case study of an EC comprising nine buildings in a small city in the northeast of Italy. The work rests on the single- and multi-objective optimization of the polygeneration systems taking into account the sharing of electricity among the buildings (both self-produced and/or the purchased from the grid), as well as the sharing of heating and cooling between the buildings through a district heating and cooling network (DHCN). The main results from the EC case study show the possibility of reducing the total annual CO2 emissions by around 24.3% (about 1.72 kt CO2/year) while increasing the total annual costs by 1.9% (about 0.09 M€/year) or reducing the total annual costs by 31.9% (about 1.47 M€/year) while increasing the total annual CO2 emissions by 2.2% (about 0.16 kt CO2/year). The work developed within this research can be adapted to different case studies, such as in the residential–commercial buildings and industrial sectors. Therefore, the model resulting from this work constitutes an effective tool to optimally design and operate polygeneration systems integrated into ECs.&lt;/p&gt;&quot;,&quot;issue&quot;:&quot;13&quot;,&quot;volume&quot;:&quot;17&quot;,&quot;container-title-short&quot;:&quot;Energies (Basel).&quot;},&quot;isTemporary&quot;:false}]},{&quot;citationID&quot;:&quot;MENDELEY_CITATION_94464e02-64aa-4b84-948c-989aee7cb4eb&quot;,&quot;properties&quot;:{&quot;noteIndex&quot;:0},&quot;isEdited&quot;:false,&quot;manualOverride&quot;:{&quot;isManuallyOverridden&quot;:false,&quot;citeprocText&quot;:&quot;[38]&quot;,&quot;manualOverrideText&quot;:&quot;&quot;},&quot;citationTag&quot;:&quot;MENDELEY_CITATION_v3_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&quot;,&quot;citationItems&quot;:[{&quot;id&quot;:&quot;39e6e63a-abdc-38b4-bc7e-087f23193300&quot;,&quot;itemData&quot;:{&quot;type&quot;:&quot;article-journal&quot;,&quot;id&quot;:&quot;39e6e63a-abdc-38b4-bc7e-087f23193300&quot;,&quot;title&quot;:&quot;Energy Demand Response in a Food-Processing Plant: A Deep Reinforcement Learning Approach&quot;,&quot;author&quot;:[{&quot;family&quot;:&quot;Wohlgenannt&quot;,&quot;given&quot;:&quot;Philipp&quot;,&quot;parse-names&quot;:false,&quot;dropping-particle&quot;:&quot;&quot;,&quot;non-dropping-particle&quot;:&quot;&quot;},{&quot;family&quot;:&quot;Hegenbart&quot;,&quot;given&quot;:&quot;Sebastian&quot;,&quot;parse-names&quot;:false,&quot;dropping-particle&quot;:&quot;&quot;,&quot;non-dropping-particle&quot;:&quot;&quot;},{&quot;family&quot;:&quot;Eder&quot;,&quot;given&quot;:&quot;Elias&quot;,&quot;parse-names&quot;:false,&quot;dropping-particle&quot;:&quot;&quot;,&quot;non-dropping-particle&quot;:&quot;&quot;},{&quot;family&quot;:&quot;Kolhe&quot;,&quot;given&quot;:&quot;Mohan&quot;,&quot;parse-names&quot;:false,&quot;dropping-particle&quot;:&quot;&quot;,&quot;non-dropping-particle&quot;:&quot;&quot;},{&quot;family&quot;:&quot;Kepplinger&quot;,&quot;given&quot;:&quot;Peter&quot;,&quot;parse-names&quot;:false,&quot;dropping-particle&quot;:&quot;&quot;,&quot;non-dropping-particle&quot;:&quot;&quot;}],&quot;container-title&quot;:&quot;Energies&quot;,&quot;container-title-short&quot;:&quot;Energies (Basel).&quot;,&quot;DOI&quot;:&quot;10.3390/en17246430&quot;,&quot;ISSN&quot;:&quot;1996-1073&quot;,&quot;issued&quot;:{&quot;date-parts&quot;:[[2024,12,20]]},&quot;page&quot;:&quot;6430&quot;,&quot;abstract&quot;:&quot;&lt;p&gt;The food industry faces significant challenges in managing operational costs due to its high energy intensity and rising energy prices. Industrial food-processing facilities, with substantial thermal capacities and large demands for cooling and heating, offer promising opportunities for demand response (DR) strategies. This study explores the application of deep reinforcement learning (RL) as an innovative, data-driven approach for DR in the food industry. By leveraging the adaptive, self-learning capabilities of RL, energy costs in the investigated plant are effectively decreased. The RL algorithm was compared with the well-established optimization method Mixed Integer Linear Programming (MILP), and both were benchmarked against a reference scenario without DR. The two optimization strategies demonstrate cost savings of 17.57% and 18.65% for RL and MILP, respectively. Although RL is slightly less efficient in cost reduction, it significantly outperforms in computational speed, being approximately 20 times faster. During operation, RL only needs 2ms per optimization compared to 19s for MILP, making it a promising optimization tool for edge computing. Moreover, while MILP’s computation time increases considerably with the number of binary variables, RL efficiently learns dynamic system behavior and scales to more complex systems without significant performance degradation. These results highlight that deep RL, when applied to DR, offers substantial cost savings and computational efficiency, with broad applicability to energy management in various applications.&lt;/p&gt;&quot;,&quot;issue&quot;:&quot;24&quot;,&quot;volume&quot;:&quot;17&quot;},&quot;isTemporary&quot;:false}]},{&quot;citationID&quot;:&quot;MENDELEY_CITATION_f6ee1e61-1bbe-43ae-916b-e4b52f3e034f&quot;,&quot;properties&quot;:{&quot;noteIndex&quot;:0},&quot;isEdited&quot;:false,&quot;manualOverride&quot;:{&quot;isManuallyOverridden&quot;:false,&quot;citeprocText&quot;:&quot;[39]&quot;,&quot;manualOverrideText&quot;:&quot;&quot;},&quot;citationTag&quot;:&quot;MENDELEY_CITATION_v3_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&quot;,&quot;citationItems&quot;:[{&quot;id&quot;:&quot;db0b8039-29f3-359f-944c-e94a21d1ea11&quot;,&quot;itemData&quot;:{&quot;type&quot;:&quot;paper-conference&quot;,&quot;id&quot;:&quot;db0b8039-29f3-359f-944c-e94a21d1ea11&quot;,&quot;title&quot;:&quot;Performance Comparison of Deep RL Algorithms for Energy Systems Optimal Scheduling&quot;,&quot;author&quot;:[{&quot;family&quot;:&quot;Shengren&quot;,&quot;given&quot;:&quot;Hou&quot;,&quot;parse-names&quot;:false,&quot;dropping-particle&quot;:&quot;&quot;,&quot;non-dropping-particle&quot;:&quot;&quot;},{&quot;family&quot;:&quot;Salazar&quot;,&quot;given&quot;:&quot;Edgar Mauricio&quot;,&quot;parse-names&quot;:false,&quot;dropping-particle&quot;:&quot;&quot;,&quot;non-dropping-particle&quot;:&quot;&quot;},{&quot;family&quot;:&quot;Vergara&quot;,&quot;given&quot;:&quot;Pedro P.&quot;,&quot;parse-names&quot;:false,&quot;dropping-particle&quot;:&quot;&quot;,&quot;non-dropping-particle&quot;:&quot;&quot;},{&quot;family&quot;:&quot;Palensky&quot;,&quot;given&quot;:&quot;Peter&quot;,&quot;parse-names&quot;:false,&quot;dropping-particle&quot;:&quot;&quot;,&quot;non-dropping-particle&quot;:&quot;&quot;}],&quot;container-title&quot;:&quot;2022 IEEE PES Innovative Smart Grid Technologies Conference Europe (ISGT-Europe)&quot;,&quot;DOI&quot;:&quot;10.1109/ISGT-Europe54678.2022.9960642&quot;,&quot;ISBN&quot;:&quot;978-1-6654-8032-1&quot;,&quot;issued&quot;:{&quot;date-parts&quot;:[[2022,10,10]]},&quot;page&quot;:&quot;1-6&quot;,&quot;publisher&quot;:&quot;IEEE&quot;,&quot;container-title-short&quot;:&quot;&quot;},&quot;isTemporary&quot;:false}]},{&quot;citationID&quot;:&quot;MENDELEY_CITATION_96ae9baa-ea86-4a08-9c4f-af9c24e3165b&quot;,&quot;properties&quot;:{&quot;noteIndex&quot;:0},&quot;isEdited&quot;:false,&quot;manualOverride&quot;:{&quot;isManuallyOverridden&quot;:false,&quot;citeprocText&quot;:&quot;[40]&quot;,&quot;manualOverrideText&quot;:&quot;&quot;},&quot;citationTag&quot;:&quot;MENDELEY_CITATION_v3_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&quot;,&quot;citationItems&quot;:[{&quot;id&quot;:&quot;24483df0-3b18-335c-b6c9-40541914d90d&quot;,&quot;itemData&quot;:{&quot;type&quot;:&quot;article-journal&quot;,&quot;id&quot;:&quot;24483df0-3b18-335c-b6c9-40541914d90d&quot;,&quot;title&quot;:&quot;Mixed Deep Reinforcement Learning Considering Discrete-continuous Hybrid Action Space for Smart Home Energy Management&quot;,&quot;author&quot;:[{&quot;family&quot;:&quot;Huang&quot;,&quot;given&quot;:&quot;Chao&quot;,&quot;parse-names&quot;:false,&quot;dropping-particle&quot;:&quot;&quot;,&quot;non-dropping-particle&quot;:&quot;&quot;},{&quot;family&quot;:&quot;Zhang&quot;,&quot;given&quot;:&quot;Hongcai&quot;,&quot;parse-names&quot;:false,&quot;dropping-particle&quot;:&quot;&quot;,&quot;non-dropping-particle&quot;:&quot;&quot;},{&quot;family&quot;:&quot;Wang&quot;,&quot;given&quot;:&quot;Long&quot;,&quot;parse-names&quot;:false,&quot;dropping-particle&quot;:&quot;&quot;,&quot;non-dropping-particle&quot;:&quot;&quot;},{&quot;family&quot;:&quot;Luo&quot;,&quot;given&quot;:&quot;Xiong&quot;,&quot;parse-names&quot;:false,&quot;dropping-particle&quot;:&quot;&quot;,&quot;non-dropping-particle&quot;:&quot;&quot;},{&quot;family&quot;:&quot;Song&quot;,&quot;given&quot;:&quot;Yonghua&quot;,&quot;parse-names&quot;:false,&quot;dropping-particle&quot;:&quot;&quot;,&quot;non-dropping-particle&quot;:&quot;&quot;}],&quot;container-title&quot;:&quot;Journal of Modern Power Systems and Clean Energy&quot;,&quot;DOI&quot;:&quot;10.35833/MPCE.2021.000394&quot;,&quot;ISSN&quot;:&quot;2196-5625&quot;,&quot;issued&quot;:{&quot;date-parts&quot;:[[2022]]},&quot;page&quot;:&quot;743-754&quot;,&quot;issue&quot;:&quot;3&quot;,&quot;volume&quot;:&quot;10&quot;,&quot;container-title-short&quot;:&quot;&quot;},&quot;isTemporary&quot;:false}]},{&quot;citationID&quot;:&quot;MENDELEY_CITATION_6c73ec7e-f594-40ea-aad9-4c624f81d6ce&quot;,&quot;properties&quot;:{&quot;noteIndex&quot;:0},&quot;isEdited&quot;:false,&quot;manualOverride&quot;:{&quot;isManuallyOverridden&quot;:false,&quot;citeprocText&quot;:&quot;[41]&quot;,&quot;manualOverrideText&quot;:&quot;&quot;},&quot;citationTag&quot;:&quot;MENDELEY_CITATION_v3_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&quot;,&quot;citationItems&quot;:[{&quot;id&quot;:&quot;e6b87f49-da3a-31c2-9708-c2655a7acf54&quot;,&quot;itemData&quot;:{&quot;type&quot;:&quot;article-journal&quot;,&quot;id&quot;:&quot;e6b87f49-da3a-31c2-9708-c2655a7acf54&quot;,&quot;title&quot;:&quot;Deep reinforcement learning-based energy management for design and control of off-grid renewable microgrids with dual-battery storage&quot;,&quot;author&quot;:[{&quot;family&quot;:&quot;Khan&quot;,&quot;given&quot;:&quot;Wajid&quot;,&quot;parse-names&quot;:false,&quot;dropping-particle&quot;:&quot;&quot;,&quot;non-dropping-particle&quot;:&quot;&quot;},{&quot;family&quot;:&quot;Renhai&quot;,&quot;given&quot;:&quot;Feng&quot;,&quot;parse-names&quot;:false,&quot;dropping-particle&quot;:&quot;&quot;,&quot;non-dropping-particle&quot;:&quot;&quot;},{&quot;family&quot;:&quot;Aziz&quot;,&quot;given&quot;:&quot;Abdul&quot;,&quot;parse-names&quot;:false,&quot;dropping-particle&quot;:&quot;&quot;,&quot;non-dropping-particle&quot;:&quot;&quot;},{&quot;family&quot;:&quot;Yousaf&quot;,&quot;given&quot;:&quot;Muhammad Zain&quot;,&quot;parse-names&quot;:false,&quot;dropping-particle&quot;:&quot;&quot;,&quot;non-dropping-particle&quot;:&quot;&quot;},{&quot;family&quot;:&quot;Cai&quot;,&quot;given&quot;:&quot;Zhi&quot;,&quot;parse-names&quot;:false,&quot;dropping-particle&quot;:&quot;&quot;,&quot;non-dropping-particle&quot;:&quot;&quot;},{&quot;family&quot;:&quot;Iqbal&quot;,&quot;given&quot;:&quot;Muhammad Umair&quot;,&quot;parse-names&quot;:false,&quot;dropping-particle&quot;:&quot;&quot;,&quot;non-dropping-particle&quot;:&quot;&quot;},{&quot;family&quot;:&quot;Wang&quot;,&quot;given&quot;:&quot;Jiang&quot;,&quot;parse-names&quot;:false,&quot;dropping-particle&quot;:&quot;&quot;,&quot;non-dropping-particle&quot;:&quot;&quot;},{&quot;family&quot;:&quot;Abdullah&quot;,&quot;given&quot;:&quot;Mustafa&quot;,&quot;parse-names&quot;:false,&quot;dropping-particle&quot;:&quot;&quot;,&quot;non-dropping-particle&quot;:&quot;&quot;},{&quot;family&quot;:&quot;Geremew&quot;,&quot;given&quot;:&quot;Mebratu Sintie&quot;,&quot;parse-names&quot;:false,&quot;dropping-particle&quot;:&quot;&quot;,&quot;non-dropping-particle&quot;:&quot;&quot;}],&quot;container-title&quot;:&quot;Energy Exploration &amp; Exploitation&quot;,&quot;DOI&quot;:&quot;10.1177/01445987251387368&quot;,&quot;ISSN&quot;:&quot;0144-5987&quot;,&quot;issued&quot;:{&quot;date-parts&quot;:[[2026,3,16]]},&quot;page&quot;:&quot;821-869&quot;,&quot;abstract&quot;:&quot;&lt;p&gt; Meeting the growing global electricity demand in remote and off-grid regions requires cost-effective and reliable power solutions that overcome the intermittency of renewable energy sources. This paper presents a comprehensive techno-economic optimization framework for the design and operation of off-grid hybrid renewable energy systems (HRES) integrating photovoltaic (PV), wind turbine, biomass generator, diesel backup, and a dual-chemistry hybrid battery energy storage system (HBESS) combining lithium-ion and nickel-iron batteries. A detailed mathematical modeling approach is employed to capture the nonlinear dynamics, stochastic renewable behavior, battery degradation, and temperature-adjusted component efficiencies. The system is formulated as a multi-objective mixed-integer nonlinear programming problem targeting the minimization of life cycle cost (LCC), levelized cost of energy (LCOE), and CO &lt;sub&gt;2&lt;/sub&gt; emissions while satisfying reliability constraints such as loss of power supply probability (LPSP &amp;lt; 0.01). To solve the optimization problem, advanced metaheuristic algorithms—Particle Swarm Optimization (PSO), Genetic Algorithms (GA), Grey Wolf Optimizer (GWO), and Differential Evolution (DE), and Salp Swarm Algorithm (SSA)—and a Deep Q-Network (DQN)-based reinforcement learning energy management strategy are implemented and benchmarked. The proposed DQN-based controller demonstrates superior performance over conventional rule-based and static dispatch methods by maintaining more stable battery state-of-charge (SOC) profiles, reducing degradation, and enabling intelligent real-time decision-making. Simulation results based on realistic meteorological and demand profiles reveal that the integrated DQN and HBESS strategy reduces total LCC by over 20%, CO &lt;sub&gt;2&lt;/sub&gt; emissions by up to 30%, and battery degradation costs by over 10% compared to baseline systems. The Salp Swarm Algorithm (SSA) achieves the fastest convergence and the highest-quality Pareto-optimal solutions among all metaheuristics evaluated. Sensitivity analysis identifies diesel price and interest rate as the most influential parameters on LCOE, while load shifting through aggressive demand-side management further minimizes battery usage, operating costs, and emissions. The proposed framework not only addresses key challenges in off-grid microgrid design but also provides a scalable and robust pathway for sustainable rural electrification using hybrid storage and intelligent control. &lt;/p&gt;&quot;,&quot;issue&quot;:&quot;2&quot;,&quot;volume&quot;:&quot;44&quot;,&quot;container-title-short&quot;:&quot;&quot;},&quot;isTemporary&quot;:false}]},{&quot;citationID&quot;:&quot;MENDELEY_CITATION_4aa9aa38-c6f8-4655-adad-651820be928f&quot;,&quot;properties&quot;:{&quot;noteIndex&quot;:0},&quot;isEdited&quot;:false,&quot;manualOverride&quot;:{&quot;isManuallyOverridden&quot;:false,&quot;citeprocText&quot;:&quot;[42]&quot;,&quot;manualOverrideText&quot;:&quot;&quot;},&quot;citationTag&quot;:&quot;MENDELEY_CITATION_v3_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&quot;,&quot;citationItems&quot;:[{&quot;id&quot;:&quot;724df896-ae80-37a5-bbb1-ea526b483901&quot;,&quot;itemData&quot;:{&quot;type&quot;:&quot;article-journal&quot;,&quot;id&quot;:&quot;724df896-ae80-37a5-bbb1-ea526b483901&quot;,&quot;title&quot;:&quot;Energy Demand Response in a Food-Processing Plant: A Deep Reinforcement Learning Approach&quot;,&quot;author&quot;:[{&quot;family&quot;:&quot;Wohlgenannt&quot;,&quot;given&quot;:&quot;Philipp&quot;,&quot;parse-names&quot;:false,&quot;dropping-particle&quot;:&quot;&quot;,&quot;non-dropping-particle&quot;:&quot;&quot;},{&quot;family&quot;:&quot;Hegenbart&quot;,&quot;given&quot;:&quot;Sebastian&quot;,&quot;parse-names&quot;:false,&quot;dropping-particle&quot;:&quot;&quot;,&quot;non-dropping-particle&quot;:&quot;&quot;},{&quot;family&quot;:&quot;Eder&quot;,&quot;given&quot;:&quot;Elias&quot;,&quot;parse-names&quot;:false,&quot;dropping-particle&quot;:&quot;&quot;,&quot;non-dropping-particle&quot;:&quot;&quot;},{&quot;family&quot;:&quot;Kolhe&quot;,&quot;given&quot;:&quot;Mohan&quot;,&quot;parse-names&quot;:false,&quot;dropping-particle&quot;:&quot;&quot;,&quot;non-dropping-particle&quot;:&quot;&quot;},{&quot;family&quot;:&quot;Kepplinger&quot;,&quot;given&quot;:&quot;Peter&quot;,&quot;parse-names&quot;:false,&quot;dropping-particle&quot;:&quot;&quot;,&quot;non-dropping-particle&quot;:&quot;&quot;}],&quot;container-title&quot;:&quot;Energies&quot;,&quot;container-title-short&quot;:&quot;Energies (Basel).&quot;,&quot;DOI&quot;:&quot;10.3390/en17246430&quot;,&quot;ISSN&quot;:&quot;1996-1073&quot;,&quot;issued&quot;:{&quot;date-parts&quot;:[[2024,12,20]]},&quot;page&quot;:&quot;6430&quot;,&quot;abstract&quot;:&quot;&lt;p&gt;The food industry faces significant challenges in managing operational costs due to its high energy intensity and rising energy prices. Industrial food-processing facilities, with substantial thermal capacities and large demands for cooling and heating, offer promising opportunities for demand response (DR) strategies. This study explores the application of deep reinforcement learning (RL) as an innovative, data-driven approach for DR in the food industry. By leveraging the adaptive, self-learning capabilities of RL, energy costs in the investigated plant are effectively decreased. The RL algorithm was compared with the well-established optimization method Mixed Integer Linear Programming (MILP), and both were benchmarked against a reference scenario without DR. The two optimization strategies demonstrate cost savings of 17.57% and 18.65% for RL and MILP, respectively. Although RL is slightly less efficient in cost reduction, it significantly outperforms in computational speed, being approximately 20 times faster. During operation, RL only needs 2ms per optimization compared to 19s for MILP, making it a promising optimization tool for edge computing. Moreover, while MILP’s computation time increases considerably with the number of binary variables, RL efficiently learns dynamic system behavior and scales to more complex systems without significant performance degradation. These results highlight that deep RL, when applied to DR, offers substantial cost savings and computational efficiency, with broad applicability to energy management in various applications.&lt;/p&gt;&quot;,&quot;issue&quot;:&quot;24&quot;,&quot;volume&quot;:&quot;17&quot;},&quot;isTemporary&quot;:false}]},{&quot;citationID&quot;:&quot;MENDELEY_CITATION_7cbe8449-6ae3-4327-a6e1-c91a210c1a1d&quot;,&quot;properties&quot;:{&quot;noteIndex&quot;:0},&quot;isEdited&quot;:false,&quot;manualOverride&quot;:{&quot;isManuallyOverridden&quot;:false,&quot;citeprocText&quot;:&quot;[43], [44]&quot;,&quot;manualOverrideText&quot;:&quot;&quot;},&quot;citationTag&quot;:&quot;MENDELEY_CITATION_v3_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&quot;,&quot;citationItems&quot;:[{&quot;id&quot;:&quot;80e0b832-1c6f-3864-9f71-9b273477a917&quot;,&quot;itemData&quot;:{&quot;type&quot;:&quot;article-journal&quot;,&quot;id&quot;:&quot;80e0b832-1c6f-3864-9f71-9b273477a917&quot;,&quot;title&quot;:&quot;Reinforcement Learning Techniques in Optimizing Energy Systems&quot;,&quot;author&quot;:[{&quot;family&quot;:&quot;Stavrev&quot;,&quot;given&quot;:&quot;Stefan&quot;,&quot;parse-names&quot;:false,&quot;dropping-particle&quot;:&quot;&quot;,&quot;non-dropping-particle&quot;:&quot;&quot;},{&quot;family&quot;:&quot;Ginchev&quot;,&quot;given&quot;:&quot;Dimitar&quot;,&quot;parse-names&quot;:false,&quot;dropping-particle&quot;:&quot;&quot;,&quot;non-dropping-particle&quot;:&quot;&quot;}],&quot;container-title&quot;:&quot;Electronics&quot;,&quot;DOI&quot;:&quot;10.3390/electronics13081459&quot;,&quot;ISSN&quot;:&quot;2079-9292&quot;,&quot;issued&quot;:{&quot;date-parts&quot;:[[2024,4,12]]},&quot;page&quot;:&quot;1459&quot;,&quot;abstract&quot;:&quot;&lt;p&gt;Reinforcement learning (RL) techniques have emerged as powerful tools for optimizing energy systems, offering the potential to enhance efficiency, reliability, and sustainability. This review paper provides a comprehensive examination of the applications of RL in the field of energy system optimization, spanning various domains such as energy management, grid control, and renewable energy integration. Beginning with an overview of RL fundamentals, the paper explores recent advancements in RL algorithms and their adaptation to address the unique challenges of energy system optimization. Case studies and real-world applications demonstrate the efficacy of RL-based approaches in improving energy efficiency, reducing costs, and mitigating environmental impacts. Furthermore, the paper discusses future directions and challenges, including scalability, interpretability, and integration with domain knowledge. By synthesizing the latest research findings and identifying key areas for further investigation, this paper aims to inform and inspire future research endeavors in the intersection of reinforcement learning and energy system optimization.&lt;/p&gt;&quot;,&quot;issue&quot;:&quot;8&quot;,&quot;volume&quot;:&quot;13&quot;,&quot;container-title-short&quot;:&quot;Electronics (Basel).&quot;},&quot;isTemporary&quot;:false},{&quot;id&quot;:&quot;71c1ace4-7085-3db1-9b31-493a7b2fcde3&quot;,&quot;itemData&quot;:{&quot;type&quot;:&quot;article-journal&quot;,&quot;id&quot;:&quot;71c1ace4-7085-3db1-9b31-493a7b2fcde3&quot;,&quot;title&quot;:&quot;Deep Reinforcement Learning Approaches the MILP Optimum of a Multi-Energy Optimization in Energy Communities&quot;,&quot;author&quot;:[{&quot;family&quot;:&quot;Vetter&quot;,&quot;given&quot;:&quot;Vinzent&quot;,&quot;parse-names&quot;:false,&quot;dropping-particle&quot;:&quot;&quot;,&quot;non-dropping-particle&quot;:&quot;&quot;},{&quot;family&quot;:&quot;Wohlgenannt&quot;,&quot;given&quot;:&quot;Philipp&quot;,&quot;parse-names&quot;:false,&quot;dropping-particle&quot;:&quot;&quot;,&quot;non-dropping-particle&quot;:&quot;&quot;},{&quot;family&quot;:&quot;Kepplinger&quot;,&quot;given&quot;:&quot;Peter&quot;,&quot;parse-names&quot;:false,&quot;dropping-particle&quot;:&quot;&quot;,&quot;non-dropping-particle&quot;:&quot;&quot;},{&quot;family&quot;:&quot;Eder&quot;,&quot;given&quot;:&quot;Elias&quot;,&quot;parse-names&quot;:false,&quot;dropping-particle&quot;:&quot;&quot;,&quot;non-dropping-particle&quot;:&quot;&quot;}],&quot;container-title&quot;:&quot;Energies&quot;,&quot;DOI&quot;:&quot;10.3390/en18174489&quot;,&quot;ISSN&quot;:&quot;1996-1073&quot;,&quot;issued&quot;:{&quot;date-parts&quot;:[[2025,8,23]]},&quot;page&quot;:&quot;4489&quot;,&quot;abstract&quot;:&quot;&lt;p&gt;As energy systems transition toward high shares of variable renewable generation, local energy communities (ECs) are increasingly relevant for enabling demand-side flexibility and self-sufficiency. This shift is particularly evident in the residential sector, where the deployment of photovoltaic (PV) systems is rapidly growing. While mixed-integer linear programming (MILP) remains the standard for operational optimization and demand response in such systems, its computational burden limits scalability and responsiveness under real-time or uncertain conditions. Reinforcement learning (RL), by contrast, offers a model-free, adaptive alternative. However, its application to real-world energy system operation remains limited. This study explores the application of a Deep Q-Network (DQN) to a real residential EC, which has received limited attention in prior work. The system comprises three single-family homes sharing a centralized heating system with a thermal energy storage (TES), a PV installation, and a grid connection. We compare the performance of MILP and RL controllers across economic and environmental metrics. Relative to a reference scenario without TES, MILP and RL reduce energy costs by 10.06% and 8.78%, respectively, and both approaches yield lower total energy consumption and CO2-equivalent emissions. Notably, the trained RL agent achieves a near-optimal outcome while requiring only 22% of the MILP’s computation time. These results demonstrate that DQNs can offer a computationally efficient and practically viable alternative to MILP for real-time control in residential energy systems.&lt;/p&gt;&quot;,&quot;issue&quot;:&quot;17&quot;,&quot;volume&quot;:&quot;18&quot;,&quot;container-title-short&quot;:&quot;Energies (Basel).&quot;},&quot;isTemporary&quot;:false}]},{&quot;citationID&quot;:&quot;MENDELEY_CITATION_fb974e0b-7e67-4c93-a30f-ed459a189960&quot;,&quot;properties&quot;:{&quot;noteIndex&quot;:0},&quot;isEdited&quot;:false,&quot;manualOverride&quot;:{&quot;isManuallyOverridden&quot;:false,&quot;citeprocText&quot;:&quot;[45]&quot;,&quot;manualOverrideText&quot;:&quot;&quot;},&quot;citationTag&quot;:&quot;MENDELEY_CITATION_v3_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&quot;,&quot;citationItems&quot;:[{&quot;id&quot;:&quot;8dce386b-1be0-3f7f-90b3-85aff7b0a20e&quot;,&quot;itemData&quot;:{&quot;type&quot;:&quot;article-journal&quot;,&quot;id&quot;:&quot;8dce386b-1be0-3f7f-90b3-85aff7b0a20e&quot;,&quot;title&quot;:&quot;Optimal energy system scheduling using a constraint-aware reinforcement learning algorithm&quot;,&quot;author&quot;:[{&quot;family&quot;:&quot;Shengren&quot;,&quot;given&quot;:&quot;Hou&quot;,&quot;parse-names&quot;:false,&quot;dropping-particle&quot;:&quot;&quot;,&quot;non-dropping-particle&quot;:&quot;&quot;},{&quot;family&quot;:&quot;Vergara&quot;,&quot;given&quot;:&quot;Pedro P.&quot;,&quot;parse-names&quot;:false,&quot;dropping-particle&quot;:&quot;&quot;,&quot;non-dropping-particle&quot;:&quot;&quot;},{&quot;family&quot;:&quot;Salazar Duque&quot;,&quot;given&quot;:&quot;Edgar Mauricio&quot;,&quot;parse-names&quot;:false,&quot;dropping-particle&quot;:&quot;&quot;,&quot;non-dropping-particle&quot;:&quot;&quot;},{&quot;family&quot;:&quot;Palensky&quot;,&quot;given&quot;:&quot;Peter&quot;,&quot;parse-names&quot;:false,&quot;dropping-particle&quot;:&quot;&quot;,&quot;non-dropping-particle&quot;:&quot;&quot;}],&quot;container-title&quot;:&quot;International Journal of Electrical Power &amp; Energy Systems&quot;,&quot;DOI&quot;:&quot;10.1016/j.ijepes.2023.109230&quot;,&quot;ISSN&quot;:&quot;01420615&quot;,&quot;issued&quot;:{&quot;date-parts&quot;:[[2023,10]]},&quot;page&quot;:&quot;109230&quot;,&quot;volume&quot;:&quot;152&quot;,&quot;container-title-short&quot;:&quot;&quot;},&quot;isTemporary&quot;:false}]},{&quot;citationID&quot;:&quot;MENDELEY_CITATION_1cdcd498-a953-4c56-9fed-7dd79ae2f0e4&quot;,&quot;properties&quot;:{&quot;noteIndex&quot;:0},&quot;isEdited&quot;:false,&quot;manualOverride&quot;:{&quot;isManuallyOverridden&quot;:false,&quot;citeprocText&quot;:&quot;[46]&quot;,&quot;manualOverrideText&quot;:&quot;&quot;},&quot;citationTag&quot;:&quot;MENDELEY_CITATION_v3_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&quot;,&quot;citationItems&quot;:[{&quot;id&quot;:&quot;06c2b8d2-b2dc-3af5-b126-6311b944aca0&quot;,&quot;itemData&quot;:{&quot;type&quot;:&quot;article&quot;,&quot;id&quot;:&quot;06c2b8d2-b2dc-3af5-b126-6311b944aca0&quot;,&quot;title&quot;:&quot;Reinforcement Learning Techniques in Optimizing Energy Systems&quot;,&quot;author&quot;:[{&quot;family&quot;:&quot;Stavrev&quot;,&quot;given&quot;:&quot;Stefan&quot;,&quot;parse-names&quot;:false,&quot;dropping-particle&quot;:&quot;&quot;,&quot;non-dropping-particle&quot;:&quot;&quot;},{&quot;family&quot;:&quot;Ginchev&quot;,&quot;given&quot;:&quot;Dimitar&quot;,&quot;parse-names&quot;:false,&quot;dropping-particle&quot;:&quot;&quot;,&quot;non-dropping-particle&quot;:&quot;&quot;}],&quot;container-title&quot;:&quot;Electronics (Switzerland)&quot;,&quot;DOI&quot;:&quot;10.3390/electronics13081459&quot;,&quot;ISSN&quot;:&quot;20799292&quot;,&quot;issued&quot;:{&quot;date-parts&quot;:[[2024,4,1]]},&quot;abstract&quot;:&quot;Reinforcement learning (RL) techniques have emerged as powerful tools for optimizing energy systems, offering the potential to enhance efficiency, reliability, and sustainability. This review paper provides a comprehensive examination of the applications of RL in the field of energy system optimization, spanning various domains such as energy management, grid control, and renewable energy integration. Beginning with an overview of RL fundamentals, the paper explores recent advancements in RL algorithms and their adaptation to address the unique challenges of energy system optimization. Case studies and real-world applications demonstrate the efficacy of RL-based approaches in improving energy efficiency, reducing costs, and mitigating environmental impacts. Furthermore, the paper discusses future directions and challenges, including scalability, interpretability, and integration with domain knowledge. By synthesizing the latest research findings and identifying key areas for further investigation, this paper aims to inform and inspire future research endeavors in the intersection of reinforcement learning and energy system optimization.&quot;,&quot;publisher&quot;:&quot;Multidisciplinary Digital Publishing Institute (MDPI)&quot;,&quot;issue&quot;:&quot;8&quot;,&quot;volume&quot;:&quot;13&quot;,&quot;container-title-short&quot;:&quot;&quot;},&quot;isTemporary&quot;:false}]},{&quot;citationID&quot;:&quot;MENDELEY_CITATION_8f9fc719-49df-456a-8934-5bb7891faa53&quot;,&quot;properties&quot;:{&quot;noteIndex&quot;:0},&quot;isEdited&quot;:false,&quot;manualOverride&quot;:{&quot;isManuallyOverridden&quot;:false,&quot;citeprocText&quot;:&quot;[47]&quot;,&quot;manualOverrideText&quot;:&quot;&quot;},&quot;citationTag&quot;:&quot;MENDELEY_CITATION_v3_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&quot;,&quot;citationItems&quot;:[{&quot;id&quot;:&quot;b748b453-1bc9-3b06-a2bc-accd4d93d9d9&quot;,&quot;itemData&quot;:{&quot;type&quot;:&quot;article-journal&quot;,&quot;id&quot;:&quot;b748b453-1bc9-3b06-a2bc-accd4d93d9d9&quot;,&quot;title&quot;:&quot;Applications of reinforcement learning in energy systems&quot;,&quot;author&quot;:[{&quot;family&quot;:&quot;Perera&quot;,&quot;given&quot;:&quot;A.T.D.&quot;,&quot;parse-names&quot;:false,&quot;dropping-particle&quot;:&quot;&quot;,&quot;non-dropping-particle&quot;:&quot;&quot;},{&quot;family&quot;:&quot;Kamalaruban&quot;,&quot;given&quot;:&quot;Parameswaran&quot;,&quot;parse-names&quot;:false,&quot;dropping-particle&quot;:&quot;&quot;,&quot;non-dropping-particle&quot;:&quot;&quot;}],&quot;container-title&quot;:&quot;Renewable and Sustainable Energy Reviews&quot;,&quot;DOI&quot;:&quot;10.1016/j.rser.2020.110618&quot;,&quot;ISSN&quot;:&quot;13640321&quot;,&quot;issued&quot;:{&quot;date-parts&quot;:[[2021,3]]},&quot;page&quot;:&quot;110618&quot;,&quot;volume&quot;:&quot;137&quot;,&quot;container-title-short&quot;:&quot;&quot;},&quot;isTemporary&quot;:false}]},{&quot;citationID&quot;:&quot;MENDELEY_CITATION_92567a48-90b0-46c9-bfb8-195d222dd6c2&quot;,&quot;properties&quot;:{&quot;noteIndex&quot;:0},&quot;isEdited&quot;:false,&quot;manualOverride&quot;:{&quot;isManuallyOverridden&quot;:false,&quot;citeprocText&quot;:&quot;[48]&quot;,&quot;manualOverrideText&quot;:&quot;&quot;},&quot;citationTag&quot;:&quot;MENDELEY_CITATION_v3_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&quot;,&quot;citationItems&quot;:[{&quot;id&quot;:&quot;408e45c0-460c-38aa-8310-19b6e3612eca&quot;,&quot;itemData&quot;:{&quot;type&quot;:&quot;article-journal&quot;,&quot;id&quot;:&quot;408e45c0-460c-38aa-8310-19b6e3612eca&quot;,&quot;title&quot;:&quot;Reinforcement Learning Techniques in Optimizing Energy Systems&quot;,&quot;author&quot;:[{&quot;family&quot;:&quot;Stavrev&quot;,&quot;given&quot;:&quot;Stefan&quot;,&quot;parse-names&quot;:false,&quot;dropping-particle&quot;:&quot;&quot;,&quot;non-dropping-particle&quot;:&quot;&quot;},{&quot;family&quot;:&quot;Ginchev&quot;,&quot;given&quot;:&quot;Dimitar&quot;,&quot;parse-names&quot;:false,&quot;dropping-particle&quot;:&quot;&quot;,&quot;non-dropping-particle&quot;:&quot;&quot;}],&quot;container-title&quot;:&quot;Electronics&quot;,&quot;container-title-short&quot;:&quot;Electronics (Basel).&quot;,&quot;DOI&quot;:&quot;10.3390/electronics13081459&quot;,&quot;ISSN&quot;:&quot;2079-9292&quot;,&quot;issued&quot;:{&quot;date-parts&quot;:[[2024,4,12]]},&quot;page&quot;:&quot;1459&quot;,&quot;abstract&quot;:&quot;&lt;p&gt;Reinforcement learning (RL) techniques have emerged as powerful tools for optimizing energy systems, offering the potential to enhance efficiency, reliability, and sustainability. This review paper provides a comprehensive examination of the applications of RL in the field of energy system optimization, spanning various domains such as energy management, grid control, and renewable energy integration. Beginning with an overview of RL fundamentals, the paper explores recent advancements in RL algorithms and their adaptation to address the unique challenges of energy system optimization. Case studies and real-world applications demonstrate the efficacy of RL-based approaches in improving energy efficiency, reducing costs, and mitigating environmental impacts. Furthermore, the paper discusses future directions and challenges, including scalability, interpretability, and integration with domain knowledge. By synthesizing the latest research findings and identifying key areas for further investigation, this paper aims to inform and inspire future research endeavors in the intersection of reinforcement learning and energy system optimization.&lt;/p&gt;&quot;,&quot;issue&quot;:&quot;8&quot;,&quot;volume&quot;:&quot;13&quot;},&quot;isTemporary&quot;:false}]},{&quot;citationID&quot;:&quot;MENDELEY_CITATION_2d90f837-c9a3-4da7-9b2d-0b187fae7ad5&quot;,&quot;properties&quot;:{&quot;noteIndex&quot;:0},&quot;isEdited&quot;:false,&quot;manualOverride&quot;:{&quot;isManuallyOverridden&quot;:false,&quot;citeprocText&quot;:&quot;[49]&quot;,&quot;manualOverrideText&quot;:&quot;&quot;},&quot;citationTag&quot;:&quot;MENDELEY_CITATION_v3_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&quot;,&quot;citationItems&quot;:[{&quot;id&quot;:&quot;94630c80-577c-3ded-896b-4aaf82147c8b&quot;,&quot;itemData&quot;:{&quot;type&quot;:&quot;chapter&quot;,&quot;id&quot;:&quot;94630c80-577c-3ded-896b-4aaf82147c8b&quot;,&quot;title&quot;:&quot;Efficient Exploration in Reinforcement Learning&quot;,&quot;author&quot;:[{&quot;family&quot;:&quot;Langford&quot;,&quot;given&quot;:&quot;John&quot;,&quot;parse-names&quot;:false,&quot;dropping-particle&quot;:&quot;&quot;,&quot;non-dropping-particle&quot;:&quot;&quot;}],&quot;container-title&quot;:&quot;Encyclopedia of Machine Learning&quot;,&quot;DOI&quot;:&quot;10.1007/978-0-387-30164-8_244&quot;,&quot;issued&quot;:{&quot;date-parts&quot;:[[2011]]},&quot;publisher-place&quot;:&quot;Boston, MA&quot;,&quot;page&quot;:&quot;309-311&quot;,&quot;publisher&quot;:&quot;Springer US&quot;,&quot;container-title-short&quot;:&quot;&quot;},&quot;isTemporary&quot;:false}]},{&quot;citationID&quot;:&quot;MENDELEY_CITATION_409cf5ec-19c5-4b5e-b434-08af62e0486e&quot;,&quot;properties&quot;:{&quot;noteIndex&quot;:0},&quot;isEdited&quot;:false,&quot;manualOverride&quot;:{&quot;isManuallyOverridden&quot;:false,&quot;citeprocText&quot;:&quot;[50]&quot;,&quot;manualOverrideText&quot;:&quot;&quot;},&quot;citationTag&quot;:&quot;MENDELEY_CITATION_v3_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&quot;,&quot;citationItems&quot;:[{&quot;id&quot;:&quot;b87850aa-a581-31c2-a694-b706eafaefa3&quot;,&quot;itemData&quot;:{&quot;type&quot;:&quot;article-journal&quot;,&quot;id&quot;:&quot;b87850aa-a581-31c2-a694-b706eafaefa3&quot;,&quot;title&quot;:&quot;ROBOT LEARNING&quot;,&quot;author&quot;:[{&quot;family&quot;:&quot;Sutton&quot;,&quot;given&quot;:&quot;Richard&quot;,&quot;parse-names&quot;:false,&quot;dropping-particle&quot;:&quot;&quot;,&quot;non-dropping-particle&quot;:&quot;&quot;},{&quot;family&quot;:&quot;Barto&quot;,&quot;given&quot;:&quot;Andrew&quot;,&quot;parse-names&quot;:false,&quot;dropping-particle&quot;:&quot;&quot;,&quot;non-dropping-particle&quot;:&quot;&quot;}],&quot;container-title&quot;:&quot;Robotica&quot;,&quot;container-title-short&quot;:&quot;Robotica&quot;,&quot;DOI&quot;:&quot;10.1017/S0263574799271172&quot;,&quot;ISSN&quot;:&quot;0263-5747&quot;,&quot;issued&quot;:{&quot;date-parts&quot;:[[1999,3,1]]},&quot;page&quot;:&quot;229-235&quot;,&quot;issue&quot;:&quot;2&quot;,&quot;volume&quot;:&quot;17&quot;},&quot;isTemporary&quot;:false}]},{&quot;citationID&quot;:&quot;MENDELEY_CITATION_275dbc2a-bca7-47b7-904d-467adf502462&quot;,&quot;properties&quot;:{&quot;noteIndex&quot;:0},&quot;isEdited&quot;:false,&quot;manualOverride&quot;:{&quot;isManuallyOverridden&quot;:false,&quot;citeprocText&quot;:&quot;[51]&quot;,&quot;manualOverrideText&quot;:&quot;&quot;},&quot;citationTag&quot;:&quot;MENDELEY_CITATION_v3_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&quot;,&quot;citationItems&quot;:[{&quot;id&quot;:&quot;8a2da654-28fe-395b-8105-172abb9e04b0&quot;,&quot;itemData&quot;:{&quot;type&quot;:&quot;paper-conference&quot;,&quot;id&quot;:&quot;8a2da654-28fe-395b-8105-172abb9e04b0&quot;,&quot;title&quot;:&quot;Overview of Reinforcement Learning Based on Value and Policy&quot;,&quot;author&quot;:[{&quot;family&quot;:&quot;Liu&quot;,&quot;given&quot;:&quot;Yun-ting&quot;,&quot;parse-names&quot;:false,&quot;dropping-particle&quot;:&quot;&quot;,&quot;non-dropping-particle&quot;:&quot;&quot;},{&quot;family&quot;:&quot;Yang&quot;,&quot;given&quot;:&quot;Jia-ming&quot;,&quot;parse-names&quot;:false,&quot;dropping-particle&quot;:&quot;&quot;,&quot;non-dropping-particle&quot;:&quot;&quot;},{&quot;family&quot;:&quot;Chen&quot;,&quot;given&quot;:&quot;Liang&quot;,&quot;parse-names&quot;:false,&quot;dropping-particle&quot;:&quot;&quot;,&quot;non-dropping-particle&quot;:&quot;&quot;},{&quot;family&quot;:&quot;Guo&quot;,&quot;given&quot;:&quot;Ting&quot;,&quot;parse-names&quot;:false,&quot;dropping-particle&quot;:&quot;&quot;,&quot;non-dropping-particle&quot;:&quot;&quot;},{&quot;family&quot;:&quot;Jiang&quot;,&quot;given&quot;:&quot;Yu&quot;,&quot;parse-names&quot;:false,&quot;dropping-particle&quot;:&quot;&quot;,&quot;non-dropping-particle&quot;:&quot;&quot;}],&quot;container-title&quot;:&quot;2020 Chinese Control And Decision Conference (CCDC)&quot;,&quot;DOI&quot;:&quot;10.1109/CCDC49329.2020.9164615&quot;,&quot;ISBN&quot;:&quot;978-1-7281-5855-6&quot;,&quot;issued&quot;:{&quot;date-parts&quot;:[[2020,8]]},&quot;page&quot;:&quot;598-603&quot;,&quot;publisher&quot;:&quot;IEEE&quot;,&quot;container-title-short&quot;:&quot;&quot;},&quot;isTemporary&quot;:false}]},{&quot;citationID&quot;:&quot;MENDELEY_CITATION_ef102693-b21e-49bd-8961-a5f9603586b2&quot;,&quot;properties&quot;:{&quot;noteIndex&quot;:0},&quot;isEdited&quot;:false,&quot;manualOverride&quot;:{&quot;isManuallyOverridden&quot;:false,&quot;citeprocText&quot;:&quot;[52]&quot;,&quot;manualOverrideText&quot;:&quot;&quot;},&quot;citationTag&quot;:&quot;MENDELEY_CITATION_v3_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&quot;,&quot;citationItems&quot;:[{&quot;id&quot;:&quot;ffddf98e-e370-3452-8a14-62d7c8029a56&quot;,&quot;itemData&quot;:{&quot;type&quot;:&quot;article-journal&quot;,&quot;id&quot;:&quot;ffddf98e-e370-3452-8a14-62d7c8029a56&quot;,&quot;title&quot;:&quot;Comparing Policy Gradient and Value Function Based Reinforcement Learning Methods in Simulated Electrical Power Trade&quot;,&quot;author&quot;:[{&quot;family&quot;:&quot;Lincoln&quot;,&quot;given&quot;:&quot;Richard&quot;,&quot;parse-names&quot;:false,&quot;dropping-particle&quot;:&quot;&quot;,&quot;non-dropping-particle&quot;:&quot;&quot;},{&quot;family&quot;:&quot;Galloway&quot;,&quot;given&quot;:&quot;Stuart&quot;,&quot;parse-names&quot;:false,&quot;dropping-particle&quot;:&quot;&quot;,&quot;non-dropping-particle&quot;:&quot;&quot;},{&quot;family&quot;:&quot;Stephen&quot;,&quot;given&quot;:&quot;Bruce&quot;,&quot;parse-names&quot;:false,&quot;dropping-particle&quot;:&quot;&quot;,&quot;non-dropping-particle&quot;:&quot;&quot;},{&quot;family&quot;:&quot;Burt&quot;,&quot;given&quot;:&quot;Graeme&quot;,&quot;parse-names&quot;:false,&quot;dropping-particle&quot;:&quot;&quot;,&quot;non-dropping-particle&quot;:&quot;&quot;}],&quot;container-title&quot;:&quot;IEEE Transactions on Power Systems&quot;,&quot;DOI&quot;:&quot;10.1109/TPWRS.2011.2166091&quot;,&quot;ISSN&quot;:&quot;0885-8950&quot;,&quot;issued&quot;:{&quot;date-parts&quot;:[[2012,2]]},&quot;page&quot;:&quot;373-380&quot;,&quot;issue&quot;:&quot;1&quot;,&quot;volume&quot;:&quot;27&quot;,&quot;container-title-short&quot;:&quot;&quot;},&quot;isTemporary&quot;:false}]},{&quot;citationID&quot;:&quot;MENDELEY_CITATION_2803f5df-7f60-4bed-8861-5d6e31d32156&quot;,&quot;properties&quot;:{&quot;noteIndex&quot;:0},&quot;isEdited&quot;:false,&quot;manualOverride&quot;:{&quot;isManuallyOverridden&quot;:false,&quot;citeprocText&quot;:&quot;[53]&quot;,&quot;manualOverrideText&quot;:&quot;&quot;},&quot;citationTag&quot;:&quot;MENDELEY_CITATION_v3_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&quot;,&quot;citationItems&quot;:[{&quot;id&quot;:&quot;e54e5b56-d131-3a66-9ffb-14ae92ea0215&quot;,&quot;itemData&quot;:{&quot;type&quot;:&quot;article-journal&quot;,&quot;id&quot;:&quot;e54e5b56-d131-3a66-9ffb-14ae92ea0215&quot;,&quot;title&quot;:&quot;Policy Gradient Methods in Deep Reinforcement Learning&quot;,&quot;author&quot;:[{&quot;family&quot;:&quot;Gao&quot;,&quot;given&quot;:&quot;Yuhan&quot;,&quot;parse-names&quot;:false,&quot;dropping-particle&quot;:&quot;&quot;,&quot;non-dropping-particle&quot;:&quot;&quot;}],&quot;container-title&quot;:&quot;Applied and Computational Engineering&quot;,&quot;DOI&quot;:&quot;10.54254/2755-2721/2025.TJ23321&quot;,&quot;ISSN&quot;:&quot;2755-2721&quot;,&quot;issued&quot;:{&quot;date-parts&quot;:[[2025,5,22]]},&quot;page&quot;:&quot;27-34&quot;,&quot;abstract&quot;:&quot;&lt;p&gt;Policy gradient (PG) methods are a fundamental component of deep reinforcement learning (DRL), particularly effective in continuous and high-dimensional control tasks. This paper presents a structured review of PG algorithms, tracing their development from basic Monte Carlo methods like REINFORCE to advanced techniques such as asynchronous advantage actor-critic (A3C), trust region policy optimization (TRPO), proximal policy optimization (PPO), deep deterministic policy gradient (DDPG), and soft actor-critic (SAC). These methods differ in terms of policy structure, optimization stability, and sample efficiency, addressing core challenges in policy learning through gradient-based updates. In addition, this review explores the application of PG methods in real-world domains, including autonomous driving, financial portfolio management, and smart grid energy systems. These applications demonstrate PG methods’ capacity to operate under uncertainty and adapt to complex dynamic environments. However, limitations such as high variance, low sample efficiency, and instability in multi-agent and offline settings remain significant obstacles. The review concludes by outlining emerging research directions, including entropy-based exploration, model-based policy optimization, meta-learning, and Transformer-based sequence modeling. This work aims to offer theoretical insights and practical guidance to support the continued advancement and application of policy gradient methods in reinforcement learning.&lt;/p&gt;&quot;,&quot;issue&quot;:&quot;1&quot;,&quot;volume&quot;:&quot;158&quot;,&quot;container-title-short&quot;:&quot;&quot;},&quot;isTemporary&quot;:false}]},{&quot;citationID&quot;:&quot;MENDELEY_CITATION_6b0aa260-f728-4cb7-8d42-c258b6a59a24&quot;,&quot;properties&quot;:{&quot;noteIndex&quot;:0},&quot;isEdited&quot;:false,&quot;manualOverride&quot;:{&quot;isManuallyOverridden&quot;:false,&quot;citeprocText&quot;:&quot;[54]&quot;,&quot;manualOverrideText&quot;:&quot;&quot;},&quot;citationTag&quot;:&quot;MENDELEY_CITATION_v3_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&quot;,&quot;citationItems&quot;:[{&quot;id&quot;:&quot;695f87ef-b1a7-3d24-bf63-54c6c4a9499c&quot;,&quot;itemData&quot;:{&quot;type&quot;:&quot;article-journal&quot;,&quot;id&quot;:&quot;695f87ef-b1a7-3d24-bf63-54c6c4a9499c&quot;,&quot;title&quot;:&quot;Reinforcement Learning and Its Applications in Modern Power and Energy Systems: A Review&quot;,&quot;author&quot;:[{&quot;family&quot;:&quot;Cao&quot;,&quot;given&quot;:&quot;Di&quot;,&quot;parse-names&quot;:false,&quot;dropping-particle&quot;:&quot;&quot;,&quot;non-dropping-particle&quot;:&quot;&quot;},{&quot;family&quot;:&quot;Hu&quot;,&quot;given&quot;:&quot;Weihao&quot;,&quot;parse-names&quot;:false,&quot;dropping-particle&quot;:&quot;&quot;,&quot;non-dropping-particle&quot;:&quot;&quot;},{&quot;family&quot;:&quot;Zhao&quot;,&quot;given&quot;:&quot;Junbo&quot;,&quot;parse-names&quot;:false,&quot;dropping-particle&quot;:&quot;&quot;,&quot;non-dropping-particle&quot;:&quot;&quot;},{&quot;family&quot;:&quot;Zhang&quot;,&quot;given&quot;:&quot;Guozhou&quot;,&quot;parse-names&quot;:false,&quot;dropping-particle&quot;:&quot;&quot;,&quot;non-dropping-particle&quot;:&quot;&quot;},{&quot;family&quot;:&quot;Zhang&quot;,&quot;given&quot;:&quot;Bin&quot;,&quot;parse-names&quot;:false,&quot;dropping-particle&quot;:&quot;&quot;,&quot;non-dropping-particle&quot;:&quot;&quot;},{&quot;family&quot;:&quot;Liu&quot;,&quot;given&quot;:&quot;Zhou&quot;,&quot;parse-names&quot;:false,&quot;dropping-particle&quot;:&quot;&quot;,&quot;non-dropping-particle&quot;:&quot;&quot;},{&quot;family&quot;:&quot;Chen&quot;,&quot;given&quot;:&quot;Zhe&quot;,&quot;parse-names&quot;:false,&quot;dropping-particle&quot;:&quot;&quot;,&quot;non-dropping-particle&quot;:&quot;&quot;},{&quot;family&quot;:&quot;Blaabjerg&quot;,&quot;given&quot;:&quot;Frede&quot;,&quot;parse-names&quot;:false,&quot;dropping-particle&quot;:&quot;&quot;,&quot;non-dropping-particle&quot;:&quot;&quot;}],&quot;container-title&quot;:&quot;Journal of Modern Power Systems and Clean Energy&quot;,&quot;DOI&quot;:&quot;10.35833/MPCE.2020.000552&quot;,&quot;ISSN&quot;:&quot;2196-5625&quot;,&quot;issued&quot;:{&quot;date-parts&quot;:[[2020]]},&quot;page&quot;:&quot;1029-1042&quot;,&quot;issue&quot;:&quot;6&quot;,&quot;volume&quot;:&quot;8&quot;,&quot;container-title-short&quot;:&quot;&quot;},&quot;isTemporary&quot;:false}]},{&quot;citationID&quot;:&quot;MENDELEY_CITATION_77016d76-bbff-470c-acaf-6a996a49373b&quot;,&quot;properties&quot;:{&quot;noteIndex&quot;:0},&quot;isEdited&quot;:false,&quot;manualOverride&quot;:{&quot;isManuallyOverridden&quot;:false,&quot;citeprocText&quot;:&quot;[55]&quot;,&quot;manualOverrideText&quot;:&quot;&quot;},&quot;citationTag&quot;:&quot;MENDELEY_CITATION_v3_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&quot;,&quot;citationItems&quot;:[{&quot;id&quot;:&quot;e45cab0b-e52f-3cff-b734-fbaac9d65a24&quot;,&quot;itemData&quot;:{&quot;type&quot;:&quot;paper-conference&quot;,&quot;id&quot;:&quot;e45cab0b-e52f-3cff-b734-fbaac9d65a24&quot;,&quot;title&quot;:&quot;Performance Comparison of Deep RL Algorithms for Energy Systems Optimal Scheduling&quot;,&quot;author&quot;:[{&quot;family&quot;:&quot;Shengren&quot;,&quot;given&quot;:&quot;Hou&quot;,&quot;parse-names&quot;:false,&quot;dropping-particle&quot;:&quot;&quot;,&quot;non-dropping-particle&quot;:&quot;&quot;},{&quot;family&quot;:&quot;Salazar&quot;,&quot;given&quot;:&quot;Edgar Mauricio&quot;,&quot;parse-names&quot;:false,&quot;dropping-particle&quot;:&quot;&quot;,&quot;non-dropping-particle&quot;:&quot;&quot;},{&quot;family&quot;:&quot;Vergara&quot;,&quot;given&quot;:&quot;Pedro P.&quot;,&quot;parse-names&quot;:false,&quot;dropping-particle&quot;:&quot;&quot;,&quot;non-dropping-particle&quot;:&quot;&quot;},{&quot;family&quot;:&quot;Palensky&quot;,&quot;given&quot;:&quot;Peter&quot;,&quot;parse-names&quot;:false,&quot;dropping-particle&quot;:&quot;&quot;,&quot;non-dropping-particle&quot;:&quot;&quot;}],&quot;container-title&quot;:&quot;2022 IEEE PES Innovative Smart Grid Technologies Conference Europe (ISGT-Europe)&quot;,&quot;DOI&quot;:&quot;10.1109/ISGT-Europe54678.2022.9960642&quot;,&quot;ISBN&quot;:&quot;978-1-6654-8032-1&quot;,&quot;issued&quot;:{&quot;date-parts&quot;:[[2022,10,10]]},&quot;page&quot;:&quot;1-6&quot;,&quot;publisher&quot;:&quot;IEEE&quot;,&quot;container-title-short&quot;:&quot;&quot;},&quot;isTemporary&quot;:false}]},{&quot;citationID&quot;:&quot;MENDELEY_CITATION_fb2fc071-3f5b-4fb6-b316-f06ec1993bea&quot;,&quot;properties&quot;:{&quot;noteIndex&quot;:0},&quot;isEdited&quot;:false,&quot;manualOverride&quot;:{&quot;isManuallyOverridden&quot;:false,&quot;citeprocText&quot;:&quot;[47], [56]&quot;,&quot;manualOverrideText&quot;:&quot;&quot;},&quot;citationTag&quot;:&quot;MENDELEY_CITATION_v3_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&quot;,&quot;citationItems&quot;:[{&quot;id&quot;:&quot;287b606c-b40e-3f97-b41d-bcd33d0ee05c&quot;,&quot;itemData&quot;:{&quot;type&quot;:&quot;article-journal&quot;,&quot;id&quot;:&quot;287b606c-b40e-3f97-b41d-bcd33d0ee05c&quot;,&quot;title&quot;:&quot;Reward Shaping-Based Actor–Critic Deep Reinforcement Learning for Residential Energy Management&quot;,&quot;author&quot;:[{&quot;family&quot;:&quot;Lu&quot;,&quot;given&quot;:&quot;Renzhi&quot;,&quot;parse-names&quot;:false,&quot;dropping-particle&quot;:&quot;&quot;,&quot;non-dropping-particle&quot;:&quot;&quot;},{&quot;family&quot;:&quot;Jiang&quot;,&quot;given&quot;:&quot;Zhenyu&quot;,&quot;parse-names&quot;:false,&quot;dropping-particle&quot;:&quot;&quot;,&quot;non-dropping-particle&quot;:&quot;&quot;},{&quot;family&quot;:&quot;Wu&quot;,&quot;given&quot;:&quot;Huaming&quot;,&quot;parse-names&quot;:false,&quot;dropping-particle&quot;:&quot;&quot;,&quot;non-dropping-particle&quot;:&quot;&quot;},{&quot;family&quot;:&quot;Ding&quot;,&quot;given&quot;:&quot;Yuemin&quot;,&quot;parse-names&quot;:false,&quot;dropping-particle&quot;:&quot;&quot;,&quot;non-dropping-particle&quot;:&quot;&quot;},{&quot;family&quot;:&quot;Wang&quot;,&quot;given&quot;:&quot;Dong&quot;,&quot;parse-names&quot;:false,&quot;dropping-particle&quot;:&quot;&quot;,&quot;non-dropping-particle&quot;:&quot;&quot;},{&quot;family&quot;:&quot;Zhang&quot;,&quot;given&quot;:&quot;Hai-Tao&quot;,&quot;parse-names&quot;:false,&quot;dropping-particle&quot;:&quot;&quot;,&quot;non-dropping-particle&quot;:&quot;&quot;}],&quot;container-title&quot;:&quot;IEEE Transactions on Industrial Informatics&quot;,&quot;container-title-short&quot;:&quot;IEEE Trans. Industr. Inform.&quot;,&quot;DOI&quot;:&quot;10.1109/TII.2022.3183802&quot;,&quot;ISSN&quot;:&quot;1551-3203&quot;,&quot;issued&quot;:{&quot;date-parts&quot;:[[2023,3]]},&quot;page&quot;:&quot;2662-2673&quot;,&quot;issue&quot;:&quot;3&quot;,&quot;volume&quot;:&quot;19&quot;},&quot;isTemporary&quot;:false},{&quot;id&quot;:&quot;b748b453-1bc9-3b06-a2bc-accd4d93d9d9&quot;,&quot;itemData&quot;:{&quot;type&quot;:&quot;article-journal&quot;,&quot;id&quot;:&quot;b748b453-1bc9-3b06-a2bc-accd4d93d9d9&quot;,&quot;title&quot;:&quot;Applications of reinforcement learning in energy systems&quot;,&quot;author&quot;:[{&quot;family&quot;:&quot;Perera&quot;,&quot;given&quot;:&quot;A.T.D.&quot;,&quot;parse-names&quot;:false,&quot;dropping-particle&quot;:&quot;&quot;,&quot;non-dropping-particle&quot;:&quot;&quot;},{&quot;family&quot;:&quot;Kamalaruban&quot;,&quot;given&quot;:&quot;Parameswaran&quot;,&quot;parse-names&quot;:false,&quot;dropping-particle&quot;:&quot;&quot;,&quot;non-dropping-particle&quot;:&quot;&quot;}],&quot;container-title&quot;:&quot;Renewable and Sustainable Energy Reviews&quot;,&quot;DOI&quot;:&quot;10.1016/j.rser.2020.110618&quot;,&quot;ISSN&quot;:&quot;13640321&quot;,&quot;issued&quot;:{&quot;date-parts&quot;:[[2021,3]]},&quot;page&quot;:&quot;110618&quot;,&quot;volume&quot;:&quot;137&quot;,&quot;container-title-short&quot;:&quot;&quot;},&quot;isTemporary&quot;:false}]},{&quot;citationID&quot;:&quot;MENDELEY_CITATION_0a510372-57a7-426b-836c-f53f7d26b1fe&quot;,&quot;properties&quot;:{&quot;noteIndex&quot;:0},&quot;isEdited&quot;:false,&quot;manualOverride&quot;:{&quot;isManuallyOverridden&quot;:false,&quot;citeprocText&quot;:&quot;[26]&quot;,&quot;manualOverrideText&quot;:&quot;&quot;},&quot;citationTag&quot;:&quot;MENDELEY_CITATION_v3_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&quot;,&quot;citationItems&quot;:[{&quot;id&quot;:&quot;31848458-a34e-370b-af77-81d1d893a1c5&quot;,&quot;itemData&quot;:{&quot;type&quot;:&quot;article-journal&quot;,&quot;id&quot;:&quot;31848458-a34e-370b-af77-81d1d893a1c5&quot;,&quot;title&quot;:&quot;Deep Reinforcement Learning Approaches the MILP Optimum of a Multi-Energy Optimization in Energy Communities&quot;,&quot;author&quot;:[{&quot;family&quot;:&quot;Vetter&quot;,&quot;given&quot;:&quot;Vinzent&quot;,&quot;parse-names&quot;:false,&quot;dropping-particle&quot;:&quot;&quot;,&quot;non-dropping-particle&quot;:&quot;&quot;},{&quot;family&quot;:&quot;Wohlgenannt&quot;,&quot;given&quot;:&quot;Philipp&quot;,&quot;parse-names&quot;:false,&quot;dropping-particle&quot;:&quot;&quot;,&quot;non-dropping-particle&quot;:&quot;&quot;},{&quot;family&quot;:&quot;Kepplinger&quot;,&quot;given&quot;:&quot;Peter&quot;,&quot;parse-names&quot;:false,&quot;dropping-particle&quot;:&quot;&quot;,&quot;non-dropping-particle&quot;:&quot;&quot;},{&quot;family&quot;:&quot;Eder&quot;,&quot;given&quot;:&quot;Elias&quot;,&quot;parse-names&quot;:false,&quot;dropping-particle&quot;:&quot;&quot;,&quot;non-dropping-particle&quot;:&quot;&quot;}],&quot;container-title&quot;:&quot;Energies&quot;,&quot;DOI&quot;:&quot;10.3390/en18174489&quot;,&quot;ISSN&quot;:&quot;1996-1073&quot;,&quot;issued&quot;:{&quot;date-parts&quot;:[[2025,8,23]]},&quot;page&quot;:&quot;4489&quot;,&quot;abstract&quot;:&quot;&lt;p&gt;As energy systems transition toward high shares of variable renewable generation, local energy communities (ECs) are increasingly relevant for enabling demand-side flexibility and self-sufficiency. This shift is particularly evident in the residential sector, where the deployment of photovoltaic (PV) systems is rapidly growing. While mixed-integer linear programming (MILP) remains the standard for operational optimization and demand response in such systems, its computational burden limits scalability and responsiveness under real-time or uncertain conditions. Reinforcement learning (RL), by contrast, offers a model-free, adaptive alternative. However, its application to real-world energy system operation remains limited. This study explores the application of a Deep Q-Network (DQN) to a real residential EC, which has received limited attention in prior work. The system comprises three single-family homes sharing a centralized heating system with a thermal energy storage (TES), a PV installation, and a grid connection. We compare the performance of MILP and RL controllers across economic and environmental metrics. Relative to a reference scenario without TES, MILP and RL reduce energy costs by 10.06% and 8.78%, respectively, and both approaches yield lower total energy consumption and CO2-equivalent emissions. Notably, the trained RL agent achieves a near-optimal outcome while requiring only 22% of the MILP’s computation time. These results demonstrate that DQNs can offer a computationally efficient and practically viable alternative to MILP for real-time control in residential energy systems.&lt;/p&gt;&quot;,&quot;issue&quot;:&quot;17&quot;,&quot;volume&quot;:&quot;18&quot;,&quot;container-title-short&quot;:&quot;Energies (Basel).&quot;},&quot;isTemporary&quot;:false}]},{&quot;citationID&quot;:&quot;MENDELEY_CITATION_d44b77f0-61f7-4c28-821a-92a263b68faa&quot;,&quot;properties&quot;:{&quot;noteIndex&quot;:0},&quot;isEdited&quot;:false,&quot;manualOverride&quot;:{&quot;isManuallyOverridden&quot;:false,&quot;citeprocText&quot;:&quot;[57]&quot;,&quot;manualOverrideText&quot;:&quot;&quot;},&quot;citationTag&quot;:&quot;MENDELEY_CITATION_v3_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&quot;,&quot;citationItems&quot;:[{&quot;id&quot;:&quot;878a73bd-0c5d-3e77-a841-71aeb93db99a&quot;,&quot;itemData&quot;:{&quot;type&quot;:&quot;article-journal&quot;,&quot;id&quot;:&quot;878a73bd-0c5d-3e77-a841-71aeb93db99a&quot;,&quot;title&quot;:&quot;Reinforcement Learning for Joint Design and Control of Battery-PV Systems&quot;,&quot;author&quot;:[{&quot;family&quot;:&quot;Cauz&quot;,&quot;given&quot;:&quot;Marine&quot;,&quot;parse-names&quot;:false,&quot;dropping-particle&quot;:&quot;&quot;,&quot;non-dropping-particle&quot;:&quot;&quot;},{&quot;family&quot;:&quot;Bolland&quot;,&quot;given&quot;:&quot;Adrien&quot;,&quot;parse-names&quot;:false,&quot;dropping-particle&quot;:&quot;&quot;,&quot;non-dropping-particle&quot;:&quot;&quot;},{&quot;family&quot;:&quot;Miftari&quot;,&quot;given&quot;:&quot;Bardhyl&quot;,&quot;parse-names&quot;:false,&quot;dropping-particle&quot;:&quot;&quot;,&quot;non-dropping-particle&quot;:&quot;&quot;},{&quot;family&quot;:&quot;Perret&quot;,&quot;given&quot;:&quot;Lionel&quot;,&quot;parse-names&quot;:false,&quot;dropping-particle&quot;:&quot;&quot;,&quot;non-dropping-particle&quot;:&quot;&quot;},{&quot;family&quot;:&quot;Ballif&quot;,&quot;given&quot;:&quot;Christophe&quot;,&quot;parse-names&quot;:false,&quot;dropping-particle&quot;:&quot;&quot;,&quot;non-dropping-particle&quot;:&quot;&quot;},{&quot;family&quot;:&quot;Wyrsch&quot;,&quot;given&quot;:&quot;Nicolas&quot;,&quot;parse-names&quot;:false,&quot;dropping-particle&quot;:&quot;&quot;,&quot;non-dropping-particle&quot;:&quot;&quot;}],&quot;URL&quot;:&quot;http://arxiv.org/abs/2307.04244&quot;,&quot;issued&quot;:{&quot;date-parts&quot;:[[2023,7,9]]},&quot;abstract&quot;:&quot;The decentralisation and unpredictability of new renewable energy sources require rethinking our energy system. Data-driven approaches, such as reinforcement learning (RL), have emerged as new control strategies for operating these systems, but they have not yet been applied to system design. This paper aims to bridge this gap by studying the use of an RL-based method for joint design and control of a real-world PV and battery system. The design problem is first formulated as a mixed-integer linear programming problem (MILP). The optimal MILP solution is then used to evaluate the performance of an RL agent trained in a surrogate environment designed for applying an existing data-driven algorithm. The main difference between the two models lies in their optimization approaches: while MILP finds a solution that minimizes the total costs for a one-year operation given the deterministic historical data, RL is a stochastic method that searches for an optimal strategy over one week of data on expectation over all weeks in the historical dataset. Both methods were applied on a toy example using one-week data and on a case study using one-year data. In both cases, models were found to converge to similar control solutions, but their investment decisions differed. Overall, these outcomes are an initial step illustrating benefits and challenges of using RL for the joint design and control of energy systems.&quot;,&quot;container-title-short&quot;:&quot;&quot;},&quot;isTemporary&quot;:false}]},{&quot;citationID&quot;:&quot;MENDELEY_CITATION_ad01b917-344f-4c3a-bbf6-4c037af3c5a8&quot;,&quot;properties&quot;:{&quot;noteIndex&quot;:0},&quot;isEdited&quot;:false,&quot;manualOverride&quot;:{&quot;isManuallyOverridden&quot;:false,&quot;citeprocText&quot;:&quot;[58]&quot;,&quot;manualOverrideText&quot;:&quot;&quot;},&quot;citationTag&quot;:&quot;MENDELEY_CITATION_v3_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&quot;,&quot;citationItems&quot;:[{&quot;id&quot;:&quot;f9d59068-a5c5-321b-98f4-f48ae0ee5cc2&quot;,&quot;itemData&quot;:{&quot;type&quot;:&quot;article-journal&quot;,&quot;id&quot;:&quot;f9d59068-a5c5-321b-98f4-f48ae0ee5cc2&quot;,&quot;title&quot;:&quot;Reinforcement Learning-Based Energy Management for Hybrid Power Systems: State-of-the-Art Survey, Review, and Perspectives&quot;,&quot;author&quot;:[{&quot;family&quot;:&quot;Tang&quot;,&quot;given&quot;:&quot;Xiaolin&quot;,&quot;parse-names&quot;:false,&quot;dropping-particle&quot;:&quot;&quot;,&quot;non-dropping-particle&quot;:&quot;&quot;},{&quot;family&quot;:&quot;Chen&quot;,&quot;given&quot;:&quot;Jiaxin&quot;,&quot;parse-names&quot;:false,&quot;dropping-particle&quot;:&quot;&quot;,&quot;non-dropping-particle&quot;:&quot;&quot;},{&quot;family&quot;:&quot;Qin&quot;,&quot;given&quot;:&quot;Yechen&quot;,&quot;parse-names&quot;:false,&quot;dropping-particle&quot;:&quot;&quot;,&quot;non-dropping-particle&quot;:&quot;&quot;},{&quot;family&quot;:&quot;Liu&quot;,&quot;given&quot;:&quot;Teng&quot;,&quot;parse-names&quot;:false,&quot;dropping-particle&quot;:&quot;&quot;,&quot;non-dropping-particle&quot;:&quot;&quot;},{&quot;family&quot;:&quot;Yang&quot;,&quot;given&quot;:&quot;Kai&quot;,&quot;parse-names&quot;:false,&quot;dropping-particle&quot;:&quot;&quot;,&quot;non-dropping-particle&quot;:&quot;&quot;},{&quot;family&quot;:&quot;Khajepour&quot;,&quot;given&quot;:&quot;Amir&quot;,&quot;parse-names&quot;:false,&quot;dropping-particle&quot;:&quot;&quot;,&quot;non-dropping-particle&quot;:&quot;&quot;},{&quot;family&quot;:&quot;Li&quot;,&quot;given&quot;:&quot;Shen&quot;,&quot;parse-names&quot;:false,&quot;dropping-particle&quot;:&quot;&quot;,&quot;non-dropping-particle&quot;:&quot;&quot;}],&quot;container-title&quot;:&quot;Chinese Journal of Mechanical Engineering&quot;,&quot;DOI&quot;:&quot;10.1186/s10033-024-01026-4&quot;,&quot;ISSN&quot;:&quot;2192-8258&quot;,&quot;issued&quot;:{&quot;date-parts&quot;:[[2024,5,17]]},&quot;page&quot;:&quot;43&quot;,&quot;abstract&quot;:&quot;&lt;p&gt;The new energy vehicle plays a crucial role in green transportation, and the energy management strategy of hybrid power systems is essential for ensuring energy-efficient driving. This paper presents a state-of-the-art survey and review of reinforcement learning-based energy management strategies for hybrid power systems. Additionally, it envisions the outlook for autonomous intelligent hybrid electric vehicles, with reinforcement learning as the foundational technology. First of all, to provide a macro view of historical development, the brief history of deep learning, reinforcement learning, and deep reinforcement learning is presented in the form of a timeline. Then, the comprehensive survey and review are conducted by collecting papers from mainstream academic databases. Enumerating most of the contributions based on three main directions—algorithm innovation, powertrain innovation, and environment innovation—provides an objective review of the research status. Finally, to advance the application of reinforcement learning in autonomous intelligent hybrid electric vehicles, future research plans positioned as “Alpha HEV” are envisioned, integrating Autopilot and energy-saving control.&lt;/p&gt;&quot;,&quot;issue&quot;:&quot;1&quot;,&quot;volume&quot;:&quot;37&quot;,&quot;container-title-short&quot;:&quot;&quot;},&quot;isTemporary&quot;:false}]},{&quot;citationID&quot;:&quot;MENDELEY_CITATION_1494569a-231a-4a1f-9dcf-fd4949b38031&quot;,&quot;properties&quot;:{&quot;noteIndex&quot;:0},&quot;isEdited&quot;:false,&quot;manualOverride&quot;:{&quot;isManuallyOverridden&quot;:false,&quot;citeprocText&quot;:&quot;[59]&quot;,&quot;manualOverrideText&quot;:&quot;&quot;},&quot;citationTag&quot;:&quot;MENDELEY_CITATION_v3_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&quot;,&quot;citationItems&quot;:[{&quot;id&quot;:&quot;b53bd128-ecfb-3d48-b37c-bc2414a5ecf6&quot;,&quot;itemData&quot;:{&quot;type&quot;:&quot;article-journal&quot;,&quot;id&quot;:&quot;b53bd128-ecfb-3d48-b37c-bc2414a5ecf6&quot;,&quot;title&quot;:&quot;Proximal Policy Optimization for Energy Management of Electric Vehicles and PV Storage Units&quot;,&quot;author&quot;:[{&quot;family&quot;:&quot;Alonso&quot;,&quot;given&quot;:&quot;Monica&quot;,&quot;parse-names&quot;:false,&quot;dropping-particle&quot;:&quot;&quot;,&quot;non-dropping-particle&quot;:&quot;&quot;},{&quot;family&quot;:&quot;Amaris&quot;,&quot;given&quot;:&quot;Hortensia&quot;,&quot;parse-names&quot;:false,&quot;dropping-particle&quot;:&quot;&quot;,&quot;non-dropping-particle&quot;:&quot;&quot;},{&quot;family&quot;:&quot;Martin&quot;,&quot;given&quot;:&quot;David&quot;,&quot;parse-names&quot;:false,&quot;dropping-particle&quot;:&quot;&quot;,&quot;non-dropping-particle&quot;:&quot;&quot;},{&quot;family&quot;:&quot;la Escalera&quot;,&quot;given&quot;:&quot;Arturo&quot;,&quot;parse-names&quot;:false,&quot;dropping-particle&quot;:&quot;&quot;,&quot;non-dropping-particle&quot;:&quot;de&quot;}],&quot;container-title&quot;:&quot;Energies&quot;,&quot;container-title-short&quot;:&quot;Energies (Basel).&quot;,&quot;DOI&quot;:&quot;10.3390/en16155689&quot;,&quot;ISSN&quot;:&quot;1996-1073&quot;,&quot;issued&quot;:{&quot;date-parts&quot;:[[2023,7,29]]},&quot;page&quot;:&quot;5689&quot;,&quot;abstract&quot;:&quot;&lt;p&gt;Connected autonomous electric vehicles (CAEVs) are essential actors in the decarbonization process of the transport sector and a key aspect of home energy management systems (HEMSs) along with PV units, CAEVs and battery energy storage systems. However, there are associated uncertainties which present new challenges to HEMSs, such as aleatory EV arrival and departure times, unknown EV battery states of charge at the connection time, and stochastic PV production due to weather and passing cloud conditions. The proposed HEMS is based on proximal policy optimization (PPO), which is a deep reinforcement learning algorithm suitable for continuous complex environments. The optimal solution for HEMS is a tradeoff between CAEV driver’s range anxiety, batteries degradation, and energy consumption, which is solved by means of incentives/penalties in the reinforcement learning formulation. The proposed PPO algorithm was compared to conventional methods such as business-as-usual (BAU) and value iteration (VI) solutions based on dynamic programming. Simulation results indicate that the proposed PPO’s performance showed a daily energy cost reduction of 54% and 27% compared to BAU and VI, respectively. Finally, the developed PPO algorithm is suitable for real-time operations due to its fast execution and good convergence to the optimal solution.&lt;/p&gt;&quot;,&quot;issue&quot;:&quot;15&quot;,&quot;volume&quot;:&quot;16&quot;},&quot;isTemporary&quot;:false}]},{&quot;citationID&quot;:&quot;MENDELEY_CITATION_3b1abaf4-731f-4517-b80f-ef9ec2160c37&quot;,&quot;properties&quot;:{&quot;noteIndex&quot;:0},&quot;isEdited&quot;:false,&quot;manualOverride&quot;:{&quot;isManuallyOverridden&quot;:false,&quot;citeprocText&quot;:&quot;[60]&quot;,&quot;manualOverrideText&quot;:&quot;&quot;},&quot;citationTag&quot;:&quot;MENDELEY_CITATION_v3_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&quot;,&quot;citationItems&quot;:[{&quot;id&quot;:&quot;0ff5ca73-a774-3552-8a06-19b477c5e9e3&quot;,&quot;itemData&quot;:{&quot;type&quot;:&quot;article-journal&quot;,&quot;id&quot;:&quot;0ff5ca73-a774-3552-8a06-19b477c5e9e3&quot;,&quot;title&quot;:&quot;Deep Reinforcement Learning for Intraday Multireservoir Hydropower Management&quot;,&quot;author&quot;:[{&quot;family&quot;:&quot;Castro-Freibott&quot;,&quot;given&quot;:&quot;Rodrigo&quot;,&quot;parse-names&quot;:false,&quot;dropping-particle&quot;:&quot;&quot;,&quot;non-dropping-particle&quot;:&quot;&quot;},{&quot;family&quot;:&quot;García-Sánchez&quot;,&quot;given&quot;:&quot;Álvaro&quot;,&quot;parse-names&quot;:false,&quot;dropping-particle&quot;:&quot;&quot;,&quot;non-dropping-particle&quot;:&quot;&quot;},{&quot;family&quot;:&quot;Espiga-Fernández&quot;,&quot;given&quot;:&quot;Francisco&quot;,&quot;parse-names&quot;:false,&quot;dropping-particle&quot;:&quot;&quot;,&quot;non-dropping-particle&quot;:&quot;&quot;},{&quot;family&quot;:&quot;González-Santander de la Cruz&quot;,&quot;given&quot;:&quot;Guillermo&quot;,&quot;parse-names&quot;:false,&quot;dropping-particle&quot;:&quot;&quot;,&quot;non-dropping-particle&quot;:&quot;&quot;}],&quot;container-title&quot;:&quot;Mathematics&quot;,&quot;DOI&quot;:&quot;10.3390/math13010151&quot;,&quot;ISSN&quot;:&quot;2227-7390&quot;,&quot;issued&quot;:{&quot;date-parts&quot;:[[2025,1,3]]},&quot;page&quot;:&quot;151&quot;,&quot;abstract&quot;:&quot;&lt;p&gt;This study investigates the application of Reinforcement Learning (RL) to optimize intraday operations of hydropower reservoirs. Unlike previous approaches that focus on long-term planning with coarse temporal resolutions and discretized state-action spaces, we propose an RL framework tailored to the Hydropower Reservoirs Intraday Economic Optimization problem. This framework manages continuous state-action spaces while accounting for fine-grained temporal dynamics, including dam-to-turbine delays, gate movement constraints, and power group operations. Our methodology evaluates three distinct action space formulations (continuous, discrete, and adjustments) implemented using modern RL algorithms (A2C, PPO, and SAC). We compare them against both a greedy baseline and Mixed-Integer Linear Programming (MILP) solutions. Experiments on real-world data from a two-reservoir system and a simulated six-reservoir system demonstrate that while MILP achieves superior performance in the smaller system, its performance degrades significantly when scaled to six reservoirs. In contrast, RL agents, particularly those using discrete action spaces and trained with PPO, maintain consistent performance across both configurations, achieving considerable improvements with less than one second of execution time. These results suggest that RL offers a scalable alternative to traditional optimization methods for hydropower operations, particularly in scenarios requiring real-time decision making or involving larger systems.&lt;/p&gt;&quot;,&quot;issue&quot;:&quot;1&quot;,&quot;volume&quot;:&quot;13&quot;,&quot;container-title-short&quot;:&quot;&quot;},&quot;isTemporary&quot;:false}]},{&quot;citationID&quot;:&quot;MENDELEY_CITATION_3ac95b0f-c725-4795-bfa4-1eba977c9f4a&quot;,&quot;properties&quot;:{&quot;noteIndex&quot;:0},&quot;isEdited&quot;:false,&quot;manualOverride&quot;:{&quot;isManuallyOverridden&quot;:false,&quot;citeprocText&quot;:&quot;[61]&quot;,&quot;manualOverrideText&quot;:&quot;&quot;},&quot;citationTag&quot;:&quot;MENDELEY_CITATION_v3_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&quot;,&quot;citationItems&quot;:[{&quot;id&quot;:&quot;3cac7bf3-aab5-308c-b172-3e50ea998683&quot;,&quot;itemData&quot;:{&quot;type&quot;:&quot;article-journal&quot;,&quot;id&quot;:&quot;3cac7bf3-aab5-308c-b172-3e50ea998683&quot;,&quot;title&quot;:&quot;Microgrid control for renewable energy sources based on deep reinforcement learning and numerical optimization approaches&quot;,&quot;author&quot;:[{&quot;family&quot;:&quot;Zhadan&quot;,&quot;given&quot;:&quot;Anastasia Yu.&quot;,&quot;parse-names&quot;:false,&quot;dropping-particle&quot;:&quot;&quot;,&quot;non-dropping-particle&quot;:&quot;&quot;},{&quot;family&quot;:&quot;Wu&quot;,&quot;given&quot;:&quot;Haitao&quot;,&quot;parse-names&quot;:false,&quot;dropping-particle&quot;:&quot;&quot;,&quot;non-dropping-particle&quot;:&quot;&quot;},{&quot;family&quot;:&quot;Kudin&quot;,&quot;given&quot;:&quot;Pavel S.&quot;,&quot;parse-names&quot;:false,&quot;dropping-particle&quot;:&quot;&quot;,&quot;non-dropping-particle&quot;:&quot;&quot;},{&quot;family&quot;:&quot;Zhang&quot;,&quot;given&quot;:&quot;Yuyi&quot;,&quot;parse-names&quot;:false,&quot;dropping-particle&quot;:&quot;&quot;,&quot;non-dropping-particle&quot;:&quot;&quot;},{&quot;family&quot;:&quot;Petrosian&quot;,&quot;given&quot;:&quot;Ovanes L.&quot;,&quot;parse-names&quot;:false,&quot;dropping-particle&quot;:&quot;&quot;,&quot;non-dropping-particle&quot;:&quot;&quot;}],&quot;container-title&quot;:&quot;Vestnik of Saint Petersburg University. Applied Mathematics. Computer Science. Control Processes&quot;,&quot;DOI&quot;:&quot;10.21638/11701/spbu10.2023.307&quot;,&quot;ISSN&quot;:&quot;18119905&quot;,&quot;issued&quot;:{&quot;date-parts&quot;:[[2023]]},&quot;page&quot;:&quot;391-402&quot;,&quot;abstract&quot;:&quot;&lt;p&gt;Optimal scheduling of battery energy storage system plays crucial part in dis- tributed energy system. As a data driven method, deep reinforcement learning does not require system knowledge of dynamic system, present optimal solution for nonlinear optimization problem. In this research, financial cost of energy con- sumption reduced by scheduling battery energy using deep reinforcement learning method (RL). Reinforcement learning can adapt to equipment parameter changes and noise in the data, while mixed-integer linear programming (MILP) requires high accuracy in forecasting power generation and demand, accurate equipment parameters to achieve good performance, and high computational cost for large- scale industrial applications. Based on this, it can be assumed that deep RL based solution is capable of outperform classic deterministic optimization model MILP. This study compares four state-of-the-art RL algorithms for the battery power plant control problem: PPO, A2C, SAC, TD3. According to the simulation results, TD3 shows the best results, outperforming MILP by 5% in cost savings, and the time to solve the problem is reduced by about a factor of three.&lt;/p&gt;&quot;,&quot;issue&quot;:&quot;3&quot;,&quot;volume&quot;:&quot;19&quot;,&quot;container-title-short&quot;:&quot;&quot;},&quot;isTemporary&quot;:false}]}]"/>
     <we:property name="MENDELEY_CITATIONS_STYLE" value="{&quot;id&quot;:&quot;https://www.zotero.org/styles/ieee&quot;,&quot;title&quot;:&quot;IEEE Reference Guide version 11.29.2023&quot;,&quot;format&quot;:&quot;numeric&quot;,&quot;defaultLocale&quot;:null,&quot;isLocaleCodeValid&quot;:true}"/>
   </we:properties>
   <we:bindings/>
@@ -23862,6 +24131,44 @@
 </file>
 
 <file path=customXml/item1.xml><?xml version="1.0" encoding="utf-8"?>
+<b:Sources xmlns:b="http://schemas.openxmlformats.org/officeDocument/2006/bibliography" xmlns="http://schemas.openxmlformats.org/officeDocument/2006/bibliography" SelectedStyle="/IEEE2006OfficeOnline.xsl" StyleName="IEEE" Version="2006">
+  <b:Source>
+    <b:Tag>Placeholder1</b:Tag>
+    <b:SourceType>Book</b:SourceType>
+    <b:Guid>{61C2BEB0-04B1-424E-AEC0-322EDBD1A18A}</b:Guid>
+    <b:RefOrder>2</b:RefOrder>
+  </b:Source>
+  <b:Source>
+    <b:Tag>Placeholder2</b:Tag>
+    <b:SourceType>Book</b:SourceType>
+    <b:Guid>{26E93F14-F601-D04A-A10D-E3BC3760B577}</b:Guid>
+    <b:RefOrder>1</b:RefOrder>
+  </b:Source>
+</b:Sources>
+</file>
+
+<file path=customXml/item2.xml><?xml version="1.0" encoding="utf-8"?>
+<?mso-contentType ?>
+<FormTemplates xmlns="http://schemas.microsoft.com/sharepoint/v3/contenttype/forms">
+  <Display>DocumentLibraryForm</Display>
+  <Edit>DocumentLibraryForm</Edit>
+  <New>DocumentLibraryForm</New>
+</FormTemplates>
+</file>
+
+<file path=customXml/item3.xml><?xml version="1.0" encoding="utf-8"?>
+<p:properties xmlns:p="http://schemas.microsoft.com/office/2006/metadata/properties" xmlns:xsi="http://www.w3.org/2001/XMLSchema-instance" xmlns:pc="http://schemas.microsoft.com/office/infopath/2007/PartnerControls">
+  <documentManagement>
+    <TaxCatchAll xmlns="4de74af2-d2a7-4bc3-a319-420167317553" xsi:nil="true"/>
+    <ArchiverLinkFileType xmlns="c0991f74-233a-4c46-9c55-a176f0e8ba44" xsi:nil="true"/>
+    <lcf76f155ced4ddcb4097134ff3c332f xmlns="c0991f74-233a-4c46-9c55-a176f0e8ba44">
+      <Terms xmlns="http://schemas.microsoft.com/office/infopath/2007/PartnerControls"/>
+    </lcf76f155ced4ddcb4097134ff3c332f>
+  </documentManagement>
+</p:properties>
+</file>
+
+<file path=customXml/item4.xml><?xml version="1.0" encoding="utf-8"?>
 <ct:contentTypeSchema xmlns:ct="http://schemas.microsoft.com/office/2006/metadata/contentType" xmlns:ma="http://schemas.microsoft.com/office/2006/metadata/properties/metaAttributes" ct:_="" ma:_="" ma:contentTypeName="Dokument" ma:contentTypeID="0x0101003A15E957932D6F4AB4FD28F85AF4FFD8" ma:contentTypeVersion="14" ma:contentTypeDescription="Ein neues Dokument erstellen." ma:contentTypeScope="" ma:versionID="e040dc8dbf4a4132031beaaf90e02bdd">
   <xsd:schema xmlns:xsd="http://www.w3.org/2001/XMLSchema" xmlns:xs="http://www.w3.org/2001/XMLSchema" xmlns:p="http://schemas.microsoft.com/office/2006/metadata/properties" xmlns:ns2="c0991f74-233a-4c46-9c55-a176f0e8ba44" xmlns:ns3="4de74af2-d2a7-4bc3-a319-420167317553" targetNamespace="http://schemas.microsoft.com/office/2006/metadata/properties" ma:root="true" ma:fieldsID="63fe477e893c7cf9e00d7d25e31408c1" ns2:_="" ns3:_="">
     <xsd:import namespace="c0991f74-233a-4c46-9c55-a176f0e8ba44"/>
@@ -24090,45 +24397,34 @@
 </ct:contentTypeSchema>
 </file>
 
-<file path=customXml/item2.xml><?xml version="1.0" encoding="utf-8"?>
-<b:Sources xmlns:b="http://schemas.openxmlformats.org/officeDocument/2006/bibliography" xmlns="http://schemas.openxmlformats.org/officeDocument/2006/bibliography" SelectedStyle="/IEEE2006OfficeOnline.xsl" StyleName="IEEE" Version="2006">
-  <b:Source>
-    <b:Tag>Placeholder1</b:Tag>
-    <b:SourceType>Book</b:SourceType>
-    <b:Guid>{61C2BEB0-04B1-424E-AEC0-322EDBD1A18A}</b:Guid>
-    <b:RefOrder>2</b:RefOrder>
-  </b:Source>
-  <b:Source>
-    <b:Tag>Placeholder2</b:Tag>
-    <b:SourceType>Book</b:SourceType>
-    <b:Guid>{26E93F14-F601-D04A-A10D-E3BC3760B577}</b:Guid>
-    <b:RefOrder>1</b:RefOrder>
-  </b:Source>
-</b:Sources>
+<file path=customXml/itemProps1.xml><?xml version="1.0" encoding="utf-8"?>
+<ds:datastoreItem xmlns:ds="http://schemas.openxmlformats.org/officeDocument/2006/customXml" ds:itemID="{8ED87741-333E-524C-B42D-A34782CE569A}">
+  <ds:schemaRefs>
+    <ds:schemaRef ds:uri="http://schemas.openxmlformats.org/officeDocument/2006/bibliography"/>
+  </ds:schemaRefs>
+</ds:datastoreItem>
 </file>
 
-<file path=customXml/item3.xml><?xml version="1.0" encoding="utf-8"?>
-<?mso-contentType ?>
-<FormTemplates xmlns="http://schemas.microsoft.com/sharepoint/v3/contenttype/forms">
-  <Display>DocumentLibraryForm</Display>
-  <Edit>DocumentLibraryForm</Edit>
-  <New>DocumentLibraryForm</New>
-</FormTemplates>
+<file path=customXml/itemProps2.xml><?xml version="1.0" encoding="utf-8"?>
+<ds:datastoreItem xmlns:ds="http://schemas.openxmlformats.org/officeDocument/2006/customXml" ds:itemID="{123745DA-69E4-464B-8AAF-512AB146EAEF}">
+  <ds:schemaRefs>
+    <ds:schemaRef ds:uri="http://schemas.microsoft.com/sharepoint/v3/contenttype/forms"/>
+  </ds:schemaRefs>
+</ds:datastoreItem>
 </file>
 
-<file path=customXml/item4.xml><?xml version="1.0" encoding="utf-8"?>
-<p:properties xmlns:p="http://schemas.microsoft.com/office/2006/metadata/properties" xmlns:xsi="http://www.w3.org/2001/XMLSchema-instance" xmlns:pc="http://schemas.microsoft.com/office/infopath/2007/PartnerControls">
-  <documentManagement>
-    <TaxCatchAll xmlns="4de74af2-d2a7-4bc3-a319-420167317553" xsi:nil="true"/>
-    <ArchiverLinkFileType xmlns="c0991f74-233a-4c46-9c55-a176f0e8ba44" xsi:nil="true"/>
-    <lcf76f155ced4ddcb4097134ff3c332f xmlns="c0991f74-233a-4c46-9c55-a176f0e8ba44">
-      <Terms xmlns="http://schemas.microsoft.com/office/infopath/2007/PartnerControls"/>
-    </lcf76f155ced4ddcb4097134ff3c332f>
-  </documentManagement>
-</p:properties>
+<file path=customXml/itemProps3.xml><?xml version="1.0" encoding="utf-8"?>
+<ds:datastoreItem xmlns:ds="http://schemas.openxmlformats.org/officeDocument/2006/customXml" ds:itemID="{5DB99EA3-5A91-4DE8-9C2E-5E2756FB8116}">
+  <ds:schemaRefs>
+    <ds:schemaRef ds:uri="http://schemas.microsoft.com/office/2006/metadata/properties"/>
+    <ds:schemaRef ds:uri="http://schemas.microsoft.com/office/infopath/2007/PartnerControls"/>
+    <ds:schemaRef ds:uri="4de74af2-d2a7-4bc3-a319-420167317553"/>
+    <ds:schemaRef ds:uri="c0991f74-233a-4c46-9c55-a176f0e8ba44"/>
+  </ds:schemaRefs>
+</ds:datastoreItem>
 </file>
 
-<file path=customXml/itemProps1.xml><?xml version="1.0" encoding="utf-8"?>
+<file path=customXml/itemProps4.xml><?xml version="1.0" encoding="utf-8"?>
 <ds:datastoreItem xmlns:ds="http://schemas.openxmlformats.org/officeDocument/2006/customXml" ds:itemID="{DB59158D-15C5-4DFF-AEB5-CA02C610712D}">
   <ds:schemaRefs>
     <ds:schemaRef ds:uri="http://schemas.microsoft.com/office/2006/metadata/contentType"/>
@@ -24145,31 +24441,4 @@
     <ds:schemaRef ds:uri="http://schemas.microsoft.com/internal/obd"/>
   </ds:schemaRefs>
 </ds:datastoreItem>
-</file>
-
-<file path=customXml/itemProps2.xml><?xml version="1.0" encoding="utf-8"?>
-<ds:datastoreItem xmlns:ds="http://schemas.openxmlformats.org/officeDocument/2006/customXml" ds:itemID="{8ED87741-333E-524C-B42D-A34782CE569A}">
-  <ds:schemaRefs>
-    <ds:schemaRef ds:uri="http://schemas.openxmlformats.org/officeDocument/2006/bibliography"/>
-  </ds:schemaRefs>
-</ds:datastoreItem>
-</file>
-
-<file path=customXml/itemProps3.xml><?xml version="1.0" encoding="utf-8"?>
-<ds:datastoreItem xmlns:ds="http://schemas.openxmlformats.org/officeDocument/2006/customXml" ds:itemID="{123745DA-69E4-464B-8AAF-512AB146EAEF}">
-  <ds:schemaRefs>
-    <ds:schemaRef ds:uri="http://schemas.microsoft.com/sharepoint/v3/contenttype/forms"/>
-  </ds:schemaRefs>
-</ds:datastoreItem>
-</file>
-
-<file path=customXml/itemProps4.xml><?xml version="1.0" encoding="utf-8"?>
-<ds:datastoreItem xmlns:ds="http://schemas.openxmlformats.org/officeDocument/2006/customXml" ds:itemID="{5DB99EA3-5A91-4DE8-9C2E-5E2756FB8116}">
-  <ds:schemaRefs>
-    <ds:schemaRef ds:uri="http://schemas.microsoft.com/office/2006/metadata/properties"/>
-    <ds:schemaRef ds:uri="http://schemas.microsoft.com/office/infopath/2007/PartnerControls"/>
-    <ds:schemaRef ds:uri="4de74af2-d2a7-4bc3-a319-420167317553"/>
-    <ds:schemaRef ds:uri="c0991f74-233a-4c46-9c55-a176f0e8ba44"/>
-  </ds:schemaRefs>
-</ds:datastoreItem>
 </file>
</xml_diff>

<commit_message>
cleaned up a lil bit
</commit_message>
<xml_diff>
--- a/Thesis Rafi Draft 1.docx
+++ b/Thesis Rafi Draft 1.docx
@@ -6392,11 +6392,6 @@
       <w:r>
         <w:lastRenderedPageBreak/>
         <w:t>constraints.</w:t>
-      </w:r>
-    </w:p>
-    <w:p>
-      <w:r>
-        <w:t xml:space="preserve"> </w:t>
       </w:r>
     </w:p>
     <w:p>
@@ -8242,20 +8237,20 @@
         <w:rPr>
           <w:kern w:val="0"/>
         </w:rPr>
-        <w:t xml:space="preserve"> </w:t>
+        <w:t xml:space="preserve"> to find the valleys or hills within the linear boundaries. </w:t>
       </w:r>
       <w:r>
         <w:rPr>
           <w:kern w:val="0"/>
         </w:rPr>
+        <w:t xml:space="preserve">In practice, MILP has been used as the </w:t>
+      </w:r>
+      <w:r>
+        <w:rPr>
+          <w:kern w:val="0"/>
+        </w:rPr>
         <w:lastRenderedPageBreak/>
-        <w:t>to find the valleys or hills within the linear boundaries. </w:t>
-      </w:r>
-      <w:r>
-        <w:rPr>
-          <w:kern w:val="0"/>
-        </w:rPr>
-        <w:t>In practice, MILP has been used as the reference method for operational optimization, demand response, scheduling in energy communities, industrial plants, and integrated multi-energy systems because it produces globally optimal solutions to the defined linear problem when sufficient computation time is available</w:t>
+        <w:t>reference method for operational optimization, demand response, scheduling in energy communities, industrial plants, and integrated multi-energy systems because it produces globally optimal solutions to the defined linear problem when sufficient computation time is available</w:t>
       </w:r>
       <w:r>
         <w:rPr>
@@ -8785,14 +8780,7 @@
               <w:rPr>
                 <w:kern w:val="0"/>
               </w:rPr>
-              <w:t xml:space="preserve">• Captures highly realistic physical/chemical behavior </w:t>
-            </w:r>
-            <w:r>
-              <w:rPr>
-                <w:kern w:val="0"/>
-              </w:rPr>
-              <w:lastRenderedPageBreak/>
-              <w:t>without linear simplifications.</w:t>
+              <w:t>• Captures highly realistic physical/chemical behavior without linear simplifications.</w:t>
             </w:r>
           </w:p>
         </w:tc>
@@ -8812,7 +8800,6 @@
               <w:rPr>
                 <w:kern w:val="0"/>
               </w:rPr>
-              <w:lastRenderedPageBreak/>
               <w:t>• Non-convex problems can get trapped in local sub-optima.</w:t>
             </w:r>
           </w:p>
@@ -8827,8 +8814,14 @@
               <w:rPr>
                 <w:kern w:val="0"/>
               </w:rPr>
+              <w:t xml:space="preserve">• High computational </w:t>
+            </w:r>
+            <w:r>
+              <w:rPr>
+                <w:kern w:val="0"/>
+              </w:rPr>
               <w:lastRenderedPageBreak/>
-              <w:t>• High computational complexity (NP-hard).</w:t>
+              <w:t>complexity (NP-hard).</w:t>
             </w:r>
           </w:p>
         </w:tc>
@@ -9364,14 +9357,7 @@
         <w:rPr>
           <w:kern w:val="0"/>
         </w:rPr>
-        <w:t xml:space="preserve">31.9% CO2 cut with a </w:t>
-      </w:r>
-      <w:r>
-        <w:rPr>
-          <w:kern w:val="0"/>
-        </w:rPr>
-        <w:lastRenderedPageBreak/>
-        <w:t xml:space="preserve">2.22.2% CO2 emissions increase </w:t>
+        <w:t xml:space="preserve">31.9% CO2 cut with a 2.22.2% CO2 emissions increase </w:t>
       </w:r>
       <w:sdt>
         <w:sdtPr>
@@ -9877,11 +9863,7 @@
         <w:t>What is RL? And how does it differ mainly from MILP?</w:t>
       </w:r>
       <w:r>
-        <w:t xml:space="preserve"> And why is it even a relevant </w:t>
-      </w:r>
-      <w:r>
-        <w:lastRenderedPageBreak/>
-        <w:t>consideration for optimizing energy system?</w:t>
+        <w:t xml:space="preserve"> And why is it even a relevant consideration for optimizing energy system?</w:t>
       </w:r>
     </w:p>
     <w:p>
@@ -9893,6 +9875,7 @@
         </w:numPr>
       </w:pPr>
       <w:r>
+        <w:lastRenderedPageBreak/>
         <w:t>What are the different kinds of novel RL</w:t>
       </w:r>
       <w:r>
@@ -10144,7 +10127,7 @@
         </w:rPr>
         <w:lastRenderedPageBreak/>
         <w:drawing>
-          <wp:inline distT="0" distB="0" distL="0" distR="0" wp14:anchorId="7F1C01FB" wp14:editId="08B81A00">
+          <wp:inline distT="0" distB="0" distL="0" distR="0" wp14:anchorId="7F1C01FB" wp14:editId="6B367939">
             <wp:extent cx="5943600" cy="3042285"/>
             <wp:effectExtent l="0" t="0" r="0" b="0"/>
             <wp:docPr id="1692581311" name="Graphic 1"/>
@@ -12469,7 +12452,6 @@
         <w:t xml:space="preserve">. </w:t>
       </w:r>
     </w:p>
-    <w:p/>
     <w:p>
       <w:pPr>
         <w:pStyle w:val="Heading3"/>
@@ -12477,7 +12459,6 @@
           <w:ilvl w:val="0"/>
           <w:numId w:val="0"/>
         </w:numPr>
-        <w:ind w:left="720" w:hanging="720"/>
       </w:pPr>
     </w:p>
     <w:p>
@@ -12511,19 +12492,49 @@
         <w:t xml:space="preserve"> of RL algorithms to be </w:t>
       </w:r>
       <w:r>
-        <w:t>chosen for complex energy system optimization and control. The type of RL algorithms are usually divided into three parts: value-based</w:t>
-      </w:r>
-      <w:r>
-        <w:t xml:space="preserve"> RL, policy-based RL, and actor-critic that sits in between them. </w:t>
-      </w:r>
-      <w:r>
-        <w:t xml:space="preserve">The different </w:t>
+        <w:t>chosen for complex energy system optimization and control. The type</w:t>
+      </w:r>
+      <w:r>
+        <w:t>s</w:t>
+      </w:r>
+      <w:r>
+        <w:t xml:space="preserve"> of RL algorithms are usually divided into three parts: value-based</w:t>
+      </w:r>
+      <w:r>
+        <w:t xml:space="preserve"> RL, policy-based RL, and actor-critic</w:t>
+      </w:r>
+      <w:r>
+        <w:t>,</w:t>
+      </w:r>
+      <w:r>
+        <w:t xml:space="preserve"> </w:t>
+      </w:r>
+      <w:r>
+        <w:t>which</w:t>
+      </w:r>
+      <w:r>
+        <w:t xml:space="preserve"> sits in between them. </w:t>
+      </w:r>
+      <w:r>
+        <w:t>The differen</w:t>
+      </w:r>
+      <w:r>
+        <w:t>ce</w:t>
+      </w:r>
+      <w:r>
+        <w:t xml:space="preserve"> </w:t>
       </w:r>
       <w:r>
         <w:t>between</w:t>
       </w:r>
       <w:r>
-        <w:t xml:space="preserve"> these different types lie in </w:t>
+        <w:t xml:space="preserve"> these different types lie</w:t>
+      </w:r>
+      <w:r>
+        <w:t>s</w:t>
+      </w:r>
+      <w:r>
+        <w:t xml:space="preserve"> in </w:t>
       </w:r>
       <w:r>
         <w:t xml:space="preserve">the learning methodology for the RL agent. Value-based RL learns a value function, </w:t>
@@ -12532,10 +12543,28 @@
         <w:t xml:space="preserve">usually a Q(s,a) estimate, and then </w:t>
       </w:r>
       <w:r>
-        <w:t xml:space="preserve">chooses an action that returns best estimated value. </w:t>
-      </w:r>
-      <w:r>
-        <w:t>Some example of value.based RL are Q-learning and Deep</w:t>
+        <w:t xml:space="preserve">chooses an action that returns </w:t>
+      </w:r>
+      <w:r>
+        <w:t xml:space="preserve">the </w:t>
+      </w:r>
+      <w:r>
+        <w:t xml:space="preserve">best estimated value. </w:t>
+      </w:r>
+      <w:r>
+        <w:t>Some example</w:t>
+      </w:r>
+      <w:r>
+        <w:t>s</w:t>
+      </w:r>
+      <w:r>
+        <w:t xml:space="preserve"> of value</w:t>
+      </w:r>
+      <w:r>
+        <w:t xml:space="preserve"> </w:t>
+      </w:r>
+      <w:r>
+        <w:t>based RL are Q-learning and Deep</w:t>
       </w:r>
       <w:r>
         <w:t xml:space="preserve"> Q Network (</w:t>
@@ -12614,7 +12643,13 @@
     <w:p/>
     <w:p>
       <w:r>
-        <w:t>On the other hand, Policy-based RL learn the Policy directly</w:t>
+        <w:t>On the other hand, Policy-based RL learn</w:t>
+      </w:r>
+      <w:r>
+        <w:t>s</w:t>
+      </w:r>
+      <w:r>
+        <w:t xml:space="preserve"> the Policy directly</w:t>
       </w:r>
       <w:r>
         <w:t>, which means it parametrizes the action rule itself and pinpoints the optimal policy with methods like policy gradients and PPO</w:t>
@@ -12652,22 +12687,40 @@
         <w:t xml:space="preserve">There </w:t>
       </w:r>
       <w:r>
-        <w:t>are</w:t>
-      </w:r>
-      <w:r>
-        <w:t xml:space="preserve"> many </w:t>
-      </w:r>
-      <w:r>
-        <w:t>literatures</w:t>
+        <w:t>is</w:t>
+      </w:r>
+      <w:r>
+        <w:t xml:space="preserve"> m</w:t>
+      </w:r>
+      <w:r>
+        <w:t>uch</w:t>
+      </w:r>
+      <w:r>
+        <w:t xml:space="preserve"> </w:t>
+      </w:r>
+      <w:r>
+        <w:t>literature</w:t>
       </w:r>
       <w:r>
         <w:t xml:space="preserve"> on RL that simply applies </w:t>
       </w:r>
       <w:r>
-        <w:t>a value-based approach, howe</w:t>
-      </w:r>
-      <w:r>
-        <w:t>ver, since energy problem are often continuous, high-dimensional, and constrained, policy-based approach are usually preferred</w:t>
+        <w:t xml:space="preserve">a value-based approach, </w:t>
+      </w:r>
+      <w:r>
+        <w:t>h</w:t>
+      </w:r>
+      <w:r>
+        <w:t>owe</w:t>
+      </w:r>
+      <w:r>
+        <w:t>ver, since energy problem are often continuous, high-dimensional, and constrained, policy-based approach</w:t>
+      </w:r>
+      <w:r>
+        <w:t>es</w:t>
+      </w:r>
+      <w:r>
+        <w:t xml:space="preserve"> are usually preferred</w:t>
       </w:r>
       <w:r>
         <w:t xml:space="preserve"> </w:t>
@@ -12699,7 +12752,13 @@
     <w:p/>
     <w:p>
       <w:r>
-        <w:t xml:space="preserve">Actor-critics methods are a mixed between the two: the actor learns the policy, while the critic learns the estimated value to make training more stable. </w:t>
+        <w:t xml:space="preserve">Actor-critic methods are a mix </w:t>
+      </w:r>
+      <w:r>
+        <w:t>of</w:t>
+      </w:r>
+      <w:r>
+        <w:t xml:space="preserve"> the two: the actor learns the policy, while the critic learns the estimated value to make training more stable. </w:t>
       </w:r>
       <w:r>
         <w:t xml:space="preserve">In the literature, </w:t>
@@ -12779,38 +12838,38 @@
         <w:t xml:space="preserve">, </w:t>
       </w:r>
       <w:r>
-        <w:t xml:space="preserve">Twin Delayed </w:t>
+        <w:t>Twin Delayed Deep Deterministic Policy Gradient (</w:t>
+      </w:r>
+      <w:r>
+        <w:t>TD3</w:t>
+      </w:r>
+      <w:r>
+        <w:t>)</w:t>
+      </w:r>
+      <w:r>
+        <w:t xml:space="preserve">, and </w:t>
+      </w:r>
+      <w:r>
+        <w:t>Deep Deterministic Policy Gradient (</w:t>
+      </w:r>
+      <w:r>
+        <w:t>DDPG</w:t>
+      </w:r>
+      <w:r>
+        <w:t>)</w:t>
+      </w:r>
+      <w:r>
+        <w:t xml:space="preserve">. </w:t>
+      </w:r>
+      <w:r>
+        <w:t>Numerous</w:t>
+      </w:r>
+      <w:r>
+        <w:t xml:space="preserve"> </w:t>
       </w:r>
       <w:r>
         <w:lastRenderedPageBreak/>
-        <w:t>Deep Deterministic Policy Gradient (</w:t>
-      </w:r>
-      <w:r>
-        <w:t>TD3</w:t>
-      </w:r>
-      <w:r>
-        <w:t>)</w:t>
-      </w:r>
-      <w:r>
-        <w:t xml:space="preserve">, and </w:t>
-      </w:r>
-      <w:r>
-        <w:t>Deep Deterministic Policy Gradient (</w:t>
-      </w:r>
-      <w:r>
-        <w:t>DDPG</w:t>
-      </w:r>
-      <w:r>
-        <w:t>)</w:t>
-      </w:r>
-      <w:r>
-        <w:t xml:space="preserve">. </w:t>
-      </w:r>
-      <w:r>
-        <w:t>Numerous</w:t>
-      </w:r>
-      <w:r>
-        <w:t xml:space="preserve"> studies have shown the application of this algorithm method</w:t>
+        <w:t>studies have shown the application of this algorithm method</w:t>
       </w:r>
       <w:r>
         <w:t xml:space="preserve"> into different kinds of energy systems</w:t>
@@ -13017,7 +13076,19 @@
         <w:rPr>
           <w:color w:val="000000"/>
         </w:rPr>
-        <w:t xml:space="preserve"> frameworks are used to only optimize the dispatch strategy of the energy system in a fixed </w:t>
+        <w:t xml:space="preserve"> frameworks are used to optimize</w:t>
+      </w:r>
+      <w:r>
+        <w:rPr>
+          <w:color w:val="000000"/>
+        </w:rPr>
+        <w:t xml:space="preserve"> only</w:t>
+      </w:r>
+      <w:r>
+        <w:rPr>
+          <w:color w:val="000000"/>
+        </w:rPr>
+        <w:t xml:space="preserve"> the dispatch strategy of the energy system in a fixed </w:t>
       </w:r>
       <w:r>
         <w:rPr>
@@ -13535,310 +13606,346 @@
         <w:rPr>
           <w:color w:val="000000"/>
         </w:rPr>
-        <w:t xml:space="preserve">. </w:t>
+        <w:t>. However, while introducing the design decision problem</w:t>
       </w:r>
       <w:r>
         <w:rPr>
           <w:color w:val="000000"/>
         </w:rPr>
+        <w:t>,</w:t>
+      </w:r>
+      <w:r>
+        <w:rPr>
+          <w:color w:val="000000"/>
+        </w:rPr>
+        <w:t xml:space="preserve"> the RL </w:t>
+      </w:r>
+      <w:r>
+        <w:rPr>
+          <w:color w:val="000000"/>
+        </w:rPr>
+        <w:t xml:space="preserve">at first managed to produce a </w:t>
+      </w:r>
+      <w:r>
+        <w:rPr>
+          <w:color w:val="000000"/>
+        </w:rPr>
         <w:lastRenderedPageBreak/>
-        <w:t>However, while introducing the design decision problem</w:t>
+        <w:t>better result in terms of cost</w:t>
       </w:r>
       <w:r>
         <w:rPr>
           <w:color w:val="000000"/>
         </w:rPr>
+        <w:t>;</w:t>
+      </w:r>
+      <w:r>
+        <w:rPr>
+          <w:color w:val="000000"/>
+        </w:rPr>
+        <w:t xml:space="preserve"> however, the authors later found that this is due to the </w:t>
+      </w:r>
+      <w:r>
+        <w:rPr>
+          <w:color w:val="000000"/>
+        </w:rPr>
+        <w:t>modelling limitations that the RL excludes</w:t>
+      </w:r>
+      <w:r>
+        <w:rPr>
+          <w:color w:val="000000"/>
+        </w:rPr>
         <w:t>,</w:t>
       </w:r>
       <w:r>
         <w:rPr>
           <w:color w:val="000000"/>
         </w:rPr>
-        <w:t xml:space="preserve"> the RL </w:t>
+        <w:t xml:space="preserve"> </w:t>
       </w:r>
       <w:r>
         <w:rPr>
           <w:color w:val="000000"/>
         </w:rPr>
-        <w:t>at first managed to produce a better result in terms of cost</w:t>
+        <w:t xml:space="preserve">which is the battery SOC </w:t>
       </w:r>
       <w:r>
         <w:rPr>
           <w:color w:val="000000"/>
         </w:rPr>
-        <w:t>;</w:t>
+        <w:t>balance at the end</w:t>
       </w:r>
       <w:r>
         <w:rPr>
           <w:color w:val="000000"/>
         </w:rPr>
-        <w:t xml:space="preserve"> however, the authors later found that this is due to the </w:t>
+        <w:t xml:space="preserve"> that should be the same as the initial SOC state. </w:t>
       </w:r>
       <w:r>
         <w:rPr>
           <w:color w:val="000000"/>
         </w:rPr>
-        <w:t>modelling limitations that the RL excludes</w:t>
+        <w:t xml:space="preserve">With this assumption being included in the calculation, the cost result of RL </w:t>
       </w:r>
       <w:r>
         <w:rPr>
           <w:color w:val="000000"/>
         </w:rPr>
+        <w:t>drops,</w:t>
+      </w:r>
+      <w:r>
+        <w:rPr>
+          <w:color w:val="000000"/>
+        </w:rPr>
+        <w:t xml:space="preserve"> </w:t>
+      </w:r>
+      <w:r>
+        <w:rPr>
+          <w:color w:val="000000"/>
+        </w:rPr>
+        <w:t>and MILP prevails to become cheaper.</w:t>
+      </w:r>
+      <w:r>
+        <w:rPr>
+          <w:color w:val="000000"/>
+        </w:rPr>
+        <w:t xml:space="preserve"> This shows </w:t>
+      </w:r>
+      <w:r>
+        <w:rPr>
+          <w:color w:val="000000"/>
+        </w:rPr>
+        <w:t>how important the modelling phase and identical assumption</w:t>
+      </w:r>
+      <w:r>
+        <w:rPr>
+          <w:color w:val="000000"/>
+        </w:rPr>
+        <w:t>s</w:t>
+      </w:r>
+      <w:r>
+        <w:rPr>
+          <w:color w:val="000000"/>
+        </w:rPr>
+        <w:t xml:space="preserve"> are for a fair comparison.</w:t>
+      </w:r>
+      <w:r>
+        <w:rPr>
+          <w:color w:val="000000"/>
+        </w:rPr>
+        <w:t xml:space="preserve"> </w:t>
+      </w:r>
+      <w:r>
+        <w:rPr>
+          <w:color w:val="000000"/>
+        </w:rPr>
+        <w:t xml:space="preserve">Interestingly, </w:t>
+      </w:r>
+      <w:r>
+        <w:rPr>
+          <w:color w:val="000000"/>
+        </w:rPr>
+        <w:t>the RL approach manages to converge to a near</w:t>
+      </w:r>
+      <w:r>
+        <w:rPr>
+          <w:color w:val="000000"/>
+        </w:rPr>
+        <w:t>-</w:t>
+      </w:r>
+      <w:r>
+        <w:rPr>
+          <w:color w:val="000000"/>
+        </w:rPr>
+        <w:t>optimal solution with a design variable that is significantly different from the MILP</w:t>
+      </w:r>
+      <w:r>
+        <w:rPr>
+          <w:color w:val="000000"/>
+        </w:rPr>
+        <w:t>:</w:t>
+      </w:r>
+      <w:r>
+        <w:rPr>
+          <w:color w:val="000000"/>
+        </w:rPr>
+        <w:t xml:space="preserve"> </w:t>
+      </w:r>
+      <w:r>
+        <w:rPr>
+          <w:color w:val="000000"/>
+        </w:rPr>
+        <w:t xml:space="preserve">62 kWh and 41 kWp for RL and 40 kWh and 103 kWp for </w:t>
+      </w:r>
+      <w:r>
+        <w:rPr>
+          <w:color w:val="000000"/>
+        </w:rPr>
+        <w:t>MILP for battery and PV</w:t>
+      </w:r>
+      <w:r>
+        <w:rPr>
+          <w:color w:val="000000"/>
+        </w:rPr>
         <w:t>,</w:t>
       </w:r>
       <w:r>
         <w:rPr>
           <w:color w:val="000000"/>
         </w:rPr>
+        <w:t xml:space="preserve"> respectively</w:t>
+      </w:r>
+      <w:r>
+        <w:rPr>
+          <w:color w:val="000000"/>
+        </w:rPr>
+        <w:t>, with the</w:t>
+      </w:r>
+      <w:r>
+        <w:rPr>
+          <w:color w:val="000000"/>
+        </w:rPr>
+        <w:t xml:space="preserve"> RL layout having 145.65% </w:t>
+      </w:r>
+      <w:r>
+        <w:rPr>
+          <w:color w:val="000000"/>
+        </w:rPr>
+        <w:t xml:space="preserve">of the </w:t>
+      </w:r>
+      <w:r>
+        <w:rPr>
+          <w:color w:val="000000"/>
+        </w:rPr>
+        <w:t>cost of MILP after considering th</w:t>
+      </w:r>
+      <w:r>
+        <w:rPr>
+          <w:color w:val="000000"/>
+        </w:rPr>
+        <w:t xml:space="preserve">e additional SOC calculations. </w:t>
+      </w:r>
+    </w:p>
+    <w:p>
+      <w:pPr>
+        <w:rPr>
+          <w:color w:val="000000"/>
+        </w:rPr>
+      </w:pPr>
+    </w:p>
+    <w:p>
+      <w:pPr>
+        <w:rPr>
+          <w:color w:val="000000"/>
+        </w:rPr>
+      </w:pPr>
+      <w:r>
+        <w:rPr>
+          <w:color w:val="000000"/>
+        </w:rPr>
+        <w:t xml:space="preserve">In the second stage of this study, </w:t>
+      </w:r>
+      <w:r>
+        <w:rPr>
+          <w:color w:val="000000"/>
+        </w:rPr>
+        <w:t xml:space="preserve">the </w:t>
+      </w:r>
+      <w:r>
+        <w:rPr>
+          <w:color w:val="000000"/>
+        </w:rPr>
+        <w:t>RL</w:t>
+      </w:r>
+      <w:r>
+        <w:rPr>
+          <w:color w:val="000000"/>
+        </w:rPr>
         <w:t xml:space="preserve"> </w:t>
       </w:r>
       <w:r>
         <w:rPr>
           <w:color w:val="000000"/>
         </w:rPr>
-        <w:t xml:space="preserve">which is the battery SOC </w:t>
+        <w:t>approach failed</w:t>
       </w:r>
       <w:r>
         <w:rPr>
           <w:color w:val="000000"/>
         </w:rPr>
-        <w:t>balance at the end</w:t>
+        <w:t xml:space="preserve"> to converge to the same cost value of MILP</w:t>
       </w:r>
       <w:r>
         <w:rPr>
           <w:color w:val="000000"/>
         </w:rPr>
-        <w:t xml:space="preserve"> that should be the same as the initial SOC state. </w:t>
+        <w:t xml:space="preserve"> under the fixed sizing scenario, with it being </w:t>
       </w:r>
       <w:r>
         <w:rPr>
           <w:color w:val="000000"/>
         </w:rPr>
-        <w:t xml:space="preserve">With this assumption being included in the calculation, the cost result of RL </w:t>
+        <w:t>12% more expensive</w:t>
       </w:r>
       <w:r>
         <w:rPr>
           <w:color w:val="000000"/>
         </w:rPr>
-        <w:t>drops,</w:t>
+        <w:t xml:space="preserve">. Under the joint operational and sizing decision optimization scenario, </w:t>
       </w:r>
       <w:r>
         <w:rPr>
           <w:color w:val="000000"/>
         </w:rPr>
+        <w:t xml:space="preserve">RL </w:t>
+      </w:r>
+      <w:r>
+        <w:rPr>
+          <w:color w:val="000000"/>
+        </w:rPr>
+        <w:t xml:space="preserve">ends up </w:t>
+      </w:r>
+      <w:r>
+        <w:rPr>
+          <w:color w:val="000000"/>
+        </w:rPr>
+        <w:t xml:space="preserve">having 22% more cost than MILP, while the design </w:t>
+      </w:r>
+      <w:r>
+        <w:rPr>
+          <w:color w:val="000000"/>
+        </w:rPr>
+        <w:t>decision</w:t>
+      </w:r>
+      <w:r>
+        <w:rPr>
+          <w:color w:val="000000"/>
+        </w:rPr>
+        <w:t>s</w:t>
+      </w:r>
+      <w:r>
+        <w:rPr>
+          <w:color w:val="000000"/>
+        </w:rPr>
+        <w:t xml:space="preserve"> are significantly smaller than MILP (44 kWh &amp; 57 kWp</w:t>
+      </w:r>
+      <w:r>
+        <w:rPr>
+          <w:color w:val="000000"/>
+        </w:rPr>
         <w:t xml:space="preserve"> </w:t>
       </w:r>
       <w:r>
         <w:rPr>
           <w:color w:val="000000"/>
         </w:rPr>
-        <w:t>and MILP prevails to become cheaper.</w:t>
+        <w:t xml:space="preserve">for </w:t>
       </w:r>
       <w:r>
         <w:rPr>
           <w:color w:val="000000"/>
         </w:rPr>
-        <w:t xml:space="preserve"> This shows </w:t>
-      </w:r>
-      <w:r>
-        <w:rPr>
-          <w:color w:val="000000"/>
-        </w:rPr>
-        <w:t>how important the modelling phase and identical assumption are for a fair comparison.</w:t>
-      </w:r>
-      <w:r>
-        <w:rPr>
-          <w:color w:val="000000"/>
-        </w:rPr>
-        <w:t xml:space="preserve"> </w:t>
-      </w:r>
-      <w:r>
-        <w:rPr>
-          <w:color w:val="000000"/>
-        </w:rPr>
-        <w:t xml:space="preserve">Interestingly, </w:t>
-      </w:r>
-      <w:r>
-        <w:rPr>
-          <w:color w:val="000000"/>
-        </w:rPr>
-        <w:t>the RL approach manages to converge to a near</w:t>
-      </w:r>
-      <w:r>
-        <w:rPr>
-          <w:color w:val="000000"/>
-        </w:rPr>
-        <w:t>-</w:t>
-      </w:r>
-      <w:r>
-        <w:rPr>
-          <w:color w:val="000000"/>
-        </w:rPr>
-        <w:t>optimal solution with a design variable that is significantly different from the MILP</w:t>
-      </w:r>
-      <w:r>
-        <w:rPr>
-          <w:color w:val="000000"/>
-        </w:rPr>
-        <w:t>:</w:t>
-      </w:r>
-      <w:r>
-        <w:rPr>
-          <w:color w:val="000000"/>
-        </w:rPr>
-        <w:t xml:space="preserve"> </w:t>
-      </w:r>
-      <w:r>
-        <w:rPr>
-          <w:color w:val="000000"/>
-        </w:rPr>
-        <w:t xml:space="preserve">62 kWh and 41 kWp for RL and 40 kWh and 103 kWp for </w:t>
-      </w:r>
-      <w:r>
-        <w:rPr>
-          <w:color w:val="000000"/>
-        </w:rPr>
-        <w:t>MILP for battery and PV</w:t>
-      </w:r>
-      <w:r>
-        <w:rPr>
-          <w:color w:val="000000"/>
-        </w:rPr>
-        <w:t>,</w:t>
-      </w:r>
-      <w:r>
-        <w:rPr>
-          <w:color w:val="000000"/>
-        </w:rPr>
-        <w:t xml:space="preserve"> respectively</w:t>
-      </w:r>
-      <w:r>
-        <w:rPr>
-          <w:color w:val="000000"/>
-        </w:rPr>
-        <w:t>, with the</w:t>
-      </w:r>
-      <w:r>
-        <w:rPr>
-          <w:color w:val="000000"/>
-        </w:rPr>
-        <w:t xml:space="preserve"> RL layout having 145.65% cost of MILP after considering th</w:t>
-      </w:r>
-      <w:r>
-        <w:rPr>
-          <w:color w:val="000000"/>
-        </w:rPr>
-        <w:t xml:space="preserve">e additional SOC calculations. </w:t>
-      </w:r>
-    </w:p>
-    <w:p>
-      <w:pPr>
-        <w:rPr>
-          <w:color w:val="000000"/>
-        </w:rPr>
-      </w:pPr>
-    </w:p>
-    <w:p>
-      <w:pPr>
-        <w:rPr>
-          <w:color w:val="000000"/>
-        </w:rPr>
-      </w:pPr>
-      <w:r>
-        <w:rPr>
-          <w:color w:val="000000"/>
-        </w:rPr>
-        <w:t xml:space="preserve">In the second stage of this study, </w:t>
-      </w:r>
-      <w:r>
-        <w:rPr>
-          <w:color w:val="000000"/>
-        </w:rPr>
-        <w:t xml:space="preserve">the </w:t>
-      </w:r>
-      <w:r>
-        <w:rPr>
-          <w:color w:val="000000"/>
-        </w:rPr>
-        <w:t>RL</w:t>
-      </w:r>
-      <w:r>
-        <w:rPr>
-          <w:color w:val="000000"/>
-        </w:rPr>
-        <w:t xml:space="preserve"> </w:t>
-      </w:r>
-      <w:r>
-        <w:rPr>
-          <w:color w:val="000000"/>
-        </w:rPr>
-        <w:t>approach failed</w:t>
-      </w:r>
-      <w:r>
-        <w:rPr>
-          <w:color w:val="000000"/>
-        </w:rPr>
-        <w:t xml:space="preserve"> to converge to the same cost value of MILP</w:t>
-      </w:r>
-      <w:r>
-        <w:rPr>
-          <w:color w:val="000000"/>
-        </w:rPr>
-        <w:t xml:space="preserve"> under the fixed sizing scenario, with it being </w:t>
-      </w:r>
-      <w:r>
-        <w:rPr>
-          <w:color w:val="000000"/>
-        </w:rPr>
-        <w:t>12% more expensive</w:t>
-      </w:r>
-      <w:r>
-        <w:rPr>
-          <w:color w:val="000000"/>
-        </w:rPr>
-        <w:t xml:space="preserve">. Under the joint operational and sizing decision optimization scenario, </w:t>
-      </w:r>
-      <w:r>
-        <w:rPr>
-          <w:color w:val="000000"/>
-        </w:rPr>
-        <w:t xml:space="preserve">RL </w:t>
-      </w:r>
-      <w:r>
-        <w:rPr>
-          <w:color w:val="000000"/>
-        </w:rPr>
-        <w:t xml:space="preserve">ends up </w:t>
-      </w:r>
-      <w:r>
-        <w:rPr>
-          <w:color w:val="000000"/>
-        </w:rPr>
-        <w:t xml:space="preserve">having 22% more cost than MILP, while the design </w:t>
-      </w:r>
-      <w:r>
-        <w:rPr>
-          <w:color w:val="000000"/>
-        </w:rPr>
-        <w:t>decision</w:t>
-      </w:r>
-      <w:r>
-        <w:rPr>
-          <w:color w:val="000000"/>
-        </w:rPr>
-        <w:t>s</w:t>
-      </w:r>
-      <w:r>
-        <w:rPr>
-          <w:color w:val="000000"/>
-        </w:rPr>
-        <w:t xml:space="preserve"> are significantly smaller than MILP (44 kWh &amp; 57 kWp</w:t>
-      </w:r>
-      <w:r>
-        <w:rPr>
-          <w:color w:val="000000"/>
-        </w:rPr>
-        <w:t xml:space="preserve"> RL and </w:t>
+        <w:t xml:space="preserve">RL and </w:t>
       </w:r>
       <w:r>
         <w:rPr>
@@ -14186,14 +14293,14 @@
         <w:rPr>
           <w:color w:val="000000"/>
         </w:rPr>
-        <w:t xml:space="preserve"> This result also shows that PPO could maintain consistent performance across discrete and continuous action spaces while achieving it with less than one second of execution time. Another </w:t>
+        <w:t xml:space="preserve"> This result also shows that PPO could maintain consistent performance across discrete and continuous action spaces while achieving it with less than one second of execution time. Another study compared four RL algorithms: PPO, A2C, SAC, TD3 for a battery power plant control </w:t>
       </w:r>
       <w:r>
         <w:rPr>
           <w:color w:val="000000"/>
         </w:rPr>
         <w:lastRenderedPageBreak/>
-        <w:t xml:space="preserve">study compared four RL algorithms: PPO, A2C, SAC, TD3 for a battery power plant control problem and demonstrated TD3 superior results among the RL algorithms and outperformed MILP by 5% in cost savings </w:t>
+        <w:t xml:space="preserve">problem and demonstrated TD3 superior results among the RL algorithms and outperformed MILP by 5% in cost savings </w:t>
       </w:r>
       <w:sdt>
         <w:sdtPr>
@@ -14231,13 +14338,93 @@
         <w:rPr>
           <w:color w:val="000000"/>
         </w:rPr>
-        <w:t xml:space="preserve">In a study on optimizing renewables penetration in modern smart grids, a comparative analysis was conducted between rule-based, MILP, and DRL algorithms (DDPG, PPO, SAC). The result demonstrated SAC superiority in delivering the best results, reducing operational costs by 20%, achieving 92.8 % renewable application, while minimizing loss-of-load probability. From diving deep into the literature, it is possible to argue that many RL strategies are </w:t>
+        <w:t>In a study on optimizing renewables penetration in modern smart grids, a comparative analysis was conducted between rule-based, MILP, and DRL algorithms (DDPG, PPO, SAC). The result demonstrated SAC superiority in delivering the best results, reducing operational costs by 20%, achieving 92.8 % renewable application, while minimizing loss-of-load probability</w:t>
       </w:r>
       <w:r>
         <w:rPr>
           <w:color w:val="000000"/>
         </w:rPr>
-        <w:t xml:space="preserve">already competitive with MILP even some better, however, this highly dependent on the system complexity and uncertainty assumption. </w:t>
+        <w:t xml:space="preserve"> </w:t>
+      </w:r>
+      <w:sdt>
+        <w:sdtPr>
+          <w:rPr>
+            <w:color w:val="000000"/>
+          </w:rPr>
+          <w:tag w:val="MENDELEY_CITATION_v3_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"/>
+          <w:id w:val="1209227495"/>
+          <w:placeholder>
+            <w:docPart w:val="DefaultPlaceholder_-1854013440"/>
+          </w:placeholder>
+        </w:sdtPr>
+        <w:sdtContent>
+          <w:r>
+            <w:rPr>
+              <w:color w:val="000000"/>
+            </w:rPr>
+            <w:t>[62]</w:t>
+          </w:r>
+        </w:sdtContent>
+      </w:sdt>
+      <w:r>
+        <w:rPr>
+          <w:color w:val="000000"/>
+        </w:rPr>
+        <w:t xml:space="preserve">. </w:t>
+      </w:r>
+      <w:r>
+        <w:rPr>
+          <w:color w:val="000000"/>
+        </w:rPr>
+        <w:t>By</w:t>
+      </w:r>
+      <w:r>
+        <w:rPr>
+          <w:color w:val="000000"/>
+        </w:rPr>
+        <w:t xml:space="preserve"> diving deep into the literature, it is possible to argue that many RL strategies are </w:t>
+      </w:r>
+      <w:r>
+        <w:rPr>
+          <w:color w:val="000000"/>
+        </w:rPr>
+        <w:t>already competitive with MILP</w:t>
+      </w:r>
+      <w:r>
+        <w:rPr>
+          <w:color w:val="000000"/>
+        </w:rPr>
+        <w:t>, or</w:t>
+      </w:r>
+      <w:r>
+        <w:rPr>
+          <w:color w:val="000000"/>
+        </w:rPr>
+        <w:t xml:space="preserve"> even some better</w:t>
+      </w:r>
+      <w:r>
+        <w:rPr>
+          <w:color w:val="000000"/>
+        </w:rPr>
+        <w:t>;</w:t>
+      </w:r>
+      <w:r>
+        <w:rPr>
+          <w:color w:val="000000"/>
+        </w:rPr>
+        <w:t xml:space="preserve"> however, this </w:t>
+      </w:r>
+      <w:r>
+        <w:rPr>
+          <w:color w:val="000000"/>
+        </w:rPr>
+        <w:t xml:space="preserve">is </w:t>
+      </w:r>
+      <w:r>
+        <w:rPr>
+          <w:color w:val="000000"/>
+        </w:rPr>
+        <w:t xml:space="preserve">highly dependent on the system complexity and uncertainty assumption. </w:t>
       </w:r>
     </w:p>
     <w:p>
@@ -23242,6 +23429,7 @@
     <w:rsid w:val="003A41B9"/>
     <w:rsid w:val="004A039B"/>
     <w:rsid w:val="004A3857"/>
+    <w:rsid w:val="004B36BD"/>
     <w:rsid w:val="0056319B"/>
     <w:rsid w:val="00567653"/>
     <w:rsid w:val="005A2D59"/>
@@ -24122,7 +24310,7 @@
   <we:properties>
     <we:property name="MENDELEY_BIBLIOGRAPHY_IS_DIRTY" value="true"/>
     <we:property name="MENDELEY_BIBLIOGRAPHY_LAST_MODIFIED" value="1784919424295"/>
-    <we:property name="MENDELEY_CITATIONS" value="[{&quot;citationID&quot;:&quot;MENDELEY_CITATION_9a69a8b0-b116-4a8e-be9e-ca9faac00dd4&quot;,&quot;properties&quot;:{&quot;noteIndex&quot;:0},&quot;isEdited&quot;:false,&quot;manualOverride&quot;:{&quot;isManuallyOverridden&quot;:false,&quot;citeprocText&quot;:&quot;[1]&quot;,&quot;manualOverrideText&quot;:&quot;&quot;},&quot;citationTag&quot;:&quot;MENDELEY_CITATION_v3_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&quot;,&quot;citationItems&quot;:[{&quot;id&quot;:&quot;9f54496b-fc3d-3546-b057-55b552d0253d&quot;,&quot;itemData&quot;:{&quot;type&quot;:&quot;article-journal&quot;,&quot;id&quot;:&quot;9f54496b-fc3d-3546-b057-55b552d0253d&quot;,&quot;title&quot;:&quot;Hard-to-Abate Sectors: The role of industrial carbon capture and storage (CCS) in emission mitigation&quot;,&quot;author&quot;:[{&quot;family&quot;:&quot;Paltsev&quot;,&quot;given&quot;:&quot;Sergey&quot;,&quot;parse-names&quot;:false,&quot;dropping-particle&quot;:&quot;&quot;,&quot;non-dropping-particle&quot;:&quot;&quot;},{&quot;family&quot;:&quot;Morris&quot;,&quot;given&quot;:&quot;Jennifer&quot;,&quot;parse-names&quot;:false,&quot;dropping-particle&quot;:&quot;&quot;,&quot;non-dropping-particle&quot;:&quot;&quot;},{&quot;family&quot;:&quot;Kheshgi&quot;,&quot;given&quot;:&quot;Haroon&quot;,&quot;parse-names&quot;:false,&quot;dropping-particle&quot;:&quot;&quot;,&quot;non-dropping-particle&quot;:&quot;&quot;},{&quot;family&quot;:&quot;Herzog&quot;,&quot;given&quot;:&quot;Howard&quot;,&quot;parse-names&quot;:false,&quot;dropping-particle&quot;:&quot;&quot;,&quot;non-dropping-particle&quot;:&quot;&quot;}],&quot;container-title&quot;:&quot;Applied Energy&quot;,&quot;DOI&quot;:&quot;10.1016/j.apenergy.2021.117322&quot;,&quot;ISSN&quot;:&quot;03062619&quot;,&quot;issued&quot;:{&quot;date-parts&quot;:[[2021,10]]},&quot;page&quot;:&quot;117322&quot;,&quot;volume&quot;:&quot;300&quot;,&quot;container-title-short&quot;:&quot;Appl. Energy&quot;},&quot;isTemporary&quot;:false}]},{&quot;citationID&quot;:&quot;MENDELEY_CITATION_8d7bd39f-5014-4a97-bce1-d22efa7dbd0b&quot;,&quot;properties&quot;:{&quot;noteIndex&quot;:0},&quot;isEdited&quot;:false,&quot;manualOverride&quot;:{&quot;isManuallyOverridden&quot;:false,&quot;citeprocText&quot;:&quot;[2]&quot;,&quot;manualOverrideText&quot;:&quot;&quot;},&quot;citationTag&quot;:&quot;MENDELEY_CITATION_v3_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&quot;,&quot;citationItems&quot;:[{&quot;id&quot;:&quot;956a38fa-e422-3333-a9ab-81f96dae1644&quot;,&quot;itemData&quot;:{&quot;type&quot;:&quot;article-journal&quot;,&quot;id&quot;:&quot;956a38fa-e422-3333-a9ab-81f96dae1644&quot;,&quot;title&quot;:&quot;Decarbonizing Hard-to-Abate Sectors with Renewable Hydrogen: A Real Case Application to the Ceramics Industry&quot;,&quot;author&quot;:[{&quot;family&quot;:&quot;Sousa&quot;,&quot;given&quot;:&quot;Jorge&quot;,&quot;parse-names&quot;:false,&quot;dropping-particle&quot;:&quot;&quot;,&quot;non-dropping-particle&quot;:&quot;&quot;},{&quot;family&quot;:&quot;Azevedo&quot;,&quot;given&quot;:&quot;Inês&quot;,&quot;parse-names&quot;:false,&quot;dropping-particle&quot;:&quot;&quot;,&quot;non-dropping-particle&quot;:&quot;&quot;},{&quot;family&quot;:&quot;Camus&quot;,&quot;given&quot;:&quot;Cristina&quot;,&quot;parse-names&quot;:false,&quot;dropping-particle&quot;:&quot;&quot;,&quot;non-dropping-particle&quot;:&quot;&quot;},{&quot;family&quot;:&quot;Mendes&quot;,&quot;given&quot;:&quot;Luís&quot;,&quot;parse-names&quot;:false,&quot;dropping-particle&quot;:&quot;&quot;,&quot;non-dropping-particle&quot;:&quot;&quot;},{&quot;family&quot;:&quot;Viveiros&quot;,&quot;given&quot;:&quot;Carla&quot;,&quot;parse-names&quot;:false,&quot;dropping-particle&quot;:&quot;&quot;,&quot;non-dropping-particle&quot;:&quot;&quot;},{&quot;family&quot;:&quot;Barata&quot;,&quot;given&quot;:&quot;Filipe&quot;,&quot;parse-names&quot;:false,&quot;dropping-particle&quot;:&quot;&quot;,&quot;non-dropping-particle&quot;:&quot;&quot;}],&quot;container-title&quot;:&quot;Energies&quot;,&quot;DOI&quot;:&quot;10.3390/en17153661&quot;,&quot;ISSN&quot;:&quot;1996-1073&quot;,&quot;issued&quot;:{&quot;date-parts&quot;:[[2024,7,25]]},&quot;page&quot;:&quot;3661&quot;,&quot;abstract&quot;:&quot;&lt;p&gt;Hydrogen produced from renewable energy sources is a valuable energy carrier for linking growing renewable electricity generation with the hard-to-abate sectors, such as cement, steel, glass, chemical, and ceramics industries. In this context, this paper presents a new model of hydrogen production based on solar photovoltaics and wind energy with application to a real-world ceramics factory. For this task, a novel multipurpose profit-maximizing model is implemented using GAMS. The developed model explores hydrogen production with multiple value streams that enable technical and economical informed decisions under specific scenarios. Our results show that it is profitable to sell the hydrogen produced to the gas grid rather than using it for self-consumption for low-gas-price scenarios. On the other hand, when the price of gas is significantly high, it is more profitable to use as much hydrogen as possible for self-consumption to supply the factory and reduce the internal use of natural gas. The role of electricity self-consumption has proven to be key for the project’s profitability as, without this revenue stream, the project would not be profitable in any analysed scenario.&lt;/p&gt;&quot;,&quot;issue&quot;:&quot;15&quot;,&quot;volume&quot;:&quot;17&quot;,&quot;container-title-short&quot;:&quot;Energies (Basel).&quot;},&quot;isTemporary&quot;:false}]},{&quot;citationID&quot;:&quot;MENDELEY_CITATION_cc9a11a7-48e8-4bcd-9601-05385ccebf02&quot;,&quot;properties&quot;:{&quot;noteIndex&quot;:0},&quot;isEdited&quot;:false,&quot;manualOverride&quot;:{&quot;isManuallyOverridden&quot;:false,&quot;citeprocText&quot;:&quot;[3]&quot;,&quot;manualOverrideText&quot;:&quot;&quot;},&quot;citationTag&quot;:&quot;MENDELEY_CITATION_v3_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&quot;,&quot;citationItems&quot;:[{&quot;id&quot;:&quot;66781a91-8ce9-38c0-8b80-b0de4bdb3cc9&quot;,&quot;itemData&quot;:{&quot;type&quot;:&quot;article-journal&quot;,&quot;id&quot;:&quot;66781a91-8ce9-38c0-8b80-b0de4bdb3cc9&quot;,&quot;title&quot;:&quot;From green hydrogen to electricity: A review on recent advances, challenges, and opportunities on power-to-hydrogen-to-power systems&quot;,&quot;author&quot;:[{&quot;family&quot;:&quot;Risco-Bravo&quot;,&quot;given&quot;:&quot;A.&quot;,&quot;parse-names&quot;:false,&quot;dropping-particle&quot;:&quot;&quot;,&quot;non-dropping-particle&quot;:&quot;&quot;},{&quot;family&quot;:&quot;Varela&quot;,&quot;given&quot;:&quot;C.&quot;,&quot;parse-names&quot;:false,&quot;dropping-particle&quot;:&quot;&quot;,&quot;non-dropping-particle&quot;:&quot;&quot;},{&quot;family&quot;:&quot;Bartels&quot;,&quot;given&quot;:&quot;J.&quot;,&quot;parse-names&quot;:false,&quot;dropping-particle&quot;:&quot;&quot;,&quot;non-dropping-particle&quot;:&quot;&quot;},{&quot;family&quot;:&quot;Zondervan&quot;,&quot;given&quot;:&quot;E.&quot;,&quot;parse-names&quot;:false,&quot;dropping-particle&quot;:&quot;&quot;,&quot;non-dropping-particle&quot;:&quot;&quot;}],&quot;container-title&quot;:&quot;Renewable and Sustainable Energy Reviews&quot;,&quot;DOI&quot;:&quot;10.1016/j.rser.2023.113930&quot;,&quot;ISSN&quot;:&quot;13640321&quot;,&quot;issued&quot;:{&quot;date-parts&quot;:[[2024,1]]},&quot;page&quot;:&quot;113930&quot;,&quot;volume&quot;:&quot;189&quot;,&quot;container-title-short&quot;:&quot;&quot;},&quot;isTemporary&quot;:false}]},{&quot;citationID&quot;:&quot;MENDELEY_CITATION_10ebcc1d-9e7d-475c-9706-140f1e237e74&quot;,&quot;properties&quot;:{&quot;noteIndex&quot;:0},&quot;isEdited&quot;:false,&quot;manualOverride&quot;:{&quot;isManuallyOverridden&quot;:false,&quot;citeprocText&quot;:&quot;[4]&quot;,&quot;manualOverrideText&quot;:&quot;&quot;},&quot;citationTag&quot;:&quot;MENDELEY_CITATION_v3_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&quot;,&quot;citationItems&quot;:[{&quot;id&quot;:&quot;d00ceab6-c269-3d86-a58b-dd8be99f154b&quot;,&quot;itemData&quot;:{&quot;type&quot;:&quot;article-journal&quot;,&quot;id&quot;:&quot;d00ceab6-c269-3d86-a58b-dd8be99f154b&quot;,&quot;title&quot;:&quot;A comprehensive review of optimizing hybrid renewable energy system using optimization techniques&quot;,&quot;author&quot;:[{&quot;family&quot;:&quot;Yao&quot;,&quot;given&quot;:&quot;Ye&quot;,&quot;parse-names&quot;:false,&quot;dropping-particle&quot;:&quot;&quot;,&quot;non-dropping-particle&quot;:&quot;&quot;},{&quot;family&quot;:&quot;Wang&quot;,&quot;given&quot;:&quot;Zhen&quot;,&quot;parse-names&quot;:false,&quot;dropping-particle&quot;:&quot;&quot;,&quot;non-dropping-particle&quot;:&quot;&quot;},{&quot;family&quot;:&quot;Ma&quot;,&quot;given&quot;:&quot;Chao&quot;,&quot;parse-names&quot;:false,&quot;dropping-particle&quot;:&quot;&quot;,&quot;non-dropping-particle&quot;:&quot;&quot;},{&quot;family&quot;:&quot;Liu&quot;,&quot;given&quot;:&quot;Mengmeng&quot;,&quot;parse-names&quot;:false,&quot;dropping-particle&quot;:&quot;&quot;,&quot;non-dropping-particle&quot;:&quot;&quot;},{&quot;family&quot;:&quot;Qi&quot;,&quot;given&quot;:&quot;Wenchao&quot;,&quot;parse-names&quot;:false,&quot;dropping-particle&quot;:&quot;&quot;,&quot;non-dropping-particle&quot;:&quot;&quot;},{&quot;family&quot;:&quot;Yang&quot;,&quot;given&quot;:&quot;Xiuwei&quot;,&quot;parse-names&quot;:false,&quot;dropping-particle&quot;:&quot;&quot;,&quot;non-dropping-particle&quot;:&quot;&quot;},{&quot;family&quot;:&quot;Gao&quot;,&quot;given&quot;:&quot;Xifeng&quot;,&quot;parse-names&quot;:false,&quot;dropping-particle&quot;:&quot;&quot;,&quot;non-dropping-particle&quot;:&quot;&quot;},{&quot;family&quot;:&quot;Liu&quot;,&quot;given&quot;:&quot;Yingzhou&quot;,&quot;parse-names&quot;:false,&quot;dropping-particle&quot;:&quot;&quot;,&quot;non-dropping-particle&quot;:&quot;&quot;},{&quot;family&quot;:&quot;Lian&quot;,&quot;given&quot;:&quot;Jijian&quot;,&quot;parse-names&quot;:false,&quot;dropping-particle&quot;:&quot;&quot;,&quot;non-dropping-particle&quot;:&quot;&quot;},{&quot;family&quot;:&quot;Wang&quot;,&quot;given&quot;:&quot;Haolin&quot;,&quot;parse-names&quot;:false,&quot;dropping-particle&quot;:&quot;&quot;,&quot;non-dropping-particle&quot;:&quot;&quot;}],&quot;container-title&quot;:&quot;Engineering Science and Technology, an International Journal&quot;,&quot;DOI&quot;:&quot;10.1016/j.jestch.2026.102384&quot;,&quot;ISSN&quot;:&quot;22150986&quot;,&quot;issued&quot;:{&quot;date-parts&quot;:[[2026,6]]},&quot;page&quot;:&quot;102384&quot;,&quot;volume&quot;:&quot;78&quot;,&quot;container-title-short&quot;:&quot;&quot;},&quot;isTemporary&quot;:false}]},{&quot;citationID&quot;:&quot;MENDELEY_CITATION_883842a3-a21f-4bfa-9084-5059522ad981&quot;,&quot;properties&quot;:{&quot;noteIndex&quot;:0},&quot;isEdited&quot;:false,&quot;manualOverride&quot;:{&quot;isManuallyOverridden&quot;:false,&quot;citeprocText&quot;:&quot;[5]&quot;,&quot;manualOverrideText&quot;:&quot;&quot;},&quot;citationTag&quot;:&quot;MENDELEY_CITATION_v3_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&quot;,&quot;citationItems&quot;:[{&quot;id&quot;:&quot;37e1e1c6-a2f3-3486-92e6-469dc2e4adc9&quot;,&quot;itemData&quot;:{&quot;type&quot;:&quot;article-journal&quot;,&quot;id&quot;:&quot;37e1e1c6-a2f3-3486-92e6-469dc2e4adc9&quot;,&quot;title&quot;:&quot;Energy Demand Response in a Food-Processing Plant: A Deep Reinforcement Learning Approach&quot;,&quot;author&quot;:[{&quot;family&quot;:&quot;Wohlgenannt&quot;,&quot;given&quot;:&quot;Philipp&quot;,&quot;parse-names&quot;:false,&quot;dropping-particle&quot;:&quot;&quot;,&quot;non-dropping-particle&quot;:&quot;&quot;},{&quot;family&quot;:&quot;Hegenbart&quot;,&quot;given&quot;:&quot;Sebastian&quot;,&quot;parse-names&quot;:false,&quot;dropping-particle&quot;:&quot;&quot;,&quot;non-dropping-particle&quot;:&quot;&quot;},{&quot;family&quot;:&quot;Eder&quot;,&quot;given&quot;:&quot;Elias&quot;,&quot;parse-names&quot;:false,&quot;dropping-particle&quot;:&quot;&quot;,&quot;non-dropping-particle&quot;:&quot;&quot;},{&quot;family&quot;:&quot;Kolhe&quot;,&quot;given&quot;:&quot;Mohan&quot;,&quot;parse-names&quot;:false,&quot;dropping-particle&quot;:&quot;&quot;,&quot;non-dropping-particle&quot;:&quot;&quot;},{&quot;family&quot;:&quot;Kepplinger&quot;,&quot;given&quot;:&quot;Peter&quot;,&quot;parse-names&quot;:false,&quot;dropping-particle&quot;:&quot;&quot;,&quot;non-dropping-particle&quot;:&quot;&quot;}],&quot;container-title&quot;:&quot;Energies&quot;,&quot;container-title-short&quot;:&quot;Energies (Basel).&quot;,&quot;DOI&quot;:&quot;10.3390/en17246430&quot;,&quot;ISSN&quot;:&quot;1996-1073&quot;,&quot;issued&quot;:{&quot;date-parts&quot;:[[2024,12,20]]},&quot;page&quot;:&quot;6430&quot;,&quot;abstract&quot;:&quot;&lt;p&gt;The food industry faces significant challenges in managing operational costs due to its high energy intensity and rising energy prices. Industrial food-processing facilities, with substantial thermal capacities and large demands for cooling and heating, offer promising opportunities for demand response (DR) strategies. This study explores the application of deep reinforcement learning (RL) as an innovative, data-driven approach for DR in the food industry. By leveraging the adaptive, self-learning capabilities of RL, energy costs in the investigated plant are effectively decreased. The RL algorithm was compared with the well-established optimization method Mixed Integer Linear Programming (MILP), and both were benchmarked against a reference scenario without DR. The two optimization strategies demonstrate cost savings of 17.57% and 18.65% for RL and MILP, respectively. Although RL is slightly less efficient in cost reduction, it significantly outperforms in computational speed, being approximately 20 times faster. During operation, RL only needs 2ms per optimization compared to 19s for MILP, making it a promising optimization tool for edge computing. Moreover, while MILP’s computation time increases considerably with the number of binary variables, RL efficiently learns dynamic system behavior and scales to more complex systems without significant performance degradation. These results highlight that deep RL, when applied to DR, offers substantial cost savings and computational efficiency, with broad applicability to energy management in various applications.&lt;/p&gt;&quot;,&quot;issue&quot;:&quot;24&quot;,&quot;volume&quot;:&quot;17&quot;},&quot;isTemporary&quot;:false}]},{&quot;citationID&quot;:&quot;MENDELEY_CITATION_d7370189-8bad-428a-bf96-f6e0b77e7bf5&quot;,&quot;properties&quot;:{&quot;noteIndex&quot;:0},&quot;isEdited&quot;:false,&quot;manualOverride&quot;:{&quot;isManuallyOverridden&quot;:false,&quot;citeprocText&quot;:&quot;[6]&quot;,&quot;manualOverrideText&quot;:&quot;&quot;},&quot;citationTag&quot;:&quot;MENDELEY_CITATION_v3_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&quot;,&quot;citationItems&quot;:[{&quot;id&quot;:&quot;f01623cd-5b09-3de7-90db-88f6efe9d97e&quot;,&quot;itemData&quot;:{&quot;type&quot;:&quot;article-journal&quot;,&quot;id&quot;:&quot;f01623cd-5b09-3de7-90db-88f6efe9d97e&quot;,&quot;title&quot;:&quot;Optimization of energy supply systems by MILP branch and bound method in consideration of hierarchical relationship between design and operation&quot;,&quot;author&quot;:[{&quot;family&quot;:&quot;Yokoyama&quot;,&quot;given&quot;:&quot;Ryohei&quot;,&quot;parse-names&quot;:false,&quot;dropping-particle&quot;:&quot;&quot;,&quot;non-dropping-particle&quot;:&quot;&quot;},{&quot;family&quot;:&quot;Shinano&quot;,&quot;given&quot;:&quot;Yuji&quot;,&quot;parse-names&quot;:false,&quot;dropping-particle&quot;:&quot;&quot;,&quot;non-dropping-particle&quot;:&quot;&quot;},{&quot;family&quot;:&quot;Taniguchi&quot;,&quot;given&quot;:&quot;Syusuke&quot;,&quot;parse-names&quot;:false,&quot;dropping-particle&quot;:&quot;&quot;,&quot;non-dropping-particle&quot;:&quot;&quot;},{&quot;family&quot;:&quot;Ohkura&quot;,&quot;given&quot;:&quot;Masashi&quot;,&quot;parse-names&quot;:false,&quot;dropping-particle&quot;:&quot;&quot;,&quot;non-dropping-particle&quot;:&quot;&quot;},{&quot;family&quot;:&quot;Wakui&quot;,&quot;given&quot;:&quot;Tetsuya&quot;,&quot;parse-names&quot;:false,&quot;dropping-particle&quot;:&quot;&quot;,&quot;non-dropping-particle&quot;:&quot;&quot;}],&quot;container-title&quot;:&quot;Energy Conversion and Management&quot;,&quot;DOI&quot;:&quot;10.1016/j.enconman.2014.12.020&quot;,&quot;ISSN&quot;:&quot;01968904&quot;,&quot;issued&quot;:{&quot;date-parts&quot;:[[2015,3]]},&quot;page&quot;:&quot;92-104&quot;,&quot;volume&quot;:&quot;92&quot;,&quot;container-title-short&quot;:&quot;Energy Convers. Manag.&quot;},&quot;isTemporary&quot;:false}]},{&quot;citationID&quot;:&quot;MENDELEY_CITATION_25f810e2-1387-4860-bc8b-20e968f8adf0&quot;,&quot;properties&quot;:{&quot;noteIndex&quot;:0},&quot;isEdited&quot;:false,&quot;manualOverride&quot;:{&quot;isManuallyOverridden&quot;:false,&quot;citeprocText&quot;:&quot;[7]&quot;,&quot;manualOverrideText&quot;:&quot;&quot;},&quot;citationTag&quot;:&quot;MENDELEY_CITATION_v3_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&quot;,&quot;citationItems&quot;:[{&quot;id&quot;:&quot;85308694-191e-34ed-aa20-9e1aa6f08e43&quot;,&quot;itemData&quot;:{&quot;type&quot;:&quot;article-journal&quot;,&quot;id&quot;:&quot;85308694-191e-34ed-aa20-9e1aa6f08e43&quot;,&quot;title&quot;:&quot;Reinforcement Learning Techniques in Optimizing Energy Systems&quot;,&quot;author&quot;:[{&quot;family&quot;:&quot;Stavrev&quot;,&quot;given&quot;:&quot;Stefan&quot;,&quot;parse-names&quot;:false,&quot;dropping-particle&quot;:&quot;&quot;,&quot;non-dropping-particle&quot;:&quot;&quot;},{&quot;family&quot;:&quot;Ginchev&quot;,&quot;given&quot;:&quot;Dimitar&quot;,&quot;parse-names&quot;:false,&quot;dropping-particle&quot;:&quot;&quot;,&quot;non-dropping-particle&quot;:&quot;&quot;}],&quot;container-title&quot;:&quot;Electronics&quot;,&quot;DOI&quot;:&quot;10.3390/electronics13081459&quot;,&quot;ISSN&quot;:&quot;2079-9292&quot;,&quot;issued&quot;:{&quot;date-parts&quot;:[[2024,4,12]]},&quot;page&quot;:&quot;1459&quot;,&quot;abstract&quot;:&quot;&lt;p&gt;Reinforcement learning (RL) techniques have emerged as powerful tools for optimizing energy systems, offering the potential to enhance efficiency, reliability, and sustainability. This review paper provides a comprehensive examination of the applications of RL in the field of energy system optimization, spanning various domains such as energy management, grid control, and renewable energy integration. Beginning with an overview of RL fundamentals, the paper explores recent advancements in RL algorithms and their adaptation to address the unique challenges of energy system optimization. Case studies and real-world applications demonstrate the efficacy of RL-based approaches in improving energy efficiency, reducing costs, and mitigating environmental impacts. Furthermore, the paper discusses future directions and challenges, including scalability, interpretability, and integration with domain knowledge. By synthesizing the latest research findings and identifying key areas for further investigation, this paper aims to inform and inspire future research endeavors in the intersection of reinforcement learning and energy system optimization.&lt;/p&gt;&quot;,&quot;issue&quot;:&quot;8&quot;,&quot;volume&quot;:&quot;13&quot;,&quot;container-title-short&quot;:&quot;Electronics (Basel).&quot;},&quot;isTemporary&quot;:false}]},{&quot;citationID&quot;:&quot;MENDELEY_CITATION_51c152f6-c4bd-46c0-a730-f4779c171221&quot;,&quot;properties&quot;:{&quot;noteIndex&quot;:0},&quot;isEdited&quot;:false,&quot;manualOverride&quot;:{&quot;isManuallyOverridden&quot;:false,&quot;citeprocText&quot;:&quot;[8]&quot;,&quot;manualOverrideText&quot;:&quot;&quot;},&quot;citationTag&quot;:&quot;MENDELEY_CITATION_v3_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&quot;,&quot;citationItems&quot;:[{&quot;id&quot;:&quot;19ead3b7-e80b-3f24-a3e3-22a038f3385c&quot;,&quot;itemData&quot;:{&quot;type&quot;:&quot;article-journal&quot;,&quot;id&quot;:&quot;19ead3b7-e80b-3f24-a3e3-22a038f3385c&quot;,&quot;title&quot;:&quot;LCA and exergy-economic evaluation of a biogas-to-fuels system using CO2 hydrogenation and exhaust gas recycling&quot;,&quot;author&quot;:[{&quot;family&quot;:&quot;Ghiasirad&quot;,&quot;given&quot;:&quot;Hamed&quot;,&quot;parse-names&quot;:false,&quot;dropping-particle&quot;:&quot;&quot;,&quot;non-dropping-particle&quot;:&quot;&quot;},{&quot;family&quot;:&quot;Ebrahimian&quot;,&quot;given&quot;:&quot;Farinaz&quot;,&quot;parse-names&quot;:false,&quot;dropping-particle&quot;:&quot;&quot;,&quot;non-dropping-particle&quot;:&quot;&quot;},{&quot;family&quot;:&quot;Gholizadeh&quot;,&quot;given&quot;:&quot;Towhid&quot;,&quot;parse-names&quot;:false,&quot;dropping-particle&quot;:&quot;&quot;,&quot;non-dropping-particle&quot;:&quot;&quot;},{&quot;family&quot;:&quot;Mohammadi&quot;,&quot;given&quot;:&quot;Ali&quot;,&quot;parse-names&quot;:false,&quot;dropping-particle&quot;:&quot;&quot;,&quot;non-dropping-particle&quot;:&quot;&quot;},{&quot;family&quot;:&quot;Mirmasoumi&quot;,&quot;given&quot;:&quot;Siamak&quot;,&quot;parse-names&quot;:false,&quot;dropping-particle&quot;:&quot;&quot;,&quot;non-dropping-particle&quot;:&quot;&quot;},{&quot;family&quot;:&quot;Saray&quot;,&quot;given&quot;:&quot;Rahim Khoshbakhti&quot;,&quot;parse-names&quot;:false,&quot;dropping-particle&quot;:&quot;&quot;,&quot;non-dropping-particle&quot;:&quot;&quot;},{&quot;family&quot;:&quot;Skorek-Osikowska&quot;,&quot;given&quot;:&quot;Anna&quot;,&quot;parse-names&quot;:false,&quot;dropping-particle&quot;:&quot;&quot;,&quot;non-dropping-particle&quot;:&quot;&quot;}],&quot;container-title&quot;:&quot;Energy Conversion and Management: X&quot;,&quot;DOI&quot;:&quot;10.1016/j.ecmx.2025.100897&quot;,&quot;ISSN&quot;:&quot;25901745&quot;,&quot;issued&quot;:{&quot;date-parts&quot;:[[2025,4]]},&quot;page&quot;:&quot;100897&quot;,&quot;volume&quot;:&quot;26&quot;,&quot;container-title-short&quot;:&quot;&quot;},&quot;isTemporary&quot;:false}]},{&quot;citationID&quot;:&quot;MENDELEY_CITATION_105cda64-5b6c-464e-beda-2ca75d02300e&quot;,&quot;properties&quot;:{&quot;noteIndex&quot;:0},&quot;isEdited&quot;:false,&quot;manualOverride&quot;:{&quot;isManuallyOverridden&quot;:false,&quot;citeprocText&quot;:&quot;[9]&quot;,&quot;manualOverrideText&quot;:&quot;&quot;},&quot;citationTag&quot;:&quot;MENDELEY_CITATION_v3_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&quot;,&quot;citationItems&quot;:[{&quot;id&quot;:&quot;56e0ce24-6bd0-3ca6-ad59-9e041fc06482&quot;,&quot;itemData&quot;:{&quot;type&quot;:&quot;article-journal&quot;,&quot;id&quot;:&quot;56e0ce24-6bd0-3ca6-ad59-9e041fc06482&quot;,&quot;title&quot;:&quot;Syngas biomethanation: state‐of‐the‐art review and perspectives&quot;,&quot;author&quot;:[{&quot;family&quot;:&quot;Grimalt‐Alemany&quot;,&quot;given&quot;:&quot;Antonio&quot;,&quot;parse-names&quot;:false,&quot;dropping-particle&quot;:&quot;&quot;,&quot;non-dropping-particle&quot;:&quot;&quot;},{&quot;family&quot;:&quot;Skiadas&quot;,&quot;given&quot;:&quot;Ioannis&quot;,&quot;parse-names&quot;:false,&quot;dropping-particle&quot;:&quot;V.&quot;,&quot;non-dropping-particle&quot;:&quot;&quot;},{&quot;family&quot;:&quot;Gavala&quot;,&quot;given&quot;:&quot;Hariklia N.&quot;,&quot;parse-names&quot;:false,&quot;dropping-particle&quot;:&quot;&quot;,&quot;non-dropping-particle&quot;:&quot;&quot;}],&quot;container-title&quot;:&quot;Biofuels, Bioproducts and Biorefining&quot;,&quot;DOI&quot;:&quot;10.1002/bbb.1826&quot;,&quot;ISSN&quot;:&quot;1932-104X&quot;,&quot;issued&quot;:{&quot;date-parts&quot;:[[2018,1,10]]},&quot;page&quot;:&quot;139-158&quot;,&quot;abstract&quot;:&quot;&lt;p&gt;Significant research efforts are currently being made worldwide to develop more efficient biomethane production processes from a variety of waste streams. The biomethanation of biomass‐derived syngas can contribute to increasing the potential of methane production as it opens the way for the conversion of recalcitrant biomasses, generally not fully exploitable by anaerobic digestion systems. Additionally, this biological process presents several advantages over its analogous process of catalytic methanation such as the use of inexpensive biocatalysts, milder operational conditions, higher tolerance to the impurities of syngas, and higher product selectivity. However, there are still several challenges to be addressed for this technology to reach commercial stage. This work reviews the progress made over the last few years in syngas biomethanation processes in order to provide an overview of the current state of the art of this technology. The most relevant aspects determining the performance of syngas biomethanation processes are extensively discussed here, including microbial diversity and metabolic interactions in mixed microbial consortia, the influence of operating parameters and bioreactor designs, and the potential of modelling as a tool for the design and control of this bioprocess. © 2017 Society of Chemical Industry and John Wiley &amp;amp; Sons, Ltd&lt;/p&gt;&quot;,&quot;issue&quot;:&quot;1&quot;,&quot;volume&quot;:&quot;12&quot;,&quot;container-title-short&quot;:&quot;&quot;},&quot;isTemporary&quot;:false}]},{&quot;citationID&quot;:&quot;MENDELEY_CITATION_790cd8fb-1a04-4124-9aa6-1645a459196b&quot;,&quot;properties&quot;:{&quot;noteIndex&quot;:0},&quot;isEdited&quot;:false,&quot;manualOverride&quot;:{&quot;isManuallyOverridden&quot;:false,&quot;citeprocText&quot;:&quot;[9], [10]&quot;,&quot;manualOverrideText&quot;:&quot;&quot;},&quot;citationTag&quot;:&quot;MENDELEY_CITATION_v3_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&quot;,&quot;citationItems&quot;:[{&quot;id&quot;:&quot;aa2feb8d-c9bd-3781-bba9-d18156ecd3e8&quot;,&quot;itemData&quot;:{&quot;type&quot;:&quot;article-journal&quot;,&quot;id&quot;:&quot;aa2feb8d-c9bd-3781-bba9-d18156ecd3e8&quot;,&quot;title&quot;:&quot;Alternative sustainable routes to methanol production: Techno-economic and environmental assessment&quot;,&quot;author&quot;:[{&quot;family&quot;:&quot;Scomazzon&quot;,&quot;given&quot;:&quot;Marco&quot;,&quot;parse-names&quot;:false,&quot;dropping-particle&quot;:&quot;&quot;,&quot;non-dropping-particle&quot;:&quot;&quot;},{&quot;family&quot;:&quot;Barbera&quot;,&quot;given&quot;:&quot;Elena&quot;,&quot;parse-names&quot;:false,&quot;dropping-particle&quot;:&quot;&quot;,&quot;non-dropping-particle&quot;:&quot;&quot;},{&quot;family&quot;:&quot;Bezzo&quot;,&quot;given&quot;:&quot;Fabrizio&quot;,&quot;parse-names&quot;:false,&quot;dropping-particle&quot;:&quot;&quot;,&quot;non-dropping-particle&quot;:&quot;&quot;}],&quot;container-title&quot;:&quot;Journal of Environmental Chemical Engineering&quot;,&quot;DOI&quot;:&quot;10.1016/j.jece.2024.112674&quot;,&quot;ISSN&quot;:&quot;22133437&quot;,&quot;issued&quot;:{&quot;date-parts&quot;:[[2024,6]]},&quot;page&quot;:&quot;112674&quot;,&quot;issue&quot;:&quot;3&quot;,&quot;volume&quot;:&quot;12&quot;,&quot;container-title-short&quot;:&quot;J. Environ. Chem. Eng.&quot;},&quot;isTemporary&quot;:false},{&quot;id&quot;:&quot;56e0ce24-6bd0-3ca6-ad59-9e041fc06482&quot;,&quot;itemData&quot;:{&quot;type&quot;:&quot;article-journal&quot;,&quot;id&quot;:&quot;56e0ce24-6bd0-3ca6-ad59-9e041fc06482&quot;,&quot;title&quot;:&quot;Syngas biomethanation: state‐of‐the‐art review and perspectives&quot;,&quot;author&quot;:[{&quot;family&quot;:&quot;Grimalt‐Alemany&quot;,&quot;given&quot;:&quot;Antonio&quot;,&quot;parse-names&quot;:false,&quot;dropping-particle&quot;:&quot;&quot;,&quot;non-dropping-particle&quot;:&quot;&quot;},{&quot;family&quot;:&quot;Skiadas&quot;,&quot;given&quot;:&quot;Ioannis&quot;,&quot;parse-names&quot;:false,&quot;dropping-particle&quot;:&quot;V.&quot;,&quot;non-dropping-particle&quot;:&quot;&quot;},{&quot;family&quot;:&quot;Gavala&quot;,&quot;given&quot;:&quot;Hariklia N.&quot;,&quot;parse-names&quot;:false,&quot;dropping-particle&quot;:&quot;&quot;,&quot;non-dropping-particle&quot;:&quot;&quot;}],&quot;container-title&quot;:&quot;Biofuels, Bioproducts and Biorefining&quot;,&quot;DOI&quot;:&quot;10.1002/bbb.1826&quot;,&quot;ISSN&quot;:&quot;1932-104X&quot;,&quot;issued&quot;:{&quot;date-parts&quot;:[[2018,1,10]]},&quot;page&quot;:&quot;139-158&quot;,&quot;abstract&quot;:&quot;&lt;p&gt;Significant research efforts are currently being made worldwide to develop more efficient biomethane production processes from a variety of waste streams. The biomethanation of biomass‐derived syngas can contribute to increasing the potential of methane production as it opens the way for the conversion of recalcitrant biomasses, generally not fully exploitable by anaerobic digestion systems. Additionally, this biological process presents several advantages over its analogous process of catalytic methanation such as the use of inexpensive biocatalysts, milder operational conditions, higher tolerance to the impurities of syngas, and higher product selectivity. However, there are still several challenges to be addressed for this technology to reach commercial stage. This work reviews the progress made over the last few years in syngas biomethanation processes in order to provide an overview of the current state of the art of this technology. The most relevant aspects determining the performance of syngas biomethanation processes are extensively discussed here, including microbial diversity and metabolic interactions in mixed microbial consortia, the influence of operating parameters and bioreactor designs, and the potential of modelling as a tool for the design and control of this bioprocess. © 2017 Society of Chemical Industry and John Wiley &amp;amp; Sons, Ltd&lt;/p&gt;&quot;,&quot;issue&quot;:&quot;1&quot;,&quot;volume&quot;:&quot;12&quot;,&quot;container-title-short&quot;:&quot;&quot;},&quot;isTemporary&quot;:false}]},{&quot;citationID&quot;:&quot;MENDELEY_CITATION_b4c44ef8-e2c2-413d-b321-be21b9ddc9bc&quot;,&quot;properties&quot;:{&quot;noteIndex&quot;:0},&quot;isEdited&quot;:false,&quot;manualOverride&quot;:{&quot;isManuallyOverridden&quot;:false,&quot;citeprocText&quot;:&quot;[9]&quot;,&quot;manualOverrideText&quot;:&quot;&quot;},&quot;citationTag&quot;:&quot;MENDELEY_CITATION_v3_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&quot;,&quot;citationItems&quot;:[{&quot;id&quot;:&quot;56e0ce24-6bd0-3ca6-ad59-9e041fc06482&quot;,&quot;itemData&quot;:{&quot;type&quot;:&quot;article-journal&quot;,&quot;id&quot;:&quot;56e0ce24-6bd0-3ca6-ad59-9e041fc06482&quot;,&quot;title&quot;:&quot;Syngas biomethanation: state‐of‐the‐art review and perspectives&quot;,&quot;author&quot;:[{&quot;family&quot;:&quot;Grimalt‐Alemany&quot;,&quot;given&quot;:&quot;Antonio&quot;,&quot;parse-names&quot;:false,&quot;dropping-particle&quot;:&quot;&quot;,&quot;non-dropping-particle&quot;:&quot;&quot;},{&quot;family&quot;:&quot;Skiadas&quot;,&quot;given&quot;:&quot;Ioannis&quot;,&quot;parse-names&quot;:false,&quot;dropping-particle&quot;:&quot;V.&quot;,&quot;non-dropping-particle&quot;:&quot;&quot;},{&quot;family&quot;:&quot;Gavala&quot;,&quot;given&quot;:&quot;Hariklia N.&quot;,&quot;parse-names&quot;:false,&quot;dropping-particle&quot;:&quot;&quot;,&quot;non-dropping-particle&quot;:&quot;&quot;}],&quot;container-title&quot;:&quot;Biofuels, Bioproducts and Biorefining&quot;,&quot;DOI&quot;:&quot;10.1002/bbb.1826&quot;,&quot;ISSN&quot;:&quot;1932-104X&quot;,&quot;issued&quot;:{&quot;date-parts&quot;:[[2018,1,10]]},&quot;page&quot;:&quot;139-158&quot;,&quot;abstract&quot;:&quot;&lt;p&gt;Significant research efforts are currently being made worldwide to develop more efficient biomethane production processes from a variety of waste streams. The biomethanation of biomass‐derived syngas can contribute to increasing the potential of methane production as it opens the way for the conversion of recalcitrant biomasses, generally not fully exploitable by anaerobic digestion systems. Additionally, this biological process presents several advantages over its analogous process of catalytic methanation such as the use of inexpensive biocatalysts, milder operational conditions, higher tolerance to the impurities of syngas, and higher product selectivity. However, there are still several challenges to be addressed for this technology to reach commercial stage. This work reviews the progress made over the last few years in syngas biomethanation processes in order to provide an overview of the current state of the art of this technology. The most relevant aspects determining the performance of syngas biomethanation processes are extensively discussed here, including microbial diversity and metabolic interactions in mixed microbial consortia, the influence of operating parameters and bioreactor designs, and the potential of modelling as a tool for the design and control of this bioprocess. © 2017 Society of Chemical Industry and John Wiley &amp;amp; Sons, Ltd&lt;/p&gt;&quot;,&quot;issue&quot;:&quot;1&quot;,&quot;volume&quot;:&quot;12&quot;,&quot;container-title-short&quot;:&quot;&quot;},&quot;isTemporary&quot;:false}]},{&quot;citationID&quot;:&quot;MENDELEY_CITATION_ff939063-8c0e-47e0-8f2f-be64fc1a6c11&quot;,&quot;properties&quot;:{&quot;noteIndex&quot;:0},&quot;isEdited&quot;:false,&quot;manualOverride&quot;:{&quot;isManuallyOverridden&quot;:false,&quot;citeprocText&quot;:&quot;[9], [11]&quot;,&quot;manualOverrideText&quot;:&quot;&quot;},&quot;citationTag&quot;:&quot;MENDELEY_CITATION_v3_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&quot;,&quot;citationItems&quot;:[{&quot;id&quot;:&quot;05ccdcdc-ca9b-3b81-a51a-6f8632295c3c&quot;,&quot;itemData&quot;:{&quot;type&quot;:&quot;article-journal&quot;,&quot;id&quot;:&quot;05ccdcdc-ca9b-3b81-a51a-6f8632295c3c&quot;,&quot;title&quot;:&quot;Techno-economic-environmental assessment of the integration of power-to-X and biogas utilization towards the production of electricity, hydrogen, methane and methanol&quot;,&quot;author&quot;:[{&quot;family&quot;:&quot;Moioli&quot;,&quot;given&quot;:&quot;Emanuele&quot;,&quot;parse-names&quot;:false,&quot;dropping-particle&quot;:&quot;&quot;,&quot;non-dropping-particle&quot;:&quot;&quot;},{&quot;family&quot;:&quot;Schildhauer&quot;,&quot;given&quot;:&quot;Tilman&quot;,&quot;parse-names&quot;:false,&quot;dropping-particle&quot;:&quot;&quot;,&quot;non-dropping-particle&quot;:&quot;&quot;}],&quot;container-title&quot;:&quot;Sustainable Energy &amp; Fuels&quot;,&quot;DOI&quot;:&quot;10.1039/D3SE00052D&quot;,&quot;ISSN&quot;:&quot;2398-4902&quot;,&quot;issued&quot;:{&quot;date-parts&quot;:[[2023]]},&quot;page&quot;:&quot;2690-2706&quot;,&quot;abstract&quot;:&quot;&lt;p&gt;Various routes for the valorisation of biogas towards methane and methanol and for electricity or hydrogen storage is assessed.&lt;/p&gt;&quot;,&quot;issue&quot;:&quot;11&quot;,&quot;volume&quot;:&quot;7&quot;,&quot;container-title-short&quot;:&quot;Sustain. Energy Fuels&quot;},&quot;isTemporary&quot;:false},{&quot;id&quot;:&quot;56e0ce24-6bd0-3ca6-ad59-9e041fc06482&quot;,&quot;itemData&quot;:{&quot;type&quot;:&quot;article-journal&quot;,&quot;id&quot;:&quot;56e0ce24-6bd0-3ca6-ad59-9e041fc06482&quot;,&quot;title&quot;:&quot;Syngas biomethanation: state‐of‐the‐art review and perspectives&quot;,&quot;author&quot;:[{&quot;family&quot;:&quot;Grimalt‐Alemany&quot;,&quot;given&quot;:&quot;Antonio&quot;,&quot;parse-names&quot;:false,&quot;dropping-particle&quot;:&quot;&quot;,&quot;non-dropping-particle&quot;:&quot;&quot;},{&quot;family&quot;:&quot;Skiadas&quot;,&quot;given&quot;:&quot;Ioannis&quot;,&quot;parse-names&quot;:false,&quot;dropping-particle&quot;:&quot;V.&quot;,&quot;non-dropping-particle&quot;:&quot;&quot;},{&quot;family&quot;:&quot;Gavala&quot;,&quot;given&quot;:&quot;Hariklia N.&quot;,&quot;parse-names&quot;:false,&quot;dropping-particle&quot;:&quot;&quot;,&quot;non-dropping-particle&quot;:&quot;&quot;}],&quot;container-title&quot;:&quot;Biofuels, Bioproducts and Biorefining&quot;,&quot;DOI&quot;:&quot;10.1002/bbb.1826&quot;,&quot;ISSN&quot;:&quot;1932-104X&quot;,&quot;issued&quot;:{&quot;date-parts&quot;:[[2018,1,10]]},&quot;page&quot;:&quot;139-158&quot;,&quot;abstract&quot;:&quot;&lt;p&gt;Significant research efforts are currently being made worldwide to develop more efficient biomethane production processes from a variety of waste streams. The biomethanation of biomass‐derived syngas can contribute to increasing the potential of methane production as it opens the way for the conversion of recalcitrant biomasses, generally not fully exploitable by anaerobic digestion systems. Additionally, this biological process presents several advantages over its analogous process of catalytic methanation such as the use of inexpensive biocatalysts, milder operational conditions, higher tolerance to the impurities of syngas, and higher product selectivity. However, there are still several challenges to be addressed for this technology to reach commercial stage. This work reviews the progress made over the last few years in syngas biomethanation processes in order to provide an overview of the current state of the art of this technology. The most relevant aspects determining the performance of syngas biomethanation processes are extensively discussed here, including microbial diversity and metabolic interactions in mixed microbial consortia, the influence of operating parameters and bioreactor designs, and the potential of modelling as a tool for the design and control of this bioprocess. © 2017 Society of Chemical Industry and John Wiley &amp;amp; Sons, Ltd&lt;/p&gt;&quot;,&quot;issue&quot;:&quot;1&quot;,&quot;volume&quot;:&quot;12&quot;,&quot;container-title-short&quot;:&quot;&quot;},&quot;isTemporary&quot;:false}]},{&quot;citationID&quot;:&quot;MENDELEY_CITATION_df48a702-88dc-4563-926b-cf46720d5673&quot;,&quot;properties&quot;:{&quot;noteIndex&quot;:0},&quot;isEdited&quot;:false,&quot;manualOverride&quot;:{&quot;isManuallyOverridden&quot;:false,&quot;citeprocText&quot;:&quot;[10]&quot;,&quot;manualOverrideText&quot;:&quot;&quot;},&quot;citationTag&quot;:&quot;MENDELEY_CITATION_v3_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&quot;,&quot;citationItems&quot;:[{&quot;id&quot;:&quot;aa2feb8d-c9bd-3781-bba9-d18156ecd3e8&quot;,&quot;itemData&quot;:{&quot;type&quot;:&quot;article-journal&quot;,&quot;id&quot;:&quot;aa2feb8d-c9bd-3781-bba9-d18156ecd3e8&quot;,&quot;title&quot;:&quot;Alternative sustainable routes to methanol production: Techno-economic and environmental assessment&quot;,&quot;author&quot;:[{&quot;family&quot;:&quot;Scomazzon&quot;,&quot;given&quot;:&quot;Marco&quot;,&quot;parse-names&quot;:false,&quot;dropping-particle&quot;:&quot;&quot;,&quot;non-dropping-particle&quot;:&quot;&quot;},{&quot;family&quot;:&quot;Barbera&quot;,&quot;given&quot;:&quot;Elena&quot;,&quot;parse-names&quot;:false,&quot;dropping-particle&quot;:&quot;&quot;,&quot;non-dropping-particle&quot;:&quot;&quot;},{&quot;family&quot;:&quot;Bezzo&quot;,&quot;given&quot;:&quot;Fabrizio&quot;,&quot;parse-names&quot;:false,&quot;dropping-particle&quot;:&quot;&quot;,&quot;non-dropping-particle&quot;:&quot;&quot;}],&quot;container-title&quot;:&quot;Journal of Environmental Chemical Engineering&quot;,&quot;DOI&quot;:&quot;10.1016/j.jece.2024.112674&quot;,&quot;ISSN&quot;:&quot;22133437&quot;,&quot;issued&quot;:{&quot;date-parts&quot;:[[2024,6]]},&quot;page&quot;:&quot;112674&quot;,&quot;issue&quot;:&quot;3&quot;,&quot;volume&quot;:&quot;12&quot;,&quot;container-title-short&quot;:&quot;J. Environ. Chem. Eng.&quot;},&quot;isTemporary&quot;:false}]},{&quot;citationID&quot;:&quot;MENDELEY_CITATION_8eef8f75-1f87-4dff-a071-68987bdeee67&quot;,&quot;properties&quot;:{&quot;noteIndex&quot;:0},&quot;isEdited&quot;:false,&quot;manualOverride&quot;:{&quot;isManuallyOverridden&quot;:false,&quot;citeprocText&quot;:&quot;[10]&quot;,&quot;manualOverrideText&quot;:&quot;&quot;},&quot;citationTag&quot;:&quot;MENDELEY_CITATION_v3_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&quot;,&quot;citationItems&quot;:[{&quot;id&quot;:&quot;aa2feb8d-c9bd-3781-bba9-d18156ecd3e8&quot;,&quot;itemData&quot;:{&quot;type&quot;:&quot;article-journal&quot;,&quot;id&quot;:&quot;aa2feb8d-c9bd-3781-bba9-d18156ecd3e8&quot;,&quot;title&quot;:&quot;Alternative sustainable routes to methanol production: Techno-economic and environmental assessment&quot;,&quot;author&quot;:[{&quot;family&quot;:&quot;Scomazzon&quot;,&quot;given&quot;:&quot;Marco&quot;,&quot;parse-names&quot;:false,&quot;dropping-particle&quot;:&quot;&quot;,&quot;non-dropping-particle&quot;:&quot;&quot;},{&quot;family&quot;:&quot;Barbera&quot;,&quot;given&quot;:&quot;Elena&quot;,&quot;parse-names&quot;:false,&quot;dropping-particle&quot;:&quot;&quot;,&quot;non-dropping-particle&quot;:&quot;&quot;},{&quot;family&quot;:&quot;Bezzo&quot;,&quot;given&quot;:&quot;Fabrizio&quot;,&quot;parse-names&quot;:false,&quot;dropping-particle&quot;:&quot;&quot;,&quot;non-dropping-particle&quot;:&quot;&quot;}],&quot;container-title&quot;:&quot;Journal of Environmental Chemical Engineering&quot;,&quot;DOI&quot;:&quot;10.1016/j.jece.2024.112674&quot;,&quot;ISSN&quot;:&quot;22133437&quot;,&quot;issued&quot;:{&quot;date-parts&quot;:[[2024,6]]},&quot;page&quot;:&quot;112674&quot;,&quot;issue&quot;:&quot;3&quot;,&quot;volume&quot;:&quot;12&quot;,&quot;container-title-short&quot;:&quot;J. Environ. Chem. Eng.&quot;},&quot;isTemporary&quot;:false}]},{&quot;citationID&quot;:&quot;MENDELEY_CITATION_8a70196d-3ff9-41c8-be39-fcf525822331&quot;,&quot;properties&quot;:{&quot;noteIndex&quot;:0},&quot;isEdited&quot;:false,&quot;manualOverride&quot;:{&quot;isManuallyOverridden&quot;:false,&quot;citeprocText&quot;:&quot;[12]&quot;,&quot;manualOverrideText&quot;:&quot;&quot;},&quot;citationTag&quot;:&quot;MENDELEY_CITATION_v3_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&quot;,&quot;citationItems&quot;:[{&quot;id&quot;:&quot;1310fab5-b88a-3b52-8d94-488c61413bed&quot;,&quot;itemData&quot;:{&quot;type&quot;:&quot;article-journal&quot;,&quot;id&quot;:&quot;1310fab5-b88a-3b52-8d94-488c61413bed&quot;,&quot;title&quot;:&quot;Techno-economic evaluation of biomass-to-fuels with solid-oxide electrolyzer&quot;,&quot;author&quot;:[{&quot;family&quot;:&quot;Zhang&quot;,&quot;given&quot;:&quot;Hanfei&quot;,&quot;parse-names&quot;:false,&quot;dropping-particle&quot;:&quot;&quot;,&quot;non-dropping-particle&quot;:&quot;&quot;},{&quot;family&quot;:&quot;Wang&quot;,&quot;given&quot;:&quot;Ligang&quot;,&quot;parse-names&quot;:false,&quot;dropping-particle&quot;:&quot;&quot;,&quot;non-dropping-particle&quot;:&quot;&quot;},{&quot;family&quot;:&quot;herle&quot;,&quot;given&quot;:&quot;Jan&quot;,&quot;parse-names&quot;:false,&quot;dropping-particle&quot;:&quot;&quot;,&quot;non-dropping-particle&quot;:&quot;Van&quot;},{&quot;family&quot;:&quot;Maréchal&quot;,&quot;given&quot;:&quot;François&quot;,&quot;parse-names&quot;:false,&quot;dropping-particle&quot;:&quot;&quot;,&quot;non-dropping-particle&quot;:&quot;&quot;},{&quot;family&quot;:&quot;Desideri&quot;,&quot;given&quot;:&quot;Umberto&quot;,&quot;parse-names&quot;:false,&quot;dropping-particle&quot;:&quot;&quot;,&quot;non-dropping-particle&quot;:&quot;&quot;}],&quot;container-title&quot;:&quot;Applied Energy&quot;,&quot;DOI&quot;:&quot;10.1016/j.apenergy.2020.115113&quot;,&quot;ISSN&quot;:&quot;03062619&quot;,&quot;issued&quot;:{&quot;date-parts&quot;:[[2020,7]]},&quot;page&quot;:&quot;115113&quot;,&quot;volume&quot;:&quot;270&quot;,&quot;container-title-short&quot;:&quot;Appl. Energy&quot;},&quot;isTemporary&quot;:false}]},{&quot;citationID&quot;:&quot;MENDELEY_CITATION_13304e8f-750e-4a08-8b1d-6a0f67b53a03&quot;,&quot;properties&quot;:{&quot;noteIndex&quot;:0},&quot;isEdited&quot;:false,&quot;manualOverride&quot;:{&quot;isManuallyOverridden&quot;:false,&quot;citeprocText&quot;:&quot;[13]&quot;,&quot;manualOverrideText&quot;:&quot;&quot;},&quot;citationTag&quot;:&quot;MENDELEY_CITATION_v3_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&quot;,&quot;citationItems&quot;:[{&quot;id&quot;:&quot;190b1267-cffd-3b0f-acfd-1ca4b15c3e7b&quot;,&quot;itemData&quot;:{&quot;type&quot;:&quot;article-journal&quot;,&quot;id&quot;:&quot;190b1267-cffd-3b0f-acfd-1ca4b15c3e7b&quot;,&quot;title&quot;:&quot;Techno-economic assessment of the impact of electrolysis technology on power-to-methanol processes&quot;,&quot;author&quot;:[{&quot;family&quot;:&quot;Walther&quot;,&quot;given&quot;:&quot;Aniko&quot;,&quot;parse-names&quot;:false,&quot;dropping-particle&quot;:&quot;&quot;,&quot;non-dropping-particle&quot;:&quot;&quot;},{&quot;family&quot;:&quot;Löning&quot;,&quot;given&quot;:&quot;Kai&quot;,&quot;parse-names&quot;:false,&quot;dropping-particle&quot;:&quot;&quot;,&quot;non-dropping-particle&quot;:&quot;&quot;},{&quot;family&quot;:&quot;Reichelt&quot;,&quot;given&quot;:&quot;Erik&quot;,&quot;parse-names&quot;:false,&quot;dropping-particle&quot;:&quot;&quot;,&quot;non-dropping-particle&quot;:&quot;&quot;}],&quot;container-title&quot;:&quot;International Journal of Hydrogen Energy&quot;,&quot;DOI&quot;:&quot;10.1016/j.ijhydene.2026.153394&quot;,&quot;ISSN&quot;:&quot;03603199&quot;,&quot;issued&quot;:{&quot;date-parts&quot;:[[2026,2]]},&quot;page&quot;:&quot;153394&quot;,&quot;volume&quot;:&quot;206&quot;,&quot;container-title-short&quot;:&quot;Int. J. Hydrogen Energy&quot;},&quot;isTemporary&quot;:false}]},{&quot;citationID&quot;:&quot;MENDELEY_CITATION_6a736241-62e6-4de8-9385-e50fe6f3ae30&quot;,&quot;properties&quot;:{&quot;noteIndex&quot;:0},&quot;isEdited&quot;:false,&quot;manualOverride&quot;:{&quot;isManuallyOverridden&quot;:false,&quot;citeprocText&quot;:&quot;[14], [15], [16]&quot;,&quot;manualOverrideText&quot;:&quot;&quot;},&quot;citationTag&quot;:&quot;MENDELEY_CITATION_v3_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&quot;,&quot;citationItems&quot;:[{&quot;id&quot;:&quot;d24a77c3-65ad-3302-bdd5-2971e96b5fe6&quot;,&quot;itemData&quot;:{&quot;type&quot;:&quot;article-journal&quot;,&quot;id&quot;:&quot;d24a77c3-65ad-3302-bdd5-2971e96b5fe6&quot;,&quot;title&quot;:&quot;Alkaline Water Electrolysis Powered by Renewable Energy: A Review&quot;,&quot;author&quot;:[{&quot;family&quot;:&quot;Brauns&quot;,&quot;given&quot;:&quot;Jörn&quot;,&quot;parse-names&quot;:false,&quot;dropping-particle&quot;:&quot;&quot;,&quot;non-dropping-particle&quot;:&quot;&quot;},{&quot;family&quot;:&quot;Turek&quot;,&quot;given&quot;:&quot;Thomas&quot;,&quot;parse-names&quot;:false,&quot;dropping-particle&quot;:&quot;&quot;,&quot;non-dropping-particle&quot;:&quot;&quot;}],&quot;container-title&quot;:&quot;Processes&quot;,&quot;DOI&quot;:&quot;10.3390/pr8020248&quot;,&quot;ISSN&quot;:&quot;2227-9717&quot;,&quot;issued&quot;:{&quot;date-parts&quot;:[[2020,2,21]]},&quot;page&quot;:&quot;248&quot;,&quot;abstract&quot;:&quot;&lt;p&gt;Alkaline water electrolysis is a key technology for large-scale hydrogen production powered by renewable energy. As conventional electrolyzers are designed for operation at fixed process conditions, the implementation of fluctuating and highly intermittent renewable energy is challenging. This contribution shows the recent state of system descriptions for alkaline water electrolysis and renewable energies, such as solar and wind power. Each component of a hydrogen energy system needs to be optimized to increase the operation time and system efficiency. Only in this way can hydrogen produced by electrolysis processes be competitive with the conventional path based on fossil energy sources. Conventional alkaline water electrolyzers show a limited part-load range due to an increased gas impurity at low power availability. As explosive mixtures of hydrogen and oxygen must be prevented, a safety shutdown is performed when reaching specific gas contamination. Furthermore, the cell voltage should be optimized to maintain a high efficiency. While photovoltaic panels can be directly coupled to alkaline water electrolyzers, wind turbines require suitable converters with additional losses. By combining alkaline water electrolysis with hydrogen storage tanks and fuel cells, power grid stabilization can be performed. As a consequence, the conventional spinning reserve can be reduced, which additionally lowers the carbon dioxide emissions.&lt;/p&gt;&quot;,&quot;issue&quot;:&quot;2&quot;,&quot;volume&quot;:&quot;8&quot;,&quot;container-title-short&quot;:&quot;&quot;},&quot;isTemporary&quot;:false},{&quot;id&quot;:&quot;fb305ddc-d308-30ab-8f80-782b0f32ba1c&quot;,&quot;itemData&quot;:{&quot;type&quot;:&quot;article-journal&quot;,&quot;id&quot;:&quot;fb305ddc-d308-30ab-8f80-782b0f32ba1c&quot;,&quot;title&quot;:&quot;Electrofuels for the transport sector: A review of production costs&quot;,&quot;author&quot;:[{&quot;family&quot;:&quot;Brynolf&quot;,&quot;given&quot;:&quot;Selma&quot;,&quot;parse-names&quot;:false,&quot;dropping-particle&quot;:&quot;&quot;,&quot;non-dropping-particle&quot;:&quot;&quot;},{&quot;family&quot;:&quot;Taljegard&quot;,&quot;given&quot;:&quot;Maria&quot;,&quot;parse-names&quot;:false,&quot;dropping-particle&quot;:&quot;&quot;,&quot;non-dropping-particle&quot;:&quot;&quot;},{&quot;family&quot;:&quot;Grahn&quot;,&quot;given&quot;:&quot;Maria&quot;,&quot;parse-names&quot;:false,&quot;dropping-particle&quot;:&quot;&quot;,&quot;non-dropping-particle&quot;:&quot;&quot;},{&quot;family&quot;:&quot;Hansson&quot;,&quot;given&quot;:&quot;Julia&quot;,&quot;parse-names&quot;:false,&quot;dropping-particle&quot;:&quot;&quot;,&quot;non-dropping-particle&quot;:&quot;&quot;}],&quot;container-title&quot;:&quot;Renewable and Sustainable Energy Reviews&quot;,&quot;DOI&quot;:&quot;10.1016/j.rser.2017.05.288&quot;,&quot;ISSN&quot;:&quot;13640321&quot;,&quot;issued&quot;:{&quot;date-parts&quot;:[[2018,1]]},&quot;page&quot;:&quot;1887-1905&quot;,&quot;volume&quot;:&quot;81&quot;,&quot;container-title-short&quot;:&quot;&quot;},&quot;isTemporary&quot;:false},{&quot;id&quot;:&quot;1b5f443a-d989-3c31-80b4-27044204c02c&quot;,&quot;itemData&quot;:{&quot;type&quot;:&quot;article-journal&quot;,&quot;id&quot;:&quot;1b5f443a-d989-3c31-80b4-27044204c02c&quot;,&quot;title&quot;:&quot;Hydrogen production by PEM water electrolysis – A review&quot;,&quot;author&quot;:[{&quot;family&quot;:&quot;Shiva Kumar&quot;,&quot;given&quot;:&quot;S.&quot;,&quot;parse-names&quot;:false,&quot;dropping-particle&quot;:&quot;&quot;,&quot;non-dropping-particle&quot;:&quot;&quot;},{&quot;family&quot;:&quot;Himabindu&quot;,&quot;given&quot;:&quot;V.&quot;,&quot;parse-names&quot;:false,&quot;dropping-particle&quot;:&quot;&quot;,&quot;non-dropping-particle&quot;:&quot;&quot;}],&quot;container-title&quot;:&quot;Materials Science for Energy Technologies&quot;,&quot;DOI&quot;:&quot;10.1016/j.mset.2019.03.002&quot;,&quot;ISSN&quot;:&quot;25892991&quot;,&quot;issued&quot;:{&quot;date-parts&quot;:[[2019,12]]},&quot;page&quot;:&quot;442-454&quot;,&quot;issue&quot;:&quot;3&quot;,&quot;volume&quot;:&quot;2&quot;,&quot;container-title-short&quot;:&quot;Mater. Sci. Energy Technol.&quot;},&quot;isTemporary&quot;:false}]},{&quot;citationID&quot;:&quot;MENDELEY_CITATION_e23df023-1b0e-4c7d-a81a-d4f5c2bec620&quot;,&quot;properties&quot;:{&quot;noteIndex&quot;:0},&quot;isEdited&quot;:false,&quot;manualOverride&quot;:{&quot;isManuallyOverridden&quot;:false,&quot;citeprocText&quot;:&quot;[17]&quot;,&quot;manualOverrideText&quot;:&quot;&quot;},&quot;citationTag&quot;:&quot;MENDELEY_CITATION_v3_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&quot;,&quot;citationItems&quot;:[{&quot;id&quot;:&quot;8c3b2930-cd0d-331a-8923-1e74c3142273&quot;,&quot;itemData&quot;:{&quot;type&quot;:&quot;article-journal&quot;,&quot;id&quot;:&quot;8c3b2930-cd0d-331a-8923-1e74c3142273&quot;,&quot;title&quot;:&quot;LCA and exergy-economic evaluation of a biogas-to-fuels system using CO2 hydrogenation and exhaust gas recycling&quot;,&quot;author&quot;:[{&quot;family&quot;:&quot;Ghiasirad&quot;,&quot;given&quot;:&quot;Hamed&quot;,&quot;parse-names&quot;:false,&quot;dropping-particle&quot;:&quot;&quot;,&quot;non-dropping-particle&quot;:&quot;&quot;},{&quot;family&quot;:&quot;Ebrahimian&quot;,&quot;given&quot;:&quot;Farinaz&quot;,&quot;parse-names&quot;:false,&quot;dropping-particle&quot;:&quot;&quot;,&quot;non-dropping-particle&quot;:&quot;&quot;},{&quot;family&quot;:&quot;Gholizadeh&quot;,&quot;given&quot;:&quot;Towhid&quot;,&quot;parse-names&quot;:false,&quot;dropping-particle&quot;:&quot;&quot;,&quot;non-dropping-particle&quot;:&quot;&quot;},{&quot;family&quot;:&quot;Mohammadi&quot;,&quot;given&quot;:&quot;Ali&quot;,&quot;parse-names&quot;:false,&quot;dropping-particle&quot;:&quot;&quot;,&quot;non-dropping-particle&quot;:&quot;&quot;},{&quot;family&quot;:&quot;Mirmasoumi&quot;,&quot;given&quot;:&quot;Siamak&quot;,&quot;parse-names&quot;:false,&quot;dropping-particle&quot;:&quot;&quot;,&quot;non-dropping-particle&quot;:&quot;&quot;},{&quot;family&quot;:&quot;Saray&quot;,&quot;given&quot;:&quot;Rahim Khoshbakhti&quot;,&quot;parse-names&quot;:false,&quot;dropping-particle&quot;:&quot;&quot;,&quot;non-dropping-particle&quot;:&quot;&quot;},{&quot;family&quot;:&quot;Skorek-Osikowska&quot;,&quot;given&quot;:&quot;Anna&quot;,&quot;parse-names&quot;:false,&quot;dropping-particle&quot;:&quot;&quot;,&quot;non-dropping-particle&quot;:&quot;&quot;}],&quot;container-title&quot;:&quot;Energy Conversion and Management: X&quot;,&quot;DOI&quot;:&quot;10.1016/j.ecmx.2025.100897&quot;,&quot;ISSN&quot;:&quot;25901745&quot;,&quot;issued&quot;:{&quot;date-parts&quot;:[[2025,4]]},&quot;page&quot;:&quot;100897&quot;,&quot;volume&quot;:&quot;26&quot;,&quot;container-title-short&quot;:&quot;&quot;},&quot;isTemporary&quot;:false}]},{&quot;citationID&quot;:&quot;MENDELEY_CITATION_f5902acf-3f1b-4f47-a295-09ff9652d7b2&quot;,&quot;properties&quot;:{&quot;noteIndex&quot;:0},&quot;isEdited&quot;:false,&quot;manualOverride&quot;:{&quot;isManuallyOverridden&quot;:false,&quot;citeprocText&quot;:&quot;[18]&quot;,&quot;manualOverrideText&quot;:&quot;&quot;},&quot;citationTag&quot;:&quot;MENDELEY_CITATION_v3_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&quot;,&quot;citationItems&quot;:[{&quot;id&quot;:&quot;cb817469-f165-3488-91d4-ffe692974354&quot;,&quot;itemData&quot;:{&quot;type&quot;:&quot;article-journal&quot;,&quot;id&quot;:&quot;cb817469-f165-3488-91d4-ffe692974354&quot;,&quot;title&quot;:&quot;Alternative sustainable routes to methanol production: Techno-economic and environmental assessment&quot;,&quot;author&quot;:[{&quot;family&quot;:&quot;Scomazzon&quot;,&quot;given&quot;:&quot;Marco&quot;,&quot;parse-names&quot;:false,&quot;dropping-particle&quot;:&quot;&quot;,&quot;non-dropping-particle&quot;:&quot;&quot;},{&quot;family&quot;:&quot;Barbera&quot;,&quot;given&quot;:&quot;Elena&quot;,&quot;parse-names&quot;:false,&quot;dropping-particle&quot;:&quot;&quot;,&quot;non-dropping-particle&quot;:&quot;&quot;},{&quot;family&quot;:&quot;Bezzo&quot;,&quot;given&quot;:&quot;Fabrizio&quot;,&quot;parse-names&quot;:false,&quot;dropping-particle&quot;:&quot;&quot;,&quot;non-dropping-particle&quot;:&quot;&quot;}],&quot;container-title&quot;:&quot;Journal of Environmental Chemical Engineering&quot;,&quot;DOI&quot;:&quot;10.1016/j.jece.2024.112674&quot;,&quot;ISSN&quot;:&quot;22133437&quot;,&quot;issued&quot;:{&quot;date-parts&quot;:[[2024,6]]},&quot;page&quot;:&quot;112674&quot;,&quot;issue&quot;:&quot;3&quot;,&quot;volume&quot;:&quot;12&quot;,&quot;container-title-short&quot;:&quot;J. Environ. Chem. Eng.&quot;},&quot;isTemporary&quot;:false}]},{&quot;citationID&quot;:&quot;MENDELEY_CITATION_50e16af0-91a6-43f9-862e-188051a6076b&quot;,&quot;properties&quot;:{&quot;noteIndex&quot;:0},&quot;isEdited&quot;:false,&quot;manualOverride&quot;:{&quot;isManuallyOverridden&quot;:false,&quot;citeprocText&quot;:&quot;[17]&quot;,&quot;manualOverrideText&quot;:&quot;&quot;},&quot;citationTag&quot;:&quot;MENDELEY_CITATION_v3_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&quot;,&quot;citationItems&quot;:[{&quot;id&quot;:&quot;8c3b2930-cd0d-331a-8923-1e74c3142273&quot;,&quot;itemData&quot;:{&quot;type&quot;:&quot;article-journal&quot;,&quot;id&quot;:&quot;8c3b2930-cd0d-331a-8923-1e74c3142273&quot;,&quot;title&quot;:&quot;LCA and exergy-economic evaluation of a biogas-to-fuels system using CO2 hydrogenation and exhaust gas recycling&quot;,&quot;author&quot;:[{&quot;family&quot;:&quot;Ghiasirad&quot;,&quot;given&quot;:&quot;Hamed&quot;,&quot;parse-names&quot;:false,&quot;dropping-particle&quot;:&quot;&quot;,&quot;non-dropping-particle&quot;:&quot;&quot;},{&quot;family&quot;:&quot;Ebrahimian&quot;,&quot;given&quot;:&quot;Farinaz&quot;,&quot;parse-names&quot;:false,&quot;dropping-particle&quot;:&quot;&quot;,&quot;non-dropping-particle&quot;:&quot;&quot;},{&quot;family&quot;:&quot;Gholizadeh&quot;,&quot;given&quot;:&quot;Towhid&quot;,&quot;parse-names&quot;:false,&quot;dropping-particle&quot;:&quot;&quot;,&quot;non-dropping-particle&quot;:&quot;&quot;},{&quot;family&quot;:&quot;Mohammadi&quot;,&quot;given&quot;:&quot;Ali&quot;,&quot;parse-names&quot;:false,&quot;dropping-particle&quot;:&quot;&quot;,&quot;non-dropping-particle&quot;:&quot;&quot;},{&quot;family&quot;:&quot;Mirmasoumi&quot;,&quot;given&quot;:&quot;Siamak&quot;,&quot;parse-names&quot;:false,&quot;dropping-particle&quot;:&quot;&quot;,&quot;non-dropping-particle&quot;:&quot;&quot;},{&quot;family&quot;:&quot;Saray&quot;,&quot;given&quot;:&quot;Rahim Khoshbakhti&quot;,&quot;parse-names&quot;:false,&quot;dropping-particle&quot;:&quot;&quot;,&quot;non-dropping-particle&quot;:&quot;&quot;},{&quot;family&quot;:&quot;Skorek-Osikowska&quot;,&quot;given&quot;:&quot;Anna&quot;,&quot;parse-names&quot;:false,&quot;dropping-particle&quot;:&quot;&quot;,&quot;non-dropping-particle&quot;:&quot;&quot;}],&quot;container-title&quot;:&quot;Energy Conversion and Management: X&quot;,&quot;DOI&quot;:&quot;10.1016/j.ecmx.2025.100897&quot;,&quot;ISSN&quot;:&quot;25901745&quot;,&quot;issued&quot;:{&quot;date-parts&quot;:[[2025,4]]},&quot;page&quot;:&quot;100897&quot;,&quot;volume&quot;:&quot;26&quot;,&quot;container-title-short&quot;:&quot;&quot;},&quot;isTemporary&quot;:false}]},{&quot;citationID&quot;:&quot;MENDELEY_CITATION_f6f42889-26df-4dbb-987f-6da6adaab487&quot;,&quot;properties&quot;:{&quot;noteIndex&quot;:0},&quot;isEdited&quot;:false,&quot;manualOverride&quot;:{&quot;isManuallyOverridden&quot;:false,&quot;citeprocText&quot;:&quot;[19]&quot;,&quot;manualOverrideText&quot;:&quot;&quot;},&quot;citationTag&quot;:&quot;MENDELEY_CITATION_v3_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&quot;,&quot;citationItems&quot;:[{&quot;id&quot;:&quot;28a53769-a0e5-3c5a-80f0-90f7301702eb&quot;,&quot;itemData&quot;:{&quot;type&quot;:&quot;article-journal&quot;,&quot;id&quot;:&quot;28a53769-a0e5-3c5a-80f0-90f7301702eb&quot;,&quot;title&quot;:&quot;Techno-economic-environmental assessment of the integration of power-to-X and biogas utilization towards the production of electricity, hydrogen, methane and methanol&quot;,&quot;author&quot;:[{&quot;family&quot;:&quot;Moioli&quot;,&quot;given&quot;:&quot;Emanuele&quot;,&quot;parse-names&quot;:false,&quot;dropping-particle&quot;:&quot;&quot;,&quot;non-dropping-particle&quot;:&quot;&quot;},{&quot;family&quot;:&quot;Schildhauer&quot;,&quot;given&quot;:&quot;Tilman&quot;,&quot;parse-names&quot;:false,&quot;dropping-particle&quot;:&quot;&quot;,&quot;non-dropping-particle&quot;:&quot;&quot;}],&quot;container-title&quot;:&quot;Sustainable Energy &amp; Fuels&quot;,&quot;DOI&quot;:&quot;10.1039/D3SE00052D&quot;,&quot;ISSN&quot;:&quot;2398-4902&quot;,&quot;issued&quot;:{&quot;date-parts&quot;:[[2023]]},&quot;page&quot;:&quot;2690-2706&quot;,&quot;abstract&quot;:&quot;&lt;p&gt;Various routes for the valorisation of biogas towards methane and methanol and for electricity or hydrogen storage is assessed.&lt;/p&gt;&quot;,&quot;issue&quot;:&quot;11&quot;,&quot;volume&quot;:&quot;7&quot;,&quot;container-title-short&quot;:&quot;Sustain. Energy Fuels&quot;},&quot;isTemporary&quot;:false}]},{&quot;citationID&quot;:&quot;MENDELEY_CITATION_8e42163d-fd20-4d53-837d-ec79437e85ea&quot;,&quot;properties&quot;:{&quot;noteIndex&quot;:0},&quot;isEdited&quot;:false,&quot;manualOverride&quot;:{&quot;isManuallyOverridden&quot;:false,&quot;citeprocText&quot;:&quot;[20]&quot;,&quot;manualOverrideText&quot;:&quot;&quot;},&quot;citationTag&quot;:&quot;MENDELEY_CITATION_v3_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&quot;,&quot;citationItems&quot;:[{&quot;id&quot;:&quot;104cea19-ccc6-37e7-9959-f839fd356eec&quot;,&quot;itemData&quot;:{&quot;type&quot;:&quot;article-journal&quot;,&quot;id&quot;:&quot;104cea19-ccc6-37e7-9959-f839fd356eec&quot;,&quot;title&quot;:&quot;Improving carbon efficiency for an advanced Biomass-to-Liquid process using hydrogen and oxygen from electrolysis&quot;,&quot;author&quot;:[{&quot;family&quot;:&quot;Dossow&quot;,&quot;given&quot;:&quot;Marcel&quot;,&quot;parse-names&quot;:false,&quot;dropping-particle&quot;:&quot;&quot;,&quot;non-dropping-particle&quot;:&quot;&quot;},{&quot;family&quot;:&quot;Dieterich&quot;,&quot;given&quot;:&quot;Vincent&quot;,&quot;parse-names&quot;:false,&quot;dropping-particle&quot;:&quot;&quot;,&quot;non-dropping-particle&quot;:&quot;&quot;},{&quot;family&quot;:&quot;Hanel&quot;,&quot;given&quot;:&quot;Andreas&quot;,&quot;parse-names&quot;:false,&quot;dropping-particle&quot;:&quot;&quot;,&quot;non-dropping-particle&quot;:&quot;&quot;},{&quot;family&quot;:&quot;Spliethoff&quot;,&quot;given&quot;:&quot;Hartmut&quot;,&quot;parse-names&quot;:false,&quot;dropping-particle&quot;:&quot;&quot;,&quot;non-dropping-particle&quot;:&quot;&quot;},{&quot;family&quot;:&quot;Fendt&quot;,&quot;given&quot;:&quot;Sebastian&quot;,&quot;parse-names&quot;:false,&quot;dropping-particle&quot;:&quot;&quot;,&quot;non-dropping-particle&quot;:&quot;&quot;}],&quot;container-title&quot;:&quot;Renewable and Sustainable Energy Reviews&quot;,&quot;DOI&quot;:&quot;10.1016/j.rser.2021.111670&quot;,&quot;ISSN&quot;:&quot;13640321&quot;,&quot;issued&quot;:{&quot;date-parts&quot;:[[2021,12]]},&quot;page&quot;:&quot;111670&quot;,&quot;volume&quot;:&quot;152&quot;,&quot;container-title-short&quot;:&quot;&quot;},&quot;isTemporary&quot;:false}]},{&quot;citationID&quot;:&quot;MENDELEY_CITATION_88d0ffc1-318e-4fe5-b886-2a172eaebfef&quot;,&quot;properties&quot;:{&quot;noteIndex&quot;:0},&quot;isEdited&quot;:false,&quot;manualOverride&quot;:{&quot;isManuallyOverridden&quot;:false,&quot;citeprocText&quot;:&quot;[21]&quot;,&quot;manualOverrideText&quot;:&quot;&quot;},&quot;citationTag&quot;:&quot;MENDELEY_CITATION_v3_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&quot;,&quot;citationItems&quot;:[{&quot;id&quot;:&quot;70edddc8-ee03-31fd-86e6-6cf7a4858b7a&quot;,&quot;itemData&quot;:{&quot;type&quot;:&quot;article-journal&quot;,&quot;id&quot;:&quot;70edddc8-ee03-31fd-86e6-6cf7a4858b7a&quot;,&quot;title&quot;:&quot;Flexible Power and Biomass-To-Methanol Plants With Different Gasification Technologies&quot;,&quot;author&quot;:[{&quot;family&quot;:&quot;Poluzzi&quot;,&quot;given&quot;:&quot;A.&quot;,&quot;parse-names&quot;:false,&quot;dropping-particle&quot;:&quot;&quot;,&quot;non-dropping-particle&quot;:&quot;&quot;},{&quot;family&quot;:&quot;Guandalini&quot;,&quot;given&quot;:&quot;G.&quot;,&quot;parse-names&quot;:false,&quot;dropping-particle&quot;:&quot;&quot;,&quot;non-dropping-particle&quot;:&quot;&quot;},{&quot;family&quot;:&quot;Guffanti&quot;,&quot;given&quot;:&quot;S.&quot;,&quot;parse-names&quot;:false,&quot;dropping-particle&quot;:&quot;&quot;,&quot;non-dropping-particle&quot;:&quot;&quot;},{&quot;family&quot;:&quot;Martinelli&quot;,&quot;given&quot;:&quot;M.&quot;,&quot;parse-names&quot;:false,&quot;dropping-particle&quot;:&quot;&quot;,&quot;non-dropping-particle&quot;:&quot;&quot;},{&quot;family&quot;:&quot;Moioli&quot;,&quot;given&quot;:&quot;S.&quot;,&quot;parse-names&quot;:false,&quot;dropping-particle&quot;:&quot;&quot;,&quot;non-dropping-particle&quot;:&quot;&quot;},{&quot;family&quot;:&quot;Huttenhuis&quot;,&quot;given&quot;:&quot;P.&quot;,&quot;parse-names&quot;:false,&quot;dropping-particle&quot;:&quot;&quot;,&quot;non-dropping-particle&quot;:&quot;&quot;},{&quot;family&quot;:&quot;Rexwinkel&quot;,&quot;given&quot;:&quot;G.&quot;,&quot;parse-names&quot;:false,&quot;dropping-particle&quot;:&quot;&quot;,&quot;non-dropping-particle&quot;:&quot;&quot;},{&quot;family&quot;:&quot;Palonen&quot;,&quot;given&quot;:&quot;J.&quot;,&quot;parse-names&quot;:false,&quot;dropping-particle&quot;:&quot;&quot;,&quot;non-dropping-particle&quot;:&quot;&quot;},{&quot;family&quot;:&quot;Martelli&quot;,&quot;given&quot;:&quot;E.&quot;,&quot;parse-names&quot;:false,&quot;dropping-particle&quot;:&quot;&quot;,&quot;non-dropping-particle&quot;:&quot;&quot;},{&quot;family&quot;:&quot;Groppi&quot;,&quot;given&quot;:&quot;G.&quot;,&quot;parse-names&quot;:false,&quot;dropping-particle&quot;:&quot;&quot;,&quot;non-dropping-particle&quot;:&quot;&quot;},{&quot;family&quot;:&quot;Romano&quot;,&quot;given&quot;:&quot;M. C.&quot;,&quot;parse-names&quot;:false,&quot;dropping-particle&quot;:&quot;&quot;,&quot;non-dropping-particle&quot;:&quot;&quot;}],&quot;container-title&quot;:&quot;Frontiers in Energy Research&quot;,&quot;DOI&quot;:&quot;10.3389/fenrg.2021.795673&quot;,&quot;ISSN&quot;:&quot;2296-598X&quot;,&quot;issued&quot;:{&quot;date-parts&quot;:[[2022,1,27]]},&quot;abstract&quot;:&quot;&lt;p&gt; The competitiveness of biofuels may be increased by integrating biomass gasification plants with electrolysis units, which generate hydrogen to be combined with carbon-rich syngas. This option allows increasing the yield of the final product by retaining a higher amount of biogenic carbon and improving the resilience of the energy sector by favoring electric grid services and sector coupling. This article illustrates a techno-economic comparative analysis of three flexible power and biomass to methanol plants based on different gasification technologies: direct gasification, indirect gasification, and sorption-enhanced gasification. The design and operational criteria of each plant are conceived to operate both without green hydrogen addition (baseline mode) and with hydrogen addition (enhanced mode), following an intermittent use of the electrolysis system, which is turned on when the electricity price allows an economically viable hydrogen production. The methanol production plants include a gasification section, syngas cleaning, conditioning and compression section, methanol synthesis and purification, and heat recovery steam cycle to be flexibly operated. Due to the high oxygen demand in the gasifier, the direct gasification-based plant obtains a great advantage to be operated between a minimum load to satisfy the oxygen demand at high electricity prices and a maximum load to maximize methanol production at low electricity prices. This allows avoiding large oxygen storages with significant benefits for Capex and safety issues. The analysis reports specific fixed-capital investments between 1823 and 2048 €/kW of methanol output in the enhanced operation and LCOFs between 29.7 and 31.7 €/GJ &lt;sub&gt;LHV&lt;/sub&gt; . Economic advantages may be derived from a decrease in the electrolysis capital investment, especially for the direct gasification-based plants, which employ the greatest sized electrolyzer. Methanol breakeven selling prices range between 545 and 582 €/t with the 2019 reference Denmark electricity price curve and between 484 and 535 €/t with an assumed modified electricity price curve of a future energy mix with increased penetration of intermittent renewables. &lt;/p&gt;&quot;,&quot;volume&quot;:&quot;9&quot;,&quot;container-title-short&quot;:&quot;Front. Energy Res.&quot;},&quot;isTemporary&quot;:false}]},{&quot;citationID&quot;:&quot;MENDELEY_CITATION_e06c8150-ca7f-4bb6-8b73-8555f96f90d4&quot;,&quot;properties&quot;:{&quot;noteIndex&quot;:0},&quot;isEdited&quot;:false,&quot;manualOverride&quot;:{&quot;isManuallyOverridden&quot;:false,&quot;citeprocText&quot;:&quot;[22]&quot;,&quot;manualOverrideText&quot;:&quot;&quot;},&quot;citationTag&quot;:&quot;MENDELEY_CITATION_v3_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&quot;,&quot;citationItems&quot;:[{&quot;id&quot;:&quot;a36d5e43-f1b3-3f4c-8cdc-446f28ab3924&quot;,&quot;itemData&quot;:{&quot;type&quot;:&quot;article-journal&quot;,&quot;id&quot;:&quot;a36d5e43-f1b3-3f4c-8cdc-446f28ab3924&quot;,&quot;title&quot;:&quot;Benefits of Hybrid Production of E-Methanol in Connection with Biomass Gasification&quot;,&quot;author&quot;:[{&quot;family&quot;:&quot;Anetjärvi&quot;,&quot;given&quot;:&quot;Eemeli&quot;,&quot;parse-names&quot;:false,&quot;dropping-particle&quot;:&quot;&quot;,&quot;non-dropping-particle&quot;:&quot;&quot;},{&quot;family&quot;:&quot;Vakkilainen&quot;,&quot;given&quot;:&quot;Esa&quot;,&quot;parse-names&quot;:false,&quot;dropping-particle&quot;:&quot;&quot;,&quot;non-dropping-particle&quot;:&quot;&quot;},{&quot;family&quot;:&quot;Melin&quot;,&quot;given&quot;:&quot;Kristian&quot;,&quot;parse-names&quot;:false,&quot;dropping-particle&quot;:&quot;&quot;,&quot;non-dropping-particle&quot;:&quot;&quot;}],&quot;container-title&quot;:&quot;SSRN Electronic Journal&quot;,&quot;DOI&quot;:&quot;10.2139/ssrn.4184476&quot;,&quot;ISSN&quot;:&quot;1556-5068&quot;,&quot;issued&quot;:{&quot;date-parts&quot;:[[2022]]},&quot;container-title-short&quot;:&quot;&quot;},&quot;isTemporary&quot;:false}]},{&quot;citationID&quot;:&quot;MENDELEY_CITATION_cd84c5ed-f67d-47d0-afce-d099ac46029a&quot;,&quot;properties&quot;:{&quot;noteIndex&quot;:0},&quot;isEdited&quot;:false,&quot;manualOverride&quot;:{&quot;isManuallyOverridden&quot;:false,&quot;citeprocText&quot;:&quot;[23]&quot;,&quot;manualOverrideText&quot;:&quot;&quot;},&quot;citationTag&quot;:&quot;MENDELEY_CITATION_v3_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&quot;,&quot;citationItems&quot;:[{&quot;id&quot;:&quot;048c482b-30be-34eb-bade-6c65560bb00c&quot;,&quot;itemData&quot;:{&quot;type&quot;:&quot;article-journal&quot;,&quot;id&quot;:&quot;048c482b-30be-34eb-bade-6c65560bb00c&quot;,&quot;title&quot;:&quot;Techno-economic optimization of biomass-to-methanol with solid-oxide electrolyzer&quot;,&quot;author&quot;:[{&quot;family&quot;:&quot;Zhang&quot;,&quot;given&quot;:&quot;Hanfei&quot;,&quot;parse-names&quot;:false,&quot;dropping-particle&quot;:&quot;&quot;,&quot;non-dropping-particle&quot;:&quot;&quot;},{&quot;family&quot;:&quot;Wang&quot;,&quot;given&quot;:&quot;Ligang&quot;,&quot;parse-names&quot;:false,&quot;dropping-particle&quot;:&quot;&quot;,&quot;non-dropping-particle&quot;:&quot;&quot;},{&quot;family&quot;:&quot;Pérez-Fortes&quot;,&quot;given&quot;:&quot;Mar&quot;,&quot;parse-names&quot;:false,&quot;dropping-particle&quot;:&quot;&quot;,&quot;non-dropping-particle&quot;:&quot;&quot;},{&quot;family&quot;:&quot;herle&quot;,&quot;given&quot;:&quot;Jan&quot;,&quot;parse-names&quot;:false,&quot;dropping-particle&quot;:&quot;&quot;,&quot;non-dropping-particle&quot;:&quot;Van&quot;},{&quot;family&quot;:&quot;Maréchal&quot;,&quot;given&quot;:&quot;François&quot;,&quot;parse-names&quot;:false,&quot;dropping-particle&quot;:&quot;&quot;,&quot;non-dropping-particle&quot;:&quot;&quot;},{&quot;family&quot;:&quot;Desideri&quot;,&quot;given&quot;:&quot;Umberto&quot;,&quot;parse-names&quot;:false,&quot;dropping-particle&quot;:&quot;&quot;,&quot;non-dropping-particle&quot;:&quot;&quot;}],&quot;container-title&quot;:&quot;Applied Energy&quot;,&quot;DOI&quot;:&quot;10.1016/j.apenergy.2019.114071&quot;,&quot;ISSN&quot;:&quot;03062619&quot;,&quot;issued&quot;:{&quot;date-parts&quot;:[[2020,1]]},&quot;page&quot;:&quot;114071&quot;,&quot;volume&quot;:&quot;258&quot;,&quot;container-title-short&quot;:&quot;Appl. Energy&quot;},&quot;isTemporary&quot;:false}]},{&quot;citationID&quot;:&quot;MENDELEY_CITATION_42ff2c48-5158-4a41-83ab-c9fb9e7d73b7&quot;,&quot;properties&quot;:{&quot;noteIndex&quot;:0},&quot;isEdited&quot;:false,&quot;manualOverride&quot;:{&quot;isManuallyOverridden&quot;:false,&quot;citeprocText&quot;:&quot;[24]&quot;,&quot;manualOverrideText&quot;:&quot;&quot;},&quot;citationTag&quot;:&quot;MENDELEY_CITATION_v3_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&quot;,&quot;citationItems&quot;:[{&quot;id&quot;:&quot;ded22db1-0dce-3c1b-981f-fd5847a7cce1&quot;,&quot;itemData&quot;:{&quot;type&quot;:&quot;article-journal&quot;,&quot;id&quot;:&quot;ded22db1-0dce-3c1b-981f-fd5847a7cce1&quot;,&quot;title&quot;:&quot;Flexible Power &amp;amp; Biomass-to-Methanol plants: Design optimization and economic viability of the electrolysis integration&quot;,&quot;author&quot;:[{&quot;family&quot;:&quot;Poluzzi&quot;,&quot;given&quot;:&quot;Alessandro&quot;,&quot;parse-names&quot;:false,&quot;dropping-particle&quot;:&quot;&quot;,&quot;non-dropping-particle&quot;:&quot;&quot;},{&quot;family&quot;:&quot;Guandalini&quot;,&quot;given&quot;:&quot;Giulio&quot;,&quot;parse-names&quot;:false,&quot;dropping-particle&quot;:&quot;&quot;,&quot;non-dropping-particle&quot;:&quot;&quot;},{&quot;family&quot;:&quot;Guffanti&quot;,&quot;given&quot;:&quot;Simone&quot;,&quot;parse-names&quot;:false,&quot;dropping-particle&quot;:&quot;&quot;,&quot;non-dropping-particle&quot;:&quot;&quot;},{&quot;family&quot;:&quot;Elsido&quot;,&quot;given&quot;:&quot;Cristina&quot;,&quot;parse-names&quot;:false,&quot;dropping-particle&quot;:&quot;&quot;,&quot;non-dropping-particle&quot;:&quot;&quot;},{&quot;family&quot;:&quot;Moioli&quot;,&quot;given&quot;:&quot;Stefania&quot;,&quot;parse-names&quot;:false,&quot;dropping-particle&quot;:&quot;&quot;,&quot;non-dropping-particle&quot;:&quot;&quot;},{&quot;family&quot;:&quot;Huttenhuis&quot;,&quot;given&quot;:&quot;Patrick&quot;,&quot;parse-names&quot;:false,&quot;dropping-particle&quot;:&quot;&quot;,&quot;non-dropping-particle&quot;:&quot;&quot;},{&quot;family&quot;:&quot;Rexwinkel&quot;,&quot;given&quot;:&quot;Glenn&quot;,&quot;parse-names&quot;:false,&quot;dropping-particle&quot;:&quot;&quot;,&quot;non-dropping-particle&quot;:&quot;&quot;},{&quot;family&quot;:&quot;Martelli&quot;,&quot;given&quot;:&quot;Emanuele&quot;,&quot;parse-names&quot;:false,&quot;dropping-particle&quot;:&quot;&quot;,&quot;non-dropping-particle&quot;:&quot;&quot;},{&quot;family&quot;:&quot;Groppi&quot;,&quot;given&quot;:&quot;Gianpiero&quot;,&quot;parse-names&quot;:false,&quot;dropping-particle&quot;:&quot;&quot;,&quot;non-dropping-particle&quot;:&quot;&quot;},{&quot;family&quot;:&quot;Romano&quot;,&quot;given&quot;:&quot;Matteo C.&quot;,&quot;parse-names&quot;:false,&quot;dropping-particle&quot;:&quot;&quot;,&quot;non-dropping-particle&quot;:&quot;&quot;}],&quot;container-title&quot;:&quot;Fuel&quot;,&quot;DOI&quot;:&quot;10.1016/j.fuel.2021.122113&quot;,&quot;ISSN&quot;:&quot;00162361&quot;,&quot;issued&quot;:{&quot;date-parts&quot;:[[2022,2]]},&quot;page&quot;:&quot;122113&quot;,&quot;volume&quot;:&quot;310&quot;,&quot;container-title-short&quot;:&quot;&quot;},&quot;isTemporary&quot;:false}]},{&quot;citationID&quot;:&quot;MENDELEY_CITATION_a84a64c2-5cd9-45b5-8dd3-eed0901210e0&quot;,&quot;properties&quot;:{&quot;noteIndex&quot;:0},&quot;isEdited&quot;:false,&quot;manualOverride&quot;:{&quot;isManuallyOverridden&quot;:false,&quot;citeprocText&quot;:&quot;[25]&quot;,&quot;manualOverrideText&quot;:&quot;&quot;},&quot;citationTag&quot;:&quot;MENDELEY_CITATION_v3_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&quot;,&quot;citationItems&quot;:[{&quot;id&quot;:&quot;a332ee91-b343-3289-860a-430557bbc5fa&quot;,&quot;itemData&quot;:{&quot;type&quot;:&quot;article-journal&quot;,&quot;id&quot;:&quot;a332ee91-b343-3289-860a-430557bbc5fa&quot;,&quot;title&quot;:&quot;Flexible Power &amp;amp; Biomass-to-Methanol plants: Design optimization and economic viability of the electrolysis integration&quot;,&quot;author&quot;:[{&quot;family&quot;:&quot;Poluzzi&quot;,&quot;given&quot;:&quot;Alessandro&quot;,&quot;parse-names&quot;:false,&quot;dropping-particle&quot;:&quot;&quot;,&quot;non-dropping-particle&quot;:&quot;&quot;},{&quot;family&quot;:&quot;Guandalini&quot;,&quot;given&quot;:&quot;Giulio&quot;,&quot;parse-names&quot;:false,&quot;dropping-particle&quot;:&quot;&quot;,&quot;non-dropping-particle&quot;:&quot;&quot;},{&quot;family&quot;:&quot;Guffanti&quot;,&quot;given&quot;:&quot;Simone&quot;,&quot;parse-names&quot;:false,&quot;dropping-particle&quot;:&quot;&quot;,&quot;non-dropping-particle&quot;:&quot;&quot;},{&quot;family&quot;:&quot;Elsido&quot;,&quot;given&quot;:&quot;Cristina&quot;,&quot;parse-names&quot;:false,&quot;dropping-particle&quot;:&quot;&quot;,&quot;non-dropping-particle&quot;:&quot;&quot;},{&quot;family&quot;:&quot;Moioli&quot;,&quot;given&quot;:&quot;Stefania&quot;,&quot;parse-names&quot;:false,&quot;dropping-particle&quot;:&quot;&quot;,&quot;non-dropping-particle&quot;:&quot;&quot;},{&quot;family&quot;:&quot;Huttenhuis&quot;,&quot;given&quot;:&quot;Patrick&quot;,&quot;parse-names&quot;:false,&quot;dropping-particle&quot;:&quot;&quot;,&quot;non-dropping-particle&quot;:&quot;&quot;},{&quot;family&quot;:&quot;Rexwinkel&quot;,&quot;given&quot;:&quot;Glenn&quot;,&quot;parse-names&quot;:false,&quot;dropping-particle&quot;:&quot;&quot;,&quot;non-dropping-particle&quot;:&quot;&quot;},{&quot;family&quot;:&quot;Martelli&quot;,&quot;given&quot;:&quot;Emanuele&quot;,&quot;parse-names&quot;:false,&quot;dropping-particle&quot;:&quot;&quot;,&quot;non-dropping-particle&quot;:&quot;&quot;},{&quot;family&quot;:&quot;Groppi&quot;,&quot;given&quot;:&quot;Gianpiero&quot;,&quot;parse-names&quot;:false,&quot;dropping-particle&quot;:&quot;&quot;,&quot;non-dropping-particle&quot;:&quot;&quot;},{&quot;family&quot;:&quot;Romano&quot;,&quot;given&quot;:&quot;Matteo C.&quot;,&quot;parse-names&quot;:false,&quot;dropping-particle&quot;:&quot;&quot;,&quot;non-dropping-particle&quot;:&quot;&quot;}],&quot;container-title&quot;:&quot;Fuel&quot;,&quot;DOI&quot;:&quot;10.1016/j.fuel.2021.122113&quot;,&quot;ISSN&quot;:&quot;00162361&quot;,&quot;issued&quot;:{&quot;date-parts&quot;:[[2022,2]]},&quot;page&quot;:&quot;122113&quot;,&quot;volume&quot;:&quot;310&quot;,&quot;container-title-short&quot;:&quot;&quot;},&quot;isTemporary&quot;:false}]},{&quot;citationID&quot;:&quot;MENDELEY_CITATION_8c83e7a2-71cf-4160-9fdd-2510731786cf&quot;,&quot;properties&quot;:{&quot;noteIndex&quot;:0},&quot;isEdited&quot;:false,&quot;manualOverride&quot;:{&quot;isManuallyOverridden&quot;:false,&quot;citeprocText&quot;:&quot;[21]&quot;,&quot;manualOverrideText&quot;:&quot;&quot;},&quot;citationTag&quot;:&quot;MENDELEY_CITATION_v3_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&quot;,&quot;citationItems&quot;:[{&quot;id&quot;:&quot;70edddc8-ee03-31fd-86e6-6cf7a4858b7a&quot;,&quot;itemData&quot;:{&quot;type&quot;:&quot;article-journal&quot;,&quot;id&quot;:&quot;70edddc8-ee03-31fd-86e6-6cf7a4858b7a&quot;,&quot;title&quot;:&quot;Flexible Power and Biomass-To-Methanol Plants With Different Gasification Technologies&quot;,&quot;author&quot;:[{&quot;family&quot;:&quot;Poluzzi&quot;,&quot;given&quot;:&quot;A.&quot;,&quot;parse-names&quot;:false,&quot;dropping-particle&quot;:&quot;&quot;,&quot;non-dropping-particle&quot;:&quot;&quot;},{&quot;family&quot;:&quot;Guandalini&quot;,&quot;given&quot;:&quot;G.&quot;,&quot;parse-names&quot;:false,&quot;dropping-particle&quot;:&quot;&quot;,&quot;non-dropping-particle&quot;:&quot;&quot;},{&quot;family&quot;:&quot;Guffanti&quot;,&quot;given&quot;:&quot;S.&quot;,&quot;parse-names&quot;:false,&quot;dropping-particle&quot;:&quot;&quot;,&quot;non-dropping-particle&quot;:&quot;&quot;},{&quot;family&quot;:&quot;Martinelli&quot;,&quot;given&quot;:&quot;M.&quot;,&quot;parse-names&quot;:false,&quot;dropping-particle&quot;:&quot;&quot;,&quot;non-dropping-particle&quot;:&quot;&quot;},{&quot;family&quot;:&quot;Moioli&quot;,&quot;given&quot;:&quot;S.&quot;,&quot;parse-names&quot;:false,&quot;dropping-particle&quot;:&quot;&quot;,&quot;non-dropping-particle&quot;:&quot;&quot;},{&quot;family&quot;:&quot;Huttenhuis&quot;,&quot;given&quot;:&quot;P.&quot;,&quot;parse-names&quot;:false,&quot;dropping-particle&quot;:&quot;&quot;,&quot;non-dropping-particle&quot;:&quot;&quot;},{&quot;family&quot;:&quot;Rexwinkel&quot;,&quot;given&quot;:&quot;G.&quot;,&quot;parse-names&quot;:false,&quot;dropping-particle&quot;:&quot;&quot;,&quot;non-dropping-particle&quot;:&quot;&quot;},{&quot;family&quot;:&quot;Palonen&quot;,&quot;given&quot;:&quot;J.&quot;,&quot;parse-names&quot;:false,&quot;dropping-particle&quot;:&quot;&quot;,&quot;non-dropping-particle&quot;:&quot;&quot;},{&quot;family&quot;:&quot;Martelli&quot;,&quot;given&quot;:&quot;E.&quot;,&quot;parse-names&quot;:false,&quot;dropping-particle&quot;:&quot;&quot;,&quot;non-dropping-particle&quot;:&quot;&quot;},{&quot;family&quot;:&quot;Groppi&quot;,&quot;given&quot;:&quot;G.&quot;,&quot;parse-names&quot;:false,&quot;dropping-particle&quot;:&quot;&quot;,&quot;non-dropping-particle&quot;:&quot;&quot;},{&quot;family&quot;:&quot;Romano&quot;,&quot;given&quot;:&quot;M. C.&quot;,&quot;parse-names&quot;:false,&quot;dropping-particle&quot;:&quot;&quot;,&quot;non-dropping-particle&quot;:&quot;&quot;}],&quot;container-title&quot;:&quot;Frontiers in Energy Research&quot;,&quot;DOI&quot;:&quot;10.3389/fenrg.2021.795673&quot;,&quot;ISSN&quot;:&quot;2296-598X&quot;,&quot;issued&quot;:{&quot;date-parts&quot;:[[2022,1,27]]},&quot;abstract&quot;:&quot;&lt;p&gt; The competitiveness of biofuels may be increased by integrating biomass gasification plants with electrolysis units, which generate hydrogen to be combined with carbon-rich syngas. This option allows increasing the yield of the final product by retaining a higher amount of biogenic carbon and improving the resilience of the energy sector by favoring electric grid services and sector coupling. This article illustrates a techno-economic comparative analysis of three flexible power and biomass to methanol plants based on different gasification technologies: direct gasification, indirect gasification, and sorption-enhanced gasification. The design and operational criteria of each plant are conceived to operate both without green hydrogen addition (baseline mode) and with hydrogen addition (enhanced mode), following an intermittent use of the electrolysis system, which is turned on when the electricity price allows an economically viable hydrogen production. The methanol production plants include a gasification section, syngas cleaning, conditioning and compression section, methanol synthesis and purification, and heat recovery steam cycle to be flexibly operated. Due to the high oxygen demand in the gasifier, the direct gasification-based plant obtains a great advantage to be operated between a minimum load to satisfy the oxygen demand at high electricity prices and a maximum load to maximize methanol production at low electricity prices. This allows avoiding large oxygen storages with significant benefits for Capex and safety issues. The analysis reports specific fixed-capital investments between 1823 and 2048 €/kW of methanol output in the enhanced operation and LCOFs between 29.7 and 31.7 €/GJ &lt;sub&gt;LHV&lt;/sub&gt; . Economic advantages may be derived from a decrease in the electrolysis capital investment, especially for the direct gasification-based plants, which employ the greatest sized electrolyzer. Methanol breakeven selling prices range between 545 and 582 €/t with the 2019 reference Denmark electricity price curve and between 484 and 535 €/t with an assumed modified electricity price curve of a future energy mix with increased penetration of intermittent renewables. &lt;/p&gt;&quot;,&quot;volume&quot;:&quot;9&quot;,&quot;container-title-short&quot;:&quot;Front. Energy Res.&quot;},&quot;isTemporary&quot;:false}]},{&quot;citationID&quot;:&quot;MENDELEY_CITATION_e2d98fbf-79a4-429b-9796-2be5c079023d&quot;,&quot;properties&quot;:{&quot;noteIndex&quot;:0},&quot;isEdited&quot;:false,&quot;manualOverride&quot;:{&quot;isManuallyOverridden&quot;:false,&quot;citeprocText&quot;:&quot;[25]&quot;,&quot;manualOverrideText&quot;:&quot;&quot;},&quot;citationTag&quot;:&quot;MENDELEY_CITATION_v3_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&quot;,&quot;citationItems&quot;:[{&quot;id&quot;:&quot;a332ee91-b343-3289-860a-430557bbc5fa&quot;,&quot;itemData&quot;:{&quot;type&quot;:&quot;article-journal&quot;,&quot;id&quot;:&quot;a332ee91-b343-3289-860a-430557bbc5fa&quot;,&quot;title&quot;:&quot;Flexible Power &amp;amp; Biomass-to-Methanol plants: Design optimization and economic viability of the electrolysis integration&quot;,&quot;author&quot;:[{&quot;family&quot;:&quot;Poluzzi&quot;,&quot;given&quot;:&quot;Alessandro&quot;,&quot;parse-names&quot;:false,&quot;dropping-particle&quot;:&quot;&quot;,&quot;non-dropping-particle&quot;:&quot;&quot;},{&quot;family&quot;:&quot;Guandalini&quot;,&quot;given&quot;:&quot;Giulio&quot;,&quot;parse-names&quot;:false,&quot;dropping-particle&quot;:&quot;&quot;,&quot;non-dropping-particle&quot;:&quot;&quot;},{&quot;family&quot;:&quot;Guffanti&quot;,&quot;given&quot;:&quot;Simone&quot;,&quot;parse-names&quot;:false,&quot;dropping-particle&quot;:&quot;&quot;,&quot;non-dropping-particle&quot;:&quot;&quot;},{&quot;family&quot;:&quot;Elsido&quot;,&quot;given&quot;:&quot;Cristina&quot;,&quot;parse-names&quot;:false,&quot;dropping-particle&quot;:&quot;&quot;,&quot;non-dropping-particle&quot;:&quot;&quot;},{&quot;family&quot;:&quot;Moioli&quot;,&quot;given&quot;:&quot;Stefania&quot;,&quot;parse-names&quot;:false,&quot;dropping-particle&quot;:&quot;&quot;,&quot;non-dropping-particle&quot;:&quot;&quot;},{&quot;family&quot;:&quot;Huttenhuis&quot;,&quot;given&quot;:&quot;Patrick&quot;,&quot;parse-names&quot;:false,&quot;dropping-particle&quot;:&quot;&quot;,&quot;non-dropping-particle&quot;:&quot;&quot;},{&quot;family&quot;:&quot;Rexwinkel&quot;,&quot;given&quot;:&quot;Glenn&quot;,&quot;parse-names&quot;:false,&quot;dropping-particle&quot;:&quot;&quot;,&quot;non-dropping-particle&quot;:&quot;&quot;},{&quot;family&quot;:&quot;Martelli&quot;,&quot;given&quot;:&quot;Emanuele&quot;,&quot;parse-names&quot;:false,&quot;dropping-particle&quot;:&quot;&quot;,&quot;non-dropping-particle&quot;:&quot;&quot;},{&quot;family&quot;:&quot;Groppi&quot;,&quot;given&quot;:&quot;Gianpiero&quot;,&quot;parse-names&quot;:false,&quot;dropping-particle&quot;:&quot;&quot;,&quot;non-dropping-particle&quot;:&quot;&quot;},{&quot;family&quot;:&quot;Romano&quot;,&quot;given&quot;:&quot;Matteo C.&quot;,&quot;parse-names&quot;:false,&quot;dropping-particle&quot;:&quot;&quot;,&quot;non-dropping-particle&quot;:&quot;&quot;}],&quot;container-title&quot;:&quot;Fuel&quot;,&quot;DOI&quot;:&quot;10.1016/j.fuel.2021.122113&quot;,&quot;ISSN&quot;:&quot;00162361&quot;,&quot;issued&quot;:{&quot;date-parts&quot;:[[2022,2]]},&quot;page&quot;:&quot;122113&quot;,&quot;volume&quot;:&quot;310&quot;,&quot;container-title-short&quot;:&quot;&quot;},&quot;isTemporary&quot;:false}]},{&quot;citationID&quot;:&quot;MENDELEY_CITATION_b7c42850-3893-430a-a91a-ba071b5a549f&quot;,&quot;properties&quot;:{&quot;noteIndex&quot;:0},&quot;isEdited&quot;:false,&quot;manualOverride&quot;:{&quot;isManuallyOverridden&quot;:false,&quot;citeprocText&quot;:&quot;[26]&quot;,&quot;manualOverrideText&quot;:&quot;&quot;},&quot;citationTag&quot;:&quot;MENDELEY_CITATION_v3_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&quot;,&quot;citationItems&quot;:[{&quot;id&quot;:&quot;31848458-a34e-370b-af77-81d1d893a1c5&quot;,&quot;itemData&quot;:{&quot;type&quot;:&quot;article-journal&quot;,&quot;id&quot;:&quot;31848458-a34e-370b-af77-81d1d893a1c5&quot;,&quot;title&quot;:&quot;Deep Reinforcement Learning Approaches the MILP Optimum of a Multi-Energy Optimization in Energy Communities&quot;,&quot;author&quot;:[{&quot;family&quot;:&quot;Vetter&quot;,&quot;given&quot;:&quot;Vinzent&quot;,&quot;parse-names&quot;:false,&quot;dropping-particle&quot;:&quot;&quot;,&quot;non-dropping-particle&quot;:&quot;&quot;},{&quot;family&quot;:&quot;Wohlgenannt&quot;,&quot;given&quot;:&quot;Philipp&quot;,&quot;parse-names&quot;:false,&quot;dropping-particle&quot;:&quot;&quot;,&quot;non-dropping-particle&quot;:&quot;&quot;},{&quot;family&quot;:&quot;Kepplinger&quot;,&quot;given&quot;:&quot;Peter&quot;,&quot;parse-names&quot;:false,&quot;dropping-particle&quot;:&quot;&quot;,&quot;non-dropping-particle&quot;:&quot;&quot;},{&quot;family&quot;:&quot;Eder&quot;,&quot;given&quot;:&quot;Elias&quot;,&quot;parse-names&quot;:false,&quot;dropping-particle&quot;:&quot;&quot;,&quot;non-dropping-particle&quot;:&quot;&quot;}],&quot;container-title&quot;:&quot;Energies&quot;,&quot;container-title-short&quot;:&quot;Energies (Basel).&quot;,&quot;DOI&quot;:&quot;10.3390/en18174489&quot;,&quot;ISSN&quot;:&quot;1996-1073&quot;,&quot;issued&quot;:{&quot;date-parts&quot;:[[2025,8,23]]},&quot;page&quot;:&quot;4489&quot;,&quot;abstract&quot;:&quot;&lt;p&gt;As energy systems transition toward high shares of variable renewable generation, local energy communities (ECs) are increasingly relevant for enabling demand-side flexibility and self-sufficiency. This shift is particularly evident in the residential sector, where the deployment of photovoltaic (PV) systems is rapidly growing. While mixed-integer linear programming (MILP) remains the standard for operational optimization and demand response in such systems, its computational burden limits scalability and responsiveness under real-time or uncertain conditions. Reinforcement learning (RL), by contrast, offers a model-free, adaptive alternative. However, its application to real-world energy system operation remains limited. This study explores the application of a Deep Q-Network (DQN) to a real residential EC, which has received limited attention in prior work. The system comprises three single-family homes sharing a centralized heating system with a thermal energy storage (TES), a PV installation, and a grid connection. We compare the performance of MILP and RL controllers across economic and environmental metrics. Relative to a reference scenario without TES, MILP and RL reduce energy costs by 10.06% and 8.78%, respectively, and both approaches yield lower total energy consumption and CO2-equivalent emissions. Notably, the trained RL agent achieves a near-optimal outcome while requiring only 22% of the MILP’s computation time. These results demonstrate that DQNs can offer a computationally efficient and practically viable alternative to MILP for real-time control in residential energy systems.&lt;/p&gt;&quot;,&quot;issue&quot;:&quot;17&quot;,&quot;volume&quot;:&quot;18&quot;},&quot;isTemporary&quot;:false}]},{&quot;citationID&quot;:&quot;MENDELEY_CITATION_03d18768-2530-4173-a512-ec7dc06e4ecc&quot;,&quot;properties&quot;:{&quot;noteIndex&quot;:0},&quot;isEdited&quot;:false,&quot;manualOverride&quot;:{&quot;isManuallyOverridden&quot;:false,&quot;citeprocText&quot;:&quot;[27]&quot;,&quot;manualOverrideText&quot;:&quot;&quot;},&quot;citationTag&quot;:&quot;MENDELEY_CITATION_v3_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&quot;,&quot;citationItems&quot;:[{&quot;id&quot;:&quot;185586bd-ce77-3f7d-ae64-0f509db4cf05&quot;,&quot;itemData&quot;:{&quot;type&quot;:&quot;article-journal&quot;,&quot;id&quot;:&quot;185586bd-ce77-3f7d-ae64-0f509db4cf05&quot;,&quot;title&quot;:&quot;Energy Demand Response in a Food-Processing Plant: A Deep Reinforcement Learning Approach&quot;,&quot;author&quot;:[{&quot;family&quot;:&quot;Wohlgenannt&quot;,&quot;given&quot;:&quot;Philipp&quot;,&quot;parse-names&quot;:false,&quot;dropping-particle&quot;:&quot;&quot;,&quot;non-dropping-particle&quot;:&quot;&quot;},{&quot;family&quot;:&quot;Hegenbart&quot;,&quot;given&quot;:&quot;Sebastian&quot;,&quot;parse-names&quot;:false,&quot;dropping-particle&quot;:&quot;&quot;,&quot;non-dropping-particle&quot;:&quot;&quot;},{&quot;family&quot;:&quot;Eder&quot;,&quot;given&quot;:&quot;Elias&quot;,&quot;parse-names&quot;:false,&quot;dropping-particle&quot;:&quot;&quot;,&quot;non-dropping-particle&quot;:&quot;&quot;},{&quot;family&quot;:&quot;Kolhe&quot;,&quot;given&quot;:&quot;Mohan&quot;,&quot;parse-names&quot;:false,&quot;dropping-particle&quot;:&quot;&quot;,&quot;non-dropping-particle&quot;:&quot;&quot;},{&quot;family&quot;:&quot;Kepplinger&quot;,&quot;given&quot;:&quot;Peter&quot;,&quot;parse-names&quot;:false,&quot;dropping-particle&quot;:&quot;&quot;,&quot;non-dropping-particle&quot;:&quot;&quot;}],&quot;container-title&quot;:&quot;Energies&quot;,&quot;DOI&quot;:&quot;10.3390/en17246430&quot;,&quot;ISSN&quot;:&quot;1996-1073&quot;,&quot;issued&quot;:{&quot;date-parts&quot;:[[2024,12,20]]},&quot;page&quot;:&quot;6430&quot;,&quot;abstract&quot;:&quot;&lt;p&gt;The food industry faces significant challenges in managing operational costs due to its high energy intensity and rising energy prices. Industrial food-processing facilities, with substantial thermal capacities and large demands for cooling and heating, offer promising opportunities for demand response (DR) strategies. This study explores the application of deep reinforcement learning (RL) as an innovative, data-driven approach for DR in the food industry. By leveraging the adaptive, self-learning capabilities of RL, energy costs in the investigated plant are effectively decreased. The RL algorithm was compared with the well-established optimization method Mixed Integer Linear Programming (MILP), and both were benchmarked against a reference scenario without DR. The two optimization strategies demonstrate cost savings of 17.57% and 18.65% for RL and MILP, respectively. Although RL is slightly less efficient in cost reduction, it significantly outperforms in computational speed, being approximately 20 times faster. During operation, RL only needs 2ms per optimization compared to 19s for MILP, making it a promising optimization tool for edge computing. Moreover, while MILP’s computation time increases considerably with the number of binary variables, RL efficiently learns dynamic system behavior and scales to more complex systems without significant performance degradation. These results highlight that deep RL, when applied to DR, offers substantial cost savings and computational efficiency, with broad applicability to energy management in various applications.&lt;/p&gt;&quot;,&quot;issue&quot;:&quot;24&quot;,&quot;volume&quot;:&quot;17&quot;,&quot;container-title-short&quot;:&quot;Energies (Basel).&quot;},&quot;isTemporary&quot;:false}]},{&quot;citationID&quot;:&quot;MENDELEY_CITATION_d0ae8956-c2f2-4f72-9054-a8ca53b2504b&quot;,&quot;properties&quot;:{&quot;noteIndex&quot;:0},&quot;isEdited&quot;:false,&quot;manualOverride&quot;:{&quot;isManuallyOverridden&quot;:false,&quot;citeprocText&quot;:&quot;[28]&quot;,&quot;manualOverrideText&quot;:&quot;&quot;},&quot;citationTag&quot;:&quot;MENDELEY_CITATION_v3_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&quot;,&quot;citationItems&quot;:[{&quot;id&quot;:&quot;b510e037-8e3e-36b2-9b7f-53d097c80a2d&quot;,&quot;itemData&quot;:{&quot;type&quot;:&quot;article-journal&quot;,&quot;id&quot;:&quot;b510e037-8e3e-36b2-9b7f-53d097c80a2d&quot;,&quot;title&quot;:&quot;A comprehensive review on optimization of hybrid renewable energy systems using various optimization techniques&quot;,&quot;author&quot;:[{&quot;family&quot;:&quot;Thirunavukkarasu&quot;,&quot;given&quot;:&quot;M.&quot;,&quot;parse-names&quot;:false,&quot;dropping-particle&quot;:&quot;&quot;,&quot;non-dropping-particle&quot;:&quot;&quot;},{&quot;family&quot;:&quot;Sawle&quot;,&quot;given&quot;:&quot;Yashwant&quot;,&quot;parse-names&quot;:false,&quot;dropping-particle&quot;:&quot;&quot;,&quot;non-dropping-particle&quot;:&quot;&quot;},{&quot;family&quot;:&quot;Lala&quot;,&quot;given&quot;:&quot;Himadri&quot;,&quot;parse-names&quot;:false,&quot;dropping-particle&quot;:&quot;&quot;,&quot;non-dropping-particle&quot;:&quot;&quot;}],&quot;container-title&quot;:&quot;Renewable and Sustainable Energy Reviews&quot;,&quot;DOI&quot;:&quot;10.1016/j.rser.2023.113192&quot;,&quot;ISSN&quot;:&quot;13640321&quot;,&quot;issued&quot;:{&quot;date-parts&quot;:[[2023,4]]},&quot;page&quot;:&quot;113192&quot;,&quot;volume&quot;:&quot;176&quot;,&quot;container-title-short&quot;:&quot;&quot;},&quot;isTemporary&quot;:false}]},{&quot;citationID&quot;:&quot;MENDELEY_CITATION_b63a1021-7346-498d-adf3-73382c63a827&quot;,&quot;properties&quot;:{&quot;noteIndex&quot;:0},&quot;isEdited&quot;:false,&quot;manualOverride&quot;:{&quot;isManuallyOverridden&quot;:false,&quot;citeprocText&quot;:&quot;[29]&quot;,&quot;manualOverrideText&quot;:&quot;&quot;},&quot;citationTag&quot;:&quot;MENDELEY_CITATION_v3_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&quot;,&quot;citationItems&quot;:[{&quot;id&quot;:&quot;0f89bf4c-80d3-3ce8-8c18-b8917957c10b&quot;,&quot;itemData&quot;:{&quot;type&quot;:&quot;article-journal&quot;,&quot;id&quot;:&quot;0f89bf4c-80d3-3ce8-8c18-b8917957c10b&quot;,&quot;title&quot;:&quot;Optimal energy system scheduling using a constraint-aware reinforcement learning algorithm&quot;,&quot;author&quot;:[{&quot;family&quot;:&quot;Shengren&quot;,&quot;given&quot;:&quot;Hou&quot;,&quot;parse-names&quot;:false,&quot;dropping-particle&quot;:&quot;&quot;,&quot;non-dropping-particle&quot;:&quot;&quot;},{&quot;family&quot;:&quot;Vergara&quot;,&quot;given&quot;:&quot;Pedro P.&quot;,&quot;parse-names&quot;:false,&quot;dropping-particle&quot;:&quot;&quot;,&quot;non-dropping-particle&quot;:&quot;&quot;},{&quot;family&quot;:&quot;Salazar Duque&quot;,&quot;given&quot;:&quot;Edgar Mauricio&quot;,&quot;parse-names&quot;:false,&quot;dropping-particle&quot;:&quot;&quot;,&quot;non-dropping-particle&quot;:&quot;&quot;},{&quot;family&quot;:&quot;Palensky&quot;,&quot;given&quot;:&quot;Peter&quot;,&quot;parse-names&quot;:false,&quot;dropping-particle&quot;:&quot;&quot;,&quot;non-dropping-particle&quot;:&quot;&quot;}],&quot;container-title&quot;:&quot;International Journal of Electrical Power &amp; Energy Systems&quot;,&quot;DOI&quot;:&quot;10.1016/j.ijepes.2023.109230&quot;,&quot;ISSN&quot;:&quot;01420615&quot;,&quot;issued&quot;:{&quot;date-parts&quot;:[[2023,10]]},&quot;page&quot;:&quot;109230&quot;,&quot;volume&quot;:&quot;152&quot;,&quot;container-title-short&quot;:&quot;&quot;},&quot;isTemporary&quot;:false}]},{&quot;citationID&quot;:&quot;MENDELEY_CITATION_6d8a7862-c0c2-4c71-b5ea-7e17817e262d&quot;,&quot;properties&quot;:{&quot;noteIndex&quot;:0},&quot;isEdited&quot;:false,&quot;manualOverride&quot;:{&quot;isManuallyOverridden&quot;:false,&quot;citeprocText&quot;:&quot;[30]&quot;,&quot;manualOverrideText&quot;:&quot;&quot;},&quot;citationTag&quot;:&quot;MENDELEY_CITATION_v3_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&quot;,&quot;citationItems&quot;:[{&quot;id&quot;:&quot;32d54ec3-73fd-3a7d-a2b9-efadea2d2319&quot;,&quot;itemData&quot;:{&quot;type&quot;:&quot;article-journal&quot;,&quot;id&quot;:&quot;32d54ec3-73fd-3a7d-a2b9-efadea2d2319&quot;,&quot;title&quot;:&quot;A Review on Multi-Objective Mixed-Integer Non-Linear Optimization Programming Methods&quot;,&quot;author&quot;:[{&quot;family&quot;:&quot;Jaber&quot;,&quot;given&quot;:&quot;Ahmed&quot;,&quot;parse-names&quot;:false,&quot;dropping-particle&quot;:&quot;&quot;,&quot;non-dropping-particle&quot;:&quot;&quot;},{&quot;family&quot;:&quot;Younes&quot;,&quot;given&quot;:&quot;Rafic&quot;,&quot;parse-names&quot;:false,&quot;dropping-particle&quot;:&quot;&quot;,&quot;non-dropping-particle&quot;:&quot;&quot;},{&quot;family&quot;:&quot;Lafon&quot;,&quot;given&quot;:&quot;Pascal&quot;,&quot;parse-names&quot;:false,&quot;dropping-particle&quot;:&quot;&quot;,&quot;non-dropping-particle&quot;:&quot;&quot;},{&quot;family&quot;:&quot;Khoder&quot;,&quot;given&quot;:&quot;Jihan&quot;,&quot;parse-names&quot;:false,&quot;dropping-particle&quot;:&quot;&quot;,&quot;non-dropping-particle&quot;:&quot;&quot;}],&quot;container-title&quot;:&quot;Eng&quot;,&quot;DOI&quot;:&quot;10.3390/eng5030104&quot;,&quot;ISSN&quot;:&quot;2673-4117&quot;,&quot;issued&quot;:{&quot;date-parts&quot;:[[2024,8,17]]},&quot;page&quot;:&quot;1961-1979&quot;,&quot;abstract&quot;:&quot;&lt;p&gt;This paper provides a recent overview of the exact, approximate, and hybrid optimization methods that handle Multi-Objective Mixed-Integer Non-Linear Programming (MO-MINLP) problems. Both the domains of exact and approximate research have experienced significant growth, driven by their shared goal of addressing a wide range of real-world problems. This work presents a comprehensive literature review that highlights the significant theoretical contributions in the field of hybrid approaches between these research areas. We also point out possible research gaps in the literature. Hence, the main research questions to be answered in this paper involve the following: (1) how to exactly or approximately solve a MO-MINLP problem? (2) What are the drawbacks of exact methods as well as approximate methods? (3) What are the research lines that are currently underway to enhance the performances of these methods? and (4) Where are the research gaps in this field? This work aims to provide enough descriptive information for newcomers in this area about the research that has been carried out and that is currently underway concerning exact, approximate, and hybrid methods used to solve MO-MINLP problems.&lt;/p&gt;&quot;,&quot;issue&quot;:&quot;3&quot;,&quot;volume&quot;:&quot;5&quot;,&quot;container-title-short&quot;:&quot;&quot;},&quot;isTemporary&quot;:false}]},{&quot;citationID&quot;:&quot;MENDELEY_CITATION_43edfd88-7e00-44e3-af12-138762045627&quot;,&quot;properties&quot;:{&quot;noteIndex&quot;:0},&quot;isEdited&quot;:false,&quot;manualOverride&quot;:{&quot;isManuallyOverridden&quot;:false,&quot;citeprocText&quot;:&quot;[31]&quot;,&quot;manualOverrideText&quot;:&quot;&quot;},&quot;citationTag&quot;:&quot;MENDELEY_CITATION_v3_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&quot;,&quot;citationItems&quot;:[{&quot;id&quot;:&quot;3491985c-2e0b-31bc-84e8-6823f88df629&quot;,&quot;itemData&quot;:{&quot;type&quot;:&quot;article-journal&quot;,&quot;id&quot;:&quot;3491985c-2e0b-31bc-84e8-6823f88df629&quot;,&quot;title&quot;:&quot;Multi-objective stochastic optimization problem: a systematic literature review&quot;,&quot;author&quot;:[{&quot;family&quot;:&quot;Pirouz&quot;,&quot;given&quot;:&quot;Behzad&quot;,&quot;parse-names&quot;:false,&quot;dropping-particle&quot;:&quot;&quot;,&quot;non-dropping-particle&quot;:&quot;&quot;},{&quot;family&quot;:&quot;Guerriero&quot;,&quot;given&quot;:&quot;Francesca&quot;,&quot;parse-names&quot;:false,&quot;dropping-particle&quot;:&quot;&quot;,&quot;non-dropping-particle&quot;:&quot;&quot;}],&quot;container-title&quot;:&quot;Applied Energy&quot;,&quot;DOI&quot;:&quot;10.1016/j.apenergy.2025.127237&quot;,&quot;ISSN&quot;:&quot;03062619&quot;,&quot;issued&quot;:{&quot;date-parts&quot;:[[2026,2]]},&quot;page&quot;:&quot;127237&quot;,&quot;volume&quot;:&quot;405&quot;,&quot;container-title-short&quot;:&quot;Appl. Energy&quot;},&quot;isTemporary&quot;:false}]},{&quot;citationID&quot;:&quot;MENDELEY_CITATION_b6249101-b808-40c8-a033-78980999aeb7&quot;,&quot;properties&quot;:{&quot;noteIndex&quot;:0},&quot;isEdited&quot;:false,&quot;manualOverride&quot;:{&quot;isManuallyOverridden&quot;:false,&quot;citeprocText&quot;:&quot;[32]&quot;,&quot;manualOverrideText&quot;:&quot;&quot;},&quot;citationTag&quot;:&quot;MENDELEY_CITATION_v3_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&quot;,&quot;citationItems&quot;:[{&quot;id&quot;:&quot;54e38a01-fa83-3801-a318-6f19e94cb79c&quot;,&quot;itemData&quot;:{&quot;type&quot;:&quot;article-journal&quot;,&quot;id&quot;:&quot;54e38a01-fa83-3801-a318-6f19e94cb79c&quot;,&quot;title&quot;:&quot;A review on recent standalone and grid integrated hybrid renewable energy systems: System optimization and energy management strategies&quot;,&quot;author&quot;:[{&quot;family&quot;:&quot;Basnet&quot;,&quot;given&quot;:&quot;Sarad&quot;,&quot;parse-names&quot;:false,&quot;dropping-particle&quot;:&quot;&quot;,&quot;non-dropping-particle&quot;:&quot;&quot;},{&quot;family&quot;:&quot;Deschinkel&quot;,&quot;given&quot;:&quot;Karine&quot;,&quot;parse-names&quot;:false,&quot;dropping-particle&quot;:&quot;&quot;,&quot;non-dropping-particle&quot;:&quot;&quot;},{&quot;family&quot;:&quot;Moyne&quot;,&quot;given&quot;:&quot;Luis&quot;,&quot;parse-names&quot;:false,&quot;dropping-particle&quot;:&quot;&quot;,&quot;non-dropping-particle&quot;:&quot;Le&quot;},{&quot;family&quot;:&quot;Cécile Péra&quot;,&quot;given&quot;:&quot;Marie&quot;,&quot;parse-names&quot;:false,&quot;dropping-particle&quot;:&quot;&quot;,&quot;non-dropping-particle&quot;:&quot;&quot;}],&quot;container-title&quot;:&quot;Renewable Energy Focus&quot;,&quot;DOI&quot;:&quot;10.1016/j.ref.2023.06.001&quot;,&quot;ISSN&quot;:&quot;17550084&quot;,&quot;issued&quot;:{&quot;date-parts&quot;:[[2023,9]]},&quot;page&quot;:&quot;103-125&quot;,&quot;volume&quot;:&quot;46&quot;,&quot;container-title-short&quot;:&quot;&quot;},&quot;isTemporary&quot;:false}]},{&quot;citationID&quot;:&quot;MENDELEY_CITATION_9c9f6d6b-0d28-4cda-88a9-65954fd94b49&quot;,&quot;properties&quot;:{&quot;noteIndex&quot;:0},&quot;isEdited&quot;:false,&quot;manualOverride&quot;:{&quot;isManuallyOverridden&quot;:false,&quot;citeprocText&quot;:&quot;[33]&quot;,&quot;manualOverrideText&quot;:&quot;&quot;},&quot;citationTag&quot;:&quot;MENDELEY_CITATION_v3_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&quot;,&quot;citationItems&quot;:[{&quot;id&quot;:&quot;a7dd1c28-2105-373b-8623-5d74e7cdc012&quot;,&quot;itemData&quot;:{&quot;type&quot;:&quot;article-journal&quot;,&quot;id&quot;:&quot;a7dd1c28-2105-373b-8623-5d74e7cdc012&quot;,&quot;title&quot;:&quot;A Survey on Mixed-Integer Programming Techniques in Bilevel Optimization&quot;,&quot;author&quot;:[{&quot;family&quot;:&quot;Kleinert&quot;,&quot;given&quot;:&quot;Thomas&quot;,&quot;parse-names&quot;:false,&quot;dropping-particle&quot;:&quot;&quot;,&quot;non-dropping-particle&quot;:&quot;&quot;},{&quot;family&quot;:&quot;Labbé&quot;,&quot;given&quot;:&quot;Martine&quot;,&quot;parse-names&quot;:false,&quot;dropping-particle&quot;:&quot;&quot;,&quot;non-dropping-particle&quot;:&quot;&quot;},{&quot;family&quot;:&quot;Ljubić&quot;,&quot;given&quot;:&quot;Ivana&quot;,&quot;parse-names&quot;:false,&quot;dropping-particle&quot;:&quot;&quot;,&quot;non-dropping-particle&quot;:&quot;&quot;},{&quot;family&quot;:&quot;Schmidt&quot;,&quot;given&quot;:&quot;Martin&quot;,&quot;parse-names&quot;:false,&quot;dropping-particle&quot;:&quot;&quot;,&quot;non-dropping-particle&quot;:&quot;&quot;}],&quot;container-title&quot;:&quot;EURO Journal on Computational Optimization&quot;,&quot;DOI&quot;:&quot;10.1016/j.ejco.2021.100007&quot;,&quot;ISSN&quot;:&quot;21924406&quot;,&quot;issued&quot;:{&quot;date-parts&quot;:[[2021]]},&quot;page&quot;:&quot;100007&quot;,&quot;volume&quot;:&quot;9&quot;,&quot;container-title-short&quot;:&quot;&quot;},&quot;isTemporary&quot;:false}]},{&quot;citationID&quot;:&quot;MENDELEY_CITATION_33ef091a-ded0-4a74-8b85-848522b9880f&quot;,&quot;properties&quot;:{&quot;noteIndex&quot;:0},&quot;isEdited&quot;:false,&quot;manualOverride&quot;:{&quot;isManuallyOverridden&quot;:false,&quot;citeprocText&quot;:&quot;[32], [33], [34], [35]&quot;,&quot;manualOverrideText&quot;:&quot;&quot;},&quot;citationTag&quot;:&quot;MENDELEY_CITATION_v3_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&quot;,&quot;citationItems&quot;:[{&quot;id&quot;:&quot;f5b03336-6a29-3705-ac39-a115ab7d476b&quot;,&quot;itemData&quot;:{&quot;type&quot;:&quot;article-journal&quot;,&quot;id&quot;:&quot;f5b03336-6a29-3705-ac39-a115ab7d476b&quot;,&quot;title&quot;:&quot;Recent advances in mathematical programming techniques for the optimization of process systems under uncertainty&quot;,&quot;author&quot;:[{&quot;family&quot;:&quot;Grossmann&quot;,&quot;given&quot;:&quot;Ignacio E.&quot;,&quot;parse-names&quot;:false,&quot;dropping-particle&quot;:&quot;&quot;,&quot;non-dropping-particle&quot;:&quot;&quot;},{&quot;family&quot;:&quot;Apap&quot;,&quot;given&quot;:&quot;Robert M.&quot;,&quot;parse-names&quot;:false,&quot;dropping-particle&quot;:&quot;&quot;,&quot;non-dropping-particle&quot;:&quot;&quot;},{&quot;family&quot;:&quot;Calfa&quot;,&quot;given&quot;:&quot;Bruno A.&quot;,&quot;parse-names&quot;:false,&quot;dropping-particle&quot;:&quot;&quot;,&quot;non-dropping-particle&quot;:&quot;&quot;},{&quot;family&quot;:&quot;García-Herreros&quot;,&quot;given&quot;:&quot;Pablo&quot;,&quot;parse-names&quot;:false,&quot;dropping-particle&quot;:&quot;&quot;,&quot;non-dropping-particle&quot;:&quot;&quot;},{&quot;family&quot;:&quot;Zhang&quot;,&quot;given&quot;:&quot;Qi&quot;,&quot;parse-names&quot;:false,&quot;dropping-particle&quot;:&quot;&quot;,&quot;non-dropping-particle&quot;:&quot;&quot;}],&quot;container-title&quot;:&quot;Computers &amp; Chemical Engineering&quot;,&quot;DOI&quot;:&quot;10.1016/j.compchemeng.2016.03.002&quot;,&quot;ISSN&quot;:&quot;00981354&quot;,&quot;issued&quot;:{&quot;date-parts&quot;:[[2016,8]]},&quot;page&quot;:&quot;3-14&quot;,&quot;volume&quot;:&quot;91&quot;,&quot;container-title-short&quot;:&quot;Comput. Chem. Eng.&quot;},&quot;isTemporary&quot;:false},{&quot;id&quot;:&quot;1c837bc1-1688-320b-9cef-676437130233&quot;,&quot;itemData&quot;:{&quot;type&quot;:&quot;article-journal&quot;,&quot;id&quot;:&quot;1c837bc1-1688-320b-9cef-676437130233&quot;,&quot;title&quot;:&quot;A Review of Stochastic Programming Methods for Optimization of Process Systems Under Uncertainty&quot;,&quot;author&quot;:[{&quot;family&quot;:&quot;Li&quot;,&quot;given&quot;:&quot;Can&quot;,&quot;parse-names&quot;:false,&quot;dropping-particle&quot;:&quot;&quot;,&quot;non-dropping-particle&quot;:&quot;&quot;},{&quot;family&quot;:&quot;Grossmann&quot;,&quot;given&quot;:&quot;Ignacio E.&quot;,&quot;parse-names&quot;:false,&quot;dropping-particle&quot;:&quot;&quot;,&quot;non-dropping-particle&quot;:&quot;&quot;}],&quot;container-title&quot;:&quot;Frontiers in Chemical Engineering&quot;,&quot;DOI&quot;:&quot;10.3389/fceng.2020.622241&quot;,&quot;ISSN&quot;:&quot;2673-2718&quot;,&quot;issued&quot;:{&quot;date-parts&quot;:[[2021,1,28]]},&quot;abstract&quot;:&quot;&lt;p&gt;Uncertainties are widespread in the optimization of process systems, such as uncertainties in process technologies, prices, and customer demands. In this paper, we review the basic concepts and recent advances of a risk-neutral mathematical framework called “stochastic programming” and its applications in solving process systems engineering problems under uncertainty. This review intends to provide both a tutorial for beginners without prior experience and a high-level overview of the current state-of-the-art developments for experts in process systems engineering and stochastic programming. The mathematical formulations and algorithms for two-stage and multistage stochastic programming are reviewed with illustrative examples from process industries. The differences between stochastic programming under exogenous uncertainty and endogenous uncertainties are discussed. The concepts and several data-driven methods for generating scenario trees are also reviewed.&lt;/p&gt;&quot;,&quot;volume&quot;:&quot;2&quot;,&quot;container-title-short&quot;:&quot;&quot;},&quot;isTemporary&quot;:false},{&quot;id&quot;:&quot;a7dd1c28-2105-373b-8623-5d74e7cdc012&quot;,&quot;itemData&quot;:{&quot;type&quot;:&quot;article-journal&quot;,&quot;id&quot;:&quot;a7dd1c28-2105-373b-8623-5d74e7cdc012&quot;,&quot;title&quot;:&quot;A Survey on Mixed-Integer Programming Techniques in Bilevel Optimization&quot;,&quot;author&quot;:[{&quot;family&quot;:&quot;Kleinert&quot;,&quot;given&quot;:&quot;Thomas&quot;,&quot;parse-names&quot;:false,&quot;dropping-particle&quot;:&quot;&quot;,&quot;non-dropping-particle&quot;:&quot;&quot;},{&quot;family&quot;:&quot;Labbé&quot;,&quot;given&quot;:&quot;Martine&quot;,&quot;parse-names&quot;:false,&quot;dropping-particle&quot;:&quot;&quot;,&quot;non-dropping-particle&quot;:&quot;&quot;},{&quot;family&quot;:&quot;Ljubić&quot;,&quot;given&quot;:&quot;Ivana&quot;,&quot;parse-names&quot;:false,&quot;dropping-particle&quot;:&quot;&quot;,&quot;non-dropping-particle&quot;:&quot;&quot;},{&quot;family&quot;:&quot;Schmidt&quot;,&quot;given&quot;:&quot;Martin&quot;,&quot;parse-names&quot;:false,&quot;dropping-particle&quot;:&quot;&quot;,&quot;non-dropping-particle&quot;:&quot;&quot;}],&quot;container-title&quot;:&quot;EURO Journal on Computational Optimization&quot;,&quot;DOI&quot;:&quot;10.1016/j.ejco.2021.100007&quot;,&quot;ISSN&quot;:&quot;21924406&quot;,&quot;issued&quot;:{&quot;date-parts&quot;:[[2021]]},&quot;page&quot;:&quot;100007&quot;,&quot;volume&quot;:&quot;9&quot;,&quot;container-title-short&quot;:&quot;&quot;},&quot;isTemporary&quot;:false},{&quot;id&quot;:&quot;54e38a01-fa83-3801-a318-6f19e94cb79c&quot;,&quot;itemData&quot;:{&quot;type&quot;:&quot;article-journal&quot;,&quot;id&quot;:&quot;54e38a01-fa83-3801-a318-6f19e94cb79c&quot;,&quot;title&quot;:&quot;A review on recent standalone and grid integrated hybrid renewable energy systems: System optimization and energy management strategies&quot;,&quot;author&quot;:[{&quot;family&quot;:&quot;Basnet&quot;,&quot;given&quot;:&quot;Sarad&quot;,&quot;parse-names&quot;:false,&quot;dropping-particle&quot;:&quot;&quot;,&quot;non-dropping-particle&quot;:&quot;&quot;},{&quot;family&quot;:&quot;Deschinkel&quot;,&quot;given&quot;:&quot;Karine&quot;,&quot;parse-names&quot;:false,&quot;dropping-particle&quot;:&quot;&quot;,&quot;non-dropping-particle&quot;:&quot;&quot;},{&quot;family&quot;:&quot;Moyne&quot;,&quot;given&quot;:&quot;Luis&quot;,&quot;parse-names&quot;:false,&quot;dropping-particle&quot;:&quot;&quot;,&quot;non-dropping-particle&quot;:&quot;Le&quot;},{&quot;family&quot;:&quot;Cécile Péra&quot;,&quot;given&quot;:&quot;Marie&quot;,&quot;parse-names&quot;:false,&quot;dropping-particle&quot;:&quot;&quot;,&quot;non-dropping-particle&quot;:&quot;&quot;}],&quot;container-title&quot;:&quot;Renewable Energy Focus&quot;,&quot;DOI&quot;:&quot;10.1016/j.ref.2023.06.001&quot;,&quot;ISSN&quot;:&quot;17550084&quot;,&quot;issued&quot;:{&quot;date-parts&quot;:[[2023,9]]},&quot;page&quot;:&quot;103-125&quot;,&quot;volume&quot;:&quot;46&quot;,&quot;container-title-short&quot;:&quot;&quot;},&quot;isTemporary&quot;:false}]},{&quot;citationID&quot;:&quot;MENDELEY_CITATION_4a4c6769-de4f-4723-ad1a-7b324cf3f736&quot;,&quot;properties&quot;:{&quot;noteIndex&quot;:0},&quot;isEdited&quot;:false,&quot;manualOverride&quot;:{&quot;isManuallyOverridden&quot;:false,&quot;citeprocText&quot;:&quot;[36]&quot;,&quot;manualOverrideText&quot;:&quot;&quot;},&quot;citationTag&quot;:&quot;MENDELEY_CITATION_v3_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&quot;,&quot;citationItems&quot;:[{&quot;id&quot;:&quot;657631e7-7854-321d-9660-90161531164b&quot;,&quot;itemData&quot;:{&quot;type&quot;:&quot;article-journal&quot;,&quot;id&quot;:&quot;657631e7-7854-321d-9660-90161531164b&quot;,&quot;title&quot;:&quot;Integrating multi-objective superstructure optimization and multi-criteria assessment: a novel methodology for sustainable process design&quot;,&quot;author&quot;:[{&quot;family&quot;:&quot;Kenkel&quot;,&quot;given&quot;:&quot;Philipp&quot;,&quot;parse-names&quot;:false,&quot;dropping-particle&quot;:&quot;&quot;,&quot;non-dropping-particle&quot;:&quot;&quot;},{&quot;family&quot;:&quot;Schnuelle&quot;,&quot;given&quot;:&quot;Christian&quot;,&quot;parse-names&quot;:false,&quot;dropping-particle&quot;:&quot;&quot;,&quot;non-dropping-particle&quot;:&quot;&quot;},{&quot;family&quot;:&quot;Wassermann&quot;,&quot;given&quot;:&quot;Timo&quot;,&quot;parse-names&quot;:false,&quot;dropping-particle&quot;:&quot;&quot;,&quot;non-dropping-particle&quot;:&quot;&quot;},{&quot;family&quot;:&quot;Zondervan&quot;,&quot;given&quot;:&quot;Edwin&quot;,&quot;parse-names&quot;:false,&quot;dropping-particle&quot;:&quot;&quot;,&quot;non-dropping-particle&quot;:&quot;&quot;}],&quot;container-title&quot;:&quot;Physical Sciences Reviews&quot;,&quot;DOI&quot;:&quot;10.1515/psr-2020-0058&quot;,&quot;ISSN&quot;:&quot;2365-659X&quot;,&quot;issued&quot;:{&quot;date-parts&quot;:[[2023,9,25]]},&quot;page&quot;:&quot;2361-2394&quot;,&quot;abstract&quot;:&quot;&lt;p&gt; This work presents a novel methodology for integrated multi-objective superstructure optimization and multi-criteria assessment. The method is tailored for sustainable process synthesis utilizing mixed-integer linear programming (MILP). The six-step algorithm includes 1) superstructure formulation, 2) criteria definition and implementation, 3) criteria weighting, 4) single-criterion optimization, 5) reformulation and 6) multi-criteria optimization. It is automated in the &lt;bold&gt; &lt;italic&gt;O&lt;/italic&gt; &lt;/bold&gt; &lt;italic&gt;pen s&lt;/italic&gt; &lt;bold&gt; &lt;italic&gt;U&lt;/italic&gt; &lt;/bold&gt; &lt;italic&gt;perstruc&lt;/italic&gt; &lt;bold&gt; &lt;italic&gt;T&lt;/italic&gt; &lt;/bold&gt; &lt;italic&gt;ure mo&lt;/italic&gt; &lt;bold&gt; &lt;italic&gt;D&lt;/italic&gt; &lt;/bold&gt; &lt;italic&gt;eling and&lt;/italic&gt; &lt;bold&gt; &lt;italic&gt;O&lt;/italic&gt; &lt;/bold&gt; &lt;italic&gt;ptimizati&lt;/italic&gt; &lt;bold&gt; &lt;italic&gt;O&lt;/italic&gt; &lt;/bold&gt; &lt;italic&gt;n f&lt;/italic&gt; &lt;bold&gt; &lt;italic&gt;R&lt;/italic&gt; &lt;/bold&gt; &lt;italic&gt;amework&lt;/italic&gt; (OUTDOOR) and tested on integrated power-to-X and biomass-to-X processes for methanol production. Three criteria are considered, namely net production costs ( &lt;italic&gt;NPC&lt;/italic&gt; ), net production greenhouse gas emissions ( &lt;italic&gt;NPE&lt;/italic&gt; ) and net production fresh water demand ( &lt;italic&gt;NPFWD&lt;/italic&gt; ). The optimization indicates &lt;italic&gt;NPC&lt;/italic&gt; of 1307 €/t &lt;sub&gt;MeOH&lt;/sub&gt; with &lt;italic&gt;NPE&lt;/italic&gt; of −2.23 &lt;inline-formula id=\&quot;j_psr-2020-0058_ineq_001\&quot;&gt; &lt;alternatives&gt; &lt;math&gt; &lt;mrow&gt; &lt;msub&gt; &lt;mtext&gt;t&lt;/mtext&gt; &lt;msub&gt; &lt;mtext&gt;CO&lt;/mtext&gt; &lt;mn&gt;2&lt;/mn&gt; &lt;/msub&gt; &lt;/msub&gt; &lt;mo&gt;/&lt;/mo&gt; &lt;msub&gt; &lt;mtext&gt;t&lt;/mtext&gt; &lt;mtext&gt;MeOH&lt;/mtext&gt; &lt;/msub&gt; &lt;/mrow&gt; &lt;/math&gt; &lt;tex-math&gt;${\\text{t}}_{{\\text{CO}}_{2}}/{\\text{t}}_{\\text{MeOH}}$&lt;/tex-math&gt; &lt;inline-graphic href=\&quot;graphic/j_psr-2020-0058_ineq_001.png\&quot;/&gt; &lt;/alternatives&gt; &lt;/inline-formula&gt; and &lt;italic&gt;NPFWD&lt;/italic&gt; of −3.42 &lt;inline-formula id=\&quot;j_psr-2020-0058_ineq_002\&quot;&gt; &lt;alternatives&gt; &lt;math&gt; &lt;mrow&gt; &lt;msub&gt; &lt;mtext&gt;t&lt;/mtext&gt; &lt;mrow&gt; &lt;msub&gt; &lt;mtext&gt;H&lt;/mtext&gt; &lt;mn&gt;2&lt;/mn&gt; &lt;/msub&gt; &lt;mtext&gt;O&lt;/mtext&gt; &lt;/mrow&gt; &lt;/msub&gt; &lt;mo&gt;/&lt;/mo&gt; &lt;msub&gt; &lt;mtext&gt;t&lt;/mtext&gt; &lt;mtext&gt;MeOH&lt;/mtext&gt; &lt;/msub&gt; &lt;/mrow&gt; &lt;/math&gt; &lt;tex-math&gt;${\\text{t}}_{{\\text{H}}_{2}\\text{O}}/{\\text{t}}_{\\text{MeOH}}$&lt;/tex-math&gt; &lt;inline-graphic href=\&quot;graphic/j_psr-2020-0058_ineq_002.png\&quot;/&gt; &lt;/alternatives&gt; &lt;/inline-formula&gt; for an optimal trade-off plant. The plant configuration features low-pressure alkaline electrolysis for hydrogen supply, absorption-based CO &lt;sub&gt;2&lt;/sub&gt; capture and steam production from methanol purge gas for internal heat supply. Conducted variation and sensitivity analyses indicate that methanol costs can drop to about 500 €/t &lt;sub&gt;MeOH&lt;/sub&gt; if electricity is free of charge, or to 805 €/t &lt;sub&gt;MeOH&lt;/sub&gt; if biogas is available at large quantities, if a least-cost process layouts are considered. However, all performed multi-criteria analyses imply a robust optimal process design utilizing electricity-based methanol production. &lt;/p&gt;&quot;,&quot;issue&quot;:&quot;9&quot;,&quot;volume&quot;:&quot;8&quot;,&quot;container-title-short&quot;:&quot;&quot;},&quot;isTemporary&quot;:false}]},{&quot;citationID&quot;:&quot;MENDELEY_CITATION_17f6286c-8eea-4653-85d8-bedf5256b8a1&quot;,&quot;properties&quot;:{&quot;noteIndex&quot;:0},&quot;isEdited&quot;:false,&quot;manualOverride&quot;:{&quot;isManuallyOverridden&quot;:false,&quot;citeprocText&quot;:&quot;[37]&quot;,&quot;manualOverrideText&quot;:&quot;&quot;},&quot;citationTag&quot;:&quot;MENDELEY_CITATION_v3_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&quot;,&quot;citationItems&quot;:[{&quot;id&quot;:&quot;a94934b4-96b0-3079-8b75-f945ca40e652&quot;,&quot;itemData&quot;:{&quot;type&quot;:&quot;article-journal&quot;,&quot;id&quot;:&quot;a94934b4-96b0-3079-8b75-f945ca40e652&quot;,&quot;title&quot;:&quot;Multi-Objective Optimization of an Energy Community Powered by a Distributed Polygeneration System&quot;,&quot;author&quot;:[{&quot;family&quot;:&quot;Souza&quot;,&quot;given&quot;:&quot;Ronelly José&quot;,&quot;parse-names&quot;:false,&quot;dropping-particle&quot;:&quot;&quot;,&quot;non-dropping-particle&quot;:&quot;De&quot;},{&quot;family&quot;:&quot;Reini&quot;,&quot;given&quot;:&quot;Mauro&quot;,&quot;parse-names&quot;:false,&quot;dropping-particle&quot;:&quot;&quot;,&quot;non-dropping-particle&quot;:&quot;&quot;},{&quot;family&quot;:&quot;Serra&quot;,&quot;given&quot;:&quot;Luis M.&quot;,&quot;parse-names&quot;:false,&quot;dropping-particle&quot;:&quot;&quot;,&quot;non-dropping-particle&quot;:&quot;&quot;},{&quot;family&quot;:&quot;Lozano&quot;,&quot;given&quot;:&quot;Miguel A.&quot;,&quot;parse-names&quot;:false,&quot;dropping-particle&quot;:&quot;&quot;,&quot;non-dropping-particle&quot;:&quot;&quot;},{&quot;family&quot;:&quot;Nadalon&quot;,&quot;given&quot;:&quot;Emanuele&quot;,&quot;parse-names&quot;:false,&quot;dropping-particle&quot;:&quot;&quot;,&quot;non-dropping-particle&quot;:&quot;&quot;},{&quot;family&quot;:&quot;Casisi&quot;,&quot;given&quot;:&quot;Melchiorre&quot;,&quot;parse-names&quot;:false,&quot;dropping-particle&quot;:&quot;&quot;,&quot;non-dropping-particle&quot;:&quot;&quot;}],&quot;container-title&quot;:&quot;Energies&quot;,&quot;DOI&quot;:&quot;10.3390/en17133085&quot;,&quot;ISSN&quot;:&quot;1996-1073&quot;,&quot;issued&quot;:{&quot;date-parts&quot;:[[2024,6,22]]},&quot;page&quot;:&quot;3085&quot;,&quot;abstract&quot;:&quot;&lt;p&gt;This paper presents a multi-objective optimization model for the integration of polygeneration systems into energy communities (ECs), by analyzing a case study. The concept of ECs is increasingly seen as beneficial for reducing global energy consumption and greenhouse gas emissions. Polygeneration systems have the potential to play a crucial role in this context, since they are known for producing multiple energy services from a single energy resource, besides the possibility of being fed also by renewable energy sources. However, optimizing the configuration and operation of these systems within ECs presents complex challenges due to the variety of technologies involved, their interactions, and the dynamic behavior of buildings. Therefore, the aim of this work is developing a mathematical model using a mixed integer linear programming (MILP) algorithm to optimally design and operate polygeneration systems integrated into ECs. The model is applied to a case study of an EC comprising nine buildings in a small city in the northeast of Italy. The work rests on the single- and multi-objective optimization of the polygeneration systems taking into account the sharing of electricity among the buildings (both self-produced and/or the purchased from the grid), as well as the sharing of heating and cooling between the buildings through a district heating and cooling network (DHCN). The main results from the EC case study show the possibility of reducing the total annual CO2 emissions by around 24.3% (about 1.72 kt CO2/year) while increasing the total annual costs by 1.9% (about 0.09 M€/year) or reducing the total annual costs by 31.9% (about 1.47 M€/year) while increasing the total annual CO2 emissions by 2.2% (about 0.16 kt CO2/year). The work developed within this research can be adapted to different case studies, such as in the residential–commercial buildings and industrial sectors. Therefore, the model resulting from this work constitutes an effective tool to optimally design and operate polygeneration systems integrated into ECs.&lt;/p&gt;&quot;,&quot;issue&quot;:&quot;13&quot;,&quot;volume&quot;:&quot;17&quot;,&quot;container-title-short&quot;:&quot;Energies (Basel).&quot;},&quot;isTemporary&quot;:false}]},{&quot;citationID&quot;:&quot;MENDELEY_CITATION_94464e02-64aa-4b84-948c-989aee7cb4eb&quot;,&quot;properties&quot;:{&quot;noteIndex&quot;:0},&quot;isEdited&quot;:false,&quot;manualOverride&quot;:{&quot;isManuallyOverridden&quot;:false,&quot;citeprocText&quot;:&quot;[38]&quot;,&quot;manualOverrideText&quot;:&quot;&quot;},&quot;citationTag&quot;:&quot;MENDELEY_CITATION_v3_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&quot;,&quot;citationItems&quot;:[{&quot;id&quot;:&quot;39e6e63a-abdc-38b4-bc7e-087f23193300&quot;,&quot;itemData&quot;:{&quot;type&quot;:&quot;article-journal&quot;,&quot;id&quot;:&quot;39e6e63a-abdc-38b4-bc7e-087f23193300&quot;,&quot;title&quot;:&quot;Energy Demand Response in a Food-Processing Plant: A Deep Reinforcement Learning Approach&quot;,&quot;author&quot;:[{&quot;family&quot;:&quot;Wohlgenannt&quot;,&quot;given&quot;:&quot;Philipp&quot;,&quot;parse-names&quot;:false,&quot;dropping-particle&quot;:&quot;&quot;,&quot;non-dropping-particle&quot;:&quot;&quot;},{&quot;family&quot;:&quot;Hegenbart&quot;,&quot;given&quot;:&quot;Sebastian&quot;,&quot;parse-names&quot;:false,&quot;dropping-particle&quot;:&quot;&quot;,&quot;non-dropping-particle&quot;:&quot;&quot;},{&quot;family&quot;:&quot;Eder&quot;,&quot;given&quot;:&quot;Elias&quot;,&quot;parse-names&quot;:false,&quot;dropping-particle&quot;:&quot;&quot;,&quot;non-dropping-particle&quot;:&quot;&quot;},{&quot;family&quot;:&quot;Kolhe&quot;,&quot;given&quot;:&quot;Mohan&quot;,&quot;parse-names&quot;:false,&quot;dropping-particle&quot;:&quot;&quot;,&quot;non-dropping-particle&quot;:&quot;&quot;},{&quot;family&quot;:&quot;Kepplinger&quot;,&quot;given&quot;:&quot;Peter&quot;,&quot;parse-names&quot;:false,&quot;dropping-particle&quot;:&quot;&quot;,&quot;non-dropping-particle&quot;:&quot;&quot;}],&quot;container-title&quot;:&quot;Energies&quot;,&quot;container-title-short&quot;:&quot;Energies (Basel).&quot;,&quot;DOI&quot;:&quot;10.3390/en17246430&quot;,&quot;ISSN&quot;:&quot;1996-1073&quot;,&quot;issued&quot;:{&quot;date-parts&quot;:[[2024,12,20]]},&quot;page&quot;:&quot;6430&quot;,&quot;abstract&quot;:&quot;&lt;p&gt;The food industry faces significant challenges in managing operational costs due to its high energy intensity and rising energy prices. Industrial food-processing facilities, with substantial thermal capacities and large demands for cooling and heating, offer promising opportunities for demand response (DR) strategies. This study explores the application of deep reinforcement learning (RL) as an innovative, data-driven approach for DR in the food industry. By leveraging the adaptive, self-learning capabilities of RL, energy costs in the investigated plant are effectively decreased. The RL algorithm was compared with the well-established optimization method Mixed Integer Linear Programming (MILP), and both were benchmarked against a reference scenario without DR. The two optimization strategies demonstrate cost savings of 17.57% and 18.65% for RL and MILP, respectively. Although RL is slightly less efficient in cost reduction, it significantly outperforms in computational speed, being approximately 20 times faster. During operation, RL only needs 2ms per optimization compared to 19s for MILP, making it a promising optimization tool for edge computing. Moreover, while MILP’s computation time increases considerably with the number of binary variables, RL efficiently learns dynamic system behavior and scales to more complex systems without significant performance degradation. These results highlight that deep RL, when applied to DR, offers substantial cost savings and computational efficiency, with broad applicability to energy management in various applications.&lt;/p&gt;&quot;,&quot;issue&quot;:&quot;24&quot;,&quot;volume&quot;:&quot;17&quot;},&quot;isTemporary&quot;:false}]},{&quot;citationID&quot;:&quot;MENDELEY_CITATION_f6ee1e61-1bbe-43ae-916b-e4b52f3e034f&quot;,&quot;properties&quot;:{&quot;noteIndex&quot;:0},&quot;isEdited&quot;:false,&quot;manualOverride&quot;:{&quot;isManuallyOverridden&quot;:false,&quot;citeprocText&quot;:&quot;[39]&quot;,&quot;manualOverrideText&quot;:&quot;&quot;},&quot;citationTag&quot;:&quot;MENDELEY_CITATION_v3_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&quot;,&quot;citationItems&quot;:[{&quot;id&quot;:&quot;db0b8039-29f3-359f-944c-e94a21d1ea11&quot;,&quot;itemData&quot;:{&quot;type&quot;:&quot;paper-conference&quot;,&quot;id&quot;:&quot;db0b8039-29f3-359f-944c-e94a21d1ea11&quot;,&quot;title&quot;:&quot;Performance Comparison of Deep RL Algorithms for Energy Systems Optimal Scheduling&quot;,&quot;author&quot;:[{&quot;family&quot;:&quot;Shengren&quot;,&quot;given&quot;:&quot;Hou&quot;,&quot;parse-names&quot;:false,&quot;dropping-particle&quot;:&quot;&quot;,&quot;non-dropping-particle&quot;:&quot;&quot;},{&quot;family&quot;:&quot;Salazar&quot;,&quot;given&quot;:&quot;Edgar Mauricio&quot;,&quot;parse-names&quot;:false,&quot;dropping-particle&quot;:&quot;&quot;,&quot;non-dropping-particle&quot;:&quot;&quot;},{&quot;family&quot;:&quot;Vergara&quot;,&quot;given&quot;:&quot;Pedro P.&quot;,&quot;parse-names&quot;:false,&quot;dropping-particle&quot;:&quot;&quot;,&quot;non-dropping-particle&quot;:&quot;&quot;},{&quot;family&quot;:&quot;Palensky&quot;,&quot;given&quot;:&quot;Peter&quot;,&quot;parse-names&quot;:false,&quot;dropping-particle&quot;:&quot;&quot;,&quot;non-dropping-particle&quot;:&quot;&quot;}],&quot;container-title&quot;:&quot;2022 IEEE PES Innovative Smart Grid Technologies Conference Europe (ISGT-Europe)&quot;,&quot;DOI&quot;:&quot;10.1109/ISGT-Europe54678.2022.9960642&quot;,&quot;ISBN&quot;:&quot;978-1-6654-8032-1&quot;,&quot;issued&quot;:{&quot;date-parts&quot;:[[2022,10,10]]},&quot;page&quot;:&quot;1-6&quot;,&quot;publisher&quot;:&quot;IEEE&quot;,&quot;container-title-short&quot;:&quot;&quot;},&quot;isTemporary&quot;:false}]},{&quot;citationID&quot;:&quot;MENDELEY_CITATION_96ae9baa-ea86-4a08-9c4f-af9c24e3165b&quot;,&quot;properties&quot;:{&quot;noteIndex&quot;:0},&quot;isEdited&quot;:false,&quot;manualOverride&quot;:{&quot;isManuallyOverridden&quot;:false,&quot;citeprocText&quot;:&quot;[40]&quot;,&quot;manualOverrideText&quot;:&quot;&quot;},&quot;citationTag&quot;:&quot;MENDELEY_CITATION_v3_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&quot;,&quot;citationItems&quot;:[{&quot;id&quot;:&quot;24483df0-3b18-335c-b6c9-40541914d90d&quot;,&quot;itemData&quot;:{&quot;type&quot;:&quot;article-journal&quot;,&quot;id&quot;:&quot;24483df0-3b18-335c-b6c9-40541914d90d&quot;,&quot;title&quot;:&quot;Mixed Deep Reinforcement Learning Considering Discrete-continuous Hybrid Action Space for Smart Home Energy Management&quot;,&quot;author&quot;:[{&quot;family&quot;:&quot;Huang&quot;,&quot;given&quot;:&quot;Chao&quot;,&quot;parse-names&quot;:false,&quot;dropping-particle&quot;:&quot;&quot;,&quot;non-dropping-particle&quot;:&quot;&quot;},{&quot;family&quot;:&quot;Zhang&quot;,&quot;given&quot;:&quot;Hongcai&quot;,&quot;parse-names&quot;:false,&quot;dropping-particle&quot;:&quot;&quot;,&quot;non-dropping-particle&quot;:&quot;&quot;},{&quot;family&quot;:&quot;Wang&quot;,&quot;given&quot;:&quot;Long&quot;,&quot;parse-names&quot;:false,&quot;dropping-particle&quot;:&quot;&quot;,&quot;non-dropping-particle&quot;:&quot;&quot;},{&quot;family&quot;:&quot;Luo&quot;,&quot;given&quot;:&quot;Xiong&quot;,&quot;parse-names&quot;:false,&quot;dropping-particle&quot;:&quot;&quot;,&quot;non-dropping-particle&quot;:&quot;&quot;},{&quot;family&quot;:&quot;Song&quot;,&quot;given&quot;:&quot;Yonghua&quot;,&quot;parse-names&quot;:false,&quot;dropping-particle&quot;:&quot;&quot;,&quot;non-dropping-particle&quot;:&quot;&quot;}],&quot;container-title&quot;:&quot;Journal of Modern Power Systems and Clean Energy&quot;,&quot;DOI&quot;:&quot;10.35833/MPCE.2021.000394&quot;,&quot;ISSN&quot;:&quot;2196-5625&quot;,&quot;issued&quot;:{&quot;date-parts&quot;:[[2022]]},&quot;page&quot;:&quot;743-754&quot;,&quot;issue&quot;:&quot;3&quot;,&quot;volume&quot;:&quot;10&quot;,&quot;container-title-short&quot;:&quot;&quot;},&quot;isTemporary&quot;:false}]},{&quot;citationID&quot;:&quot;MENDELEY_CITATION_6c73ec7e-f594-40ea-aad9-4c624f81d6ce&quot;,&quot;properties&quot;:{&quot;noteIndex&quot;:0},&quot;isEdited&quot;:false,&quot;manualOverride&quot;:{&quot;isManuallyOverridden&quot;:false,&quot;citeprocText&quot;:&quot;[41]&quot;,&quot;manualOverrideText&quot;:&quot;&quot;},&quot;citationTag&quot;:&quot;MENDELEY_CITATION_v3_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&quot;,&quot;citationItems&quot;:[{&quot;id&quot;:&quot;e6b87f49-da3a-31c2-9708-c2655a7acf54&quot;,&quot;itemData&quot;:{&quot;type&quot;:&quot;article-journal&quot;,&quot;id&quot;:&quot;e6b87f49-da3a-31c2-9708-c2655a7acf54&quot;,&quot;title&quot;:&quot;Deep reinforcement learning-based energy management for design and control of off-grid renewable microgrids with dual-battery storage&quot;,&quot;author&quot;:[{&quot;family&quot;:&quot;Khan&quot;,&quot;given&quot;:&quot;Wajid&quot;,&quot;parse-names&quot;:false,&quot;dropping-particle&quot;:&quot;&quot;,&quot;non-dropping-particle&quot;:&quot;&quot;},{&quot;family&quot;:&quot;Renhai&quot;,&quot;given&quot;:&quot;Feng&quot;,&quot;parse-names&quot;:false,&quot;dropping-particle&quot;:&quot;&quot;,&quot;non-dropping-particle&quot;:&quot;&quot;},{&quot;family&quot;:&quot;Aziz&quot;,&quot;given&quot;:&quot;Abdul&quot;,&quot;parse-names&quot;:false,&quot;dropping-particle&quot;:&quot;&quot;,&quot;non-dropping-particle&quot;:&quot;&quot;},{&quot;family&quot;:&quot;Yousaf&quot;,&quot;given&quot;:&quot;Muhammad Zain&quot;,&quot;parse-names&quot;:false,&quot;dropping-particle&quot;:&quot;&quot;,&quot;non-dropping-particle&quot;:&quot;&quot;},{&quot;family&quot;:&quot;Cai&quot;,&quot;given&quot;:&quot;Zhi&quot;,&quot;parse-names&quot;:false,&quot;dropping-particle&quot;:&quot;&quot;,&quot;non-dropping-particle&quot;:&quot;&quot;},{&quot;family&quot;:&quot;Iqbal&quot;,&quot;given&quot;:&quot;Muhammad Umair&quot;,&quot;parse-names&quot;:false,&quot;dropping-particle&quot;:&quot;&quot;,&quot;non-dropping-particle&quot;:&quot;&quot;},{&quot;family&quot;:&quot;Wang&quot;,&quot;given&quot;:&quot;Jiang&quot;,&quot;parse-names&quot;:false,&quot;dropping-particle&quot;:&quot;&quot;,&quot;non-dropping-particle&quot;:&quot;&quot;},{&quot;family&quot;:&quot;Abdullah&quot;,&quot;given&quot;:&quot;Mustafa&quot;,&quot;parse-names&quot;:false,&quot;dropping-particle&quot;:&quot;&quot;,&quot;non-dropping-particle&quot;:&quot;&quot;},{&quot;family&quot;:&quot;Geremew&quot;,&quot;given&quot;:&quot;Mebratu Sintie&quot;,&quot;parse-names&quot;:false,&quot;dropping-particle&quot;:&quot;&quot;,&quot;non-dropping-particle&quot;:&quot;&quot;}],&quot;container-title&quot;:&quot;Energy Exploration &amp; Exploitation&quot;,&quot;DOI&quot;:&quot;10.1177/01445987251387368&quot;,&quot;ISSN&quot;:&quot;0144-5987&quot;,&quot;issued&quot;:{&quot;date-parts&quot;:[[2026,3,16]]},&quot;page&quot;:&quot;821-869&quot;,&quot;abstract&quot;:&quot;&lt;p&gt; Meeting the growing global electricity demand in remote and off-grid regions requires cost-effective and reliable power solutions that overcome the intermittency of renewable energy sources. This paper presents a comprehensive techno-economic optimization framework for the design and operation of off-grid hybrid renewable energy systems (HRES) integrating photovoltaic (PV), wind turbine, biomass generator, diesel backup, and a dual-chemistry hybrid battery energy storage system (HBESS) combining lithium-ion and nickel-iron batteries. A detailed mathematical modeling approach is employed to capture the nonlinear dynamics, stochastic renewable behavior, battery degradation, and temperature-adjusted component efficiencies. The system is formulated as a multi-objective mixed-integer nonlinear programming problem targeting the minimization of life cycle cost (LCC), levelized cost of energy (LCOE), and CO &lt;sub&gt;2&lt;/sub&gt; emissions while satisfying reliability constraints such as loss of power supply probability (LPSP &amp;lt; 0.01). To solve the optimization problem, advanced metaheuristic algorithms—Particle Swarm Optimization (PSO), Genetic Algorithms (GA), Grey Wolf Optimizer (GWO), and Differential Evolution (DE), and Salp Swarm Algorithm (SSA)—and a Deep Q-Network (DQN)-based reinforcement learning energy management strategy are implemented and benchmarked. The proposed DQN-based controller demonstrates superior performance over conventional rule-based and static dispatch methods by maintaining more stable battery state-of-charge (SOC) profiles, reducing degradation, and enabling intelligent real-time decision-making. Simulation results based on realistic meteorological and demand profiles reveal that the integrated DQN and HBESS strategy reduces total LCC by over 20%, CO &lt;sub&gt;2&lt;/sub&gt; emissions by up to 30%, and battery degradation costs by over 10% compared to baseline systems. The Salp Swarm Algorithm (SSA) achieves the fastest convergence and the highest-quality Pareto-optimal solutions among all metaheuristics evaluated. Sensitivity analysis identifies diesel price and interest rate as the most influential parameters on LCOE, while load shifting through aggressive demand-side management further minimizes battery usage, operating costs, and emissions. The proposed framework not only addresses key challenges in off-grid microgrid design but also provides a scalable and robust pathway for sustainable rural electrification using hybrid storage and intelligent control. &lt;/p&gt;&quot;,&quot;issue&quot;:&quot;2&quot;,&quot;volume&quot;:&quot;44&quot;,&quot;container-title-short&quot;:&quot;&quot;},&quot;isTemporary&quot;:false}]},{&quot;citationID&quot;:&quot;MENDELEY_CITATION_4aa9aa38-c6f8-4655-adad-651820be928f&quot;,&quot;properties&quot;:{&quot;noteIndex&quot;:0},&quot;isEdited&quot;:false,&quot;manualOverride&quot;:{&quot;isManuallyOverridden&quot;:false,&quot;citeprocText&quot;:&quot;[42]&quot;,&quot;manualOverrideText&quot;:&quot;&quot;},&quot;citationTag&quot;:&quot;MENDELEY_CITATION_v3_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&quot;,&quot;citationItems&quot;:[{&quot;id&quot;:&quot;724df896-ae80-37a5-bbb1-ea526b483901&quot;,&quot;itemData&quot;:{&quot;type&quot;:&quot;article-journal&quot;,&quot;id&quot;:&quot;724df896-ae80-37a5-bbb1-ea526b483901&quot;,&quot;title&quot;:&quot;Energy Demand Response in a Food-Processing Plant: A Deep Reinforcement Learning Approach&quot;,&quot;author&quot;:[{&quot;family&quot;:&quot;Wohlgenannt&quot;,&quot;given&quot;:&quot;Philipp&quot;,&quot;parse-names&quot;:false,&quot;dropping-particle&quot;:&quot;&quot;,&quot;non-dropping-particle&quot;:&quot;&quot;},{&quot;family&quot;:&quot;Hegenbart&quot;,&quot;given&quot;:&quot;Sebastian&quot;,&quot;parse-names&quot;:false,&quot;dropping-particle&quot;:&quot;&quot;,&quot;non-dropping-particle&quot;:&quot;&quot;},{&quot;family&quot;:&quot;Eder&quot;,&quot;given&quot;:&quot;Elias&quot;,&quot;parse-names&quot;:false,&quot;dropping-particle&quot;:&quot;&quot;,&quot;non-dropping-particle&quot;:&quot;&quot;},{&quot;family&quot;:&quot;Kolhe&quot;,&quot;given&quot;:&quot;Mohan&quot;,&quot;parse-names&quot;:false,&quot;dropping-particle&quot;:&quot;&quot;,&quot;non-dropping-particle&quot;:&quot;&quot;},{&quot;family&quot;:&quot;Kepplinger&quot;,&quot;given&quot;:&quot;Peter&quot;,&quot;parse-names&quot;:false,&quot;dropping-particle&quot;:&quot;&quot;,&quot;non-dropping-particle&quot;:&quot;&quot;}],&quot;container-title&quot;:&quot;Energies&quot;,&quot;container-title-short&quot;:&quot;Energies (Basel).&quot;,&quot;DOI&quot;:&quot;10.3390/en17246430&quot;,&quot;ISSN&quot;:&quot;1996-1073&quot;,&quot;issued&quot;:{&quot;date-parts&quot;:[[2024,12,20]]},&quot;page&quot;:&quot;6430&quot;,&quot;abstract&quot;:&quot;&lt;p&gt;The food industry faces significant challenges in managing operational costs due to its high energy intensity and rising energy prices. Industrial food-processing facilities, with substantial thermal capacities and large demands for cooling and heating, offer promising opportunities for demand response (DR) strategies. This study explores the application of deep reinforcement learning (RL) as an innovative, data-driven approach for DR in the food industry. By leveraging the adaptive, self-learning capabilities of RL, energy costs in the investigated plant are effectively decreased. The RL algorithm was compared with the well-established optimization method Mixed Integer Linear Programming (MILP), and both were benchmarked against a reference scenario without DR. The two optimization strategies demonstrate cost savings of 17.57% and 18.65% for RL and MILP, respectively. Although RL is slightly less efficient in cost reduction, it significantly outperforms in computational speed, being approximately 20 times faster. During operation, RL only needs 2ms per optimization compared to 19s for MILP, making it a promising optimization tool for edge computing. Moreover, while MILP’s computation time increases considerably with the number of binary variables, RL efficiently learns dynamic system behavior and scales to more complex systems without significant performance degradation. These results highlight that deep RL, when applied to DR, offers substantial cost savings and computational efficiency, with broad applicability to energy management in various applications.&lt;/p&gt;&quot;,&quot;issue&quot;:&quot;24&quot;,&quot;volume&quot;:&quot;17&quot;},&quot;isTemporary&quot;:false}]},{&quot;citationID&quot;:&quot;MENDELEY_CITATION_7cbe8449-6ae3-4327-a6e1-c91a210c1a1d&quot;,&quot;properties&quot;:{&quot;noteIndex&quot;:0},&quot;isEdited&quot;:false,&quot;manualOverride&quot;:{&quot;isManuallyOverridden&quot;:false,&quot;citeprocText&quot;:&quot;[43], [44]&quot;,&quot;manualOverrideText&quot;:&quot;&quot;},&quot;citationTag&quot;:&quot;MENDELEY_CITATION_v3_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&quot;,&quot;citationItems&quot;:[{&quot;id&quot;:&quot;80e0b832-1c6f-3864-9f71-9b273477a917&quot;,&quot;itemData&quot;:{&quot;type&quot;:&quot;article-journal&quot;,&quot;id&quot;:&quot;80e0b832-1c6f-3864-9f71-9b273477a917&quot;,&quot;title&quot;:&quot;Reinforcement Learning Techniques in Optimizing Energy Systems&quot;,&quot;author&quot;:[{&quot;family&quot;:&quot;Stavrev&quot;,&quot;given&quot;:&quot;Stefan&quot;,&quot;parse-names&quot;:false,&quot;dropping-particle&quot;:&quot;&quot;,&quot;non-dropping-particle&quot;:&quot;&quot;},{&quot;family&quot;:&quot;Ginchev&quot;,&quot;given&quot;:&quot;Dimitar&quot;,&quot;parse-names&quot;:false,&quot;dropping-particle&quot;:&quot;&quot;,&quot;non-dropping-particle&quot;:&quot;&quot;}],&quot;container-title&quot;:&quot;Electronics&quot;,&quot;DOI&quot;:&quot;10.3390/electronics13081459&quot;,&quot;ISSN&quot;:&quot;2079-9292&quot;,&quot;issued&quot;:{&quot;date-parts&quot;:[[2024,4,12]]},&quot;page&quot;:&quot;1459&quot;,&quot;abstract&quot;:&quot;&lt;p&gt;Reinforcement learning (RL) techniques have emerged as powerful tools for optimizing energy systems, offering the potential to enhance efficiency, reliability, and sustainability. This review paper provides a comprehensive examination of the applications of RL in the field of energy system optimization, spanning various domains such as energy management, grid control, and renewable energy integration. Beginning with an overview of RL fundamentals, the paper explores recent advancements in RL algorithms and their adaptation to address the unique challenges of energy system optimization. Case studies and real-world applications demonstrate the efficacy of RL-based approaches in improving energy efficiency, reducing costs, and mitigating environmental impacts. Furthermore, the paper discusses future directions and challenges, including scalability, interpretability, and integration with domain knowledge. By synthesizing the latest research findings and identifying key areas for further investigation, this paper aims to inform and inspire future research endeavors in the intersection of reinforcement learning and energy system optimization.&lt;/p&gt;&quot;,&quot;issue&quot;:&quot;8&quot;,&quot;volume&quot;:&quot;13&quot;,&quot;container-title-short&quot;:&quot;Electronics (Basel).&quot;},&quot;isTemporary&quot;:false},{&quot;id&quot;:&quot;71c1ace4-7085-3db1-9b31-493a7b2fcde3&quot;,&quot;itemData&quot;:{&quot;type&quot;:&quot;article-journal&quot;,&quot;id&quot;:&quot;71c1ace4-7085-3db1-9b31-493a7b2fcde3&quot;,&quot;title&quot;:&quot;Deep Reinforcement Learning Approaches the MILP Optimum of a Multi-Energy Optimization in Energy Communities&quot;,&quot;author&quot;:[{&quot;family&quot;:&quot;Vetter&quot;,&quot;given&quot;:&quot;Vinzent&quot;,&quot;parse-names&quot;:false,&quot;dropping-particle&quot;:&quot;&quot;,&quot;non-dropping-particle&quot;:&quot;&quot;},{&quot;family&quot;:&quot;Wohlgenannt&quot;,&quot;given&quot;:&quot;Philipp&quot;,&quot;parse-names&quot;:false,&quot;dropping-particle&quot;:&quot;&quot;,&quot;non-dropping-particle&quot;:&quot;&quot;},{&quot;family&quot;:&quot;Kepplinger&quot;,&quot;given&quot;:&quot;Peter&quot;,&quot;parse-names&quot;:false,&quot;dropping-particle&quot;:&quot;&quot;,&quot;non-dropping-particle&quot;:&quot;&quot;},{&quot;family&quot;:&quot;Eder&quot;,&quot;given&quot;:&quot;Elias&quot;,&quot;parse-names&quot;:false,&quot;dropping-particle&quot;:&quot;&quot;,&quot;non-dropping-particle&quot;:&quot;&quot;}],&quot;container-title&quot;:&quot;Energies&quot;,&quot;DOI&quot;:&quot;10.3390/en18174489&quot;,&quot;ISSN&quot;:&quot;1996-1073&quot;,&quot;issued&quot;:{&quot;date-parts&quot;:[[2025,8,23]]},&quot;page&quot;:&quot;4489&quot;,&quot;abstract&quot;:&quot;&lt;p&gt;As energy systems transition toward high shares of variable renewable generation, local energy communities (ECs) are increasingly relevant for enabling demand-side flexibility and self-sufficiency. This shift is particularly evident in the residential sector, where the deployment of photovoltaic (PV) systems is rapidly growing. While mixed-integer linear programming (MILP) remains the standard for operational optimization and demand response in such systems, its computational burden limits scalability and responsiveness under real-time or uncertain conditions. Reinforcement learning (RL), by contrast, offers a model-free, adaptive alternative. However, its application to real-world energy system operation remains limited. This study explores the application of a Deep Q-Network (DQN) to a real residential EC, which has received limited attention in prior work. The system comprises three single-family homes sharing a centralized heating system with a thermal energy storage (TES), a PV installation, and a grid connection. We compare the performance of MILP and RL controllers across economic and environmental metrics. Relative to a reference scenario without TES, MILP and RL reduce energy costs by 10.06% and 8.78%, respectively, and both approaches yield lower total energy consumption and CO2-equivalent emissions. Notably, the trained RL agent achieves a near-optimal outcome while requiring only 22% of the MILP’s computation time. These results demonstrate that DQNs can offer a computationally efficient and practically viable alternative to MILP for real-time control in residential energy systems.&lt;/p&gt;&quot;,&quot;issue&quot;:&quot;17&quot;,&quot;volume&quot;:&quot;18&quot;,&quot;container-title-short&quot;:&quot;Energies (Basel).&quot;},&quot;isTemporary&quot;:false}]},{&quot;citationID&quot;:&quot;MENDELEY_CITATION_fb974e0b-7e67-4c93-a30f-ed459a189960&quot;,&quot;properties&quot;:{&quot;noteIndex&quot;:0},&quot;isEdited&quot;:false,&quot;manualOverride&quot;:{&quot;isManuallyOverridden&quot;:false,&quot;citeprocText&quot;:&quot;[45]&quot;,&quot;manualOverrideText&quot;:&quot;&quot;},&quot;citationTag&quot;:&quot;MENDELEY_CITATION_v3_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&quot;,&quot;citationItems&quot;:[{&quot;id&quot;:&quot;8dce386b-1be0-3f7f-90b3-85aff7b0a20e&quot;,&quot;itemData&quot;:{&quot;type&quot;:&quot;article-journal&quot;,&quot;id&quot;:&quot;8dce386b-1be0-3f7f-90b3-85aff7b0a20e&quot;,&quot;title&quot;:&quot;Optimal energy system scheduling using a constraint-aware reinforcement learning algorithm&quot;,&quot;author&quot;:[{&quot;family&quot;:&quot;Shengren&quot;,&quot;given&quot;:&quot;Hou&quot;,&quot;parse-names&quot;:false,&quot;dropping-particle&quot;:&quot;&quot;,&quot;non-dropping-particle&quot;:&quot;&quot;},{&quot;family&quot;:&quot;Vergara&quot;,&quot;given&quot;:&quot;Pedro P.&quot;,&quot;parse-names&quot;:false,&quot;dropping-particle&quot;:&quot;&quot;,&quot;non-dropping-particle&quot;:&quot;&quot;},{&quot;family&quot;:&quot;Salazar Duque&quot;,&quot;given&quot;:&quot;Edgar Mauricio&quot;,&quot;parse-names&quot;:false,&quot;dropping-particle&quot;:&quot;&quot;,&quot;non-dropping-particle&quot;:&quot;&quot;},{&quot;family&quot;:&quot;Palensky&quot;,&quot;given&quot;:&quot;Peter&quot;,&quot;parse-names&quot;:false,&quot;dropping-particle&quot;:&quot;&quot;,&quot;non-dropping-particle&quot;:&quot;&quot;}],&quot;container-title&quot;:&quot;International Journal of Electrical Power &amp; Energy Systems&quot;,&quot;DOI&quot;:&quot;10.1016/j.ijepes.2023.109230&quot;,&quot;ISSN&quot;:&quot;01420615&quot;,&quot;issued&quot;:{&quot;date-parts&quot;:[[2023,10]]},&quot;page&quot;:&quot;109230&quot;,&quot;volume&quot;:&quot;152&quot;,&quot;container-title-short&quot;:&quot;&quot;},&quot;isTemporary&quot;:false}]},{&quot;citationID&quot;:&quot;MENDELEY_CITATION_1cdcd498-a953-4c56-9fed-7dd79ae2f0e4&quot;,&quot;properties&quot;:{&quot;noteIndex&quot;:0},&quot;isEdited&quot;:false,&quot;manualOverride&quot;:{&quot;isManuallyOverridden&quot;:false,&quot;citeprocText&quot;:&quot;[46]&quot;,&quot;manualOverrideText&quot;:&quot;&quot;},&quot;citationTag&quot;:&quot;MENDELEY_CITATION_v3_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&quot;,&quot;citationItems&quot;:[{&quot;id&quot;:&quot;06c2b8d2-b2dc-3af5-b126-6311b944aca0&quot;,&quot;itemData&quot;:{&quot;type&quot;:&quot;article&quot;,&quot;id&quot;:&quot;06c2b8d2-b2dc-3af5-b126-6311b944aca0&quot;,&quot;title&quot;:&quot;Reinforcement Learning Techniques in Optimizing Energy Systems&quot;,&quot;author&quot;:[{&quot;family&quot;:&quot;Stavrev&quot;,&quot;given&quot;:&quot;Stefan&quot;,&quot;parse-names&quot;:false,&quot;dropping-particle&quot;:&quot;&quot;,&quot;non-dropping-particle&quot;:&quot;&quot;},{&quot;family&quot;:&quot;Ginchev&quot;,&quot;given&quot;:&quot;Dimitar&quot;,&quot;parse-names&quot;:false,&quot;dropping-particle&quot;:&quot;&quot;,&quot;non-dropping-particle&quot;:&quot;&quot;}],&quot;container-title&quot;:&quot;Electronics (Switzerland)&quot;,&quot;DOI&quot;:&quot;10.3390/electronics13081459&quot;,&quot;ISSN&quot;:&quot;20799292&quot;,&quot;issued&quot;:{&quot;date-parts&quot;:[[2024,4,1]]},&quot;abstract&quot;:&quot;Reinforcement learning (RL) techniques have emerged as powerful tools for optimizing energy systems, offering the potential to enhance efficiency, reliability, and sustainability. This review paper provides a comprehensive examination of the applications of RL in the field of energy system optimization, spanning various domains such as energy management, grid control, and renewable energy integration. Beginning with an overview of RL fundamentals, the paper explores recent advancements in RL algorithms and their adaptation to address the unique challenges of energy system optimization. Case studies and real-world applications demonstrate the efficacy of RL-based approaches in improving energy efficiency, reducing costs, and mitigating environmental impacts. Furthermore, the paper discusses future directions and challenges, including scalability, interpretability, and integration with domain knowledge. By synthesizing the latest research findings and identifying key areas for further investigation, this paper aims to inform and inspire future research endeavors in the intersection of reinforcement learning and energy system optimization.&quot;,&quot;publisher&quot;:&quot;Multidisciplinary Digital Publishing Institute (MDPI)&quot;,&quot;issue&quot;:&quot;8&quot;,&quot;volume&quot;:&quot;13&quot;,&quot;container-title-short&quot;:&quot;&quot;},&quot;isTemporary&quot;:false}]},{&quot;citationID&quot;:&quot;MENDELEY_CITATION_8f9fc719-49df-456a-8934-5bb7891faa53&quot;,&quot;properties&quot;:{&quot;noteIndex&quot;:0},&quot;isEdited&quot;:false,&quot;manualOverride&quot;:{&quot;isManuallyOverridden&quot;:false,&quot;citeprocText&quot;:&quot;[47]&quot;,&quot;manualOverrideText&quot;:&quot;&quot;},&quot;citationTag&quot;:&quot;MENDELEY_CITATION_v3_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&quot;,&quot;citationItems&quot;:[{&quot;id&quot;:&quot;b748b453-1bc9-3b06-a2bc-accd4d93d9d9&quot;,&quot;itemData&quot;:{&quot;type&quot;:&quot;article-journal&quot;,&quot;id&quot;:&quot;b748b453-1bc9-3b06-a2bc-accd4d93d9d9&quot;,&quot;title&quot;:&quot;Applications of reinforcement learning in energy systems&quot;,&quot;author&quot;:[{&quot;family&quot;:&quot;Perera&quot;,&quot;given&quot;:&quot;A.T.D.&quot;,&quot;parse-names&quot;:false,&quot;dropping-particle&quot;:&quot;&quot;,&quot;non-dropping-particle&quot;:&quot;&quot;},{&quot;family&quot;:&quot;Kamalaruban&quot;,&quot;given&quot;:&quot;Parameswaran&quot;,&quot;parse-names&quot;:false,&quot;dropping-particle&quot;:&quot;&quot;,&quot;non-dropping-particle&quot;:&quot;&quot;}],&quot;container-title&quot;:&quot;Renewable and Sustainable Energy Reviews&quot;,&quot;DOI&quot;:&quot;10.1016/j.rser.2020.110618&quot;,&quot;ISSN&quot;:&quot;13640321&quot;,&quot;issued&quot;:{&quot;date-parts&quot;:[[2021,3]]},&quot;page&quot;:&quot;110618&quot;,&quot;volume&quot;:&quot;137&quot;,&quot;container-title-short&quot;:&quot;&quot;},&quot;isTemporary&quot;:false}]},{&quot;citationID&quot;:&quot;MENDELEY_CITATION_92567a48-90b0-46c9-bfb8-195d222dd6c2&quot;,&quot;properties&quot;:{&quot;noteIndex&quot;:0},&quot;isEdited&quot;:false,&quot;manualOverride&quot;:{&quot;isManuallyOverridden&quot;:false,&quot;citeprocText&quot;:&quot;[48]&quot;,&quot;manualOverrideText&quot;:&quot;&quot;},&quot;citationTag&quot;:&quot;MENDELEY_CITATION_v3_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&quot;,&quot;citationItems&quot;:[{&quot;id&quot;:&quot;408e45c0-460c-38aa-8310-19b6e3612eca&quot;,&quot;itemData&quot;:{&quot;type&quot;:&quot;article-journal&quot;,&quot;id&quot;:&quot;408e45c0-460c-38aa-8310-19b6e3612eca&quot;,&quot;title&quot;:&quot;Reinforcement Learning Techniques in Optimizing Energy Systems&quot;,&quot;author&quot;:[{&quot;family&quot;:&quot;Stavrev&quot;,&quot;given&quot;:&quot;Stefan&quot;,&quot;parse-names&quot;:false,&quot;dropping-particle&quot;:&quot;&quot;,&quot;non-dropping-particle&quot;:&quot;&quot;},{&quot;family&quot;:&quot;Ginchev&quot;,&quot;given&quot;:&quot;Dimitar&quot;,&quot;parse-names&quot;:false,&quot;dropping-particle&quot;:&quot;&quot;,&quot;non-dropping-particle&quot;:&quot;&quot;}],&quot;container-title&quot;:&quot;Electronics&quot;,&quot;container-title-short&quot;:&quot;Electronics (Basel).&quot;,&quot;DOI&quot;:&quot;10.3390/electronics13081459&quot;,&quot;ISSN&quot;:&quot;2079-9292&quot;,&quot;issued&quot;:{&quot;date-parts&quot;:[[2024,4,12]]},&quot;page&quot;:&quot;1459&quot;,&quot;abstract&quot;:&quot;&lt;p&gt;Reinforcement learning (RL) techniques have emerged as powerful tools for optimizing energy systems, offering the potential to enhance efficiency, reliability, and sustainability. This review paper provides a comprehensive examination of the applications of RL in the field of energy system optimization, spanning various domains such as energy management, grid control, and renewable energy integration. Beginning with an overview of RL fundamentals, the paper explores recent advancements in RL algorithms and their adaptation to address the unique challenges of energy system optimization. Case studies and real-world applications demonstrate the efficacy of RL-based approaches in improving energy efficiency, reducing costs, and mitigating environmental impacts. Furthermore, the paper discusses future directions and challenges, including scalability, interpretability, and integration with domain knowledge. By synthesizing the latest research findings and identifying key areas for further investigation, this paper aims to inform and inspire future research endeavors in the intersection of reinforcement learning and energy system optimization.&lt;/p&gt;&quot;,&quot;issue&quot;:&quot;8&quot;,&quot;volume&quot;:&quot;13&quot;},&quot;isTemporary&quot;:false}]},{&quot;citationID&quot;:&quot;MENDELEY_CITATION_2d90f837-c9a3-4da7-9b2d-0b187fae7ad5&quot;,&quot;properties&quot;:{&quot;noteIndex&quot;:0},&quot;isEdited&quot;:false,&quot;manualOverride&quot;:{&quot;isManuallyOverridden&quot;:false,&quot;citeprocText&quot;:&quot;[49]&quot;,&quot;manualOverrideText&quot;:&quot;&quot;},&quot;citationTag&quot;:&quot;MENDELEY_CITATION_v3_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&quot;,&quot;citationItems&quot;:[{&quot;id&quot;:&quot;94630c80-577c-3ded-896b-4aaf82147c8b&quot;,&quot;itemData&quot;:{&quot;type&quot;:&quot;chapter&quot;,&quot;id&quot;:&quot;94630c80-577c-3ded-896b-4aaf82147c8b&quot;,&quot;title&quot;:&quot;Efficient Exploration in Reinforcement Learning&quot;,&quot;author&quot;:[{&quot;family&quot;:&quot;Langford&quot;,&quot;given&quot;:&quot;John&quot;,&quot;parse-names&quot;:false,&quot;dropping-particle&quot;:&quot;&quot;,&quot;non-dropping-particle&quot;:&quot;&quot;}],&quot;container-title&quot;:&quot;Encyclopedia of Machine Learning&quot;,&quot;DOI&quot;:&quot;10.1007/978-0-387-30164-8_244&quot;,&quot;issued&quot;:{&quot;date-parts&quot;:[[2011]]},&quot;publisher-place&quot;:&quot;Boston, MA&quot;,&quot;page&quot;:&quot;309-311&quot;,&quot;publisher&quot;:&quot;Springer US&quot;,&quot;container-title-short&quot;:&quot;&quot;},&quot;isTemporary&quot;:false}]},{&quot;citationID&quot;:&quot;MENDELEY_CITATION_409cf5ec-19c5-4b5e-b434-08af62e0486e&quot;,&quot;properties&quot;:{&quot;noteIndex&quot;:0},&quot;isEdited&quot;:false,&quot;manualOverride&quot;:{&quot;isManuallyOverridden&quot;:false,&quot;citeprocText&quot;:&quot;[50]&quot;,&quot;manualOverrideText&quot;:&quot;&quot;},&quot;citationTag&quot;:&quot;MENDELEY_CITATION_v3_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&quot;,&quot;citationItems&quot;:[{&quot;id&quot;:&quot;b87850aa-a581-31c2-a694-b706eafaefa3&quot;,&quot;itemData&quot;:{&quot;type&quot;:&quot;article-journal&quot;,&quot;id&quot;:&quot;b87850aa-a581-31c2-a694-b706eafaefa3&quot;,&quot;title&quot;:&quot;ROBOT LEARNING&quot;,&quot;author&quot;:[{&quot;family&quot;:&quot;Sutton&quot;,&quot;given&quot;:&quot;Richard&quot;,&quot;parse-names&quot;:false,&quot;dropping-particle&quot;:&quot;&quot;,&quot;non-dropping-particle&quot;:&quot;&quot;},{&quot;family&quot;:&quot;Barto&quot;,&quot;given&quot;:&quot;Andrew&quot;,&quot;parse-names&quot;:false,&quot;dropping-particle&quot;:&quot;&quot;,&quot;non-dropping-particle&quot;:&quot;&quot;}],&quot;container-title&quot;:&quot;Robotica&quot;,&quot;container-title-short&quot;:&quot;Robotica&quot;,&quot;DOI&quot;:&quot;10.1017/S0263574799271172&quot;,&quot;ISSN&quot;:&quot;0263-5747&quot;,&quot;issued&quot;:{&quot;date-parts&quot;:[[1999,3,1]]},&quot;page&quot;:&quot;229-235&quot;,&quot;issue&quot;:&quot;2&quot;,&quot;volume&quot;:&quot;17&quot;},&quot;isTemporary&quot;:false}]},{&quot;citationID&quot;:&quot;MENDELEY_CITATION_275dbc2a-bca7-47b7-904d-467adf502462&quot;,&quot;properties&quot;:{&quot;noteIndex&quot;:0},&quot;isEdited&quot;:false,&quot;manualOverride&quot;:{&quot;isManuallyOverridden&quot;:false,&quot;citeprocText&quot;:&quot;[51]&quot;,&quot;manualOverrideText&quot;:&quot;&quot;},&quot;citationTag&quot;:&quot;MENDELEY_CITATION_v3_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&quot;,&quot;citationItems&quot;:[{&quot;id&quot;:&quot;8a2da654-28fe-395b-8105-172abb9e04b0&quot;,&quot;itemData&quot;:{&quot;type&quot;:&quot;paper-conference&quot;,&quot;id&quot;:&quot;8a2da654-28fe-395b-8105-172abb9e04b0&quot;,&quot;title&quot;:&quot;Overview of Reinforcement Learning Based on Value and Policy&quot;,&quot;author&quot;:[{&quot;family&quot;:&quot;Liu&quot;,&quot;given&quot;:&quot;Yun-ting&quot;,&quot;parse-names&quot;:false,&quot;dropping-particle&quot;:&quot;&quot;,&quot;non-dropping-particle&quot;:&quot;&quot;},{&quot;family&quot;:&quot;Yang&quot;,&quot;given&quot;:&quot;Jia-ming&quot;,&quot;parse-names&quot;:false,&quot;dropping-particle&quot;:&quot;&quot;,&quot;non-dropping-particle&quot;:&quot;&quot;},{&quot;family&quot;:&quot;Chen&quot;,&quot;given&quot;:&quot;Liang&quot;,&quot;parse-names&quot;:false,&quot;dropping-particle&quot;:&quot;&quot;,&quot;non-dropping-particle&quot;:&quot;&quot;},{&quot;family&quot;:&quot;Guo&quot;,&quot;given&quot;:&quot;Ting&quot;,&quot;parse-names&quot;:false,&quot;dropping-particle&quot;:&quot;&quot;,&quot;non-dropping-particle&quot;:&quot;&quot;},{&quot;family&quot;:&quot;Jiang&quot;,&quot;given&quot;:&quot;Yu&quot;,&quot;parse-names&quot;:false,&quot;dropping-particle&quot;:&quot;&quot;,&quot;non-dropping-particle&quot;:&quot;&quot;}],&quot;container-title&quot;:&quot;2020 Chinese Control And Decision Conference (CCDC)&quot;,&quot;DOI&quot;:&quot;10.1109/CCDC49329.2020.9164615&quot;,&quot;ISBN&quot;:&quot;978-1-7281-5855-6&quot;,&quot;issued&quot;:{&quot;date-parts&quot;:[[2020,8]]},&quot;page&quot;:&quot;598-603&quot;,&quot;publisher&quot;:&quot;IEEE&quot;,&quot;container-title-short&quot;:&quot;&quot;},&quot;isTemporary&quot;:false}]},{&quot;citationID&quot;:&quot;MENDELEY_CITATION_ef102693-b21e-49bd-8961-a5f9603586b2&quot;,&quot;properties&quot;:{&quot;noteIndex&quot;:0},&quot;isEdited&quot;:false,&quot;manualOverride&quot;:{&quot;isManuallyOverridden&quot;:false,&quot;citeprocText&quot;:&quot;[52]&quot;,&quot;manualOverrideText&quot;:&quot;&quot;},&quot;citationTag&quot;:&quot;MENDELEY_CITATION_v3_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&quot;,&quot;citationItems&quot;:[{&quot;id&quot;:&quot;ffddf98e-e370-3452-8a14-62d7c8029a56&quot;,&quot;itemData&quot;:{&quot;type&quot;:&quot;article-journal&quot;,&quot;id&quot;:&quot;ffddf98e-e370-3452-8a14-62d7c8029a56&quot;,&quot;title&quot;:&quot;Comparing Policy Gradient and Value Function Based Reinforcement Learning Methods in Simulated Electrical Power Trade&quot;,&quot;author&quot;:[{&quot;family&quot;:&quot;Lincoln&quot;,&quot;given&quot;:&quot;Richard&quot;,&quot;parse-names&quot;:false,&quot;dropping-particle&quot;:&quot;&quot;,&quot;non-dropping-particle&quot;:&quot;&quot;},{&quot;family&quot;:&quot;Galloway&quot;,&quot;given&quot;:&quot;Stuart&quot;,&quot;parse-names&quot;:false,&quot;dropping-particle&quot;:&quot;&quot;,&quot;non-dropping-particle&quot;:&quot;&quot;},{&quot;family&quot;:&quot;Stephen&quot;,&quot;given&quot;:&quot;Bruce&quot;,&quot;parse-names&quot;:false,&quot;dropping-particle&quot;:&quot;&quot;,&quot;non-dropping-particle&quot;:&quot;&quot;},{&quot;family&quot;:&quot;Burt&quot;,&quot;given&quot;:&quot;Graeme&quot;,&quot;parse-names&quot;:false,&quot;dropping-particle&quot;:&quot;&quot;,&quot;non-dropping-particle&quot;:&quot;&quot;}],&quot;container-title&quot;:&quot;IEEE Transactions on Power Systems&quot;,&quot;DOI&quot;:&quot;10.1109/TPWRS.2011.2166091&quot;,&quot;ISSN&quot;:&quot;0885-8950&quot;,&quot;issued&quot;:{&quot;date-parts&quot;:[[2012,2]]},&quot;page&quot;:&quot;373-380&quot;,&quot;issue&quot;:&quot;1&quot;,&quot;volume&quot;:&quot;27&quot;,&quot;container-title-short&quot;:&quot;&quot;},&quot;isTemporary&quot;:false}]},{&quot;citationID&quot;:&quot;MENDELEY_CITATION_2803f5df-7f60-4bed-8861-5d6e31d32156&quot;,&quot;properties&quot;:{&quot;noteIndex&quot;:0},&quot;isEdited&quot;:false,&quot;manualOverride&quot;:{&quot;isManuallyOverridden&quot;:false,&quot;citeprocText&quot;:&quot;[53]&quot;,&quot;manualOverrideText&quot;:&quot;&quot;},&quot;citationTag&quot;:&quot;MENDELEY_CITATION_v3_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&quot;,&quot;citationItems&quot;:[{&quot;id&quot;:&quot;e54e5b56-d131-3a66-9ffb-14ae92ea0215&quot;,&quot;itemData&quot;:{&quot;type&quot;:&quot;article-journal&quot;,&quot;id&quot;:&quot;e54e5b56-d131-3a66-9ffb-14ae92ea0215&quot;,&quot;title&quot;:&quot;Policy Gradient Methods in Deep Reinforcement Learning&quot;,&quot;author&quot;:[{&quot;family&quot;:&quot;Gao&quot;,&quot;given&quot;:&quot;Yuhan&quot;,&quot;parse-names&quot;:false,&quot;dropping-particle&quot;:&quot;&quot;,&quot;non-dropping-particle&quot;:&quot;&quot;}],&quot;container-title&quot;:&quot;Applied and Computational Engineering&quot;,&quot;DOI&quot;:&quot;10.54254/2755-2721/2025.TJ23321&quot;,&quot;ISSN&quot;:&quot;2755-2721&quot;,&quot;issued&quot;:{&quot;date-parts&quot;:[[2025,5,22]]},&quot;page&quot;:&quot;27-34&quot;,&quot;abstract&quot;:&quot;&lt;p&gt;Policy gradient (PG) methods are a fundamental component of deep reinforcement learning (DRL), particularly effective in continuous and high-dimensional control tasks. This paper presents a structured review of PG algorithms, tracing their development from basic Monte Carlo methods like REINFORCE to advanced techniques such as asynchronous advantage actor-critic (A3C), trust region policy optimization (TRPO), proximal policy optimization (PPO), deep deterministic policy gradient (DDPG), and soft actor-critic (SAC). These methods differ in terms of policy structure, optimization stability, and sample efficiency, addressing core challenges in policy learning through gradient-based updates. In addition, this review explores the application of PG methods in real-world domains, including autonomous driving, financial portfolio management, and smart grid energy systems. These applications demonstrate PG methods’ capacity to operate under uncertainty and adapt to complex dynamic environments. However, limitations such as high variance, low sample efficiency, and instability in multi-agent and offline settings remain significant obstacles. The review concludes by outlining emerging research directions, including entropy-based exploration, model-based policy optimization, meta-learning, and Transformer-based sequence modeling. This work aims to offer theoretical insights and practical guidance to support the continued advancement and application of policy gradient methods in reinforcement learning.&lt;/p&gt;&quot;,&quot;issue&quot;:&quot;1&quot;,&quot;volume&quot;:&quot;158&quot;,&quot;container-title-short&quot;:&quot;&quot;},&quot;isTemporary&quot;:false}]},{&quot;citationID&quot;:&quot;MENDELEY_CITATION_6b0aa260-f728-4cb7-8d42-c258b6a59a24&quot;,&quot;properties&quot;:{&quot;noteIndex&quot;:0},&quot;isEdited&quot;:false,&quot;manualOverride&quot;:{&quot;isManuallyOverridden&quot;:false,&quot;citeprocText&quot;:&quot;[54]&quot;,&quot;manualOverrideText&quot;:&quot;&quot;},&quot;citationTag&quot;:&quot;MENDELEY_CITATION_v3_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&quot;,&quot;citationItems&quot;:[{&quot;id&quot;:&quot;695f87ef-b1a7-3d24-bf63-54c6c4a9499c&quot;,&quot;itemData&quot;:{&quot;type&quot;:&quot;article-journal&quot;,&quot;id&quot;:&quot;695f87ef-b1a7-3d24-bf63-54c6c4a9499c&quot;,&quot;title&quot;:&quot;Reinforcement Learning and Its Applications in Modern Power and Energy Systems: A Review&quot;,&quot;author&quot;:[{&quot;family&quot;:&quot;Cao&quot;,&quot;given&quot;:&quot;Di&quot;,&quot;parse-names&quot;:false,&quot;dropping-particle&quot;:&quot;&quot;,&quot;non-dropping-particle&quot;:&quot;&quot;},{&quot;family&quot;:&quot;Hu&quot;,&quot;given&quot;:&quot;Weihao&quot;,&quot;parse-names&quot;:false,&quot;dropping-particle&quot;:&quot;&quot;,&quot;non-dropping-particle&quot;:&quot;&quot;},{&quot;family&quot;:&quot;Zhao&quot;,&quot;given&quot;:&quot;Junbo&quot;,&quot;parse-names&quot;:false,&quot;dropping-particle&quot;:&quot;&quot;,&quot;non-dropping-particle&quot;:&quot;&quot;},{&quot;family&quot;:&quot;Zhang&quot;,&quot;given&quot;:&quot;Guozhou&quot;,&quot;parse-names&quot;:false,&quot;dropping-particle&quot;:&quot;&quot;,&quot;non-dropping-particle&quot;:&quot;&quot;},{&quot;family&quot;:&quot;Zhang&quot;,&quot;given&quot;:&quot;Bin&quot;,&quot;parse-names&quot;:false,&quot;dropping-particle&quot;:&quot;&quot;,&quot;non-dropping-particle&quot;:&quot;&quot;},{&quot;family&quot;:&quot;Liu&quot;,&quot;given&quot;:&quot;Zhou&quot;,&quot;parse-names&quot;:false,&quot;dropping-particle&quot;:&quot;&quot;,&quot;non-dropping-particle&quot;:&quot;&quot;},{&quot;family&quot;:&quot;Chen&quot;,&quot;given&quot;:&quot;Zhe&quot;,&quot;parse-names&quot;:false,&quot;dropping-particle&quot;:&quot;&quot;,&quot;non-dropping-particle&quot;:&quot;&quot;},{&quot;family&quot;:&quot;Blaabjerg&quot;,&quot;given&quot;:&quot;Frede&quot;,&quot;parse-names&quot;:false,&quot;dropping-particle&quot;:&quot;&quot;,&quot;non-dropping-particle&quot;:&quot;&quot;}],&quot;container-title&quot;:&quot;Journal of Modern Power Systems and Clean Energy&quot;,&quot;DOI&quot;:&quot;10.35833/MPCE.2020.000552&quot;,&quot;ISSN&quot;:&quot;2196-5625&quot;,&quot;issued&quot;:{&quot;date-parts&quot;:[[2020]]},&quot;page&quot;:&quot;1029-1042&quot;,&quot;issue&quot;:&quot;6&quot;,&quot;volume&quot;:&quot;8&quot;,&quot;container-title-short&quot;:&quot;&quot;},&quot;isTemporary&quot;:false}]},{&quot;citationID&quot;:&quot;MENDELEY_CITATION_77016d76-bbff-470c-acaf-6a996a49373b&quot;,&quot;properties&quot;:{&quot;noteIndex&quot;:0},&quot;isEdited&quot;:false,&quot;manualOverride&quot;:{&quot;isManuallyOverridden&quot;:false,&quot;citeprocText&quot;:&quot;[55]&quot;,&quot;manualOverrideText&quot;:&quot;&quot;},&quot;citationTag&quot;:&quot;MENDELEY_CITATION_v3_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&quot;,&quot;citationItems&quot;:[{&quot;id&quot;:&quot;e45cab0b-e52f-3cff-b734-fbaac9d65a24&quot;,&quot;itemData&quot;:{&quot;type&quot;:&quot;paper-conference&quot;,&quot;id&quot;:&quot;e45cab0b-e52f-3cff-b734-fbaac9d65a24&quot;,&quot;title&quot;:&quot;Performance Comparison of Deep RL Algorithms for Energy Systems Optimal Scheduling&quot;,&quot;author&quot;:[{&quot;family&quot;:&quot;Shengren&quot;,&quot;given&quot;:&quot;Hou&quot;,&quot;parse-names&quot;:false,&quot;dropping-particle&quot;:&quot;&quot;,&quot;non-dropping-particle&quot;:&quot;&quot;},{&quot;family&quot;:&quot;Salazar&quot;,&quot;given&quot;:&quot;Edgar Mauricio&quot;,&quot;parse-names&quot;:false,&quot;dropping-particle&quot;:&quot;&quot;,&quot;non-dropping-particle&quot;:&quot;&quot;},{&quot;family&quot;:&quot;Vergara&quot;,&quot;given&quot;:&quot;Pedro P.&quot;,&quot;parse-names&quot;:false,&quot;dropping-particle&quot;:&quot;&quot;,&quot;non-dropping-particle&quot;:&quot;&quot;},{&quot;family&quot;:&quot;Palensky&quot;,&quot;given&quot;:&quot;Peter&quot;,&quot;parse-names&quot;:false,&quot;dropping-particle&quot;:&quot;&quot;,&quot;non-dropping-particle&quot;:&quot;&quot;}],&quot;container-title&quot;:&quot;2022 IEEE PES Innovative Smart Grid Technologies Conference Europe (ISGT-Europe)&quot;,&quot;DOI&quot;:&quot;10.1109/ISGT-Europe54678.2022.9960642&quot;,&quot;ISBN&quot;:&quot;978-1-6654-8032-1&quot;,&quot;issued&quot;:{&quot;date-parts&quot;:[[2022,10,10]]},&quot;page&quot;:&quot;1-6&quot;,&quot;publisher&quot;:&quot;IEEE&quot;,&quot;container-title-short&quot;:&quot;&quot;},&quot;isTemporary&quot;:false}]},{&quot;citationID&quot;:&quot;MENDELEY_CITATION_fb2fc071-3f5b-4fb6-b316-f06ec1993bea&quot;,&quot;properties&quot;:{&quot;noteIndex&quot;:0},&quot;isEdited&quot;:false,&quot;manualOverride&quot;:{&quot;isManuallyOverridden&quot;:false,&quot;citeprocText&quot;:&quot;[47], [56]&quot;,&quot;manualOverrideText&quot;:&quot;&quot;},&quot;citationTag&quot;:&quot;MENDELEY_CITATION_v3_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&quot;,&quot;citationItems&quot;:[{&quot;id&quot;:&quot;287b606c-b40e-3f97-b41d-bcd33d0ee05c&quot;,&quot;itemData&quot;:{&quot;type&quot;:&quot;article-journal&quot;,&quot;id&quot;:&quot;287b606c-b40e-3f97-b41d-bcd33d0ee05c&quot;,&quot;title&quot;:&quot;Reward Shaping-Based Actor–Critic Deep Reinforcement Learning for Residential Energy Management&quot;,&quot;author&quot;:[{&quot;family&quot;:&quot;Lu&quot;,&quot;given&quot;:&quot;Renzhi&quot;,&quot;parse-names&quot;:false,&quot;dropping-particle&quot;:&quot;&quot;,&quot;non-dropping-particle&quot;:&quot;&quot;},{&quot;family&quot;:&quot;Jiang&quot;,&quot;given&quot;:&quot;Zhenyu&quot;,&quot;parse-names&quot;:false,&quot;dropping-particle&quot;:&quot;&quot;,&quot;non-dropping-particle&quot;:&quot;&quot;},{&quot;family&quot;:&quot;Wu&quot;,&quot;given&quot;:&quot;Huaming&quot;,&quot;parse-names&quot;:false,&quot;dropping-particle&quot;:&quot;&quot;,&quot;non-dropping-particle&quot;:&quot;&quot;},{&quot;family&quot;:&quot;Ding&quot;,&quot;given&quot;:&quot;Yuemin&quot;,&quot;parse-names&quot;:false,&quot;dropping-particle&quot;:&quot;&quot;,&quot;non-dropping-particle&quot;:&quot;&quot;},{&quot;family&quot;:&quot;Wang&quot;,&quot;given&quot;:&quot;Dong&quot;,&quot;parse-names&quot;:false,&quot;dropping-particle&quot;:&quot;&quot;,&quot;non-dropping-particle&quot;:&quot;&quot;},{&quot;family&quot;:&quot;Zhang&quot;,&quot;given&quot;:&quot;Hai-Tao&quot;,&quot;parse-names&quot;:false,&quot;dropping-particle&quot;:&quot;&quot;,&quot;non-dropping-particle&quot;:&quot;&quot;}],&quot;container-title&quot;:&quot;IEEE Transactions on Industrial Informatics&quot;,&quot;container-title-short&quot;:&quot;IEEE Trans. Industr. Inform.&quot;,&quot;DOI&quot;:&quot;10.1109/TII.2022.3183802&quot;,&quot;ISSN&quot;:&quot;1551-3203&quot;,&quot;issued&quot;:{&quot;date-parts&quot;:[[2023,3]]},&quot;page&quot;:&quot;2662-2673&quot;,&quot;issue&quot;:&quot;3&quot;,&quot;volume&quot;:&quot;19&quot;},&quot;isTemporary&quot;:false},{&quot;id&quot;:&quot;b748b453-1bc9-3b06-a2bc-accd4d93d9d9&quot;,&quot;itemData&quot;:{&quot;type&quot;:&quot;article-journal&quot;,&quot;id&quot;:&quot;b748b453-1bc9-3b06-a2bc-accd4d93d9d9&quot;,&quot;title&quot;:&quot;Applications of reinforcement learning in energy systems&quot;,&quot;author&quot;:[{&quot;family&quot;:&quot;Perera&quot;,&quot;given&quot;:&quot;A.T.D.&quot;,&quot;parse-names&quot;:false,&quot;dropping-particle&quot;:&quot;&quot;,&quot;non-dropping-particle&quot;:&quot;&quot;},{&quot;family&quot;:&quot;Kamalaruban&quot;,&quot;given&quot;:&quot;Parameswaran&quot;,&quot;parse-names&quot;:false,&quot;dropping-particle&quot;:&quot;&quot;,&quot;non-dropping-particle&quot;:&quot;&quot;}],&quot;container-title&quot;:&quot;Renewable and Sustainable Energy Reviews&quot;,&quot;DOI&quot;:&quot;10.1016/j.rser.2020.110618&quot;,&quot;ISSN&quot;:&quot;13640321&quot;,&quot;issued&quot;:{&quot;date-parts&quot;:[[2021,3]]},&quot;page&quot;:&quot;110618&quot;,&quot;volume&quot;:&quot;137&quot;,&quot;container-title-short&quot;:&quot;&quot;},&quot;isTemporary&quot;:false}]},{&quot;citationID&quot;:&quot;MENDELEY_CITATION_0a510372-57a7-426b-836c-f53f7d26b1fe&quot;,&quot;properties&quot;:{&quot;noteIndex&quot;:0},&quot;isEdited&quot;:false,&quot;manualOverride&quot;:{&quot;isManuallyOverridden&quot;:false,&quot;citeprocText&quot;:&quot;[26]&quot;,&quot;manualOverrideText&quot;:&quot;&quot;},&quot;citationTag&quot;:&quot;MENDELEY_CITATION_v3_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&quot;,&quot;citationItems&quot;:[{&quot;id&quot;:&quot;31848458-a34e-370b-af77-81d1d893a1c5&quot;,&quot;itemData&quot;:{&quot;type&quot;:&quot;article-journal&quot;,&quot;id&quot;:&quot;31848458-a34e-370b-af77-81d1d893a1c5&quot;,&quot;title&quot;:&quot;Deep Reinforcement Learning Approaches the MILP Optimum of a Multi-Energy Optimization in Energy Communities&quot;,&quot;author&quot;:[{&quot;family&quot;:&quot;Vetter&quot;,&quot;given&quot;:&quot;Vinzent&quot;,&quot;parse-names&quot;:false,&quot;dropping-particle&quot;:&quot;&quot;,&quot;non-dropping-particle&quot;:&quot;&quot;},{&quot;family&quot;:&quot;Wohlgenannt&quot;,&quot;given&quot;:&quot;Philipp&quot;,&quot;parse-names&quot;:false,&quot;dropping-particle&quot;:&quot;&quot;,&quot;non-dropping-particle&quot;:&quot;&quot;},{&quot;family&quot;:&quot;Kepplinger&quot;,&quot;given&quot;:&quot;Peter&quot;,&quot;parse-names&quot;:false,&quot;dropping-particle&quot;:&quot;&quot;,&quot;non-dropping-particle&quot;:&quot;&quot;},{&quot;family&quot;:&quot;Eder&quot;,&quot;given&quot;:&quot;Elias&quot;,&quot;parse-names&quot;:false,&quot;dropping-particle&quot;:&quot;&quot;,&quot;non-dropping-particle&quot;:&quot;&quot;}],&quot;container-title&quot;:&quot;Energies&quot;,&quot;DOI&quot;:&quot;10.3390/en18174489&quot;,&quot;ISSN&quot;:&quot;1996-1073&quot;,&quot;issued&quot;:{&quot;date-parts&quot;:[[2025,8,23]]},&quot;page&quot;:&quot;4489&quot;,&quot;abstract&quot;:&quot;&lt;p&gt;As energy systems transition toward high shares of variable renewable generation, local energy communities (ECs) are increasingly relevant for enabling demand-side flexibility and self-sufficiency. This shift is particularly evident in the residential sector, where the deployment of photovoltaic (PV) systems is rapidly growing. While mixed-integer linear programming (MILP) remains the standard for operational optimization and demand response in such systems, its computational burden limits scalability and responsiveness under real-time or uncertain conditions. Reinforcement learning (RL), by contrast, offers a model-free, adaptive alternative. However, its application to real-world energy system operation remains limited. This study explores the application of a Deep Q-Network (DQN) to a real residential EC, which has received limited attention in prior work. The system comprises three single-family homes sharing a centralized heating system with a thermal energy storage (TES), a PV installation, and a grid connection. We compare the performance of MILP and RL controllers across economic and environmental metrics. Relative to a reference scenario without TES, MILP and RL reduce energy costs by 10.06% and 8.78%, respectively, and both approaches yield lower total energy consumption and CO2-equivalent emissions. Notably, the trained RL agent achieves a near-optimal outcome while requiring only 22% of the MILP’s computation time. These results demonstrate that DQNs can offer a computationally efficient and practically viable alternative to MILP for real-time control in residential energy systems.&lt;/p&gt;&quot;,&quot;issue&quot;:&quot;17&quot;,&quot;volume&quot;:&quot;18&quot;,&quot;container-title-short&quot;:&quot;Energies (Basel).&quot;},&quot;isTemporary&quot;:false}]},{&quot;citationID&quot;:&quot;MENDELEY_CITATION_d44b77f0-61f7-4c28-821a-92a263b68faa&quot;,&quot;properties&quot;:{&quot;noteIndex&quot;:0},&quot;isEdited&quot;:false,&quot;manualOverride&quot;:{&quot;isManuallyOverridden&quot;:false,&quot;citeprocText&quot;:&quot;[57]&quot;,&quot;manualOverrideText&quot;:&quot;&quot;},&quot;citationTag&quot;:&quot;MENDELEY_CITATION_v3_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&quot;,&quot;citationItems&quot;:[{&quot;id&quot;:&quot;878a73bd-0c5d-3e77-a841-71aeb93db99a&quot;,&quot;itemData&quot;:{&quot;type&quot;:&quot;article-journal&quot;,&quot;id&quot;:&quot;878a73bd-0c5d-3e77-a841-71aeb93db99a&quot;,&quot;title&quot;:&quot;Reinforcement Learning for Joint Design and Control of Battery-PV Systems&quot;,&quot;author&quot;:[{&quot;family&quot;:&quot;Cauz&quot;,&quot;given&quot;:&quot;Marine&quot;,&quot;parse-names&quot;:false,&quot;dropping-particle&quot;:&quot;&quot;,&quot;non-dropping-particle&quot;:&quot;&quot;},{&quot;family&quot;:&quot;Bolland&quot;,&quot;given&quot;:&quot;Adrien&quot;,&quot;parse-names&quot;:false,&quot;dropping-particle&quot;:&quot;&quot;,&quot;non-dropping-particle&quot;:&quot;&quot;},{&quot;family&quot;:&quot;Miftari&quot;,&quot;given&quot;:&quot;Bardhyl&quot;,&quot;parse-names&quot;:false,&quot;dropping-particle&quot;:&quot;&quot;,&quot;non-dropping-particle&quot;:&quot;&quot;},{&quot;family&quot;:&quot;Perret&quot;,&quot;given&quot;:&quot;Lionel&quot;,&quot;parse-names&quot;:false,&quot;dropping-particle&quot;:&quot;&quot;,&quot;non-dropping-particle&quot;:&quot;&quot;},{&quot;family&quot;:&quot;Ballif&quot;,&quot;given&quot;:&quot;Christophe&quot;,&quot;parse-names&quot;:false,&quot;dropping-particle&quot;:&quot;&quot;,&quot;non-dropping-particle&quot;:&quot;&quot;},{&quot;family&quot;:&quot;Wyrsch&quot;,&quot;given&quot;:&quot;Nicolas&quot;,&quot;parse-names&quot;:false,&quot;dropping-particle&quot;:&quot;&quot;,&quot;non-dropping-particle&quot;:&quot;&quot;}],&quot;URL&quot;:&quot;http://arxiv.org/abs/2307.04244&quot;,&quot;issued&quot;:{&quot;date-parts&quot;:[[2023,7,9]]},&quot;abstract&quot;:&quot;The decentralisation and unpredictability of new renewable energy sources require rethinking our energy system. Data-driven approaches, such as reinforcement learning (RL), have emerged as new control strategies for operating these systems, but they have not yet been applied to system design. This paper aims to bridge this gap by studying the use of an RL-based method for joint design and control of a real-world PV and battery system. The design problem is first formulated as a mixed-integer linear programming problem (MILP). The optimal MILP solution is then used to evaluate the performance of an RL agent trained in a surrogate environment designed for applying an existing data-driven algorithm. The main difference between the two models lies in their optimization approaches: while MILP finds a solution that minimizes the total costs for a one-year operation given the deterministic historical data, RL is a stochastic method that searches for an optimal strategy over one week of data on expectation over all weeks in the historical dataset. Both methods were applied on a toy example using one-week data and on a case study using one-year data. In both cases, models were found to converge to similar control solutions, but their investment decisions differed. Overall, these outcomes are an initial step illustrating benefits and challenges of using RL for the joint design and control of energy systems.&quot;,&quot;container-title-short&quot;:&quot;&quot;},&quot;isTemporary&quot;:false}]},{&quot;citationID&quot;:&quot;MENDELEY_CITATION_ad01b917-344f-4c3a-bbf6-4c037af3c5a8&quot;,&quot;properties&quot;:{&quot;noteIndex&quot;:0},&quot;isEdited&quot;:false,&quot;manualOverride&quot;:{&quot;isManuallyOverridden&quot;:false,&quot;citeprocText&quot;:&quot;[58]&quot;,&quot;manualOverrideText&quot;:&quot;&quot;},&quot;citationTag&quot;:&quot;MENDELEY_CITATION_v3_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&quot;,&quot;citationItems&quot;:[{&quot;id&quot;:&quot;f9d59068-a5c5-321b-98f4-f48ae0ee5cc2&quot;,&quot;itemData&quot;:{&quot;type&quot;:&quot;article-journal&quot;,&quot;id&quot;:&quot;f9d59068-a5c5-321b-98f4-f48ae0ee5cc2&quot;,&quot;title&quot;:&quot;Reinforcement Learning-Based Energy Management for Hybrid Power Systems: State-of-the-Art Survey, Review, and Perspectives&quot;,&quot;author&quot;:[{&quot;family&quot;:&quot;Tang&quot;,&quot;given&quot;:&quot;Xiaolin&quot;,&quot;parse-names&quot;:false,&quot;dropping-particle&quot;:&quot;&quot;,&quot;non-dropping-particle&quot;:&quot;&quot;},{&quot;family&quot;:&quot;Chen&quot;,&quot;given&quot;:&quot;Jiaxin&quot;,&quot;parse-names&quot;:false,&quot;dropping-particle&quot;:&quot;&quot;,&quot;non-dropping-particle&quot;:&quot;&quot;},{&quot;family&quot;:&quot;Qin&quot;,&quot;given&quot;:&quot;Yechen&quot;,&quot;parse-names&quot;:false,&quot;dropping-particle&quot;:&quot;&quot;,&quot;non-dropping-particle&quot;:&quot;&quot;},{&quot;family&quot;:&quot;Liu&quot;,&quot;given&quot;:&quot;Teng&quot;,&quot;parse-names&quot;:false,&quot;dropping-particle&quot;:&quot;&quot;,&quot;non-dropping-particle&quot;:&quot;&quot;},{&quot;family&quot;:&quot;Yang&quot;,&quot;given&quot;:&quot;Kai&quot;,&quot;parse-names&quot;:false,&quot;dropping-particle&quot;:&quot;&quot;,&quot;non-dropping-particle&quot;:&quot;&quot;},{&quot;family&quot;:&quot;Khajepour&quot;,&quot;given&quot;:&quot;Amir&quot;,&quot;parse-names&quot;:false,&quot;dropping-particle&quot;:&quot;&quot;,&quot;non-dropping-particle&quot;:&quot;&quot;},{&quot;family&quot;:&quot;Li&quot;,&quot;given&quot;:&quot;Shen&quot;,&quot;parse-names&quot;:false,&quot;dropping-particle&quot;:&quot;&quot;,&quot;non-dropping-particle&quot;:&quot;&quot;}],&quot;container-title&quot;:&quot;Chinese Journal of Mechanical Engineering&quot;,&quot;DOI&quot;:&quot;10.1186/s10033-024-01026-4&quot;,&quot;ISSN&quot;:&quot;2192-8258&quot;,&quot;issued&quot;:{&quot;date-parts&quot;:[[2024,5,17]]},&quot;page&quot;:&quot;43&quot;,&quot;abstract&quot;:&quot;&lt;p&gt;The new energy vehicle plays a crucial role in green transportation, and the energy management strategy of hybrid power systems is essential for ensuring energy-efficient driving. This paper presents a state-of-the-art survey and review of reinforcement learning-based energy management strategies for hybrid power systems. Additionally, it envisions the outlook for autonomous intelligent hybrid electric vehicles, with reinforcement learning as the foundational technology. First of all, to provide a macro view of historical development, the brief history of deep learning, reinforcement learning, and deep reinforcement learning is presented in the form of a timeline. Then, the comprehensive survey and review are conducted by collecting papers from mainstream academic databases. Enumerating most of the contributions based on three main directions—algorithm innovation, powertrain innovation, and environment innovation—provides an objective review of the research status. Finally, to advance the application of reinforcement learning in autonomous intelligent hybrid electric vehicles, future research plans positioned as “Alpha HEV” are envisioned, integrating Autopilot and energy-saving control.&lt;/p&gt;&quot;,&quot;issue&quot;:&quot;1&quot;,&quot;volume&quot;:&quot;37&quot;,&quot;container-title-short&quot;:&quot;&quot;},&quot;isTemporary&quot;:false}]},{&quot;citationID&quot;:&quot;MENDELEY_CITATION_1494569a-231a-4a1f-9dcf-fd4949b38031&quot;,&quot;properties&quot;:{&quot;noteIndex&quot;:0},&quot;isEdited&quot;:false,&quot;manualOverride&quot;:{&quot;isManuallyOverridden&quot;:false,&quot;citeprocText&quot;:&quot;[59]&quot;,&quot;manualOverrideText&quot;:&quot;&quot;},&quot;citationTag&quot;:&quot;MENDELEY_CITATION_v3_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&quot;,&quot;citationItems&quot;:[{&quot;id&quot;:&quot;b53bd128-ecfb-3d48-b37c-bc2414a5ecf6&quot;,&quot;itemData&quot;:{&quot;type&quot;:&quot;article-journal&quot;,&quot;id&quot;:&quot;b53bd128-ecfb-3d48-b37c-bc2414a5ecf6&quot;,&quot;title&quot;:&quot;Proximal Policy Optimization for Energy Management of Electric Vehicles and PV Storage Units&quot;,&quot;author&quot;:[{&quot;family&quot;:&quot;Alonso&quot;,&quot;given&quot;:&quot;Monica&quot;,&quot;parse-names&quot;:false,&quot;dropping-particle&quot;:&quot;&quot;,&quot;non-dropping-particle&quot;:&quot;&quot;},{&quot;family&quot;:&quot;Amaris&quot;,&quot;given&quot;:&quot;Hortensia&quot;,&quot;parse-names&quot;:false,&quot;dropping-particle&quot;:&quot;&quot;,&quot;non-dropping-particle&quot;:&quot;&quot;},{&quot;family&quot;:&quot;Martin&quot;,&quot;given&quot;:&quot;David&quot;,&quot;parse-names&quot;:false,&quot;dropping-particle&quot;:&quot;&quot;,&quot;non-dropping-particle&quot;:&quot;&quot;},{&quot;family&quot;:&quot;la Escalera&quot;,&quot;given&quot;:&quot;Arturo&quot;,&quot;parse-names&quot;:false,&quot;dropping-particle&quot;:&quot;&quot;,&quot;non-dropping-particle&quot;:&quot;de&quot;}],&quot;container-title&quot;:&quot;Energies&quot;,&quot;container-title-short&quot;:&quot;Energies (Basel).&quot;,&quot;DOI&quot;:&quot;10.3390/en16155689&quot;,&quot;ISSN&quot;:&quot;1996-1073&quot;,&quot;issued&quot;:{&quot;date-parts&quot;:[[2023,7,29]]},&quot;page&quot;:&quot;5689&quot;,&quot;abstract&quot;:&quot;&lt;p&gt;Connected autonomous electric vehicles (CAEVs) are essential actors in the decarbonization process of the transport sector and a key aspect of home energy management systems (HEMSs) along with PV units, CAEVs and battery energy storage systems. However, there are associated uncertainties which present new challenges to HEMSs, such as aleatory EV arrival and departure times, unknown EV battery states of charge at the connection time, and stochastic PV production due to weather and passing cloud conditions. The proposed HEMS is based on proximal policy optimization (PPO), which is a deep reinforcement learning algorithm suitable for continuous complex environments. The optimal solution for HEMS is a tradeoff between CAEV driver’s range anxiety, batteries degradation, and energy consumption, which is solved by means of incentives/penalties in the reinforcement learning formulation. The proposed PPO algorithm was compared to conventional methods such as business-as-usual (BAU) and value iteration (VI) solutions based on dynamic programming. Simulation results indicate that the proposed PPO’s performance showed a daily energy cost reduction of 54% and 27% compared to BAU and VI, respectively. Finally, the developed PPO algorithm is suitable for real-time operations due to its fast execution and good convergence to the optimal solution.&lt;/p&gt;&quot;,&quot;issue&quot;:&quot;15&quot;,&quot;volume&quot;:&quot;16&quot;},&quot;isTemporary&quot;:false}]},{&quot;citationID&quot;:&quot;MENDELEY_CITATION_3b1abaf4-731f-4517-b80f-ef9ec2160c37&quot;,&quot;properties&quot;:{&quot;noteIndex&quot;:0},&quot;isEdited&quot;:false,&quot;manualOverride&quot;:{&quot;isManuallyOverridden&quot;:false,&quot;citeprocText&quot;:&quot;[60]&quot;,&quot;manualOverrideText&quot;:&quot;&quot;},&quot;citationTag&quot;:&quot;MENDELEY_CITATION_v3_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&quot;,&quot;citationItems&quot;:[{&quot;id&quot;:&quot;0ff5ca73-a774-3552-8a06-19b477c5e9e3&quot;,&quot;itemData&quot;:{&quot;type&quot;:&quot;article-journal&quot;,&quot;id&quot;:&quot;0ff5ca73-a774-3552-8a06-19b477c5e9e3&quot;,&quot;title&quot;:&quot;Deep Reinforcement Learning for Intraday Multireservoir Hydropower Management&quot;,&quot;author&quot;:[{&quot;family&quot;:&quot;Castro-Freibott&quot;,&quot;given&quot;:&quot;Rodrigo&quot;,&quot;parse-names&quot;:false,&quot;dropping-particle&quot;:&quot;&quot;,&quot;non-dropping-particle&quot;:&quot;&quot;},{&quot;family&quot;:&quot;García-Sánchez&quot;,&quot;given&quot;:&quot;Álvaro&quot;,&quot;parse-names&quot;:false,&quot;dropping-particle&quot;:&quot;&quot;,&quot;non-dropping-particle&quot;:&quot;&quot;},{&quot;family&quot;:&quot;Espiga-Fernández&quot;,&quot;given&quot;:&quot;Francisco&quot;,&quot;parse-names&quot;:false,&quot;dropping-particle&quot;:&quot;&quot;,&quot;non-dropping-particle&quot;:&quot;&quot;},{&quot;family&quot;:&quot;González-Santander de la Cruz&quot;,&quot;given&quot;:&quot;Guillermo&quot;,&quot;parse-names&quot;:false,&quot;dropping-particle&quot;:&quot;&quot;,&quot;non-dropping-particle&quot;:&quot;&quot;}],&quot;container-title&quot;:&quot;Mathematics&quot;,&quot;DOI&quot;:&quot;10.3390/math13010151&quot;,&quot;ISSN&quot;:&quot;2227-7390&quot;,&quot;issued&quot;:{&quot;date-parts&quot;:[[2025,1,3]]},&quot;page&quot;:&quot;151&quot;,&quot;abstract&quot;:&quot;&lt;p&gt;This study investigates the application of Reinforcement Learning (RL) to optimize intraday operations of hydropower reservoirs. Unlike previous approaches that focus on long-term planning with coarse temporal resolutions and discretized state-action spaces, we propose an RL framework tailored to the Hydropower Reservoirs Intraday Economic Optimization problem. This framework manages continuous state-action spaces while accounting for fine-grained temporal dynamics, including dam-to-turbine delays, gate movement constraints, and power group operations. Our methodology evaluates three distinct action space formulations (continuous, discrete, and adjustments) implemented using modern RL algorithms (A2C, PPO, and SAC). We compare them against both a greedy baseline and Mixed-Integer Linear Programming (MILP) solutions. Experiments on real-world data from a two-reservoir system and a simulated six-reservoir system demonstrate that while MILP achieves superior performance in the smaller system, its performance degrades significantly when scaled to six reservoirs. In contrast, RL agents, particularly those using discrete action spaces and trained with PPO, maintain consistent performance across both configurations, achieving considerable improvements with less than one second of execution time. These results suggest that RL offers a scalable alternative to traditional optimization methods for hydropower operations, particularly in scenarios requiring real-time decision making or involving larger systems.&lt;/p&gt;&quot;,&quot;issue&quot;:&quot;1&quot;,&quot;volume&quot;:&quot;13&quot;,&quot;container-title-short&quot;:&quot;&quot;},&quot;isTemporary&quot;:false}]},{&quot;citationID&quot;:&quot;MENDELEY_CITATION_3ac95b0f-c725-4795-bfa4-1eba977c9f4a&quot;,&quot;properties&quot;:{&quot;noteIndex&quot;:0},&quot;isEdited&quot;:false,&quot;manualOverride&quot;:{&quot;isManuallyOverridden&quot;:false,&quot;citeprocText&quot;:&quot;[61]&quot;,&quot;manualOverrideText&quot;:&quot;&quot;},&quot;citationTag&quot;:&quot;MENDELEY_CITATION_v3_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&quot;,&quot;citationItems&quot;:[{&quot;id&quot;:&quot;3cac7bf3-aab5-308c-b172-3e50ea998683&quot;,&quot;itemData&quot;:{&quot;type&quot;:&quot;article-journal&quot;,&quot;id&quot;:&quot;3cac7bf3-aab5-308c-b172-3e50ea998683&quot;,&quot;title&quot;:&quot;Microgrid control for renewable energy sources based on deep reinforcement learning and numerical optimization approaches&quot;,&quot;author&quot;:[{&quot;family&quot;:&quot;Zhadan&quot;,&quot;given&quot;:&quot;Anastasia Yu.&quot;,&quot;parse-names&quot;:false,&quot;dropping-particle&quot;:&quot;&quot;,&quot;non-dropping-particle&quot;:&quot;&quot;},{&quot;family&quot;:&quot;Wu&quot;,&quot;given&quot;:&quot;Haitao&quot;,&quot;parse-names&quot;:false,&quot;dropping-particle&quot;:&quot;&quot;,&quot;non-dropping-particle&quot;:&quot;&quot;},{&quot;family&quot;:&quot;Kudin&quot;,&quot;given&quot;:&quot;Pavel S.&quot;,&quot;parse-names&quot;:false,&quot;dropping-particle&quot;:&quot;&quot;,&quot;non-dropping-particle&quot;:&quot;&quot;},{&quot;family&quot;:&quot;Zhang&quot;,&quot;given&quot;:&quot;Yuyi&quot;,&quot;parse-names&quot;:false,&quot;dropping-particle&quot;:&quot;&quot;,&quot;non-dropping-particle&quot;:&quot;&quot;},{&quot;family&quot;:&quot;Petrosian&quot;,&quot;given&quot;:&quot;Ovanes L.&quot;,&quot;parse-names&quot;:false,&quot;dropping-particle&quot;:&quot;&quot;,&quot;non-dropping-particle&quot;:&quot;&quot;}],&quot;container-title&quot;:&quot;Vestnik of Saint Petersburg University. Applied Mathematics. Computer Science. Control Processes&quot;,&quot;DOI&quot;:&quot;10.21638/11701/spbu10.2023.307&quot;,&quot;ISSN&quot;:&quot;18119905&quot;,&quot;issued&quot;:{&quot;date-parts&quot;:[[2023]]},&quot;page&quot;:&quot;391-402&quot;,&quot;abstract&quot;:&quot;&lt;p&gt;Optimal scheduling of battery energy storage system plays crucial part in dis- tributed energy system. As a data driven method, deep reinforcement learning does not require system knowledge of dynamic system, present optimal solution for nonlinear optimization problem. In this research, financial cost of energy con- sumption reduced by scheduling battery energy using deep reinforcement learning method (RL). Reinforcement learning can adapt to equipment parameter changes and noise in the data, while mixed-integer linear programming (MILP) requires high accuracy in forecasting power generation and demand, accurate equipment parameters to achieve good performance, and high computational cost for large- scale industrial applications. Based on this, it can be assumed that deep RL based solution is capable of outperform classic deterministic optimization model MILP. This study compares four state-of-the-art RL algorithms for the battery power plant control problem: PPO, A2C, SAC, TD3. According to the simulation results, TD3 shows the best results, outperforming MILP by 5% in cost savings, and the time to solve the problem is reduced by about a factor of three.&lt;/p&gt;&quot;,&quot;issue&quot;:&quot;3&quot;,&quot;volume&quot;:&quot;19&quot;,&quot;container-title-short&quot;:&quot;&quot;},&quot;isTemporary&quot;:false}]}]"/>
+    <we:property name="MENDELEY_CITATIONS" value="[{&quot;citationID&quot;:&quot;MENDELEY_CITATION_9a69a8b0-b116-4a8e-be9e-ca9faac00dd4&quot;,&quot;properties&quot;:{&quot;noteIndex&quot;:0},&quot;isEdited&quot;:false,&quot;manualOverride&quot;:{&quot;isManuallyOverridden&quot;:false,&quot;citeprocText&quot;:&quot;[1]&quot;,&quot;manualOverrideText&quot;:&quot;&quot;},&quot;citationTag&quot;:&quot;MENDELEY_CITATION_v3_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&quot;,&quot;citationItems&quot;:[{&quot;id&quot;:&quot;9f54496b-fc3d-3546-b057-55b552d0253d&quot;,&quot;itemData&quot;:{&quot;type&quot;:&quot;article-journal&quot;,&quot;id&quot;:&quot;9f54496b-fc3d-3546-b057-55b552d0253d&quot;,&quot;title&quot;:&quot;Hard-to-Abate Sectors: The role of industrial carbon capture and storage (CCS) in emission mitigation&quot;,&quot;author&quot;:[{&quot;family&quot;:&quot;Paltsev&quot;,&quot;given&quot;:&quot;Sergey&quot;,&quot;parse-names&quot;:false,&quot;dropping-particle&quot;:&quot;&quot;,&quot;non-dropping-particle&quot;:&quot;&quot;},{&quot;family&quot;:&quot;Morris&quot;,&quot;given&quot;:&quot;Jennifer&quot;,&quot;parse-names&quot;:false,&quot;dropping-particle&quot;:&quot;&quot;,&quot;non-dropping-particle&quot;:&quot;&quot;},{&quot;family&quot;:&quot;Kheshgi&quot;,&quot;given&quot;:&quot;Haroon&quot;,&quot;parse-names&quot;:false,&quot;dropping-particle&quot;:&quot;&quot;,&quot;non-dropping-particle&quot;:&quot;&quot;},{&quot;family&quot;:&quot;Herzog&quot;,&quot;given&quot;:&quot;Howard&quot;,&quot;parse-names&quot;:false,&quot;dropping-particle&quot;:&quot;&quot;,&quot;non-dropping-particle&quot;:&quot;&quot;}],&quot;container-title&quot;:&quot;Applied Energy&quot;,&quot;DOI&quot;:&quot;10.1016/j.apenergy.2021.117322&quot;,&quot;ISSN&quot;:&quot;03062619&quot;,&quot;issued&quot;:{&quot;date-parts&quot;:[[2021,10]]},&quot;page&quot;:&quot;117322&quot;,&quot;volume&quot;:&quot;300&quot;,&quot;container-title-short&quot;:&quot;Appl. Energy&quot;},&quot;isTemporary&quot;:false}]},{&quot;citationID&quot;:&quot;MENDELEY_CITATION_8d7bd39f-5014-4a97-bce1-d22efa7dbd0b&quot;,&quot;properties&quot;:{&quot;noteIndex&quot;:0},&quot;isEdited&quot;:false,&quot;manualOverride&quot;:{&quot;isManuallyOverridden&quot;:false,&quot;citeprocText&quot;:&quot;[2]&quot;,&quot;manualOverrideText&quot;:&quot;&quot;},&quot;citationTag&quot;:&quot;MENDELEY_CITATION_v3_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&quot;,&quot;citationItems&quot;:[{&quot;id&quot;:&quot;956a38fa-e422-3333-a9ab-81f96dae1644&quot;,&quot;itemData&quot;:{&quot;type&quot;:&quot;article-journal&quot;,&quot;id&quot;:&quot;956a38fa-e422-3333-a9ab-81f96dae1644&quot;,&quot;title&quot;:&quot;Decarbonizing Hard-to-Abate Sectors with Renewable Hydrogen: A Real Case Application to the Ceramics Industry&quot;,&quot;author&quot;:[{&quot;family&quot;:&quot;Sousa&quot;,&quot;given&quot;:&quot;Jorge&quot;,&quot;parse-names&quot;:false,&quot;dropping-particle&quot;:&quot;&quot;,&quot;non-dropping-particle&quot;:&quot;&quot;},{&quot;family&quot;:&quot;Azevedo&quot;,&quot;given&quot;:&quot;Inês&quot;,&quot;parse-names&quot;:false,&quot;dropping-particle&quot;:&quot;&quot;,&quot;non-dropping-particle&quot;:&quot;&quot;},{&quot;family&quot;:&quot;Camus&quot;,&quot;given&quot;:&quot;Cristina&quot;,&quot;parse-names&quot;:false,&quot;dropping-particle&quot;:&quot;&quot;,&quot;non-dropping-particle&quot;:&quot;&quot;},{&quot;family&quot;:&quot;Mendes&quot;,&quot;given&quot;:&quot;Luís&quot;,&quot;parse-names&quot;:false,&quot;dropping-particle&quot;:&quot;&quot;,&quot;non-dropping-particle&quot;:&quot;&quot;},{&quot;family&quot;:&quot;Viveiros&quot;,&quot;given&quot;:&quot;Carla&quot;,&quot;parse-names&quot;:false,&quot;dropping-particle&quot;:&quot;&quot;,&quot;non-dropping-particle&quot;:&quot;&quot;},{&quot;family&quot;:&quot;Barata&quot;,&quot;given&quot;:&quot;Filipe&quot;,&quot;parse-names&quot;:false,&quot;dropping-particle&quot;:&quot;&quot;,&quot;non-dropping-particle&quot;:&quot;&quot;}],&quot;container-title&quot;:&quot;Energies&quot;,&quot;DOI&quot;:&quot;10.3390/en17153661&quot;,&quot;ISSN&quot;:&quot;1996-1073&quot;,&quot;issued&quot;:{&quot;date-parts&quot;:[[2024,7,25]]},&quot;page&quot;:&quot;3661&quot;,&quot;abstract&quot;:&quot;&lt;p&gt;Hydrogen produced from renewable energy sources is a valuable energy carrier for linking growing renewable electricity generation with the hard-to-abate sectors, such as cement, steel, glass, chemical, and ceramics industries. In this context, this paper presents a new model of hydrogen production based on solar photovoltaics and wind energy with application to a real-world ceramics factory. For this task, a novel multipurpose profit-maximizing model is implemented using GAMS. The developed model explores hydrogen production with multiple value streams that enable technical and economical informed decisions under specific scenarios. Our results show that it is profitable to sell the hydrogen produced to the gas grid rather than using it for self-consumption for low-gas-price scenarios. On the other hand, when the price of gas is significantly high, it is more profitable to use as much hydrogen as possible for self-consumption to supply the factory and reduce the internal use of natural gas. The role of electricity self-consumption has proven to be key for the project’s profitability as, without this revenue stream, the project would not be profitable in any analysed scenario.&lt;/p&gt;&quot;,&quot;issue&quot;:&quot;15&quot;,&quot;volume&quot;:&quot;17&quot;,&quot;container-title-short&quot;:&quot;Energies (Basel).&quot;},&quot;isTemporary&quot;:false}]},{&quot;citationID&quot;:&quot;MENDELEY_CITATION_cc9a11a7-48e8-4bcd-9601-05385ccebf02&quot;,&quot;properties&quot;:{&quot;noteIndex&quot;:0},&quot;isEdited&quot;:false,&quot;manualOverride&quot;:{&quot;isManuallyOverridden&quot;:false,&quot;citeprocText&quot;:&quot;[3]&quot;,&quot;manualOverrideText&quot;:&quot;&quot;},&quot;citationTag&quot;:&quot;MENDELEY_CITATION_v3_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&quot;,&quot;citationItems&quot;:[{&quot;id&quot;:&quot;66781a91-8ce9-38c0-8b80-b0de4bdb3cc9&quot;,&quot;itemData&quot;:{&quot;type&quot;:&quot;article-journal&quot;,&quot;id&quot;:&quot;66781a91-8ce9-38c0-8b80-b0de4bdb3cc9&quot;,&quot;title&quot;:&quot;From green hydrogen to electricity: A review on recent advances, challenges, and opportunities on power-to-hydrogen-to-power systems&quot;,&quot;author&quot;:[{&quot;family&quot;:&quot;Risco-Bravo&quot;,&quot;given&quot;:&quot;A.&quot;,&quot;parse-names&quot;:false,&quot;dropping-particle&quot;:&quot;&quot;,&quot;non-dropping-particle&quot;:&quot;&quot;},{&quot;family&quot;:&quot;Varela&quot;,&quot;given&quot;:&quot;C.&quot;,&quot;parse-names&quot;:false,&quot;dropping-particle&quot;:&quot;&quot;,&quot;non-dropping-particle&quot;:&quot;&quot;},{&quot;family&quot;:&quot;Bartels&quot;,&quot;given&quot;:&quot;J.&quot;,&quot;parse-names&quot;:false,&quot;dropping-particle&quot;:&quot;&quot;,&quot;non-dropping-particle&quot;:&quot;&quot;},{&quot;family&quot;:&quot;Zondervan&quot;,&quot;given&quot;:&quot;E.&quot;,&quot;parse-names&quot;:false,&quot;dropping-particle&quot;:&quot;&quot;,&quot;non-dropping-particle&quot;:&quot;&quot;}],&quot;container-title&quot;:&quot;Renewable and Sustainable Energy Reviews&quot;,&quot;DOI&quot;:&quot;10.1016/j.rser.2023.113930&quot;,&quot;ISSN&quot;:&quot;13640321&quot;,&quot;issued&quot;:{&quot;date-parts&quot;:[[2024,1]]},&quot;page&quot;:&quot;113930&quot;,&quot;volume&quot;:&quot;189&quot;,&quot;container-title-short&quot;:&quot;&quot;},&quot;isTemporary&quot;:false}]},{&quot;citationID&quot;:&quot;MENDELEY_CITATION_10ebcc1d-9e7d-475c-9706-140f1e237e74&quot;,&quot;properties&quot;:{&quot;noteIndex&quot;:0},&quot;isEdited&quot;:false,&quot;manualOverride&quot;:{&quot;isManuallyOverridden&quot;:false,&quot;citeprocText&quot;:&quot;[4]&quot;,&quot;manualOverrideText&quot;:&quot;&quot;},&quot;citationTag&quot;:&quot;MENDELEY_CITATION_v3_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&quot;,&quot;citationItems&quot;:[{&quot;id&quot;:&quot;d00ceab6-c269-3d86-a58b-dd8be99f154b&quot;,&quot;itemData&quot;:{&quot;type&quot;:&quot;article-journal&quot;,&quot;id&quot;:&quot;d00ceab6-c269-3d86-a58b-dd8be99f154b&quot;,&quot;title&quot;:&quot;A comprehensive review of optimizing hybrid renewable energy system using optimization techniques&quot;,&quot;author&quot;:[{&quot;family&quot;:&quot;Yao&quot;,&quot;given&quot;:&quot;Ye&quot;,&quot;parse-names&quot;:false,&quot;dropping-particle&quot;:&quot;&quot;,&quot;non-dropping-particle&quot;:&quot;&quot;},{&quot;family&quot;:&quot;Wang&quot;,&quot;given&quot;:&quot;Zhen&quot;,&quot;parse-names&quot;:false,&quot;dropping-particle&quot;:&quot;&quot;,&quot;non-dropping-particle&quot;:&quot;&quot;},{&quot;family&quot;:&quot;Ma&quot;,&quot;given&quot;:&quot;Chao&quot;,&quot;parse-names&quot;:false,&quot;dropping-particle&quot;:&quot;&quot;,&quot;non-dropping-particle&quot;:&quot;&quot;},{&quot;family&quot;:&quot;Liu&quot;,&quot;given&quot;:&quot;Mengmeng&quot;,&quot;parse-names&quot;:false,&quot;dropping-particle&quot;:&quot;&quot;,&quot;non-dropping-particle&quot;:&quot;&quot;},{&quot;family&quot;:&quot;Qi&quot;,&quot;given&quot;:&quot;Wenchao&quot;,&quot;parse-names&quot;:false,&quot;dropping-particle&quot;:&quot;&quot;,&quot;non-dropping-particle&quot;:&quot;&quot;},{&quot;family&quot;:&quot;Yang&quot;,&quot;given&quot;:&quot;Xiuwei&quot;,&quot;parse-names&quot;:false,&quot;dropping-particle&quot;:&quot;&quot;,&quot;non-dropping-particle&quot;:&quot;&quot;},{&quot;family&quot;:&quot;Gao&quot;,&quot;given&quot;:&quot;Xifeng&quot;,&quot;parse-names&quot;:false,&quot;dropping-particle&quot;:&quot;&quot;,&quot;non-dropping-particle&quot;:&quot;&quot;},{&quot;family&quot;:&quot;Liu&quot;,&quot;given&quot;:&quot;Yingzhou&quot;,&quot;parse-names&quot;:false,&quot;dropping-particle&quot;:&quot;&quot;,&quot;non-dropping-particle&quot;:&quot;&quot;},{&quot;family&quot;:&quot;Lian&quot;,&quot;given&quot;:&quot;Jijian&quot;,&quot;parse-names&quot;:false,&quot;dropping-particle&quot;:&quot;&quot;,&quot;non-dropping-particle&quot;:&quot;&quot;},{&quot;family&quot;:&quot;Wang&quot;,&quot;given&quot;:&quot;Haolin&quot;,&quot;parse-names&quot;:false,&quot;dropping-particle&quot;:&quot;&quot;,&quot;non-dropping-particle&quot;:&quot;&quot;}],&quot;container-title&quot;:&quot;Engineering Science and Technology, an International Journal&quot;,&quot;DOI&quot;:&quot;10.1016/j.jestch.2026.102384&quot;,&quot;ISSN&quot;:&quot;22150986&quot;,&quot;issued&quot;:{&quot;date-parts&quot;:[[2026,6]]},&quot;page&quot;:&quot;102384&quot;,&quot;volume&quot;:&quot;78&quot;,&quot;container-title-short&quot;:&quot;&quot;},&quot;isTemporary&quot;:false}]},{&quot;citationID&quot;:&quot;MENDELEY_CITATION_883842a3-a21f-4bfa-9084-5059522ad981&quot;,&quot;properties&quot;:{&quot;noteIndex&quot;:0},&quot;isEdited&quot;:false,&quot;manualOverride&quot;:{&quot;isManuallyOverridden&quot;:false,&quot;citeprocText&quot;:&quot;[5]&quot;,&quot;manualOverrideText&quot;:&quot;&quot;},&quot;citationTag&quot;:&quot;MENDELEY_CITATION_v3_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&quot;,&quot;citationItems&quot;:[{&quot;id&quot;:&quot;37e1e1c6-a2f3-3486-92e6-469dc2e4adc9&quot;,&quot;itemData&quot;:{&quot;type&quot;:&quot;article-journal&quot;,&quot;id&quot;:&quot;37e1e1c6-a2f3-3486-92e6-469dc2e4adc9&quot;,&quot;title&quot;:&quot;Energy Demand Response in a Food-Processing Plant: A Deep Reinforcement Learning Approach&quot;,&quot;author&quot;:[{&quot;family&quot;:&quot;Wohlgenannt&quot;,&quot;given&quot;:&quot;Philipp&quot;,&quot;parse-names&quot;:false,&quot;dropping-particle&quot;:&quot;&quot;,&quot;non-dropping-particle&quot;:&quot;&quot;},{&quot;family&quot;:&quot;Hegenbart&quot;,&quot;given&quot;:&quot;Sebastian&quot;,&quot;parse-names&quot;:false,&quot;dropping-particle&quot;:&quot;&quot;,&quot;non-dropping-particle&quot;:&quot;&quot;},{&quot;family&quot;:&quot;Eder&quot;,&quot;given&quot;:&quot;Elias&quot;,&quot;parse-names&quot;:false,&quot;dropping-particle&quot;:&quot;&quot;,&quot;non-dropping-particle&quot;:&quot;&quot;},{&quot;family&quot;:&quot;Kolhe&quot;,&quot;given&quot;:&quot;Mohan&quot;,&quot;parse-names&quot;:false,&quot;dropping-particle&quot;:&quot;&quot;,&quot;non-dropping-particle&quot;:&quot;&quot;},{&quot;family&quot;:&quot;Kepplinger&quot;,&quot;given&quot;:&quot;Peter&quot;,&quot;parse-names&quot;:false,&quot;dropping-particle&quot;:&quot;&quot;,&quot;non-dropping-particle&quot;:&quot;&quot;}],&quot;container-title&quot;:&quot;Energies&quot;,&quot;container-title-short&quot;:&quot;Energies (Basel).&quot;,&quot;DOI&quot;:&quot;10.3390/en17246430&quot;,&quot;ISSN&quot;:&quot;1996-1073&quot;,&quot;issued&quot;:{&quot;date-parts&quot;:[[2024,12,20]]},&quot;page&quot;:&quot;6430&quot;,&quot;abstract&quot;:&quot;&lt;p&gt;The food industry faces significant challenges in managing operational costs due to its high energy intensity and rising energy prices. Industrial food-processing facilities, with substantial thermal capacities and large demands for cooling and heating, offer promising opportunities for demand response (DR) strategies. This study explores the application of deep reinforcement learning (RL) as an innovative, data-driven approach for DR in the food industry. By leveraging the adaptive, self-learning capabilities of RL, energy costs in the investigated plant are effectively decreased. The RL algorithm was compared with the well-established optimization method Mixed Integer Linear Programming (MILP), and both were benchmarked against a reference scenario without DR. The two optimization strategies demonstrate cost savings of 17.57% and 18.65% for RL and MILP, respectively. Although RL is slightly less efficient in cost reduction, it significantly outperforms in computational speed, being approximately 20 times faster. During operation, RL only needs 2ms per optimization compared to 19s for MILP, making it a promising optimization tool for edge computing. Moreover, while MILP’s computation time increases considerably with the number of binary variables, RL efficiently learns dynamic system behavior and scales to more complex systems without significant performance degradation. These results highlight that deep RL, when applied to DR, offers substantial cost savings and computational efficiency, with broad applicability to energy management in various applications.&lt;/p&gt;&quot;,&quot;issue&quot;:&quot;24&quot;,&quot;volume&quot;:&quot;17&quot;},&quot;isTemporary&quot;:false}]},{&quot;citationID&quot;:&quot;MENDELEY_CITATION_d7370189-8bad-428a-bf96-f6e0b77e7bf5&quot;,&quot;properties&quot;:{&quot;noteIndex&quot;:0},&quot;isEdited&quot;:false,&quot;manualOverride&quot;:{&quot;isManuallyOverridden&quot;:false,&quot;citeprocText&quot;:&quot;[6]&quot;,&quot;manualOverrideText&quot;:&quot;&quot;},&quot;citationTag&quot;:&quot;MENDELEY_CITATION_v3_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&quot;,&quot;citationItems&quot;:[{&quot;id&quot;:&quot;f01623cd-5b09-3de7-90db-88f6efe9d97e&quot;,&quot;itemData&quot;:{&quot;type&quot;:&quot;article-journal&quot;,&quot;id&quot;:&quot;f01623cd-5b09-3de7-90db-88f6efe9d97e&quot;,&quot;title&quot;:&quot;Optimization of energy supply systems by MILP branch and bound method in consideration of hierarchical relationship between design and operation&quot;,&quot;author&quot;:[{&quot;family&quot;:&quot;Yokoyama&quot;,&quot;given&quot;:&quot;Ryohei&quot;,&quot;parse-names&quot;:false,&quot;dropping-particle&quot;:&quot;&quot;,&quot;non-dropping-particle&quot;:&quot;&quot;},{&quot;family&quot;:&quot;Shinano&quot;,&quot;given&quot;:&quot;Yuji&quot;,&quot;parse-names&quot;:false,&quot;dropping-particle&quot;:&quot;&quot;,&quot;non-dropping-particle&quot;:&quot;&quot;},{&quot;family&quot;:&quot;Taniguchi&quot;,&quot;given&quot;:&quot;Syusuke&quot;,&quot;parse-names&quot;:false,&quot;dropping-particle&quot;:&quot;&quot;,&quot;non-dropping-particle&quot;:&quot;&quot;},{&quot;family&quot;:&quot;Ohkura&quot;,&quot;given&quot;:&quot;Masashi&quot;,&quot;parse-names&quot;:false,&quot;dropping-particle&quot;:&quot;&quot;,&quot;non-dropping-particle&quot;:&quot;&quot;},{&quot;family&quot;:&quot;Wakui&quot;,&quot;given&quot;:&quot;Tetsuya&quot;,&quot;parse-names&quot;:false,&quot;dropping-particle&quot;:&quot;&quot;,&quot;non-dropping-par